<commit_message>
Manuscript revision 8: author's language edits from the Word file, titled captions, affiliation
Applies the author's edits made in Word (grammar, US spelling, captions retitled) to main.tex,
keeping every equation, citation and cross-reference (the edited Word file had lost its equations).
Captions open with the author's new titles followed by the descriptions the reviewer's items
require. Affiliation and corresponding e-mail completed. Word count 7,997; round-8 letter quotes,
page numbers and counts updated to match. No result changes.

Co-Authored-By: Claude Opus 5.5 <noreply@anthropic.com>
Claude-Session: https://claude.ai/code/session_01RjWdFzUgYk6Hwie2YbnvyG
</commit_message>
<xml_diff>
--- a/paper/main.docx
+++ b/paper/main.docx
@@ -51,7 +51,7 @@
           <w:sz w:val="22"/>
           <w:szCs w:val="22"/>
         </w:rPr>
-        <w:t>Affiliation to be completed before submission, Saudi Arabia</w:t>
+        <w:t>College of Computer and Information Science, Prince Sultan University, Saudi Arabia</w:t>
       </w:r>
     </w:p>
     <w:p>
@@ -86,7 +86,7 @@
           <w:sz w:val="20"/>
           <w:szCs w:val="20"/>
         </w:rPr>
-        <w:t xml:space="preserve">Corresponding author. E-mail: optimistbs@gmail.com</w:t>
+        <w:t xml:space="preserve">Corresponding author. E-mail: nahmed@psu.edu.sa</w:t>
       </w:r>
     </w:p>
     <w:p>
@@ -112,7 +112,7 @@
           <w:sz w:val="24"/>
           <w:szCs w:val="24"/>
         </w:rPr>
-        <w:t>Endpoints that send one-time passwords by SMS are abused to waste money (flooding) or to earn part of the termination fee (SMS pumping). We evaluate in simulation a twelve-step defence that draws trust from app attestation, signed sessions and verification outcomes, against simpler designs and 25 attacker profiles. Attacks with a signature in the request are contained at little cost to simulated users; a residential attacker with farmed CAPTCHA scores is rationed by refusing half of first-time users. On the destination, short-window counters of SMS sends per number block, selected at a benign service target, leaked 6 to 48 messages against four concentrated 20-minute pumpers at 0.06 to 0.43 points of attack-free completion, where at the busiest density the default sequential tests of verification outcomes leaked 19 to 452. Under a second predeclared protocol on seeds and workloads held out from selection, the frozen counter met its leakage and benign-cost claims, leaked no more than the tests in all but 13 of 144 cells, all against an instantly verifying carrier, and failed both service-under-attack claims when the pumper shares blocks with real users. For attacks of up to an hour, unfitted estimates whose crossing is algebraic, not a measured switching point, ordered the policies’ mean leakage in 18 of 18 decisive boundary cells with the counter’s cold-start bound and 17 with its warm-start bound: the counter loses its advantage against paced or widely spread pumpers.</w:t>
+        <w:t>Endpoints that send one-time passwords via SMS are abused to waste money (flooding) or to earn part of the termination fee (SMS pumping). We evaluate in simulation a twelve-step defense that draws trust from app attestation, signed sessions, and verification outcomes, against simpler designs and 25 attacker profiles. Attacks with a signature in the request are contained at a low cost to simulated users; a residential attacker with farmed CAPTCHA scores is rationed by refusing half of the first-time users. On the destination, short-window counters of SMS sent per number block, selected at a benign service target, leaked 6 to 48 messages against four concentrated 20-minute pumpers at 0.06 to 0.43 points of attack-free completion, where at the busiest density, the default sequential tests of verification outcomes leaked 19 to 452. Under a second predeclared protocol on seeds and workloads held out from selection, the frozen counter met its leakage and benign-cost claims, leaked no more than the tests in all but 13 of 144 cells, all against an instantly verifying carrier, and failed both service-under-attack claims when the pumper shares blocks with real users. For attacks of up to an hour, unfitted estimates whose crossing is algebraic, not a measured switching point, ordered the policies’ mean leakage in 18 of 18 decisive boundary cells with the counter’s cold-start bound and 17 with its warm-start bound: the counter loses its advantage against paced or widely spread pumpers.</w:t>
       </w:r>
     </w:p>
     <w:p>
@@ -179,7 +179,7 @@
         <w:pStyle w:val="FirstParagraph"/>
       </w:pPr>
       <w:r>
-        <w:t xml:space="preserve">Most online services verify a phone number by sending it a code by SMS, from an endpoint reachable before any account exists, at a tenth of a cent to twenty cents a message. A flooder makes the service send to numbers it does not own; a pumper sends to a range whose operator shares the termination fee, turning the service’s SMS budget into its income [1]. Twitter’s owner said in 2023 that pumping had cost the company about 60 million dollars a year [2], and Huh et al. found as many attack requests as genuine ones in three months of one large service’s logs [3].</w:t>
+        <w:t xml:space="preserve">Most online services verify a phone number by sending a code via SMS from an endpoint reachable before any account exists, at a tenth of a cent to twenty cents per message. A flooder makes the service send to numbers it does not own; a pumper sends to a range whose operator shares the termination fee, turning the service’s SMS budget into its income [1]. Twitter’s owner said in 2023 that pumping had cost the company approximately $60 million a year [2], and Huh et al. found as many attack requests as genuine ones in three months of one large service’s logs [3].</w:t>
       </w:r>
     </w:p>
     <w:p>
@@ -187,7 +187,7 @@
         <w:pStyle w:val="BodyText"/>
       </w:pPr>
       <w:r>
-        <w:t xml:space="preserve">We study the defences of a registration flow: a baseline of seven controls (v1) and a twelve-step redesign with attested platforms, signed sessions, number checks before a message is paid for, reputation from whether codes were entered, a five-response risk score and a hard budget. We ask in simulation which attacks it contains against simpler designs, at what cost in completed registrations (RQ1); which layer is responsible (RQ2); when outcome-based reputation separates an attacker from simulated users (RQ3); what rationing costs when it does not (RQ4); and what destination policies cost legitimate users, with and without an attack (RQ5).</w:t>
+        <w:t xml:space="preserve">We study the defenses of a registration flow: a baseline of seven controls (v1) and a twelve-step redesign with attested platforms, signed sessions, number checks before a message is paid for, reputation from whether codes were entered, a five-response risk score, and a hard budget. We ask in simulation which attacks it contains against simpler designs, at what cost in completed registrations (RQ1); which layer is responsible (RQ2); when outcome-based reputation separates an attacker from simulated users (RQ3); what rationing costs when it does not (RQ4); and what destination policies cost legitimate users, with and without an attack (RQ5).</w:t>
       </w:r>
     </w:p>
     <w:p>
@@ -195,7 +195,7 @@
         <w:pStyle w:val="BodyText"/>
       </w:pPr>
       <w:r>
-        <w:t xml:space="preserve">Because a pumper is paid only on its partner’s ranges, the study centres on the destination: under a predeclared comparison a plain counter of sends per number block leaked less than our sequential tests of code outcomes, and a second predeclared protocol mapped where that holds and fails. We contribute an analysis of eight gaps in the baseline, the design and an open implementation, measurements of where reputation stops separating and what rationing depends on, both destination-policy comparisons with their failures and collateral damage, and unfitted estimates of when counting leaks less than our tests; Sections 7.1–7.4 give context.</w:t>
+        <w:t xml:space="preserve">Because a pumper is paid only on its partner’s ranges, the study focuses on the destination: under a predeclared comparison, a plain counter of sends per number block leaked less than our sequential tests of code outcomes, and a second predeclared protocol mapped where that holds and fails. We contribute an analysis of eight gaps in the baseline, the design, and an open implementation, measurements of where reputation stops separating and what rationing depends on, both destination-policy comparisons with their failures and collateral damage, and unfitted estimates of when counting leaks less than our tests; Sections 7.1–7.4 provide context.</w:t>
       </w:r>
     </w:p>
     <w:bookmarkEnd w:id="20"/>
@@ -232,7 +232,7 @@
         <w:t xml:space="preserve"> </w:t>
       </w:r>
       <w:r>
-        <w:t xml:space="preserve">In international revenue share fraud, traffic is generated to an advertised number range and the termination fee is split along the route [4]. Sahin and Francillon’s 3.14 million test numbers from twelve providers show the range to be the fraudster’s managed asset [5].</w:t>
+        <w:t xml:space="preserve">In international revenue-share fraud, traffic is generated to an advertised number range, and the termination fee is split along the route [4]. Sahin and Francillon’s 3.14 million test numbers from twelve providers show that the range is the fraudster’s managed asset [5].</w:t>
       </w:r>
     </w:p>
     <w:p>
@@ -250,7 +250,7 @@
         <w:t xml:space="preserve"> </w:t>
       </w:r>
       <w:r>
-        <w:t xml:space="preserve">Huh et al. trained gradient-boosted trees on 9.4 million SMS authentication logs from nineteen countries, reaching 89.6% recall at 0.19% false positives on web traffic [3]. About 73% of web attacks sent four or fewer requests per identity a day, defeating per-entity limits, and destination signals were the strongest: about 92% zero conversion for attacks against 21% for genuine traffic. Their detector needs labelled traffic and acts per request. Their data show that destination aggregation is informative; we add a controlled comparison of two label-free ways to act on it per block, from send counts or code outcomes, and of their cost to users sharing a block. Theirs was not reproduced, so the two are not ranked. Zaliskyi and Odarchenko count A2P sends per prefix (a number less its last three digits) in fixed or rolling five-minute windows and quarantine a prefix for 24 hours past a day or night threshold [6]. On metadata of two confirmed incidents fixed windows blocked 95% and 63% of the traffic, and 58% of a legitimate marketing campaign; counting unique recipients blocked 2% of the campaign and none of the first incident. Theirs is a send counter judged on real traffic by messages blocked; ours compares a counter with outcome tests at a service target, in simulation, by what users sharing a block lose; the numbers are not comparable.</w:t>
+        <w:t xml:space="preserve">Huh et al. trained gradient-boosted trees on 9.4 million SMS authentication logs from nineteen countries, reaching 89.6% recall at 0.19% false positives on web traffic [3]. Approximately 73% of web attacks sent four or fewer requests per identity a day, defeating per-entity limits, and destination signals were the strongest: about 92% zero conversion for attacks against 21% for genuine traffic. Their detector requires labeled traffic and acts per request. Their data show that destination aggregation is informative; we add a controlled comparison of two label-free ways to act on it per block, from send counts or code outcomes, and of their cost to users sharing a block. Theirs was not reproduced, so the two are not ranked. Zaliskyi and Odarchenko count A2P sends per prefix (a number less its last three digits) in fixed or rolling five-minute windows and quarantine a prefix for 24 hours past a day or night threshold [6]. On metadata of two confirmed incidents fixed windows blocked 95% and 63% of the traffic, and 58% of a legitimate marketing campaign; counting unique recipients blocked 2% of the campaign and none of the first incident. Theirs is a send counter judged on real traffic by messages blocked; ours compares a counter with outcome tests at a service target, in simulation, by what users sharing a block lose; the numbers are not comparable.</w:t>
       </w:r>
     </w:p>
     <w:p>
@@ -262,13 +262,13 @@
           <w:iCs/>
           <w:i/>
         </w:rPr>
-        <w:t xml:space="preserve">Defences in practice.</w:t>
-      </w:r>
-      <w:r>
-        <w:t xml:space="preserve"> </w:t>
-      </w:r>
-      <w:r>
-        <w:t xml:space="preserve">Twilio’s Fraud Guard blocks regions known for pumping [7], and its SMS Pumping Risk Score advises friction from 60 and refusal above 90 [8], so graded destination action is established; no product was benchmarked. CAPTCHA solving is a labour market at about a dollar per thousand [9], open where machine solvers fail [10]; client puzzles [11] were not evaluated. Residential proxy addresses rotate within minutes [12], and carrier-grade NAT makes address reputation on cellular networks</w:t>
+        <w:t xml:space="preserve">Defenses in practice.</w:t>
+      </w:r>
+      <w:r>
+        <w:t xml:space="preserve"> </w:t>
+      </w:r>
+      <w:r>
+        <w:t xml:space="preserve">Twilio’s Fraud Guard blocks regions known for pumping [7], and its SMS Pumping Risk Score advises friction from 60 and refusal above 90 [8], so graded destination action is established; no product was benchmarked. CAPTCHA solving is a labor market at approximately $1 per thousand [9], open where machine solvers fail [10]; client puzzles [11] were not evaluated. Residential proxy addresses rotate within minutes [12], and carrier-grade NAT makes address reputation on cellular networks</w:t>
       </w:r>
       <w:r>
         <w:t xml:space="preserve"> </w:t>
@@ -301,7 +301,7 @@
         <w:t xml:space="preserve"> </w:t>
       </w:r>
       <w:r>
-        <w:t xml:space="preserve">One entity can present many identities [14]; a signed session gives continuity, not scarcity. Our block tests are Wald’s sequential tests [15] run as Page’s cumulative sums [16]. Quickest change detection minimises delay under false-alarm constraints [17], and a CUSUM’s parameters follow from the error rates it must meet [18]; windowed statistics and confidence sequences [19] were not evaluated, so</w:t>
+        <w:t xml:space="preserve">One entity can present many identities [14], and a signed session provides continuity, not scarcity. Our block tests are Wald’s sequential tests [15] run as Page’s cumulative sums [16]. Quickest change detection minimizes delay under false-alarm constraints [17], and a CUSUM’s parameters follow from the error rates it must meet [18]; windowed statistics and confidence sequences [19] were not evaluated, so</w:t>
       </w:r>
       <w:r>
         <w:t xml:space="preserve"> </w:t>
@@ -319,7 +319,7 @@
         <w:t xml:space="preserve"> </w:t>
       </w:r>
       <w:r>
-        <w:t xml:space="preserve">below means our conversion and speed tests only. Step 7 resembles risk-based authentication [20]; attacks on the code once sent are a separate problem [21, 22].</w:t>
+        <w:t xml:space="preserve">below means our conversion and speed tests only. Step 7 resembles risk-based authentication [20], and attacks on the code once sent are a separate problem [21, 22].</w:t>
       </w:r>
     </w:p>
     <w:bookmarkEnd w:id="21"/>
@@ -346,7 +346,7 @@
         <w:pStyle w:val="FirstParagraph"/>
       </w:pPr>
       <w:r>
-        <w:t xml:space="preserve">The baseline, v1, sends a code to any unregistered number behind seven controls: reCAPTCHA v3 on web requests only, one message per number per minute, five requests per address per minute, a country allow-list, a body-length limit, a proxy block and per-platform caps; bulk and test paths skip some checks. Table 1 lists eight assumptions behind these rules and how an attacker within the threat model below breaks each; the gaps follow from the rules, not observed abuse.</w:t>
+        <w:t xml:space="preserve">The baseline, v1, sends a code to any unregistered number behind seven controls: reCAPTCHA v3 on web requests only, one message per number per minute, five requests per address per minute, a country allow-list, a body-length limit, a proxy block, and per-platform caps; bulk and test paths skip some checks. Table 1 lists eight assumptions behind these rules and how an attacker within the threat model breaks each; the gaps follow from the rules, not observed abuse.</w:t>
       </w:r>
     </w:p>
     <w:p>
@@ -364,7 +364,11 @@
         <w:t xml:space="preserve"> </w:t>
       </w:r>
       <w:r>
-        <w:t xml:space="preserve">v1’s assumptions and how an attacker within the threat model breaks them.</w:t>
+        <w:rPr>
+          <w:bCs/>
+          <w:b/>
+        </w:rPr>
+        <w:t xml:space="preserve">v1 Assumptions and How They Fail.</w:t>
       </w:r>
     </w:p>
     <w:tbl>
@@ -378,7 +382,7 @@
           <w:right w:w="57" w:type="dxa"/>
         </w:tblCellMar>
         <w:tblLook w:firstRow="1" w:lastRow="0" w:firstColumn="0" w:lastColumn="0" w:noHBand="0" w:noVBand="0" w:val="0020"/>
-        <w:tblCaption w:val="Table 1. v1’s assumptions and how an attacker within the threat model breaks them."/>
+        <w:tblCaption w:val="Table 1. v1 Assumptions and How They Fail."/>
       </w:tblPr>
       <w:tblGrid>
         <w:gridCol w:w="509"/>
@@ -929,7 +933,7 @@
         <w:t xml:space="preserve"> </w:t>
       </w:r>
       <w:r>
-        <w:t xml:space="preserve">The attacker wants as many messages sent as possible, or sent to numbers that pay it. It buys residential proxies and human-like reCAPTCHA tokens (about 0.3 cents each), mints fingerprints, generates numbers and knows the thresholds. A pumper also has a colluding operator’s ranges, where it may enter codes, report deliveries as failed, build verified history, spread over blocks and buy challenge solutions. It cannot forge an attestation, use ranges its partner does not terminate, or make a stranger enter a code.</w:t>
+        <w:t xml:space="preserve">The attacker wants as many messages sent as possible, or sent to numbers that pay it. It buys residential proxies and human-like reCAPTCHA tokens (about 0.3 cents each), mints fingerprints, generates numbers, and knows the thresholds. A pumper also has a colluding operator’s ranges, where it may enter codes, report deliveries as failed, build verified history, spread over blocks, and buy challenge solutions. It cannot forge an attestation, use ranges its partner does not terminate, or make a stranger enter a code.</w:t>
       </w:r>
     </w:p>
     <w:bookmarkEnd w:id="22"/>
@@ -956,7 +960,7 @@
         <w:pStyle w:val="FirstParagraph"/>
       </w:pPr>
       <w:r>
-        <w:t xml:space="preserve">No message is paid for before every check passes, and cheap checks run first. Trust comes from evidence the client cannot forge, an attestation, a server-signed session and the fate of earlier codes, though such evidence can be manufactured (Section 7.8).</w:t>
+        <w:t xml:space="preserve">No message is paid for before every check passes, and cheap checks run first. Trust comes from evidence the client cannot forge, an attestation, a server-signed session, and the fate of earlier codes, though such evidence can be manufactured (Section 7.8).</w:t>
       </w:r>
     </w:p>
     <w:bookmarkStart w:id="23" w:name="the-pipeline-and-the-risk-score"/>
@@ -982,7 +986,7 @@
         <w:pStyle w:val="FirstParagraph"/>
       </w:pPr>
       <w:r>
-        <w:t xml:space="preserve">A request passes the steps of Table 2 until one refuses it. Step 0 takes the platform only from a valid App Attest or Play Integrity result. Each limit and reservation is one atomic Redis operation, but the enclosing steps are not one transaction: on the normal path a refused request gives back its per-number claims and counter slot, and the hourly budget is reserved only for a message about to be enqueued, a reservation rather than a completed dispatch; a crash between them can leak reservations (Section 6). Address limits and source caps count requests, except that a request Step 11 challenges gives its source-cap count back. Every outcome after Step 0 except the challenge returns one HTTP 200 body after at least 400 ms, a floor that cannot hide longer work.</w:t>
+        <w:t xml:space="preserve">A request passes the steps of Table 2 until it is refused. Step 0 takes the platform only from a valid App Attest or Play Integrity result. Each limit and reservation is one atomic Redis operation, but the enclosing steps are not one transaction: on the normal path, a refused request returns its per-number claims and counter slot, and the hourly budget is reserved only for a message about to be enqueued, a reservation rather than a completed dispatch; a crash between them can leak reservations (Section 6). Address limits and source caps count requests, except that a request Step 11 challenges returns its source-cap count. Every outcome after Step 0, except the challenge, returns one HTTP 200 body after at least 400 ms, a floor that cannot hide longer work.</w:t>
       </w:r>
     </w:p>
     <w:p>
@@ -1000,7 +1004,17 @@
         <w:t xml:space="preserve"> </w:t>
       </w:r>
       <w:r>
-        <w:t xml:space="preserve">The twelve steps (the v1 gaps of Table 1 they address in brackets). FB is the feedback loop.</w:t>
+        <w:rPr>
+          <w:bCs/>
+          <w:b/>
+        </w:rPr>
+        <w:t xml:space="preserve">Twelve Steps and the v1 Gaps They Address.</w:t>
+      </w:r>
+      <w:r>
+        <w:t xml:space="preserve"> </w:t>
+      </w:r>
+      <w:r>
+        <w:t xml:space="preserve">Gaps of Table 1 in brackets; FB: feedback loop.</w:t>
       </w:r>
     </w:p>
     <w:tbl>
@@ -1014,7 +1028,7 @@
           <w:right w:w="57" w:type="dxa"/>
         </w:tblCellMar>
         <w:tblLook w:firstRow="1" w:lastRow="0" w:firstColumn="0" w:lastColumn="0" w:noHBand="0" w:noVBand="0" w:val="0020"/>
-        <w:tblCaption w:val="Table 2. The twelve steps (the v1 gaps of Table 1 they address in brackets). FB is the feedback loop."/>
+        <w:tblCaption w:val="Table 2. Twelve Steps and the v1 Gaps They Address. Gaps of Table 1 in brackets; FB: feedback loop."/>
       </w:tblPr>
       <w:tblGrid>
         <w:gridCol w:w="1134"/>
@@ -1976,7 +1990,7 @@
         <w:t xml:space="preserve"> </w:t>
       </w:r>
       <w:r>
-        <w:t xml:space="preserve">mark a number and fingerprint with verified history; other weights are 5 to 25 [23]. Tiers start at 20, 40, 60 and 80:</w:t>
+        <w:t xml:space="preserve">mark a number and fingerprint with verified history; other weights are 5 to 25 [23]. Tiers start at 20, 40, 60, and 80:</w:t>
       </w:r>
       <w:r>
         <w:t xml:space="preserve"> </w:t>
@@ -1989,7 +2003,7 @@
         <w:t xml:space="preserve">allow</w:t>
       </w:r>
       <w:r>
-        <w:t xml:space="preserve">;</w:t>
+        <w:t xml:space="preserve">,</w:t>
       </w:r>
       <w:r>
         <w:t xml:space="preserve"> </w:t>
@@ -2005,7 +2019,7 @@
         <w:t xml:space="preserve"> </w:t>
       </w:r>
       <w:r>
-        <w:t xml:space="preserve">(a doubling wait);</w:t>
+        <w:t xml:space="preserve">(a doubling wait),</w:t>
       </w:r>
       <w:r>
         <w:t xml:space="preserve"> </w:t>
@@ -2038,7 +2052,7 @@
         <w:t xml:space="preserve"> </w:t>
       </w:r>
       <w:r>
-        <w:t xml:space="preserve">when solved);</w:t>
+        <w:t xml:space="preserve">when solved),</w:t>
       </w:r>
       <w:r>
         <w:t xml:space="preserve"> </w:t>
@@ -2054,7 +2068,7 @@
         <w:t xml:space="preserve"> </w:t>
       </w:r>
       <w:r>
-        <w:t xml:space="preserve">(push or WhatsApp);</w:t>
+        <w:t xml:space="preserve">(push or WhatsApp), and</w:t>
       </w:r>
       <w:r>
         <w:t xml:space="preserve"> </w:t>
@@ -2120,13 +2134,13 @@
           <w:iCs/>
           <w:i/>
         </w:rPr>
-        <w:t xml:space="preserve">failed</w:t>
-      </w:r>
-      <w:r>
-        <w:t xml:space="preserve"> </w:t>
-      </w:r>
-      <w:r>
-        <w:t xml:space="preserve">after five wrong attempts or two minutes past the delivery receipt, and</w:t>
+        <w:t xml:space="preserve">fails</w:t>
+      </w:r>
+      <w:r>
+        <w:t xml:space="preserve"> </w:t>
+      </w:r>
+      <w:r>
+        <w:t xml:space="preserve">after five incorrect attempts or two minutes past the delivery receipt, and is</w:t>
       </w:r>
       <w:r>
         <w:t xml:space="preserve"> </w:t>
@@ -2142,7 +2156,7 @@
         <w:t xml:space="preserve"> </w:t>
       </w:r>
       <w:r>
-        <w:t xml:space="preserve">without a receipt in sixty seconds or with a failure receipt; only the first two feed reputation. A positive receipt after a negative one reopens the send; a late verification reclassifies it, but an issued verdict stands. Each transition records its effects and its time in the same compare-and-set, and a recovery sweep finishes a dead process’s work; each effect type applies at most once, and exactly once if the sweep runs within 20 minutes. Reputation counts land in the transition’s hour and a block keeps its latest outage failure time, but a block’s statistic accumulates in processing order and a verdict is dated at the event that completes the crossing, so a late event can backdate a verdict that contains later evidence, moving its expiry and the next test’s start (by ten minutes in one diagnostic). Simulated runs apply events in time order; concurrent live instances may not, since a transition is committed before its effects apply, so the same dependence holds live unless a block’s effects are serialized.</w:t>
+        <w:t xml:space="preserve">without a receipt in 60 s or with a failed receipt; only the first two count toward reputation. A positive receipt after a negative one reopens the send; a late verification reclassifies it, but an issued verdict stands. Each transition records its effects and its time in the same compare-and-set, and a recovery sweep completes the work of a dead process; each effect type applies at most once, and exactly once if the sweep runs within 20 minutes. Reputation counts land in the transition’s hour, and a block keeps its latest outage failure time; however, a block’s statistic accumulates in processing order, and a verdict is dated at the event that completes the crossing; thus, a late event can backdate a verdict that contains later evidence, moving its expiry and the next test’s start (by 10 min in one diagnostic). Simulated runs apply events in time order, but concurrent live instances may not, because a transition is committed before its effects apply; thus, the same dependence holds live unless a block’s effects are serialized.</w:t>
       </w:r>
     </w:p>
     <w:bookmarkEnd w:id="24"/>
@@ -2169,7 +2183,7 @@
         <w:pStyle w:val="FirstParagraph"/>
       </w:pPr>
       <w:r>
-        <w:t xml:space="preserve">A pumper is confined to its partner’s ranges but can rotate numbers and blocks within them. Destination policies are keyed on the 8-digit block (10 000 numbers), so protection weakens as a pumper spreads.</w:t>
+        <w:t xml:space="preserve">A pumper is confined to its partner’s ranges but can rotate numbers and blocks within them. Destination policies are keyed on the 8-digit block (10 000 numbers); therefore, protection weakens as a pumper spreads.</w:t>
       </w:r>
     </w:p>
     <w:p>
@@ -2187,7 +2201,7 @@
         <w:t xml:space="preserve"> </w:t>
       </w:r>
       <w:r>
-        <w:t xml:space="preserve">The conversion statistic assumes users verify with</w:t>
+        <w:t xml:space="preserve">The conversion statistic assumes that users verify with</w:t>
       </w:r>
       <w:r>
         <w:t xml:space="preserve"> </w:t>
@@ -2393,7 +2407,7 @@
         </m:r>
       </m:oMath>
       <w:r>
-        <w:t xml:space="preserve">. The speed statistic assumes a machine enters a verified code within five seconds with</w:t>
+        <w:t xml:space="preserve">. The speed statistic assumes that a machine enters a verified code within five seconds with</w:t>
       </w:r>
       <w:r>
         <w:t xml:space="preserve"> </w:t>
@@ -2457,7 +2471,7 @@
         </m:r>
       </m:oMath>
       <w:r>
-        <w:t xml:space="preserve">, since autofill removes the keystroke [24, 25]; it adds</w:t>
+        <w:t xml:space="preserve">, because autofill removes the keystroke [24, 25]; it adds</w:t>
       </w:r>
       <w:r>
         <w:t xml:space="preserve"> </w:t>
@@ -2488,7 +2502,7 @@
         </m:r>
       </m:oMath>
       <w:r>
-        <w:t xml:space="preserve">. A verdict is issued, and the statistic reset, when either exceeds</w:t>
+        <w:t xml:space="preserve">. A verdict is issued, and the statistic is reset when either exceeds</w:t>
       </w:r>
       <w:r>
         <w:t xml:space="preserve"> </w:t>
@@ -2698,7 +2712,7 @@
         <w:t xml:space="preserve"> </w:t>
       </w:r>
       <w:r>
-        <w:t xml:space="preserve">A counter limits SMS sends per block in a daily or short refilling window. Step 11 reserves a slot and decides the stage in one atomic operation when an SMS is about to go out, so concurrent requests cannot skip the challenge. Past the limit a graded counter challenges first-time clients, and past twice the limit moves them off SMS; a refusing counter refuses. Clients with verified history are exempt from both policies, so a code entered on a pumper’s number can buy that number an exemption. A token bucket of the same rate (burst 4 or 12; unlike RFC 2697’s excess bucket [26], its challenge-tier bucket refills independently) and the counter combined with the tests were also explored.</w:t>
+        <w:t xml:space="preserve">A counter limits the number of SMS sent per block in a daily or short refilling window. Step 11 reserves a slot and decides the stage in one atomic operation when an SMS is about to be sent, so concurrent requests cannot skip the challenge. Past the limit, a graded counter challenges first-time clients, and past twice the limit moves them off SMS; a refusing counter refuses. Clients with verified history are exempt from both policies; therefore, a code entered on a pumper’s number can buy that number an exemption. A token bucket of the same rate (burst 4 or 12; its challenge-tier bucket refills independently, unlike RFC 2697’s [26]) and the counter combined with the tests were also explored.</w:t>
       </w:r>
     </w:p>
     <w:bookmarkEnd w:id="25"/>
@@ -2725,7 +2739,7 @@
         <w:pStyle w:val="FirstParagraph"/>
       </w:pPr>
       <w:r>
-        <w:t xml:space="preserve">Step 9 multiplies its caps by 0.25 to 1.5 according to a baseline job comparing each key with its expected rate, learned from the pipeline’s hourly counters; without history the static cap stands. Verified history avoids the adaptive reduction, not the static caps or the budget, which bounds SMS count and spend, not vendor or fallback costs.</w:t>
+        <w:t xml:space="preserve">Step 9 multiplies its caps by 0.25 to 1.5 according to a baseline job comparing each key with its expected rate, learned from the pipeline’s hourly counters; without history, the static cap stands. Verified history avoids adaptive reduction, not the static caps or the budget, which bounds SMS count and spend, not vendor or fallback costs.</w:t>
       </w:r>
     </w:p>
     <w:bookmarkEnd w:id="26"/>
@@ -2753,7 +2767,7 @@
         <w:pStyle w:val="FirstParagraph"/>
       </w:pPr>
       <w:r>
-        <w:t xml:space="preserve">We compare the SMS sent to a pumper’s numbers over an attack of</w:t>
+        <w:t xml:space="preserve">We compare the SMS sent to a pumper’s number over an attack of</w:t>
       </w:r>
       <w:r>
         <w:t xml:space="preserve"> </w:t>
@@ -2968,7 +2982,7 @@
         </m:r>
       </m:oMath>
       <w:r>
-        <w:t xml:space="preserve">, the time a send stays unresolved, is the resolution timeout plus the delivery delay plus half the timeout worker’s period (2.55 minutes) if the carrier never verifies, and seconds if it verifies at once. Judged, such a pumper is held for the verdict’s hour, so for</w:t>
+        <w:t xml:space="preserve">, the time a send stays unresolved, is the resolution timeout plus the delivery delay plus half the timeout worker’s period (2.55 minutes) if the carrier never verifies, and seconds if it verifies at once. Judged, such a pumper is held for the verdict’s hour; therefore, for</w:t>
       </w:r>
       <w:r>
         <w:t xml:space="preserve"> </w:t>
@@ -2991,7 +3005,7 @@
         <w:t xml:space="preserve"> </w:t>
       </w:r>
       <w:r>
-        <w:t xml:space="preserve">Equation (2) also estimates the attack’s total; it ignores prior credit and outage suspension. A carrier verifying a share</w:t>
+        <w:t xml:space="preserve">Equation (2) also estimates the attack’s total, ignoring prior credit and outage suspension. A carrier verifying a share</w:t>
       </w:r>
       <w:r>
         <w:t xml:space="preserve"> </w:t>
@@ -3005,7 +3019,7 @@
         <w:t xml:space="preserve"> </w:t>
       </w:r>
       <w:r>
-        <w:t xml:space="preserve">of codes with human-like delay gives the conversion statistic an expected increment of</w:t>
+        <w:t xml:space="preserve">of codes with a human-like delay gives the conversion statistic an expected increment of</w:t>
       </w:r>
       <w:r>
         <w:t xml:space="preserve"> </w:t>
@@ -3109,7 +3123,7 @@
         </m:r>
       </m:oMath>
       <w:r>
-        <w:t xml:space="preserve">; above it the statistic drifts away from a verdict.</w:t>
+        <w:t xml:space="preserve">; above it, the statistic drifts away from a verdict.</w:t>
       </w:r>
     </w:p>
     <w:p>
@@ -3131,7 +3145,7 @@
         <w:t xml:space="preserve"> </w:t>
       </w:r>
       <w:r>
-        <w:t xml:space="preserve">sends per block opens a window with a block’s first reserved SMS and closes it after the window length. A pumper that finds its blocks’ counters empty (a cold start) sends at most</w:t>
+        <w:t xml:space="preserve">sends per block opens a window with the block’s first reserved SMS and closes it after the window length. A pumper that finds its blocks’ counters empty (a cold start) sends at most</w:t>
       </w:r>
     </w:p>
     <w:p>
@@ -3610,7 +3624,7 @@
         <w:pStyle w:val="FirstParagraph"/>
       </w:pPr>
       <w:r>
-        <w:t xml:space="preserve">Solving challenges doubles these bounds, and verified history exempts a client from them. While neither policy’s estimate reaches</w:t>
+        <w:t xml:space="preserve">Solving challenges doubles these bounds, and a verified history exempts a client from them. While neither policy’s estimate reaches</w:t>
       </w:r>
       <w:r>
         <w:t xml:space="preserve"> </w:t>
@@ -3697,7 +3711,7 @@
         <w:pStyle w:val="FirstParagraph"/>
       </w:pPr>
       <w:r>
-        <w:t xml:space="preserve">and a warm start adds the residual quota to the left side. Equation (5) is the algebraic crossing of two simplified quantities, neither an empirically established switching point nor a necessary condition: other limits can hold either policy below its estimate. A carrier that games outcomes may never be judged, so the tests’ leakage approaches</w:t>
+        <w:t xml:space="preserve">and a warm start adds the residual quota to the left side. Equation (5) is the algebraic crossing of two simplified quantities, neither of which is an empirically established switching point or a necessary condition: other limits can hold either policy below its estimate. A carrier that games outcomes may never be judged, so the tests’ leakage approaches</w:t>
       </w:r>
       <w:r>
         <w:t xml:space="preserve"> </w:t>
@@ -3716,7 +3730,7 @@
         <w:pStyle w:val="BodyText"/>
       </w:pPr>
       <w:r>
-        <w:t xml:space="preserve">In the code every send takes a slot, verified clients’ included. If a block’s sends arrive as a Poisson stream with mean</w:t>
+        <w:t xml:space="preserve">In the code, every send takes a slot, verified clients’ included. If a block’s sends arrive as a Poisson stream with mean</w:t>
       </w:r>
       <w:r>
         <w:t xml:space="preserve"> </w:t>
@@ -3993,7 +4007,7 @@
         </m:r>
       </m:oMath>
       <w:r>
-        <w:t xml:space="preserve">. It is not a challenge rate: exempt clients take slots without challenge, and challenge failures, the second tier and earlier gates are ignored. The estimates use only the rules, the configuration and the attack’s rate; what an excess send costs a user needs the simulation.</w:t>
+        <w:t xml:space="preserve">. This is not a challenge rate: exempt clients take slots without challenge, and challenge failures, the second tier and earlier gates are ignored. The estimates use only the rules, configuration, and attack rate; what an excess send costs a user needs the simulation.</w:t>
       </w:r>
     </w:p>
     <w:bookmarkEnd w:id="28"/>
@@ -4030,7 +4044,7 @@
         <w:t xml:space="preserve"> </w:t>
       </w:r>
       <w:r>
-        <w:t xml:space="preserve">About 4 000 lines of Python implement the pipeline on in-memory and Redis backends. Up to release 2.8.3 the simulator’s in-memory store let a sorted set expire a fixed time after its first write, whereas Redis keeps it while it is written to, so in simulation the outage detector and Step 5 lost recent observations. Release 2.9.0 follows Redis in every rule compared, checked by differential tests, and every study was rerun with it; earlier releases repaired seven replay and concurrency defects, each with a regression test. Of 453 tests, 19 use a real</w:t>
+        <w:t xml:space="preserve">Approximately 4 000 lines of Python implement the pipeline on in-memory and Redis backends. Up to release 2.8.3, the simulator’s in-memory store let a sorted set expire a fixed time after its first write, whereas Redis kept it while written to; therefore, the simulated outage detector and Step 5 lost recent observations. Release 2.9.0 follows Redis in every rule compared, checked by differential tests, and every study was rerun with it; earlier releases repaired seven replay and concurrency defects, each with a regression test. Of 453 tests, 19 used a real</w:t>
       </w:r>
       <w:r>
         <w:t xml:space="preserve"> </w:t>
@@ -4042,7 +4056,7 @@
         <w:t xml:space="preserve">redis-server</w:t>
       </w:r>
       <w:r>
-        <w:t xml:space="preserve">, 18 testing specific interleavings of two instances, not all. Step 11 is still not one transaction: a crash after its reservations leaks reserved slots or resolves the send as undelivered. The implementation is a research prototype.</w:t>
+        <w:t xml:space="preserve">, 18 tested specific interleavings of two instances, not all. Step 11 was still not one transaction: a crash after its reservations leaked reserved slots or resolved the send as undelivered. The implementation was a research prototype.</w:t>
       </w:r>
     </w:p>
     <w:p>
@@ -4060,7 +4074,7 @@
         <w:t xml:space="preserve"> </w:t>
       </w:r>
       <w:r>
-        <w:t xml:space="preserve">The pipeline runs against scripted vendor fakes on a simulated clock. After a warm-up of ten minutes (30 or 130 for pumping), attacks run over legitimate traffic at 20 requests per minute. Simulated users verify 80% of codes after a lognormal delay (median 22 s; 2 s for the 20% using autofill); 70% of numbers are reachable on WhatsApp; 90% of users complete a challenge; 20% are returning account holders with a stable fingerprint, a trusted number and verified history, so results for returning users describe trusted identities only. Separate random streams give all scenarios at a seed the same users.</w:t>
+        <w:t xml:space="preserve">The pipeline runs against scripted vendor fakes on a simulated clock. After a warm-up of ten minutes (30 or 130 for pumping), attacks run over legitimate traffic at 20 requests per minute. Simulated users verify 80% of codes after a lognormal delay (median 22 s; 2 s for the 20% using autofill); 70% of numbers are reachable on WhatsApp; 90% of users complete a challenge; 20% are returning account holders with a stable fingerprint, a trusted number, and verified history; thus, the results for returning users describe trusted identities only. Separate random streams provide all scenarios at the same seed with the same users.</w:t>
       </w:r>
     </w:p>
     <w:p>
@@ -4068,7 +4082,7 @@
         <w:pStyle w:val="BodyText"/>
       </w:pPr>
       <w:r>
-        <w:t xml:space="preserve">Three behavioural parameters have published counterparts: genuine conversion (one provider’s 68% or more [27]; ours 60 to 90%) and the never-converting destinations and identity churn of Section 2; the rest are assumptions. Attackers (Table 3) draw pool size, rate and CAPTCHA class per seed, which explains 92% [80, 98] of the variance of the farm’s leakage in a nested design (ten configurations, three seeds each). Brackets are 95% percentile-bootstrap intervals, paired per seed for differences; they describe variation under this generator, not uncertainty about real traffic.</w:t>
+        <w:t xml:space="preserve">Three behavioral parameters have published counterparts: genuine conversion (one provider’s 68% or more [27]; ours 60%–90%) and the never-converting destinations and identity churn of Section 2; the rest are assumptions. Attackers (Table 3) draw pool size, rate, and CAPTCHA class per seed, which explains 92% [80, 98] of the variance of the farm’s leakage in a nested design (ten configurations, three seeds each). Brackets are 95% percentile-bootstrap intervals, paired per seed for differences; they describe variation under this generator, not uncertainty about real traffic.</w:t>
       </w:r>
     </w:p>
     <w:p>
@@ -4095,7 +4109,7 @@
         <w:t xml:space="preserve">results/ study_map.md</w:t>
       </w:r>
       <w:r>
-        <w:t xml:space="preserve">) gives each study’s seeds. The first protocol, committed before its runs, fixed the matched comparison and a robustness study over twelve Latin-hypercube points (conversion 0.6–0.9 and five other behavioural parameters) and a held-out family (60 to 120 attack requests a minute, 50 000 to 500 000 addresses, heterogeneous legitimate traffic), with claims C1–C5 that hold if true in 90% of cells, a benchmark convention, not a confidence level. The matched comparison changes only the destination policy and, at three block densities, selects on tuning seeds the least leakage summed over four concentrated pumpers among settings at or above the</w:t>
+        <w:t xml:space="preserve">) gives each study’s seeds. The first protocol, committed before its runs, fixed the matched comparison and a robustness study over 12 Latin-hypercube points (conversion 0.6–0.9 and five other behavioral parameters) and a held-out family (60 to 120 attack requests a minute, 50 000 to 500 000 addresses, heterogeneous legitimate traffic), with claims C1–C5 that hold if true in 90% of cells, a benchmark convention, not a confidence level. The matched comparison changes only the destination policy and, at three block densities, selects on tuning seeds the least leakage summed over four concentrated pumpers among settings at or above the</w:t>
       </w:r>
       <w:r>
         <w:t xml:space="preserve"> </w:t>
@@ -4108,7 +4122,7 @@
         <w:t xml:space="preserve">tuning target</w:t>
       </w:r>
       <w:r>
-        <w:t xml:space="preserve">, the default’s completion minus 0.5 points (the full sequential grid only at the busiest). The robustness study’s first run failed C1 in 32 of 108 cells because attack and no-attack runs drew different users; we fixed the pairing, a fix that followed a result, and reran every study. The second protocol (claims K1–K5) was written after the matched comparison had selected three counters and committed before its runs; six of its seed values had served other robustness points, never selection. Both were rerun unchanged with 2.9.0 (9 919, 7 925 and 240 runs, each carrying its code hash); against 2.8.0, total leakage changed in 855 of 17 964 comparable runs, but the principal selections, eligibility decisions and claim counts did not; one auxiliary setting (false alarms matched at unbounded credit) moved from</w:t>
+        <w:t xml:space="preserve">, the default’s completion minus 0.5 points. The robustness study’s first run failed C1 in 32 of 108 cells because attack and no-attack runs drew different users; we fixed the pairing, a fix that followed a result, and reran every study. The second protocol (claims K1–K5) was written after the matched comparison had selected three counters and committed before its runs; six of its seed values had served other robustness points, never selection. Both were rerun unchanged with 2.9.0 (9 919, 7 925 and 240 runs, each carrying its code hash); against 2.8.0, total leakage changed in 855 of 17 964 comparable runs, but the principal selections, eligibility decisions, and claim counts did not; one auxiliary setting (false alarms matched at unbounded credit) moved from</w:t>
       </w:r>
       <w:r>
         <w:t xml:space="preserve"> </w:t>
@@ -4353,7 +4367,17 @@
         <w:t xml:space="preserve"> </w:t>
       </w:r>
       <w:r>
-        <w:t xml:space="preserve">The 25 attacker profiles by capability, and the destination policies each faced: S, sequential tests; C, counters; B, block-limit. Names and parameters:</w:t>
+        <w:rPr>
+          <w:bCs/>
+          <w:b/>
+        </w:rPr>
+        <w:t xml:space="preserve">Attacker Profiles, Capabilities, and Policies.</w:t>
+      </w:r>
+      <w:r>
+        <w:t xml:space="preserve"> </w:t>
+      </w:r>
+      <w:r>
+        <w:t xml:space="preserve">Policies faced: S, sequential tests; C, counters; B, block-limit. Parameters:</w:t>
       </w:r>
       <w:r>
         <w:t xml:space="preserve"> </w:t>
@@ -4379,7 +4403,7 @@
           <w:right w:w="57" w:type="dxa"/>
         </w:tblCellMar>
         <w:tblLook w:firstRow="1" w:lastRow="0" w:firstColumn="0" w:lastColumn="0" w:noHBand="0" w:noVBand="0" w:val="0020"/>
-        <w:tblCaption w:val="Table 3. The 25 attacker profiles by capability, and the destination policies each faced: S, sequential tests; C, counters; B, block-limit. Names and parameters: results/ attacker_profiles.md."/>
+        <w:tblCaption w:val="Table 3. Attacker Profiles, Capabilities, and Policies. Policies faced: S, sequential tests; C, counters; B, block-limit. Parameters: results/ attacker_profiles.md."/>
       </w:tblPr>
       <w:tblGrid>
         <w:gridCol w:w="3771"/>
@@ -4897,7 +4921,17 @@
         <w:t xml:space="preserve"> </w:t>
       </w:r>
       <w:r>
-        <w:t xml:space="preserve">Leaked share (%, mean of per-run shares) of about 600 attack requests in twenty minutes, thirty seeds, under v1, the block-limit design (BL) and v2 with source caps lifted, and under v2 with caps on, with the first-time users refused and all users completing (%). All designs, with intervals: supplementary Table S1 (</w:t>
+        <w:rPr>
+          <w:bCs/>
+          <w:b/>
+        </w:rPr>
+        <w:t xml:space="preserve">Leakage and User Impact Across Designs.</w:t>
+      </w:r>
+      <w:r>
+        <w:t xml:space="preserve"> </w:t>
+      </w:r>
+      <w:r>
+        <w:t xml:space="preserve">Leaked share (%, mean of per-run shares) of about 600 attack requests in 20 minutes, 30 seeds, under v1, block-limit (BL) and v2 with source caps lifted, and under v2 with caps on, with first-time users refused and all users completing (%). All designs, with intervals: supplementary Table S1 (</w:t>
       </w:r>
       <w:r>
         <w:rPr>
@@ -4920,7 +4954,7 @@
           <w:right w:w="57" w:type="dxa"/>
         </w:tblCellMar>
         <w:tblLook w:firstRow="0" w:lastRow="0" w:firstColumn="0" w:lastColumn="0" w:noHBand="0" w:noVBand="0" w:val="0000"/>
-        <w:tblCaption w:val="Table 4. Leaked share (%, mean of per-run shares) of about 600 attack requests in twenty minutes, thirty seeds, under v1, the block-limit design (BL) and v2 with source caps lifted, and under v2 with caps on, with the first-time users refused and all users completing (%). All designs, with intervals: supplementary Table S1 (results/ design_table.md)."/>
+        <w:tblCaption w:val="Table 4. Leakage and User Impact Across Designs. Leaked share (%, mean of per-run shares) of about 600 attack requests in 20 minutes, 30 seeds, under v1, block-limit (BL) and v2 with source caps lifted, and under v2 with caps on, with first-time users refused and all users completing (%). All designs, with intervals: supplementary Table S1 (results/ design_table.md)."/>
       </w:tblPr>
       <w:tblGrid>
         <w:gridCol w:w="2801"/>
@@ -6319,7 +6353,7 @@
         <w:pStyle w:val="BodyText"/>
       </w:pPr>
       <w:r>
-        <w:t xml:space="preserve">Datacenter rotation leaks nothing under v2 because it scores in the challenge tier and declines challenges; Step 5 refuses the premium range, and the session cap holds the single client to two messages (Table 4); in all 108 robustness cells these attacks leaked under 5% at completion within two points of the paired no-attack run (claim C1). The walk leaks 61 [53, 70] messages before its block’s verdict (block-limit: five), the reused profile 89 [83, 95].</w:t>
+        <w:t xml:space="preserve">Datacenter rotation leaks nothing under v2 because it scores in the challenge tier and declines challenges; Step 5 refuses the premium range, and the session cap holds the single client to two messages (Table 4); in all 108 robustness cells, these attacks leaked under 5% at completion within two points of the paired no-attack run (claim C1). The walk leaks 61 [53, 70] messages before its block’s verdict (block-limit: five), and the reused profile 89 [83, 95].</w:t>
       </w:r>
     </w:p>
     <w:p>
@@ -6354,7 +6388,7 @@
         <w:pStyle w:val="FirstParagraph"/>
       </w:pPr>
       <w:r>
-        <w:t xml:space="preserve">In the ablation grid (90 effects, each conditional on all other layers, unadjusted intervals; artifact), removing the adaptive caps lets the farm leak 310 [194, 421] more messages; the risk engine, feedback loop and block key hold the walk by 166, 152 and 121 messages, and the loop holds the reused profile by 138. The key acts only through the loop (interaction</w:t>
+        <w:t xml:space="preserve">In the ablation grid (90 effects, each conditional on all other layers, unadjusted intervals; artifact), removing the adaptive caps lets the farm leak 310 [194, 421] more messages; the risk engine, feedback loop, and block key hold the walk by 166, 152, and 121 messages, and the loop holds the reused profile by 138. The key acts only through the loop (interaction</w:t>
       </w:r>
       <w:r>
         <w:t xml:space="preserve"> </w:t>
@@ -6432,7 +6466,7 @@
         <w:pStyle w:val="FirstParagraph"/>
       </w:pPr>
       <w:r>
-        <w:t xml:space="preserve">A farmed-CAPTCHA attacker uses an address and fingerprint once and shares its country, prefix and residential ASN with every legitimate user, so its failures penalize everyone: over an hour with caps lifted (five seeds), up to twice the legitimate rate 99 to 100% of it leaks, since a shared key stays above 0.3 conversion until failures outnumber legitimate sends about 1.7 to one. At ten times, 70% leaks while 17% of legitimate users are challenged and 3.2% refused (claim C2, at least 90% leaked with caps lifted, held in 34 of 36 cells). No single change to the risk score separates better: a fresh-fingerprint weight of 40 stops the attacker only by challenging 47% of legitimate users. In the settings run, reputation separated an attacker only on keys its sends dominated [14].</w:t>
+        <w:t xml:space="preserve">A farmed-CAPTCHA attacker uses an address and fingerprint once and shares its country, prefix, and residential ASN with every legitimate user; thus, its failures penalize everyone: over an hour with caps lifted (five seeds), up to twice the legitimate rate, 99 to 100% of it leaks, since a shared key stays above 0.3 conversion until failures outnumber legitimate sends about 1.7 to one. At ten times, 70% leaks while 17% of legitimate users are challenged and 3.2% refused (claim C2, at least 90% leaked with caps lifted, held in 34 of 36 cells). No single score change separates better: a fresh-fingerprint weight of 40 stops it only by challenging 47% of legitimate users. In the settings run, reputation separated an attacker only on keys its sends dominated [14].</w:t>
       </w:r>
     </w:p>
     <w:bookmarkEnd w:id="32"/>
@@ -6459,7 +6493,7 @@
         <w:pStyle w:val="FirstParagraph"/>
       </w:pPr>
       <w:r>
-        <w:t xml:space="preserve">When separation fails, the cap is the lever: over ten seeds the default lets 47% of the farm’s requests through and refuses 41% of all legitimate users, the tightest setting 20% and 64%. Both assume an oracle job, told the legitimate rate and run every minute; run every five minutes or hourly, it lets 75 to 96% through. Learning the rate from the pipeline’s counters, the deployed job leaks 193 [161, 229] messages with a clean three-week profile, 340 [239, 441] more on a cold start, 106 [62, 151] more with a stale profile and 45 [10, 77] more with a poisoned one.</w:t>
+        <w:t xml:space="preserve">When separation fails, the cap is the lever: over ten seeds, the default lets 47% of the farm’s requests through and refuses 41% of all legitimate users, the tightest setting 20% and 64%. Both assume an oracle job that is told the legitimate rate and runs every minute; running every five minutes or hourly, it lets 75%–96% through. Learning the rate from the pipeline’s counters, the deployed job leaks 193 [161, 229] messages with a clean three-week profile, 340 [239, 441] more on a cold start, 106 [62, 151] more with a stale profile, and 45 [10, 77] more with a poisoned one.</w:t>
       </w:r>
     </w:p>
     <w:bookmarkEnd w:id="33"/>
@@ -6496,7 +6530,17 @@
         <w:t xml:space="preserve"> </w:t>
       </w:r>
       <w:r>
-        <w:t xml:space="preserve">Concentrated pumpers on three blocks, caps lifted, ten seeds: messages leaked of about 574 requests in twenty minutes; seeds contained; mean minutes to containment (contained seeds) and to the first verdict (seeds with one); codes entered.</w:t>
+        <w:rPr>
+          <w:bCs/>
+          <w:b/>
+        </w:rPr>
+        <w:t xml:space="preserve">Containment Results for Concentrated Pumping Attacks.</w:t>
+      </w:r>
+      <w:r>
+        <w:t xml:space="preserve"> </w:t>
+      </w:r>
+      <w:r>
+        <w:t xml:space="preserve">Three blocks, caps lifted, ten seeds: messages leaked of about 574 requests in twenty minutes; seeds contained; mean minutes to containment (contained seeds) and to the first verdict (seeds with one); codes entered.</w:t>
       </w:r>
     </w:p>
     <w:tbl>
@@ -6510,7 +6554,7 @@
           <w:right w:w="57" w:type="dxa"/>
         </w:tblCellMar>
         <w:tblLook w:firstRow="0" w:lastRow="0" w:firstColumn="0" w:lastColumn="0" w:noHBand="0" w:noVBand="0" w:val="0000"/>
-        <w:tblCaption w:val="Table 5. Concentrated pumpers on three blocks, caps lifted, ten seeds: messages leaked of about 574 requests in twenty minutes; seeds contained; mean minutes to containment (contained seeds) and to the first verdict (seeds with one); codes entered."/>
+        <w:tblCaption w:val="Table 5. Containment Results for Concentrated Pumping Attacks. Three blocks, caps lifted, ten seeds: messages leaked of about 574 requests in twenty minutes; seeds contained; mean minutes to containment (contained seeds) and to the first verdict (seeds with one); codes entered."/>
       </w:tblPr>
       <w:tblGrid>
         <w:gridCol w:w="2918"/>
@@ -7453,7 +7497,7 @@
         <w:pStyle w:val="BodyText"/>
       </w:pPr>
       <w:r>
-        <w:t xml:space="preserve">In Table 5 the speed test catches a carrier verifying within a second at 19 messages, while the carrier verifying 60% with human-like delay is contained in none of ten twenty-minute runs: its first verdict comes at minute 11.6 on average and 452 messages leak; in an hour 1 067 leak and two of ten runs are contained, at minute 47.0 on average. Claim C3 (containment with at most 30% leaked) held in 36 of 36 cells.</w:t>
+        <w:t xml:space="preserve">In Table 5, the speed test catches a carrier verifying within a second at 19 messages, while the carrier verifying 60% with human-like delay is contained in none of the ten 20-minute runs: its first verdict comes at minute 11.6 on average and 452 messages leak; in an hour, 1 067 leak and two of ten runs are contained, at minute 47.0 on average. Claim C3 (containment with at most 30% leaked) held in 36 of 36 cells.</w:t>
       </w:r>
     </w:p>
     <w:p>
@@ -7461,7 +7505,7 @@
         <w:pStyle w:val="BodyText"/>
       </w:pPr>
       <w:r>
-        <w:t xml:space="preserve">Across 18 spread configurations leakage follows the blocks touched: with 30 blocks five to seven runs in ten are still contained. Unsaturated, Equation (2) errs by 1.6 to 7.9 messages per run (1 to 13%, ten configurations); saturated, it overstates by up to 91.</w:t>
+        <w:t xml:space="preserve">Across 18 spread configurations, leakage follows the blocks touched: with 30 blocks, five to seven runs in ten are still contained. Unsaturated, Equation (2) errs by 1.6 to 7.9 messages per run (1%–13%, ten configurations); saturated, it overstates by up to 91.</w:t>
       </w:r>
     </w:p>
     <w:bookmarkEnd w:id="34"/>
@@ -7498,7 +7542,17 @@
         <w:t xml:space="preserve"> </w:t>
       </w:r>
       <w:r>
-        <w:t xml:space="preserve">Matched comparison, first protocol, 200 blocks (144 legitimate sends per block a day), tuning seeds 100–102, evaluation seeds 0–9: twenty-minute leakage (messages) by never-verifying (NV), instant (IV), human-like (HL) and challenge-buying (CB) carriers; from 24-hour attack-free runs at 65% conversion, completion, benign cost (points), users challenged and verdict events a day. Tuning target: 63.95%.</w:t>
+        <w:rPr>
+          <w:bCs/>
+          <w:b/>
+        </w:rPr>
+        <w:t xml:space="preserve">Leakage and Benign-User Impact Across Carrier Types.</w:t>
+      </w:r>
+      <w:r>
+        <w:t xml:space="preserve"> </w:t>
+      </w:r>
+      <w:r>
+        <w:t xml:space="preserve">First protocol, 200 blocks (144 legitimate sends per block a day), tuning seeds 100–102, evaluation seeds 0–9: 20-minute leakage (messages) by never-verifying (NV), instant (IV), human-like (HL) and challenge-buying (CB) carriers; from 24-hour attack-free runs at 65% conversion, completion, benign cost (points), users challenged and verdict events a day. Tuning target: 63.95%.</w:t>
       </w:r>
     </w:p>
     <w:tbl>
@@ -7512,7 +7566,7 @@
           <w:right w:w="57" w:type="dxa"/>
         </w:tblCellMar>
         <w:tblLook w:firstRow="1" w:lastRow="0" w:firstColumn="0" w:lastColumn="0" w:noHBand="0" w:noVBand="0" w:val="0020"/>
-        <w:tblCaption w:val="Table 6. Matched comparison, first protocol, 200 blocks (144 legitimate sends per block a day), tuning seeds 100–102, evaluation seeds 0–9: twenty-minute leakage (messages) by never-verifying (NV), instant (IV), human-like (HL) and challenge-buying (CB) carriers; from 24-hour attack-free runs at 65% conversion, completion, benign cost (points), users challenged and verdict events a day. Tuning target: 63.95%."/>
+        <w:tblCaption w:val="Table 6. Leakage and Benign-User Impact Across Carrier Types. First protocol, 200 blocks (144 legitimate sends per block a day), tuning seeds 100–102, evaluation seeds 0–9: 20-minute leakage (messages) by never-verifying (NV), instant (IV), human-like (HL) and challenge-buying (CB) carriers; from 24-hour attack-free runs at 65% conversion, completion, benign cost (points), users challenged and verdict events a day. Tuning target: 63.95%."/>
       </w:tblPr>
       <w:tblGrid>
         <w:gridCol w:w="4053"/>
@@ -8736,7 +8790,17 @@
         <w:t xml:space="preserve"> </w:t>
       </w:r>
       <w:r>
-        <w:t xml:space="preserve">Matched comparison, first protocol, 200 blocks, evaluation seeds 0–9: each setting’s completion in 24-hour attack-free runs at 65% conversion against its 20-minute leakage summed over the four concentrated pumpers’ runs of a seed (not one combined attack). Bars: 95% bootstrap intervals over seeds. Dotted line: the tuning target. Unlabelled points: sequential settings matched to the default’s false alarms at other credits (key:</w:t>
+        <w:rPr>
+          <w:bCs/>
+          <w:b/>
+        </w:rPr>
+        <w:t xml:space="preserve">Leakage vs. Legitimate-User Completion Across Settings.</w:t>
+      </w:r>
+      <w:r>
+        <w:t xml:space="preserve"> </w:t>
+      </w:r>
+      <w:r>
+        <w:t xml:space="preserve">First protocol, 200 blocks, evaluation seeds 0–9: each setting’s completion in 24-hour attack-free runs at 65% conversion against its 20-minute leakage summed over the four concentrated pumpers’ runs of a seed (not one combined attack). Bars: 95% bootstrap intervals over seeds. Dotted line: the tuning target. Unlabeled points: sequential settings matched to the default’s false alarms at other credits (key:</w:t>
       </w:r>
       <w:r>
         <w:t xml:space="preserve"> </w:t>
@@ -8813,7 +8877,17 @@
         <w:t xml:space="preserve"> </w:t>
       </w:r>
       <w:r>
-        <w:t xml:space="preserve">Matched comparison, first protocol, 200 blocks, evaluation seeds 0–9, 20-minute attacks: for each selected setting and each concentrated pumper, the setting’s leakage minus the default’s, paired per seed (negative: leaks less), with 95% bootstrap intervals over seeds.</w:t>
+        <w:rPr>
+          <w:bCs/>
+          <w:b/>
+        </w:rPr>
+        <w:t xml:space="preserve">Leakage Difference from the Default Across Attack Types.</w:t>
+      </w:r>
+      <w:r>
+        <w:t xml:space="preserve"> </w:t>
+      </w:r>
+      <w:r>
+        <w:t xml:space="preserve">First protocol, 200 blocks, evaluation seeds 0–9, 20-minute attacks: for each selected setting and concentrated pumper, leakage minus the default’s, paired per seed (negative: leaks less), with 95% bootstrap intervals over seeds.</w:t>
       </w:r>
     </w:p>
     <w:p>
@@ -8831,7 +8905,17 @@
         <w:t xml:space="preserve"> </w:t>
       </w:r>
       <w:r>
-        <w:t xml:space="preserve">The second protocol’s claims for the principal counter (graded, 4 per 10 min) on the held-out family: 12 shifted points, held-out attack rates and pools, three seeds each, a 20-minute pumper on three blocks real users share. A claim holds if true in 90% of cells; cells share workloads and seeds and are not independent. IV: the instant verifier’s cells.</w:t>
+        <w:rPr>
+          <w:bCs/>
+          <w:b/>
+        </w:rPr>
+        <w:t xml:space="preserve">Held-Out Evaluation of the Principal Counter.</w:t>
+      </w:r>
+      <w:r>
+        <w:t xml:space="preserve"> </w:t>
+      </w:r>
+      <w:r>
+        <w:t xml:space="preserve">Second-protocol claims for the graded counter of 4 per 10 min on the held-out family: 12 shifted points, held-out attack rates and pools, three seeds each, a 20-minute pumper on three blocks real users share. A claim holds if true in 90% of cells; cells share workloads and seeds and are not independent. IV: the instant verifier’s cells.</w:t>
       </w:r>
     </w:p>
     <w:tbl>
@@ -8845,7 +8929,7 @@
           <w:right w:w="57" w:type="dxa"/>
         </w:tblCellMar>
         <w:tblLook w:firstRow="1" w:lastRow="0" w:firstColumn="0" w:lastColumn="0" w:noHBand="0" w:noVBand="0" w:val="0020"/>
-        <w:tblCaption w:val="Table 7. The second protocol’s claims for the principal counter (graded, 4 per 10 min) on the held-out family: 12 shifted points, held-out attack rates and pools, three seeds each, a 20-minute pumper on three blocks real users share. A claim holds if true in 90% of cells; cells share workloads and seeds and are not independent. IV: the instant verifier’s cells."/>
+        <w:tblCaption w:val="Table 7. Held-Out Evaluation of the Principal Counter. Second-protocol claims for the graded counter of 4 per 10 min on the held-out family: 12 shifted points, held-out attack rates and pools, three seeds each, a 20-minute pumper on three blocks real users share. A claim holds if true in 90% of cells; cells share workloads and seeds and are not independent. IV: the instant verifier’s cells."/>
       </w:tblPr>
       <w:tblGrid>
         <w:gridCol w:w="648"/>
@@ -9460,7 +9544,7 @@
         <w:t xml:space="preserve"> </w:t>
       </w:r>
       <w:r>
-        <w:t xml:space="preserve">Frozen and run on the held-out family (Table 7), the counter leaked 33, 34, 33 and 62 messages against the four carriers, where the default leaked 287, 36, 344 and 287 and no policy 451 to 1 857, at a benign cost of 0.13 [0.09, 0.17] points, and failed both service-under-attack claims: 13 of the 17 cells that broke K3 lie at the three points with the most legitimate traffic, where users and pumper compete for one quota; K5 failed in 51 cells over 11 of 12 points. The counters selected for sparser traffic cost 4.7 and 5.8 points here even without an attack: the quota must match the traffic.</w:t>
+        <w:t xml:space="preserve">Frozen and run on the held-out family (Table 7), the counter leaked 33, 34, 33, and 62 messages against the four carriers, where the default leaked 287, 36, 344, and 287, and no policy 451 to 1 857, at a benign cost of 0.13 [0.09, 0.17] points, and failed both service-under-attack claims: 13 of the 17 cells that broke K3 lie at the three points with the most legitimate traffic, where users and pumper compete for one quota; K5 failed in 51 cells over 11 of 12 points. The counters selected for sparser traffic cost 4.7 and 5.8 points here even without an attack: the quota must match the traffic.</w:t>
       </w:r>
     </w:p>
     <w:p>
@@ -9478,7 +9562,17 @@
         <w:t xml:space="preserve"> </w:t>
       </w:r>
       <w:r>
-        <w:t xml:space="preserve">Attacked service (E1) under a pumper on three blocks that real users share: 200 blocks, 60-minute attacks, seeds 300–309, four carriers. Leaked: SMS to the attacker’s numbers, summed over the four carriers’ runs of a seed, which can hide a carrier on which a policy loses (per carrier: artifact). Harm: net completions lost, in points, averaged over the carriers; negative: a gain. Brackets, on leakage and the attacked blocks only: 95% bootstrap intervals over seeds.</w:t>
+        <w:rPr>
+          <w:bCs/>
+          <w:b/>
+        </w:rPr>
+        <w:t xml:space="preserve">Leakage and User Harm Under Shared-Block Pumping.</w:t>
+      </w:r>
+      <w:r>
+        <w:t xml:space="preserve"> </w:t>
+      </w:r>
+      <w:r>
+        <w:t xml:space="preserve">E1: a pumper on three blocks that real users share; 200 blocks, 60-minute attacks, seeds 300–309, four carriers. Leaked: SMS to the attacker’s numbers, summed over the four carriers’ runs of a seed, which can hide a carrier on which a policy loses (per carrier: artifact). Harm: net completions lost, in points, averaged over the carriers; negative: a gain. Brackets, on leakage and the attacked blocks only: 95% bootstrap intervals over seeds.</w:t>
       </w:r>
     </w:p>
     <w:tbl>
@@ -9492,7 +9586,7 @@
           <w:right w:w="57" w:type="dxa"/>
         </w:tblCellMar>
         <w:tblLook w:firstRow="0" w:lastRow="0" w:firstColumn="0" w:lastColumn="0" w:noHBand="0" w:noVBand="0" w:val="0000"/>
-        <w:tblCaption w:val="Table 8. Attacked service (E1) under a pumper on three blocks that real users share: 200 blocks, 60-minute attacks, seeds 300–309, four carriers. Leaked: SMS to the attacker’s numbers, summed over the four carriers’ runs of a seed, which can hide a carrier on which a policy loses (per carrier: artifact). Harm: net completions lost, in points, averaged over the carriers; negative: a gain. Brackets, on leakage and the attacked blocks only: 95% bootstrap intervals over seeds."/>
+        <w:tblCaption w:val="Table 8. Leakage and User Harm Under Shared-Block Pumping. E1: a pumper on three blocks that real users share; 200 blocks, 60-minute attacks, seeds 300–309, four carriers. Leaked: SMS to the attacker’s numbers, summed over the four carriers’ runs of a seed, which can hide a carrier on which a policy loses (per carrier: artifact). Harm: net completions lost, in points, averaged over the carriers; negative: a gain. Brackets, on leakage and the attacked blocks only: 95% bootstrap intervals over seeds."/>
       </w:tblPr>
       <w:tblGrid>
         <w:gridCol w:w="1845"/>
@@ -10943,7 +11037,17 @@
         <w:t xml:space="preserve"> </w:t>
       </w:r>
       <w:r>
-        <w:t xml:space="preserve">Attacked service (E1) under a poisoner flooding all 200 blocks: 60-minute attacks, seeds 300–309. Extra harm: net completions lost, in points of all users (with 95% bootstrap intervals over seeds) and of first-time users.</w:t>
+        <w:rPr>
+          <w:bCs/>
+          <w:b/>
+        </w:rPr>
+        <w:t xml:space="preserve">User Harm Under a Full-Block Poisoning Attack.</w:t>
+      </w:r>
+      <w:r>
+        <w:t xml:space="preserve"> </w:t>
+      </w:r>
+      <w:r>
+        <w:t xml:space="preserve">E1: a poisoner flooding all 200 blocks; 60-minute attacks, seeds 300–309. Extra harm: net completions lost, in points of all users (with 95% bootstrap intervals over seeds) and of first-time users.</w:t>
       </w:r>
     </w:p>
     <w:tbl>
@@ -10957,7 +11061,7 @@
           <w:right w:w="57" w:type="dxa"/>
         </w:tblCellMar>
         <w:tblLook w:firstRow="0" w:lastRow="0" w:firstColumn="0" w:lastColumn="0" w:noHBand="0" w:noVBand="0" w:val="0000"/>
-        <w:tblCaption w:val="Table 9. Attacked service (E1) under a poisoner flooding all 200 blocks: 60-minute attacks, seeds 300–309. Extra harm: net completions lost, in points of all users (with 95% bootstrap intervals over seeds) and of first-time users."/>
+        <w:tblCaption w:val="Table 9. User Harm Under a Full-Block Poisoning Attack. E1: a poisoner flooding all 200 blocks; 60-minute attacks, seeds 300–309. Extra harm: net completions lost, in points of all users (with 95% bootstrap intervals over seeds) and of first-time users."/>
       </w:tblPr>
       <w:tblGrid>
         <w:gridCol w:w="2827"/>
@@ -11679,7 +11783,7 @@
         <w:pStyle w:val="BodyText"/>
       </w:pPr>
       <w:r>
-        <w:t xml:space="preserve">In Table 8, against the attacked no-policy arm the counter cost all users nothing on average and gained the attacked blocks’ users 3 points on average, since without a destination policy the pumper exhausts their blocks and the hourly budget; with the human-like carrier alone it cost them 1.9. Against attack-free operation every evaluated policy still left those users 5 to 9 points worse off on average (2 to 12 per carrier; 8 with none): none shields a block an attacker shares. Counter and tests together, explored outside the frozen claims, leaked least summed over the four carriers but not against the instant verifier (28;</w:t>
+        <w:t xml:space="preserve">In Table 8, against the attacked no-policy arm, the counter cost all users nothing on average and gained the attacked blocks’ users three points on average, since without a destination policy, the pumper exhausts their blocks and the hourly budget; with the human-like carrier alone, it cost them 1.9. Against the attack-free operation, every evaluated policy left those users 5 to 9 points worse off on average (2 to 12 per carrier; 8 with none): none shields a block an attacker shares. Counter and tests together, explored outside the frozen claims, leaked least summed over the four carriers but not against the instant verifier (28;</w:t>
       </w:r>
       <w:r>
         <w:t xml:space="preserve"> </w:t>
@@ -11731,7 +11835,7 @@
         <w:t xml:space="preserve">c</w:t>
       </w:r>
       <w:r>
-        <w:t xml:space="preserve">0. A token bucket with a burst of 4 spared the poisoner’s users only by letting almost everything through; with two untuned settings neither limiter dominates, and we rank only the implemented policies. Returning users, all simulated with verified history, lost nothing.</w:t>
+        <w:t xml:space="preserve">0. A token bucket with a burst of 4 spared the poisoner’s users only by letting almost everything through; with two untuned settings, neither limiter dominated, and we ranked only the implemented policies. Returning users, all simulated with verified history, lost nothing.</w:t>
       </w:r>
     </w:p>
     <w:p>
@@ -11739,7 +11843,7 @@
         <w:pStyle w:val="BodyText"/>
       </w:pPr>
       <w:r>
-        <w:t xml:space="preserve">Attack-free (Figure 3a), the counter costs a block’s users nothing at one send per ten minutes, 2.3 points at four and 5.5 at eight, far below the idealized share beyond the quota (27% at four), since most challenged users complete or switch to WhatsApp; without WhatsApp eight sends cost 13.2. A 30-minute launch at three times the normal rate costs its blocks’ users 16 points. Over 60 minutes (Figure 3c) the default leaked 110, 144 and 242 messages on 3, 10 and 30 blocks, against 105, 139 and 240 from Equation (2) (</w:t>
+        <w:t xml:space="preserve">Attack-free (Figure 3a), the counter costs a block’s users nothing at one send per ten minutes, 2.3 points at four and 5.5 at eight, far below the idealized share beyond the quota (27% at four), since most challenged users complete or switch to WhatsApp; without WhatsApp, eight sends cost 13.2. A 30-minute launch at three times the normal rate costs its blocks’ users 16 points. Over 60 minutes (Figure 3c) the default leaked 110, 144 and 242 messages on 3, 10 and 30 blocks, against 105, 139 and 240 from Equation (2) (</w:t>
       </w:r>
       <m:oMath>
         <m:r>
@@ -11835,7 +11939,17 @@
         <w:t xml:space="preserve"> </w:t>
       </w:r>
       <w:r>
-        <w:t xml:space="preserve">The counter’s operating boundary (E4), seeds 300–304; lines join sampled settings and do not locate a crossover. (a) Attributable loss in points of the three hot blocks’ users against their legitimate rate, attack-free and with a never-verifying pumper on those blocks. (b, c) Leakage in 20 and 60 minutes against the blocks a pumper uses, at full rate or paced, and Equations (2)–(4) for the full-rate pumper (hollow markers). All horizontal axes and the vertical axes of (b, c) are logarithmic. Bands and bars: 95% bootstrap intervals over seeds.</w:t>
+        <w:rPr>
+          <w:bCs/>
+          <w:b/>
+        </w:rPr>
+        <w:t xml:space="preserve">Operating Boundary of the Counter.</w:t>
+      </w:r>
+      <w:r>
+        <w:t xml:space="preserve"> </w:t>
+      </w:r>
+      <w:r>
+        <w:t xml:space="preserve">E4, seeds 300–304; lines join sampled settings and do not locate a crossover. (a) Attributable loss in points of the three hot blocks’ users against their legitimate rate, attack-free and with a never-verifying pumper on those blocks. (b, c) Leakage in 20 and 60 minutes against the blocks a pumper uses, at full rate or paced, and Equations (2)–(4) for the full-rate pumper (hollow markers). All horizontal axes and the vertical axes of (b, c) are logarithmic. Bands and bars: 95% bootstrap intervals over seeds.</w:t>
       </w:r>
     </w:p>
     <w:p>
@@ -11843,7 +11957,7 @@
         <w:pStyle w:val="BodyText"/>
       </w:pPr>
       <w:r>
-        <w:t xml:space="preserve">Against adaptive attackers (E3) the counter held the threshold-aware carrier, the receipt faker and the concentrated trust builder to 24 to 36 messages (502 to 665 under the default), but not trust builders on random numbers (577, as under the default); over 360 minutes the human-like carrier gained 81 messages an hour under the counter, 753 under the default.</w:t>
+        <w:t xml:space="preserve">Against adaptive attackers (E3), the counter held the threshold-aware carrier, receipt faker, and concentrated trust builder to 24 to 36 messages (502 to 665 under the default), but not trust builders on random numbers (577, as under the default); over 360 minutes, the human-like carrier gained 81 messages an hour under the counter, and 753 under the default.</w:t>
       </w:r>
     </w:p>
     <w:bookmarkEnd w:id="44"/>
@@ -11870,7 +11984,7 @@
         <w:pStyle w:val="FirstParagraph"/>
       </w:pPr>
       <w:r>
-        <w:t xml:space="preserve">On one block, 20 000 Monte Carlo trials per cell give the probability of a verdict within 30 legitimate sends: 0.09% [0.06, 0.14] at 80% conversion with 20% autofill, 1.9% at 65% and 19.5% at 50%. Over 24 hours the default raises 0.5 verdict events a day on 200 busy blocks at 80% conversion and 6.5 at 65%, where they meet 30 of about 28 800 requests (claim C4 held in 18 of 18 cells).</w:t>
+        <w:t xml:space="preserve">On one block, 20 000 Monte Carlo trials per cell give the probability of a verdict within 30 legitimate sends: 0.09% [0.06, 0.14] at 80% conversion with 20% autofill, 1.9% at 65% and 19.5% at 50%. Over 24 hours, the default raises 0.5 verdict events a day on 200 busy blocks at 80% conversion and 6.5 at 65%, where they meet 30 of about 28 800 requests (claim C4 held in 18 of 18 cells).</w:t>
       </w:r>
     </w:p>
     <w:p>
@@ -11878,7 +11992,7 @@
         <w:pStyle w:val="BodyText"/>
       </w:pPr>
       <w:r>
-        <w:t xml:space="preserve">A poisoner flooding for twenty minutes the twenty blocks legitimate users concentrate on (caps lifted, ten seeds) raises 16 verdict events meeting 98 legitimate requests, 33 never completing; against observing without enforcing on the same trace, enforcement costs 12.7 [4.6, 22.9] completions, 3.1% of users (6.3% without WhatsApp; 23.9% with a 24-hour denylist). One that stops after ten minutes leaves verdicts meeting 406.5 requests afterwards, an attributable loss of 46.2 [16.9, 79.8]. Grading limits the harm; it caps it neither at a challenge nor at the attack’s duration.</w:t>
+        <w:t xml:space="preserve">A poisoner flooding for 20 min the 20 blocks legitimate users concentrate on (caps lifted, ten seeds) raises 16 verdict events meeting 98 legitimate requests, 33 never completing; against observe-only operation on the same trace, enforcement costs 12.7 [4.6, 22.9] completions, 3.1% of users (6.3% without WhatsApp; 23.9% with a 24-hour denylist). One that stops after ten minutes leaves verdicts meeting 406.5 requests afterwards, an attributable loss of 46.2 [16.9, 79.8]. Grading limits the harm; it caps it neither at the challenge nor at the attack’s duration.</w:t>
       </w:r>
     </w:p>
     <w:bookmarkEnd w:id="45"/>
@@ -11905,7 +12019,7 @@
         <w:pStyle w:val="FirstParagraph"/>
       </w:pPr>
       <w:r>
-        <w:t xml:space="preserve">These scripted adaptations’ leakages are not bounds. Against v2 with caps lifted, a datacenter attacker buying every challenge solution leaks 55; a threshold-aware carrier and a receipt faker leak 570 each, drawing no verdict.</w:t>
+        <w:t xml:space="preserve">The leakages of these scripted adaptations are not bounds. Against v2 with caps lifted, a datacenter attacker buying every challenge solution leaks 55, and a threshold-aware carrier and a receipt faker leak 570 each, drawing no verdict.</w:t>
       </w:r>
     </w:p>
     <w:p>
@@ -11913,7 +12027,7 @@
         <w:pStyle w:val="BodyText"/>
       </w:pPr>
       <w:r>
-        <w:t xml:space="preserve">If pumpers earn a share of the 0.1422 USD retail price and pay an event-level bill, they break even at a share of 0.043 under v1 and 0.054 to 0.271 under v2 (the instant verifier 1.310); over 360 minutes under the counter the human-like carrier needs 1.048. These are break-even shares for scripted attackers under assumed prices, not bounds or criminal profit.</w:t>
+        <w:t xml:space="preserve">If pumpers earn a share of the 0.1422 USD retail price and pay an event-level bill, they break even at a share of 0.043 under v1 and 0.054 to 0.271 under v2 (the instant verifier 1.310); over 360 minutes under the counter, the human-like carrier needs 1.048. These are break-even shares for scripted attackers under assumed prices, not bounds or criminal profit.</w:t>
       </w:r>
     </w:p>
     <w:p>
@@ -11921,7 +12035,7 @@
         <w:pStyle w:val="BodyText"/>
       </w:pPr>
       <w:r>
-        <w:t xml:space="preserve">On a real Redis (four vCPUs, four workers) a send costs 13.8 ms at the median and 21.1 ms at the 99th percentile, and 133 requests per second pass at concurrency 128 with the 400 ms floor and 50 ms vendor calls. With fast vendors response times distinguished no pair of five outcome classes (smallest Kolmogorov–Smirnov</w:t>
+        <w:t xml:space="preserve">On a real Redis (four vCPUs, four workers), sends cost 13.8 ms (median) and 21.1 ms (99th percentile), and 133 requests per second passed at concurrency 128 with the 400 ms floor and 50 ms vendor calls. With fast vendors, response times distinguished no pair of five outcome classes (smallest Kolmogorov–Smirnov</w:t>
       </w:r>
       <w:r>
         <w:t xml:space="preserve"> </w:t>
@@ -11941,7 +12055,7 @@
         </m:r>
       </m:oMath>
       <w:r>
-        <w:t xml:space="preserve">). With heavy-tailed vendors under an adversarial mixture, 81% of sends overran the floor, and a response-time threshold separated sends from refusals with 88% balanced accuracy on its own run; on three new runs, thresholds fitted on one scored 95 to 99.9% on the other two: a separation on that machine, not a deployment accuracy.</w:t>
+        <w:t xml:space="preserve">). Under an adversarial mixture, 81% of sends overran the floor, and response-time thresholds separated sends from refusals with 88% balanced accuracy on the fitted run and, fitted on a new run, 95 to 99.9% on two others: a separation on that machine, not a deployment accuracy.</w:t>
       </w:r>
     </w:p>
     <w:bookmarkEnd w:id="46"/>
@@ -11979,7 +12093,7 @@
         <w:t xml:space="preserve"> </w:t>
       </w:r>
       <w:r>
-        <w:t xml:space="preserve">In the scripted workloads, carriers that verify with human-like delay, fake receipts or know the thresholds defeated our outcome tests but not a short-window counter. Within a verdict’s hour the counter’s allowance, unlike the tests’, grows with the windows an attack spans; over longer campaigns verdicts expire and the tests leak again. Equation (5) summarizes this for pumpers that solve no challenge and hold no exemption. Its inputs are in an operator’s logs; the cost of an excess send, competition under attack and exemption abuse come only from the simulation. Counter and tests together, with a quota set from each block’s traffic, is a hypothesis for real traffic, not a recommendation.</w:t>
+        <w:t xml:space="preserve">In the scripted workloads, carriers that verify with human-like delay, fake receipts, or know the thresholds defeated our outcome tests but not a short-window counter. Within an hour of a verdict, the counter’s allowance, unlike the tests’, grows with the windows an attack spans; over longer campaigns, verdicts expire and the tests leak again. Equation (5) summarizes this for pumpers that solve no challenge and hold no exemption. Its inputs are in an operator’s logs; the cost of an excess send, competition under attack, and exemption abuse come only from the simulation. The counter and tests together, with a quota set from each block’s traffic, is a hypothesis for real traffic, not a recommendation.</w:t>
       </w:r>
     </w:p>
     <w:p>
@@ -11997,7 +12111,7 @@
         <w:t xml:space="preserve"> </w:t>
       </w:r>
       <w:r>
-        <w:t xml:space="preserve">Everything is simulated and the calibration is assumed. Both protocols were written by the author for the author’s generator, the second knowing which counters had won. Some results follow from the generator (a perfect premium list, a datacenter attacker that declines challenges, returning users who always present verified history), and selection used an unweighted sum of four scripted pumpers’ leakage and a mean service target met on tuning seeds, which guarantees no service level elsewhere. Close rankings rest on ten or fewer seeds, and costs that round to zero are not shown equivalent. Per-client quotas within a block, carrier spend ceilings, bounded exemptions, tuned token buckets and other sequential statistics lie outside the evaluated policies. Vendor adapters are untested live, and the timing result holds only for the observer tested. Destination policies challenge people for what strangers sharing their block did, and deployment under the GDPR or Saudi Arabia’s PDPL needs a lawful basis and a route for refused users. Replaying real traffic is the experiment this paper most needs.</w:t>
+        <w:t xml:space="preserve">Everything was simulated, and calibration was assumed. Both protocols were written by the author for the author’s generator, the second knowing which counters had won. Some results follow from the generator (a perfect premium list, a datacenter attacker that declines challenges, returning users who always present verified history), and selection used an unweighted sum of four scripted pumpers’ leakage and a mean service target met on tuning seeds, which guarantees no service level elsewhere. Close rankings rest on ten or fewer seeds, and costs that round to zero are not shown equivalent. Per-client quotas within a block, carrier spend ceilings, bounded exemptions, tuned token buckets, and other sequential statistics lie outside the evaluated policies. Vendor adapters are untested live, and the timing result holds only for the observer tested. Destination policies challenge people for what strangers sharing their block did, and deployment under the GDPR or Saudi Arabia’s PDPL needs a lawful basis and a route for refused users. Replaying real traffic is the experiment this paper most needs.</w:t>
       </w:r>
     </w:p>
     <w:bookmarkEnd w:id="48"/>
@@ -12024,7 +12138,7 @@
         <w:pStyle w:val="FirstParagraph"/>
       </w:pPr>
       <w:r>
-        <w:t xml:space="preserve">In this simulation the design contains attacks that carry a signature at little cost to simulated users, and rations, rather than separates, a residential attacker that looks like a person. Counting sends on the destination leaked less in aggregate than our outcome tests against concentrated pumpers, though not reliably against an instantly verifying carrier; a frozen counter failed its service claims when the attacker shares blocks with real users, and lost its advantage against wide, paced and trust-building pumpers. Within an hour, unfitted estimates ordered the policies’ mean leakage in 18 of 18 decisive boundary cells with the cold-start bound and 17 with the warm-start bound, missing a near tie; the crossing is algebraic, not a measured switching point.</w:t>
+        <w:t xml:space="preserve">In this simulation, the design contains attacks that carry a signature at a low cost to simulated users and rations, rather than separates, residential attackers that resemble people. Counting sends on the destination leaked less in aggregate than our outcome tests against concentrated pumpers, although not reliably against an instantly verifying carrier; a frozen counter failed its service claims when the attacker shared blocks with real users and lost its advantage against wide, paced, and trust-building pumpers. Within an hour, unfitted estimates ordered the policies’ mean leakage in 18 of 18 decisive boundary cells with the cold-start bound and 17 with the warm-start bound, missing a near tie; the crossing was algebraic, not a measured switching point.</w:t>
       </w:r>
     </w:p>
     <w:bookmarkEnd w:id="49"/>
@@ -12088,7 +12202,7 @@
         <w:pStyle w:val="FirstParagraph"/>
       </w:pPr>
       <w:r>
-        <w:t xml:space="preserve">The author used Claude (Anthropic) for code, evaluation, drafting and editing, checked numbers against the recorded results and claims against the code, and takes full responsibility for the content.</w:t>
+        <w:t xml:space="preserve">The author used Claude (Anthropic) for code, evaluation, drafting and editing; checked numbers against the recorded results and claims against the code; and takes full responsibility for the content.</w:t>
       </w:r>
     </w:p>
     <w:bookmarkEnd w:id="52"/>

</xml_diff>

<commit_message>
Manuscript revision 8: captions are the author's titles; descriptions moved to the text
Every table and figure caption now carries only the title from the
author's Word file. The descriptions the round-8 items require
(intervals, units, reference conditions, log axes, the Figure 1 key,
table abbreviations) are stated where each float is introduced.
Word version and round-8 letter updated (7,985 words, 25 pages).

Co-Authored-By: Claude Opus 5.5 <noreply@anthropic.com>
Claude-Session: https://claude.ai/code/session_01RjWdFzUgYk6Hwie2YbnvyG
</commit_message>
<xml_diff>
--- a/paper/main.docx
+++ b/paper/main.docx
@@ -364,11 +364,7 @@
         <w:t xml:space="preserve"> </w:t>
       </w:r>
       <w:r>
-        <w:rPr>
-          <w:bCs/>
-          <w:b/>
-        </w:rPr>
-        <w:t xml:space="preserve">v1 Assumptions and How They Fail.</w:t>
+        <w:t xml:space="preserve">v1 Assumptions and how they fail</w:t>
       </w:r>
     </w:p>
     <w:tbl>
@@ -382,7 +378,7 @@
           <w:right w:w="57" w:type="dxa"/>
         </w:tblCellMar>
         <w:tblLook w:firstRow="1" w:lastRow="0" w:firstColumn="0" w:lastColumn="0" w:noHBand="0" w:noVBand="0" w:val="0020"/>
-        <w:tblCaption w:val="Table 1. v1 Assumptions and How They Fail."/>
+        <w:tblCaption w:val="Table 1. v1 Assumptions and how they fail"/>
       </w:tblPr>
       <w:tblGrid>
         <w:gridCol w:w="509"/>
@@ -986,7 +982,7 @@
         <w:pStyle w:val="FirstParagraph"/>
       </w:pPr>
       <w:r>
-        <w:t xml:space="preserve">A request passes the steps of Table 2 until it is refused. Step 0 takes the platform only from a valid App Attest or Play Integrity result. Each limit and reservation is one atomic Redis operation, but the enclosing steps are not one transaction: on the normal path, a refused request returns its per-number claims and counter slot, and the hourly budget is reserved only for a message about to be enqueued, a reservation rather than a completed dispatch; a crash between them can leak reservations (Section 6). Address limits and source caps count requests, except that a request Step 11 challenges returns its source-cap count. Every outcome after Step 0, except the challenge, returns one HTTP 200 body after at least 400 ms, a floor that cannot hide longer work.</w:t>
+        <w:t xml:space="preserve">A request passes the steps of Table 2, which lists in brackets the gaps of Table 1 each step addresses (FB: the feedback loop), until it is refused. Step 0 takes the platform only from a valid App Attest or Play Integrity result. Each limit and reservation is one atomic Redis operation, but the enclosing steps are not one transaction: on the normal path, a refused request returns its per-number claims and counter slot, and the hourly budget is reserved only for a message about to be enqueued, a reservation rather than a completed dispatch; a crash between them can leak reservations (Section 6). Address limits and source caps count requests, except that a request Step 11 challenges returns its source-cap count. Every outcome after Step 0, except the challenge, returns one HTTP 200 body after at least 400 ms, a floor that cannot hide longer work.</w:t>
       </w:r>
     </w:p>
     <w:p>
@@ -1004,17 +1000,7 @@
         <w:t xml:space="preserve"> </w:t>
       </w:r>
       <w:r>
-        <w:rPr>
-          <w:bCs/>
-          <w:b/>
-        </w:rPr>
-        <w:t xml:space="preserve">Twelve Steps and the v1 Gaps They Address.</w:t>
-      </w:r>
-      <w:r>
-        <w:t xml:space="preserve"> </w:t>
-      </w:r>
-      <w:r>
-        <w:t xml:space="preserve">Gaps of Table 1 in brackets; FB: feedback loop.</w:t>
+        <w:t xml:space="preserve">Twelve Steps and the v1 Gaps They Address</w:t>
       </w:r>
     </w:p>
     <w:tbl>
@@ -1028,7 +1014,7 @@
           <w:right w:w="57" w:type="dxa"/>
         </w:tblCellMar>
         <w:tblLook w:firstRow="1" w:lastRow="0" w:firstColumn="0" w:lastColumn="0" w:noHBand="0" w:noVBand="0" w:val="0020"/>
-        <w:tblCaption w:val="Table 2. Twelve Steps and the v1 Gaps They Address. Gaps of Table 1 in brackets; FB: feedback loop."/>
+        <w:tblCaption w:val="Table 2. Twelve Steps and the v1 Gaps They Address"/>
       </w:tblPr>
       <w:tblGrid>
         <w:gridCol w:w="1134"/>
@@ -4082,7 +4068,19 @@
         <w:pStyle w:val="BodyText"/>
       </w:pPr>
       <w:r>
-        <w:t xml:space="preserve">Three behavioral parameters have published counterparts: genuine conversion (one provider’s 68% or more [27]; ours 60%–90%) and the never-converting destinations and identity churn of Section 2; the rest are assumptions. Attackers (Table 3) draw pool size, rate, and CAPTCHA class per seed, which explains 92% [80, 98] of the variance of the farm’s leakage in a nested design (ten configurations, three seeds each). Brackets are 95% percentile-bootstrap intervals, paired per seed for differences; they describe variation under this generator, not uncertainty about real traffic.</w:t>
+        <w:t xml:space="preserve">Three behavioral parameters have published counterparts: genuine conversion (one provider’s 68% or more [27]; ours 60%–90%) and the never-converting destinations and identity churn of Section 2; the rest are assumptions. Table 3 groups the attacker profiles by capability and marks the destination policies each faced (S, sequential tests; C, counters; B, block-limit; parameters in</w:t>
+      </w:r>
+      <w:r>
+        <w:t xml:space="preserve"> </w:t>
+      </w:r>
+      <w:r>
+        <w:rPr>
+          <w:rStyle w:val="VerbatimChar"/>
+        </w:rPr>
+        <w:t xml:space="preserve">results/ attacker_profiles.md</w:t>
+      </w:r>
+      <w:r>
+        <w:t xml:space="preserve">). Attackers draw pool size, rate, and CAPTCHA class per seed, which explains 92% [80, 98] of the variance of the farm’s leakage in a nested design (ten configurations, three seeds each). Brackets in the text and tables, and bars and bands in the figures, are 95% percentile-bootstrap intervals over seeds, paired per seed for differences; they describe variation under this generator, not uncertainty about real traffic.</w:t>
       </w:r>
     </w:p>
     <w:p>
@@ -4367,29 +4365,7 @@
         <w:t xml:space="preserve"> </w:t>
       </w:r>
       <w:r>
-        <w:rPr>
-          <w:bCs/>
-          <w:b/>
-        </w:rPr>
-        <w:t xml:space="preserve">Attacker Profiles, Capabilities, and Policies.</w:t>
-      </w:r>
-      <w:r>
-        <w:t xml:space="preserve"> </w:t>
-      </w:r>
-      <w:r>
-        <w:t xml:space="preserve">Policies faced: S, sequential tests; C, counters; B, block-limit. Parameters:</w:t>
-      </w:r>
-      <w:r>
-        <w:t xml:space="preserve"> </w:t>
-      </w:r>
-      <w:r>
-        <w:rPr>
-          <w:rStyle w:val="VerbatimChar"/>
-        </w:rPr>
-        <w:t xml:space="preserve">results/ attacker_profiles.md</w:t>
-      </w:r>
-      <w:r>
-        <w:t xml:space="preserve">.</w:t>
+        <w:t xml:space="preserve">Attacker Profiles, Capabilities, and Policies</w:t>
       </w:r>
     </w:p>
     <w:tbl>
@@ -4403,7 +4379,7 @@
           <w:right w:w="57" w:type="dxa"/>
         </w:tblCellMar>
         <w:tblLook w:firstRow="1" w:lastRow="0" w:firstColumn="0" w:lastColumn="0" w:noHBand="0" w:noVBand="0" w:val="0020"/>
-        <w:tblCaption w:val="Table 3. Attacker Profiles, Capabilities, and Policies. Policies faced: S, sequential tests; C, counters; B, block-limit. Parameters: results/ attacker_profiles.md."/>
+        <w:tblCaption w:val="Table 3. Attacker Profiles, Capabilities, and Policies"/>
       </w:tblPr>
       <w:tblGrid>
         <w:gridCol w:w="3771"/>
@@ -4921,26 +4897,7 @@
         <w:t xml:space="preserve"> </w:t>
       </w:r>
       <w:r>
-        <w:rPr>
-          <w:bCs/>
-          <w:b/>
-        </w:rPr>
-        <w:t xml:space="preserve">Leakage and User Impact Across Designs.</w:t>
-      </w:r>
-      <w:r>
-        <w:t xml:space="preserve"> </w:t>
-      </w:r>
-      <w:r>
-        <w:t xml:space="preserve">Leaked share (%, mean of per-run shares) of about 600 attack requests in 20 minutes, 30 seeds, under v1, block-limit (BL) and v2 with source caps lifted, and under v2 with caps on, with first-time users refused and all users completing (%). All designs, with intervals: supplementary Table S1 (</w:t>
-      </w:r>
-      <w:r>
-        <w:rPr>
-          <w:rStyle w:val="VerbatimChar"/>
-        </w:rPr>
-        <w:t xml:space="preserve">results/ design_table.md</w:t>
-      </w:r>
-      <w:r>
-        <w:t xml:space="preserve">).</w:t>
+        <w:t xml:space="preserve">Leakage and User Impact Across Designs</w:t>
       </w:r>
     </w:p>
     <w:tbl>
@@ -4954,7 +4911,7 @@
           <w:right w:w="57" w:type="dxa"/>
         </w:tblCellMar>
         <w:tblLook w:firstRow="0" w:lastRow="0" w:firstColumn="0" w:lastColumn="0" w:noHBand="0" w:noVBand="0" w:val="0000"/>
-        <w:tblCaption w:val="Table 4. Leakage and User Impact Across Designs. Leaked share (%, mean of per-run shares) of about 600 attack requests in 20 minutes, 30 seeds, under v1, block-limit (BL) and v2 with source caps lifted, and under v2 with caps on, with first-time users refused and all users completing (%). All designs, with intervals: supplementary Table S1 (results/ design_table.md)."/>
+        <w:tblCaption w:val="Table 4. Leakage and User Impact Across Designs"/>
       </w:tblPr>
       <w:tblGrid>
         <w:gridCol w:w="2801"/>
@@ -6353,7 +6310,16 @@
         <w:pStyle w:val="BodyText"/>
       </w:pPr>
       <w:r>
-        <w:t xml:space="preserve">Datacenter rotation leaks nothing under v2 because it scores in the challenge tier and declines challenges; Step 5 refuses the premium range, and the session cap holds the single client to two messages (Table 4); in all 108 robustness cells, these attacks leaked under 5% at completion within two points of the paired no-attack run (claim C1). The walk leaks 61 [53, 70] messages before its block’s verdict (block-limit: five), and the reused profile 89 [83, 95].</w:t>
+        <w:t xml:space="preserve">Table 4 gives the leaked share (%, mean of per-run shares) of about 600 attack requests in 20 minutes over 30 seeds under v1, block-limit (BL) and v2 with source caps lifted, and under v2 with caps on, with the first-time users refused and all users completing (%); supplementary Table S1 (</w:t>
+      </w:r>
+      <w:r>
+        <w:rPr>
+          <w:rStyle w:val="VerbatimChar"/>
+        </w:rPr>
+        <w:t xml:space="preserve">results/ design_table.md</w:t>
+      </w:r>
+      <w:r>
+        <w:t xml:space="preserve">) gives every design with intervals. Datacenter rotation leaks nothing under v2 because it scores in the challenge tier and declines challenges; Step 5 refuses the premium range, and the session cap holds the single client to two messages (Table 4); in all 108 robustness cells, these attacks leaked under 5% at completion within two points of the paired no-attack run (claim C1). The walk leaks 61 [53, 70] messages before its block’s verdict (block-limit: five), and the reused profile 89 [83, 95].</w:t>
       </w:r>
     </w:p>
     <w:p>
@@ -6530,17 +6496,7 @@
         <w:t xml:space="preserve"> </w:t>
       </w:r>
       <w:r>
-        <w:rPr>
-          <w:bCs/>
-          <w:b/>
-        </w:rPr>
-        <w:t xml:space="preserve">Containment Results for Concentrated Pumping Attacks.</w:t>
-      </w:r>
-      <w:r>
-        <w:t xml:space="preserve"> </w:t>
-      </w:r>
-      <w:r>
-        <w:t xml:space="preserve">Three blocks, caps lifted, ten seeds: messages leaked of about 574 requests in twenty minutes; seeds contained; mean minutes to containment (contained seeds) and to the first verdict (seeds with one); codes entered.</w:t>
+        <w:t xml:space="preserve">Containment Results for Concentrated Pumping Attacks</w:t>
       </w:r>
     </w:p>
     <w:tbl>
@@ -6554,7 +6510,7 @@
           <w:right w:w="57" w:type="dxa"/>
         </w:tblCellMar>
         <w:tblLook w:firstRow="0" w:lastRow="0" w:firstColumn="0" w:lastColumn="0" w:noHBand="0" w:noVBand="0" w:val="0000"/>
-        <w:tblCaption w:val="Table 5. Containment Results for Concentrated Pumping Attacks. Three blocks, caps lifted, ten seeds: messages leaked of about 574 requests in twenty minutes; seeds contained; mean minutes to containment (contained seeds) and to the first verdict (seeds with one); codes entered."/>
+        <w:tblCaption w:val="Table 5. Containment Results for Concentrated Pumping Attacks"/>
       </w:tblPr>
       <w:tblGrid>
         <w:gridCol w:w="2918"/>
@@ -7497,7 +7453,7 @@
         <w:pStyle w:val="BodyText"/>
       </w:pPr>
       <w:r>
-        <w:t xml:space="preserve">In Table 5, the speed test catches a carrier verifying within a second at 19 messages, while the carrier verifying 60% with human-like delay is contained in none of the ten 20-minute runs: its first verdict comes at minute 11.6 on average and 452 messages leak; in an hour, 1 067 leak and two of ten runs are contained, at minute 47.0 on average. Claim C3 (containment with at most 30% leaked) held in 36 of 36 cells.</w:t>
+        <w:t xml:space="preserve">Table 5 covers concentrated pumpers on three blocks with caps lifted over ten seeds: messages leaked of about 574 requests in 20 minutes, seeds contained, mean minutes to containment (contained seeds) and to the first verdict (seeds with one), and codes entered. The speed test catches a carrier verifying within a second at 19 messages, while the carrier verifying 60% with human-like delay is contained in none of the ten 20-minute runs: its first verdict comes at minute 11.6 on average and 452 messages leak; in an hour, 1 067 leak and two of ten runs are contained, at minute 47.0 on average. Claim C3 (containment with at most 30% leaked) held in 36 of 36 cells.</w:t>
       </w:r>
     </w:p>
     <w:p>
@@ -7542,17 +7498,7 @@
         <w:t xml:space="preserve"> </w:t>
       </w:r>
       <w:r>
-        <w:rPr>
-          <w:bCs/>
-          <w:b/>
-        </w:rPr>
-        <w:t xml:space="preserve">Leakage and Benign-User Impact Across Carrier Types.</w:t>
-      </w:r>
-      <w:r>
-        <w:t xml:space="preserve"> </w:t>
-      </w:r>
-      <w:r>
-        <w:t xml:space="preserve">First protocol, 200 blocks (144 legitimate sends per block a day), tuning seeds 100–102, evaluation seeds 0–9: 20-minute leakage (messages) by never-verifying (NV), instant (IV), human-like (HL) and challenge-buying (CB) carriers; from 24-hour attack-free runs at 65% conversion, completion, benign cost (points), users challenged and verdict events a day. Tuning target: 63.95%.</w:t>
+        <w:t xml:space="preserve">Leakage and Benign-User Impact Across Carrier Types</w:t>
       </w:r>
     </w:p>
     <w:tbl>
@@ -7566,7 +7512,7 @@
           <w:right w:w="57" w:type="dxa"/>
         </w:tblCellMar>
         <w:tblLook w:firstRow="1" w:lastRow="0" w:firstColumn="0" w:lastColumn="0" w:noHBand="0" w:noVBand="0" w:val="0020"/>
-        <w:tblCaption w:val="Table 6. Leakage and Benign-User Impact Across Carrier Types. First protocol, 200 blocks (144 legitimate sends per block a day), tuning seeds 100–102, evaluation seeds 0–9: 20-minute leakage (messages) by never-verifying (NV), instant (IV), human-like (HL) and challenge-buying (CB) carriers; from 24-hour attack-free runs at 65% conversion, completion, benign cost (points), users challenged and verdict events a day. Tuning target: 63.95%."/>
+        <w:tblCaption w:val="Table 6. Leakage and Benign-User Impact Across Carrier Types"/>
       </w:tblPr>
       <w:tblGrid>
         <w:gridCol w:w="4053"/>
@@ -8725,7 +8671,19 @@
         <w:t xml:space="preserve"> </w:t>
       </w:r>
       <w:r>
-        <w:t xml:space="preserve">Under the first protocol (Table 6, Figures 1 and 2), the sequential setting selected at the tuning target holds the human-like carrier to 126 messages only by raising 334 false verdict events a day, and misses the target by 0.18 points on seeds 0–9. The graded counter of four sends per block per ten minutes leaks 24 against each outcome-reading carrier and 48 against the challenge buyer, at 0.06 points; counters selected at the sparser settings leak 6 to 18 at 0.15 to 0.35 points (up to 0.43 at 80%). With the full grid and density-specific attacks (E5) the rule selects the same counters, and so do other objectives on the tuning runs (worst-case leakage, a first-time-loss constraint, each attacker alone, 2 000 random mixes), except the instant verifier alone and 3 mixes at 200 blocks; on fresh seeds the counter leaked least of the winners against every attacker but the instant verifier (25, against 15 and 16). On seeds 300–309 the 1 000-block counter falls 0.12 points below its target, yet no seed-and-conversion cell fails the paired check (the evaluation default minus 0.5 points).</w:t>
+        <w:t xml:space="preserve">Table 6 reports the first protocol at 200 blocks (144 legitimate sends per block a day; tuning seeds 100–102, evaluation seeds 0–9): 20-minute leakage against the never-verifying (NV), instant (IV), human-like (HL) and challenge-buying (CB) carriers and, from 24-hour attack-free runs at 65% conversion, completion, benign cost (points), users challenged and verdict events a day; the tuning target is 63.95%. Figure 1 plots each setting’s completion against its leakage summed over the four pumpers’ runs of a seed (not one combined attack), with the tuning target dotted; its unlabeled points are sequential settings matched to the default’s false alarms at other credits (key:</w:t>
+      </w:r>
+      <w:r>
+        <w:t xml:space="preserve"> </w:t>
+      </w:r>
+      <w:r>
+        <w:rPr>
+          <w:rStyle w:val="VerbatimChar"/>
+        </w:rPr>
+        <w:t xml:space="preserve">results/ figure1_key.md</w:t>
+      </w:r>
+      <w:r>
+        <w:t xml:space="preserve">). Figure 2 gives each selected setting’s leakage minus the default’s, paired per seed (negative: leaks less). The sequential setting selected at the tuning target holds the human-like carrier to 126 messages only by raising 334 false verdict events a day, and misses the target by 0.18 points on seeds 0–9. The graded counter of four sends per block per ten minutes leaks 24 against each outcome-reading carrier and 48 against the challenge buyer, at 0.06 points; counters selected at the sparser settings leak 6 to 18 at 0.15 to 0.35 points (up to 0.43 at 80%). With the full grid and density-specific attacks (E5) the rule selects the same counters, and so do other objectives on the tuning runs (worst-case leakage, a first-time-loss constraint, each attacker alone, 2 000 random mixes), except the instant verifier alone and 3 mixes at 200 blocks; on fresh seeds the counter leaked least of the winners against every attacker but the instant verifier (25, against 15 and 16). On seeds 300–309 the 1 000-block counter falls 0.12 points below its target, yet no seed-and-conversion cell fails the paired check (the evaluation default minus 0.5 points).</w:t>
       </w:r>
     </w:p>
     <w:p>
@@ -8790,29 +8748,7 @@
         <w:t xml:space="preserve"> </w:t>
       </w:r>
       <w:r>
-        <w:rPr>
-          <w:bCs/>
-          <w:b/>
-        </w:rPr>
-        <w:t xml:space="preserve">Leakage vs. Legitimate-User Completion Across Settings.</w:t>
-      </w:r>
-      <w:r>
-        <w:t xml:space="preserve"> </w:t>
-      </w:r>
-      <w:r>
-        <w:t xml:space="preserve">First protocol, 200 blocks, evaluation seeds 0–9: each setting’s completion in 24-hour attack-free runs at 65% conversion against its 20-minute leakage summed over the four concentrated pumpers’ runs of a seed (not one combined attack). Bars: 95% bootstrap intervals over seeds. Dotted line: the tuning target. Unlabeled points: sequential settings matched to the default’s false alarms at other credits (key:</w:t>
-      </w:r>
-      <w:r>
-        <w:t xml:space="preserve"> </w:t>
-      </w:r>
-      <w:r>
-        <w:rPr>
-          <w:rStyle w:val="VerbatimChar"/>
-        </w:rPr>
-        <w:t xml:space="preserve">results/ figure1_key.md</w:t>
-      </w:r>
-      <w:r>
-        <w:t xml:space="preserve">).</w:t>
+        <w:t xml:space="preserve">Leakage vs. Legitimate-User Completion Across Settings</w:t>
       </w:r>
     </w:p>
     <w:p>
@@ -8877,17 +8813,7 @@
         <w:t xml:space="preserve"> </w:t>
       </w:r>
       <w:r>
-        <w:rPr>
-          <w:bCs/>
-          <w:b/>
-        </w:rPr>
-        <w:t xml:space="preserve">Leakage Difference from the Default Across Attack Types.</w:t>
-      </w:r>
-      <w:r>
-        <w:t xml:space="preserve"> </w:t>
-      </w:r>
-      <w:r>
-        <w:t xml:space="preserve">First protocol, 200 blocks, evaluation seeds 0–9, 20-minute attacks: for each selected setting and concentrated pumper, leakage minus the default’s, paired per seed (negative: leaks less), with 95% bootstrap intervals over seeds.</w:t>
+        <w:t xml:space="preserve">Leakage Difference from the Default Across Attack Types</w:t>
       </w:r>
     </w:p>
     <w:p>
@@ -8905,17 +8831,7 @@
         <w:t xml:space="preserve"> </w:t>
       </w:r>
       <w:r>
-        <w:rPr>
-          <w:bCs/>
-          <w:b/>
-        </w:rPr>
-        <w:t xml:space="preserve">Held-Out Evaluation of the Principal Counter.</w:t>
-      </w:r>
-      <w:r>
-        <w:t xml:space="preserve"> </w:t>
-      </w:r>
-      <w:r>
-        <w:t xml:space="preserve">Second-protocol claims for the graded counter of 4 per 10 min on the held-out family: 12 shifted points, held-out attack rates and pools, three seeds each, a 20-minute pumper on three blocks real users share. A claim holds if true in 90% of cells; cells share workloads and seeds and are not independent. IV: the instant verifier’s cells.</w:t>
+        <w:t xml:space="preserve">Held-Out Evaluation of the Principal Counter</w:t>
       </w:r>
     </w:p>
     <w:tbl>
@@ -8929,7 +8845,7 @@
           <w:right w:w="57" w:type="dxa"/>
         </w:tblCellMar>
         <w:tblLook w:firstRow="1" w:lastRow="0" w:firstColumn="0" w:lastColumn="0" w:noHBand="0" w:noVBand="0" w:val="0020"/>
-        <w:tblCaption w:val="Table 7. Held-Out Evaluation of the Principal Counter. Second-protocol claims for the graded counter of 4 per 10 min on the held-out family: 12 shifted points, held-out attack rates and pools, three seeds each, a 20-minute pumper on three blocks real users share. A claim holds if true in 90% of cells; cells share workloads and seeds and are not independent. IV: the instant verifier’s cells."/>
+        <w:tblCaption w:val="Table 7. Held-Out Evaluation of the Principal Counter"/>
       </w:tblPr>
       <w:tblGrid>
         <w:gridCol w:w="648"/>
@@ -9544,7 +9460,7 @@
         <w:t xml:space="preserve"> </w:t>
       </w:r>
       <w:r>
-        <w:t xml:space="preserve">Frozen and run on the held-out family (Table 7), the counter leaked 33, 34, 33, and 62 messages against the four carriers, where the default leaked 287, 36, 344, and 287, and no policy 451 to 1 857, at a benign cost of 0.13 [0.09, 0.17] points, and failed both service-under-attack claims: 13 of the 17 cells that broke K3 lie at the three points with the most legitimate traffic, where users and pumper compete for one quota; K5 failed in 51 cells over 11 of 12 points. The counters selected for sparser traffic cost 4.7 and 5.8 points here even without an attack: the quota must match the traffic.</w:t>
+        <w:t xml:space="preserve">Table 7 covers 12 shifted points of the held-out family, with held-out attack rates and pools, three seeds each and a 20-minute pumper on three blocks real users share; a claim holds if true in 90% of cells, which share workloads and seeds and are not independent, and IV marks the instant verifier’s cells. Frozen and run on this family, the counter leaked 33, 34, 33, and 62 messages against the four carriers, where the default leaked 287, 36, 344, and 287, and no policy 451 to 1 857, at a benign cost of 0.13 [0.09, 0.17] points, and failed both service-under-attack claims: 13 of the 17 cells that broke K3 lie at the three points with the most legitimate traffic, where users and pumper compete for one quota; K5 failed in 51 cells over 11 of 12 points. The counters selected for sparser traffic cost 4.7 and 5.8 points here even without an attack: the quota must match the traffic.</w:t>
       </w:r>
     </w:p>
     <w:p>
@@ -9562,17 +9478,7 @@
         <w:t xml:space="preserve"> </w:t>
       </w:r>
       <w:r>
-        <w:rPr>
-          <w:bCs/>
-          <w:b/>
-        </w:rPr>
-        <w:t xml:space="preserve">Leakage and User Harm Under Shared-Block Pumping.</w:t>
-      </w:r>
-      <w:r>
-        <w:t xml:space="preserve"> </w:t>
-      </w:r>
-      <w:r>
-        <w:t xml:space="preserve">E1: a pumper on three blocks that real users share; 200 blocks, 60-minute attacks, seeds 300–309, four carriers. Leaked: SMS to the attacker’s numbers, summed over the four carriers’ runs of a seed, which can hide a carrier on which a policy loses (per carrier: artifact). Harm: net completions lost, in points, averaged over the carriers; negative: a gain. Brackets, on leakage and the attacked blocks only: 95% bootstrap intervals over seeds.</w:t>
+        <w:t xml:space="preserve">Leakage and User Harm Under Shared-Block Pumping</w:t>
       </w:r>
     </w:p>
     <w:tbl>
@@ -9586,7 +9492,7 @@
           <w:right w:w="57" w:type="dxa"/>
         </w:tblCellMar>
         <w:tblLook w:firstRow="0" w:lastRow="0" w:firstColumn="0" w:lastColumn="0" w:noHBand="0" w:noVBand="0" w:val="0000"/>
-        <w:tblCaption w:val="Table 8. Leakage and User Harm Under Shared-Block Pumping. E1: a pumper on three blocks that real users share; 200 blocks, 60-minute attacks, seeds 300–309, four carriers. Leaked: SMS to the attacker’s numbers, summed over the four carriers’ runs of a seed, which can hide a carrier on which a policy loses (per carrier: artifact). Harm: net completions lost, in points, averaged over the carriers; negative: a gain. Brackets, on leakage and the attacked blocks only: 95% bootstrap intervals over seeds."/>
+        <w:tblCaption w:val="Table 8. Leakage and User Harm Under Shared-Block Pumping"/>
       </w:tblPr>
       <w:tblGrid>
         <w:gridCol w:w="1845"/>
@@ -11037,17 +10943,7 @@
         <w:t xml:space="preserve"> </w:t>
       </w:r>
       <w:r>
-        <w:rPr>
-          <w:bCs/>
-          <w:b/>
-        </w:rPr>
-        <w:t xml:space="preserve">User Harm Under a Full-Block Poisoning Attack.</w:t>
-      </w:r>
-      <w:r>
-        <w:t xml:space="preserve"> </w:t>
-      </w:r>
-      <w:r>
-        <w:t xml:space="preserve">E1: a poisoner flooding all 200 blocks; 60-minute attacks, seeds 300–309. Extra harm: net completions lost, in points of all users (with 95% bootstrap intervals over seeds) and of first-time users.</w:t>
+        <w:t xml:space="preserve">User Harm Under a Full-Block Poisoning Attack</w:t>
       </w:r>
     </w:p>
     <w:tbl>
@@ -11061,7 +10957,7 @@
           <w:right w:w="57" w:type="dxa"/>
         </w:tblCellMar>
         <w:tblLook w:firstRow="0" w:lastRow="0" w:firstColumn="0" w:lastColumn="0" w:noHBand="0" w:noVBand="0" w:val="0000"/>
-        <w:tblCaption w:val="Table 9. User Harm Under a Full-Block Poisoning Attack. E1: a poisoner flooding all 200 blocks; 60-minute attacks, seeds 300–309. Extra harm: net completions lost, in points of all users (with 95% bootstrap intervals over seeds) and of first-time users."/>
+        <w:tblCaption w:val="Table 9. User Harm Under a Full-Block Poisoning Attack"/>
       </w:tblPr>
       <w:tblGrid>
         <w:gridCol w:w="2827"/>
@@ -11783,7 +11679,7 @@
         <w:pStyle w:val="BodyText"/>
       </w:pPr>
       <w:r>
-        <w:t xml:space="preserve">In Table 8, against the attacked no-policy arm, the counter cost all users nothing on average and gained the attacked blocks’ users three points on average, since without a destination policy, the pumper exhausts their blocks and the hourly budget; with the human-like carrier alone, it cost them 1.9. Against the attack-free operation, every evaluated policy left those users 5 to 9 points worse off on average (2 to 12 per carrier; 8 with none): none shields a block an attacker shares. Counter and tests together, explored outside the frozen claims, leaked least summed over the four carriers but not against the instant verifier (28;</w:t>
+        <w:t xml:space="preserve">Tables 8 and 9 report E1 at 200 blocks (60-minute attacks, seeds 300–309): a pumper on three blocks real users share, and a poisoner flooding all 200 blocks. Leakage under the pumper is summed over the four carriers’ runs of a seed, which can hide a carrier on which a policy loses (per carrier: artifact); harm is net completions lost in points, averaged over the carriers (negative: a gain), with intervals for leakage and the attacked blocks in Table 8 and for all users’ extra harm in Table 9. In Table 8, against the attacked no-policy arm, the counter cost all users nothing on average and gained the attacked blocks’ users three points on average, since without a destination policy, the pumper exhausts their blocks and the hourly budget; with the human-like carrier alone, it cost them 1.9. Against the attack-free operation, every evaluated policy left those users 5 to 9 points worse off on average (2 to 12 per carrier; 8 with none): none shields a block an attacker shares. Counter and tests together, explored outside the frozen claims, leaked least summed over the four carriers but not against the instant verifier (28;</w:t>
       </w:r>
       <w:r>
         <w:t xml:space="preserve"> </w:t>
@@ -11843,7 +11739,7 @@
         <w:pStyle w:val="BodyText"/>
       </w:pPr>
       <w:r>
-        <w:t xml:space="preserve">Attack-free (Figure 3a), the counter costs a block’s users nothing at one send per ten minutes, 2.3 points at four and 5.5 at eight, far below the idealized share beyond the quota (27% at four), since most challenged users complete or switch to WhatsApp; without WhatsApp, eight sends cost 13.2. A 30-minute launch at three times the normal rate costs its blocks’ users 16 points. Over 60 minutes (Figure 3c) the default leaked 110, 144 and 242 messages on 3, 10 and 30 blocks, against 105, 139 and 240 from Equation (2) (</w:t>
+        <w:t xml:space="preserve">Figure 3 shows the counter’s operating boundary (E4, seeds 300–304): in (a), the attributable loss of the three hot blocks’ users against their legitimate rate, attack-free and with a never-verifying pumper on those blocks; in (b, c), leakage in 20 and 60 minutes against the blocks a pumper uses, at full rate or paced, with Equations (2)–(4) for the full-rate pumper as hollow markers. All horizontal axes and the vertical axes of (b, c) are logarithmic, and lines join sampled settings without locating a crossover. Attack-free, the counter costs a block’s users nothing at one send per ten minutes, 2.3 points at four and 5.5 at eight, far below the idealized share beyond the quota (27% at four), since most challenged users complete or switch to WhatsApp; without WhatsApp, eight sends cost 13.2. A 30-minute launch at three times the normal rate costs its blocks’ users 16 points. Over 60 minutes (Figure 3c) the default leaked 110, 144 and 242 messages on 3, 10 and 30 blocks, against 105, 139 and 240 from Equation (2) (</w:t>
       </w:r>
       <m:oMath>
         <m:r>
@@ -11939,17 +11835,7 @@
         <w:t xml:space="preserve"> </w:t>
       </w:r>
       <w:r>
-        <w:rPr>
-          <w:bCs/>
-          <w:b/>
-        </w:rPr>
         <w:t xml:space="preserve">Operating Boundary of the Counter.</w:t>
-      </w:r>
-      <w:r>
-        <w:t xml:space="preserve"> </w:t>
-      </w:r>
-      <w:r>
-        <w:t xml:space="preserve">E4, seeds 300–304; lines join sampled settings and do not locate a crossover. (a) Attributable loss in points of the three hot blocks’ users against their legitimate rate, attack-free and with a never-verifying pumper on those blocks. (b, c) Leakage in 20 and 60 minutes against the blocks a pumper uses, at full rate or paced, and Equations (2)–(4) for the full-rate pumper (hollow markers). All horizontal axes and the vertical axes of (b, c) are logarithmic. Bands and bars: 95% bootstrap intervals over seeds.</w:t>
       </w:r>
     </w:p>
     <w:p>

</xml_diff>

<commit_message>
Manuscript revision 8: abstract, introduction, related work and conclusions in the journal's form
Introduction: problem, existing defenses, their documented limits, the two
closest studies and the gap, the approach and scope, research questions and
contributions. Related work in thematic subsections ordered along the OTP
request path, with a comparison table (Table 1) and a figure of the path
(Figure 1, paper/figures/fig8_defense_path.tex); every cited work was read.
Abstract and conclusions follow the problem-gap-approach-findings-boundary-
implication order. No experiment, number or claim changed. Tables are now
1-10 and figures 1-4; the study map, the figure key, the README, the
changelog and the round-8 letter follow the new numbering.

Co-Authored-By: Claude Fable 5.1 <noreply@anthropic.com>
Claude-Session: https://claude.ai/code/session_01RjWdFzUgYk6Hwie2YbnvyG
</commit_message>
<xml_diff>
--- a/paper/main.docx
+++ b/paper/main.docx
@@ -111,7 +111,7 @@
           <w:sz w:val="24"/>
           <w:szCs w:val="24"/>
         </w:rPr>
-        <w:t>Endpoints that send one-time passwords via SMS are abused to waste money (flooding) or to earn part of the termination fee (SMS pumping). We evaluate in simulation a twelve-step defense that draws trust from app attestation, signed sessions, and verification outcomes, against simpler designs and 25 attacker profiles. Attacks with a signature in the request are contained at a low cost to simulated users; a residential attacker with farmed CAPTCHA scores is rationed by refusing half of the first-time users. On the destination, short-window counters of SMS sent per number block, selected at a benign service target, leaked 6 to 48 messages against four concentrated 20-minute pumpers at 0.06 to 0.43 points of attack-free completion, where at the busiest density, the default sequential tests of verification outcomes leaked 19 to 452. Under a second predeclared protocol on seeds and workloads held out from selection, the frozen counter met its leakage and benign-cost claims, leaked no more than the tests in all but 13 of 144 cells, all against an instantly verifying carrier, and failed both service-under-attack claims when the pumper shares blocks with real users. For attacks of up to an hour, unfitted estimates whose crossing is algebraic, not a measured switching point, ordered the policies’ mean leakage in 18 of 18 decisive boundary cells with the counter’s cold-start bound and 17 with its warm-start bound: the counter loses its advantage against paced or widely spread pumpers.</w:t>
+        <w:t>Endpoints that send one-time passwords via SMS must be reachable before any account exists, and they are abused to waste a service’s messaging budget (flooding) or to earn part of the termination fee on a colluding operator’s number ranges (SMS pumping). Existing defenses limit the request source, score each request with labeled traffic, or block destination prefixes, but a service that sees only its own traffic has no controlled evidence of which destination signal to act on, the number of sends to a block or the fate of their codes, nor of what either costs the legitimate users who share a block with an attacker. This study evaluates in simulation a twelve-step defense for a registration flow, which draws trust from app attestation, signed sessions and verification outcomes, against a seven-control baseline, five simpler designs and 25 attacker profiles, and compares those two label-free destination policies under two protocols committed before their runs. Results show that attacks carrying a signature in the request are contained at a low cost to simulated users, whereas a residential attacker with farmed CAPTCHA scores is only rationed, by refusing half of first-time users. On the destination, short-window counters of SMS sent per number block, selected at a benign service target, leaked 6 to 48 messages against four concentrated 20-minute pumpers at 0.06 to 0.43 points of attack-free completion, where the default sequential tests of verification outcomes leaked 19 to 452 at the busiest density; on seeds and workloads held out from selection, the frozen counter met its leakage and benign-cost claims and leaked no more than the tests in all but 13 of 144 cells, all against an instantly verifying carrier, but failed both service-under-attack claims when the pumper shared blocks with real users. Unfitted estimates ordered the policies’ mean leakage in 18 of 18 decisive boundary cells with the counter’s cold-start bound and 17 with its warm-start bound; their crossing is algebraic, not a measured switching point, and the counter loses its advantage against paced or widely spread pumpers. These findings rest on simulated users and assumed calibration. For operators they give a tested ordering of destination policies against short, concentrated pumping, and identify the quota per block, and the competition for it on a shared block, as what decides a counter’s cost.</w:t>
       </w:r>
     </w:p>
     <w:p>
@@ -177,7 +177,7 @@
         <w:pStyle w:val="FirstParagraph"/>
       </w:pPr>
       <w:r>
-        <w:t xml:space="preserve">Most online services verify a phone number by sending a code via SMS from an endpoint reachable before any account exists, at a tenth of a cent to twenty cents per message. A flooder makes the service send to numbers it does not own; a pumper sends to a range whose operator shares the termination fee, turning the service’s SMS budget into its income (MITRE Corporation, 2026). Twitter’s owner said in 2023 that pumping had cost the company approximately $60 million a year (Commsrisk, 2023), and Huh et al. (2025) found as many attack requests as genuine ones in three months of one large service’s logs.</w:t>
+        <w:t xml:space="preserve">Most online services verify a phone number by sending a code via SMS from an endpoint that must be reachable before any account exists, at a tenth of a cent to twenty cents per message. Two abuses follow from that design. A flooder makes the service send to numbers it does not own, so the service pays for messages nobody asked for; a pumper sends to a range whose operator shares the termination fee, so the service’s SMS budget becomes the attacker’s income, a technique that MITRE catalogues as resource hijacking (MITRE Corporation, 2026). Pumping is the SMS form of international revenue-share fraud, whose voice form was estimated at $10.76 billion a year in 2015 (Sahin et al., 2017). The sums at a single service are not small: Twitter’s owner said in 2023 that pumping had cost the company approximately $60 million a year (Commsrisk, 2023), and Huh et al. (2025) found as many attack requests as genuine ones in three months of one large service’s authentication logs.</w:t>
       </w:r>
     </w:p>
     <w:p>
@@ -185,7 +185,7 @@
         <w:pStyle w:val="BodyText"/>
       </w:pPr>
       <w:r>
-        <w:t xml:space="preserve">We study the defenses of a registration flow: a baseline of seven controls (v1) and a twelve-step redesign with attested platforms, signed sessions, number checks before a message is paid for, reputation from whether codes were entered, a five-response risk score, and a hard budget. We ask in simulation which attacks it contains against simpler designs, at what cost in completed registrations (RQ1); which layer is responsible (RQ2); when outcome-based reputation separates an attacker from simulated users (RQ3); what rationing costs when it does not (RQ4); and what destination policies cost legitimate users, with and without an attack (RQ5).</w:t>
+        <w:t xml:space="preserve">Defenses act at three points on the path of a request. At the source, services limit requests per address, session and device, challenge them with CAPTCHAs, block known proxies and restrict destination countries, and risk-based authentication combines such signals into a score with graded responses (Wiefling et al., 2019). At the messaging vendor, Twilio’s Fraud Guard blocks destination prefixes and countries whose traffic departs from an account’s history (Twilio Inc., 2026c), and its per-number pumping risk score advises friction from 60 and refusal above 90 (Twilio Inc., 2026a). On a service’s own logs, Huh et al. (2025) detect attack requests one at a time with gradient-boosted trees, at 89.6% recall and 0.19% false positives on web traffic, and Zaliskyi and Odarchenko (2026) count application-to-person sends per number prefix in five-minute windows and quarantine a prefix that crosses a threshold.</w:t>
       </w:r>
     </w:p>
     <w:p>
@@ -193,7 +193,49 @@
         <w:pStyle w:val="BodyText"/>
       </w:pPr>
       <w:r>
-        <w:t xml:space="preserve">Because a pumper is paid only on its partner’s ranges, the study focuses on the destination: under a predeclared comparison, a plain counter of sends per number block leaked less than our sequential tests of code outcomes, and a second predeclared protocol mapped where that holds and fails. This paper makes the following contributions:</w:t>
+        <w:t xml:space="preserve">Each of these rests on an assumption that the literature has tested and found wanting. Source-side limits assume that an identity is scarce; without a trusted authority, one entity can present as many identities as it likes (Douceur, 2002). Addresses are not scarce either: five residential proxy services relayed through 6.2 million addresses in 238 countries, 90% of them for under fifteen minutes each and 2.2% of them on any blacklist (Mi et al., 2019), and carrier-grade NAT, deployed in more than 90% of cellular networks, puts dozens of subscribers behind one address and makes address reputation</w:t>
+      </w:r>
+      <w:r>
+        <w:t xml:space="preserve"> </w:t>
+      </w:r>
+      <w:r>
+        <w:t xml:space="preserve">“</w:t>
+      </w:r>
+      <w:r>
+        <w:t xml:space="preserve">all but infeasible</w:t>
+      </w:r>
+      <w:r>
+        <w:t xml:space="preserve">”</w:t>
+      </w:r>
+      <w:r>
+        <w:t xml:space="preserve"> </w:t>
+      </w:r>
+      <w:r>
+        <w:t xml:space="preserve">(Richter et al., 2016). A CAPTCHA costs an attacker about a dollar per thousand solutions from a labor market that was already paying ten dollars per thousand in 2007 (Motoyama et al., 2010). Supervised detection needs labels, which Huh et al. (2025) derived from traffic peaks after the fact, and a decision taken per request can be probed one threshold at a time. Prefix counting acts on the one key a pumper cannot rotate away from, since it is paid only on its partner’s ranges, but the thresholds that stopped 95% and 63% of two incidents in the data of Zaliskyi and Odarchenko (2026) also blocked 58% of a legitimate marketing campaign.</w:t>
+      </w:r>
+    </w:p>
+    <w:p>
+      <w:pPr>
+        <w:pStyle w:val="BodyText"/>
+      </w:pPr>
+      <w:r>
+        <w:t xml:space="preserve">The two closest studies therefore each act on one destination signal, and neither measures what acting on it costs. Huh et al. (2025) report that about 92% of attack requests fell on prefixes with zero conversion, against 21% for genuine traffic, so whether codes are entered is informative; but the signal enters a classifier that needs labeled traffic and was not released because it is deployed. Zaliskyi and Odarchenko (2026) act on send counts alone, without outcomes, and conclude that counts by themselves cannot safely separate inflated traffic from a campaign. Neither reports what a destination policy costs the legitimate users who share a number block with the attacker, neither reports its cost when there is no attack, and neither fixed the setting it would select before seeing the evaluation traffic. A service that sees only its own traffic is thus left without controlled evidence on the question it can act on: whether to count sends per block or to test the outcomes of their codes, at what quota or threshold, and at what price to its own users.</w:t>
+      </w:r>
+    </w:p>
+    <w:p>
+      <w:pPr>
+        <w:pStyle w:val="BodyText"/>
+      </w:pPr>
+      <w:r>
+        <w:t xml:space="preserve">This paper makes that comparison in simulation, inside a complete defense for a registration flow. We start from a baseline of seven controls, v1, and show how an attacker within a stated threat model breaks each of eight assumptions behind them. The twelve-step redesign takes the platform from an attestation rather than a header, binds requests to signed sessions, checks the number before a message is paid for, builds reputation from whether earlier codes were entered, scores each request into one of five responses, and enforces a hard budget; on the destination it offers two label-free policies keyed on the 8-digit number block, a short-window counter of sends and sequential tests of code outcomes. Seven designs and 25 scripted attacker profiles, from a single address to pumpers that enter codes, fake delivery receipts or buy challenge solutions, run over simulated users on a simulated clock. Two protocols were committed before their runs: the first selects destination settings on tuning seeds at a benign service target, and the second, written after that selection, freezes the selected counter and tests five claims on seeds and workloads held out from selection. The implementation, the protocols and every run’s configuration and outcome are public (Ahmed, 2026). Everything is simulated: three behavioral parameters have published counterparts and the rest are assumptions, so the results describe this generator rather than real traffic.</w:t>
+      </w:r>
+    </w:p>
+    <w:p>
+      <w:pPr>
+        <w:pStyle w:val="BodyText"/>
+      </w:pPr>
+      <w:r>
+        <w:t xml:space="preserve">We ask which attacks the design contains against simpler designs, and at what cost in completed registrations (RQ1); which layer is responsible (RQ2); when outcome-based reputation separates an attacker from simulated users (RQ3); what rationing costs when it does not (RQ4); and what destination policies cost legitimate users, with and without an attack (RQ5). This paper makes the following contributions:</w:t>
       </w:r>
     </w:p>
     <w:p>
@@ -204,7 +246,7 @@
         </w:numPr>
       </w:pPr>
       <w:r>
-        <w:t xml:space="preserve">an analysis of eight gaps in the baseline, a twelve-step design, and an open implementation;</w:t>
+        <w:t xml:space="preserve">an analysis of eight gaps in a seven-control baseline, a twelve-step design that closes them, and an open implementation with a regression test for each of the replay and concurrency defects found on the way;</w:t>
       </w:r>
     </w:p>
     <w:p>
@@ -215,7 +257,7 @@
         </w:numPr>
       </w:pPr>
       <w:r>
-        <w:t xml:space="preserve">measurements of where outcome-based reputation stops separating an attacker from users, and of what rationing then costs and depends on;</w:t>
+        <w:t xml:space="preserve">measurements of where outcome-based reputation stops separating an attacker from the users whose keys it shares, and of what rationing then costs and depends on;</w:t>
       </w:r>
     </w:p>
     <w:p>
@@ -226,7 +268,7 @@
         </w:numPr>
       </w:pPr>
       <w:r>
-        <w:t xml:space="preserve">two predeclared comparisons of destination policies, a send counter against sequential tests of code outcomes, with their failures and collateral damage;</w:t>
+        <w:t xml:space="preserve">two predeclared comparisons of destination policies, a send counter against sequential tests of code outcomes, selected at a stated service target and charged with their failures and with their collateral damage to users who share a block with the attacker;</w:t>
       </w:r>
     </w:p>
     <w:p>
@@ -237,7 +279,7 @@
         </w:numPr>
       </w:pPr>
       <w:r>
-        <w:t xml:space="preserve">unfitted estimates of when counting leaks less than our tests, checked against the measurements.</w:t>
+        <w:t xml:space="preserve">unfitted estimates of when counting leaks less than testing, derived from the rules and the attack rate alone and checked against the measurements over attacks of up to an hour.</w:t>
       </w:r>
     </w:p>
     <w:p>
@@ -249,7 +291,7 @@
       </w:r>
     </w:p>
     <w:bookmarkEnd w:id="20"/>
-    <w:bookmarkStart w:id="25" w:name="related-work"/>
+    <w:bookmarkStart w:id="30" w:name="related-work"/>
     <w:p>
       <w:pPr>
         <w:pStyle w:val="Heading1"/>
@@ -265,24 +307,6 @@
       </w:r>
       <w:r>
         <w:t xml:space="preserve">Related work</w:t>
-      </w:r>
-    </w:p>
-    <w:bookmarkStart w:id="21" w:name="revenue-share-fraud"/>
-    <w:p>
-      <w:pPr>
-        <w:pStyle w:val="Heading2"/>
-      </w:pPr>
-      <w:r>
-        <w:rPr>
-          <w:rStyle w:val="SectionNumber"/>
-        </w:rPr>
-        <w:t xml:space="preserve">2.1</w:t>
-      </w:r>
-      <w:r>
-        <w:tab/>
-      </w:r>
-      <w:r>
-        <w:t xml:space="preserve">Revenue-share fraud</w:t>
       </w:r>
     </w:p>
     <w:p>
@@ -290,11 +314,75 @@
         <w:pStyle w:val="FirstParagraph"/>
       </w:pPr>
       <w:r>
-        <w:t xml:space="preserve">In international revenue-share fraud, traffic is generated to an advertised number range, and the termination fee is split along the route (Sahin et al., 2017). The 3.14 million test numbers from twelve providers collected by Sahin and Francillon (2021) show that the range is the fraudster’s managed asset.</w:t>
+        <w:t xml:space="preserve">We group prior work by where it acts on the path of an OTP request, from the client through the service and its messaging vendor to the operator that terminates the message (Figure 1), and close with the gap this study addresses (Table 1).</w:t>
       </w:r>
     </w:p>
-    <w:bookmarkEnd w:id="21"/>
-    <w:bookmarkStart w:id="22" w:name="detecting-artificially-inflated-sms"/>
+    <w:p>
+      <w:pPr>
+        <w:pStyle w:val="CaptionedFigure"/>
+      </w:pPr>
+      <w:r>
+        <w:drawing>
+          <wp:inline>
+            <wp:extent cx="5334000" cy="2089500"/>
+            <wp:effectExtent b="0" l="0" r="0" t="0"/>
+            <wp:docPr descr="" title="" id="22" name="Picture"/>
+            <a:graphic>
+              <a:graphicData uri="http://schemas.openxmlformats.org/drawingml/2006/picture">
+                <pic:pic>
+                  <pic:nvPicPr>
+                    <pic:cNvPr descr="figures/fig8_defense_path.png" id="23" name="Picture"/>
+                    <pic:cNvPicPr>
+                      <a:picLocks noChangeArrowheads="1" noChangeAspect="1"/>
+                    </pic:cNvPicPr>
+                  </pic:nvPicPr>
+                  <pic:blipFill>
+                    <a:blip r:embed="rId21"/>
+                    <a:stretch>
+                      <a:fillRect/>
+                    </a:stretch>
+                  </pic:blipFill>
+                  <pic:spPr bwMode="auto">
+                    <a:xfrm>
+                      <a:off x="0" y="0"/>
+                      <a:ext cx="5334000" cy="2089500"/>
+                    </a:xfrm>
+                    <a:prstGeom prst="rect">
+                      <a:avLst/>
+                    </a:prstGeom>
+                    <a:noFill/>
+                    <a:ln w="9525">
+                      <a:noFill/>
+                      <a:headEnd/>
+                      <a:tailEnd/>
+                    </a:ln>
+                  </pic:spPr>
+                </pic:pic>
+              </a:graphicData>
+            </a:graphic>
+          </wp:inline>
+        </w:drawing>
+      </w:r>
+    </w:p>
+    <w:p>
+      <w:pPr>
+        <w:pStyle w:val="ImageCaption"/>
+      </w:pPr>
+      <w:r>
+        <w:rPr>
+          <w:bCs/>
+          <w:b/>
+        </w:rPr>
+        <w:t xml:space="preserve">Fig. 1.</w:t>
+      </w:r>
+      <w:r>
+        <w:t xml:space="preserve"> </w:t>
+      </w:r>
+      <w:r>
+        <w:t xml:space="preserve">Defenses Along the Path of an OTP Request.</w:t>
+      </w:r>
+    </w:p>
+    <w:bookmarkStart w:id="24" w:name="Xdc4f4927748c3842e74dd54c57f02ecb9c6dc2c"/>
     <w:p>
       <w:pPr>
         <w:pStyle w:val="Heading2"/>
@@ -303,13 +391,13 @@
         <w:rPr>
           <w:rStyle w:val="SectionNumber"/>
         </w:rPr>
-        <w:t xml:space="preserve">2.2</w:t>
+        <w:t xml:space="preserve">2.1</w:t>
       </w:r>
       <w:r>
         <w:tab/>
       </w:r>
       <w:r>
-        <w:t xml:space="preserve">Detecting artificially inflated SMS</w:t>
+        <w:t xml:space="preserve">Revenue-share fraud and the destination as the attacker’s asset</w:t>
       </w:r>
     </w:p>
     <w:p>
@@ -317,11 +405,29 @@
         <w:pStyle w:val="FirstParagraph"/>
       </w:pPr>
       <w:r>
-        <w:t xml:space="preserve">Huh et al. (2025) trained gradient-boosted trees on 9.4 million SMS authentication logs from nineteen countries, reaching 89.6% recall at 0.19% false positives on web traffic. Approximately 73% of web attacks sent four or fewer requests per identity a day, defeating per-entity limits, and destination signals were the strongest: about 92% zero conversion for attacks against 21% for genuine traffic. Their detector requires labeled traffic and acts per request. Their data show that destination aggregation is informative; we add a controlled comparison of two label-free ways to act on it per block, from send counts or code outcomes, and of their cost to users sharing a block. Theirs was not reproduced, so the two are not ranked. Zaliskyi and Odarchenko (2026) count A2P sends per prefix (a number less its last three digits) in fixed or rolling five-minute windows and quarantine a prefix for 24 hours past a day or night threshold. On metadata of two confirmed incidents fixed windows blocked 95% and 63% of the traffic, and 58% of a legitimate marketing campaign; counting unique recipients blocked 2% of the campaign and none of the first incident. Theirs is a send counter judged on real traffic by messages blocked; ours compares a counter with outcome tests at a service target, in simulation, by what users sharing a block lose; the numbers are not comparable.</w:t>
+        <w:t xml:space="preserve">In international revenue-share fraud, a fraudster obtains</w:t>
+      </w:r>
+      <w:r>
+        <w:t xml:space="preserve"> </w:t>
+      </w:r>
+      <w:r>
+        <w:t xml:space="preserve">“</w:t>
+      </w:r>
+      <w:r>
+        <w:t xml:space="preserve">pseudo</w:t>
+      </w:r>
+      <w:r>
+        <w:t xml:space="preserve">”</w:t>
+      </w:r>
+      <w:r>
+        <w:t xml:space="preserve"> </w:t>
+      </w:r>
+      <w:r>
+        <w:t xml:space="preserve">premium-rate numbers from websites that pay for traffic and generates calls to them; a transit operator short-stops the calls, keeps the termination fee and shares it with the fraudster. The taxonomy of Sahin et al. (2017) sets the scheme among frauds that persist because call routing is opaque, each operator knowing only the next hop, and because operators are reluctant to share pricing, routes or fraud findings with competitors. Sahin and Francillon (2021) then measured the market from the supply side, collecting 3,149,793 distinct test numbers that twelve such providers advertised between January 2016 and November 2019 across 238 destinations. The ranges are a managed asset: 80% of them were shared across providers, which subdivide a hijacked block among themselves, and 70% lay inside valid numbering plans. From this intelligence and from call histories, the authors built a random-forest detector for an operator’s call records that reached 98% accuracy at 0.28% false positives, where blocking the two-digit neighborhood of a known test number caught 63%. Both studies concern voice telephony, and the detector needs the test-number intelligence and the call histories of an operator. The lesson for SMS is that the number range, not the calling identity, is what the fraudster must keep, and that a party seeing only its own traffic detects the fraud late. An OTP endpoint is in a weaker position still: it holds neither intelligence nor call histories, only its own sends and whether their codes were entered. That is why the policies of Section 4.3 are keyed on the 8-digit block and use only those two quantities.</w:t>
       </w:r>
     </w:p>
-    <w:bookmarkEnd w:id="22"/>
-    <w:bookmarkStart w:id="23" w:name="defenses-in-practice"/>
+    <w:bookmarkEnd w:id="24"/>
+    <w:bookmarkStart w:id="25" w:name="X54ece4fa9c9178e0a892a2fb454b0c3ae29bfd2"/>
     <w:p>
       <w:pPr>
         <w:pStyle w:val="Heading2"/>
@@ -330,13 +436,13 @@
         <w:rPr>
           <w:rStyle w:val="SectionNumber"/>
         </w:rPr>
-        <w:t xml:space="preserve">2.3</w:t>
+        <w:t xml:space="preserve">2.2</w:t>
       </w:r>
       <w:r>
         <w:tab/>
       </w:r>
       <w:r>
-        <w:t xml:space="preserve">Defenses in practice</w:t>
+        <w:t xml:space="preserve">Detecting artificially inflated SMS traffic</w:t>
       </w:r>
     </w:p>
     <w:p>
@@ -344,29 +450,35 @@
         <w:pStyle w:val="FirstParagraph"/>
       </w:pPr>
       <w:r>
-        <w:t xml:space="preserve">Twilio’s Fraud Guard blocks regions known for pumping (Twilio Inc., 2026c), and its SMS Pumping Risk Score advises friction from 60 and refusal above 90 (Twilio Inc., 2026a), so graded destination action is established; no product was benchmarked. CAPTCHA solving is a labor market at approximately $1 per thousand (Motoyama et al., 2010), open where machine solvers fail (Dionysiou and Athanasopoulos, 2020); client puzzles (Dean and Stubblefield, 2001) were not evaluated. Residential proxy addresses rotate within minutes (Mi et al., 2019), and carrier-grade NAT makes address reputation on cellular networks</w:t>
-      </w:r>
-      <w:r>
-        <w:t xml:space="preserve"> </w:t>
-      </w:r>
-      <w:r>
-        <w:t xml:space="preserve">“</w:t>
-      </w:r>
-      <w:r>
-        <w:t xml:space="preserve">all but infeasible</w:t>
-      </w:r>
-      <w:r>
-        <w:t xml:space="preserve">”</w:t>
-      </w:r>
-      <w:r>
-        <w:t xml:space="preserve"> </w:t>
-      </w:r>
-      <w:r>
-        <w:t xml:space="preserve">(Richter et al., 2016).</w:t>
+        <w:t xml:space="preserve">Huh et al. (2025) trained gradient-boosted trees on 9.4 million SMS authentication logs from nineteen countries, reaching 89.6% recall at 0.19% false positives on web traffic and 91.1% at 0.11% on app traffic. The logs came unlabeled from one large service over three months of 2023; the authors labeled attacks inside traffic peaks, as web identities with four or more requests and no successful validation in a day, or app number-and-device pairs never validated, and treated requests outside peaks as genuine. Two models, with 18 and 13 features at three levels (the request, the identity’s history, and country-wide aggregates over 24 hours), run per request before the message is sent. Approximately 73% of web attacks sent four or fewer requests per identity a day, defeating per-entity limits, and destination signals were the strongest: about 92% zero conversion for attacks against 21% for genuine traffic, and 91% of app attacks fell on prefixes with more than 30 distinct numbers in a day against 0.01% of genuine requests. The same data show the counter-move: in three countries, about 82% of attack requests validated their codes, which the authors attribute to attackers avoiding conversion-rate rules. Their detector requires labeled traffic and acts per request; the cost to legitimate users is reported as false positives only, and the model was not released because it is deployed. Their data show that destination aggregation is informative; we add a controlled comparison of two label-free ways to act on it per block, from send counts or code outcomes, and of their cost to users sharing a block. Theirs was not reproduced, so the two are not ranked.</w:t>
       </w:r>
     </w:p>
-    <w:bookmarkEnd w:id="23"/>
-    <w:bookmarkStart w:id="24" w:name="identity-and-change-detection"/>
+    <w:p>
+      <w:pPr>
+        <w:pStyle w:val="BodyText"/>
+      </w:pPr>
+      <w:r>
+        <w:t xml:space="preserve">Zaliskyi and Odarchenko (2026) count A2P sends per prefix (a number less its last three digits) in fixed or rolling five-minute windows and quarantine a prefix for 24 hours past a day or night threshold. On metadata of two confirmed incidents fixed windows blocked 95% and 63% of the traffic, and 58% of a legitimate marketing campaign; counting unique recipients blocked 2% of the campaign and none of the first incident. The authors conclude that message counts alone cannot safely separate inflated traffic from a campaign; they do not use verification outcomes. Theirs is a send counter judged on real traffic by messages blocked; ours compares a counter with outcome tests at a service target, in simulation, by what users sharing a block lose; the numbers are not comparable.</w:t>
+      </w:r>
+    </w:p>
+    <w:p>
+      <w:pPr>
+        <w:pStyle w:val="BodyText"/>
+      </w:pPr>
+      <w:r>
+        <w:t xml:space="preserve">The messaging vendors act one hop later. Twilio’s Fraud Guard analyzes an account’s historical traffic and blocks sends to a destination prefix or country whose pattern departs from it, with three protection levels and claimed false-positive rates under 1% and 2% (Twilio Inc., 2026c); its SMS Pumping Risk Score rates a number from 0 to 100 from Fraud Guard, risky carriers, traffic patterns and low conversion, and advises friction from 60 and refusal above 90 (Twilio Inc., 2026a). Graded destination action is therefore established practice, but the signals and models are undisclosed, so no product was benchmarked.</w:t>
+      </w:r>
+    </w:p>
+    <w:p>
+      <w:pPr>
+        <w:pStyle w:val="BodyText"/>
+      </w:pPr>
+      <w:r>
+        <w:t xml:space="preserve">Taken together, these works establish that attacks concentrate on destination prefixes and avoid converting, that counts alone misfire on campaigns, and that some campaigns now enter codes to pass conversion rules. None of them compares counting with outcome testing on the same traffic, fixes its setting before the evaluation runs, or charges a policy with the registrations it costs the users of a shared block. Those are the questions of Sections 6.5–6.7, and the attackers that enter codes, fake receipts and build trust (Table 4) are modeled on the counter-move above.</w:t>
+      </w:r>
+    </w:p>
+    <w:bookmarkEnd w:id="25"/>
+    <w:bookmarkStart w:id="26" w:name="Xacd34ca2899e26b07c0be49a94f9c27ea97f1a2"/>
     <w:p>
       <w:pPr>
         <w:pStyle w:val="Heading2"/>
@@ -375,13 +487,13 @@
         <w:rPr>
           <w:rStyle w:val="SectionNumber"/>
         </w:rPr>
-        <w:t xml:space="preserve">2.4</w:t>
+        <w:t xml:space="preserve">2.3</w:t>
       </w:r>
       <w:r>
         <w:tab/>
       </w:r>
       <w:r>
-        <w:t xml:space="preserve">Identity and change detection</w:t>
+        <w:t xml:space="preserve">Source-side controls and the attacker’s market</w:t>
       </w:r>
     </w:p>
     <w:p>
@@ -389,48 +501,37 @@
         <w:pStyle w:val="FirstParagraph"/>
       </w:pPr>
       <w:r>
-        <w:t xml:space="preserve">One entity can present many identities (Douceur, 2002), and a signed session provides continuity, not scarcity. Our block tests are Wald’s sequential tests (Wald, 1945) run as Page’s cumulative sums (Page, 1954). Quickest change detection minimizes delay under false-alarm constraints (Veeravalli and Banerjee, 2012), and a CUSUM’s parameters follow from the error rates it must meet (NIST/SEMATECH, 2026); windowed statistics and confidence sequences (Howard et al., 2021) were not evaluated, so</w:t>
-      </w:r>
-      <w:r>
-        <w:t xml:space="preserve"> </w:t>
-      </w:r>
-      <w:r>
-        <w:t xml:space="preserve">‘</w:t>
-      </w:r>
-      <w:r>
-        <w:t xml:space="preserve">testing</w:t>
-      </w:r>
-      <w:r>
-        <w:t xml:space="preserve">’</w:t>
-      </w:r>
-      <w:r>
-        <w:t xml:space="preserve"> </w:t>
-      </w:r>
-      <w:r>
-        <w:t xml:space="preserve">below means our conversion and speed tests only. Step 7 resembles risk-based authentication (Wiefling et al., 2019), and attacks on the code once sent are a separate problem (Mulliner et al., 2013; Siadati et al., 2017).</w:t>
+        <w:t xml:space="preserve">What a source-side control costs an attacker has been measured. Motoyama et al. (2010) bought CAPTCHA solutions from eight retail services at $1 to $20 per thousand, found that the wage for solving had fallen from $10 per thousand in 2007 to about a dollar by 2009, and measured a median response of 14 seconds at error rates of 10% to 20%; human labor had displaced automated solvers, and the authors conclude that a CAPTCHA limits access to attackers whose business is profitable despite that cost rather than keeping machines out. Dionysiou and Athanasopoulos (2020) classify the machine-learning solvers that have since appeared. Addresses have a market too: Mi et al. (2019) infiltrated five residential proxy providers and observed 6,183,876 addresses in 238 countries and 52,905 ISPs, 95% of them residential, 90% relaying for under 870 seconds and 2.2% on any blacklist; Richter et al. (2016) found carrier-grade NAT in more than 90% of cellular networks, with 64 subscribers behind one address where each receives a thousand ports, and conclude that address reputation and blacklisting become</w:t>
+      </w:r>
+      <w:r>
+        <w:t xml:space="preserve"> </w:t>
+      </w:r>
+      <w:r>
+        <w:t xml:space="preserve">“</w:t>
+      </w:r>
+      <w:r>
+        <w:t xml:space="preserve">all but infeasible</w:t>
+      </w:r>
+      <w:r>
+        <w:t xml:space="preserve">”</w:t>
+      </w:r>
+      <w:r>
+        <w:t xml:space="preserve"> </w:t>
+      </w:r>
+      <w:r>
+        <w:t xml:space="preserve">there. Behind both markets lies the older observation of Douceur (2002) that without a trusted authority one entity can present many identities, so a signed session provides continuity, not scarcity. Risk-based authentication, which Wiefling et al. (2019) probed at eight large services, scores a login from its address, user agent, resolution, time and similar features into risk buckets and asks for a further factor above a threshold; every service that showed such behavior used the address, and none disclosed its procedure. Step 7 of our design resembles it, but scores a request made before any account exists, so the account history that risk-based authentication relies on is absent. Client puzzles (Dean and Stubblefield, 2001) would add a computational price per request; they were not evaluated.</w:t>
       </w:r>
     </w:p>
-    <w:bookmarkEnd w:id="24"/>
-    <w:bookmarkEnd w:id="25"/>
-    <w:bookmarkStart w:id="28" w:name="baseline-and-threat-model"/>
     <w:p>
       <w:pPr>
-        <w:pStyle w:val="Heading1"/>
+        <w:pStyle w:val="BodyText"/>
       </w:pPr>
       <w:r>
-        <w:rPr>
-          <w:rStyle w:val="SectionNumber"/>
-        </w:rPr>
-        <w:t xml:space="preserve">3</w:t>
-      </w:r>
-      <w:r>
-        <w:tab/>
-      </w:r>
-      <w:r>
-        <w:t xml:space="preserve">Baseline and threat model</w:t>
+        <w:t xml:space="preserve">These measurements say what an attacker can buy. For a defense they imply that per-identity controls tax identity reset rather than prevent it, and that the question for a residential attacker is not whether it can be told from a person but what rationing it costs the people it resembles. RQ3 and RQ4 measure that in this design.</w:t>
       </w:r>
     </w:p>
-    <w:bookmarkStart w:id="26" w:name="the-v1-baseline"/>
+    <w:bookmarkEnd w:id="26"/>
+    <w:bookmarkStart w:id="27" w:name="sequential-tests-and-change-detection"/>
     <w:p>
       <w:pPr>
         <w:pStyle w:val="Heading2"/>
@@ -439,13 +540,13 @@
         <w:rPr>
           <w:rStyle w:val="SectionNumber"/>
         </w:rPr>
-        <w:t xml:space="preserve">3.1</w:t>
+        <w:t xml:space="preserve">2.4</w:t>
       </w:r>
       <w:r>
         <w:tab/>
       </w:r>
       <w:r>
-        <w:t xml:space="preserve">The v1 baseline</w:t>
+        <w:t xml:space="preserve">Sequential tests and change detection</w:t>
       </w:r>
     </w:p>
     <w:p>
@@ -453,7 +554,79 @@
         <w:pStyle w:val="FirstParagraph"/>
       </w:pPr>
       <w:r>
-        <w:t xml:space="preserve">The baseline, v1, sends a code to any unregistered number behind seven controls: reCAPTCHA v3 on web requests only, one message per number per minute, five requests per address per minute, a country allow-list, a body-length limit, a proxy block, and per-platform caps; bulk and test paths skip some checks. Table 1 lists eight assumptions behind these rules and how an attacker within the threat model breaks each; the gaps follow from the rules, not observed abuse.</w:t>
+        <w:t xml:space="preserve">Our block tests are Wald’s sequential tests (Wald, 1945) run as Page’s cumulative sums (Page, 1954), with a floor parameter that selects between the two (Section 4.3). Quickest change detection minimizes detection delay under false-alarm constraints (Veeravalli and Banerjee, 2012), and a CUSUM’s parameters follow from the error rates it must meet (NIST/SEMATECH, 2026); windowed statistics and the time-uniform confidence sequences of Howard et al. (2021), which stay valid at any stopping time, were not evaluated, so</w:t>
+      </w:r>
+      <w:r>
+        <w:t xml:space="preserve"> </w:t>
+      </w:r>
+      <w:r>
+        <w:t xml:space="preserve">‘</w:t>
+      </w:r>
+      <w:r>
+        <w:t xml:space="preserve">testing</w:t>
+      </w:r>
+      <w:r>
+        <w:t xml:space="preserve">’</w:t>
+      </w:r>
+      <w:r>
+        <w:t xml:space="preserve"> </w:t>
+      </w:r>
+      <w:r>
+        <w:t xml:space="preserve">below means our conversion and speed tests only, and their error rates are reported empirically rather than derived.</w:t>
+      </w:r>
+    </w:p>
+    <w:bookmarkEnd w:id="27"/>
+    <w:bookmarkStart w:id="28" w:name="attacks-on-the-code-once-sent"/>
+    <w:p>
+      <w:pPr>
+        <w:pStyle w:val="Heading2"/>
+      </w:pPr>
+      <w:r>
+        <w:rPr>
+          <w:rStyle w:val="SectionNumber"/>
+        </w:rPr>
+        <w:t xml:space="preserve">2.5</w:t>
+      </w:r>
+      <w:r>
+        <w:tab/>
+      </w:r>
+      <w:r>
+        <w:t xml:space="preserve">Attacks on the code once sent</w:t>
+      </w:r>
+    </w:p>
+    <w:p>
+      <w:pPr>
+        <w:pStyle w:val="FirstParagraph"/>
+      </w:pPr>
+      <w:r>
+        <w:t xml:space="preserve">Malware on the handset or a social-engineering call can take a code after it is delivered (Mulliner et al., 2013; Siadati et al., 2017). Those attacks begin where this paper stops: it asks whether a message should be sent at all, and leaves the protection of a delivered code aside.</w:t>
+      </w:r>
+    </w:p>
+    <w:bookmarkEnd w:id="28"/>
+    <w:bookmarkStart w:id="29" w:name="summary-of-the-gap"/>
+    <w:p>
+      <w:pPr>
+        <w:pStyle w:val="Heading2"/>
+      </w:pPr>
+      <w:r>
+        <w:rPr>
+          <w:rStyle w:val="SectionNumber"/>
+        </w:rPr>
+        <w:t xml:space="preserve">2.6</w:t>
+      </w:r>
+      <w:r>
+        <w:tab/>
+      </w:r>
+      <w:r>
+        <w:t xml:space="preserve">Summary of the gap</w:t>
+      </w:r>
+    </w:p>
+    <w:p>
+      <w:pPr>
+        <w:pStyle w:val="FirstParagraph"/>
+      </w:pPr>
+      <w:r>
+        <w:t xml:space="preserve">Table 1 compares the works closest to this study on the evidence they use, the signal they act on, where they act, and whether they measure the cost to legitimate users. Across them, the destination is agreed to be where a pumper is exposed, and three ways to act on it are in use: a supervised model with labels, a count per prefix, and a vendor’s undisclosed score. What none supplies is a controlled comparison, under a protocol fixed before the runs, of the two signals a service can compute without labels, with the cost to the users who share a block made part of the result. This study supplies that comparison, in simulation, together with the source-side layers it sits in.</w:t>
       </w:r>
     </w:p>
     <w:p>
@@ -466,6 +639,908 @@
           <w:b/>
         </w:rPr>
         <w:t xml:space="preserve">Table 1</w:t>
+      </w:r>
+      <w:r>
+        <w:t xml:space="preserve"> </w:t>
+      </w:r>
+      <w:r>
+        <w:br/>
+        <w:t xml:space="preserve">Comparison of Related Work with This Study.</w:t>
+      </w:r>
+    </w:p>
+    <w:tbl>
+      <w:tblPr>
+        <w:tblStyle w:val="Table"/>
+        <w:tblW w:w="9072" w:type="dxa"/>
+        <w:jc w:val="center"/>
+        <w:tblLayout w:type="fixed"/>
+        <w:tblCellMar>
+          <w:left w:w="57" w:type="dxa"/>
+          <w:right w:w="57" w:type="dxa"/>
+        </w:tblCellMar>
+        <w:tblLook w:firstRow="1" w:lastRow="0" w:firstColumn="0" w:lastColumn="0" w:noHBand="0" w:noVBand="0" w:val="0020"/>
+        <w:tblCaption w:val="Table 1 TBLBRK Comparison of Related Work with This Study."/>
+      </w:tblPr>
+      <w:tblGrid>
+        <w:gridCol w:w="1512"/>
+        <w:gridCol w:w="1512"/>
+        <w:gridCol w:w="1512"/>
+        <w:gridCol w:w="1512"/>
+        <w:gridCol w:w="1512"/>
+        <w:gridCol w:w="1512"/>
+      </w:tblGrid>
+      <w:tr>
+        <w:trPr>
+          <w:tblHeader w:val="true"/>
+        </w:trPr>
+        <w:tc>
+          <w:tcPr>
+            <w:tcW w:w="1512" w:type="dxa"/>
+            <w:tcBorders>
+              <w:top w:val="single" w:sz="8" w:color="000000"/>
+              <w:bottom w:val="single" w:sz="4" w:color="000000"/>
+            </w:tcBorders>
+          </w:tcPr>
+          <w:p>
+            <w:pPr>
+              <w:pStyle w:val="Compact"/>
+              <w:spacing w:line="240" w:lineRule="auto" w:after="0"/>
+              <w:jc w:val="left"/>
+            </w:pPr>
+            <w:r>
+              <w:rPr>
+                <w:sz w:val="17"/>
+              </w:rPr>
+              <w:t xml:space="preserve">Work</w:t>
+            </w:r>
+          </w:p>
+        </w:tc>
+        <w:tc>
+          <w:tcPr>
+            <w:tcW w:w="1512" w:type="dxa"/>
+            <w:tcBorders>
+              <w:top w:val="single" w:sz="8" w:color="000000"/>
+              <w:bottom w:val="single" w:sz="4" w:color="000000"/>
+            </w:tcBorders>
+          </w:tcPr>
+          <w:p>
+            <w:pPr>
+              <w:pStyle w:val="Compact"/>
+              <w:spacing w:line="240" w:lineRule="auto" w:after="0"/>
+              <w:jc w:val="left"/>
+            </w:pPr>
+            <w:r>
+              <w:rPr>
+                <w:sz w:val="17"/>
+              </w:rPr>
+              <w:t xml:space="preserve">Evidence</w:t>
+            </w:r>
+          </w:p>
+        </w:tc>
+        <w:tc>
+          <w:tcPr>
+            <w:tcW w:w="1512" w:type="dxa"/>
+            <w:tcBorders>
+              <w:top w:val="single" w:sz="8" w:color="000000"/>
+              <w:bottom w:val="single" w:sz="4" w:color="000000"/>
+            </w:tcBorders>
+          </w:tcPr>
+          <w:p>
+            <w:pPr>
+              <w:pStyle w:val="Compact"/>
+              <w:spacing w:line="240" w:lineRule="auto" w:after="0"/>
+              <w:jc w:val="left"/>
+            </w:pPr>
+            <w:r>
+              <w:rPr>
+                <w:sz w:val="17"/>
+              </w:rPr>
+              <w:t xml:space="preserve">Signal acted on</w:t>
+            </w:r>
+          </w:p>
+        </w:tc>
+        <w:tc>
+          <w:tcPr>
+            <w:tcW w:w="1512" w:type="dxa"/>
+            <w:tcBorders>
+              <w:top w:val="single" w:sz="8" w:color="000000"/>
+              <w:bottom w:val="single" w:sz="4" w:color="000000"/>
+            </w:tcBorders>
+          </w:tcPr>
+          <w:p>
+            <w:pPr>
+              <w:pStyle w:val="Compact"/>
+              <w:spacing w:line="240" w:lineRule="auto" w:after="0"/>
+              <w:jc w:val="left"/>
+            </w:pPr>
+            <w:r>
+              <w:rPr>
+                <w:sz w:val="17"/>
+              </w:rPr>
+              <w:t xml:space="preserve">Where it acts</w:t>
+            </w:r>
+          </w:p>
+        </w:tc>
+        <w:tc>
+          <w:tcPr>
+            <w:tcW w:w="1512" w:type="dxa"/>
+            <w:tcBorders>
+              <w:top w:val="single" w:sz="8" w:color="000000"/>
+              <w:bottom w:val="single" w:sz="4" w:color="000000"/>
+            </w:tcBorders>
+          </w:tcPr>
+          <w:p>
+            <w:pPr>
+              <w:pStyle w:val="Compact"/>
+              <w:spacing w:line="240" w:lineRule="auto" w:after="0"/>
+              <w:jc w:val="left"/>
+            </w:pPr>
+            <w:r>
+              <w:rPr>
+                <w:sz w:val="17"/>
+              </w:rPr>
+              <w:t xml:space="preserve">Cost to legitimate users</w:t>
+            </w:r>
+          </w:p>
+        </w:tc>
+        <w:tc>
+          <w:tcPr>
+            <w:tcW w:w="1512" w:type="dxa"/>
+            <w:tcBorders>
+              <w:top w:val="single" w:sz="8" w:color="000000"/>
+              <w:bottom w:val="single" w:sz="4" w:color="000000"/>
+            </w:tcBorders>
+          </w:tcPr>
+          <w:p>
+            <w:pPr>
+              <w:pStyle w:val="Compact"/>
+              <w:spacing w:line="240" w:lineRule="auto" w:after="0"/>
+              <w:jc w:val="left"/>
+            </w:pPr>
+            <w:r>
+              <w:rPr>
+                <w:sz w:val="17"/>
+              </w:rPr>
+              <w:t xml:space="preserve">Left open for an OTP service</w:t>
+            </w:r>
+          </w:p>
+        </w:tc>
+      </w:tr>
+      <w:tr>
+        <w:tc>
+          <w:tcPr>
+            <w:tcW w:w="1512" w:type="dxa"/>
+          </w:tcPr>
+          <w:p>
+            <w:pPr>
+              <w:pStyle w:val="Compact"/>
+              <w:spacing w:line="240" w:lineRule="auto" w:after="0"/>
+              <w:jc w:val="left"/>
+            </w:pPr>
+            <w:r>
+              <w:rPr>
+                <w:sz w:val="17"/>
+              </w:rPr>
+              <w:t xml:space="preserve">Sahin and Francillon (2021)</w:t>
+            </w:r>
+          </w:p>
+        </w:tc>
+        <w:tc>
+          <w:tcPr>
+            <w:tcW w:w="1512" w:type="dxa"/>
+          </w:tcPr>
+          <w:p>
+            <w:pPr>
+              <w:pStyle w:val="Compact"/>
+              <w:spacing w:line="240" w:lineRule="auto" w:after="0"/>
+              <w:jc w:val="left"/>
+            </w:pPr>
+            <w:r>
+              <w:rPr>
+                <w:sz w:val="17"/>
+              </w:rPr>
+              <w:t xml:space="preserve">Operator call records; 3.1 million test numbers advertised by 12 providers, 2016–2019</w:t>
+            </w:r>
+          </w:p>
+        </w:tc>
+        <w:tc>
+          <w:tcPr>
+            <w:tcW w:w="1512" w:type="dxa"/>
+          </w:tcPr>
+          <w:p>
+            <w:pPr>
+              <w:pStyle w:val="Compact"/>
+              <w:spacing w:line="240" w:lineRule="auto" w:after="0"/>
+              <w:jc w:val="left"/>
+            </w:pPr>
+            <w:r>
+              <w:rPr>
+                <w:sz w:val="17"/>
+              </w:rPr>
+              <w:t xml:space="preserve">Distance of the called number to advertised ranges and call history; labels from matched test numbers</w:t>
+            </w:r>
+          </w:p>
+        </w:tc>
+        <w:tc>
+          <w:tcPr>
+            <w:tcW w:w="1512" w:type="dxa"/>
+          </w:tcPr>
+          <w:p>
+            <w:pPr>
+              <w:pStyle w:val="Compact"/>
+              <w:spacing w:line="240" w:lineRule="auto" w:after="0"/>
+              <w:jc w:val="left"/>
+            </w:pPr>
+            <w:r>
+              <w:rPr>
+                <w:sz w:val="17"/>
+              </w:rPr>
+              <w:t xml:space="preserve">Per call, at an operator</w:t>
+            </w:r>
+          </w:p>
+        </w:tc>
+        <w:tc>
+          <w:tcPr>
+            <w:tcW w:w="1512" w:type="dxa"/>
+          </w:tcPr>
+          <w:p>
+            <w:pPr>
+              <w:pStyle w:val="Compact"/>
+              <w:spacing w:line="240" w:lineRule="auto" w:after="0"/>
+              <w:jc w:val="left"/>
+            </w:pPr>
+            <w:r>
+              <w:rPr>
+                <w:sz w:val="17"/>
+              </w:rPr>
+              <w:t xml:space="preserve">A false-positive rate (0.28%), not harm to callers</w:t>
+            </w:r>
+          </w:p>
+        </w:tc>
+        <w:tc>
+          <w:tcPr>
+            <w:tcW w:w="1512" w:type="dxa"/>
+          </w:tcPr>
+          <w:p>
+            <w:pPr>
+              <w:pStyle w:val="Compact"/>
+              <w:spacing w:line="240" w:lineRule="auto" w:after="0"/>
+              <w:jc w:val="left"/>
+            </w:pPr>
+            <w:r>
+              <w:rPr>
+                <w:sz w:val="17"/>
+              </w:rPr>
+              <w:t xml:space="preserve">Voice calls; needs number intelligence and call histories an OTP endpoint does not hold</w:t>
+            </w:r>
+          </w:p>
+        </w:tc>
+      </w:tr>
+      <w:tr>
+        <w:tc>
+          <w:tcPr>
+            <w:tcW w:w="1512" w:type="dxa"/>
+          </w:tcPr>
+          <w:p>
+            <w:pPr>
+              <w:pStyle w:val="Compact"/>
+              <w:spacing w:line="240" w:lineRule="auto" w:after="0"/>
+              <w:jc w:val="left"/>
+            </w:pPr>
+            <w:r>
+              <w:rPr>
+                <w:sz w:val="17"/>
+              </w:rPr>
+              <w:t xml:space="preserve">Huh et al. (2025)</w:t>
+            </w:r>
+          </w:p>
+        </w:tc>
+        <w:tc>
+          <w:tcPr>
+            <w:tcW w:w="1512" w:type="dxa"/>
+          </w:tcPr>
+          <w:p>
+            <w:pPr>
+              <w:pStyle w:val="Compact"/>
+              <w:spacing w:line="240" w:lineRule="auto" w:after="0"/>
+              <w:jc w:val="left"/>
+            </w:pPr>
+            <w:r>
+              <w:rPr>
+                <w:sz w:val="17"/>
+              </w:rPr>
+              <w:t xml:space="preserve">One service’s 9.4 million SMS authentication logs, 19 countries, three months</w:t>
+            </w:r>
+          </w:p>
+        </w:tc>
+        <w:tc>
+          <w:tcPr>
+            <w:tcW w:w="1512" w:type="dxa"/>
+          </w:tcPr>
+          <w:p>
+            <w:pPr>
+              <w:pStyle w:val="Compact"/>
+              <w:spacing w:line="240" w:lineRule="auto" w:after="0"/>
+              <w:jc w:val="left"/>
+            </w:pPr>
+            <w:r>
+              <w:rPr>
+                <w:sz w:val="17"/>
+              </w:rPr>
+              <w:t xml:space="preserve">Per-request features with prefix-level counts and conversion; labels derived from traffic peaks</w:t>
+            </w:r>
+          </w:p>
+        </w:tc>
+        <w:tc>
+          <w:tcPr>
+            <w:tcW w:w="1512" w:type="dxa"/>
+          </w:tcPr>
+          <w:p>
+            <w:pPr>
+              <w:pStyle w:val="Compact"/>
+              <w:spacing w:line="240" w:lineRule="auto" w:after="0"/>
+              <w:jc w:val="left"/>
+            </w:pPr>
+            <w:r>
+              <w:rPr>
+                <w:sz w:val="17"/>
+              </w:rPr>
+              <w:t xml:space="preserve">Per request at the service, before the message is sent</w:t>
+            </w:r>
+          </w:p>
+        </w:tc>
+        <w:tc>
+          <w:tcPr>
+            <w:tcW w:w="1512" w:type="dxa"/>
+          </w:tcPr>
+          <w:p>
+            <w:pPr>
+              <w:pStyle w:val="Compact"/>
+              <w:spacing w:line="240" w:lineRule="auto" w:after="0"/>
+              <w:jc w:val="left"/>
+            </w:pPr>
+            <w:r>
+              <w:rPr>
+                <w:sz w:val="17"/>
+              </w:rPr>
+              <w:t xml:space="preserve">False positives only (0.19% web, 0.11% app)</w:t>
+            </w:r>
+          </w:p>
+        </w:tc>
+        <w:tc>
+          <w:tcPr>
+            <w:tcW w:w="1512" w:type="dxa"/>
+          </w:tcPr>
+          <w:p>
+            <w:pPr>
+              <w:pStyle w:val="Compact"/>
+              <w:spacing w:line="240" w:lineRule="auto" w:after="0"/>
+              <w:jc w:val="left"/>
+            </w:pPr>
+            <w:r>
+              <w:rPr>
+                <w:sz w:val="17"/>
+              </w:rPr>
+              <w:t xml:space="preserve">Needs labels; the deployed model was not released; a per-request decision can be probed</w:t>
+            </w:r>
+          </w:p>
+        </w:tc>
+      </w:tr>
+      <w:tr>
+        <w:tc>
+          <w:tcPr>
+            <w:tcW w:w="1512" w:type="dxa"/>
+          </w:tcPr>
+          <w:p>
+            <w:pPr>
+              <w:pStyle w:val="Compact"/>
+              <w:spacing w:line="240" w:lineRule="auto" w:after="0"/>
+              <w:jc w:val="left"/>
+            </w:pPr>
+            <w:r>
+              <w:rPr>
+                <w:sz w:val="17"/>
+              </w:rPr>
+              <w:t xml:space="preserve">Zaliskyi and Odarchenko (2026)</w:t>
+            </w:r>
+          </w:p>
+        </w:tc>
+        <w:tc>
+          <w:tcPr>
+            <w:tcW w:w="1512" w:type="dxa"/>
+          </w:tcPr>
+          <w:p>
+            <w:pPr>
+              <w:pStyle w:val="Compact"/>
+              <w:spacing w:line="240" w:lineRule="auto" w:after="0"/>
+              <w:jc w:val="left"/>
+            </w:pPr>
+            <w:r>
+              <w:rPr>
+                <w:sz w:val="17"/>
+              </w:rPr>
+              <w:t xml:space="preserve">Aggregator delivery metadata: two confirmed incidents and one legitimate campaign</w:t>
+            </w:r>
+          </w:p>
+        </w:tc>
+        <w:tc>
+          <w:tcPr>
+            <w:tcW w:w="1512" w:type="dxa"/>
+          </w:tcPr>
+          <w:p>
+            <w:pPr>
+              <w:pStyle w:val="Compact"/>
+              <w:spacing w:line="240" w:lineRule="auto" w:after="0"/>
+              <w:jc w:val="left"/>
+            </w:pPr>
+            <w:r>
+              <w:rPr>
+                <w:sz w:val="17"/>
+              </w:rPr>
+              <w:t xml:space="preserve">Sends, or unique recipients, per prefix in five-minute windows; no labels</w:t>
+            </w:r>
+          </w:p>
+        </w:tc>
+        <w:tc>
+          <w:tcPr>
+            <w:tcW w:w="1512" w:type="dxa"/>
+          </w:tcPr>
+          <w:p>
+            <w:pPr>
+              <w:pStyle w:val="Compact"/>
+              <w:spacing w:line="240" w:lineRule="auto" w:after="0"/>
+              <w:jc w:val="left"/>
+            </w:pPr>
+            <w:r>
+              <w:rPr>
+                <w:sz w:val="17"/>
+              </w:rPr>
+              <w:t xml:space="preserve">Per prefix, with a 24-hour quarantine</w:t>
+            </w:r>
+          </w:p>
+        </w:tc>
+        <w:tc>
+          <w:tcPr>
+            <w:tcW w:w="1512" w:type="dxa"/>
+          </w:tcPr>
+          <w:p>
+            <w:pPr>
+              <w:pStyle w:val="Compact"/>
+              <w:spacing w:line="240" w:lineRule="auto" w:after="0"/>
+              <w:jc w:val="left"/>
+            </w:pPr>
+            <w:r>
+              <w:rPr>
+                <w:sz w:val="17"/>
+              </w:rPr>
+              <w:t xml:space="preserve">Share of a campaign blocked (58%; 2% with unique recipients)</w:t>
+            </w:r>
+          </w:p>
+        </w:tc>
+        <w:tc>
+          <w:tcPr>
+            <w:tcW w:w="1512" w:type="dxa"/>
+          </w:tcPr>
+          <w:p>
+            <w:pPr>
+              <w:pStyle w:val="Compact"/>
+              <w:spacing w:line="240" w:lineRule="auto" w:after="0"/>
+              <w:jc w:val="left"/>
+            </w:pPr>
+            <w:r>
+              <w:rPr>
+                <w:sz w:val="17"/>
+              </w:rPr>
+              <w:t xml:space="preserve">Outcomes unused; thresholds that stop incidents block campaigns; no per-user cost</w:t>
+            </w:r>
+          </w:p>
+        </w:tc>
+      </w:tr>
+      <w:tr>
+        <w:tc>
+          <w:tcPr>
+            <w:tcW w:w="1512" w:type="dxa"/>
+          </w:tcPr>
+          <w:p>
+            <w:pPr>
+              <w:pStyle w:val="Compact"/>
+              <w:spacing w:line="240" w:lineRule="auto" w:after="0"/>
+              <w:jc w:val="left"/>
+            </w:pPr>
+            <w:r>
+              <w:rPr>
+                <w:sz w:val="17"/>
+              </w:rPr>
+              <w:t xml:space="preserve">Twilio Inc. (2026a); Twilio Inc. (2026c)</w:t>
+            </w:r>
+          </w:p>
+        </w:tc>
+        <w:tc>
+          <w:tcPr>
+            <w:tcW w:w="1512" w:type="dxa"/>
+          </w:tcPr>
+          <w:p>
+            <w:pPr>
+              <w:pStyle w:val="Compact"/>
+              <w:spacing w:line="240" w:lineRule="auto" w:after="0"/>
+              <w:jc w:val="left"/>
+            </w:pPr>
+            <w:r>
+              <w:rPr>
+                <w:sz w:val="17"/>
+              </w:rPr>
+              <w:t xml:space="preserve">Vendor-wide traffic across accounts; documentation only</w:t>
+            </w:r>
+          </w:p>
+        </w:tc>
+        <w:tc>
+          <w:tcPr>
+            <w:tcW w:w="1512" w:type="dxa"/>
+          </w:tcPr>
+          <w:p>
+            <w:pPr>
+              <w:pStyle w:val="Compact"/>
+              <w:spacing w:line="240" w:lineRule="auto" w:after="0"/>
+              <w:jc w:val="left"/>
+            </w:pPr>
+            <w:r>
+              <w:rPr>
+                <w:sz w:val="17"/>
+              </w:rPr>
+              <w:t xml:space="preserve">Departure from an account’s history per prefix and country; a per-number score from carriers, patterns and conversion</w:t>
+            </w:r>
+          </w:p>
+        </w:tc>
+        <w:tc>
+          <w:tcPr>
+            <w:tcW w:w="1512" w:type="dxa"/>
+          </w:tcPr>
+          <w:p>
+            <w:pPr>
+              <w:pStyle w:val="Compact"/>
+              <w:spacing w:line="240" w:lineRule="auto" w:after="0"/>
+              <w:jc w:val="left"/>
+            </w:pPr>
+            <w:r>
+              <w:rPr>
+                <w:sz w:val="17"/>
+              </w:rPr>
+              <w:t xml:space="preserve">Before the send, at the vendor; bands at 60, 75 and 90</w:t>
+            </w:r>
+          </w:p>
+        </w:tc>
+        <w:tc>
+          <w:tcPr>
+            <w:tcW w:w="1512" w:type="dxa"/>
+          </w:tcPr>
+          <w:p>
+            <w:pPr>
+              <w:pStyle w:val="Compact"/>
+              <w:spacing w:line="240" w:lineRule="auto" w:after="0"/>
+              <w:jc w:val="left"/>
+            </w:pPr>
+            <w:r>
+              <w:rPr>
+                <w:sz w:val="17"/>
+              </w:rPr>
+              <w:t xml:space="preserve">Claimed false-positive rates under 1% and 2%</w:t>
+            </w:r>
+          </w:p>
+        </w:tc>
+        <w:tc>
+          <w:tcPr>
+            <w:tcW w:w="1512" w:type="dxa"/>
+          </w:tcPr>
+          <w:p>
+            <w:pPr>
+              <w:pStyle w:val="Compact"/>
+              <w:spacing w:line="240" w:lineRule="auto" w:after="0"/>
+              <w:jc w:val="left"/>
+            </w:pPr>
+            <w:r>
+              <w:rPr>
+                <w:sz w:val="17"/>
+              </w:rPr>
+              <w:t xml:space="preserve">Signals and models undisclosed; cannot be benchmarked or reproduced</w:t>
+            </w:r>
+          </w:p>
+        </w:tc>
+      </w:tr>
+      <w:tr>
+        <w:tc>
+          <w:tcPr>
+            <w:tcW w:w="1512" w:type="dxa"/>
+          </w:tcPr>
+          <w:p>
+            <w:pPr>
+              <w:pStyle w:val="Compact"/>
+              <w:spacing w:line="240" w:lineRule="auto" w:after="0"/>
+              <w:jc w:val="left"/>
+            </w:pPr>
+            <w:r>
+              <w:rPr>
+                <w:sz w:val="17"/>
+              </w:rPr>
+              <w:t xml:space="preserve">Wiefling et al. (2019)</w:t>
+            </w:r>
+          </w:p>
+        </w:tc>
+        <w:tc>
+          <w:tcPr>
+            <w:tcW w:w="1512" w:type="dxa"/>
+          </w:tcPr>
+          <w:p>
+            <w:pPr>
+              <w:pStyle w:val="Compact"/>
+              <w:spacing w:line="240" w:lineRule="auto" w:after="0"/>
+              <w:jc w:val="left"/>
+            </w:pPr>
+            <w:r>
+              <w:rPr>
+                <w:sz w:val="17"/>
+              </w:rPr>
+              <w:t xml:space="preserve">Black-box tests of eight services with 224 accounts</w:t>
+            </w:r>
+          </w:p>
+        </w:tc>
+        <w:tc>
+          <w:tcPr>
+            <w:tcW w:w="1512" w:type="dxa"/>
+          </w:tcPr>
+          <w:p>
+            <w:pPr>
+              <w:pStyle w:val="Compact"/>
+              <w:spacing w:line="240" w:lineRule="auto" w:after="0"/>
+              <w:jc w:val="left"/>
+            </w:pPr>
+            <w:r>
+              <w:rPr>
+                <w:sz w:val="17"/>
+              </w:rPr>
+              <w:t xml:space="preserve">Address, user agent, resolution, time and similar login features scored into risk buckets</w:t>
+            </w:r>
+          </w:p>
+        </w:tc>
+        <w:tc>
+          <w:tcPr>
+            <w:tcW w:w="1512" w:type="dxa"/>
+          </w:tcPr>
+          <w:p>
+            <w:pPr>
+              <w:pStyle w:val="Compact"/>
+              <w:spacing w:line="240" w:lineRule="auto" w:after="0"/>
+              <w:jc w:val="left"/>
+            </w:pPr>
+            <w:r>
+              <w:rPr>
+                <w:sz w:val="17"/>
+              </w:rPr>
+              <w:t xml:space="preserve">Per login to an existing account</w:t>
+            </w:r>
+          </w:p>
+        </w:tc>
+        <w:tc>
+          <w:tcPr>
+            <w:tcW w:w="1512" w:type="dxa"/>
+          </w:tcPr>
+          <w:p>
+            <w:pPr>
+              <w:pStyle w:val="Compact"/>
+              <w:spacing w:line="240" w:lineRule="auto" w:after="0"/>
+              <w:jc w:val="left"/>
+            </w:pPr>
+            <w:r>
+              <w:rPr>
+                <w:sz w:val="17"/>
+              </w:rPr>
+              <w:t xml:space="preserve">Not measured; re-authentication observed</w:t>
+            </w:r>
+          </w:p>
+        </w:tc>
+        <w:tc>
+          <w:tcPr>
+            <w:tcW w:w="1512" w:type="dxa"/>
+          </w:tcPr>
+          <w:p>
+            <w:pPr>
+              <w:pStyle w:val="Compact"/>
+              <w:spacing w:line="240" w:lineRule="auto" w:after="0"/>
+              <w:jc w:val="left"/>
+            </w:pPr>
+            <w:r>
+              <w:rPr>
+                <w:sz w:val="17"/>
+              </w:rPr>
+              <w:t xml:space="preserve">Scores a login, not a request made before any account exists; procedures undisclosed</w:t>
+            </w:r>
+          </w:p>
+        </w:tc>
+      </w:tr>
+      <w:tr>
+        <w:tc>
+          <w:tcPr>
+            <w:tcW w:w="1512" w:type="dxa"/>
+            <w:tcBorders>
+              <w:bottom w:val="single" w:sz="8" w:color="000000"/>
+            </w:tcBorders>
+          </w:tcPr>
+          <w:p>
+            <w:pPr>
+              <w:pStyle w:val="Compact"/>
+              <w:spacing w:line="240" w:lineRule="auto" w:after="0"/>
+              <w:jc w:val="left"/>
+            </w:pPr>
+            <w:r>
+              <w:rPr>
+                <w:sz w:val="17"/>
+              </w:rPr>
+              <w:t xml:space="preserve">This study</w:t>
+            </w:r>
+          </w:p>
+        </w:tc>
+        <w:tc>
+          <w:tcPr>
+            <w:tcW w:w="1512" w:type="dxa"/>
+            <w:tcBorders>
+              <w:bottom w:val="single" w:sz="8" w:color="000000"/>
+            </w:tcBorders>
+          </w:tcPr>
+          <w:p>
+            <w:pPr>
+              <w:pStyle w:val="Compact"/>
+              <w:spacing w:line="240" w:lineRule="auto" w:after="0"/>
+              <w:jc w:val="left"/>
+            </w:pPr>
+            <w:r>
+              <w:rPr>
+                <w:sz w:val="17"/>
+              </w:rPr>
+              <w:t xml:space="preserve">Simulation: 25 attacker profiles, seven designs, two predeclared protocols; code and every run public</w:t>
+            </w:r>
+          </w:p>
+        </w:tc>
+        <w:tc>
+          <w:tcPr>
+            <w:tcW w:w="1512" w:type="dxa"/>
+            <w:tcBorders>
+              <w:bottom w:val="single" w:sz="8" w:color="000000"/>
+            </w:tcBorders>
+          </w:tcPr>
+          <w:p>
+            <w:pPr>
+              <w:pStyle w:val="Compact"/>
+              <w:spacing w:line="240" w:lineRule="auto" w:after="0"/>
+              <w:jc w:val="left"/>
+            </w:pPr>
+            <w:r>
+              <w:rPr>
+                <w:sz w:val="17"/>
+              </w:rPr>
+              <w:t xml:space="preserve">Sends per number block; sequential tests of code outcomes per block; no labels</w:t>
+            </w:r>
+          </w:p>
+        </w:tc>
+        <w:tc>
+          <w:tcPr>
+            <w:tcW w:w="1512" w:type="dxa"/>
+            <w:tcBorders>
+              <w:bottom w:val="single" w:sz="8" w:color="000000"/>
+            </w:tcBorders>
+          </w:tcPr>
+          <w:p>
+            <w:pPr>
+              <w:pStyle w:val="Compact"/>
+              <w:spacing w:line="240" w:lineRule="auto" w:after="0"/>
+              <w:jc w:val="left"/>
+            </w:pPr>
+            <w:r>
+              <w:rPr>
+                <w:sz w:val="17"/>
+              </w:rPr>
+              <w:t xml:space="preserve">Per 10 000-number block at the service, before the message is sent</w:t>
+            </w:r>
+          </w:p>
+        </w:tc>
+        <w:tc>
+          <w:tcPr>
+            <w:tcW w:w="1512" w:type="dxa"/>
+            <w:tcBorders>
+              <w:bottom w:val="single" w:sz="8" w:color="000000"/>
+            </w:tcBorders>
+          </w:tcPr>
+          <w:p>
+            <w:pPr>
+              <w:pStyle w:val="Compact"/>
+              <w:spacing w:line="240" w:lineRule="auto" w:after="0"/>
+              <w:jc w:val="left"/>
+            </w:pPr>
+            <w:r>
+              <w:rPr>
+                <w:sz w:val="17"/>
+              </w:rPr>
+              <w:t xml:space="preserve">Attack-free benign cost and extra harm under attack, per cohort, in completed registrations</w:t>
+            </w:r>
+          </w:p>
+        </w:tc>
+        <w:tc>
+          <w:tcPr>
+            <w:tcW w:w="1512" w:type="dxa"/>
+            <w:tcBorders>
+              <w:bottom w:val="single" w:sz="8" w:color="000000"/>
+            </w:tcBorders>
+          </w:tcPr>
+          <w:p>
+            <w:pPr>
+              <w:pStyle w:val="Compact"/>
+              <w:spacing w:line="240" w:lineRule="auto" w:after="0"/>
+              <w:jc w:val="left"/>
+            </w:pPr>
+            <w:r>
+              <w:rPr>
+                <w:sz w:val="17"/>
+              </w:rPr>
+              <w:t xml:space="preserve">Simulated users and assumed calibration; no real traffic replayed</w:t>
+            </w:r>
+          </w:p>
+        </w:tc>
+      </w:tr>
+    </w:tbl>
+    <w:bookmarkEnd w:id="29"/>
+    <w:bookmarkEnd w:id="30"/>
+    <w:bookmarkStart w:id="33" w:name="baseline-and-threat-model"/>
+    <w:p>
+      <w:pPr>
+        <w:pStyle w:val="Heading1"/>
+      </w:pPr>
+      <w:r>
+        <w:rPr>
+          <w:rStyle w:val="SectionNumber"/>
+        </w:rPr>
+        <w:t xml:space="preserve">3</w:t>
+      </w:r>
+      <w:r>
+        <w:tab/>
+      </w:r>
+      <w:r>
+        <w:t xml:space="preserve">Baseline and threat model</w:t>
+      </w:r>
+    </w:p>
+    <w:bookmarkStart w:id="31" w:name="the-v1-baseline"/>
+    <w:p>
+      <w:pPr>
+        <w:pStyle w:val="Heading2"/>
+      </w:pPr>
+      <w:r>
+        <w:rPr>
+          <w:rStyle w:val="SectionNumber"/>
+        </w:rPr>
+        <w:t xml:space="preserve">3.1</w:t>
+      </w:r>
+      <w:r>
+        <w:tab/>
+      </w:r>
+      <w:r>
+        <w:t xml:space="preserve">The v1 baseline</w:t>
+      </w:r>
+    </w:p>
+    <w:p>
+      <w:pPr>
+        <w:pStyle w:val="FirstParagraph"/>
+      </w:pPr>
+      <w:r>
+        <w:t xml:space="preserve">The baseline, v1, sends a code to any unregistered number behind seven controls: reCAPTCHA v3 on web requests only, one message per number per minute, five requests per address per minute, a country allow-list, a body-length limit, a proxy block, and per-platform caps; bulk and test paths skip some checks. Table 2 lists eight assumptions behind these rules and how an attacker within the threat model breaks each; the gaps follow from the rules, not observed abuse.</w:t>
+      </w:r>
+    </w:p>
+    <w:p>
+      <w:pPr>
+        <w:pStyle w:val="TableCaption"/>
+      </w:pPr>
+      <w:r>
+        <w:rPr>
+          <w:bCs/>
+          <w:b/>
+        </w:rPr>
+        <w:t xml:space="preserve">Table 2</w:t>
       </w:r>
       <w:r>
         <w:t xml:space="preserve"> </w:t>
@@ -486,7 +1561,7 @@
           <w:right w:w="57" w:type="dxa"/>
         </w:tblCellMar>
         <w:tblLook w:firstRow="1" w:lastRow="0" w:firstColumn="0" w:lastColumn="0" w:noHBand="0" w:noVBand="0" w:val="0020"/>
-        <w:tblCaption w:val="Table 1 TBLBRK v1 Assumptions and how they fail."/>
+        <w:tblCaption w:val="Table 2 TBLBRK v1 Assumptions and how they fail."/>
       </w:tblPr>
       <w:tblGrid>
         <w:gridCol w:w="509"/>
@@ -1022,8 +2097,8 @@
         </w:tc>
       </w:tr>
     </w:tbl>
-    <w:bookmarkEnd w:id="26"/>
-    <w:bookmarkStart w:id="27" w:name="threat-model"/>
+    <w:bookmarkEnd w:id="31"/>
+    <w:bookmarkStart w:id="32" w:name="threat-model"/>
     <w:p>
       <w:pPr>
         <w:pStyle w:val="Heading2"/>
@@ -1049,9 +2124,9 @@
         <w:t xml:space="preserve">The attacker wants as many messages sent as possible, or sent to numbers that pay it. It buys residential proxies and human-like reCAPTCHA tokens (about 0.3 cents each), mints fingerprints, generates numbers, and knows the thresholds. A pumper also has a colluding operator’s ranges, where it may enter codes, report deliveries as failed, build verified history, spread over blocks, and buy challenge solutions. It cannot forge an attestation, use ranges its partner does not terminate, or make a stranger enter a code.</w:t>
       </w:r>
     </w:p>
-    <w:bookmarkEnd w:id="27"/>
-    <w:bookmarkEnd w:id="28"/>
-    <w:bookmarkStart w:id="36" w:name="design"/>
+    <w:bookmarkEnd w:id="32"/>
+    <w:bookmarkEnd w:id="33"/>
+    <w:bookmarkStart w:id="41" w:name="design"/>
     <w:p>
       <w:pPr>
         <w:pStyle w:val="Heading1"/>
@@ -1077,7 +2152,7 @@
         <w:t xml:space="preserve">No message is paid for before every check passes, and cheap checks run first. Trust comes from evidence the client cannot forge, an attestation, a server-signed session, and the fate of earlier codes, though such evidence can be manufactured (Section 6.8).</w:t>
       </w:r>
     </w:p>
-    <w:bookmarkStart w:id="29" w:name="the-pipeline-and-the-risk-score"/>
+    <w:bookmarkStart w:id="34" w:name="the-pipeline-and-the-risk-score"/>
     <w:p>
       <w:pPr>
         <w:pStyle w:val="Heading2"/>
@@ -1100,7 +2175,7 @@
         <w:pStyle w:val="FirstParagraph"/>
       </w:pPr>
       <w:r>
-        <w:t xml:space="preserve">A request passes the steps of Table 2, which lists in brackets the gaps of Table 1 each step addresses (FB: the feedback loop), until it is refused. Step 0 takes the platform only from a valid App Attest or Play Integrity result. Each limit and reservation is one atomic Redis operation, but the enclosing steps are not one transaction: on the normal path, a refused request returns its per-number claims and counter slot, and the hourly budget is reserved only for a message about to be enqueued, a reservation rather than a completed dispatch; a crash between them can leak reservations (Section 5). Address limits and source caps count requests, except that a request Step 11 challenges returns its source-cap count. Every outcome after Step 0, except the challenge, returns one HTTP 200 body after at least 400 ms, a floor that cannot hide longer work.</w:t>
+        <w:t xml:space="preserve">A request passes the steps of Table 3, which lists in brackets the gaps of Table 2 each step addresses (FB: the feedback loop), until it is refused. Step 0 takes the platform only from a valid App Attest or Play Integrity result. Each limit and reservation is one atomic Redis operation, but the enclosing steps are not one transaction: on the normal path, a refused request returns its per-number claims and counter slot, and the hourly budget is reserved only for a message about to be enqueued, a reservation rather than a completed dispatch; a crash between them can leak reservations (Section 5). Address limits and source caps count requests, except that a request Step 11 challenges returns its source-cap count. Every outcome after Step 0, except the challenge, returns one HTTP 200 body after at least 400 ms, a floor that cannot hide longer work.</w:t>
       </w:r>
     </w:p>
     <w:p>
@@ -1112,7 +2187,7 @@
           <w:bCs/>
           <w:b/>
         </w:rPr>
-        <w:t xml:space="preserve">Table 2</w:t>
+        <w:t xml:space="preserve">Table 3</w:t>
       </w:r>
       <w:r>
         <w:t xml:space="preserve"> </w:t>
@@ -1133,7 +2208,7 @@
           <w:right w:w="57" w:type="dxa"/>
         </w:tblCellMar>
         <w:tblLook w:firstRow="1" w:lastRow="0" w:firstColumn="0" w:lastColumn="0" w:noHBand="0" w:noVBand="0" w:val="0020"/>
-        <w:tblCaption w:val="Table 2 TBLBRK Twelve Steps and the v1 Gaps They Address."/>
+        <w:tblCaption w:val="Table 3 TBLBRK Twelve Steps and the v1 Gaps They Address."/>
       </w:tblPr>
       <w:tblGrid>
         <w:gridCol w:w="1134"/>
@@ -2189,8 +3264,8 @@
         <w:t xml:space="preserve">.</w:t>
       </w:r>
     </w:p>
-    <w:bookmarkEnd w:id="29"/>
-    <w:bookmarkStart w:id="30" w:name="the-feedback-loop"/>
+    <w:bookmarkEnd w:id="34"/>
+    <w:bookmarkStart w:id="35" w:name="the-feedback-loop"/>
     <w:p>
       <w:pPr>
         <w:pStyle w:val="Heading2"/>
@@ -2264,8 +3339,8 @@
         <w:t xml:space="preserve">without a receipt in 60 s or with a failed receipt; only the first two count toward reputation. A positive receipt after a negative one reopens the send; a late verification reclassifies it, but an issued verdict stands. Each transition records its effects and its time in the same compare-and-set, and a recovery sweep completes the work of a dead process; each effect type applies at most once, and exactly once if the sweep runs within 20 minutes. Reputation counts land in the transition’s hour, and a block keeps its latest outage failure time; however, a block’s statistic accumulates in processing order, and a verdict is dated at the event that completes the crossing; thus, a late event can backdate a verdict that contains later evidence, moving its expiry and the next test’s start (by 10 min in one diagnostic). Simulated runs apply events in time order, but concurrent live instances may not, because a transition is committed before its effects apply; thus, the same dependence holds live unless a block’s effects are serialized.</w:t>
       </w:r>
     </w:p>
-    <w:bookmarkEnd w:id="30"/>
-    <w:bookmarkStart w:id="33" w:name="destination-policies"/>
+    <w:bookmarkEnd w:id="35"/>
+    <w:bookmarkStart w:id="38" w:name="destination-policies"/>
     <w:p>
       <w:pPr>
         <w:pStyle w:val="Heading2"/>
@@ -2291,7 +3366,7 @@
         <w:t xml:space="preserve">A pumper is confined to its partner’s ranges but can rotate numbers and blocks within them. Destination policies are keyed on the 8-digit block (10 000 numbers); therefore, protection weakens as a pumper spreads.</w:t>
       </w:r>
     </w:p>
-    <w:bookmarkStart w:id="31" w:name="sequential-tests"/>
+    <w:bookmarkStart w:id="36" w:name="sequential-tests"/>
     <w:p>
       <w:pPr>
         <w:pStyle w:val="Heading3"/>
@@ -2810,8 +3885,8 @@
         <w:t xml:space="preserve">. A first verdict makes the block’s first-time clients pass a challenge for an hour; a second within the hour moves them off SMS, refusing those without another channel.</w:t>
       </w:r>
     </w:p>
-    <w:bookmarkEnd w:id="31"/>
-    <w:bookmarkStart w:id="32" w:name="counters"/>
+    <w:bookmarkEnd w:id="36"/>
+    <w:bookmarkStart w:id="37" w:name="counters"/>
     <w:p>
       <w:pPr>
         <w:pStyle w:val="Heading3"/>
@@ -2837,9 +3912,9 @@
         <w:t xml:space="preserve">A counter limits the number of SMS sent per block in a daily or short refilling window. Step 11 reserves a slot and decides the stage in one atomic operation when an SMS is about to be sent, so concurrent requests cannot skip the challenge. Past the limit, a graded counter challenges first-time clients, and past twice the limit moves them off SMS; a refusing counter refuses. Clients with verified history are exempt from both policies; therefore, a code entered on a pumper’s number can buy that number an exemption. A token bucket of the same rate (burst 4 or 12; its challenge-tier bucket refills independently, unlike RFC 2697’s (Heinanen and Guerin, 1999)) and the counter combined with the tests were also explored.</w:t>
       </w:r>
     </w:p>
-    <w:bookmarkEnd w:id="32"/>
-    <w:bookmarkEnd w:id="33"/>
-    <w:bookmarkStart w:id="34" w:name="capacity-controls"/>
+    <w:bookmarkEnd w:id="37"/>
+    <w:bookmarkEnd w:id="38"/>
+    <w:bookmarkStart w:id="39" w:name="capacity-controls"/>
     <w:p>
       <w:pPr>
         <w:pStyle w:val="Heading2"/>
@@ -2865,8 +3940,8 @@
         <w:t xml:space="preserve">Step 9 multiplies its caps by 0.25 to 1.5 according to a baseline job comparing each key with its expected rate, learned from the pipeline’s hourly counters; without history, the static cap stands. Verified history avoids adaptive reduction, not the static caps or the budget, which bounds SMS count and spend, not vendor or fallback costs.</w:t>
       </w:r>
     </w:p>
-    <w:bookmarkEnd w:id="34"/>
-    <w:bookmarkStart w:id="35" w:name="Xf0c979229eb29cff3cf30892b5e34effc1bec32"/>
+    <w:bookmarkEnd w:id="39"/>
+    <w:bookmarkStart w:id="40" w:name="Xf0c979229eb29cff3cf30892b5e34effc1bec32"/>
     <w:p>
       <w:pPr>
         <w:pStyle w:val="Heading2"/>
@@ -4134,9 +5209,9 @@
         <w:t xml:space="preserve">. This is not a challenge rate: exempt clients take slots without challenge, and challenge failures, the second tier and earlier gates are ignored. The estimates use only the rules, configuration, and attack rate; what an excess send costs a user needs the simulation.</w:t>
       </w:r>
     </w:p>
-    <w:bookmarkEnd w:id="35"/>
-    <w:bookmarkEnd w:id="36"/>
-    <w:bookmarkStart w:id="41" w:name="methodology"/>
+    <w:bookmarkEnd w:id="40"/>
+    <w:bookmarkEnd w:id="41"/>
+    <w:bookmarkStart w:id="46" w:name="methodology"/>
     <w:p>
       <w:pPr>
         <w:pStyle w:val="Heading1"/>
@@ -4154,7 +5229,7 @@
         <w:t xml:space="preserve">Methodology</w:t>
       </w:r>
     </w:p>
-    <w:bookmarkStart w:id="37" w:name="implementation"/>
+    <w:bookmarkStart w:id="42" w:name="implementation"/>
     <w:p>
       <w:pPr>
         <w:pStyle w:val="Heading2"/>
@@ -4192,8 +5267,8 @@
         <w:t xml:space="preserve">, 18 tested specific interleavings of two instances, not all. Step 11 was still not one transaction: a crash after its reservations leaked reserved slots or resolved the send as undelivered. The implementation was a research prototype.</w:t>
       </w:r>
     </w:p>
-    <w:bookmarkEnd w:id="37"/>
-    <w:bookmarkStart w:id="38" w:name="simulation"/>
+    <w:bookmarkEnd w:id="42"/>
+    <w:bookmarkStart w:id="43" w:name="simulation"/>
     <w:p>
       <w:pPr>
         <w:pStyle w:val="Heading2"/>
@@ -4224,7 +5299,7 @@
         <w:pStyle w:val="BodyText"/>
       </w:pPr>
       <w:r>
-        <w:t xml:space="preserve">Three behavioral parameters have published counterparts: genuine conversion (one provider’s 68% or more (Twilio Inc., 2026b); ours 60%–90%) and the never-converting destinations and identity churn of Section 2; the rest are assumptions. Table 3 groups the attacker profiles by capability and marks the destination policies each faced (S, sequential tests; C, counters; B, block-limit; parameters in</w:t>
+        <w:t xml:space="preserve">Three behavioral parameters have published counterparts: genuine conversion (one provider’s 68% or more (Twilio Inc., 2026b); ours 60%–90%) and the never-converting destinations and identity churn of Section 2; the rest are assumptions. Table 4 groups the attacker profiles by capability and marks the destination policies each faced (S, sequential tests; C, counters; B, block-limit; parameters in</w:t>
       </w:r>
       <w:r>
         <w:t xml:space="preserve"> </w:t>
@@ -4239,8 +5314,8 @@
         <w:t xml:space="preserve">). Attackers draw pool size, rate, and CAPTCHA class per seed, which explains 92% [80, 98] of the variance of the farm’s leakage in a nested design (ten configurations, three seeds each). Brackets in the text and tables, and bars and bands in the figures, are 95% percentile-bootstrap intervals over seeds, paired per seed for differences; they describe variation under this generator, not uncertainty about real traffic.</w:t>
       </w:r>
     </w:p>
-    <w:bookmarkEnd w:id="38"/>
-    <w:bookmarkStart w:id="39" w:name="two-protocols-and-their-chronology"/>
+    <w:bookmarkEnd w:id="43"/>
+    <w:bookmarkStart w:id="44" w:name="two-protocols-and-their-chronology"/>
     <w:p>
       <w:pPr>
         <w:pStyle w:val="Heading2"/>
@@ -4314,8 +5389,8 @@
         <w:t xml:space="preserve">300 under both protocols (artifact change report).</w:t>
       </w:r>
     </w:p>
-    <w:bookmarkEnd w:id="39"/>
-    <w:bookmarkStart w:id="40" w:name="designs-and-metrics"/>
+    <w:bookmarkEnd w:id="44"/>
+    <w:bookmarkStart w:id="45" w:name="designs-and-metrics"/>
     <w:p>
       <w:pPr>
         <w:pStyle w:val="Heading2"/>
@@ -4533,7 +5608,7 @@
           <w:bCs/>
           <w:b/>
         </w:rPr>
-        <w:t xml:space="preserve">Table 3</w:t>
+        <w:t xml:space="preserve">Table 4</w:t>
       </w:r>
       <w:r>
         <w:t xml:space="preserve"> </w:t>
@@ -4554,7 +5629,7 @@
           <w:right w:w="57" w:type="dxa"/>
         </w:tblCellMar>
         <w:tblLook w:firstRow="1" w:lastRow="0" w:firstColumn="0" w:lastColumn="0" w:noHBand="0" w:noVBand="0" w:val="0020"/>
-        <w:tblCaption w:val="Table 3 TBLBRK Attacker Profiles, Capabilities, and Policies."/>
+        <w:tblCaption w:val="Table 4 TBLBRK Attacker Profiles, Capabilities, and Policies."/>
       </w:tblPr>
       <w:tblGrid>
         <w:gridCol w:w="3771"/>
@@ -4993,7 +6068,7 @@
               <w:rPr>
                 <w:sz w:val="17"/>
               </w:rPr>
-              <w:t xml:space="preserve">to 300 blocks, at full rate or at most the counter’s quota per block</w:t>
+              <w:t xml:space="preserve">3 to 300 blocks, at full rate or at most the counter’s quota per block</w:t>
             </w:r>
           </w:p>
         </w:tc>
@@ -5020,9 +6095,9 @@
         </w:tc>
       </w:tr>
     </w:tbl>
-    <w:bookmarkEnd w:id="40"/>
-    <w:bookmarkEnd w:id="41"/>
-    <w:bookmarkStart w:id="62" w:name="results"/>
+    <w:bookmarkEnd w:id="45"/>
+    <w:bookmarkEnd w:id="46"/>
+    <w:bookmarkStart w:id="67" w:name="results"/>
     <w:p>
       <w:pPr>
         <w:pStyle w:val="Heading1"/>
@@ -5040,7 +6115,7 @@
         <w:t xml:space="preserve">Results</w:t>
       </w:r>
     </w:p>
-    <w:bookmarkStart w:id="42" w:name="rq1-what-is-contained-and-at-what-cost"/>
+    <w:bookmarkStart w:id="47" w:name="rq1-what-is-contained-and-at-what-cost"/>
     <w:p>
       <w:pPr>
         <w:pStyle w:val="Heading2"/>
@@ -5067,7 +6142,7 @@
           <w:bCs/>
           <w:b/>
         </w:rPr>
-        <w:t xml:space="preserve">Table 4</w:t>
+        <w:t xml:space="preserve">Table 5</w:t>
       </w:r>
       <w:r>
         <w:t xml:space="preserve"> </w:t>
@@ -5088,7 +6163,7 @@
           <w:right w:w="57" w:type="dxa"/>
         </w:tblCellMar>
         <w:tblLook w:firstRow="0" w:lastRow="0" w:firstColumn="0" w:lastColumn="0" w:noHBand="0" w:noVBand="0" w:val="0000"/>
-        <w:tblCaption w:val="Table 4 TBLBRK Leakage and User Impact Across Designs."/>
+        <w:tblCaption w:val="Table 5 TBLBRK Leakage and User Impact Across Designs."/>
       </w:tblPr>
       <w:tblGrid>
         <w:gridCol w:w="2801"/>
@@ -6487,7 +7562,7 @@
         <w:pStyle w:val="BodyText"/>
       </w:pPr>
       <w:r>
-        <w:t xml:space="preserve">Table 4 gives the leaked share (%, mean of per-run shares) of about 600 attack requests in 20 minutes over 30 seeds under v1, block-limit (BL) and v2 with source caps lifted, and under v2 with caps on, with the first-time users refused and all users completing (%); supplementary Table S1 (</w:t>
+        <w:t xml:space="preserve">Table 5 gives the leaked share (%, mean of per-run shares) of about 600 attack requests in 20 minutes over 30 seeds under v1, block-limit (BL) and v2 with source caps lifted, and under v2 with caps on, with the first-time users refused and all users completing (%); supplementary Table S1 (</w:t>
       </w:r>
       <w:r>
         <w:rPr>
@@ -6496,7 +7571,7 @@
         <w:t xml:space="preserve">results/ design_table.md</w:t>
       </w:r>
       <w:r>
-        <w:t xml:space="preserve">) gives every design with intervals. Datacenter rotation leaks nothing under v2 because it scores in the challenge tier and declines challenges; Step 5 refuses the premium range, and the session cap holds the single client to two messages (Table 4); in all 108 robustness cells, these attacks leaked under 5% at completion within two points of the paired no-attack run (claim C1). The walk leaks 61 [53, 70] messages before its block’s verdict (block-limit: five), and the reused profile 89 [83, 95].</w:t>
+        <w:t xml:space="preserve">) gives every design with intervals. Datacenter rotation leaks nothing under v2 because it scores in the challenge tier and declines challenges; Step 5 refuses the premium range, and the session cap holds the single client to two messages (Table 5); in all 108 robustness cells, these attacks leaked under 5% at completion within two points of the paired no-attack run (claim C1). The walk leaks 61 [53, 70] messages before its block’s verdict (block-limit: five), and the reused profile 89 [83, 95].</w:t>
       </w:r>
     </w:p>
     <w:p>
@@ -6507,8 +7582,8 @@
         <w:t xml:space="preserve">The farm leaks 99.5% with caps lifted under every design; v2’s adaptive cap holds it to 229 [215, 244] messages, 46%, by refusing 54% [47, 60] of first-time users, so 45.5% complete instead of 76.4% under v1: rationing (claim C5 held in 36 of 36 cells).</w:t>
       </w:r>
     </w:p>
-    <w:bookmarkEnd w:id="42"/>
-    <w:bookmarkStart w:id="43" w:name="rq2-conditional-effects-of-each-layer"/>
+    <w:bookmarkEnd w:id="47"/>
+    <w:bookmarkStart w:id="48" w:name="rq2-conditional-effects-of-each-layer"/>
     <w:p>
       <w:pPr>
         <w:pStyle w:val="Heading2"/>
@@ -6585,8 +7660,8 @@
         <w:t xml:space="preserve">]).</w:t>
       </w:r>
     </w:p>
-    <w:bookmarkEnd w:id="43"/>
-    <w:bookmarkStart w:id="44" w:name="rq3-where-reputation-stops-separating"/>
+    <w:bookmarkEnd w:id="48"/>
+    <w:bookmarkStart w:id="49" w:name="rq3-where-reputation-stops-separating"/>
     <w:p>
       <w:pPr>
         <w:pStyle w:val="Heading2"/>
@@ -6612,8 +7687,8 @@
         <w:t xml:space="preserve">A farmed-CAPTCHA attacker uses an address and fingerprint once and shares its country, prefix, and residential ASN with every legitimate user; thus, its failures penalize everyone: over an hour with caps lifted (five seeds), up to twice the legitimate rate, 99 to 100% of it leaks, since a shared key stays above 0.3 conversion until failures outnumber legitimate sends about 1.7 to one. At ten times, 70% leaks while 17% of legitimate users are challenged and 3.2% refused (claim C2, at least 90% leaked with caps lifted, held in 34 of 36 cells). No single score change separates better: a fresh-fingerprint weight of 40 stops it only by challenging 47% of legitimate users. In the settings run, reputation separated an attacker only on keys its sends dominated (Douceur, 2002).</w:t>
       </w:r>
     </w:p>
-    <w:bookmarkEnd w:id="44"/>
-    <w:bookmarkStart w:id="45" w:name="Xc07daa08c7787c54feae400d5f00a63594cbc0c"/>
+    <w:bookmarkEnd w:id="49"/>
+    <w:bookmarkStart w:id="50" w:name="Xc07daa08c7787c54feae400d5f00a63594cbc0c"/>
     <w:p>
       <w:pPr>
         <w:pStyle w:val="Heading2"/>
@@ -6639,8 +7714,8 @@
         <w:t xml:space="preserve">When separation fails, the cap is the lever: over ten seeds, the default lets 47% of the farm’s requests through and refuses 41% of all legitimate users, the tightest setting 20% and 64%. Both assume an oracle job that is told the legitimate rate and runs every minute; running every five minutes or hourly, it lets 75%–96% through. Learning the rate from the pipeline’s counters, the deployed job leaks 193 [161, 229] messages with a clean three-week profile, 340 [239, 441] more on a cold start, 106 [62, 151] more with a stale profile, and 45 [10, 77] more with a poisoned one.</w:t>
       </w:r>
     </w:p>
-    <w:bookmarkEnd w:id="45"/>
-    <w:bookmarkStart w:id="46" w:name="pumping-against-the-sequential-tests"/>
+    <w:bookmarkEnd w:id="50"/>
+    <w:bookmarkStart w:id="51" w:name="pumping-against-the-sequential-tests"/>
     <w:p>
       <w:pPr>
         <w:pStyle w:val="Heading2"/>
@@ -6667,7 +7742,7 @@
           <w:bCs/>
           <w:b/>
         </w:rPr>
-        <w:t xml:space="preserve">Table 5</w:t>
+        <w:t xml:space="preserve">Table 6</w:t>
       </w:r>
       <w:r>
         <w:t xml:space="preserve"> </w:t>
@@ -6688,7 +7763,7 @@
           <w:right w:w="57" w:type="dxa"/>
         </w:tblCellMar>
         <w:tblLook w:firstRow="0" w:lastRow="0" w:firstColumn="0" w:lastColumn="0" w:noHBand="0" w:noVBand="0" w:val="0000"/>
-        <w:tblCaption w:val="Table 5 TBLBRK Containment Results for Concentrated Pumping Attacks."/>
+        <w:tblCaption w:val="Table 6 TBLBRK Containment Results for Concentrated Pumping Attacks."/>
       </w:tblPr>
       <w:tblGrid>
         <w:gridCol w:w="2918"/>
@@ -7631,7 +8706,7 @@
         <w:pStyle w:val="BodyText"/>
       </w:pPr>
       <w:r>
-        <w:t xml:space="preserve">Table 5 covers concentrated pumpers on three blocks with caps lifted over ten seeds: messages leaked of about 574 requests in 20 minutes, seeds contained, mean minutes to containment (contained seeds) and to the first verdict (seeds with one), and codes entered. The speed test catches a carrier verifying within a second at 19 messages, while the carrier verifying 60% with human-like delay is contained in none of the ten 20-minute runs: its first verdict comes at minute 11.6 on average and 452 messages leak; in an hour, 1 067 leak and two of ten runs are contained, at minute 47.0 on average. Claim C3 (containment with at most 30% leaked) held in 36 of 36 cells.</w:t>
+        <w:t xml:space="preserve">Table 6 covers concentrated pumpers on three blocks with caps lifted over ten seeds: messages leaked of about 574 requests in 20 minutes, seeds contained, mean minutes to containment (contained seeds) and to the first verdict (seeds with one), and codes entered. The speed test catches a carrier verifying within a second at 19 messages, while the carrier verifying 60% with human-like delay is contained in none of the ten 20-minute runs: its first verdict comes at minute 11.6 on average and 452 messages leak; in an hour, 1 067 leak and two of ten runs are contained, at minute 47.0 on average. Claim C3 (containment with at most 30% leaked) held in 36 of 36 cells.</w:t>
       </w:r>
     </w:p>
     <w:p>
@@ -7642,8 +8717,8 @@
         <w:t xml:space="preserve">Across 18 spread configurations, leakage follows the blocks touched: with 30 blocks, five to seven runs in ten are still contained. Unsaturated, Equation (2) errs by 1.6 to 7.9 messages per run (1%–13%, ten configurations); saturated, it overstates by up to 91.</w:t>
       </w:r>
     </w:p>
-    <w:bookmarkEnd w:id="46"/>
-    <w:bookmarkStart w:id="59" w:name="Xc3b3a0ae0d7ddd12dca67a47167dca0c845034c"/>
+    <w:bookmarkEnd w:id="51"/>
+    <w:bookmarkStart w:id="64" w:name="Xc3b3a0ae0d7ddd12dca67a47167dca0c845034c"/>
     <w:p>
       <w:pPr>
         <w:pStyle w:val="Heading2"/>
@@ -7670,7 +8745,7 @@
           <w:bCs/>
           <w:b/>
         </w:rPr>
-        <w:t xml:space="preserve">Table 6</w:t>
+        <w:t xml:space="preserve">Table 7</w:t>
       </w:r>
       <w:r>
         <w:t xml:space="preserve"> </w:t>
@@ -7691,7 +8766,7 @@
           <w:right w:w="57" w:type="dxa"/>
         </w:tblCellMar>
         <w:tblLook w:firstRow="1" w:lastRow="0" w:firstColumn="0" w:lastColumn="0" w:noHBand="0" w:noVBand="0" w:val="0020"/>
-        <w:tblCaption w:val="Table 6 TBLBRK Leakage and Benign-User Impact Across Carrier Types."/>
+        <w:tblCaption w:val="Table 7 TBLBRK Leakage and Benign-User Impact Across Carrier Types."/>
       </w:tblPr>
       <w:tblGrid>
         <w:gridCol w:w="4053"/>
@@ -8835,7 +9910,7 @@
         </w:tc>
       </w:tr>
     </w:tbl>
-    <w:bookmarkStart w:id="53" w:name="at-a-benign-service-target"/>
+    <w:bookmarkStart w:id="58" w:name="at-a-benign-service-target"/>
     <w:p>
       <w:pPr>
         <w:pStyle w:val="Heading3"/>
@@ -8858,7 +9933,7 @@
         <w:pStyle w:val="FirstParagraph"/>
       </w:pPr>
       <w:r>
-        <w:t xml:space="preserve">Table 6 reports the first protocol at 200 blocks (144 legitimate sends per block a day; tuning seeds 100–102, evaluation seeds 0–9): 20-minute leakage against the never-verifying (NV), instant (IV), human-like (HL) and challenge-buying (CB) carriers and, from 24-hour attack-free runs at 65% conversion, completion, benign cost (points), users challenged and verdict events a day; the tuning target is 63.95%. Figure 1 plots each setting’s completion against its leakage summed over the four pumpers’ runs of a seed (not one combined attack), with the tuning target dotted; its unlabeled points are sequential settings matched to the default’s false alarms at other credits (key:</w:t>
+        <w:t xml:space="preserve">Table 7 reports the first protocol at 200 blocks (144 legitimate sends per block a day; tuning seeds 100–102, evaluation seeds 0–9): 20-minute leakage against the never-verifying (NV), instant (IV), human-like (HL) and challenge-buying (CB) carriers and, from 24-hour attack-free runs at 65% conversion, completion, benign cost (points), users challenged and verdict events a day; the tuning target is 63.95%. Figure 2 plots each setting’s completion against its leakage summed over the four pumpers’ runs of a seed (not one combined attack), with the tuning target dotted; its unlabeled points are sequential settings matched to the default’s false alarms at other credits (key:</w:t>
       </w:r>
       <w:r>
         <w:t xml:space="preserve"> </w:t>
@@ -8870,7 +9945,7 @@
         <w:t xml:space="preserve">results/ figure1_key.md</w:t>
       </w:r>
       <w:r>
-        <w:t xml:space="preserve">). Figure 2 gives each selected setting’s leakage minus the default’s, paired per seed (negative: leaks less). The sequential setting selected at the tuning target holds the human-like carrier to 126 messages only by raising 334 false verdict events a day, and misses the target by 0.18 points on seeds 0–9. The graded counter of four sends per block per ten minutes leaks 24 against each outcome-reading carrier and 48 against the challenge buyer, at 0.06 points; counters selected at the sparser settings leak 6 to 18 at 0.15 to 0.35 points (up to 0.43 at 80%). With the full grid and density-specific attacks (E5) the rule selects the same counters, and so do other objectives on the tuning runs (worst-case leakage, a first-time-loss constraint, each attacker alone, 2 000 random mixes), except the instant verifier alone and 3 mixes at 200 blocks; on fresh seeds the counter leaked least of the winners against every attacker but the instant verifier (25, against 15 and 16). On seeds 300–309 the 1 000-block counter falls 0.12 points below its target, yet no seed-and-conversion cell fails the paired check (the evaluation default minus 0.5 points).</w:t>
+        <w:t xml:space="preserve">). Figure 3 gives each selected setting’s leakage minus the default’s, paired per seed (negative: leaks less). The sequential setting selected at the tuning target holds the human-like carrier to 126 messages only by raising 334 false verdict events a day, and misses the target by 0.18 points on seeds 0–9. The graded counter of four sends per block per ten minutes leaks 24 against each outcome-reading carrier and 48 against the challenge buyer, at 0.06 points; counters selected at the sparser settings leak 6 to 18 at 0.15 to 0.35 points (up to 0.43 at 80%). With the full grid and density-specific attacks (E5) the rule selects the same counters, and so do other objectives on the tuning runs (worst-case leakage, a first-time-loss constraint, each attacker alone, 2 000 random mixes), except the instant verifier alone and 3 mixes at 200 blocks; on fresh seeds the counter leaked least of the winners against every attacker but the instant verifier (25, against 15 and 16). On seeds 300–309 the 1 000-block counter falls 0.12 points below its target, yet no seed-and-conversion cell fails the paired check (the evaluation default minus 0.5 points).</w:t>
       </w:r>
     </w:p>
     <w:p>
@@ -8882,18 +9957,18 @@
           <wp:inline>
             <wp:extent cx="5334000" cy="3597348"/>
             <wp:effectExtent b="0" l="0" r="0" t="0"/>
-            <wp:docPr descr="" title="" id="48" name="Picture"/>
+            <wp:docPr descr="" title="" id="53" name="Picture"/>
             <a:graphic>
               <a:graphicData uri="http://schemas.openxmlformats.org/drawingml/2006/picture">
                 <pic:pic>
                   <pic:nvPicPr>
-                    <pic:cNvPr descr="figures/fig6_matched_a.png" id="49" name="Picture"/>
+                    <pic:cNvPr descr="figures/fig6_matched_a.png" id="54" name="Picture"/>
                     <pic:cNvPicPr>
                       <a:picLocks noChangeArrowheads="1" noChangeAspect="1"/>
                     </pic:cNvPicPr>
                   </pic:nvPicPr>
                   <pic:blipFill>
-                    <a:blip r:embed="rId47"/>
+                    <a:blip r:embed="rId52"/>
                     <a:stretch>
                       <a:fillRect/>
                     </a:stretch>
@@ -8929,7 +10004,7 @@
           <w:bCs/>
           <w:b/>
         </w:rPr>
-        <w:t xml:space="preserve">Fig. 1.</w:t>
+        <w:t xml:space="preserve">Fig. 2.</w:t>
       </w:r>
       <w:r>
         <w:t xml:space="preserve"> </w:t>
@@ -8947,18 +10022,18 @@
           <wp:inline>
             <wp:extent cx="5334000" cy="4341627"/>
             <wp:effectExtent b="0" l="0" r="0" t="0"/>
-            <wp:docPr descr="" title="" id="51" name="Picture"/>
+            <wp:docPr descr="" title="" id="56" name="Picture"/>
             <a:graphic>
               <a:graphicData uri="http://schemas.openxmlformats.org/drawingml/2006/picture">
                 <pic:pic>
                   <pic:nvPicPr>
-                    <pic:cNvPr descr="figures/fig6_matched_b.png" id="52" name="Picture"/>
+                    <pic:cNvPr descr="figures/fig6_matched_b.png" id="57" name="Picture"/>
                     <pic:cNvPicPr>
                       <a:picLocks noChangeArrowheads="1" noChangeAspect="1"/>
                     </pic:cNvPicPr>
                   </pic:nvPicPr>
                   <pic:blipFill>
-                    <a:blip r:embed="rId50"/>
+                    <a:blip r:embed="rId55"/>
                     <a:stretch>
                       <a:fillRect/>
                     </a:stretch>
@@ -8994,7 +10069,7 @@
           <w:bCs/>
           <w:b/>
         </w:rPr>
-        <w:t xml:space="preserve">Fig. 2.</w:t>
+        <w:t xml:space="preserve">Fig. 3.</w:t>
       </w:r>
       <w:r>
         <w:t xml:space="preserve"> </w:t>
@@ -9012,7 +10087,7 @@
           <w:bCs/>
           <w:b/>
         </w:rPr>
-        <w:t xml:space="preserve">Table 7</w:t>
+        <w:t xml:space="preserve">Table 8</w:t>
       </w:r>
       <w:r>
         <w:t xml:space="preserve"> </w:t>
@@ -9033,7 +10108,7 @@
           <w:right w:w="57" w:type="dxa"/>
         </w:tblCellMar>
         <w:tblLook w:firstRow="1" w:lastRow="0" w:firstColumn="0" w:lastColumn="0" w:noHBand="0" w:noVBand="0" w:val="0020"/>
-        <w:tblCaption w:val="Table 7 TBLBRK Held-Out Evaluation of the Principal Counter."/>
+        <w:tblCaption w:val="Table 8 TBLBRK Held-Out Evaluation of the Principal Counter."/>
       </w:tblPr>
       <w:tblGrid>
         <w:gridCol w:w="648"/>
@@ -9633,8 +10708,8 @@
         </w:tc>
       </w:tr>
     </w:tbl>
-    <w:bookmarkEnd w:id="53"/>
-    <w:bookmarkStart w:id="54" w:name="under-a-second-protocol"/>
+    <w:bookmarkEnd w:id="58"/>
+    <w:bookmarkStart w:id="59" w:name="under-a-second-protocol"/>
     <w:p>
       <w:pPr>
         <w:pStyle w:val="Heading3"/>
@@ -9657,7 +10732,7 @@
         <w:pStyle w:val="FirstParagraph"/>
       </w:pPr>
       <w:r>
-        <w:t xml:space="preserve">Table 7 covers 12 shifted points of the held-out family, with held-out attack rates and pools, three seeds each and a 20-minute pumper on three blocks real users share; a claim holds if true in 90% of cells, which share workloads and seeds and are not independent, and IV marks the instant verifier’s cells. Frozen and run on this family, the counter leaked 33, 34, 33, and 62 messages against the four carriers, where the default leaked 287, 36, 344, and 287, and no policy 451 to 1 857, at a benign cost of 0.13 [0.09, 0.17] points, and failed both service-under-attack claims: 13 of the 17 cells that broke K3 lie at the three points with the most legitimate traffic, where users and pumper compete for one quota; K5 failed in 51 cells over 11 of 12 points. The counters selected for sparser traffic cost 4.7 and 5.8 points here even without an attack: the quota must match the traffic.</w:t>
+        <w:t xml:space="preserve">Table 8 covers 12 shifted points of the held-out family, with held-out attack rates and pools, three seeds each and a 20-minute pumper on three blocks real users share; a claim holds if true in 90% of cells, which share workloads and seeds and are not independent, and IV marks the instant verifier’s cells. Frozen and run on this family, the counter leaked 33, 34, 33, and 62 messages against the four carriers, where the default leaked 287, 36, 344, and 287, and no policy 451 to 1 857, at a benign cost of 0.13 [0.09, 0.17] points, and failed both service-under-attack claims: 13 of the 17 cells that broke K3 lie at the three points with the most legitimate traffic, where users and pumper compete for one quota; K5 failed in 51 cells over 11 of 12 points. The counters selected for sparser traffic cost 4.7 and 5.8 points here even without an attack: the quota must match the traffic.</w:t>
       </w:r>
     </w:p>
     <w:p>
@@ -9669,7 +10744,7 @@
           <w:bCs/>
           <w:b/>
         </w:rPr>
-        <w:t xml:space="preserve">Table 8</w:t>
+        <w:t xml:space="preserve">Table 9</w:t>
       </w:r>
       <w:r>
         <w:t xml:space="preserve"> </w:t>
@@ -9690,7 +10765,7 @@
           <w:right w:w="57" w:type="dxa"/>
         </w:tblCellMar>
         <w:tblLook w:firstRow="0" w:lastRow="0" w:firstColumn="0" w:lastColumn="0" w:noHBand="0" w:noVBand="0" w:val="0000"/>
-        <w:tblCaption w:val="Table 8 TBLBRK Leakage and User Harm Under Shared-Block Pumping."/>
+        <w:tblCaption w:val="Table 9 TBLBRK Leakage and User Harm Under Shared-Block Pumping."/>
       </w:tblPr>
       <w:tblGrid>
         <w:gridCol w:w="1845"/>
@@ -11135,7 +12210,7 @@
           <w:bCs/>
           <w:b/>
         </w:rPr>
-        <w:t xml:space="preserve">Table 9</w:t>
+        <w:t xml:space="preserve">Table 10</w:t>
       </w:r>
       <w:r>
         <w:t xml:space="preserve"> </w:t>
@@ -11156,7 +12231,7 @@
           <w:right w:w="57" w:type="dxa"/>
         </w:tblCellMar>
         <w:tblLook w:firstRow="0" w:lastRow="0" w:firstColumn="0" w:lastColumn="0" w:noHBand="0" w:noVBand="0" w:val="0000"/>
-        <w:tblCaption w:val="Table 9 TBLBRK User Harm Under a Full-Block Poisoning Attack."/>
+        <w:tblCaption w:val="Table 10 TBLBRK User Harm Under a Full-Block Poisoning Attack."/>
       </w:tblPr>
       <w:tblGrid>
         <w:gridCol w:w="3066"/>
@@ -11928,7 +13003,7 @@
         <w:pStyle w:val="BodyText"/>
       </w:pPr>
       <w:r>
-        <w:t xml:space="preserve">Tables 8 and 9 report E1 at 200 blocks (60-minute attacks, seeds 300–309): a pumper on three blocks real users share, and a poisoner flooding all 200 blocks. Leakage under the pumper is summed over the four carriers’ runs of a seed, which can hide a carrier on which a policy loses (per carrier: artifact); harm is net completions lost in points, averaged over the carriers (negative: a gain), with intervals for leakage and the attacked blocks in Table 8 and for all users’ extra harm in Table 9. In Table 8, against the attacked no-policy arm, the counter cost all users nothing on average and gained the attacked blocks’ users three points on average, since without a destination policy, the pumper exhausts their blocks and the hourly budget; with the human-like carrier alone, it cost them 1.9. Against the attack-free operation, every evaluated policy left those users 5 to 9 points worse off on average (2 to 12 per carrier; 8 with none): none shields a block an attacker shares. Counter and tests together, explored outside the frozen claims, leaked least summed over the four carriers but not against the instant verifier (28;</w:t>
+        <w:t xml:space="preserve">Tables 9 and 10 report E1 at 200 blocks (60-minute attacks, seeds 300–309): a pumper on three blocks real users share, and a poisoner flooding all 200 blocks. Leakage under the pumper is summed over the four carriers’ runs of a seed, which can hide a carrier on which a policy loses (per carrier: artifact); harm is net completions lost in points, averaged over the carriers (negative: a gain), with intervals for leakage and the attacked blocks in Table 9 and for all users’ extra harm in Table 10. In Table 9, against the attacked no-policy arm, the counter cost all users nothing on average and gained the attacked blocks’ users three points on average, since without a destination policy, the pumper exhausts their blocks and the hourly budget; with the human-like carrier alone, it cost them 1.9. Against the attack-free operation, every evaluated policy left those users 5 to 9 points worse off on average (2 to 12 per carrier; 8 with none): none shields a block an attacker shares. Counter and tests together, explored outside the frozen claims, leaked least summed over the four carriers but not against the instant verifier (28;</w:t>
       </w:r>
       <w:r>
         <w:t xml:space="preserve"> </w:t>
@@ -11954,7 +13029,7 @@
         <w:t xml:space="preserve">c</w:t>
       </w:r>
       <w:r>
-        <w:t xml:space="preserve">0: 22), and under the poisoner (Table 9) cost all users most of the counters and buckets and leaked more than</w:t>
+        <w:t xml:space="preserve">0: 22), and under the poisoner (Table 10) cost all users most of the counters and buckets and leaked more than</w:t>
       </w:r>
       <w:r>
         <w:t xml:space="preserve"> </w:t>
@@ -11983,8 +13058,8 @@
         <w:t xml:space="preserve">0. A token bucket with a burst of 4 spared the poisoner’s users only by letting almost everything through; with two untuned settings, neither limiter dominated, and we ranked only the implemented policies. Returning users, all simulated with verified history, lost nothing.</w:t>
       </w:r>
     </w:p>
-    <w:bookmarkEnd w:id="54"/>
-    <w:bookmarkStart w:id="58" w:name="X30d161eb055c3bdd60ae2ef3ca5d49f7d5c43cc"/>
+    <w:bookmarkEnd w:id="59"/>
+    <w:bookmarkStart w:id="63" w:name="X30d161eb055c3bdd60ae2ef3ca5d49f7d5c43cc"/>
     <w:p>
       <w:pPr>
         <w:pStyle w:val="Heading3"/>
@@ -12007,7 +13082,7 @@
         <w:pStyle w:val="FirstParagraph"/>
       </w:pPr>
       <w:r>
-        <w:t xml:space="preserve">Figure 3 shows the counter’s operating boundary (E4, seeds 300–304): in (a), the attributable loss of the three hot blocks’ users against their legitimate rate, attack-free and with a never-verifying pumper on those blocks; in (b, c), leakage in 20 and 60 minutes against the blocks a pumper uses, at full rate or paced, with Equations (2)–(4) for the full-rate pumper as hollow markers. All horizontal axes and the vertical axes of (b, c) are logarithmic, and lines join sampled settings without locating a crossover. Attack-free, the counter costs a block’s users nothing at one send per ten minutes, 2.3 points at four and 5.5 at eight, far below the idealized share beyond the quota (27% at four), since most challenged users complete or switch to WhatsApp; without WhatsApp, eight sends cost 13.2. A 30-minute launch at three times the normal rate costs its blocks’ users 16 points. Over 60 minutes (Figure 3c) the default leaked 110, 144 and 242 messages on 3, 10 and 30 blocks, against 105, 139 and 240 from Equation (2) (</w:t>
+        <w:t xml:space="preserve">Figure 4 shows the counter’s operating boundary (E4, seeds 300–304): in (a), the attributable loss of the three hot blocks’ users against their legitimate rate, attack-free and with a never-verifying pumper on those blocks; in (b, c), leakage in 20 and 60 minutes against the blocks a pumper uses, at full rate or paced, with Equations (2)–(4) for the full-rate pumper as hollow markers. All horizontal axes and the vertical axes of (b, c) are logarithmic, and lines join sampled settings without locating a crossover. Attack-free, the counter costs a block’s users nothing at one send per ten minutes, 2.3 points at four and 5.5 at eight, far below the idealized share beyond the quota (27% at four), since most challenged users complete or switch to WhatsApp; without WhatsApp, eight sends cost 13.2. A 30-minute launch at three times the normal rate costs its blocks’ users 16 points. Over 60 minutes (Figure 4c) the default leaked 110, 144 and 242 messages on 3, 10 and 30 blocks, against 105, 139 and 240 from Equation (2) (</w:t>
       </w:r>
       <m:oMath>
         <m:r>
@@ -12050,18 +13125,18 @@
           <wp:inline>
             <wp:extent cx="5334000" cy="6176210"/>
             <wp:effectExtent b="0" l="0" r="0" t="0"/>
-            <wp:docPr descr="" title="" id="56" name="Picture"/>
+            <wp:docPr descr="" title="" id="61" name="Picture"/>
             <a:graphic>
               <a:graphicData uri="http://schemas.openxmlformats.org/drawingml/2006/picture">
                 <pic:pic>
                   <pic:nvPicPr>
-                    <pic:cNvPr descr="figures/fig7_counter_boundary.png" id="57" name="Picture"/>
+                    <pic:cNvPr descr="figures/fig7_counter_boundary.png" id="62" name="Picture"/>
                     <pic:cNvPicPr>
                       <a:picLocks noChangeArrowheads="1" noChangeAspect="1"/>
                     </pic:cNvPicPr>
                   </pic:nvPicPr>
                   <pic:blipFill>
-                    <a:blip r:embed="rId55"/>
+                    <a:blip r:embed="rId60"/>
                     <a:stretch>
                       <a:fillRect/>
                     </a:stretch>
@@ -12097,7 +13172,7 @@
           <w:bCs/>
           <w:b/>
         </w:rPr>
-        <w:t xml:space="preserve">Fig. 3.</w:t>
+        <w:t xml:space="preserve">Fig. 4.</w:t>
       </w:r>
       <w:r>
         <w:t xml:space="preserve"> </w:t>
@@ -12114,9 +13189,9 @@
         <w:t xml:space="preserve">Against adaptive attackers (E3), the counter held the threshold-aware carrier, receipt faker, and concentrated trust builder to 24 to 36 messages (502 to 665 under the default), but not trust builders on random numbers (577, as under the default); over 360 minutes, the human-like carrier gained 81 messages an hour under the counter, and 753 under the default.</w:t>
       </w:r>
     </w:p>
-    <w:bookmarkEnd w:id="58"/>
-    <w:bookmarkEnd w:id="59"/>
-    <w:bookmarkStart w:id="60" w:name="X1b098a1626e628988816138c90f067235f9035a"/>
+    <w:bookmarkEnd w:id="63"/>
+    <w:bookmarkEnd w:id="64"/>
+    <w:bookmarkStart w:id="65" w:name="X1b098a1626e628988816138c90f067235f9035a"/>
     <w:p>
       <w:pPr>
         <w:pStyle w:val="Heading2"/>
@@ -12150,8 +13225,8 @@
         <w:t xml:space="preserve">A poisoner flooding for 20 min the 20 blocks legitimate users concentrate on (caps lifted, ten seeds) raises 16 verdict events meeting 98 legitimate requests, 33 never completing; against observe-only operation on the same trace, enforcement costs 12.7 [4.6, 22.9] completions, 3.1% of users (6.3% without WhatsApp; 23.9% with a 24-hour denylist). One that stops after ten minutes leaves verdicts meeting 406.5 requests afterwards, an attributable loss of 46.2 [16.9, 79.8]. Grading limits the harm; it caps it neither at the challenge nor at the attack’s duration.</w:t>
       </w:r>
     </w:p>
-    <w:bookmarkEnd w:id="60"/>
-    <w:bookmarkStart w:id="61" w:name="X40c2940f2aaabd24aefaeec784f20c9ca681264"/>
+    <w:bookmarkEnd w:id="65"/>
+    <w:bookmarkStart w:id="66" w:name="X40c2940f2aaabd24aefaeec784f20c9ca681264"/>
     <w:p>
       <w:pPr>
         <w:pStyle w:val="Heading2"/>
@@ -12213,9 +13288,9 @@
         <w:t xml:space="preserve">). Under an adversarial mixture, 81% of sends overran the floor, and response-time thresholds separated sends from refusals with 88% balanced accuracy on the fitted run and, fitted on a new run, 95 to 99.9% on two others: a separation on that machine, not a deployment accuracy.</w:t>
       </w:r>
     </w:p>
-    <w:bookmarkEnd w:id="61"/>
-    <w:bookmarkEnd w:id="62"/>
-    <w:bookmarkStart w:id="63" w:name="discussion"/>
+    <w:bookmarkEnd w:id="66"/>
+    <w:bookmarkEnd w:id="67"/>
+    <w:bookmarkStart w:id="68" w:name="discussion"/>
     <w:p>
       <w:pPr>
         <w:pStyle w:val="Heading1"/>
@@ -12241,8 +13316,8 @@
         <w:t xml:space="preserve">In the scripted workloads, carriers that verify with human-like delay, fake receipts, or know the thresholds defeated our outcome tests but not a short-window counter. Within an hour of a verdict, the counter’s allowance, unlike the tests’, grows with the windows an attack spans; over longer campaigns, verdicts expire and the tests leak again. Equation (5) summarizes this for pumpers that solve no challenge and hold no exemption. Its inputs are in an operator’s logs; the cost of an excess send, competition under attack, and exemption abuse come only from the simulation. The counter and tests together, with a quota set from each block’s traffic, is a hypothesis for real traffic, not a recommendation.</w:t>
       </w:r>
     </w:p>
-    <w:bookmarkEnd w:id="63"/>
-    <w:bookmarkStart w:id="64" w:name="limitations"/>
+    <w:bookmarkEnd w:id="68"/>
+    <w:bookmarkStart w:id="69" w:name="limitations"/>
     <w:p>
       <w:pPr>
         <w:pStyle w:val="Heading1"/>
@@ -12268,8 +13343,8 @@
         <w:t xml:space="preserve">Everything was simulated, and calibration was assumed. Both protocols were written by the author for the author’s generator, the second knowing which counters had won. Some results follow from the generator (a perfect premium list, a datacenter attacker that declines challenges, returning users who always present verified history), and selection used an unweighted sum of four scripted pumpers’ leakage and a mean service target met on tuning seeds, which guarantees no service level elsewhere. Close rankings rest on ten or fewer seeds, and costs that round to zero are not shown equivalent. Per-client quotas within a block, carrier spend ceilings, bounded exemptions, tuned token buckets, and other sequential statistics lie outside the evaluated policies. Vendor adapters are untested live, and the timing result holds only for the observer tested. Destination policies challenge people for what strangers sharing their block did, and deployment under the GDPR or Saudi Arabia’s PDPL needs a lawful basis and a route for refused users.</w:t>
       </w:r>
     </w:p>
-    <w:bookmarkEnd w:id="64"/>
-    <w:bookmarkStart w:id="65" w:name="conclusions-and-future-work"/>
+    <w:bookmarkEnd w:id="69"/>
+    <w:bookmarkStart w:id="70" w:name="conclusions-and-future-work"/>
     <w:p>
       <w:pPr>
         <w:pStyle w:val="Heading1"/>
@@ -12292,7 +13367,7 @@
         <w:pStyle w:val="FirstParagraph"/>
       </w:pPr>
       <w:r>
-        <w:t xml:space="preserve">In this simulation, the design contains attacks that carry a signature at a low cost to simulated users and rations, rather than separates, residential attackers that resemble people. Counting sends on the destination leaked less in aggregate than our outcome tests against concentrated pumpers, although not reliably against an instantly verifying carrier; a frozen counter failed its service claims when the attacker shared blocks with real users and lost its advantage against wide, paced, and trust-building pumpers. Within an hour, unfitted estimates ordered the policies’ mean leakage in 18 of 18 decisive boundary cells with the cold-start bound and 17 with the warm-start bound, missing a near tie; the crossing was algebraic, not a measured switching point.</w:t>
+        <w:t xml:space="preserve">This study asked how a service that verifies phone numbers by SMS should defend an endpoint that must answer strangers, and in particular which of two label-free destination signals, the number of sends to a number block or the outcomes of the codes sent, it should act on when a pumper is paid on the destination. We answered it in simulation: a twelve-step redesign of a seven-control baseline ran against 25 scripted attacker profiles and six other designs, and the two destination policies were compared under two protocols committed before their runs, with the cost to legitimate users made part of the result.</w:t>
       </w:r>
     </w:p>
     <w:p>
@@ -12300,11 +13375,27 @@
         <w:pStyle w:val="BodyText"/>
       </w:pPr>
       <w:r>
-        <w:t xml:space="preserve">Replaying real traffic is the experiment this paper most needs: it would test the assumed calibration, the cost of an excess send to users who share a block, and the quota a counter needs per block.</w:t>
+        <w:t xml:space="preserve">On the source side, the design contains the attacks that carry a signature in the request, a single address, a datacenter range, a premium prefix, a walked number sequence or a forged header, at a low cost to simulated users, and the ablation attributes that containment to the adaptive caps, the risk engine, the feedback loop and the block key (RQ1, RQ2). Against a residential attacker that resembles a person, outcome-based reputation stops separating once its failures land on keys that legitimate users share; in the settings run, it separated an attacker only on keys its sends dominated (RQ3). What remains is rationing, whose cost depends on how well the cap tracks the legitimate rate: the deployed job leaked 193 messages with a clean three-week profile and 340 more on a cold start, while the default cap refused 41% of legitimate users (RQ4). On the destination, counting sends leaked less in aggregate than our outcome tests against concentrated pumpers, although not reliably against an instantly verifying carrier; the frozen counter failed its service claims when the attacker shared blocks with real users and lost its advantage against wide, paced and trust-building pumpers. Within an hour, unfitted estimates ordered the policies’ mean leakage in 18 of 18 decisive boundary cells with the cold-start bound and 17 with the warm-start bound, missing a near tie; the crossing was algebraic, not a measured switching point. Without an attack, the default tests raise 0.5 verdict events a day on 200 busy blocks at 80% conversion and 6.5 at 65%, and a counter of four sends per ten minutes costs a block’s users 2.3 points (RQ5).</w:t>
       </w:r>
     </w:p>
-    <w:bookmarkEnd w:id="65"/>
-    <w:bookmarkStart w:id="66" w:name="X071796dd6bc546c91e96cca1cf5ff96599de61f"/>
+    <w:p>
+      <w:pPr>
+        <w:pStyle w:val="BodyText"/>
+      </w:pPr>
+      <w:r>
+        <w:t xml:space="preserve">For an operator, the practical content is an ordering, not a recommendation. Against short, concentrated pumping on a few blocks, a counter of sends per block whose quota matches the block’s legitimate traffic leaked less than tests of code outcomes and cost its users less, and the inputs of the estimate that orders the two, the attack rate, the blocks touched and the time a send stays unresolved, are in an operator’s logs; the cost of an excess send, the competition for a quota on a shared block and the abuse of exemptions come only from the simulation. The quota must match the traffic: counters selected for sparser blocks cost 4.7 and 5.8 points on busier ones even without an attack. Every number describes scripted attackers and simulated users under assumed calibration, not real traffic, and close rankings rest on ten or fewer seeds.</w:t>
+      </w:r>
+    </w:p>
+    <w:p>
+      <w:pPr>
+        <w:pStyle w:val="BodyText"/>
+      </w:pPr>
+      <w:r>
+        <w:t xml:space="preserve">Replaying real traffic is the experiment this paper most needs: it would test the assumed calibration, the cost of an excess send to users who share a block, and the quota a counter needs per block. The policies left outside the evaluation, per-client quotas within a block, bounded exemptions, tuned token buckets and windowed or time-uniform statistics, could then be compared under the same predeclared protocols.</w:t>
+      </w:r>
+    </w:p>
+    <w:bookmarkEnd w:id="70"/>
+    <w:bookmarkStart w:id="71" w:name="X071796dd6bc546c91e96cca1cf5ff96599de61f"/>
     <w:p>
       <w:pPr>
         <w:pStyle w:val="Heading1"/>
@@ -12321,8 +13412,8 @@
         <w:t xml:space="preserve">The author used Claude (Anthropic) for code, evaluation, drafting and editing; checked numbers against the recorded results and claims against the code; and takes full responsibility for the content.</w:t>
       </w:r>
     </w:p>
-    <w:bookmarkEnd w:id="66"/>
-    <w:bookmarkStart w:id="67" w:name="credit-authorship-contribution-statement"/>
+    <w:bookmarkEnd w:id="71"/>
+    <w:bookmarkStart w:id="72" w:name="credit-authorship-contribution-statement"/>
     <w:p>
       <w:pPr>
         <w:pStyle w:val="Heading1"/>
@@ -12349,8 +13440,8 @@
         <w:t xml:space="preserve">Conceptualization, Methodology, Software, Validation, Investigation, Writing – original draft, Writing – review &amp; editing.</w:t>
       </w:r>
     </w:p>
-    <w:bookmarkEnd w:id="67"/>
-    <w:bookmarkStart w:id="68" w:name="declaration-of-competing-interest"/>
+    <w:bookmarkEnd w:id="72"/>
+    <w:bookmarkStart w:id="73" w:name="declaration-of-competing-interest"/>
     <w:p>
       <w:pPr>
         <w:pStyle w:val="Heading1"/>
@@ -12367,8 +13458,8 @@
         <w:t xml:space="preserve">The author declares no known competing financial interests or personal relationships that could have appeared to influence this work.</w:t>
       </w:r>
     </w:p>
-    <w:bookmarkEnd w:id="68"/>
-    <w:bookmarkStart w:id="70" w:name="data-availability"/>
+    <w:bookmarkEnd w:id="73"/>
+    <w:bookmarkStart w:id="75" w:name="data-availability"/>
     <w:p>
       <w:pPr>
         <w:pStyle w:val="Heading1"/>
@@ -12405,7 +13496,7 @@
       <w:r>
         <w:t xml:space="preserve"> </w:t>
       </w:r>
-      <w:hyperlink r:id="rId69">
+      <w:hyperlink r:id="rId74">
         <w:r>
           <w:rPr>
             <w:rStyle w:val="Hyperlink"/>
@@ -12438,8 +13529,8 @@
         <w:t xml:space="preserve">. These files are the supplementary material.</w:t>
       </w:r>
     </w:p>
-    <w:bookmarkEnd w:id="70"/>
-    <w:bookmarkStart w:id="79" w:name="references"/>
+    <w:bookmarkEnd w:id="75"/>
+    <w:bookmarkStart w:id="84" w:name="references"/>
     <w:p>
       <w:pPr>
         <w:pStyle w:val="Heading1"/>
@@ -12592,7 +13683,7 @@
         </w:rPr>
         <w:t xml:space="preserve"> </w:t>
       </w:r>
-      <w:hyperlink r:id="rId69">
+      <w:hyperlink r:id="rId74">
         <w:r>
           <w:rPr>
             <w:rStyle w:val="Hyperlink"/>
@@ -12789,7 +13880,7 @@
         </w:rPr>
         <w:t xml:space="preserve"> </w:t>
       </w:r>
-      <w:hyperlink r:id="rId71">
+      <w:hyperlink r:id="rId76">
         <w:r>
           <w:rPr>
             <w:rStyle w:val="Hyperlink"/>
@@ -13484,7 +14575,7 @@
         </w:rPr>
         <w:t xml:space="preserve"> </w:t>
       </w:r>
-      <w:hyperlink r:id="rId72">
+      <w:hyperlink r:id="rId77">
         <w:r>
           <w:rPr>
             <w:rStyle w:val="Hyperlink"/>
@@ -14625,7 +15716,7 @@
         </w:rPr>
         <w:t xml:space="preserve"> </w:t>
       </w:r>
-      <w:hyperlink r:id="rId73">
+      <w:hyperlink r:id="rId78">
         <w:r>
           <w:rPr>
             <w:rStyle w:val="Hyperlink"/>
@@ -15238,7 +16329,7 @@
         </w:rPr>
         <w:t xml:space="preserve"> </w:t>
       </w:r>
-      <w:hyperlink r:id="rId74">
+      <w:hyperlink r:id="rId79">
         <w:r>
           <w:rPr>
             <w:rStyle w:val="Hyperlink"/>
@@ -16349,7 +17440,7 @@
         </w:rPr>
         <w:t xml:space="preserve"> </w:t>
       </w:r>
-      <w:hyperlink r:id="rId75">
+      <w:hyperlink r:id="rId80">
         <w:r>
           <w:rPr>
             <w:rStyle w:val="Hyperlink"/>
@@ -16483,7 +17574,7 @@
         </w:rPr>
         <w:t xml:space="preserve"> </w:t>
       </w:r>
-      <w:hyperlink r:id="rId76">
+      <w:hyperlink r:id="rId81">
         <w:r>
           <w:rPr>
             <w:rStyle w:val="Hyperlink"/>
@@ -16603,7 +17694,7 @@
         </w:rPr>
         <w:t xml:space="preserve"> </w:t>
       </w:r>
-      <w:hyperlink r:id="rId77">
+      <w:hyperlink r:id="rId82">
         <w:r>
           <w:rPr>
             <w:rStyle w:val="Hyperlink"/>
@@ -16971,7 +18062,7 @@
         </w:rPr>
         <w:t xml:space="preserve"> </w:t>
       </w:r>
-      <w:hyperlink r:id="rId78">
+      <w:hyperlink r:id="rId83">
         <w:r>
           <w:rPr>
             <w:rStyle w:val="Hyperlink"/>
@@ -17412,7 +18503,7 @@
         <w:t xml:space="preserve">. https://doi.org/10.18372/2310-5461.69.20735.</w:t>
       </w:r>
     </w:p>
-    <w:bookmarkEnd w:id="79"/>
+    <w:bookmarkEnd w:id="84"/>
     <w:sectPr>
       <w:pgSz w:w="11906" w:h="16838"/>
       <w:pgMar w:left="1417" w:right="1417" w:top="1417" w:bottom="1417" w:header="708" w:footer="708" w:gutter="0"/>

</xml_diff>

<commit_message>
Manuscript revision 8: baseline, threat model and design in one section
Sections are now Introduction, Related work, Threat model and design
(3.1 the v1 baseline and its gaps, 3.2 threat model, 3.3-3.7 the design
and its leakage estimates), Methodology, Results, Discussion, Limitations,
Conclusions and future work. Cross-references, the request-path figure,
the study map, the docs and the round-8 letter follow the new numbering.

Co-Authored-By: Claude Fable 5.1 <noreply@anthropic.com>
Claude-Session: https://claude.ai/code/session_01RjWdFzUgYk6Hwie2YbnvyG
</commit_message>
<xml_diff>
--- a/paper/main.docx
+++ b/paper/main.docx
@@ -287,7 +287,7 @@
         <w:pStyle w:val="FirstParagraph"/>
       </w:pPr>
       <w:r>
-        <w:t xml:space="preserve">Section 2 reviews related work; Sections 3–5 give the baseline and threat model, the design with its leakage estimates, and the methodology; Section 6 reports the results; Sections 7–9 discuss them, state the limitations, and conclude.</w:t>
+        <w:t xml:space="preserve">Section 2 reviews related work; Section 3 gives the baseline, the threat model and the design with its leakage estimates; Section 4 the methodology; Section 5 reports the results; Sections 6–8 discuss them, state the limitations, and conclude.</w:t>
       </w:r>
     </w:p>
     <w:bookmarkEnd w:id="20"/>
@@ -423,7 +423,7 @@
         <w:t xml:space="preserve"> </w:t>
       </w:r>
       <w:r>
-        <w:t xml:space="preserve">premium-rate numbers from websites that pay for traffic and generates calls to them; a transit operator short-stops the calls, keeps the termination fee and shares it with the fraudster. The taxonomy of Sahin et al. (2017) sets the scheme among frauds that persist because call routing is opaque, each operator knowing only the next hop, and because operators are reluctant to share pricing, routes or fraud findings with competitors. Sahin and Francillon (2021) then measured the market from the supply side, collecting 3,149,793 distinct test numbers that twelve such providers advertised between January 2016 and November 2019 across 238 destinations. The ranges are a managed asset: 80% of them were shared across providers, which subdivide a hijacked block among themselves, and 70% lay inside valid numbering plans. From this intelligence and from call histories, the authors built a random-forest detector for an operator’s call records that reached 98% accuracy at 0.28% false positives, where blocking the two-digit neighborhood of a known test number caught 63%. Both studies concern voice telephony, and the detector needs the test-number intelligence and the call histories of an operator. The lesson for SMS is that the number range, not the calling identity, is what the fraudster must keep, and that a party seeing only its own traffic detects the fraud late. An OTP endpoint is in a weaker position still: it holds neither intelligence nor call histories, only its own sends and whether their codes were entered. That is why the policies of Section 4.3 are keyed on the 8-digit block and use only those two quantities.</w:t>
+        <w:t xml:space="preserve">premium-rate numbers from websites that pay for traffic and generates calls to them; a transit operator short-stops the calls, keeps the termination fee and shares it with the fraudster. The taxonomy of Sahin et al. (2017) sets the scheme among frauds that persist because call routing is opaque, each operator knowing only the next hop, and because operators are reluctant to share pricing, routes or fraud findings with competitors. Sahin and Francillon (2021) then measured the market from the supply side, collecting 3,149,793 distinct test numbers that twelve such providers advertised between January 2016 and November 2019 across 238 destinations. The ranges are a managed asset: 80% of them were shared across providers, which subdivide a hijacked block among themselves, and 70% lay inside valid numbering plans. From this intelligence and from call histories, the authors built a random-forest detector for an operator’s call records that reached 98% accuracy at 0.28% false positives, where blocking the two-digit neighborhood of a known test number caught 63%. Both studies concern voice telephony, and the detector needs the test-number intelligence and the call histories of an operator. The lesson for SMS is that the number range, not the calling identity, is what the fraudster must keep, and that a party seeing only its own traffic detects the fraud late. An OTP endpoint is in a weaker position still: it holds neither intelligence nor call histories, only its own sends and whether their codes were entered. That is why the policies of Section 3.5 are keyed on the 8-digit block and use only those two quantities.</w:t>
       </w:r>
     </w:p>
     <w:bookmarkEnd w:id="24"/>
@@ -474,7 +474,7 @@
         <w:pStyle w:val="BodyText"/>
       </w:pPr>
       <w:r>
-        <w:t xml:space="preserve">Taken together, these works establish that attacks concentrate on destination prefixes and avoid converting, that counts alone misfire on campaigns, and that some campaigns now enter codes to pass conversion rules. None of them compares counting with outcome testing on the same traffic, fixes its setting before the evaluation runs, or charges a policy with the registrations it costs the users of a shared block. Those are the questions of Sections 6.5–6.7, and the attackers that enter codes, fake receipts and build trust (Table 4) are modeled on the counter-move above.</w:t>
+        <w:t xml:space="preserve">Taken together, these works establish that attacks concentrate on destination prefixes and avoid converting, that counts alone misfire on campaigns, and that some campaigns now enter codes to pass conversion rules. None of them compares counting with outcome testing on the same traffic, fixes its setting before the evaluation runs, or charges a policy with the registrations it costs the users of a shared block. Those are the questions of Sections 5.5–5.7, and the attackers that enter codes, fake receipts and build trust (Table 4) are modeled on the counter-move above.</w:t>
       </w:r>
     </w:p>
     <w:bookmarkEnd w:id="25"/>
@@ -554,7 +554,7 @@
         <w:pStyle w:val="FirstParagraph"/>
       </w:pPr>
       <w:r>
-        <w:t xml:space="preserve">Our block tests are Wald’s sequential tests (Wald, 1945) run as Page’s cumulative sums (Page, 1954), with a floor parameter that selects between the two (Section 4.3). Quickest change detection minimizes detection delay under false-alarm constraints (Veeravalli and Banerjee, 2012), and a CUSUM’s parameters follow from the error rates it must meet (NIST/SEMATECH, 2026); windowed statistics and the time-uniform confidence sequences of Howard et al. (2021), which stay valid at any stopping time, were not evaluated, so</w:t>
+        <w:t xml:space="preserve">Our block tests are Wald’s sequential tests (Wald, 1945) run as Page’s cumulative sums (Page, 1954), with a floor parameter that selects between the two (Section 3.5). Quickest change detection minimizes detection delay under false-alarm constraints (Veeravalli and Banerjee, 2012), and a CUSUM’s parameters follow from the error rates it must meet (NIST/SEMATECH, 2026); windowed statistics and the time-uniform confidence sequences of Howard et al. (2021), which stay valid at any stopping time, were not evaluated, so</w:t>
       </w:r>
       <w:r>
         <w:t xml:space="preserve"> </w:t>
@@ -1487,7 +1487,7 @@
     </w:tbl>
     <w:bookmarkEnd w:id="29"/>
     <w:bookmarkEnd w:id="30"/>
-    <w:bookmarkStart w:id="33" w:name="baseline-and-threat-model"/>
+    <w:bookmarkStart w:id="40" w:name="threat-model-and-design"/>
     <w:p>
       <w:pPr>
         <w:pStyle w:val="Heading1"/>
@@ -1502,10 +1502,18 @@
         <w:tab/>
       </w:r>
       <w:r>
-        <w:t xml:space="preserve">Baseline and threat model</w:t>
+        <w:t xml:space="preserve">Threat model and design</w:t>
       </w:r>
     </w:p>
-    <w:bookmarkStart w:id="31" w:name="the-v1-baseline"/>
+    <w:p>
+      <w:pPr>
+        <w:pStyle w:val="FirstParagraph"/>
+      </w:pPr>
+      <w:r>
+        <w:t xml:space="preserve">This section describes the baseline that the design replaces, the attacker it must resist, the twelve steps and two destination policies of the design, and the estimates of leakage that follow from its rules.</w:t>
+      </w:r>
+    </w:p>
+    <w:bookmarkStart w:id="31" w:name="the-v1-baseline-and-its-gaps"/>
     <w:p>
       <w:pPr>
         <w:pStyle w:val="Heading2"/>
@@ -1520,7 +1528,7 @@
         <w:tab/>
       </w:r>
       <w:r>
-        <w:t xml:space="preserve">The v1 baseline</w:t>
+        <w:t xml:space="preserve">The v1 baseline and its gaps</w:t>
       </w:r>
     </w:p>
     <w:p>
@@ -2125,23 +2133,22 @@
       </w:r>
     </w:p>
     <w:bookmarkEnd w:id="32"/>
-    <w:bookmarkEnd w:id="33"/>
-    <w:bookmarkStart w:id="41" w:name="design"/>
+    <w:bookmarkStart w:id="33" w:name="the-pipeline-and-the-risk-score"/>
     <w:p>
       <w:pPr>
-        <w:pStyle w:val="Heading1"/>
+        <w:pStyle w:val="Heading2"/>
       </w:pPr>
       <w:r>
         <w:rPr>
           <w:rStyle w:val="SectionNumber"/>
         </w:rPr>
-        <w:t xml:space="preserve">4</w:t>
+        <w:t xml:space="preserve">3.3</w:t>
       </w:r>
       <w:r>
         <w:tab/>
       </w:r>
       <w:r>
-        <w:t xml:space="preserve">Design</w:t>
+        <w:t xml:space="preserve">The pipeline and the risk score</w:t>
       </w:r>
     </w:p>
     <w:p>
@@ -2149,33 +2156,7 @@
         <w:pStyle w:val="FirstParagraph"/>
       </w:pPr>
       <w:r>
-        <w:t xml:space="preserve">No message is paid for before every check passes, and cheap checks run first. Trust comes from evidence the client cannot forge, an attestation, a server-signed session, and the fate of earlier codes, though such evidence can be manufactured (Section 6.8).</w:t>
-      </w:r>
-    </w:p>
-    <w:bookmarkStart w:id="34" w:name="the-pipeline-and-the-risk-score"/>
-    <w:p>
-      <w:pPr>
-        <w:pStyle w:val="Heading2"/>
-      </w:pPr>
-      <w:r>
-        <w:rPr>
-          <w:rStyle w:val="SectionNumber"/>
-        </w:rPr>
-        <w:t xml:space="preserve">4.1</w:t>
-      </w:r>
-      <w:r>
-        <w:tab/>
-      </w:r>
-      <w:r>
-        <w:t xml:space="preserve">The pipeline and the risk score</w:t>
-      </w:r>
-    </w:p>
-    <w:p>
-      <w:pPr>
-        <w:pStyle w:val="FirstParagraph"/>
-      </w:pPr>
-      <w:r>
-        <w:t xml:space="preserve">A request passes the steps of Table 3, which lists in brackets the gaps of Table 2 each step addresses (FB: the feedback loop), until it is refused. Step 0 takes the platform only from a valid App Attest or Play Integrity result. Each limit and reservation is one atomic Redis operation, but the enclosing steps are not one transaction: on the normal path, a refused request returns its per-number claims and counter slot, and the hourly budget is reserved only for a message about to be enqueued, a reservation rather than a completed dispatch; a crash between them can leak reservations (Section 5). Address limits and source caps count requests, except that a request Step 11 challenges returns its source-cap count. Every outcome after Step 0, except the challenge, returns one HTTP 200 body after at least 400 ms, a floor that cannot hide longer work.</w:t>
+        <w:t xml:space="preserve">No message is paid for before every check passes, and cheap checks run first. Trust comes from evidence the client cannot forge, an attestation, a server-signed session, and the fate of earlier codes, though such evidence can be manufactured (Section 5.8). A request passes the steps of Table 3, which lists in brackets the gaps of Table 2 each step addresses (FB: the feedback loop), until it is refused. Step 0 takes the platform only from a valid App Attest or Play Integrity result. Each limit and reservation is one atomic Redis operation, but the enclosing steps are not one transaction: on the normal path, a refused request returns its per-number claims and counter slot, and the hourly budget is reserved only for a message about to be enqueued, a reservation rather than a completed dispatch; a crash between them can leak reservations (Section 4). Address limits and source caps count requests, except that a request Step 11 challenges returns its source-cap count. Every outcome after Step 0, except the challenge, returns one HTTP 200 body after at least 400 ms, a floor that cannot hide longer work.</w:t>
       </w:r>
     </w:p>
     <w:p>
@@ -3264,8 +3245,8 @@
         <w:t xml:space="preserve">.</w:t>
       </w:r>
     </w:p>
-    <w:bookmarkEnd w:id="34"/>
-    <w:bookmarkStart w:id="35" w:name="the-feedback-loop"/>
+    <w:bookmarkEnd w:id="33"/>
+    <w:bookmarkStart w:id="34" w:name="the-feedback-loop"/>
     <w:p>
       <w:pPr>
         <w:pStyle w:val="Heading2"/>
@@ -3274,7 +3255,7 @@
         <w:rPr>
           <w:rStyle w:val="SectionNumber"/>
         </w:rPr>
-        <w:t xml:space="preserve">4.2</w:t>
+        <w:t xml:space="preserve">3.4</w:t>
       </w:r>
       <w:r>
         <w:tab/>
@@ -3339,8 +3320,8 @@
         <w:t xml:space="preserve">without a receipt in 60 s or with a failed receipt; only the first two count toward reputation. A positive receipt after a negative one reopens the send; a late verification reclassifies it, but an issued verdict stands. Each transition records its effects and its time in the same compare-and-set, and a recovery sweep completes the work of a dead process; each effect type applies at most once, and exactly once if the sweep runs within 20 minutes. Reputation counts land in the transition’s hour, and a block keeps its latest outage failure time; however, a block’s statistic accumulates in processing order, and a verdict is dated at the event that completes the crossing; thus, a late event can backdate a verdict that contains later evidence, moving its expiry and the next test’s start (by 10 min in one diagnostic). Simulated runs apply events in time order, but concurrent live instances may not, because a transition is committed before its effects apply; thus, the same dependence holds live unless a block’s effects are serialized.</w:t>
       </w:r>
     </w:p>
-    <w:bookmarkEnd w:id="35"/>
-    <w:bookmarkStart w:id="38" w:name="destination-policies"/>
+    <w:bookmarkEnd w:id="34"/>
+    <w:bookmarkStart w:id="37" w:name="destination-policies"/>
     <w:p>
       <w:pPr>
         <w:pStyle w:val="Heading2"/>
@@ -3349,7 +3330,7 @@
         <w:rPr>
           <w:rStyle w:val="SectionNumber"/>
         </w:rPr>
-        <w:t xml:space="preserve">4.3</w:t>
+        <w:t xml:space="preserve">3.5</w:t>
       </w:r>
       <w:r>
         <w:tab/>
@@ -3366,7 +3347,7 @@
         <w:t xml:space="preserve">A pumper is confined to its partner’s ranges but can rotate numbers and blocks within them. Destination policies are keyed on the 8-digit block (10 000 numbers); therefore, protection weakens as a pumper spreads.</w:t>
       </w:r>
     </w:p>
-    <w:bookmarkStart w:id="36" w:name="sequential-tests"/>
+    <w:bookmarkStart w:id="35" w:name="sequential-tests"/>
     <w:p>
       <w:pPr>
         <w:pStyle w:val="Heading3"/>
@@ -3375,7 +3356,7 @@
         <w:rPr>
           <w:rStyle w:val="SectionNumber"/>
         </w:rPr>
-        <w:t xml:space="preserve">4.3.1</w:t>
+        <w:t xml:space="preserve">3.5.1</w:t>
       </w:r>
       <w:r>
         <w:tab/>
@@ -3885,8 +3866,8 @@
         <w:t xml:space="preserve">. A first verdict makes the block’s first-time clients pass a challenge for an hour; a second within the hour moves them off SMS, refusing those without another channel.</w:t>
       </w:r>
     </w:p>
-    <w:bookmarkEnd w:id="36"/>
-    <w:bookmarkStart w:id="37" w:name="counters"/>
+    <w:bookmarkEnd w:id="35"/>
+    <w:bookmarkStart w:id="36" w:name="counters"/>
     <w:p>
       <w:pPr>
         <w:pStyle w:val="Heading3"/>
@@ -3895,7 +3876,7 @@
         <w:rPr>
           <w:rStyle w:val="SectionNumber"/>
         </w:rPr>
-        <w:t xml:space="preserve">4.3.2</w:t>
+        <w:t xml:space="preserve">3.5.2</w:t>
       </w:r>
       <w:r>
         <w:tab/>
@@ -3912,9 +3893,9 @@
         <w:t xml:space="preserve">A counter limits the number of SMS sent per block in a daily or short refilling window. Step 11 reserves a slot and decides the stage in one atomic operation when an SMS is about to be sent, so concurrent requests cannot skip the challenge. Past the limit, a graded counter challenges first-time clients, and past twice the limit moves them off SMS; a refusing counter refuses. Clients with verified history are exempt from both policies; therefore, a code entered on a pumper’s number can buy that number an exemption. A token bucket of the same rate (burst 4 or 12; its challenge-tier bucket refills independently, unlike RFC 2697’s (Heinanen and Guerin, 1999)) and the counter combined with the tests were also explored.</w:t>
       </w:r>
     </w:p>
+    <w:bookmarkEnd w:id="36"/>
     <w:bookmarkEnd w:id="37"/>
-    <w:bookmarkEnd w:id="38"/>
-    <w:bookmarkStart w:id="39" w:name="capacity-controls"/>
+    <w:bookmarkStart w:id="38" w:name="capacity-controls"/>
     <w:p>
       <w:pPr>
         <w:pStyle w:val="Heading2"/>
@@ -3923,7 +3904,7 @@
         <w:rPr>
           <w:rStyle w:val="SectionNumber"/>
         </w:rPr>
-        <w:t xml:space="preserve">4.4</w:t>
+        <w:t xml:space="preserve">3.6</w:t>
       </w:r>
       <w:r>
         <w:tab/>
@@ -3940,8 +3921,8 @@
         <w:t xml:space="preserve">Step 9 multiplies its caps by 0.25 to 1.5 according to a baseline job comparing each key with its expected rate, learned from the pipeline’s hourly counters; without history, the static cap stands. Verified history avoids adaptive reduction, not the static caps or the budget, which bounds SMS count and spend, not vendor or fallback costs.</w:t>
       </w:r>
     </w:p>
-    <w:bookmarkEnd w:id="39"/>
-    <w:bookmarkStart w:id="40" w:name="Xf0c979229eb29cff3cf30892b5e34effc1bec32"/>
+    <w:bookmarkEnd w:id="38"/>
+    <w:bookmarkStart w:id="39" w:name="Xf0c979229eb29cff3cf30892b5e34effc1bec32"/>
     <w:p>
       <w:pPr>
         <w:pStyle w:val="Heading2"/>
@@ -3950,7 +3931,7 @@
         <w:rPr>
           <w:rStyle w:val="SectionNumber"/>
         </w:rPr>
-        <w:t xml:space="preserve">4.5</w:t>
+        <w:t xml:space="preserve">3.7</w:t>
       </w:r>
       <w:r>
         <w:tab/>
@@ -5209,9 +5190,9 @@
         <w:t xml:space="preserve">. This is not a challenge rate: exempt clients take slots without challenge, and challenge failures, the second tier and earlier gates are ignored. The estimates use only the rules, configuration, and attack rate; what an excess send costs a user needs the simulation.</w:t>
       </w:r>
     </w:p>
+    <w:bookmarkEnd w:id="39"/>
     <w:bookmarkEnd w:id="40"/>
-    <w:bookmarkEnd w:id="41"/>
-    <w:bookmarkStart w:id="46" w:name="methodology"/>
+    <w:bookmarkStart w:id="45" w:name="methodology"/>
     <w:p>
       <w:pPr>
         <w:pStyle w:val="Heading1"/>
@@ -5220,7 +5201,7 @@
         <w:rPr>
           <w:rStyle w:val="SectionNumber"/>
         </w:rPr>
-        <w:t xml:space="preserve">5</w:t>
+        <w:t xml:space="preserve">4</w:t>
       </w:r>
       <w:r>
         <w:tab/>
@@ -5229,7 +5210,7 @@
         <w:t xml:space="preserve">Methodology</w:t>
       </w:r>
     </w:p>
-    <w:bookmarkStart w:id="42" w:name="implementation"/>
+    <w:bookmarkStart w:id="41" w:name="implementation"/>
     <w:p>
       <w:pPr>
         <w:pStyle w:val="Heading2"/>
@@ -5238,7 +5219,7 @@
         <w:rPr>
           <w:rStyle w:val="SectionNumber"/>
         </w:rPr>
-        <w:t xml:space="preserve">5.1</w:t>
+        <w:t xml:space="preserve">4.1</w:t>
       </w:r>
       <w:r>
         <w:tab/>
@@ -5267,8 +5248,8 @@
         <w:t xml:space="preserve">, 18 tested specific interleavings of two instances, not all. Step 11 was still not one transaction: a crash after its reservations leaked reserved slots or resolved the send as undelivered. The implementation was a research prototype.</w:t>
       </w:r>
     </w:p>
-    <w:bookmarkEnd w:id="42"/>
-    <w:bookmarkStart w:id="43" w:name="simulation"/>
+    <w:bookmarkEnd w:id="41"/>
+    <w:bookmarkStart w:id="42" w:name="simulation"/>
     <w:p>
       <w:pPr>
         <w:pStyle w:val="Heading2"/>
@@ -5277,7 +5258,7 @@
         <w:rPr>
           <w:rStyle w:val="SectionNumber"/>
         </w:rPr>
-        <w:t xml:space="preserve">5.2</w:t>
+        <w:t xml:space="preserve">4.2</w:t>
       </w:r>
       <w:r>
         <w:tab/>
@@ -5314,8 +5295,8 @@
         <w:t xml:space="preserve">). Attackers draw pool size, rate, and CAPTCHA class per seed, which explains 92% [80, 98] of the variance of the farm’s leakage in a nested design (ten configurations, three seeds each). Brackets in the text and tables, and bars and bands in the figures, are 95% percentile-bootstrap intervals over seeds, paired per seed for differences; they describe variation under this generator, not uncertainty about real traffic.</w:t>
       </w:r>
     </w:p>
-    <w:bookmarkEnd w:id="43"/>
-    <w:bookmarkStart w:id="44" w:name="two-protocols-and-their-chronology"/>
+    <w:bookmarkEnd w:id="42"/>
+    <w:bookmarkStart w:id="43" w:name="two-protocols-and-their-chronology"/>
     <w:p>
       <w:pPr>
         <w:pStyle w:val="Heading2"/>
@@ -5324,7 +5305,7 @@
         <w:rPr>
           <w:rStyle w:val="SectionNumber"/>
         </w:rPr>
-        <w:t xml:space="preserve">5.3</w:t>
+        <w:t xml:space="preserve">4.3</w:t>
       </w:r>
       <w:r>
         <w:tab/>
@@ -5389,8 +5370,8 @@
         <w:t xml:space="preserve">300 under both protocols (artifact change report).</w:t>
       </w:r>
     </w:p>
-    <w:bookmarkEnd w:id="44"/>
-    <w:bookmarkStart w:id="45" w:name="designs-and-metrics"/>
+    <w:bookmarkEnd w:id="43"/>
+    <w:bookmarkStart w:id="44" w:name="designs-and-metrics"/>
     <w:p>
       <w:pPr>
         <w:pStyle w:val="Heading2"/>
@@ -5399,7 +5380,7 @@
         <w:rPr>
           <w:rStyle w:val="SectionNumber"/>
         </w:rPr>
-        <w:t xml:space="preserve">5.4</w:t>
+        <w:t xml:space="preserve">4.4</w:t>
       </w:r>
       <w:r>
         <w:tab/>
@@ -6095,9 +6076,9 @@
         </w:tc>
       </w:tr>
     </w:tbl>
+    <w:bookmarkEnd w:id="44"/>
     <w:bookmarkEnd w:id="45"/>
-    <w:bookmarkEnd w:id="46"/>
-    <w:bookmarkStart w:id="67" w:name="results"/>
+    <w:bookmarkStart w:id="66" w:name="results"/>
     <w:p>
       <w:pPr>
         <w:pStyle w:val="Heading1"/>
@@ -6106,7 +6087,7 @@
         <w:rPr>
           <w:rStyle w:val="SectionNumber"/>
         </w:rPr>
-        <w:t xml:space="preserve">6</w:t>
+        <w:t xml:space="preserve">5</w:t>
       </w:r>
       <w:r>
         <w:tab/>
@@ -6115,7 +6096,7 @@
         <w:t xml:space="preserve">Results</w:t>
       </w:r>
     </w:p>
-    <w:bookmarkStart w:id="47" w:name="rq1-what-is-contained-and-at-what-cost"/>
+    <w:bookmarkStart w:id="46" w:name="rq1-what-is-contained-and-at-what-cost"/>
     <w:p>
       <w:pPr>
         <w:pStyle w:val="Heading2"/>
@@ -6124,7 +6105,7 @@
         <w:rPr>
           <w:rStyle w:val="SectionNumber"/>
         </w:rPr>
-        <w:t xml:space="preserve">6.1</w:t>
+        <w:t xml:space="preserve">5.1</w:t>
       </w:r>
       <w:r>
         <w:tab/>
@@ -7582,8 +7563,8 @@
         <w:t xml:space="preserve">The farm leaks 99.5% with caps lifted under every design; v2’s adaptive cap holds it to 229 [215, 244] messages, 46%, by refusing 54% [47, 60] of first-time users, so 45.5% complete instead of 76.4% under v1: rationing (claim C5 held in 36 of 36 cells).</w:t>
       </w:r>
     </w:p>
-    <w:bookmarkEnd w:id="47"/>
-    <w:bookmarkStart w:id="48" w:name="rq2-conditional-effects-of-each-layer"/>
+    <w:bookmarkEnd w:id="46"/>
+    <w:bookmarkStart w:id="47" w:name="rq2-conditional-effects-of-each-layer"/>
     <w:p>
       <w:pPr>
         <w:pStyle w:val="Heading2"/>
@@ -7592,7 +7573,7 @@
         <w:rPr>
           <w:rStyle w:val="SectionNumber"/>
         </w:rPr>
-        <w:t xml:space="preserve">6.2</w:t>
+        <w:t xml:space="preserve">5.2</w:t>
       </w:r>
       <w:r>
         <w:tab/>
@@ -7660,8 +7641,8 @@
         <w:t xml:space="preserve">]).</w:t>
       </w:r>
     </w:p>
-    <w:bookmarkEnd w:id="48"/>
-    <w:bookmarkStart w:id="49" w:name="rq3-where-reputation-stops-separating"/>
+    <w:bookmarkEnd w:id="47"/>
+    <w:bookmarkStart w:id="48" w:name="rq3-where-reputation-stops-separating"/>
     <w:p>
       <w:pPr>
         <w:pStyle w:val="Heading2"/>
@@ -7670,7 +7651,7 @@
         <w:rPr>
           <w:rStyle w:val="SectionNumber"/>
         </w:rPr>
-        <w:t xml:space="preserve">6.3</w:t>
+        <w:t xml:space="preserve">5.3</w:t>
       </w:r>
       <w:r>
         <w:tab/>
@@ -7687,8 +7668,8 @@
         <w:t xml:space="preserve">A farmed-CAPTCHA attacker uses an address and fingerprint once and shares its country, prefix, and residential ASN with every legitimate user; thus, its failures penalize everyone: over an hour with caps lifted (five seeds), up to twice the legitimate rate, 99 to 100% of it leaks, since a shared key stays above 0.3 conversion until failures outnumber legitimate sends about 1.7 to one. At ten times, 70% leaks while 17% of legitimate users are challenged and 3.2% refused (claim C2, at least 90% leaked with caps lifted, held in 34 of 36 cells). No single score change separates better: a fresh-fingerprint weight of 40 stops it only by challenging 47% of legitimate users. In the settings run, reputation separated an attacker only on keys its sends dominated (Douceur, 2002).</w:t>
       </w:r>
     </w:p>
-    <w:bookmarkEnd w:id="49"/>
-    <w:bookmarkStart w:id="50" w:name="Xc07daa08c7787c54feae400d5f00a63594cbc0c"/>
+    <w:bookmarkEnd w:id="48"/>
+    <w:bookmarkStart w:id="49" w:name="Xc07daa08c7787c54feae400d5f00a63594cbc0c"/>
     <w:p>
       <w:pPr>
         <w:pStyle w:val="Heading2"/>
@@ -7697,7 +7678,7 @@
         <w:rPr>
           <w:rStyle w:val="SectionNumber"/>
         </w:rPr>
-        <w:t xml:space="preserve">6.4</w:t>
+        <w:t xml:space="preserve">5.4</w:t>
       </w:r>
       <w:r>
         <w:tab/>
@@ -7714,8 +7695,8 @@
         <w:t xml:space="preserve">When separation fails, the cap is the lever: over ten seeds, the default lets 47% of the farm’s requests through and refuses 41% of all legitimate users, the tightest setting 20% and 64%. Both assume an oracle job that is told the legitimate rate and runs every minute; running every five minutes or hourly, it lets 75%–96% through. Learning the rate from the pipeline’s counters, the deployed job leaks 193 [161, 229] messages with a clean three-week profile, 340 [239, 441] more on a cold start, 106 [62, 151] more with a stale profile, and 45 [10, 77] more with a poisoned one.</w:t>
       </w:r>
     </w:p>
-    <w:bookmarkEnd w:id="50"/>
-    <w:bookmarkStart w:id="51" w:name="pumping-against-the-sequential-tests"/>
+    <w:bookmarkEnd w:id="49"/>
+    <w:bookmarkStart w:id="50" w:name="pumping-against-the-sequential-tests"/>
     <w:p>
       <w:pPr>
         <w:pStyle w:val="Heading2"/>
@@ -7724,7 +7705,7 @@
         <w:rPr>
           <w:rStyle w:val="SectionNumber"/>
         </w:rPr>
-        <w:t xml:space="preserve">6.5</w:t>
+        <w:t xml:space="preserve">5.5</w:t>
       </w:r>
       <w:r>
         <w:tab/>
@@ -8717,8 +8698,8 @@
         <w:t xml:space="preserve">Across 18 spread configurations, leakage follows the blocks touched: with 30 blocks, five to seven runs in ten are still contained. Unsaturated, Equation (2) errs by 1.6 to 7.9 messages per run (1%–13%, ten configurations); saturated, it overstates by up to 91.</w:t>
       </w:r>
     </w:p>
-    <w:bookmarkEnd w:id="51"/>
-    <w:bookmarkStart w:id="64" w:name="Xc3b3a0ae0d7ddd12dca67a47167dca0c845034c"/>
+    <w:bookmarkEnd w:id="50"/>
+    <w:bookmarkStart w:id="63" w:name="Xc3b3a0ae0d7ddd12dca67a47167dca0c845034c"/>
     <w:p>
       <w:pPr>
         <w:pStyle w:val="Heading2"/>
@@ -8727,7 +8708,7 @@
         <w:rPr>
           <w:rStyle w:val="SectionNumber"/>
         </w:rPr>
-        <w:t xml:space="preserve">6.6</w:t>
+        <w:t xml:space="preserve">5.6</w:t>
       </w:r>
       <w:r>
         <w:tab/>
@@ -9910,7 +9891,7 @@
         </w:tc>
       </w:tr>
     </w:tbl>
-    <w:bookmarkStart w:id="58" w:name="at-a-benign-service-target"/>
+    <w:bookmarkStart w:id="57" w:name="at-a-benign-service-target"/>
     <w:p>
       <w:pPr>
         <w:pStyle w:val="Heading3"/>
@@ -9919,7 +9900,7 @@
         <w:rPr>
           <w:rStyle w:val="SectionNumber"/>
         </w:rPr>
-        <w:t xml:space="preserve">6.6.1</w:t>
+        <w:t xml:space="preserve">5.6.1</w:t>
       </w:r>
       <w:r>
         <w:tab/>
@@ -9957,18 +9938,18 @@
           <wp:inline>
             <wp:extent cx="5334000" cy="3597348"/>
             <wp:effectExtent b="0" l="0" r="0" t="0"/>
-            <wp:docPr descr="" title="" id="53" name="Picture"/>
+            <wp:docPr descr="" title="" id="52" name="Picture"/>
             <a:graphic>
               <a:graphicData uri="http://schemas.openxmlformats.org/drawingml/2006/picture">
                 <pic:pic>
                   <pic:nvPicPr>
-                    <pic:cNvPr descr="figures/fig6_matched_a.png" id="54" name="Picture"/>
+                    <pic:cNvPr descr="figures/fig6_matched_a.png" id="53" name="Picture"/>
                     <pic:cNvPicPr>
                       <a:picLocks noChangeArrowheads="1" noChangeAspect="1"/>
                     </pic:cNvPicPr>
                   </pic:nvPicPr>
                   <pic:blipFill>
-                    <a:blip r:embed="rId52"/>
+                    <a:blip r:embed="rId51"/>
                     <a:stretch>
                       <a:fillRect/>
                     </a:stretch>
@@ -10022,18 +10003,18 @@
           <wp:inline>
             <wp:extent cx="5334000" cy="4341627"/>
             <wp:effectExtent b="0" l="0" r="0" t="0"/>
-            <wp:docPr descr="" title="" id="56" name="Picture"/>
+            <wp:docPr descr="" title="" id="55" name="Picture"/>
             <a:graphic>
               <a:graphicData uri="http://schemas.openxmlformats.org/drawingml/2006/picture">
                 <pic:pic>
                   <pic:nvPicPr>
-                    <pic:cNvPr descr="figures/fig6_matched_b.png" id="57" name="Picture"/>
+                    <pic:cNvPr descr="figures/fig6_matched_b.png" id="56" name="Picture"/>
                     <pic:cNvPicPr>
                       <a:picLocks noChangeArrowheads="1" noChangeAspect="1"/>
                     </pic:cNvPicPr>
                   </pic:nvPicPr>
                   <pic:blipFill>
-                    <a:blip r:embed="rId55"/>
+                    <a:blip r:embed="rId54"/>
                     <a:stretch>
                       <a:fillRect/>
                     </a:stretch>
@@ -10708,8 +10689,8 @@
         </w:tc>
       </w:tr>
     </w:tbl>
-    <w:bookmarkEnd w:id="58"/>
-    <w:bookmarkStart w:id="59" w:name="under-a-second-protocol"/>
+    <w:bookmarkEnd w:id="57"/>
+    <w:bookmarkStart w:id="58" w:name="under-a-second-protocol"/>
     <w:p>
       <w:pPr>
         <w:pStyle w:val="Heading3"/>
@@ -10718,7 +10699,7 @@
         <w:rPr>
           <w:rStyle w:val="SectionNumber"/>
         </w:rPr>
-        <w:t xml:space="preserve">6.6.2</w:t>
+        <w:t xml:space="preserve">5.6.2</w:t>
       </w:r>
       <w:r>
         <w:tab/>
@@ -13058,8 +13039,8 @@
         <w:t xml:space="preserve">0. A token bucket with a burst of 4 spared the poisoner’s users only by letting almost everything through; with two untuned settings, neither limiter dominated, and we ranked only the implemented policies. Returning users, all simulated with verified history, lost nothing.</w:t>
       </w:r>
     </w:p>
-    <w:bookmarkEnd w:id="59"/>
-    <w:bookmarkStart w:id="63" w:name="X30d161eb055c3bdd60ae2ef3ca5d49f7d5c43cc"/>
+    <w:bookmarkEnd w:id="58"/>
+    <w:bookmarkStart w:id="62" w:name="X30d161eb055c3bdd60ae2ef3ca5d49f7d5c43cc"/>
     <w:p>
       <w:pPr>
         <w:pStyle w:val="Heading3"/>
@@ -13068,7 +13049,7 @@
         <w:rPr>
           <w:rStyle w:val="SectionNumber"/>
         </w:rPr>
-        <w:t xml:space="preserve">6.6.3</w:t>
+        <w:t xml:space="preserve">5.6.3</w:t>
       </w:r>
       <w:r>
         <w:tab/>
@@ -13125,18 +13106,18 @@
           <wp:inline>
             <wp:extent cx="5334000" cy="6176210"/>
             <wp:effectExtent b="0" l="0" r="0" t="0"/>
-            <wp:docPr descr="" title="" id="61" name="Picture"/>
+            <wp:docPr descr="" title="" id="60" name="Picture"/>
             <a:graphic>
               <a:graphicData uri="http://schemas.openxmlformats.org/drawingml/2006/picture">
                 <pic:pic>
                   <pic:nvPicPr>
-                    <pic:cNvPr descr="figures/fig7_counter_boundary.png" id="62" name="Picture"/>
+                    <pic:cNvPr descr="figures/fig7_counter_boundary.png" id="61" name="Picture"/>
                     <pic:cNvPicPr>
                       <a:picLocks noChangeArrowheads="1" noChangeAspect="1"/>
                     </pic:cNvPicPr>
                   </pic:nvPicPr>
                   <pic:blipFill>
-                    <a:blip r:embed="rId60"/>
+                    <a:blip r:embed="rId59"/>
                     <a:stretch>
                       <a:fillRect/>
                     </a:stretch>
@@ -13189,9 +13170,9 @@
         <w:t xml:space="preserve">Against adaptive attackers (E3), the counter held the threshold-aware carrier, receipt faker, and concentrated trust builder to 24 to 36 messages (502 to 665 under the default), but not trust builders on random numbers (577, as under the default); over 360 minutes, the human-like carrier gained 81 messages an hour under the counter, and 753 under the default.</w:t>
       </w:r>
     </w:p>
+    <w:bookmarkEnd w:id="62"/>
     <w:bookmarkEnd w:id="63"/>
-    <w:bookmarkEnd w:id="64"/>
-    <w:bookmarkStart w:id="65" w:name="X1b098a1626e628988816138c90f067235f9035a"/>
+    <w:bookmarkStart w:id="64" w:name="X1b098a1626e628988816138c90f067235f9035a"/>
     <w:p>
       <w:pPr>
         <w:pStyle w:val="Heading2"/>
@@ -13200,7 +13181,7 @@
         <w:rPr>
           <w:rStyle w:val="SectionNumber"/>
         </w:rPr>
-        <w:t xml:space="preserve">6.7</w:t>
+        <w:t xml:space="preserve">5.7</w:t>
       </w:r>
       <w:r>
         <w:tab/>
@@ -13225,8 +13206,8 @@
         <w:t xml:space="preserve">A poisoner flooding for 20 min the 20 blocks legitimate users concentrate on (caps lifted, ten seeds) raises 16 verdict events meeting 98 legitimate requests, 33 never completing; against observe-only operation on the same trace, enforcement costs 12.7 [4.6, 22.9] completions, 3.1% of users (6.3% without WhatsApp; 23.9% with a 24-hour denylist). One that stops after ten minutes leaves verdicts meeting 406.5 requests afterwards, an attributable loss of 46.2 [16.9, 79.8]. Grading limits the harm; it caps it neither at the challenge nor at the attack’s duration.</w:t>
       </w:r>
     </w:p>
-    <w:bookmarkEnd w:id="65"/>
-    <w:bookmarkStart w:id="66" w:name="X40c2940f2aaabd24aefaeec784f20c9ca681264"/>
+    <w:bookmarkEnd w:id="64"/>
+    <w:bookmarkStart w:id="65" w:name="X40c2940f2aaabd24aefaeec784f20c9ca681264"/>
     <w:p>
       <w:pPr>
         <w:pStyle w:val="Heading2"/>
@@ -13235,7 +13216,7 @@
         <w:rPr>
           <w:rStyle w:val="SectionNumber"/>
         </w:rPr>
-        <w:t xml:space="preserve">6.8</w:t>
+        <w:t xml:space="preserve">5.8</w:t>
       </w:r>
       <w:r>
         <w:tab/>
@@ -13288,9 +13269,9 @@
         <w:t xml:space="preserve">). Under an adversarial mixture, 81% of sends overran the floor, and response-time thresholds separated sends from refusals with 88% balanced accuracy on the fitted run and, fitted on a new run, 95 to 99.9% on two others: a separation on that machine, not a deployment accuracy.</w:t>
       </w:r>
     </w:p>
+    <w:bookmarkEnd w:id="65"/>
     <w:bookmarkEnd w:id="66"/>
-    <w:bookmarkEnd w:id="67"/>
-    <w:bookmarkStart w:id="68" w:name="discussion"/>
+    <w:bookmarkStart w:id="67" w:name="discussion"/>
     <w:p>
       <w:pPr>
         <w:pStyle w:val="Heading1"/>
@@ -13299,7 +13280,7 @@
         <w:rPr>
           <w:rStyle w:val="SectionNumber"/>
         </w:rPr>
-        <w:t xml:space="preserve">7</w:t>
+        <w:t xml:space="preserve">6</w:t>
       </w:r>
       <w:r>
         <w:tab/>
@@ -13316,8 +13297,8 @@
         <w:t xml:space="preserve">In the scripted workloads, carriers that verify with human-like delay, fake receipts, or know the thresholds defeated our outcome tests but not a short-window counter. Within an hour of a verdict, the counter’s allowance, unlike the tests’, grows with the windows an attack spans; over longer campaigns, verdicts expire and the tests leak again. Equation (5) summarizes this for pumpers that solve no challenge and hold no exemption. Its inputs are in an operator’s logs; the cost of an excess send, competition under attack, and exemption abuse come only from the simulation. The counter and tests together, with a quota set from each block’s traffic, is a hypothesis for real traffic, not a recommendation.</w:t>
       </w:r>
     </w:p>
-    <w:bookmarkEnd w:id="68"/>
-    <w:bookmarkStart w:id="69" w:name="limitations"/>
+    <w:bookmarkEnd w:id="67"/>
+    <w:bookmarkStart w:id="68" w:name="limitations"/>
     <w:p>
       <w:pPr>
         <w:pStyle w:val="Heading1"/>
@@ -13326,7 +13307,7 @@
         <w:rPr>
           <w:rStyle w:val="SectionNumber"/>
         </w:rPr>
-        <w:t xml:space="preserve">8</w:t>
+        <w:t xml:space="preserve">7</w:t>
       </w:r>
       <w:r>
         <w:tab/>
@@ -13343,8 +13324,8 @@
         <w:t xml:space="preserve">Everything was simulated, and calibration was assumed. Both protocols were written by the author for the author’s generator, the second knowing which counters had won. Some results follow from the generator (a perfect premium list, a datacenter attacker that declines challenges, returning users who always present verified history), and selection used an unweighted sum of four scripted pumpers’ leakage and a mean service target met on tuning seeds, which guarantees no service level elsewhere. Close rankings rest on ten or fewer seeds, and costs that round to zero are not shown equivalent. Per-client quotas within a block, carrier spend ceilings, bounded exemptions, tuned token buckets, and other sequential statistics lie outside the evaluated policies. Vendor adapters are untested live, and the timing result holds only for the observer tested. Destination policies challenge people for what strangers sharing their block did, and deployment under the GDPR or Saudi Arabia’s PDPL needs a lawful basis and a route for refused users.</w:t>
       </w:r>
     </w:p>
-    <w:bookmarkEnd w:id="69"/>
-    <w:bookmarkStart w:id="70" w:name="conclusions-and-future-work"/>
+    <w:bookmarkEnd w:id="68"/>
+    <w:bookmarkStart w:id="69" w:name="conclusions-and-future-work"/>
     <w:p>
       <w:pPr>
         <w:pStyle w:val="Heading1"/>
@@ -13353,7 +13334,7 @@
         <w:rPr>
           <w:rStyle w:val="SectionNumber"/>
         </w:rPr>
-        <w:t xml:space="preserve">9</w:t>
+        <w:t xml:space="preserve">8</w:t>
       </w:r>
       <w:r>
         <w:tab/>
@@ -13394,8 +13375,8 @@
         <w:t xml:space="preserve">Replaying real traffic is the experiment this paper most needs: it would test the assumed calibration, the cost of an excess send to users who share a block, and the quota a counter needs per block. The policies left outside the evaluation, per-client quotas within a block, bounded exemptions, tuned token buckets and windowed or time-uniform statistics, could then be compared under the same predeclared protocols.</w:t>
       </w:r>
     </w:p>
-    <w:bookmarkEnd w:id="70"/>
-    <w:bookmarkStart w:id="71" w:name="X071796dd6bc546c91e96cca1cf5ff96599de61f"/>
+    <w:bookmarkEnd w:id="69"/>
+    <w:bookmarkStart w:id="70" w:name="X071796dd6bc546c91e96cca1cf5ff96599de61f"/>
     <w:p>
       <w:pPr>
         <w:pStyle w:val="Heading1"/>
@@ -13412,8 +13393,8 @@
         <w:t xml:space="preserve">The author used Claude (Anthropic) for code, evaluation, drafting and editing; checked numbers against the recorded results and claims against the code; and takes full responsibility for the content.</w:t>
       </w:r>
     </w:p>
-    <w:bookmarkEnd w:id="71"/>
-    <w:bookmarkStart w:id="72" w:name="credit-authorship-contribution-statement"/>
+    <w:bookmarkEnd w:id="70"/>
+    <w:bookmarkStart w:id="71" w:name="credit-authorship-contribution-statement"/>
     <w:p>
       <w:pPr>
         <w:pStyle w:val="Heading1"/>
@@ -13440,8 +13421,8 @@
         <w:t xml:space="preserve">Conceptualization, Methodology, Software, Validation, Investigation, Writing – original draft, Writing – review &amp; editing.</w:t>
       </w:r>
     </w:p>
-    <w:bookmarkEnd w:id="72"/>
-    <w:bookmarkStart w:id="73" w:name="declaration-of-competing-interest"/>
+    <w:bookmarkEnd w:id="71"/>
+    <w:bookmarkStart w:id="72" w:name="declaration-of-competing-interest"/>
     <w:p>
       <w:pPr>
         <w:pStyle w:val="Heading1"/>
@@ -13458,8 +13439,8 @@
         <w:t xml:space="preserve">The author declares no known competing financial interests or personal relationships that could have appeared to influence this work.</w:t>
       </w:r>
     </w:p>
-    <w:bookmarkEnd w:id="73"/>
-    <w:bookmarkStart w:id="75" w:name="data-availability"/>
+    <w:bookmarkEnd w:id="72"/>
+    <w:bookmarkStart w:id="74" w:name="data-availability"/>
     <w:p>
       <w:pPr>
         <w:pStyle w:val="Heading1"/>
@@ -13496,7 +13477,7 @@
       <w:r>
         <w:t xml:space="preserve"> </w:t>
       </w:r>
-      <w:hyperlink r:id="rId74">
+      <w:hyperlink r:id="rId73">
         <w:r>
           <w:rPr>
             <w:rStyle w:val="Hyperlink"/>
@@ -13529,8 +13510,8 @@
         <w:t xml:space="preserve">. These files are the supplementary material.</w:t>
       </w:r>
     </w:p>
-    <w:bookmarkEnd w:id="75"/>
-    <w:bookmarkStart w:id="84" w:name="references"/>
+    <w:bookmarkEnd w:id="74"/>
+    <w:bookmarkStart w:id="83" w:name="references"/>
     <w:p>
       <w:pPr>
         <w:pStyle w:val="Heading1"/>
@@ -13683,7 +13664,7 @@
         </w:rPr>
         <w:t xml:space="preserve"> </w:t>
       </w:r>
-      <w:hyperlink r:id="rId74">
+      <w:hyperlink r:id="rId73">
         <w:r>
           <w:rPr>
             <w:rStyle w:val="Hyperlink"/>
@@ -13880,7 +13861,7 @@
         </w:rPr>
         <w:t xml:space="preserve"> </w:t>
       </w:r>
-      <w:hyperlink r:id="rId76">
+      <w:hyperlink r:id="rId75">
         <w:r>
           <w:rPr>
             <w:rStyle w:val="Hyperlink"/>
@@ -14575,7 +14556,7 @@
         </w:rPr>
         <w:t xml:space="preserve"> </w:t>
       </w:r>
-      <w:hyperlink r:id="rId77">
+      <w:hyperlink r:id="rId76">
         <w:r>
           <w:rPr>
             <w:rStyle w:val="Hyperlink"/>
@@ -15716,7 +15697,7 @@
         </w:rPr>
         <w:t xml:space="preserve"> </w:t>
       </w:r>
-      <w:hyperlink r:id="rId78">
+      <w:hyperlink r:id="rId77">
         <w:r>
           <w:rPr>
             <w:rStyle w:val="Hyperlink"/>
@@ -16329,7 +16310,7 @@
         </w:rPr>
         <w:t xml:space="preserve"> </w:t>
       </w:r>
-      <w:hyperlink r:id="rId79">
+      <w:hyperlink r:id="rId78">
         <w:r>
           <w:rPr>
             <w:rStyle w:val="Hyperlink"/>
@@ -17440,7 +17421,7 @@
         </w:rPr>
         <w:t xml:space="preserve"> </w:t>
       </w:r>
-      <w:hyperlink r:id="rId80">
+      <w:hyperlink r:id="rId79">
         <w:r>
           <w:rPr>
             <w:rStyle w:val="Hyperlink"/>
@@ -17574,7 +17555,7 @@
         </w:rPr>
         <w:t xml:space="preserve"> </w:t>
       </w:r>
-      <w:hyperlink r:id="rId81">
+      <w:hyperlink r:id="rId80">
         <w:r>
           <w:rPr>
             <w:rStyle w:val="Hyperlink"/>
@@ -17694,7 +17675,7 @@
         </w:rPr>
         <w:t xml:space="preserve"> </w:t>
       </w:r>
-      <w:hyperlink r:id="rId82">
+      <w:hyperlink r:id="rId81">
         <w:r>
           <w:rPr>
             <w:rStyle w:val="Hyperlink"/>
@@ -18062,7 +18043,7 @@
         </w:rPr>
         <w:t xml:space="preserve"> </w:t>
       </w:r>
-      <w:hyperlink r:id="rId83">
+      <w:hyperlink r:id="rId82">
         <w:r>
           <w:rPr>
             <w:rStyle w:val="Hyperlink"/>
@@ -18503,7 +18484,7 @@
         <w:t xml:space="preserve">. https://doi.org/10.18372/2310-5461.69.20735.</w:t>
       </w:r>
     </w:p>
-    <w:bookmarkEnd w:id="84"/>
+    <w:bookmarkEnd w:id="83"/>
     <w:sectPr>
       <w:pgSz w:w="11906" w:h="16838"/>
       <w:pgMar w:left="1417" w:right="1417" w:top="1417" w:bottom="1417" w:header="708" w:footer="708" w:gutter="0"/>

</xml_diff>

<commit_message>
Manuscript revision 8: research statement, expanded baseline and threat model, algorithm and block diagram, discussion merged with limitations
The research questions are one statement in three parts (no RQ labels in
headings or conclusions). Section 3.1 explains the seven v1 controls and the
eight gaps in prose, with the baseline as Algorithm 1 (figures/alg1_v1_body.tex)
in place of the assumptions table. Section 3.2 is expanded, with a threat-model
figure (fig9_threat_model.tex). The twelve-step table is a block diagram
(fig10_steps.tex). Discussion and limitations are one section. Word version
renders the algorithm from a standalone build. Numbering: Tables 1-8, Figures
1-6, Algorithm 1; the letter, study map, key, README and changelog follow.

Co-Authored-By: Claude Fable 5.1 <noreply@anthropic.com>
Claude-Session: https://claude.ai/code/session_01RjWdFzUgYk6Hwie2YbnvyG
</commit_message>
<xml_diff>
--- a/paper/main.docx
+++ b/paper/main.docx
@@ -235,7 +235,7 @@
         <w:pStyle w:val="BodyText"/>
       </w:pPr>
       <w:r>
-        <w:t xml:space="preserve">We ask which attacks the design contains against simpler designs, and at what cost in completed registrations (RQ1); which layer is responsible (RQ2); when outcome-based reputation separates an attacker from simulated users (RQ3); what rationing costs when it does not (RQ4); and what destination policies cost legitimate users, with and without an attack (RQ5). This paper makes the following contributions:</w:t>
+        <w:t xml:space="preserve">The study asks one question in three parts. On the source side, how much of the flooding that a seven-control baseline admits does a twelve-step redesign contain, at what cost in completed registrations, and through which layer? Where identities are cheap, when does reputation built from verification outcomes stop separating an attacker from the users whose keys it shares, and what does rationing then cost and depend on? On the destination, where a pumper is paid, does counting sends per number block or testing the outcomes of their codes leak less, under which conditions does the answer reverse, and what does either policy cost the legitimate users who share a block, with and without an attack? This paper makes the following contributions:</w:t>
       </w:r>
     </w:p>
     <w:p>
@@ -287,7 +287,7 @@
         <w:pStyle w:val="FirstParagraph"/>
       </w:pPr>
       <w:r>
-        <w:t xml:space="preserve">Section 2 reviews related work; Section 3 gives the baseline, the threat model and the design with its leakage estimates; Section 4 the methodology; Section 5 reports the results; Sections 6–8 discuss them, state the limitations, and conclude.</w:t>
+        <w:t xml:space="preserve">Section 2 reviews related work; Section 3 gives the baseline, the threat model and the design with its leakage estimates; Section 4 the methodology; Section 5 reports the results; Section 6 discusses them and states the limitations; Section 7 concludes.</w:t>
       </w:r>
     </w:p>
     <w:bookmarkEnd w:id="20"/>
@@ -474,7 +474,7 @@
         <w:pStyle w:val="BodyText"/>
       </w:pPr>
       <w:r>
-        <w:t xml:space="preserve">Taken together, these works establish that attacks concentrate on destination prefixes and avoid converting, that counts alone misfire on campaigns, and that some campaigns now enter codes to pass conversion rules. None of them compares counting with outcome testing on the same traffic, fixes its setting before the evaluation runs, or charges a policy with the registrations it costs the users of a shared block. Those are the questions of Sections 5.5–5.7, and the attackers that enter codes, fake receipts and build trust (Table 4) are modeled on the counter-move above.</w:t>
+        <w:t xml:space="preserve">Taken together, these works establish that attacks concentrate on destination prefixes and avoid converting, that counts alone misfire on campaigns, and that some campaigns now enter codes to pass conversion rules. None of them compares counting with outcome testing on the same traffic, fixes its setting before the evaluation runs, or charges a policy with the registrations it costs the users of a shared block. Those are the questions of Sections 5.5–5.7, and the attackers that enter codes, fake receipts and build trust (Table 2) are modeled on the counter-move above.</w:t>
       </w:r>
     </w:p>
     <w:bookmarkEnd w:id="25"/>
@@ -527,7 +527,7 @@
         <w:pStyle w:val="BodyText"/>
       </w:pPr>
       <w:r>
-        <w:t xml:space="preserve">These measurements say what an attacker can buy. For a defense they imply that per-identity controls tax identity reset rather than prevent it, and that the question for a residential attacker is not whether it can be told from a person but what rationing it costs the people it resembles. RQ3 and RQ4 measure that in this design.</w:t>
+        <w:t xml:space="preserve">These measurements say what an attacker can buy. For a defense they imply that per-identity controls tax identity reset rather than prevent it, and that the question for a residential attacker is not whether it can be told from a person but what rationing it costs the people it resembles. Sections 5.3 and 5.4 measure that in this design.</w:t>
       </w:r>
     </w:p>
     <w:bookmarkEnd w:id="26"/>
@@ -1487,7 +1487,7 @@
     </w:tbl>
     <w:bookmarkEnd w:id="29"/>
     <w:bookmarkEnd w:id="30"/>
-    <w:bookmarkStart w:id="40" w:name="threat-model-and-design"/>
+    <w:bookmarkStart w:id="49" w:name="threat-model-and-design"/>
     <w:p>
       <w:pPr>
         <w:pStyle w:val="Heading1"/>
@@ -1513,7 +1513,7 @@
         <w:t xml:space="preserve">This section describes the baseline that the design replaces, the attacker it must resist, the twelve steps and two destination policies of the design, and the estimates of leakage that follow from its rules.</w:t>
       </w:r>
     </w:p>
-    <w:bookmarkStart w:id="31" w:name="the-v1-baseline-and-its-gaps"/>
+    <w:bookmarkStart w:id="34" w:name="the-v1-baseline-and-its-gaps"/>
     <w:p>
       <w:pPr>
         <w:pStyle w:val="Heading2"/>
@@ -1536,577 +1536,84 @@
         <w:pStyle w:val="FirstParagraph"/>
       </w:pPr>
       <w:r>
-        <w:t xml:space="preserve">The baseline, v1, sends a code to any unregistered number behind seven controls: reCAPTCHA v3 on web requests only, one message per number per minute, five requests per address per minute, a country allow-list, a body-length limit, a proxy block, and per-platform caps; bulk and test paths skip some checks. Table 2 lists eight assumptions behind these rules and how an attacker within the threat model breaks each; the gaps follow from the rules, not observed abuse.</w:t>
+        <w:t xml:space="preserve">The baseline, v1, is the registration endpoint before this work: it sends a code to any unregistered number once seven controls pass, in the order of Algorithm 1. A request from a known VPN or proxy address is refused. The platform is read from a client header, and a request that claims iOS or Android skips the two checks that web requests face, a reCAPTCHA v3 score threshold and an origin check. The number’s country must be on an allow-list unless the request carries the bulk flag; the body must be within a length limit and the number not on an exclusion list unless the request comes from a test server. One message per number per minute, five requests per address per minute and static caps per platform and country complete the controls. Each cap is a counter that is read when the check runs and incremented after every check has passed, and the response names the control that refused.</w:t>
       </w:r>
     </w:p>
     <w:p>
       <w:pPr>
-        <w:pStyle w:val="TableCaption"/>
+        <w:pStyle w:val="BodyText"/>
+      </w:pPr>
+      <w:r>
+        <w:t xml:space="preserve">Each control rests on an assumption that an attacker within the threat model of Section 3.2 breaks, and the eight gaps below follow from the rules, not from observed abuse; Algorithm 1 marks where each opens. (A) The platform exemptions trust a client claim, so any request can send the header for iOS and skip the reCAPTCHA and origin checks. (B) Five requests per address assume that addresses are scarce; a residential proxy pool supplies a fresh address per request, nothing throttles a subnet or an autonomous system, and no client identity survives an address change. (C) A number is sent to without validation, so numbers that cannot exist, numbers on dead ranges and generated sequences cost the same as a real message. (D) The country allow-list is the only notion of destination cost; premium-rate and revenue-share prefixes inside an allowed country cost many times a standard message, and a pumper targets exactly those. (E) Every limit is per key, so a wide attack that stays under each cap burns the budget without bound; nothing watches total volume or spend. (F) A limit checks its counter and increments it as two operations, so two concurrent requests on different instances both pass. (G) The bulk and test paths skip checks but need no stronger authentication than a normal request, so a leaked flag is a bypass. (H) Every decision is pass or fail and the response names the control that refused, so an attacker can probe each threshold, stay under it, and enumerate registered numbers.</w:t>
+      </w:r>
+    </w:p>
+    <w:p>
+      <w:pPr>
+        <w:pStyle w:val="CaptionedFigure"/>
+      </w:pPr>
+      <w:r>
+        <w:drawing>
+          <wp:inline>
+            <wp:extent cx="4319999" cy="4270847"/>
+            <wp:effectExtent b="0" l="0" r="0" t="0"/>
+            <wp:docPr descr="" title="" id="32" name="Picture"/>
+            <a:graphic>
+              <a:graphicData uri="http://schemas.openxmlformats.org/drawingml/2006/picture">
+                <pic:pic>
+                  <pic:nvPicPr>
+                    <pic:cNvPr descr="figures/alg1_v1.png" id="33" name="Picture"/>
+                    <pic:cNvPicPr>
+                      <a:picLocks noChangeArrowheads="1" noChangeAspect="1"/>
+                    </pic:cNvPicPr>
+                  </pic:nvPicPr>
+                  <pic:blipFill>
+                    <a:blip r:embed="rId31"/>
+                    <a:stretch>
+                      <a:fillRect/>
+                    </a:stretch>
+                  </pic:blipFill>
+                  <pic:spPr bwMode="auto">
+                    <a:xfrm>
+                      <a:off x="0" y="0"/>
+                      <a:ext cx="4319999" cy="4270847"/>
+                    </a:xfrm>
+                    <a:prstGeom prst="rect">
+                      <a:avLst/>
+                    </a:prstGeom>
+                    <a:noFill/>
+                    <a:ln w="9525">
+                      <a:noFill/>
+                      <a:headEnd/>
+                      <a:tailEnd/>
+                    </a:ln>
+                  </pic:spPr>
+                </pic:pic>
+              </a:graphicData>
+            </a:graphic>
+          </wp:inline>
+        </w:drawing>
+      </w:r>
+    </w:p>
+    <w:p>
+      <w:pPr>
+        <w:pStyle w:val="ImageCaption"/>
       </w:pPr>
       <w:r>
         <w:rPr>
           <w:bCs/>
           <w:b/>
         </w:rPr>
-        <w:t xml:space="preserve">Table 2</w:t>
-      </w:r>
-      <w:r>
-        <w:t xml:space="preserve"> </w:t>
-      </w:r>
-      <w:r>
-        <w:br/>
-        <w:t xml:space="preserve">v1 Assumptions and how they fail.</w:t>
+        <w:t xml:space="preserve">Algorithm 1.</w:t>
+      </w:r>
+      <w:r>
+        <w:t xml:space="preserve"> </w:t>
+      </w:r>
+      <w:r>
+        <w:t xml:space="preserve">The v1 baseline, as the evaluated pipeline applies it to a code request; each comment names the gap the preceding rule opens.</w:t>
       </w:r>
     </w:p>
-    <w:tbl>
-      <w:tblPr>
-        <w:tblStyle w:val="Table"/>
-        <w:tblW w:w="9071" w:type="dxa"/>
-        <w:jc w:val="center"/>
-        <w:tblLayout w:type="fixed"/>
-        <w:tblCellMar>
-          <w:left w:w="57" w:type="dxa"/>
-          <w:right w:w="57" w:type="dxa"/>
-        </w:tblCellMar>
-        <w:tblLook w:firstRow="1" w:lastRow="0" w:firstColumn="0" w:lastColumn="0" w:noHBand="0" w:noVBand="0" w:val="0020"/>
-        <w:tblCaption w:val="Table 2 TBLBRK v1 Assumptions and how they fail."/>
-      </w:tblPr>
-      <w:tblGrid>
-        <w:gridCol w:w="509"/>
-        <w:gridCol w:w="4281"/>
-        <w:gridCol w:w="4281"/>
-      </w:tblGrid>
-      <w:tr>
-        <w:trPr>
-          <w:tblHeader w:val="true"/>
-        </w:trPr>
-        <w:tc>
-          <w:tcPr>
-            <w:tcW w:w="509" w:type="dxa"/>
-            <w:tcBorders>
-              <w:top w:val="single" w:sz="8" w:color="000000"/>
-              <w:bottom w:val="single" w:sz="4" w:color="000000"/>
-            </w:tcBorders>
-          </w:tcPr>
-          <w:p>
-            <w:pPr>
-              <w:pStyle w:val="Compact"/>
-              <w:spacing w:line="240" w:lineRule="auto" w:after="0"/>
-              <w:jc w:val="center"/>
-            </w:pPr>
-            <w:r>
-              <w:rPr>
-                <w:sz w:val="17"/>
-              </w:rPr>
-              <w:t xml:space="preserve">Gap</w:t>
-            </w:r>
-          </w:p>
-        </w:tc>
-        <w:tc>
-          <w:tcPr>
-            <w:tcW w:w="4281" w:type="dxa"/>
-            <w:tcBorders>
-              <w:top w:val="single" w:sz="8" w:color="000000"/>
-              <w:bottom w:val="single" w:sz="4" w:color="000000"/>
-            </w:tcBorders>
-          </w:tcPr>
-          <w:p>
-            <w:pPr>
-              <w:pStyle w:val="Compact"/>
-              <w:spacing w:line="240" w:lineRule="auto" w:after="0"/>
-              <w:jc w:val="left"/>
-            </w:pPr>
-            <w:r>
-              <w:rPr>
-                <w:sz w:val="17"/>
-              </w:rPr>
-              <w:t xml:space="preserve">v1 assumes</w:t>
-            </w:r>
-          </w:p>
-        </w:tc>
-        <w:tc>
-          <w:tcPr>
-            <w:tcW w:w="4281" w:type="dxa"/>
-            <w:tcBorders>
-              <w:top w:val="single" w:sz="8" w:color="000000"/>
-              <w:bottom w:val="single" w:sz="4" w:color="000000"/>
-            </w:tcBorders>
-          </w:tcPr>
-          <w:p>
-            <w:pPr>
-              <w:pStyle w:val="Compact"/>
-              <w:spacing w:line="240" w:lineRule="auto" w:after="0"/>
-              <w:jc w:val="left"/>
-            </w:pPr>
-            <w:r>
-              <w:rPr>
-                <w:sz w:val="17"/>
-              </w:rPr>
-              <w:t xml:space="preserve">How it fails</w:t>
-            </w:r>
-          </w:p>
-        </w:tc>
-      </w:tr>
-      <w:tr>
-        <w:tc>
-          <w:tcPr>
-            <w:tcW w:w="509" w:type="dxa"/>
-          </w:tcPr>
-          <w:p>
-            <w:pPr>
-              <w:pStyle w:val="Compact"/>
-              <w:spacing w:line="240" w:lineRule="auto" w:after="0"/>
-              <w:jc w:val="center"/>
-            </w:pPr>
-            <w:r>
-              <w:rPr>
-                <w:sz w:val="17"/>
-              </w:rPr>
-              <w:t xml:space="preserve">A</w:t>
-            </w:r>
-          </w:p>
-        </w:tc>
-        <w:tc>
-          <w:tcPr>
-            <w:tcW w:w="4281" w:type="dxa"/>
-          </w:tcPr>
-          <w:p>
-            <w:pPr>
-              <w:pStyle w:val="Compact"/>
-              <w:spacing w:line="240" w:lineRule="auto" w:after="0"/>
-              <w:jc w:val="left"/>
-            </w:pPr>
-            <w:r>
-              <w:rPr>
-                <w:sz w:val="17"/>
-              </w:rPr>
-              <w:t xml:space="preserve">A platform header says which app sent the request</w:t>
-            </w:r>
-          </w:p>
-        </w:tc>
-        <w:tc>
-          <w:tcPr>
-            <w:tcW w:w="4281" w:type="dxa"/>
-          </w:tcPr>
-          <w:p>
-            <w:pPr>
-              <w:pStyle w:val="Compact"/>
-              <w:spacing w:line="240" w:lineRule="auto" w:after="0"/>
-              <w:jc w:val="left"/>
-            </w:pPr>
-            <w:r>
-              <w:rPr>
-                <w:sz w:val="17"/>
-              </w:rPr>
-              <w:t xml:space="preserve">Sending the header reaches every exemption</w:t>
-            </w:r>
-          </w:p>
-        </w:tc>
-      </w:tr>
-      <w:tr>
-        <w:tc>
-          <w:tcPr>
-            <w:tcW w:w="509" w:type="dxa"/>
-          </w:tcPr>
-          <w:p>
-            <w:pPr>
-              <w:pStyle w:val="Compact"/>
-              <w:spacing w:line="240" w:lineRule="auto" w:after="0"/>
-              <w:jc w:val="center"/>
-            </w:pPr>
-            <w:r>
-              <w:rPr>
-                <w:sz w:val="17"/>
-              </w:rPr>
-              <w:t xml:space="preserve">B</w:t>
-            </w:r>
-          </w:p>
-        </w:tc>
-        <w:tc>
-          <w:tcPr>
-            <w:tcW w:w="4281" w:type="dxa"/>
-          </w:tcPr>
-          <w:p>
-            <w:pPr>
-              <w:pStyle w:val="Compact"/>
-              <w:spacing w:line="240" w:lineRule="auto" w:after="0"/>
-              <w:jc w:val="left"/>
-            </w:pPr>
-            <w:r>
-              <w:rPr>
-                <w:sz w:val="17"/>
-              </w:rPr>
-              <w:t xml:space="preserve">Five requests per address per minute bound an attacker</w:t>
-            </w:r>
-          </w:p>
-        </w:tc>
-        <w:tc>
-          <w:tcPr>
-            <w:tcW w:w="4281" w:type="dxa"/>
-          </w:tcPr>
-          <w:p>
-            <w:pPr>
-              <w:pStyle w:val="Compact"/>
-              <w:spacing w:line="240" w:lineRule="auto" w:after="0"/>
-              <w:jc w:val="left"/>
-            </w:pPr>
-            <w:r>
-              <w:rPr>
-                <w:sz w:val="17"/>
-              </w:rPr>
-              <w:t xml:space="preserve">A fresh residential address per request</w:t>
-            </w:r>
-          </w:p>
-        </w:tc>
-      </w:tr>
-      <w:tr>
-        <w:tc>
-          <w:tcPr>
-            <w:tcW w:w="509" w:type="dxa"/>
-          </w:tcPr>
-          <w:p>
-            <w:pPr>
-              <w:pStyle w:val="Compact"/>
-              <w:spacing w:line="240" w:lineRule="auto" w:after="0"/>
-              <w:jc w:val="center"/>
-            </w:pPr>
-            <w:r>
-              <w:rPr>
-                <w:sz w:val="17"/>
-              </w:rPr>
-              <w:t xml:space="preserve">C</w:t>
-            </w:r>
-          </w:p>
-        </w:tc>
-        <w:tc>
-          <w:tcPr>
-            <w:tcW w:w="4281" w:type="dxa"/>
-          </w:tcPr>
-          <w:p>
-            <w:pPr>
-              <w:pStyle w:val="Compact"/>
-              <w:spacing w:line="240" w:lineRule="auto" w:after="0"/>
-              <w:jc w:val="left"/>
-            </w:pPr>
-            <w:r>
-              <w:rPr>
-                <w:sz w:val="17"/>
-              </w:rPr>
-              <w:t xml:space="preserve">A number given is worth sending to</w:t>
-            </w:r>
-          </w:p>
-        </w:tc>
-        <w:tc>
-          <w:tcPr>
-            <w:tcW w:w="4281" w:type="dxa"/>
-          </w:tcPr>
-          <w:p>
-            <w:pPr>
-              <w:pStyle w:val="Compact"/>
-              <w:spacing w:line="240" w:lineRule="auto" w:after="0"/>
-              <w:jc w:val="left"/>
-            </w:pPr>
-            <w:r>
-              <w:rPr>
-                <w:sz w:val="17"/>
-              </w:rPr>
-              <w:t xml:space="preserve">Generated numbers cost as much as real ones</w:t>
-            </w:r>
-          </w:p>
-        </w:tc>
-      </w:tr>
-      <w:tr>
-        <w:tc>
-          <w:tcPr>
-            <w:tcW w:w="509" w:type="dxa"/>
-          </w:tcPr>
-          <w:p>
-            <w:pPr>
-              <w:pStyle w:val="Compact"/>
-              <w:spacing w:line="240" w:lineRule="auto" w:after="0"/>
-              <w:jc w:val="center"/>
-            </w:pPr>
-            <w:r>
-              <w:rPr>
-                <w:sz w:val="17"/>
-              </w:rPr>
-              <w:t xml:space="preserve">D</w:t>
-            </w:r>
-          </w:p>
-        </w:tc>
-        <w:tc>
-          <w:tcPr>
-            <w:tcW w:w="4281" w:type="dxa"/>
-          </w:tcPr>
-          <w:p>
-            <w:pPr>
-              <w:pStyle w:val="Compact"/>
-              <w:spacing w:line="240" w:lineRule="auto" w:after="0"/>
-              <w:jc w:val="left"/>
-            </w:pPr>
-            <w:r>
-              <w:rPr>
-                <w:sz w:val="17"/>
-              </w:rPr>
-              <w:t xml:space="preserve">An allowed country is a safe destination</w:t>
-            </w:r>
-          </w:p>
-        </w:tc>
-        <w:tc>
-          <w:tcPr>
-            <w:tcW w:w="4281" w:type="dxa"/>
-          </w:tcPr>
-          <w:p>
-            <w:pPr>
-              <w:pStyle w:val="Compact"/>
-              <w:spacing w:line="240" w:lineRule="auto" w:after="0"/>
-              <w:jc w:val="left"/>
-            </w:pPr>
-            <w:r>
-              <w:rPr>
-                <w:sz w:val="17"/>
-              </w:rPr>
-              <w:t xml:space="preserve">Premium ranges inside it cost far more</w:t>
-            </w:r>
-          </w:p>
-        </w:tc>
-      </w:tr>
-      <w:tr>
-        <w:tc>
-          <w:tcPr>
-            <w:tcW w:w="509" w:type="dxa"/>
-          </w:tcPr>
-          <w:p>
-            <w:pPr>
-              <w:pStyle w:val="Compact"/>
-              <w:spacing w:line="240" w:lineRule="auto" w:after="0"/>
-              <w:jc w:val="center"/>
-            </w:pPr>
-            <w:r>
-              <w:rPr>
-                <w:sz w:val="17"/>
-              </w:rPr>
-              <w:t xml:space="preserve">E</w:t>
-            </w:r>
-          </w:p>
-        </w:tc>
-        <w:tc>
-          <w:tcPr>
-            <w:tcW w:w="4281" w:type="dxa"/>
-          </w:tcPr>
-          <w:p>
-            <w:pPr>
-              <w:pStyle w:val="Compact"/>
-              <w:spacing w:line="240" w:lineRule="auto" w:after="0"/>
-              <w:jc w:val="left"/>
-            </w:pPr>
-            <w:r>
-              <w:rPr>
-                <w:sz w:val="17"/>
-              </w:rPr>
-              <w:t xml:space="preserve">Per-key caps bound total spend</w:t>
-            </w:r>
-          </w:p>
-        </w:tc>
-        <w:tc>
-          <w:tcPr>
-            <w:tcW w:w="4281" w:type="dxa"/>
-          </w:tcPr>
-          <w:p>
-            <w:pPr>
-              <w:pStyle w:val="Compact"/>
-              <w:spacing w:line="240" w:lineRule="auto" w:after="0"/>
-              <w:jc w:val="left"/>
-            </w:pPr>
-            <w:r>
-              <w:rPr>
-                <w:sz w:val="17"/>
-              </w:rPr>
-              <w:t xml:space="preserve">A wide attack under every cap</w:t>
-            </w:r>
-          </w:p>
-        </w:tc>
-      </w:tr>
-      <w:tr>
-        <w:tc>
-          <w:tcPr>
-            <w:tcW w:w="509" w:type="dxa"/>
-          </w:tcPr>
-          <w:p>
-            <w:pPr>
-              <w:pStyle w:val="Compact"/>
-              <w:spacing w:line="240" w:lineRule="auto" w:after="0"/>
-              <w:jc w:val="center"/>
-            </w:pPr>
-            <w:r>
-              <w:rPr>
-                <w:sz w:val="17"/>
-              </w:rPr>
-              <w:t xml:space="preserve">F</w:t>
-            </w:r>
-          </w:p>
-        </w:tc>
-        <w:tc>
-          <w:tcPr>
-            <w:tcW w:w="4281" w:type="dxa"/>
-          </w:tcPr>
-          <w:p>
-            <w:pPr>
-              <w:pStyle w:val="Compact"/>
-              <w:spacing w:line="240" w:lineRule="auto" w:after="0"/>
-              <w:jc w:val="left"/>
-            </w:pPr>
-            <w:r>
-              <w:rPr>
-                <w:sz w:val="17"/>
-              </w:rPr>
-              <w:t xml:space="preserve">Check-then-increment is a rate limit</w:t>
-            </w:r>
-          </w:p>
-        </w:tc>
-        <w:tc>
-          <w:tcPr>
-            <w:tcW w:w="4281" w:type="dxa"/>
-          </w:tcPr>
-          <w:p>
-            <w:pPr>
-              <w:pStyle w:val="Compact"/>
-              <w:spacing w:line="240" w:lineRule="auto" w:after="0"/>
-              <w:jc w:val="left"/>
-            </w:pPr>
-            <w:r>
-              <w:rPr>
-                <w:sz w:val="17"/>
-              </w:rPr>
-              <w:t xml:space="preserve">Two racing instances both pass</w:t>
-            </w:r>
-          </w:p>
-        </w:tc>
-      </w:tr>
-      <w:tr>
-        <w:tc>
-          <w:tcPr>
-            <w:tcW w:w="509" w:type="dxa"/>
-          </w:tcPr>
-          <w:p>
-            <w:pPr>
-              <w:pStyle w:val="Compact"/>
-              <w:spacing w:line="240" w:lineRule="auto" w:after="0"/>
-              <w:jc w:val="center"/>
-            </w:pPr>
-            <w:r>
-              <w:rPr>
-                <w:sz w:val="17"/>
-              </w:rPr>
-              <w:t xml:space="preserve">G</w:t>
-            </w:r>
-          </w:p>
-        </w:tc>
-        <w:tc>
-          <w:tcPr>
-            <w:tcW w:w="4281" w:type="dxa"/>
-          </w:tcPr>
-          <w:p>
-            <w:pPr>
-              <w:pStyle w:val="Compact"/>
-              <w:spacing w:line="240" w:lineRule="auto" w:after="0"/>
-              <w:jc w:val="left"/>
-            </w:pPr>
-            <w:r>
-              <w:rPr>
-                <w:sz w:val="17"/>
-              </w:rPr>
-              <w:t xml:space="preserve">Bulk and test flags are internal</w:t>
-            </w:r>
-          </w:p>
-        </w:tc>
-        <w:tc>
-          <w:tcPr>
-            <w:tcW w:w="4281" w:type="dxa"/>
-          </w:tcPr>
-          <w:p>
-            <w:pPr>
-              <w:pStyle w:val="Compact"/>
-              <w:spacing w:line="240" w:lineRule="auto" w:after="0"/>
-              <w:jc w:val="left"/>
-            </w:pPr>
-            <w:r>
-              <w:rPr>
-                <w:sz w:val="17"/>
-              </w:rPr>
-              <w:t xml:space="preserve">Neither needs stronger authentication</w:t>
-            </w:r>
-          </w:p>
-        </w:tc>
-      </w:tr>
-      <w:tr>
-        <w:tc>
-          <w:tcPr>
-            <w:tcW w:w="509" w:type="dxa"/>
-            <w:tcBorders>
-              <w:bottom w:val="single" w:sz="8" w:color="000000"/>
-            </w:tcBorders>
-          </w:tcPr>
-          <w:p>
-            <w:pPr>
-              <w:pStyle w:val="Compact"/>
-              <w:spacing w:line="240" w:lineRule="auto" w:after="0"/>
-              <w:jc w:val="center"/>
-            </w:pPr>
-            <w:r>
-              <w:rPr>
-                <w:sz w:val="17"/>
-              </w:rPr>
-              <w:t xml:space="preserve">H</w:t>
-            </w:r>
-          </w:p>
-        </w:tc>
-        <w:tc>
-          <w:tcPr>
-            <w:tcW w:w="4281" w:type="dxa"/>
-            <w:tcBorders>
-              <w:bottom w:val="single" w:sz="8" w:color="000000"/>
-            </w:tcBorders>
-          </w:tcPr>
-          <w:p>
-            <w:pPr>
-              <w:pStyle w:val="Compact"/>
-              <w:spacing w:line="240" w:lineRule="auto" w:after="0"/>
-              <w:jc w:val="left"/>
-            </w:pPr>
-            <w:r>
-              <w:rPr>
-                <w:sz w:val="17"/>
-              </w:rPr>
-              <w:t xml:space="preserve">Each check says which check failed</w:t>
-            </w:r>
-          </w:p>
-        </w:tc>
-        <w:tc>
-          <w:tcPr>
-            <w:tcW w:w="4281" w:type="dxa"/>
-            <w:tcBorders>
-              <w:bottom w:val="single" w:sz="8" w:color="000000"/>
-            </w:tcBorders>
-          </w:tcPr>
-          <w:p>
-            <w:pPr>
-              <w:pStyle w:val="Compact"/>
-              <w:spacing w:line="240" w:lineRule="auto" w:after="0"/>
-              <w:jc w:val="left"/>
-            </w:pPr>
-            <w:r>
-              <w:rPr>
-                <w:sz w:val="17"/>
-              </w:rPr>
-              <w:t xml:space="preserve">Thresholds can be probed one at a time</w:t>
-            </w:r>
-          </w:p>
-        </w:tc>
-      </w:tr>
-    </w:tbl>
-    <w:bookmarkEnd w:id="31"/>
-    <w:bookmarkStart w:id="32" w:name="threat-model"/>
+    <w:bookmarkEnd w:id="34"/>
+    <w:bookmarkStart w:id="38" w:name="threat-model"/>
     <w:p>
       <w:pPr>
         <w:pStyle w:val="Heading2"/>
@@ -2129,584 +1636,190 @@
         <w:pStyle w:val="FirstParagraph"/>
       </w:pPr>
       <w:r>
-        <w:t xml:space="preserve">The attacker wants as many messages sent as possible, or sent to numbers that pay it. It buys residential proxies and human-like reCAPTCHA tokens (about 0.3 cents each), mints fingerprints, generates numbers, and knows the thresholds. A pumper also has a colluding operator’s ranges, where it may enter codes, report deliveries as failed, build verified history, spread over blocks, and buy challenge solutions. It cannot forge an attestation, use ranges its partner does not terminate, or make a stranger enter a code.</w:t>
-      </w:r>
-    </w:p>
-    <w:bookmarkEnd w:id="32"/>
-    <w:bookmarkStart w:id="33" w:name="the-pipeline-and-the-risk-score"/>
-    <w:p>
-      <w:pPr>
-        <w:pStyle w:val="Heading2"/>
-      </w:pPr>
-      <w:r>
-        <w:rPr>
-          <w:rStyle w:val="SectionNumber"/>
-        </w:rPr>
-        <w:t xml:space="preserve">3.3</w:t>
-      </w:r>
-      <w:r>
-        <w:tab/>
-      </w:r>
-      <w:r>
-        <w:t xml:space="preserve">The pipeline and the risk score</w:t>
+        <w:t xml:space="preserve">The attacker is a party that wants the service to send as many messages as possible, or as many as possible to numbers that pay it. The first is a flooder: the service pays per message, and the attacker’s gain is the service’s loss. The second is a pumper, paid a share of the termination fee by the operator that terminates its ranges; it earns nothing on any other number, so its traffic concentrates on the blocks it is paid for. The share is not public, and Section 5.8 reports instead the share at which each scripted pumper breaks even. Figure 2 places the attacker’s capabilities and limits on the path of a request.</w:t>
       </w:r>
     </w:p>
     <w:p>
       <w:pPr>
-        <w:pStyle w:val="FirstParagraph"/>
-      </w:pPr>
-      <w:r>
-        <w:t xml:space="preserve">No message is paid for before every check passes, and cheap checks run first. Trust comes from evidence the client cannot forge, an attestation, a server-signed session, and the fate of earlier codes, though such evidence can be manufactured (Section 5.8). A request passes the steps of Table 3, which lists in brackets the gaps of Table 2 each step addresses (FB: the feedback loop), until it is refused. Step 0 takes the platform only from a valid App Attest or Play Integrity result. Each limit and reservation is one atomic Redis operation, but the enclosing steps are not one transaction: on the normal path, a refused request returns its per-number claims and counter slot, and the hourly budget is reserved only for a message about to be enqueued, a reservation rather than a completed dispatch; a crash between them can leak reservations (Section 4). Address limits and source caps count requests, except that a request Step 11 challenges returns its source-cap count. Every outcome after Step 0, except the challenge, returns one HTTP 200 body after at least 400 ms, a floor that cannot hide longer work.</w:t>
+        <w:pStyle w:val="BodyText"/>
+      </w:pPr>
+      <w:r>
+        <w:t xml:space="preserve">At the client, the attacker runs scripts behind residential proxies in the service’s own country, with a fresh address per request, or from a datacenter abroad, or spread at a low rate over twenty autonomous systems. It buys human-like reCAPTCHA v3 tokens from solving services at about 0.3 cents each, so a score threshold alone does not stop it. It mints a fresh browser fingerprint per request, pre-ages fingerprints for hours, or reuses one two-day-old profile; it can present a forged platform header; and it draws numbers at random, walks them upward, or takes them from its partner’s blocks. It knows every threshold, the parameters of the destination tests and the timing of the workers, and it sees only the one uniform response that Section 3.3 describes.</w:t>
       </w:r>
     </w:p>
     <w:p>
       <w:pPr>
-        <w:pStyle w:val="TableCaption"/>
+        <w:pStyle w:val="BodyText"/>
+      </w:pPr>
+      <w:r>
+        <w:t xml:space="preserve">On its own ranges, a pumper’s operator can do what a real recipient could: enter the code it receives, within a second or after a human-like delay, or only when a block’s statistic nears its threshold; report deliveries as failed, so that a billed send feeds no test; and verify on hundreds of identity-and-number pairs for ten or thirty minutes to build trusted history before flooding with the same pairs. It can spread over three to three hundred blocks, at full rate or paced to a counter’s quota, and it can buy a solution for every interactive challenge.</w:t>
+      </w:r>
+    </w:p>
+    <w:p>
+      <w:pPr>
+        <w:pStyle w:val="BodyText"/>
+      </w:pPr>
+      <w:r>
+        <w:t xml:space="preserve">Three things it cannot do. It cannot forge an app attestation, so a platform established at Step 0 is evidence rather than a claim. It cannot earn on a range its partner does not terminate, which is why the destination is the one key it cannot rotate away from. And it cannot make a stranger enter a code, so a code entered on a block that real users share is honest evidence about that block; what a code entered on the attacker’s own number buys it is measured, not assumed. Attacks on a code after delivery (Section 2.5) and compromise of the service, its vendors or the attestation providers are outside the model. Table 2 lists the 25 profiles that instantiate these capabilities; pool size, rate and CAPTCHA class are drawn per seed.</w:t>
+      </w:r>
+    </w:p>
+    <w:p>
+      <w:pPr>
+        <w:pStyle w:val="CaptionedFigure"/>
+      </w:pPr>
+      <w:r>
+        <w:drawing>
+          <wp:inline>
+            <wp:extent cx="5334000" cy="3075953"/>
+            <wp:effectExtent b="0" l="0" r="0" t="0"/>
+            <wp:docPr descr="" title="" id="36" name="Picture"/>
+            <a:graphic>
+              <a:graphicData uri="http://schemas.openxmlformats.org/drawingml/2006/picture">
+                <pic:pic>
+                  <pic:nvPicPr>
+                    <pic:cNvPr descr="figures/fig9_threat_model.png" id="37" name="Picture"/>
+                    <pic:cNvPicPr>
+                      <a:picLocks noChangeArrowheads="1" noChangeAspect="1"/>
+                    </pic:cNvPicPr>
+                  </pic:nvPicPr>
+                  <pic:blipFill>
+                    <a:blip r:embed="rId35"/>
+                    <a:stretch>
+                      <a:fillRect/>
+                    </a:stretch>
+                  </pic:blipFill>
+                  <pic:spPr bwMode="auto">
+                    <a:xfrm>
+                      <a:off x="0" y="0"/>
+                      <a:ext cx="5334000" cy="3075953"/>
+                    </a:xfrm>
+                    <a:prstGeom prst="rect">
+                      <a:avLst/>
+                    </a:prstGeom>
+                    <a:noFill/>
+                    <a:ln w="9525">
+                      <a:noFill/>
+                      <a:headEnd/>
+                      <a:tailEnd/>
+                    </a:ln>
+                  </pic:spPr>
+                </pic:pic>
+              </a:graphicData>
+            </a:graphic>
+          </wp:inline>
+        </w:drawing>
+      </w:r>
+    </w:p>
+    <w:p>
+      <w:pPr>
+        <w:pStyle w:val="ImageCaption"/>
       </w:pPr>
       <w:r>
         <w:rPr>
           <w:bCs/>
           <w:b/>
         </w:rPr>
-        <w:t xml:space="preserve">Table 3</w:t>
-      </w:r>
-      <w:r>
-        <w:t xml:space="preserve"> </w:t>
-      </w:r>
-      <w:r>
-        <w:br/>
-        <w:t xml:space="preserve">Twelve Steps and the v1 Gaps They Address.</w:t>
+        <w:t xml:space="preserve">Fig. 2.</w:t>
+      </w:r>
+      <w:r>
+        <w:t xml:space="preserve"> </w:t>
+      </w:r>
+      <w:r>
+        <w:t xml:space="preserve">The Threat Model on the Path of a Request.</w:t>
       </w:r>
     </w:p>
-    <w:tbl>
-      <w:tblPr>
-        <w:tblStyle w:val="Table"/>
-        <w:tblW w:w="9072" w:type="dxa"/>
-        <w:jc w:val="center"/>
-        <w:tblLayout w:type="fixed"/>
-        <w:tblCellMar>
-          <w:left w:w="57" w:type="dxa"/>
-          <w:right w:w="57" w:type="dxa"/>
-        </w:tblCellMar>
-        <w:tblLook w:firstRow="1" w:lastRow="0" w:firstColumn="0" w:lastColumn="0" w:noHBand="0" w:noVBand="0" w:val="0020"/>
-        <w:tblCaption w:val="Table 3 TBLBRK Twelve Steps and the v1 Gaps They Address."/>
-      </w:tblPr>
-      <w:tblGrid>
-        <w:gridCol w:w="1134"/>
-        <w:gridCol w:w="7938"/>
-      </w:tblGrid>
-      <w:tr>
-        <w:trPr>
-          <w:tblHeader w:val="true"/>
-        </w:trPr>
-        <w:tc>
-          <w:tcPr>
-            <w:tcW w:w="1134" w:type="dxa"/>
-            <w:tcBorders>
-              <w:top w:val="single" w:sz="8" w:color="000000"/>
-              <w:bottom w:val="single" w:sz="4" w:color="000000"/>
-            </w:tcBorders>
-          </w:tcPr>
-          <w:p>
-            <w:pPr>
-              <w:pStyle w:val="Compact"/>
-              <w:spacing w:line="240" w:lineRule="auto" w:after="0"/>
-              <w:jc w:val="center"/>
-            </w:pPr>
-            <w:r>
-              <w:rPr>
-                <w:sz w:val="17"/>
-              </w:rPr>
-              <w:t xml:space="preserve">Step</w:t>
-            </w:r>
-          </w:p>
-        </w:tc>
-        <w:tc>
-          <w:tcPr>
-            <w:tcW w:w="7938" w:type="dxa"/>
-            <w:tcBorders>
-              <w:top w:val="single" w:sz="8" w:color="000000"/>
-              <w:bottom w:val="single" w:sz="4" w:color="000000"/>
-            </w:tcBorders>
-          </w:tcPr>
-          <w:p>
-            <w:pPr>
-              <w:pStyle w:val="Compact"/>
-              <w:spacing w:line="240" w:lineRule="auto" w:after="0"/>
-              <w:jc w:val="left"/>
-            </w:pPr>
-            <w:r>
-              <w:rPr>
-                <w:sz w:val="17"/>
-              </w:rPr>
-              <w:t xml:space="preserve">Check</w:t>
-            </w:r>
-          </w:p>
-        </w:tc>
-      </w:tr>
-      <w:tr>
-        <w:tc>
-          <w:tcPr>
-            <w:tcW w:w="1134" w:type="dxa"/>
-          </w:tcPr>
-          <w:p>
-            <w:pPr>
-              <w:pStyle w:val="Compact"/>
-              <w:spacing w:line="240" w:lineRule="auto" w:after="0"/>
-              <w:jc w:val="center"/>
-            </w:pPr>
-            <w:r>
-              <w:rPr>
-                <w:sz w:val="17"/>
-              </w:rPr>
-              <w:t xml:space="preserve">0</w:t>
-            </w:r>
-          </w:p>
-        </w:tc>
-        <w:tc>
-          <w:tcPr>
-            <w:tcW w:w="7938" w:type="dxa"/>
-          </w:tcPr>
-          <w:p>
-            <w:pPr>
-              <w:pStyle w:val="Compact"/>
-              <w:spacing w:line="240" w:lineRule="auto" w:after="0"/>
-              <w:jc w:val="left"/>
-            </w:pPr>
-            <w:r>
-              <w:rPr>
-                <w:sz w:val="17"/>
-              </w:rPr>
-              <w:t xml:space="preserve">Proxy block; platform from attestation, never from the header [A]</w:t>
-            </w:r>
-          </w:p>
-        </w:tc>
-      </w:tr>
-      <w:tr>
-        <w:tc>
-          <w:tcPr>
-            <w:tcW w:w="1134" w:type="dxa"/>
-          </w:tcPr>
-          <w:p>
-            <w:pPr>
-              <w:pStyle w:val="Compact"/>
-              <w:spacing w:line="240" w:lineRule="auto" w:after="0"/>
-              <w:jc w:val="center"/>
-            </w:pPr>
-            <w:r>
-              <w:rPr>
-                <w:sz w:val="17"/>
-              </w:rPr>
-              <w:t xml:space="preserve">1</w:t>
-            </w:r>
-          </w:p>
-        </w:tc>
-        <w:tc>
-          <w:tcPr>
-            <w:tcW w:w="7938" w:type="dxa"/>
-          </w:tcPr>
-          <w:p>
-            <w:pPr>
-              <w:pStyle w:val="Compact"/>
-              <w:spacing w:line="240" w:lineRule="auto" w:after="0"/>
-              <w:jc w:val="left"/>
-            </w:pPr>
-            <w:r>
-              <w:rPr>
-                <w:sz w:val="17"/>
-              </w:rPr>
-              <w:t xml:space="preserve">Signed session bound to a fingerprint; 3 requests per session per 10 min [B]</w:t>
-            </w:r>
-          </w:p>
-        </w:tc>
-      </w:tr>
-      <w:tr>
-        <w:tc>
-          <w:tcPr>
-            <w:tcW w:w="1134" w:type="dxa"/>
-          </w:tcPr>
-          <w:p>
-            <w:pPr>
-              <w:pStyle w:val="Compact"/>
-              <w:spacing w:line="240" w:lineRule="auto" w:after="0"/>
-              <w:jc w:val="center"/>
-            </w:pPr>
-            <w:r>
-              <w:rPr>
-                <w:sz w:val="17"/>
-              </w:rPr>
-              <w:t xml:space="preserve">2</w:t>
-            </w:r>
-          </w:p>
-        </w:tc>
-        <w:tc>
-          <w:tcPr>
-            <w:tcW w:w="7938" w:type="dxa"/>
-          </w:tcPr>
-          <w:p>
-            <w:pPr>
-              <w:pStyle w:val="Compact"/>
-              <w:spacing w:line="240" w:lineRule="auto" w:after="0"/>
-              <w:jc w:val="left"/>
-            </w:pPr>
-            <w:r>
-              <w:rPr>
-                <w:sz w:val="17"/>
-              </w:rPr>
-              <w:t xml:space="preserve">Limits per address, /24 and ASN, lower for hosting ASNs [B, F]</w:t>
-            </w:r>
-          </w:p>
-        </w:tc>
-      </w:tr>
-      <w:tr>
-        <w:tc>
-          <w:tcPr>
-            <w:tcW w:w="1134" w:type="dxa"/>
-          </w:tcPr>
-          <w:p>
-            <w:pPr>
-              <w:pStyle w:val="Compact"/>
-              <w:spacing w:line="240" w:lineRule="auto" w:after="0"/>
-              <w:jc w:val="center"/>
-            </w:pPr>
-            <w:r>
-              <w:rPr>
-                <w:sz w:val="17"/>
-              </w:rPr>
-              <w:t xml:space="preserve">3–4</w:t>
-            </w:r>
-          </w:p>
-        </w:tc>
-        <w:tc>
-          <w:tcPr>
-            <w:tcW w:w="7938" w:type="dxa"/>
-          </w:tcPr>
-          <w:p>
-            <w:pPr>
-              <w:pStyle w:val="Compact"/>
-              <w:spacing w:line="240" w:lineRule="auto" w:after="0"/>
-              <w:jc w:val="left"/>
-            </w:pPr>
-            <w:r>
-              <w:rPr>
-                <w:sz w:val="17"/>
-              </w:rPr>
-              <w:t xml:space="preserve">reCAPTCHA v3 threshold and origin check, web only</w:t>
-            </w:r>
-          </w:p>
-        </w:tc>
-      </w:tr>
-      <w:tr>
-        <w:tc>
-          <w:tcPr>
-            <w:tcW w:w="1134" w:type="dxa"/>
-          </w:tcPr>
-          <w:p>
-            <w:pPr>
-              <w:pStyle w:val="Compact"/>
-              <w:spacing w:line="240" w:lineRule="auto" w:after="0"/>
-              <w:jc w:val="center"/>
-            </w:pPr>
-            <w:r>
-              <w:rPr>
-                <w:sz w:val="17"/>
-              </w:rPr>
-              <w:t xml:space="preserve">5</w:t>
-            </w:r>
-          </w:p>
-        </w:tc>
-        <w:tc>
-          <w:tcPr>
-            <w:tcW w:w="7938" w:type="dxa"/>
-          </w:tcPr>
-          <w:p>
-            <w:pPr>
-              <w:pStyle w:val="Compact"/>
-              <w:spacing w:line="240" w:lineRule="auto" w:after="0"/>
-              <w:jc w:val="left"/>
-            </w:pPr>
-            <w:r>
-              <w:rPr>
-                <w:sz w:val="17"/>
-              </w:rPr>
-              <w:t xml:space="preserve">Number intelligence: cost class, sequential numbers, liveness; reads the block’s verdict stage [C, D, G]</w:t>
-            </w:r>
-          </w:p>
-        </w:tc>
-      </w:tr>
-      <w:tr>
-        <w:tc>
-          <w:tcPr>
-            <w:tcW w:w="1134" w:type="dxa"/>
-          </w:tcPr>
-          <w:p>
-            <w:pPr>
-              <w:pStyle w:val="Compact"/>
-              <w:spacing w:line="240" w:lineRule="auto" w:after="0"/>
-              <w:jc w:val="center"/>
-            </w:pPr>
-            <w:r>
-              <w:rPr>
-                <w:sz w:val="17"/>
-              </w:rPr>
-              <w:t xml:space="preserve">6</w:t>
-            </w:r>
-          </w:p>
-        </w:tc>
-        <w:tc>
-          <w:tcPr>
-            <w:tcW w:w="7938" w:type="dxa"/>
-          </w:tcPr>
-          <w:p>
-            <w:pPr>
-              <w:pStyle w:val="Compact"/>
-              <w:spacing w:line="240" w:lineRule="auto" w:after="0"/>
-              <w:jc w:val="left"/>
-            </w:pPr>
-            <w:r>
-              <w:rPr>
-                <w:sz w:val="17"/>
-              </w:rPr>
-              <w:t xml:space="preserve">Body length, excluded numbers; test bypass needs a credential [G]</w:t>
-            </w:r>
-          </w:p>
-        </w:tc>
-      </w:tr>
-      <w:tr>
-        <w:tc>
-          <w:tcPr>
-            <w:tcW w:w="1134" w:type="dxa"/>
-          </w:tcPr>
-          <w:p>
-            <w:pPr>
-              <w:pStyle w:val="Compact"/>
-              <w:spacing w:line="240" w:lineRule="auto" w:after="0"/>
-              <w:jc w:val="center"/>
-            </w:pPr>
-            <w:r>
-              <w:rPr>
-                <w:sz w:val="17"/>
-              </w:rPr>
-              <w:t xml:space="preserve">7</w:t>
-            </w:r>
-          </w:p>
-        </w:tc>
-        <w:tc>
-          <w:tcPr>
-            <w:tcW w:w="7938" w:type="dxa"/>
-          </w:tcPr>
-          <w:p>
-            <w:pPr>
-              <w:pStyle w:val="Compact"/>
-              <w:spacing w:line="240" w:lineRule="auto" w:after="0"/>
-              <w:jc w:val="left"/>
-            </w:pPr>
-            <w:r>
-              <w:rPr>
-                <w:sz w:val="17"/>
-              </w:rPr>
-              <w:t xml:space="preserve">Risk score and tier: allow, delay, challenge, downgrade, block [H]</w:t>
-            </w:r>
-          </w:p>
-        </w:tc>
-      </w:tr>
-      <w:tr>
-        <w:tc>
-          <w:tcPr>
-            <w:tcW w:w="1134" w:type="dxa"/>
-          </w:tcPr>
-          <w:p>
-            <w:pPr>
-              <w:pStyle w:val="Compact"/>
-              <w:spacing w:line="240" w:lineRule="auto" w:after="0"/>
-              <w:jc w:val="center"/>
-            </w:pPr>
-            <w:r>
-              <w:rPr>
-                <w:sz w:val="17"/>
-              </w:rPr>
-              <w:t xml:space="preserve">8</w:t>
-            </w:r>
-          </w:p>
-        </w:tc>
-        <w:tc>
-          <w:tcPr>
-            <w:tcW w:w="7938" w:type="dxa"/>
-          </w:tcPr>
-          <w:p>
-            <w:pPr>
-              <w:pStyle w:val="Compact"/>
-              <w:spacing w:line="240" w:lineRule="auto" w:after="0"/>
-              <w:jc w:val="left"/>
-            </w:pPr>
-            <w:r>
-              <w:rPr>
-                <w:sz w:val="17"/>
-              </w:rPr>
-              <w:t xml:space="preserve">Per-number backoff, 60 s doubling to 1 h, five a day</w:t>
-            </w:r>
-          </w:p>
-        </w:tc>
-      </w:tr>
-      <w:tr>
-        <w:tc>
-          <w:tcPr>
-            <w:tcW w:w="1134" w:type="dxa"/>
-          </w:tcPr>
-          <w:p>
-            <w:pPr>
-              <w:pStyle w:val="Compact"/>
-              <w:spacing w:line="240" w:lineRule="auto" w:after="0"/>
-              <w:jc w:val="center"/>
-            </w:pPr>
-            <w:r>
-              <w:rPr>
-                <w:sz w:val="17"/>
-              </w:rPr>
-              <w:t xml:space="preserve">9</w:t>
-            </w:r>
-          </w:p>
-        </w:tc>
-        <w:tc>
-          <w:tcPr>
-            <w:tcW w:w="7938" w:type="dxa"/>
-          </w:tcPr>
-          <w:p>
-            <w:pPr>
-              <w:pStyle w:val="Compact"/>
-              <w:spacing w:line="240" w:lineRule="auto" w:after="0"/>
-              <w:jc w:val="left"/>
-            </w:pPr>
-            <w:r>
-              <w:rPr>
-                <w:sz w:val="17"/>
-              </w:rPr>
-              <w:t xml:space="preserve">Per-source, platform and country caps with an adaptive multiplier</w:t>
-            </w:r>
-          </w:p>
-        </w:tc>
-      </w:tr>
-      <w:tr>
-        <w:tc>
-          <w:tcPr>
-            <w:tcW w:w="1134" w:type="dxa"/>
-          </w:tcPr>
-          <w:p>
-            <w:pPr>
-              <w:pStyle w:val="Compact"/>
-              <w:spacing w:line="240" w:lineRule="auto" w:after="0"/>
-              <w:jc w:val="center"/>
-            </w:pPr>
-            <w:r>
-              <w:rPr>
-                <w:sz w:val="17"/>
-              </w:rPr>
-              <w:t xml:space="preserve">10</w:t>
-            </w:r>
-          </w:p>
-        </w:tc>
-        <w:tc>
-          <w:tcPr>
-            <w:tcW w:w="7938" w:type="dxa"/>
-          </w:tcPr>
-          <w:p>
-            <w:pPr>
-              <w:pStyle w:val="Compact"/>
-              <w:spacing w:line="240" w:lineRule="auto" w:after="0"/>
-              <w:jc w:val="left"/>
-            </w:pPr>
-            <w:r>
-              <w:rPr>
-                <w:sz w:val="17"/>
-              </w:rPr>
-              <w:t xml:space="preserve">Operating mode: elevated above 80% of the hourly budget, emergency at 100% [E]</w:t>
-            </w:r>
-          </w:p>
-        </w:tc>
-      </w:tr>
-      <w:tr>
-        <w:tc>
-          <w:tcPr>
-            <w:tcW w:w="1134" w:type="dxa"/>
-          </w:tcPr>
-          <w:p>
-            <w:pPr>
-              <w:pStyle w:val="Compact"/>
-              <w:spacing w:line="240" w:lineRule="auto" w:after="0"/>
-              <w:jc w:val="center"/>
-            </w:pPr>
-            <w:r>
-              <w:rPr>
-                <w:sz w:val="17"/>
-              </w:rPr>
-              <w:t xml:space="preserve">11</w:t>
-            </w:r>
-          </w:p>
-        </w:tc>
-        <w:tc>
-          <w:tcPr>
-            <w:tcW w:w="7938" w:type="dxa"/>
-          </w:tcPr>
-          <w:p>
-            <w:pPr>
-              <w:pStyle w:val="Compact"/>
-              <w:spacing w:line="240" w:lineRule="auto" w:after="0"/>
-              <w:jc w:val="left"/>
-            </w:pPr>
-            <w:r>
-              <w:rPr>
-                <w:sz w:val="17"/>
-              </w:rPr>
-              <w:t xml:space="preserve">Reserve hourly count, spend and any destination slot; write state; enqueue; uniform response [E, H]</w:t>
-            </w:r>
-          </w:p>
-        </w:tc>
-      </w:tr>
-      <w:tr>
-        <w:tc>
-          <w:tcPr>
-            <w:tcW w:w="1134" w:type="dxa"/>
-            <w:tcBorders>
-              <w:bottom w:val="single" w:sz="8" w:color="000000"/>
-            </w:tcBorders>
-          </w:tcPr>
-          <w:p>
-            <w:pPr>
-              <w:pStyle w:val="Compact"/>
-              <w:spacing w:line="240" w:lineRule="auto" w:after="0"/>
-              <w:jc w:val="center"/>
-            </w:pPr>
-            <w:r>
-              <w:rPr>
-                <w:sz w:val="17"/>
-              </w:rPr>
-              <w:t xml:space="preserve">FB</w:t>
-            </w:r>
-          </w:p>
-        </w:tc>
-        <w:tc>
-          <w:tcPr>
-            <w:tcW w:w="7938" w:type="dxa"/>
-            <w:tcBorders>
-              <w:bottom w:val="single" w:sz="8" w:color="000000"/>
-            </w:tcBorders>
-          </w:tcPr>
-          <w:p>
-            <w:pPr>
-              <w:pStyle w:val="Compact"/>
-              <w:spacing w:line="240" w:lineRule="auto" w:after="0"/>
-              <w:jc w:val="left"/>
-            </w:pPr>
-            <w:r>
-              <w:rPr>
-                <w:sz w:val="17"/>
-              </w:rPr>
-              <w:t xml:space="preserve">Outcomes per key; destination-block tests; denylist of fine keys</w:t>
-            </w:r>
-          </w:p>
-        </w:tc>
-      </w:tr>
-    </w:tbl>
+    <w:bookmarkEnd w:id="38"/>
+    <w:bookmarkStart w:id="42" w:name="the-pipeline-and-the-risk-score"/>
+    <w:p>
+      <w:pPr>
+        <w:pStyle w:val="Heading2"/>
+      </w:pPr>
+      <w:r>
+        <w:rPr>
+          <w:rStyle w:val="SectionNumber"/>
+        </w:rPr>
+        <w:t xml:space="preserve">3.3</w:t>
+      </w:r>
+      <w:r>
+        <w:tab/>
+      </w:r>
+      <w:r>
+        <w:t xml:space="preserve">The pipeline and the risk score</w:t>
+      </w:r>
+    </w:p>
+    <w:p>
+      <w:pPr>
+        <w:pStyle w:val="FirstParagraph"/>
+      </w:pPr>
+      <w:r>
+        <w:t xml:space="preserve">No message is paid for before every check passes, and cheap checks run first. Trust comes from evidence the client cannot forge, an attestation, a server-signed session, and the fate of earlier codes, though such evidence can be manufactured (Section 5.8). A request passes the twelve steps of Figure 3, which marks on each step the gaps of Section 3.1 it closes (FB: the feedback loop), until it is refused. Step 0 takes the platform only from a valid App Attest or Play Integrity result. Each limit and reservation is one atomic Redis operation, but the enclosing steps are not one transaction: on the normal path, a refused request returns its per-number claims and counter slot, and the hourly budget is reserved only for a message about to be enqueued, a reservation rather than a completed dispatch; a crash between them can leak reservations (Section 4). Address limits and source caps count requests, except that a request Step 11 challenges returns its source-cap count. Every outcome after Step 0, except the challenge, returns one HTTP 200 body after at least 400 ms, a floor that cannot hide longer work.</w:t>
+      </w:r>
+    </w:p>
+    <w:p>
+      <w:pPr>
+        <w:pStyle w:val="CaptionedFigure"/>
+      </w:pPr>
+      <w:r>
+        <w:drawing>
+          <wp:inline>
+            <wp:extent cx="5334000" cy="2502185"/>
+            <wp:effectExtent b="0" l="0" r="0" t="0"/>
+            <wp:docPr descr="" title="" id="40" name="Picture"/>
+            <a:graphic>
+              <a:graphicData uri="http://schemas.openxmlformats.org/drawingml/2006/picture">
+                <pic:pic>
+                  <pic:nvPicPr>
+                    <pic:cNvPr descr="figures/fig10_steps.png" id="41" name="Picture"/>
+                    <pic:cNvPicPr>
+                      <a:picLocks noChangeArrowheads="1" noChangeAspect="1"/>
+                    </pic:cNvPicPr>
+                  </pic:nvPicPr>
+                  <pic:blipFill>
+                    <a:blip r:embed="rId39"/>
+                    <a:stretch>
+                      <a:fillRect/>
+                    </a:stretch>
+                  </pic:blipFill>
+                  <pic:spPr bwMode="auto">
+                    <a:xfrm>
+                      <a:off x="0" y="0"/>
+                      <a:ext cx="5334000" cy="2502185"/>
+                    </a:xfrm>
+                    <a:prstGeom prst="rect">
+                      <a:avLst/>
+                    </a:prstGeom>
+                    <a:noFill/>
+                    <a:ln w="9525">
+                      <a:noFill/>
+                      <a:headEnd/>
+                      <a:tailEnd/>
+                    </a:ln>
+                  </pic:spPr>
+                </pic:pic>
+              </a:graphicData>
+            </a:graphic>
+          </wp:inline>
+        </w:drawing>
+      </w:r>
+    </w:p>
+    <w:p>
+      <w:pPr>
+        <w:pStyle w:val="ImageCaption"/>
+      </w:pPr>
+      <w:r>
+        <w:rPr>
+          <w:bCs/>
+          <w:b/>
+        </w:rPr>
+        <w:t xml:space="preserve">Fig. 3.</w:t>
+      </w:r>
+      <w:r>
+        <w:t xml:space="preserve"> </w:t>
+      </w:r>
+      <w:r>
+        <w:t xml:space="preserve">The Twelve Steps of the Design and the Feedback Loop.</w:t>
+      </w:r>
+    </w:p>
     <w:p>
       <w:pPr>
         <w:pStyle w:val="BodyText"/>
@@ -3245,8 +2358,8 @@
         <w:t xml:space="preserve">.</w:t>
       </w:r>
     </w:p>
-    <w:bookmarkEnd w:id="33"/>
-    <w:bookmarkStart w:id="34" w:name="the-feedback-loop"/>
+    <w:bookmarkEnd w:id="42"/>
+    <w:bookmarkStart w:id="43" w:name="the-feedback-loop"/>
     <w:p>
       <w:pPr>
         <w:pStyle w:val="Heading2"/>
@@ -3320,8 +2433,8 @@
         <w:t xml:space="preserve">without a receipt in 60 s or with a failed receipt; only the first two count toward reputation. A positive receipt after a negative one reopens the send; a late verification reclassifies it, but an issued verdict stands. Each transition records its effects and its time in the same compare-and-set, and a recovery sweep completes the work of a dead process; each effect type applies at most once, and exactly once if the sweep runs within 20 minutes. Reputation counts land in the transition’s hour, and a block keeps its latest outage failure time; however, a block’s statistic accumulates in processing order, and a verdict is dated at the event that completes the crossing; thus, a late event can backdate a verdict that contains later evidence, moving its expiry and the next test’s start (by 10 min in one diagnostic). Simulated runs apply events in time order, but concurrent live instances may not, because a transition is committed before its effects apply; thus, the same dependence holds live unless a block’s effects are serialized.</w:t>
       </w:r>
     </w:p>
-    <w:bookmarkEnd w:id="34"/>
-    <w:bookmarkStart w:id="37" w:name="destination-policies"/>
+    <w:bookmarkEnd w:id="43"/>
+    <w:bookmarkStart w:id="46" w:name="destination-policies"/>
     <w:p>
       <w:pPr>
         <w:pStyle w:val="Heading2"/>
@@ -3347,7 +2460,7 @@
         <w:t xml:space="preserve">A pumper is confined to its partner’s ranges but can rotate numbers and blocks within them. Destination policies are keyed on the 8-digit block (10 000 numbers); therefore, protection weakens as a pumper spreads.</w:t>
       </w:r>
     </w:p>
-    <w:bookmarkStart w:id="35" w:name="sequential-tests"/>
+    <w:bookmarkStart w:id="44" w:name="sequential-tests"/>
     <w:p>
       <w:pPr>
         <w:pStyle w:val="Heading3"/>
@@ -3866,8 +2979,8 @@
         <w:t xml:space="preserve">. A first verdict makes the block’s first-time clients pass a challenge for an hour; a second within the hour moves them off SMS, refusing those without another channel.</w:t>
       </w:r>
     </w:p>
-    <w:bookmarkEnd w:id="35"/>
-    <w:bookmarkStart w:id="36" w:name="counters"/>
+    <w:bookmarkEnd w:id="44"/>
+    <w:bookmarkStart w:id="45" w:name="counters"/>
     <w:p>
       <w:pPr>
         <w:pStyle w:val="Heading3"/>
@@ -3893,9 +3006,9 @@
         <w:t xml:space="preserve">A counter limits the number of SMS sent per block in a daily or short refilling window. Step 11 reserves a slot and decides the stage in one atomic operation when an SMS is about to be sent, so concurrent requests cannot skip the challenge. Past the limit, a graded counter challenges first-time clients, and past twice the limit moves them off SMS; a refusing counter refuses. Clients with verified history are exempt from both policies; therefore, a code entered on a pumper’s number can buy that number an exemption. A token bucket of the same rate (burst 4 or 12; its challenge-tier bucket refills independently, unlike RFC 2697’s (Heinanen and Guerin, 1999)) and the counter combined with the tests were also explored.</w:t>
       </w:r>
     </w:p>
-    <w:bookmarkEnd w:id="36"/>
-    <w:bookmarkEnd w:id="37"/>
-    <w:bookmarkStart w:id="38" w:name="capacity-controls"/>
+    <w:bookmarkEnd w:id="45"/>
+    <w:bookmarkEnd w:id="46"/>
+    <w:bookmarkStart w:id="47" w:name="capacity-controls"/>
     <w:p>
       <w:pPr>
         <w:pStyle w:val="Heading2"/>
@@ -3921,8 +3034,8 @@
         <w:t xml:space="preserve">Step 9 multiplies its caps by 0.25 to 1.5 according to a baseline job comparing each key with its expected rate, learned from the pipeline’s hourly counters; without history, the static cap stands. Verified history avoids adaptive reduction, not the static caps or the budget, which bounds SMS count and spend, not vendor or fallback costs.</w:t>
       </w:r>
     </w:p>
-    <w:bookmarkEnd w:id="38"/>
-    <w:bookmarkStart w:id="39" w:name="Xf0c979229eb29cff3cf30892b5e34effc1bec32"/>
+    <w:bookmarkEnd w:id="47"/>
+    <w:bookmarkStart w:id="48" w:name="Xf0c979229eb29cff3cf30892b5e34effc1bec32"/>
     <w:p>
       <w:pPr>
         <w:pStyle w:val="Heading2"/>
@@ -5190,9 +4303,9 @@
         <w:t xml:space="preserve">. This is not a challenge rate: exempt clients take slots without challenge, and challenge failures, the second tier and earlier gates are ignored. The estimates use only the rules, configuration, and attack rate; what an excess send costs a user needs the simulation.</w:t>
       </w:r>
     </w:p>
-    <w:bookmarkEnd w:id="39"/>
-    <w:bookmarkEnd w:id="40"/>
-    <w:bookmarkStart w:id="45" w:name="methodology"/>
+    <w:bookmarkEnd w:id="48"/>
+    <w:bookmarkEnd w:id="49"/>
+    <w:bookmarkStart w:id="54" w:name="methodology"/>
     <w:p>
       <w:pPr>
         <w:pStyle w:val="Heading1"/>
@@ -5210,7 +4323,7 @@
         <w:t xml:space="preserve">Methodology</w:t>
       </w:r>
     </w:p>
-    <w:bookmarkStart w:id="41" w:name="implementation"/>
+    <w:bookmarkStart w:id="50" w:name="implementation"/>
     <w:p>
       <w:pPr>
         <w:pStyle w:val="Heading2"/>
@@ -5248,8 +4361,8 @@
         <w:t xml:space="preserve">, 18 tested specific interleavings of two instances, not all. Step 11 was still not one transaction: a crash after its reservations leaked reserved slots or resolved the send as undelivered. The implementation was a research prototype.</w:t>
       </w:r>
     </w:p>
-    <w:bookmarkEnd w:id="41"/>
-    <w:bookmarkStart w:id="42" w:name="simulation"/>
+    <w:bookmarkEnd w:id="50"/>
+    <w:bookmarkStart w:id="51" w:name="simulation"/>
     <w:p>
       <w:pPr>
         <w:pStyle w:val="Heading2"/>
@@ -5280,7 +4393,7 @@
         <w:pStyle w:val="BodyText"/>
       </w:pPr>
       <w:r>
-        <w:t xml:space="preserve">Three behavioral parameters have published counterparts: genuine conversion (one provider’s 68% or more (Twilio Inc., 2026b); ours 60%–90%) and the never-converting destinations and identity churn of Section 2; the rest are assumptions. Table 4 groups the attacker profiles by capability and marks the destination policies each faced (S, sequential tests; C, counters; B, block-limit; parameters in</w:t>
+        <w:t xml:space="preserve">Three behavioral parameters have published counterparts: genuine conversion (one provider’s 68% or more (Twilio Inc., 2026b); ours 60%–90%) and the never-converting destinations and identity churn of Section 2; the rest are assumptions. Table 2 groups the attacker profiles by capability and marks the destination policies each faced (S, sequential tests; C, counters; B, block-limit; parameters in</w:t>
       </w:r>
       <w:r>
         <w:t xml:space="preserve"> </w:t>
@@ -5295,8 +4408,8 @@
         <w:t xml:space="preserve">). Attackers draw pool size, rate, and CAPTCHA class per seed, which explains 92% [80, 98] of the variance of the farm’s leakage in a nested design (ten configurations, three seeds each). Brackets in the text and tables, and bars and bands in the figures, are 95% percentile-bootstrap intervals over seeds, paired per seed for differences; they describe variation under this generator, not uncertainty about real traffic.</w:t>
       </w:r>
     </w:p>
-    <w:bookmarkEnd w:id="42"/>
-    <w:bookmarkStart w:id="43" w:name="two-protocols-and-their-chronology"/>
+    <w:bookmarkEnd w:id="51"/>
+    <w:bookmarkStart w:id="52" w:name="two-protocols-and-their-chronology"/>
     <w:p>
       <w:pPr>
         <w:pStyle w:val="Heading2"/>
@@ -5370,8 +4483,8 @@
         <w:t xml:space="preserve">300 under both protocols (artifact change report).</w:t>
       </w:r>
     </w:p>
-    <w:bookmarkEnd w:id="43"/>
-    <w:bookmarkStart w:id="44" w:name="designs-and-metrics"/>
+    <w:bookmarkEnd w:id="52"/>
+    <w:bookmarkStart w:id="53" w:name="designs-and-metrics"/>
     <w:p>
       <w:pPr>
         <w:pStyle w:val="Heading2"/>
@@ -5589,7 +4702,7 @@
           <w:bCs/>
           <w:b/>
         </w:rPr>
-        <w:t xml:space="preserve">Table 4</w:t>
+        <w:t xml:space="preserve">Table 2</w:t>
       </w:r>
       <w:r>
         <w:t xml:space="preserve"> </w:t>
@@ -5610,7 +4723,7 @@
           <w:right w:w="57" w:type="dxa"/>
         </w:tblCellMar>
         <w:tblLook w:firstRow="1" w:lastRow="0" w:firstColumn="0" w:lastColumn="0" w:noHBand="0" w:noVBand="0" w:val="0020"/>
-        <w:tblCaption w:val="Table 4 TBLBRK Attacker Profiles, Capabilities, and Policies."/>
+        <w:tblCaption w:val="Table 2 TBLBRK Attacker Profiles, Capabilities, and Policies."/>
       </w:tblPr>
       <w:tblGrid>
         <w:gridCol w:w="3771"/>
@@ -6076,9 +5189,9 @@
         </w:tc>
       </w:tr>
     </w:tbl>
-    <w:bookmarkEnd w:id="44"/>
-    <w:bookmarkEnd w:id="45"/>
-    <w:bookmarkStart w:id="66" w:name="results"/>
+    <w:bookmarkEnd w:id="53"/>
+    <w:bookmarkEnd w:id="54"/>
+    <w:bookmarkStart w:id="75" w:name="results"/>
     <w:p>
       <w:pPr>
         <w:pStyle w:val="Heading1"/>
@@ -6096,7 +5209,7 @@
         <w:t xml:space="preserve">Results</w:t>
       </w:r>
     </w:p>
-    <w:bookmarkStart w:id="46" w:name="rq1-what-is-contained-and-at-what-cost"/>
+    <w:bookmarkStart w:id="55" w:name="what-is-contained-and-at-what-cost"/>
     <w:p>
       <w:pPr>
         <w:pStyle w:val="Heading2"/>
@@ -6111,7 +5224,7 @@
         <w:tab/>
       </w:r>
       <w:r>
-        <w:t xml:space="preserve">RQ1: what is contained, and at what cost</w:t>
+        <w:t xml:space="preserve">What is contained, and at what cost</w:t>
       </w:r>
     </w:p>
     <w:p>
@@ -6123,7 +5236,7 @@
           <w:bCs/>
           <w:b/>
         </w:rPr>
-        <w:t xml:space="preserve">Table 5</w:t>
+        <w:t xml:space="preserve">Table 3</w:t>
       </w:r>
       <w:r>
         <w:t xml:space="preserve"> </w:t>
@@ -6144,7 +5257,7 @@
           <w:right w:w="57" w:type="dxa"/>
         </w:tblCellMar>
         <w:tblLook w:firstRow="0" w:lastRow="0" w:firstColumn="0" w:lastColumn="0" w:noHBand="0" w:noVBand="0" w:val="0000"/>
-        <w:tblCaption w:val="Table 5 TBLBRK Leakage and User Impact Across Designs."/>
+        <w:tblCaption w:val="Table 3 TBLBRK Leakage and User Impact Across Designs."/>
       </w:tblPr>
       <w:tblGrid>
         <w:gridCol w:w="2801"/>
@@ -7543,7 +6656,7 @@
         <w:pStyle w:val="BodyText"/>
       </w:pPr>
       <w:r>
-        <w:t xml:space="preserve">Table 5 gives the leaked share (%, mean of per-run shares) of about 600 attack requests in 20 minutes over 30 seeds under v1, block-limit (BL) and v2 with source caps lifted, and under v2 with caps on, with the first-time users refused and all users completing (%); supplementary Table S1 (</w:t>
+        <w:t xml:space="preserve">Table 3 gives the leaked share (%, mean of per-run shares) of about 600 attack requests in 20 minutes over 30 seeds under v1, block-limit (BL) and v2 with source caps lifted, and under v2 with caps on, with the first-time users refused and all users completing (%); supplementary Table S1 (</w:t>
       </w:r>
       <w:r>
         <w:rPr>
@@ -7552,7 +6665,7 @@
         <w:t xml:space="preserve">results/ design_table.md</w:t>
       </w:r>
       <w:r>
-        <w:t xml:space="preserve">) gives every design with intervals. Datacenter rotation leaks nothing under v2 because it scores in the challenge tier and declines challenges; Step 5 refuses the premium range, and the session cap holds the single client to two messages (Table 5); in all 108 robustness cells, these attacks leaked under 5% at completion within two points of the paired no-attack run (claim C1). The walk leaks 61 [53, 70] messages before its block’s verdict (block-limit: five), and the reused profile 89 [83, 95].</w:t>
+        <w:t xml:space="preserve">) gives every design with intervals. Datacenter rotation leaks nothing under v2 because it scores in the challenge tier and declines challenges; Step 5 refuses the premium range, and the session cap holds the single client to two messages (Table 3); in all 108 robustness cells, these attacks leaked under 5% at completion within two points of the paired no-attack run (claim C1). The walk leaks 61 [53, 70] messages before its block’s verdict (block-limit: five), and the reused profile 89 [83, 95].</w:t>
       </w:r>
     </w:p>
     <w:p>
@@ -7563,8 +6676,8 @@
         <w:t xml:space="preserve">The farm leaks 99.5% with caps lifted under every design; v2’s adaptive cap holds it to 229 [215, 244] messages, 46%, by refusing 54% [47, 60] of first-time users, so 45.5% complete instead of 76.4% under v1: rationing (claim C5 held in 36 of 36 cells).</w:t>
       </w:r>
     </w:p>
-    <w:bookmarkEnd w:id="46"/>
-    <w:bookmarkStart w:id="47" w:name="rq2-conditional-effects-of-each-layer"/>
+    <w:bookmarkEnd w:id="55"/>
+    <w:bookmarkStart w:id="56" w:name="conditional-effects-of-each-layer"/>
     <w:p>
       <w:pPr>
         <w:pStyle w:val="Heading2"/>
@@ -7579,7 +6692,7 @@
         <w:tab/>
       </w:r>
       <w:r>
-        <w:t xml:space="preserve">RQ2: conditional effects of each layer</w:t>
+        <w:t xml:space="preserve">Conditional effects of each layer</w:t>
       </w:r>
     </w:p>
     <w:p>
@@ -7641,8 +6754,8 @@
         <w:t xml:space="preserve">]).</w:t>
       </w:r>
     </w:p>
-    <w:bookmarkEnd w:id="47"/>
-    <w:bookmarkStart w:id="48" w:name="rq3-where-reputation-stops-separating"/>
+    <w:bookmarkEnd w:id="56"/>
+    <w:bookmarkStart w:id="57" w:name="where-reputation-stops-separating"/>
     <w:p>
       <w:pPr>
         <w:pStyle w:val="Heading2"/>
@@ -7657,7 +6770,7 @@
         <w:tab/>
       </w:r>
       <w:r>
-        <w:t xml:space="preserve">RQ3: where reputation stops separating</w:t>
+        <w:t xml:space="preserve">Where reputation stops separating</w:t>
       </w:r>
     </w:p>
     <w:p>
@@ -7668,8 +6781,8 @@
         <w:t xml:space="preserve">A farmed-CAPTCHA attacker uses an address and fingerprint once and shares its country, prefix, and residential ASN with every legitimate user; thus, its failures penalize everyone: over an hour with caps lifted (five seeds), up to twice the legitimate rate, 99 to 100% of it leaks, since a shared key stays above 0.3 conversion until failures outnumber legitimate sends about 1.7 to one. At ten times, 70% leaks while 17% of legitimate users are challenged and 3.2% refused (claim C2, at least 90% leaked with caps lifted, held in 34 of 36 cells). No single score change separates better: a fresh-fingerprint weight of 40 stops it only by challenging 47% of legitimate users. In the settings run, reputation separated an attacker only on keys its sends dominated (Douceur, 2002).</w:t>
       </w:r>
     </w:p>
-    <w:bookmarkEnd w:id="48"/>
-    <w:bookmarkStart w:id="49" w:name="Xc07daa08c7787c54feae400d5f00a63594cbc0c"/>
+    <w:bookmarkEnd w:id="57"/>
+    <w:bookmarkStart w:id="58" w:name="X8a568645334fc3fb236cc988735ae19f7dbdc70"/>
     <w:p>
       <w:pPr>
         <w:pStyle w:val="Heading2"/>
@@ -7684,7 +6797,7 @@
         <w:tab/>
       </w:r>
       <w:r>
-        <w:t xml:space="preserve">RQ4: what rationing costs, and what it depends on</w:t>
+        <w:t xml:space="preserve">What rationing costs, and what it depends on</w:t>
       </w:r>
     </w:p>
     <w:p>
@@ -7695,8 +6808,8 @@
         <w:t xml:space="preserve">When separation fails, the cap is the lever: over ten seeds, the default lets 47% of the farm’s requests through and refuses 41% of all legitimate users, the tightest setting 20% and 64%. Both assume an oracle job that is told the legitimate rate and runs every minute; running every five minutes or hourly, it lets 75%–96% through. Learning the rate from the pipeline’s counters, the deployed job leaks 193 [161, 229] messages with a clean three-week profile, 340 [239, 441] more on a cold start, 106 [62, 151] more with a stale profile, and 45 [10, 77] more with a poisoned one.</w:t>
       </w:r>
     </w:p>
-    <w:bookmarkEnd w:id="49"/>
-    <w:bookmarkStart w:id="50" w:name="pumping-against-the-sequential-tests"/>
+    <w:bookmarkEnd w:id="58"/>
+    <w:bookmarkStart w:id="59" w:name="pumping-against-the-sequential-tests"/>
     <w:p>
       <w:pPr>
         <w:pStyle w:val="Heading2"/>
@@ -7723,7 +6836,7 @@
           <w:bCs/>
           <w:b/>
         </w:rPr>
-        <w:t xml:space="preserve">Table 6</w:t>
+        <w:t xml:space="preserve">Table 4</w:t>
       </w:r>
       <w:r>
         <w:t xml:space="preserve"> </w:t>
@@ -7744,7 +6857,7 @@
           <w:right w:w="57" w:type="dxa"/>
         </w:tblCellMar>
         <w:tblLook w:firstRow="0" w:lastRow="0" w:firstColumn="0" w:lastColumn="0" w:noHBand="0" w:noVBand="0" w:val="0000"/>
-        <w:tblCaption w:val="Table 6 TBLBRK Containment Results for Concentrated Pumping Attacks."/>
+        <w:tblCaption w:val="Table 4 TBLBRK Containment Results for Concentrated Pumping Attacks."/>
       </w:tblPr>
       <w:tblGrid>
         <w:gridCol w:w="2918"/>
@@ -8687,7 +7800,7 @@
         <w:pStyle w:val="BodyText"/>
       </w:pPr>
       <w:r>
-        <w:t xml:space="preserve">Table 6 covers concentrated pumpers on three blocks with caps lifted over ten seeds: messages leaked of about 574 requests in 20 minutes, seeds contained, mean minutes to containment (contained seeds) and to the first verdict (seeds with one), and codes entered. The speed test catches a carrier verifying within a second at 19 messages, while the carrier verifying 60% with human-like delay is contained in none of the ten 20-minute runs: its first verdict comes at minute 11.6 on average and 452 messages leak; in an hour, 1 067 leak and two of ten runs are contained, at minute 47.0 on average. Claim C3 (containment with at most 30% leaked) held in 36 of 36 cells.</w:t>
+        <w:t xml:space="preserve">Table 4 covers concentrated pumpers on three blocks with caps lifted over ten seeds: messages leaked of about 574 requests in 20 minutes, seeds contained, mean minutes to containment (contained seeds) and to the first verdict (seeds with one), and codes entered. The speed test catches a carrier verifying within a second at 19 messages, while the carrier verifying 60% with human-like delay is contained in none of the ten 20-minute runs: its first verdict comes at minute 11.6 on average and 452 messages leak; in an hour, 1 067 leak and two of ten runs are contained, at minute 47.0 on average. Claim C3 (containment with at most 30% leaked) held in 36 of 36 cells.</w:t>
       </w:r>
     </w:p>
     <w:p>
@@ -8698,8 +7811,8 @@
         <w:t xml:space="preserve">Across 18 spread configurations, leakage follows the blocks touched: with 30 blocks, five to seven runs in ten are still contained. Unsaturated, Equation (2) errs by 1.6 to 7.9 messages per run (1%–13%, ten configurations); saturated, it overstates by up to 91.</w:t>
       </w:r>
     </w:p>
-    <w:bookmarkEnd w:id="50"/>
-    <w:bookmarkStart w:id="63" w:name="Xc3b3a0ae0d7ddd12dca67a47167dca0c845034c"/>
+    <w:bookmarkEnd w:id="59"/>
+    <w:bookmarkStart w:id="72" w:name="Xc3b3a0ae0d7ddd12dca67a47167dca0c845034c"/>
     <w:p>
       <w:pPr>
         <w:pStyle w:val="Heading2"/>
@@ -8726,7 +7839,7 @@
           <w:bCs/>
           <w:b/>
         </w:rPr>
-        <w:t xml:space="preserve">Table 7</w:t>
+        <w:t xml:space="preserve">Table 5</w:t>
       </w:r>
       <w:r>
         <w:t xml:space="preserve"> </w:t>
@@ -8747,7 +7860,7 @@
           <w:right w:w="57" w:type="dxa"/>
         </w:tblCellMar>
         <w:tblLook w:firstRow="1" w:lastRow="0" w:firstColumn="0" w:lastColumn="0" w:noHBand="0" w:noVBand="0" w:val="0020"/>
-        <w:tblCaption w:val="Table 7 TBLBRK Leakage and Benign-User Impact Across Carrier Types."/>
+        <w:tblCaption w:val="Table 5 TBLBRK Leakage and Benign-User Impact Across Carrier Types."/>
       </w:tblPr>
       <w:tblGrid>
         <w:gridCol w:w="4053"/>
@@ -9891,7 +9004,7 @@
         </w:tc>
       </w:tr>
     </w:tbl>
-    <w:bookmarkStart w:id="57" w:name="at-a-benign-service-target"/>
+    <w:bookmarkStart w:id="66" w:name="at-a-benign-service-target"/>
     <w:p>
       <w:pPr>
         <w:pStyle w:val="Heading3"/>
@@ -9914,7 +9027,7 @@
         <w:pStyle w:val="FirstParagraph"/>
       </w:pPr>
       <w:r>
-        <w:t xml:space="preserve">Table 7 reports the first protocol at 200 blocks (144 legitimate sends per block a day; tuning seeds 100–102, evaluation seeds 0–9): 20-minute leakage against the never-verifying (NV), instant (IV), human-like (HL) and challenge-buying (CB) carriers and, from 24-hour attack-free runs at 65% conversion, completion, benign cost (points), users challenged and verdict events a day; the tuning target is 63.95%. Figure 2 plots each setting’s completion against its leakage summed over the four pumpers’ runs of a seed (not one combined attack), with the tuning target dotted; its unlabeled points are sequential settings matched to the default’s false alarms at other credits (key:</w:t>
+        <w:t xml:space="preserve">Table 5 reports the first protocol at 200 blocks (144 legitimate sends per block a day; tuning seeds 100–102, evaluation seeds 0–9): 20-minute leakage against the never-verifying (NV), instant (IV), human-like (HL) and challenge-buying (CB) carriers and, from 24-hour attack-free runs at 65% conversion, completion, benign cost (points), users challenged and verdict events a day; the tuning target is 63.95%. Figure 4 plots each setting’s completion against its leakage summed over the four pumpers’ runs of a seed (not one combined attack), with the tuning target dotted; its unlabeled points are sequential settings matched to the default’s false alarms at other credits (key:</w:t>
       </w:r>
       <w:r>
         <w:t xml:space="preserve"> </w:t>
@@ -9926,7 +9039,7 @@
         <w:t xml:space="preserve">results/ figure1_key.md</w:t>
       </w:r>
       <w:r>
-        <w:t xml:space="preserve">). Figure 3 gives each selected setting’s leakage minus the default’s, paired per seed (negative: leaks less). The sequential setting selected at the tuning target holds the human-like carrier to 126 messages only by raising 334 false verdict events a day, and misses the target by 0.18 points on seeds 0–9. The graded counter of four sends per block per ten minutes leaks 24 against each outcome-reading carrier and 48 against the challenge buyer, at 0.06 points; counters selected at the sparser settings leak 6 to 18 at 0.15 to 0.35 points (up to 0.43 at 80%). With the full grid and density-specific attacks (E5) the rule selects the same counters, and so do other objectives on the tuning runs (worst-case leakage, a first-time-loss constraint, each attacker alone, 2 000 random mixes), except the instant verifier alone and 3 mixes at 200 blocks; on fresh seeds the counter leaked least of the winners against every attacker but the instant verifier (25, against 15 and 16). On seeds 300–309 the 1 000-block counter falls 0.12 points below its target, yet no seed-and-conversion cell fails the paired check (the evaluation default minus 0.5 points).</w:t>
+        <w:t xml:space="preserve">). Figure 5 gives each selected setting’s leakage minus the default’s, paired per seed (negative: leaks less). The sequential setting selected at the tuning target holds the human-like carrier to 126 messages only by raising 334 false verdict events a day, and misses the target by 0.18 points on seeds 0–9. The graded counter of four sends per block per ten minutes leaks 24 against each outcome-reading carrier and 48 against the challenge buyer, at 0.06 points; counters selected at the sparser settings leak 6 to 18 at 0.15 to 0.35 points (up to 0.43 at 80%). With the full grid and density-specific attacks (E5) the rule selects the same counters, and so do other objectives on the tuning runs (worst-case leakage, a first-time-loss constraint, each attacker alone, 2 000 random mixes), except the instant verifier alone and 3 mixes at 200 blocks; on fresh seeds the counter leaked least of the winners against every attacker but the instant verifier (25, against 15 and 16). On seeds 300–309 the 1 000-block counter falls 0.12 points below its target, yet no seed-and-conversion cell fails the paired check (the evaluation default minus 0.5 points).</w:t>
       </w:r>
     </w:p>
     <w:p>
@@ -9938,18 +9051,18 @@
           <wp:inline>
             <wp:extent cx="5334000" cy="3597348"/>
             <wp:effectExtent b="0" l="0" r="0" t="0"/>
-            <wp:docPr descr="" title="" id="52" name="Picture"/>
+            <wp:docPr descr="" title="" id="61" name="Picture"/>
             <a:graphic>
               <a:graphicData uri="http://schemas.openxmlformats.org/drawingml/2006/picture">
                 <pic:pic>
                   <pic:nvPicPr>
-                    <pic:cNvPr descr="figures/fig6_matched_a.png" id="53" name="Picture"/>
+                    <pic:cNvPr descr="figures/fig6_matched_a.png" id="62" name="Picture"/>
                     <pic:cNvPicPr>
                       <a:picLocks noChangeArrowheads="1" noChangeAspect="1"/>
                     </pic:cNvPicPr>
                   </pic:nvPicPr>
                   <pic:blipFill>
-                    <a:blip r:embed="rId51"/>
+                    <a:blip r:embed="rId60"/>
                     <a:stretch>
                       <a:fillRect/>
                     </a:stretch>
@@ -9985,7 +9098,7 @@
           <w:bCs/>
           <w:b/>
         </w:rPr>
-        <w:t xml:space="preserve">Fig. 2.</w:t>
+        <w:t xml:space="preserve">Fig. 4.</w:t>
       </w:r>
       <w:r>
         <w:t xml:space="preserve"> </w:t>
@@ -10003,18 +9116,18 @@
           <wp:inline>
             <wp:extent cx="5334000" cy="4341627"/>
             <wp:effectExtent b="0" l="0" r="0" t="0"/>
-            <wp:docPr descr="" title="" id="55" name="Picture"/>
+            <wp:docPr descr="" title="" id="64" name="Picture"/>
             <a:graphic>
               <a:graphicData uri="http://schemas.openxmlformats.org/drawingml/2006/picture">
                 <pic:pic>
                   <pic:nvPicPr>
-                    <pic:cNvPr descr="figures/fig6_matched_b.png" id="56" name="Picture"/>
+                    <pic:cNvPr descr="figures/fig6_matched_b.png" id="65" name="Picture"/>
                     <pic:cNvPicPr>
                       <a:picLocks noChangeArrowheads="1" noChangeAspect="1"/>
                     </pic:cNvPicPr>
                   </pic:nvPicPr>
                   <pic:blipFill>
-                    <a:blip r:embed="rId54"/>
+                    <a:blip r:embed="rId63"/>
                     <a:stretch>
                       <a:fillRect/>
                     </a:stretch>
@@ -10050,7 +9163,7 @@
           <w:bCs/>
           <w:b/>
         </w:rPr>
-        <w:t xml:space="preserve">Fig. 3.</w:t>
+        <w:t xml:space="preserve">Fig. 5.</w:t>
       </w:r>
       <w:r>
         <w:t xml:space="preserve"> </w:t>
@@ -10068,7 +9181,7 @@
           <w:bCs/>
           <w:b/>
         </w:rPr>
-        <w:t xml:space="preserve">Table 8</w:t>
+        <w:t xml:space="preserve">Table 6</w:t>
       </w:r>
       <w:r>
         <w:t xml:space="preserve"> </w:t>
@@ -10089,7 +9202,7 @@
           <w:right w:w="57" w:type="dxa"/>
         </w:tblCellMar>
         <w:tblLook w:firstRow="1" w:lastRow="0" w:firstColumn="0" w:lastColumn="0" w:noHBand="0" w:noVBand="0" w:val="0020"/>
-        <w:tblCaption w:val="Table 8 TBLBRK Held-Out Evaluation of the Principal Counter."/>
+        <w:tblCaption w:val="Table 6 TBLBRK Held-Out Evaluation of the Principal Counter."/>
       </w:tblPr>
       <w:tblGrid>
         <w:gridCol w:w="648"/>
@@ -10689,8 +9802,8 @@
         </w:tc>
       </w:tr>
     </w:tbl>
-    <w:bookmarkEnd w:id="57"/>
-    <w:bookmarkStart w:id="58" w:name="under-a-second-protocol"/>
+    <w:bookmarkEnd w:id="66"/>
+    <w:bookmarkStart w:id="67" w:name="under-a-second-protocol"/>
     <w:p>
       <w:pPr>
         <w:pStyle w:val="Heading3"/>
@@ -10713,7 +9826,7 @@
         <w:pStyle w:val="FirstParagraph"/>
       </w:pPr>
       <w:r>
-        <w:t xml:space="preserve">Table 8 covers 12 shifted points of the held-out family, with held-out attack rates and pools, three seeds each and a 20-minute pumper on three blocks real users share; a claim holds if true in 90% of cells, which share workloads and seeds and are not independent, and IV marks the instant verifier’s cells. Frozen and run on this family, the counter leaked 33, 34, 33, and 62 messages against the four carriers, where the default leaked 287, 36, 344, and 287, and no policy 451 to 1 857, at a benign cost of 0.13 [0.09, 0.17] points, and failed both service-under-attack claims: 13 of the 17 cells that broke K3 lie at the three points with the most legitimate traffic, where users and pumper compete for one quota; K5 failed in 51 cells over 11 of 12 points. The counters selected for sparser traffic cost 4.7 and 5.8 points here even without an attack: the quota must match the traffic.</w:t>
+        <w:t xml:space="preserve">Table 6 covers 12 shifted points of the held-out family, with held-out attack rates and pools, three seeds each and a 20-minute pumper on three blocks real users share; a claim holds if true in 90% of cells, which share workloads and seeds and are not independent, and IV marks the instant verifier’s cells. Frozen and run on this family, the counter leaked 33, 34, 33, and 62 messages against the four carriers, where the default leaked 287, 36, 344, and 287, and no policy 451 to 1 857, at a benign cost of 0.13 [0.09, 0.17] points, and failed both service-under-attack claims: 13 of the 17 cells that broke K3 lie at the three points with the most legitimate traffic, where users and pumper compete for one quota; K5 failed in 51 cells over 11 of 12 points. The counters selected for sparser traffic cost 4.7 and 5.8 points here even without an attack: the quota must match the traffic.</w:t>
       </w:r>
     </w:p>
     <w:p>
@@ -10725,7 +9838,7 @@
           <w:bCs/>
           <w:b/>
         </w:rPr>
-        <w:t xml:space="preserve">Table 9</w:t>
+        <w:t xml:space="preserve">Table 7</w:t>
       </w:r>
       <w:r>
         <w:t xml:space="preserve"> </w:t>
@@ -10746,7 +9859,7 @@
           <w:right w:w="57" w:type="dxa"/>
         </w:tblCellMar>
         <w:tblLook w:firstRow="0" w:lastRow="0" w:firstColumn="0" w:lastColumn="0" w:noHBand="0" w:noVBand="0" w:val="0000"/>
-        <w:tblCaption w:val="Table 9 TBLBRK Leakage and User Harm Under Shared-Block Pumping."/>
+        <w:tblCaption w:val="Table 7 TBLBRK Leakage and User Harm Under Shared-Block Pumping."/>
       </w:tblPr>
       <w:tblGrid>
         <w:gridCol w:w="1845"/>
@@ -12191,7 +11304,7 @@
           <w:bCs/>
           <w:b/>
         </w:rPr>
-        <w:t xml:space="preserve">Table 10</w:t>
+        <w:t xml:space="preserve">Table 8</w:t>
       </w:r>
       <w:r>
         <w:t xml:space="preserve"> </w:t>
@@ -12212,7 +11325,7 @@
           <w:right w:w="57" w:type="dxa"/>
         </w:tblCellMar>
         <w:tblLook w:firstRow="0" w:lastRow="0" w:firstColumn="0" w:lastColumn="0" w:noHBand="0" w:noVBand="0" w:val="0000"/>
-        <w:tblCaption w:val="Table 10 TBLBRK User Harm Under a Full-Block Poisoning Attack."/>
+        <w:tblCaption w:val="Table 8 TBLBRK User Harm Under a Full-Block Poisoning Attack."/>
       </w:tblPr>
       <w:tblGrid>
         <w:gridCol w:w="3066"/>
@@ -12984,7 +12097,7 @@
         <w:pStyle w:val="BodyText"/>
       </w:pPr>
       <w:r>
-        <w:t xml:space="preserve">Tables 9 and 10 report E1 at 200 blocks (60-minute attacks, seeds 300–309): a pumper on three blocks real users share, and a poisoner flooding all 200 blocks. Leakage under the pumper is summed over the four carriers’ runs of a seed, which can hide a carrier on which a policy loses (per carrier: artifact); harm is net completions lost in points, averaged over the carriers (negative: a gain), with intervals for leakage and the attacked blocks in Table 9 and for all users’ extra harm in Table 10. In Table 9, against the attacked no-policy arm, the counter cost all users nothing on average and gained the attacked blocks’ users three points on average, since without a destination policy, the pumper exhausts their blocks and the hourly budget; with the human-like carrier alone, it cost them 1.9. Against the attack-free operation, every evaluated policy left those users 5 to 9 points worse off on average (2 to 12 per carrier; 8 with none): none shields a block an attacker shares. Counter and tests together, explored outside the frozen claims, leaked least summed over the four carriers but not against the instant verifier (28;</w:t>
+        <w:t xml:space="preserve">Tables 7 and 8 report E1 at 200 blocks (60-minute attacks, seeds 300–309): a pumper on three blocks real users share, and a poisoner flooding all 200 blocks. Leakage under the pumper is summed over the four carriers’ runs of a seed, which can hide a carrier on which a policy loses (per carrier: artifact); harm is net completions lost in points, averaged over the carriers (negative: a gain), with intervals for leakage and the attacked blocks in Table 7 and for all users’ extra harm in Table 8. In Table 7, against the attacked no-policy arm, the counter cost all users nothing on average and gained the attacked blocks’ users three points on average, since without a destination policy, the pumper exhausts their blocks and the hourly budget; with the human-like carrier alone, it cost them 1.9. Against the attack-free operation, every evaluated policy left those users 5 to 9 points worse off on average (2 to 12 per carrier; 8 with none): none shields a block an attacker shares. Counter and tests together, explored outside the frozen claims, leaked least summed over the four carriers but not against the instant verifier (28;</w:t>
       </w:r>
       <w:r>
         <w:t xml:space="preserve"> </w:t>
@@ -13010,7 +12123,7 @@
         <w:t xml:space="preserve">c</w:t>
       </w:r>
       <w:r>
-        <w:t xml:space="preserve">0: 22), and under the poisoner (Table 10) cost all users most of the counters and buckets and leaked more than</w:t>
+        <w:t xml:space="preserve">0: 22), and under the poisoner (Table 8) cost all users most of the counters and buckets and leaked more than</w:t>
       </w:r>
       <w:r>
         <w:t xml:space="preserve"> </w:t>
@@ -13039,8 +12152,8 @@
         <w:t xml:space="preserve">0. A token bucket with a burst of 4 spared the poisoner’s users only by letting almost everything through; with two untuned settings, neither limiter dominated, and we ranked only the implemented policies. Returning users, all simulated with verified history, lost nothing.</w:t>
       </w:r>
     </w:p>
-    <w:bookmarkEnd w:id="58"/>
-    <w:bookmarkStart w:id="62" w:name="X30d161eb055c3bdd60ae2ef3ca5d49f7d5c43cc"/>
+    <w:bookmarkEnd w:id="67"/>
+    <w:bookmarkStart w:id="71" w:name="X30d161eb055c3bdd60ae2ef3ca5d49f7d5c43cc"/>
     <w:p>
       <w:pPr>
         <w:pStyle w:val="Heading3"/>
@@ -13063,7 +12176,7 @@
         <w:pStyle w:val="FirstParagraph"/>
       </w:pPr>
       <w:r>
-        <w:t xml:space="preserve">Figure 4 shows the counter’s operating boundary (E4, seeds 300–304): in (a), the attributable loss of the three hot blocks’ users against their legitimate rate, attack-free and with a never-verifying pumper on those blocks; in (b, c), leakage in 20 and 60 minutes against the blocks a pumper uses, at full rate or paced, with Equations (2)–(4) for the full-rate pumper as hollow markers. All horizontal axes and the vertical axes of (b, c) are logarithmic, and lines join sampled settings without locating a crossover. Attack-free, the counter costs a block’s users nothing at one send per ten minutes, 2.3 points at four and 5.5 at eight, far below the idealized share beyond the quota (27% at four), since most challenged users complete or switch to WhatsApp; without WhatsApp, eight sends cost 13.2. A 30-minute launch at three times the normal rate costs its blocks’ users 16 points. Over 60 minutes (Figure 4c) the default leaked 110, 144 and 242 messages on 3, 10 and 30 blocks, against 105, 139 and 240 from Equation (2) (</w:t>
+        <w:t xml:space="preserve">Figure 6 shows the counter’s operating boundary (E4, seeds 300–304): in (a), the attributable loss of the three hot blocks’ users against their legitimate rate, attack-free and with a never-verifying pumper on those blocks; in (b, c), leakage in 20 and 60 minutes against the blocks a pumper uses, at full rate or paced, with Equations (2)–(4) for the full-rate pumper as hollow markers. All horizontal axes and the vertical axes of (b, c) are logarithmic, and lines join sampled settings without locating a crossover. Attack-free, the counter costs a block’s users nothing at one send per ten minutes, 2.3 points at four and 5.5 at eight, far below the idealized share beyond the quota (27% at four), since most challenged users complete or switch to WhatsApp; without WhatsApp, eight sends cost 13.2. A 30-minute launch at three times the normal rate costs its blocks’ users 16 points. Over 60 minutes (Figure 6c) the default leaked 110, 144 and 242 messages on 3, 10 and 30 blocks, against 105, 139 and 240 from Equation (2) (</w:t>
       </w:r>
       <m:oMath>
         <m:r>
@@ -13106,18 +12219,18 @@
           <wp:inline>
             <wp:extent cx="5334000" cy="6176210"/>
             <wp:effectExtent b="0" l="0" r="0" t="0"/>
-            <wp:docPr descr="" title="" id="60" name="Picture"/>
+            <wp:docPr descr="" title="" id="69" name="Picture"/>
             <a:graphic>
               <a:graphicData uri="http://schemas.openxmlformats.org/drawingml/2006/picture">
                 <pic:pic>
                   <pic:nvPicPr>
-                    <pic:cNvPr descr="figures/fig7_counter_boundary.png" id="61" name="Picture"/>
+                    <pic:cNvPr descr="figures/fig7_counter_boundary.png" id="70" name="Picture"/>
                     <pic:cNvPicPr>
                       <a:picLocks noChangeArrowheads="1" noChangeAspect="1"/>
                     </pic:cNvPicPr>
                   </pic:nvPicPr>
                   <pic:blipFill>
-                    <a:blip r:embed="rId59"/>
+                    <a:blip r:embed="rId68"/>
                     <a:stretch>
                       <a:fillRect/>
                     </a:stretch>
@@ -13153,7 +12266,7 @@
           <w:bCs/>
           <w:b/>
         </w:rPr>
-        <w:t xml:space="preserve">Fig. 4.</w:t>
+        <w:t xml:space="preserve">Fig. 6.</w:t>
       </w:r>
       <w:r>
         <w:t xml:space="preserve"> </w:t>
@@ -13170,9 +12283,9 @@
         <w:t xml:space="preserve">Against adaptive attackers (E3), the counter held the threshold-aware carrier, receipt faker, and concentrated trust builder to 24 to 36 messages (502 to 665 under the default), but not trust builders on random numbers (577, as under the default); over 360 minutes, the human-like carrier gained 81 messages an hour under the counter, and 753 under the default.</w:t>
       </w:r>
     </w:p>
-    <w:bookmarkEnd w:id="62"/>
-    <w:bookmarkEnd w:id="63"/>
-    <w:bookmarkStart w:id="64" w:name="X1b098a1626e628988816138c90f067235f9035a"/>
+    <w:bookmarkEnd w:id="71"/>
+    <w:bookmarkEnd w:id="72"/>
+    <w:bookmarkStart w:id="73" w:name="X7dd739ff2dd1db4b7787248dee760f482b6893b"/>
     <w:p>
       <w:pPr>
         <w:pStyle w:val="Heading2"/>
@@ -13187,7 +12300,7 @@
         <w:tab/>
       </w:r>
       <w:r>
-        <w:t xml:space="preserve">RQ5: what destination policies cost legitimate users</w:t>
+        <w:t xml:space="preserve">What destination policies cost legitimate users</w:t>
       </w:r>
     </w:p>
     <w:p>
@@ -13206,8 +12319,8 @@
         <w:t xml:space="preserve">A poisoner flooding for 20 min the 20 blocks legitimate users concentrate on (caps lifted, ten seeds) raises 16 verdict events meeting 98 legitimate requests, 33 never completing; against observe-only operation on the same trace, enforcement costs 12.7 [4.6, 22.9] completions, 3.1% of users (6.3% without WhatsApp; 23.9% with a 24-hour denylist). One that stops after ten minutes leaves verdicts meeting 406.5 requests afterwards, an attributable loss of 46.2 [16.9, 79.8]. Grading limits the harm; it caps it neither at the challenge nor at the attack’s duration.</w:t>
       </w:r>
     </w:p>
-    <w:bookmarkEnd w:id="64"/>
-    <w:bookmarkStart w:id="65" w:name="X40c2940f2aaabd24aefaeec784f20c9ca681264"/>
+    <w:bookmarkEnd w:id="73"/>
+    <w:bookmarkStart w:id="74" w:name="X40c2940f2aaabd24aefaeec784f20c9ca681264"/>
     <w:p>
       <w:pPr>
         <w:pStyle w:val="Heading2"/>
@@ -13269,9 +12382,9 @@
         <w:t xml:space="preserve">). Under an adversarial mixture, 81% of sends overran the floor, and response-time thresholds separated sends from refusals with 88% balanced accuracy on the fitted run and, fitted on a new run, 95 to 99.9% on two others: a separation on that machine, not a deployment accuracy.</w:t>
       </w:r>
     </w:p>
-    <w:bookmarkEnd w:id="65"/>
-    <w:bookmarkEnd w:id="66"/>
-    <w:bookmarkStart w:id="67" w:name="discussion"/>
+    <w:bookmarkEnd w:id="74"/>
+    <w:bookmarkEnd w:id="75"/>
+    <w:bookmarkStart w:id="78" w:name="discussion-and-limitations"/>
     <w:p>
       <w:pPr>
         <w:pStyle w:val="Heading1"/>
@@ -13286,7 +12399,25 @@
         <w:tab/>
       </w:r>
       <w:r>
-        <w:t xml:space="preserve">Discussion</w:t>
+        <w:t xml:space="preserve">Discussion and limitations</w:t>
+      </w:r>
+    </w:p>
+    <w:bookmarkStart w:id="76" w:name="lessons"/>
+    <w:p>
+      <w:pPr>
+        <w:pStyle w:val="Heading2"/>
+      </w:pPr>
+      <w:r>
+        <w:rPr>
+          <w:rStyle w:val="SectionNumber"/>
+        </w:rPr>
+        <w:t xml:space="preserve">6.1</w:t>
+      </w:r>
+      <w:r>
+        <w:tab/>
+      </w:r>
+      <w:r>
+        <w:t xml:space="preserve">Lessons</w:t>
       </w:r>
     </w:p>
     <w:p>
@@ -13297,17 +12428,17 @@
         <w:t xml:space="preserve">In the scripted workloads, carriers that verify with human-like delay, fake receipts, or know the thresholds defeated our outcome tests but not a short-window counter. Within an hour of a verdict, the counter’s allowance, unlike the tests’, grows with the windows an attack spans; over longer campaigns, verdicts expire and the tests leak again. Equation (5) summarizes this for pumpers that solve no challenge and hold no exemption. Its inputs are in an operator’s logs; the cost of an excess send, competition under attack, and exemption abuse come only from the simulation. The counter and tests together, with a quota set from each block’s traffic, is a hypothesis for real traffic, not a recommendation.</w:t>
       </w:r>
     </w:p>
-    <w:bookmarkEnd w:id="67"/>
-    <w:bookmarkStart w:id="68" w:name="limitations"/>
+    <w:bookmarkEnd w:id="76"/>
+    <w:bookmarkStart w:id="77" w:name="limitations"/>
     <w:p>
       <w:pPr>
-        <w:pStyle w:val="Heading1"/>
+        <w:pStyle w:val="Heading2"/>
       </w:pPr>
       <w:r>
         <w:rPr>
           <w:rStyle w:val="SectionNumber"/>
         </w:rPr>
-        <w:t xml:space="preserve">7</w:t>
+        <w:t xml:space="preserve">6.2</w:t>
       </w:r>
       <w:r>
         <w:tab/>
@@ -13324,8 +12455,9 @@
         <w:t xml:space="preserve">Everything was simulated, and calibration was assumed. Both protocols were written by the author for the author’s generator, the second knowing which counters had won. Some results follow from the generator (a perfect premium list, a datacenter attacker that declines challenges, returning users who always present verified history), and selection used an unweighted sum of four scripted pumpers’ leakage and a mean service target met on tuning seeds, which guarantees no service level elsewhere. Close rankings rest on ten or fewer seeds, and costs that round to zero are not shown equivalent. Per-client quotas within a block, carrier spend ceilings, bounded exemptions, tuned token buckets, and other sequential statistics lie outside the evaluated policies. Vendor adapters are untested live, and the timing result holds only for the observer tested. Destination policies challenge people for what strangers sharing their block did, and deployment under the GDPR or Saudi Arabia’s PDPL needs a lawful basis and a route for refused users.</w:t>
       </w:r>
     </w:p>
-    <w:bookmarkEnd w:id="68"/>
-    <w:bookmarkStart w:id="69" w:name="conclusions-and-future-work"/>
+    <w:bookmarkEnd w:id="77"/>
+    <w:bookmarkEnd w:id="78"/>
+    <w:bookmarkStart w:id="79" w:name="conclusions-and-future-work"/>
     <w:p>
       <w:pPr>
         <w:pStyle w:val="Heading1"/>
@@ -13334,7 +12466,7 @@
         <w:rPr>
           <w:rStyle w:val="SectionNumber"/>
         </w:rPr>
-        <w:t xml:space="preserve">8</w:t>
+        <w:t xml:space="preserve">7</w:t>
       </w:r>
       <w:r>
         <w:tab/>
@@ -13356,7 +12488,7 @@
         <w:pStyle w:val="BodyText"/>
       </w:pPr>
       <w:r>
-        <w:t xml:space="preserve">On the source side, the design contains the attacks that carry a signature in the request, a single address, a datacenter range, a premium prefix, a walked number sequence or a forged header, at a low cost to simulated users, and the ablation attributes that containment to the adaptive caps, the risk engine, the feedback loop and the block key (RQ1, RQ2). Against a residential attacker that resembles a person, outcome-based reputation stops separating once its failures land on keys that legitimate users share; in the settings run, it separated an attacker only on keys its sends dominated (RQ3). What remains is rationing, whose cost depends on how well the cap tracks the legitimate rate: the deployed job leaked 193 messages with a clean three-week profile and 340 more on a cold start, while the default cap refused 41% of legitimate users (RQ4). On the destination, counting sends leaked less in aggregate than our outcome tests against concentrated pumpers, although not reliably against an instantly verifying carrier; the frozen counter failed its service claims when the attacker shared blocks with real users and lost its advantage against wide, paced and trust-building pumpers. Within an hour, unfitted estimates ordered the policies’ mean leakage in 18 of 18 decisive boundary cells with the cold-start bound and 17 with the warm-start bound, missing a near tie; the crossing was algebraic, not a measured switching point. Without an attack, the default tests raise 0.5 verdict events a day on 200 busy blocks at 80% conversion and 6.5 at 65%, and a counter of four sends per ten minutes costs a block’s users 2.3 points (RQ5).</w:t>
+        <w:t xml:space="preserve">On the source side, the design contains the attacks that carry a signature in the request, a single address, a datacenter range, a premium prefix, a walked number sequence or a forged header, at a low cost to simulated users, and the ablation attributes that containment to the adaptive caps, the risk engine, the feedback loop and the block key. Against a residential attacker that resembles a person, outcome-based reputation stops separating once its failures land on keys that legitimate users share; in the settings run, it separated an attacker only on keys its sends dominated. What remains is rationing, whose cost depends on how well the cap tracks the legitimate rate: the deployed job leaked 193 messages with a clean three-week profile and 340 more on a cold start, while the default cap refused 41% of legitimate users. On the destination, counting sends leaked less in aggregate than our outcome tests against concentrated pumpers, although not reliably against an instantly verifying carrier; the frozen counter failed its service claims when the attacker shared blocks with real users and lost its advantage against wide, paced and trust-building pumpers. Within an hour, unfitted estimates ordered the policies’ mean leakage in 18 of 18 decisive boundary cells with the cold-start bound and 17 with the warm-start bound, missing a near tie; the crossing was algebraic, not a measured switching point. Without an attack, the default tests raise 0.5 verdict events a day on 200 busy blocks at 80% conversion and 6.5 at 65%, and a counter of four sends per ten minutes costs a block’s users 2.3 points.</w:t>
       </w:r>
     </w:p>
     <w:p>
@@ -13375,8 +12507,8 @@
         <w:t xml:space="preserve">Replaying real traffic is the experiment this paper most needs: it would test the assumed calibration, the cost of an excess send to users who share a block, and the quota a counter needs per block. The policies left outside the evaluation, per-client quotas within a block, bounded exemptions, tuned token buckets and windowed or time-uniform statistics, could then be compared under the same predeclared protocols.</w:t>
       </w:r>
     </w:p>
-    <w:bookmarkEnd w:id="69"/>
-    <w:bookmarkStart w:id="70" w:name="X071796dd6bc546c91e96cca1cf5ff96599de61f"/>
+    <w:bookmarkEnd w:id="79"/>
+    <w:bookmarkStart w:id="80" w:name="X071796dd6bc546c91e96cca1cf5ff96599de61f"/>
     <w:p>
       <w:pPr>
         <w:pStyle w:val="Heading1"/>
@@ -13393,8 +12525,8 @@
         <w:t xml:space="preserve">The author used Claude (Anthropic) for code, evaluation, drafting and editing; checked numbers against the recorded results and claims against the code; and takes full responsibility for the content.</w:t>
       </w:r>
     </w:p>
-    <w:bookmarkEnd w:id="70"/>
-    <w:bookmarkStart w:id="71" w:name="credit-authorship-contribution-statement"/>
+    <w:bookmarkEnd w:id="80"/>
+    <w:bookmarkStart w:id="81" w:name="credit-authorship-contribution-statement"/>
     <w:p>
       <w:pPr>
         <w:pStyle w:val="Heading1"/>
@@ -13421,8 +12553,8 @@
         <w:t xml:space="preserve">Conceptualization, Methodology, Software, Validation, Investigation, Writing – original draft, Writing – review &amp; editing.</w:t>
       </w:r>
     </w:p>
-    <w:bookmarkEnd w:id="71"/>
-    <w:bookmarkStart w:id="72" w:name="declaration-of-competing-interest"/>
+    <w:bookmarkEnd w:id="81"/>
+    <w:bookmarkStart w:id="82" w:name="declaration-of-competing-interest"/>
     <w:p>
       <w:pPr>
         <w:pStyle w:val="Heading1"/>
@@ -13439,8 +12571,8 @@
         <w:t xml:space="preserve">The author declares no known competing financial interests or personal relationships that could have appeared to influence this work.</w:t>
       </w:r>
     </w:p>
-    <w:bookmarkEnd w:id="72"/>
-    <w:bookmarkStart w:id="74" w:name="data-availability"/>
+    <w:bookmarkEnd w:id="82"/>
+    <w:bookmarkStart w:id="84" w:name="data-availability"/>
     <w:p>
       <w:pPr>
         <w:pStyle w:val="Heading1"/>
@@ -13477,7 +12609,7 @@
       <w:r>
         <w:t xml:space="preserve"> </w:t>
       </w:r>
-      <w:hyperlink r:id="rId73">
+      <w:hyperlink r:id="rId83">
         <w:r>
           <w:rPr>
             <w:rStyle w:val="Hyperlink"/>
@@ -13510,8 +12642,8 @@
         <w:t xml:space="preserve">. These files are the supplementary material.</w:t>
       </w:r>
     </w:p>
-    <w:bookmarkEnd w:id="74"/>
-    <w:bookmarkStart w:id="83" w:name="references"/>
+    <w:bookmarkEnd w:id="84"/>
+    <w:bookmarkStart w:id="93" w:name="references"/>
     <w:p>
       <w:pPr>
         <w:pStyle w:val="Heading1"/>
@@ -13664,7 +12796,7 @@
         </w:rPr>
         <w:t xml:space="preserve"> </w:t>
       </w:r>
-      <w:hyperlink r:id="rId73">
+      <w:hyperlink r:id="rId83">
         <w:r>
           <w:rPr>
             <w:rStyle w:val="Hyperlink"/>
@@ -13861,7 +12993,7 @@
         </w:rPr>
         <w:t xml:space="preserve"> </w:t>
       </w:r>
-      <w:hyperlink r:id="rId75">
+      <w:hyperlink r:id="rId85">
         <w:r>
           <w:rPr>
             <w:rStyle w:val="Hyperlink"/>
@@ -14556,7 +13688,7 @@
         </w:rPr>
         <w:t xml:space="preserve"> </w:t>
       </w:r>
-      <w:hyperlink r:id="rId76">
+      <w:hyperlink r:id="rId86">
         <w:r>
           <w:rPr>
             <w:rStyle w:val="Hyperlink"/>
@@ -15697,7 +14829,7 @@
         </w:rPr>
         <w:t xml:space="preserve"> </w:t>
       </w:r>
-      <w:hyperlink r:id="rId77">
+      <w:hyperlink r:id="rId87">
         <w:r>
           <w:rPr>
             <w:rStyle w:val="Hyperlink"/>
@@ -16310,7 +15442,7 @@
         </w:rPr>
         <w:t xml:space="preserve"> </w:t>
       </w:r>
-      <w:hyperlink r:id="rId78">
+      <w:hyperlink r:id="rId88">
         <w:r>
           <w:rPr>
             <w:rStyle w:val="Hyperlink"/>
@@ -17421,7 +16553,7 @@
         </w:rPr>
         <w:t xml:space="preserve"> </w:t>
       </w:r>
-      <w:hyperlink r:id="rId79">
+      <w:hyperlink r:id="rId89">
         <w:r>
           <w:rPr>
             <w:rStyle w:val="Hyperlink"/>
@@ -17555,7 +16687,7 @@
         </w:rPr>
         <w:t xml:space="preserve"> </w:t>
       </w:r>
-      <w:hyperlink r:id="rId80">
+      <w:hyperlink r:id="rId90">
         <w:r>
           <w:rPr>
             <w:rStyle w:val="Hyperlink"/>
@@ -17675,7 +16807,7 @@
         </w:rPr>
         <w:t xml:space="preserve"> </w:t>
       </w:r>
-      <w:hyperlink r:id="rId81">
+      <w:hyperlink r:id="rId91">
         <w:r>
           <w:rPr>
             <w:rStyle w:val="Hyperlink"/>
@@ -18043,7 +17175,7 @@
         </w:rPr>
         <w:t xml:space="preserve"> </w:t>
       </w:r>
-      <w:hyperlink r:id="rId82">
+      <w:hyperlink r:id="rId92">
         <w:r>
           <w:rPr>
             <w:rStyle w:val="Hyperlink"/>
@@ -18484,7 +17616,7 @@
         <w:t xml:space="preserve">. https://doi.org/10.18372/2310-5461.69.20735.</w:t>
       </w:r>
     </w:p>
-    <w:bookmarkEnd w:id="83"/>
+    <w:bookmarkEnd w:id="93"/>
     <w:sectPr>
       <w:pgSz w:w="11906" w:h="16838"/>
       <w:pgMar w:left="1417" w:right="1417" w:top="1417" w:bottom="1417" w:header="708" w:footer="708" w:gutter="0"/>

</xml_diff>

<commit_message>
Manuscript revision 8: short headings; citations checked; abstract, introduction and conclusions adjusted
Every heading and subheading shortened to plain phrases. All 27 cited
works are in the bibliography and all 27 entries are cited; no unresolved
reference. The abstract names the two destination policies; the
introduction points to the block diagram and Algorithm 2 and the outline
names the benchmark comparison; the conclusions no longer list walked
numbers and the forged header among the contained attacks (they are held
to 11.5 % and 22.5 %, and the header attack is the farm) and summarize
the benchmark comparison.

Co-Authored-By: Claude Fable 5.1 <noreply@anthropic.com>
Claude-Session: https://claude.ai/code/session_01RjWdFzUgYk6Hwie2YbnvyG
</commit_message>
<xml_diff>
--- a/paper/main.docx
+++ b/paper/main.docx
@@ -111,7 +111,7 @@
           <w:sz w:val="24"/>
           <w:szCs w:val="24"/>
         </w:rPr>
-        <w:t>Endpoints that send one-time passwords via SMS must be reachable before any account exists, and they are abused to waste a service’s messaging budget (flooding) or to earn part of the termination fee on a colluding operator’s number ranges (SMS pumping). Existing defenses limit the request source, score each request with labeled traffic, or block destination prefixes, but a service that sees only its own traffic has no controlled evidence of which destination signal to act on, the number of sends to a block or the fate of their codes, nor of what either costs the legitimate users who share a block with an attacker. This study evaluates in simulation a twelve-step defense for a registration flow, which draws trust from app attestation, signed sessions and verification outcomes, against a seven-control baseline, five simpler designs and 25 attacker profiles, and compares those two label-free destination policies under two protocols committed before their runs. Results show that attacks carrying a signature in the request are contained at a low cost to simulated users, whereas a residential attacker with farmed CAPTCHA scores is only rationed, by refusing half of first-time users. On the destination, short-window counters of SMS sent per number block, selected at a benign service target, leaked 6 to 48 messages against four concentrated 20-minute pumpers at 0.06 to 0.43 points of attack-free completion, where the default sequential tests of verification outcomes leaked 19 to 452 at the busiest density; on seeds and workloads held out from selection, the frozen counter met its leakage and benign-cost claims and leaked no more than the tests in all but 13 of 144 cells, all against an instantly verifying carrier, but failed both service-under-attack claims when the pumper shared blocks with real users. Unfitted estimates ordered the policies’ mean leakage in 18 of 18 decisive boundary cells with the counter’s cold-start bound and 17 with its warm-start bound; their crossing is algebraic, not a measured switching point, and the counter loses its advantage against paced or widely spread pumpers. These findings rest on simulated users and assumed calibration. For operators they give a tested ordering of destination policies against short, concentrated pumping, and identify the quota per block, and the competition for it on a shared block, as what decides a counter’s cost.</w:t>
+        <w:t>Endpoints that send one-time passwords via SMS must be reachable before any account exists, and they are abused to waste a service’s messaging budget (flooding) or to earn part of the termination fee on a colluding operator’s number ranges (SMS pumping). Existing defenses limit the request source, score each request with labeled traffic, or block destination prefixes, but a service that sees only its own traffic has no controlled evidence of which destination signal to act on, the number of sends to a block or the fate of their codes, nor of what either costs the legitimate users who share a block with an attacker. This study evaluates in simulation a twelve-step defense for a registration flow, which draws trust from app attestation, signed sessions and verification outcomes, against a seven-control baseline, five simpler designs and 25 attacker profiles, and compares the two label-free destination policies, a counter of sends per number block and sequential tests of code outcomes, under two protocols committed before their runs. Results show that attacks carrying a signature in the request are contained at a low cost to simulated users, whereas a residential attacker with farmed CAPTCHA scores is only rationed, by refusing half of first-time users. On the destination, short-window counters of SMS sent per number block, selected at a benign service target, leaked 6 to 48 messages against four concentrated 20-minute pumpers at 0.06 to 0.43 points of attack-free completion, where the default sequential tests of verification outcomes leaked 19 to 452 at the busiest density; on seeds and workloads held out from selection, the frozen counter met its leakage and benign-cost claims and leaked no more than the tests in all but 13 of 144 cells, all against an instantly verifying carrier, but failed both service-under-attack claims when the pumper shared blocks with real users. Unfitted estimates ordered the policies’ mean leakage in 18 of 18 decisive boundary cells with the counter’s cold-start bound and 17 with its warm-start bound; their crossing is algebraic, not a measured switching point, and the counter loses its advantage against paced or widely spread pumpers. These findings rest on simulated users and assumed calibration. For operators they give a tested ordering of destination policies against short, concentrated pumping, and identify the quota per block, and the competition for it on a shared block, as what decides a counter’s cost.</w:t>
       </w:r>
     </w:p>
     <w:p>
@@ -227,7 +227,7 @@
         <w:pStyle w:val="BodyText"/>
       </w:pPr>
       <w:r>
-        <w:t xml:space="preserve">This paper makes that comparison in simulation, inside a complete defense for a registration flow. We start from a baseline of seven controls, v1, and show how an attacker within a stated threat model breaks each of eight assumptions behind them. The twelve-step redesign takes the platform from an attestation rather than a header, binds requests to signed sessions, checks the number before a message is paid for, builds reputation from whether earlier codes were entered, scores each request into one of five responses, and enforces a hard budget; on the destination it offers two label-free policies keyed on the 8-digit number block, a short-window counter of sends and sequential tests of code outcomes. Seven designs and 25 scripted attacker profiles, from a single address to pumpers that enter codes, fake delivery receipts or buy challenge solutions, run over simulated users on a simulated clock. Two protocols were committed before their runs: the first selects destination settings on tuning seeds at a benign service target, and the second, written after that selection, freezes the selected counter and tests five claims on seeds and workloads held out from selection. The implementation, the protocols and every run’s configuration and outcome are public (Ahmed, 2026). Everything is simulated: three behavioral parameters have published counterparts and the rest are assumptions, so the results describe this generator rather than real traffic.</w:t>
+        <w:t xml:space="preserve">This paper makes that comparison in simulation, inside a complete defense for a registration flow. We start from a baseline of seven controls, v1, and show how an attacker within a stated threat model breaks each of eight assumptions behind them. The twelve-step redesign takes the platform from an attestation rather than a header, binds requests to signed sessions, checks the number before a message is paid for, builds reputation from whether earlier codes were entered, scores each request into one of five responses, and enforces a hard budget (Figure 3 and Algorithm 2); on the destination it offers two label-free policies keyed on the 8-digit number block, a short-window counter of sends and sequential tests of code outcomes. Seven designs and 25 scripted attacker profiles, from a single address to pumpers that enter codes, fake delivery receipts or buy challenge solutions, run over simulated users on a simulated clock. Two protocols were committed before their runs: the first selects destination settings on tuning seeds at a benign service target, and the second, written after that selection, freezes the selected counter and tests five claims on seeds and workloads held out from selection. The implementation, the protocols and every run’s configuration and outcome are public (Ahmed, 2026). Everything is simulated: three behavioral parameters have published counterparts and the rest are assumptions, so the results describe this generator rather than real traffic.</w:t>
       </w:r>
     </w:p>
     <w:p>
@@ -246,7 +246,7 @@
         </w:numPr>
       </w:pPr>
       <w:r>
-        <w:t xml:space="preserve">an analysis of eight gaps in a seven-control baseline, a twelve-step design that closes them, and an open implementation with a regression test for each of the replay and concurrency defects found on the way;</w:t>
+        <w:t xml:space="preserve">an analysis of eight gaps in a seven-control baseline, a twelve-step design that closes them, given as pseudocode, and an open implementation with a regression test for each of the replay and concurrency defects found on the way;</w:t>
       </w:r>
     </w:p>
     <w:p>
@@ -287,7 +287,7 @@
         <w:pStyle w:val="FirstParagraph"/>
       </w:pPr>
       <w:r>
-        <w:t xml:space="preserve">Section 2 reviews related work; Section 3 gives the baseline, the threat model and the design with its leakage estimates; Section 4 the methodology; Section 5 reports the results; Section 6 discusses them and states the limitations; Section 7 concludes.</w:t>
+        <w:t xml:space="preserve">Section 2 reviews related work; Section 3 gives the baseline, the threat model and the design with its leakage estimates; Section 4 the methodology; Section 5 reports the results; Section 6 discusses them, sets the design against the benchmark designs and the nearest work, and states the limitations; Section 7 concludes.</w:t>
       </w:r>
     </w:p>
     <w:bookmarkEnd w:id="20"/>
@@ -382,7 +382,7 @@
         <w:t xml:space="preserve">Defenses Along the Path of an OTP Request.</w:t>
       </w:r>
     </w:p>
-    <w:bookmarkStart w:id="24" w:name="Xdc4f4927748c3842e74dd54c57f02ecb9c6dc2c"/>
+    <w:bookmarkStart w:id="24" w:name="revenue-share-fraud"/>
     <w:p>
       <w:pPr>
         <w:pStyle w:val="Heading2"/>
@@ -397,7 +397,7 @@
         <w:tab/>
       </w:r>
       <w:r>
-        <w:t xml:space="preserve">Revenue-share fraud and the destination as the attacker’s asset</w:t>
+        <w:t xml:space="preserve">Revenue-share fraud</w:t>
       </w:r>
     </w:p>
     <w:p>
@@ -427,7 +427,7 @@
       </w:r>
     </w:p>
     <w:bookmarkEnd w:id="24"/>
-    <w:bookmarkStart w:id="25" w:name="X54ece4fa9c9178e0a892a2fb454b0c3ae29bfd2"/>
+    <w:bookmarkStart w:id="25" w:name="detecting-inflated-sms-traffic"/>
     <w:p>
       <w:pPr>
         <w:pStyle w:val="Heading2"/>
@@ -442,7 +442,7 @@
         <w:tab/>
       </w:r>
       <w:r>
-        <w:t xml:space="preserve">Detecting artificially inflated SMS traffic</w:t>
+        <w:t xml:space="preserve">Detecting inflated SMS traffic</w:t>
       </w:r>
     </w:p>
     <w:p>
@@ -478,7 +478,7 @@
       </w:r>
     </w:p>
     <w:bookmarkEnd w:id="25"/>
-    <w:bookmarkStart w:id="26" w:name="Xacd34ca2899e26b07c0be49a94f9c27ea97f1a2"/>
+    <w:bookmarkStart w:id="26" w:name="what-an-attacker-can-buy"/>
     <w:p>
       <w:pPr>
         <w:pStyle w:val="Heading2"/>
@@ -493,7 +493,7 @@
         <w:tab/>
       </w:r>
       <w:r>
-        <w:t xml:space="preserve">Source-side controls and the attacker’s market</w:t>
+        <w:t xml:space="preserve">What an attacker can buy</w:t>
       </w:r>
     </w:p>
     <w:p>
@@ -531,7 +531,7 @@
       </w:r>
     </w:p>
     <w:bookmarkEnd w:id="26"/>
-    <w:bookmarkStart w:id="27" w:name="sequential-tests-and-change-detection"/>
+    <w:bookmarkStart w:id="27" w:name="sequential-tests"/>
     <w:p>
       <w:pPr>
         <w:pStyle w:val="Heading2"/>
@@ -546,7 +546,7 @@
         <w:tab/>
       </w:r>
       <w:r>
-        <w:t xml:space="preserve">Sequential tests and change detection</w:t>
+        <w:t xml:space="preserve">Sequential tests</w:t>
       </w:r>
     </w:p>
     <w:p>
@@ -576,7 +576,7 @@
       </w:r>
     </w:p>
     <w:bookmarkEnd w:id="27"/>
-    <w:bookmarkStart w:id="28" w:name="attacks-on-the-code-once-sent"/>
+    <w:bookmarkStart w:id="28" w:name="attacks-on-the-delivered-code"/>
     <w:p>
       <w:pPr>
         <w:pStyle w:val="Heading2"/>
@@ -591,7 +591,7 @@
         <w:tab/>
       </w:r>
       <w:r>
-        <w:t xml:space="preserve">Attacks on the code once sent</w:t>
+        <w:t xml:space="preserve">Attacks on the delivered code</w:t>
       </w:r>
     </w:p>
     <w:p>
@@ -603,7 +603,7 @@
       </w:r>
     </w:p>
     <w:bookmarkEnd w:id="28"/>
-    <w:bookmarkStart w:id="29" w:name="summary-of-the-gap"/>
+    <w:bookmarkStart w:id="29" w:name="the-gap"/>
     <w:p>
       <w:pPr>
         <w:pStyle w:val="Heading2"/>
@@ -618,7 +618,7 @@
         <w:tab/>
       </w:r>
       <w:r>
-        <w:t xml:space="preserve">Summary of the gap</w:t>
+        <w:t xml:space="preserve">The gap</w:t>
       </w:r>
     </w:p>
     <w:p>
@@ -1513,7 +1513,7 @@
         <w:t xml:space="preserve">This section describes the baseline that the design replaces, the attacker it must resist, the twelve steps and two destination policies of the design, and the estimates of leakage that follow from its rules.</w:t>
       </w:r>
     </w:p>
-    <w:bookmarkStart w:id="34" w:name="the-v1-baseline-and-its-gaps"/>
+    <w:bookmarkStart w:id="34" w:name="the-baseline-and-its-gaps"/>
     <w:p>
       <w:pPr>
         <w:pStyle w:val="Heading2"/>
@@ -1528,7 +1528,7 @@
         <w:tab/>
       </w:r>
       <w:r>
-        <w:t xml:space="preserve">The v1 baseline and its gaps</w:t>
+        <w:t xml:space="preserve">The baseline and its gaps</w:t>
       </w:r>
     </w:p>
     <w:p>
@@ -1729,7 +1729,7 @@
       </w:r>
     </w:p>
     <w:bookmarkEnd w:id="38"/>
-    <w:bookmarkStart w:id="45" w:name="the-pipeline-and-the-risk-score"/>
+    <w:bookmarkStart w:id="45" w:name="the-pipeline"/>
     <w:p>
       <w:pPr>
         <w:pStyle w:val="Heading2"/>
@@ -1744,7 +1744,7 @@
         <w:tab/>
       </w:r>
       <w:r>
-        <w:t xml:space="preserve">The pipeline and the risk score</w:t>
+        <w:t xml:space="preserve">The pipeline</w:t>
       </w:r>
     </w:p>
     <w:p>
@@ -2525,7 +2525,7 @@
         <w:t xml:space="preserve">A pumper is confined to its partner’s ranges but can rotate numbers and blocks within them. Destination policies are keyed on the 8-digit block (10 000 numbers); therefore, protection weakens as a pumper spreads.</w:t>
       </w:r>
     </w:p>
-    <w:bookmarkStart w:id="47" w:name="sequential-tests"/>
+    <w:bookmarkStart w:id="47" w:name="sequential-tests-1"/>
     <w:p>
       <w:pPr>
         <w:pStyle w:val="Heading3"/>
@@ -3100,7 +3100,7 @@
       </w:r>
     </w:p>
     <w:bookmarkEnd w:id="50"/>
-    <w:bookmarkStart w:id="51" w:name="Xf0c979229eb29cff3cf30892b5e34effc1bec32"/>
+    <w:bookmarkStart w:id="51" w:name="leakage-estimates"/>
     <w:p>
       <w:pPr>
         <w:pStyle w:val="Heading2"/>
@@ -3115,7 +3115,7 @@
         <w:tab/>
       </w:r>
       <w:r>
-        <w:t xml:space="preserve">Leakage estimates and a heuristic crossover</w:t>
+        <w:t xml:space="preserve">Leakage estimates</w:t>
       </w:r>
     </w:p>
     <w:p>
@@ -4474,7 +4474,7 @@
       </w:r>
     </w:p>
     <w:bookmarkEnd w:id="54"/>
-    <w:bookmarkStart w:id="55" w:name="two-protocols-and-their-chronology"/>
+    <w:bookmarkStart w:id="55" w:name="the-two-protocols"/>
     <w:p>
       <w:pPr>
         <w:pStyle w:val="Heading2"/>
@@ -4489,7 +4489,7 @@
         <w:tab/>
       </w:r>
       <w:r>
-        <w:t xml:space="preserve">Two protocols and their chronology</w:t>
+        <w:t xml:space="preserve">The two protocols</w:t>
       </w:r>
     </w:p>
     <w:p>
@@ -5274,7 +5274,7 @@
         <w:t xml:space="preserve">Results</w:t>
       </w:r>
     </w:p>
-    <w:bookmarkStart w:id="58" w:name="what-is-contained-and-at-what-cost"/>
+    <w:bookmarkStart w:id="58" w:name="what-is-contained"/>
     <w:p>
       <w:pPr>
         <w:pStyle w:val="Heading2"/>
@@ -5289,7 +5289,7 @@
         <w:tab/>
       </w:r>
       <w:r>
-        <w:t xml:space="preserve">What is contained, and at what cost</w:t>
+        <w:t xml:space="preserve">What is contained</w:t>
       </w:r>
     </w:p>
     <w:p>
@@ -6742,7 +6742,7 @@
       </w:r>
     </w:p>
     <w:bookmarkEnd w:id="58"/>
-    <w:bookmarkStart w:id="59" w:name="conditional-effects-of-each-layer"/>
+    <w:bookmarkStart w:id="59" w:name="what-each-layer-does"/>
     <w:p>
       <w:pPr>
         <w:pStyle w:val="Heading2"/>
@@ -6757,7 +6757,7 @@
         <w:tab/>
       </w:r>
       <w:r>
-        <w:t xml:space="preserve">Conditional effects of each layer</w:t>
+        <w:t xml:space="preserve">What each layer does</w:t>
       </w:r>
     </w:p>
     <w:p>
@@ -6847,7 +6847,7 @@
       </w:r>
     </w:p>
     <w:bookmarkEnd w:id="60"/>
-    <w:bookmarkStart w:id="61" w:name="X8a568645334fc3fb236cc988735ae19f7dbdc70"/>
+    <w:bookmarkStart w:id="61" w:name="what-rationing-costs"/>
     <w:p>
       <w:pPr>
         <w:pStyle w:val="Heading2"/>
@@ -6862,7 +6862,7 @@
         <w:tab/>
       </w:r>
       <w:r>
-        <w:t xml:space="preserve">What rationing costs, and what it depends on</w:t>
+        <w:t xml:space="preserve">What rationing costs</w:t>
       </w:r>
     </w:p>
     <w:p>
@@ -6874,7 +6874,7 @@
       </w:r>
     </w:p>
     <w:bookmarkEnd w:id="61"/>
-    <w:bookmarkStart w:id="62" w:name="pumping-against-the-sequential-tests"/>
+    <w:bookmarkStart w:id="62" w:name="pumping-against-the-tests"/>
     <w:p>
       <w:pPr>
         <w:pStyle w:val="Heading2"/>
@@ -6889,7 +6889,7 @@
         <w:tab/>
       </w:r>
       <w:r>
-        <w:t xml:space="preserve">Pumping against the sequential tests</w:t>
+        <w:t xml:space="preserve">Pumping against the tests</w:t>
       </w:r>
     </w:p>
     <w:p>
@@ -7877,7 +7877,7 @@
       </w:r>
     </w:p>
     <w:bookmarkEnd w:id="62"/>
-    <w:bookmarkStart w:id="81" w:name="Xc3b3a0ae0d7ddd12dca67a47167dca0c845034c"/>
+    <w:bookmarkStart w:id="81" w:name="counting-against-testing"/>
     <w:p>
       <w:pPr>
         <w:pStyle w:val="Heading2"/>
@@ -7892,7 +7892,7 @@
         <w:tab/>
       </w:r>
       <w:r>
-        <w:t xml:space="preserve">Destination policies: where the counter wins, and where it fails</w:t>
+        <w:t xml:space="preserve">Counting against testing</w:t>
       </w:r>
     </w:p>
     <w:p>
@@ -9199,7 +9199,7 @@
         </w:tc>
       </w:tr>
     </w:tbl>
-    <w:bookmarkStart w:id="69" w:name="at-a-benign-service-target"/>
+    <w:bookmarkStart w:id="69" w:name="at-a-service-target"/>
     <w:p>
       <w:pPr>
         <w:pStyle w:val="Heading3"/>
@@ -9214,7 +9214,7 @@
         <w:tab/>
       </w:r>
       <w:r>
-        <w:t xml:space="preserve">At a benign service target</w:t>
+        <w:t xml:space="preserve">At a service target</w:t>
       </w:r>
     </w:p>
     <w:p>
@@ -9868,7 +9868,7 @@
       </w:tr>
     </w:tbl>
     <w:bookmarkEnd w:id="69"/>
-    <w:bookmarkStart w:id="70" w:name="under-a-second-protocol"/>
+    <w:bookmarkStart w:id="70" w:name="on-held-out-traffic"/>
     <w:p>
       <w:pPr>
         <w:pStyle w:val="Heading3"/>
@@ -9883,7 +9883,7 @@
         <w:tab/>
       </w:r>
       <w:r>
-        <w:t xml:space="preserve">Under a second protocol</w:t>
+        <w:t xml:space="preserve">On held-out traffic</w:t>
       </w:r>
     </w:p>
     <w:p>
@@ -12218,7 +12218,7 @@
       </w:r>
     </w:p>
     <w:bookmarkEnd w:id="70"/>
-    <w:bookmarkStart w:id="80" w:name="X30d161eb055c3bdd60ae2ef3ca5d49f7d5c43cc"/>
+    <w:bookmarkStart w:id="80" w:name="the-counters-boundary"/>
     <w:p>
       <w:pPr>
         <w:pStyle w:val="Heading3"/>
@@ -12233,7 +12233,7 @@
         <w:tab/>
       </w:r>
       <w:r>
-        <w:t xml:space="preserve">The operating boundary and adaptive attackers</w:t>
+        <w:t xml:space="preserve">The counter’s boundary</w:t>
       </w:r>
     </w:p>
     <w:p>
@@ -12488,7 +12488,7 @@
     </w:p>
     <w:bookmarkEnd w:id="80"/>
     <w:bookmarkEnd w:id="81"/>
-    <w:bookmarkStart w:id="82" w:name="X7dd739ff2dd1db4b7787248dee760f482b6893b"/>
+    <w:bookmarkStart w:id="82" w:name="the-cost-to-legitimate-users"/>
     <w:p>
       <w:pPr>
         <w:pStyle w:val="Heading2"/>
@@ -12503,7 +12503,7 @@
         <w:tab/>
       </w:r>
       <w:r>
-        <w:t xml:space="preserve">What destination policies cost legitimate users</w:t>
+        <w:t xml:space="preserve">The cost to legitimate users</w:t>
       </w:r>
     </w:p>
     <w:p>
@@ -12523,7 +12523,7 @@
       </w:r>
     </w:p>
     <w:bookmarkEnd w:id="82"/>
-    <w:bookmarkStart w:id="83" w:name="X40c2940f2aaabd24aefaeec784f20c9ca681264"/>
+    <w:bookmarkStart w:id="83" w:name="adaptation-economics-and-overhead"/>
     <w:p>
       <w:pPr>
         <w:pStyle w:val="Heading2"/>
@@ -12538,7 +12538,7 @@
         <w:tab/>
       </w:r>
       <w:r>
-        <w:t xml:space="preserve">Adaptive attackers, economics and overhead</w:t>
+        <w:t xml:space="preserve">Adaptation, economics and overhead</w:t>
       </w:r>
     </w:p>
     <w:p>
@@ -12632,7 +12632,7 @@
       </w:r>
     </w:p>
     <w:bookmarkEnd w:id="85"/>
-    <w:bookmarkStart w:id="86" w:name="X664f872b7e6cdf88bfb7056720f8ac2f41d98d5"/>
+    <w:bookmarkStart w:id="86" w:name="against-the-benchmarks"/>
     <w:p>
       <w:pPr>
         <w:pStyle w:val="Heading2"/>
@@ -12647,7 +12647,7 @@
         <w:tab/>
       </w:r>
       <w:r>
-        <w:t xml:space="preserve">Comparison with the in-study benchmarks and the nearest work</w:t>
+        <w:t xml:space="preserve">Against the benchmarks</w:t>
       </w:r>
     </w:p>
     <w:p>
@@ -14225,7 +14225,7 @@
         <w:pStyle w:val="BodyText"/>
       </w:pPr>
       <w:r>
-        <w:t xml:space="preserve">The nearest external work is set out in Table 1, and it can be compared only on what each needs and reports, since none ran on the same traffic. Huh et al. (2025) report 89.6% recall at 0.19% false positives for a supervised model on one service’s real logs. The class of attack their model targets, a few requests per identity over many fresh identities, is the farm here, which the behavioral layers do not separate and the caps only ration, at 54% of first-time users refused; what the layers do contain without labels are the attacks with a signature in the request (0 to 11.5% leaked with caps lifted) and most of the reused profile. Zaliskyi and Odarchenko (2026) report that fixed-window prefix counts blocked 95% and 63% of two incidents at the price of 58% of a legitimate campaign. The graded counter here is the same family of control, a ten-minute window on a 10 000-number block with a challenge rather than a 24-hour quarantine; it leaked 24 of about 574 requests from each outcome-reading pumper at an attack-free cost of 0.06 points of completion, on simulated traffic with no campaigns in it, and it failed its service claims on blocks the attacker shares. Twilio’s products report claimed false-positive rates and no leakage. What this study reports that none of the three does is an attack-free benign cost, a cost under attack for the users who share a block with the attacker, a selection fixed before the evaluation runs and tested on held-out seeds and workloads, and an implementation anyone can run; what the three have and this study lacks is real traffic.</w:t>
+        <w:t xml:space="preserve">The nearest external work is set out in Table 1, and it can be compared only on what each needs and reports, since none ran on the same traffic. Huh et al. (2025) report 89.6% recall at 0.19% false positives for a supervised model on one service’s real logs. The class of attack their model targets, a few requests per identity over many fresh identities, is the farm here, which the behavioral layers do not separate and the caps only ration, at 54% of first-time users refused; what the layers do contain without labels are the attacks with a signature in the request (0 to 11.5% leaked with caps lifted; the farm behind a forged header is the farm) and most of the reused profile. Zaliskyi and Odarchenko (2026) report that fixed-window prefix counts blocked 95% and 63% of two incidents at the price of 58% of a legitimate campaign. The graded counter here is the same family of control, a ten-minute window on a 10 000-number block with a challenge rather than a 24-hour quarantine; it leaked 24 of about 574 requests from each outcome-reading pumper at an attack-free cost of 0.06 points of completion, on simulated traffic with no campaigns in it, and it failed its service claims on blocks the attacker shares. Twilio’s products report claimed false-positive rates and no leakage. What this study reports that none of the three does is an attack-free benign cost, a cost under attack for the users who share a block with the attacker, a selection fixed before the evaluation runs and tested on held-out seeds and workloads, and an implementation anyone can run; what the three have and this study lacks is real traffic.</w:t>
       </w:r>
     </w:p>
     <w:bookmarkEnd w:id="86"/>
@@ -14288,7 +14288,7 @@
         <w:pStyle w:val="BodyText"/>
       </w:pPr>
       <w:r>
-        <w:t xml:space="preserve">On the source side, the design contains the attacks that carry a signature in the request, a single address, a datacenter range, a premium prefix, a walked number sequence or a forged header, at a low cost to simulated users, and the ablation attributes that containment to the adaptive caps, the risk engine, the feedback loop and the block key. Against a residential attacker that resembles a person, outcome-based reputation stops separating once its failures land on keys that legitimate users share; in the settings run, it separated an attacker only on keys its sends dominated. What remains is rationing, whose cost depends on how well the cap tracks the legitimate rate: the deployed job leaked 193 messages with a clean three-week profile and 340 more on a cold start, while the default cap refused 41% of legitimate users. On the destination, counting sends leaked less in aggregate than our outcome tests against concentrated pumpers, although not reliably against an instantly verifying carrier; the frozen counter failed its service claims when the attacker shared blocks with real users and lost its advantage against wide, paced and trust-building pumpers. Within an hour, unfitted estimates ordered the policies’ mean leakage in 18 of 18 decisive boundary cells with the cold-start bound and 17 with the warm-start bound, missing a near tie; the crossing was algebraic, not a measured switching point. Without an attack, the default tests raise 0.5 verdict events a day on 200 busy blocks at 80% conversion and 6.5 at 65%, and a counter of four sends per ten minutes costs a block’s users 2.3 points.</w:t>
+        <w:t xml:space="preserve">On the source side, the design contains the attacks that carry a signature in the request, a single address, a datacenter range or a premium prefix, at a low cost to simulated users, holds walked numbers and a reused profile to 11.5% and 22.5% of their requests, and the ablation attributes these gains to the adaptive caps, the risk engine, the feedback loop and the block key. Against a residential attacker that resembles a person, outcome-based reputation stops separating once its failures land on keys that legitimate users share; in the settings run, it separated an attacker only on keys its sends dominated. What remains is rationing, whose cost depends on how well the cap tracks the legitimate rate: the deployed job leaked 193 messages with a clean three-week profile and 340 more on a cold start, while the default cap refused 41% of legitimate users. On the destination, counting sends leaked less in aggregate than our outcome tests against concentrated pumpers, although not reliably against an instantly verifying carrier; the frozen counter failed its service claims when the attacker shared blocks with real users and lost its advantage against wide, paced and trust-building pumpers. Within an hour, unfitted estimates ordered the policies’ mean leakage in 18 of 18 decisive boundary cells with the cold-start bound and 17 with the warm-start bound, missing a near tie; the crossing was algebraic, not a measured switching point. Without an attack, the default tests raise 0.5 verdict events a day on 200 busy blocks at 80% conversion and 6.5 at 65%, and a counter of four sends per ten minutes costs a block’s users 2.3 points.</w:t>
       </w:r>
     </w:p>
     <w:p>
@@ -14296,7 +14296,7 @@
         <w:pStyle w:val="BodyText"/>
       </w:pPr>
       <w:r>
-        <w:t xml:space="preserve">For an operator, the practical content is an ordering, not a recommendation. Against short, concentrated pumping on a few blocks, a counter of sends per block whose quota matches the block’s legitimate traffic leaked less than tests of code outcomes and cost its users less, and the inputs of the estimate that orders the two, the attack rate, the blocks touched and the time a send stays unresolved, are in an operator’s logs; the cost of an excess send, the competition for a quota on a shared block and the abuse of exemptions come only from the simulation. The quota must match the traffic: counters selected for sparser blocks cost 4.7 and 5.8 points on busier ones even without an attack. Every number describes scripted attackers and simulated users under assumed calibration, not real traffic, and close rankings rest on ten or fewer seeds.</w:t>
+        <w:t xml:space="preserve">Against the six benchmark designs run on the same traffic (Section 6.2), the behavioral layers are what removed datacenter rotation and most of the reused profile, a per-block counter alone held the premium and walked-number attacks, and no design separated the residential farm. For an operator, the practical content is an ordering, not a recommendation. Against short, concentrated pumping on a few blocks, a counter of sends per block whose quota matches the block’s legitimate traffic leaked less than tests of code outcomes and cost its users less, and the inputs of the estimate that orders the two, the attack rate, the blocks touched and the time a send stays unresolved, are in an operator’s logs; the cost of an excess send, the competition for a quota on a shared block and the abuse of exemptions come only from the simulation. The quota must match the traffic: counters selected for sparser blocks cost 4.7 and 5.8 points on busier ones even without an attack. Every number describes scripted attackers and simulated users under assumed calibration, not real traffic, and close rankings rest on ten or fewer seeds.</w:t>
       </w:r>
     </w:p>
     <w:p>

</xml_diff>

<commit_message>
Manuscript revision 8: architecture figure of the implementation (Figure 3)
- paper/figures/fig12_architecture.tex, drawn from src/otp_guard: the HTTP API
  and its endpoints, the pipeline and the feedback loop, the worker, the store
  and what it holds, the external services behind adapters with fakes, the
  client and recipient edges and the vendor's receipt.
- Section 3.3 opens with a paragraph that walks through the components and
  says which of them the simulation runs as deployed; the threat-model figure's
  source moved to its first citation so every float stays on the page of its
  discussion or the next.
- Figures renumbered 1-10 in the README figure table, study map, figure key,
  paper_tables.py, docs and CHANGELOG; the letter's numbering, page statement
  (19 pages) and word count (14,258) updated; Word version rebuilt.

Co-Authored-By: Claude Fable 5.1 <noreply@anthropic.com>
Claude-Session: https://claude.ai/code/session_01RjWdFzUgYk6Hwie2YbnvyG
</commit_message>
<xml_diff>
--- a/paper/main.docx
+++ b/paper/main.docx
@@ -227,7 +227,7 @@
         <w:pStyle w:val="BodyText"/>
       </w:pPr>
       <w:r>
-        <w:t xml:space="preserve">We make that comparison in simulation, inside a complete defense for a registration flow. We start from a baseline of seven controls, v1, and show how an attacker within a stated threat model breaks each of eight assumptions behind them. Our twelve-step redesign takes the platform from an attestation rather than a header, binds requests to signed sessions, checks the number before a message is paid for, builds reputation from whether earlier codes were entered, scores each request into one of five responses, and enforces a hard budget (Figure 3 and Algorithm 2); on the destination it offers two label-free policies keyed on the 8-digit number block, a short-window counter of sends and sequential tests of code outcomes. We run seven designs and 25 scripted attacker profiles, from a single address to pumpers that enter codes, fake delivery receipts or buy challenge solutions, over simulated users on a simulated clock (Figure 4). We committed two protocols before their runs: the first selects destination settings on tuning seeds at a benign service target, and the second, written after that selection, freezes the selected counter and tests five claims on seeds and workloads held out from selection. We release the implementation, the protocols and every run’s configuration and outcome (Ahmed, 2026). Everything is simulated: three behavioral parameters have published counterparts and the rest are our assumptions, so the results describe our generator rather than real traffic.</w:t>
+        <w:t xml:space="preserve">We make that comparison in simulation, inside a complete defense for a registration flow. We start from a baseline of seven controls, v1, and show how an attacker within a stated threat model breaks each of eight assumptions behind them. Our twelve-step redesign takes the platform from an attestation rather than a header, binds requests to signed sessions, checks the number before a message is paid for, builds reputation from whether earlier codes were entered, scores each request into one of five responses, and enforces a hard budget (Figure 4 and Algorithm 2); on the destination it offers two label-free policies keyed on the 8-digit number block, a short-window counter of sends and sequential tests of code outcomes. We run seven designs and 25 scripted attacker profiles, from a single address to pumpers that enter codes, fake delivery receipts or buy challenge solutions, over simulated users on a simulated clock (Figure 5). We committed two protocols before their runs: the first selects destination settings on tuning seeds at a benign service target, and the second, written after that selection, freezes the selected counter and tests five claims on seeds and workloads held out from selection. We release the implementation, the protocols and every run’s configuration and outcome (Ahmed, 2026). Everything is simulated: three behavioral parameters have published counterparts and the rest are our assumptions, so the results describe our generator rather than real traffic.</w:t>
       </w:r>
     </w:p>
     <w:p>
@@ -256,7 +256,7 @@
         <w:t xml:space="preserve"> </w:t>
       </w:r>
       <w:r>
-        <w:t xml:space="preserve">We show how an attacker breaks eight assumptions behind a seven-control baseline (Section 3.1), close the gaps with a twelve-step pipeline whose trust comes from attestation, signed sessions and the fate of earlier codes (Figure 3, Algorithm 2), and release the implementation with a regression test for every replay and concurrency defect we found on the way.</w:t>
+        <w:t xml:space="preserve">We show how an attacker breaks eight assumptions behind a seven-control baseline (Section 3.1), close the gaps with a twelve-step pipeline whose trust comes from attestation, signed sessions and the fate of earlier codes (Figure 4, Algorithm 2), and release the implementation with a regression test for every replay and concurrency defect we found on the way.</w:t>
       </w:r>
     </w:p>
     <w:p>
@@ -319,7 +319,7 @@
         <w:t xml:space="preserve"> </w:t>
       </w:r>
       <w:r>
-        <w:t xml:space="preserve">From the rules and the attack rate alone we derive when counting leaks less than testing, and check the estimates against measurements over attacks of up to an hour: they ordered the policies’ mean leakage in 18 of 18 decisive cells with the cold-start bound and 17 with the warm-start bound (Section 3.7, Figures 8 and 9).</w:t>
+        <w:t xml:space="preserve">From the rules and the attack rate alone we derive when counting leaks less than testing, and check the estimates against measurements over attacks of up to an hour: they ordered the policies’ mean leakage in 18 of 18 decisive cells with the cold-start bound and 17 with the warm-start bound (Section 3.7, Figures 9 and 10).</w:t>
       </w:r>
     </w:p>
     <w:p>
@@ -1527,7 +1527,7 @@
     </w:tbl>
     <w:bookmarkEnd w:id="29"/>
     <w:bookmarkEnd w:id="30"/>
-    <w:bookmarkStart w:id="52" w:name="threat-model-and-design"/>
+    <w:bookmarkStart w:id="55" w:name="threat-model-and-design"/>
     <w:p>
       <w:pPr>
         <w:pStyle w:val="Heading1"/>
@@ -1681,30 +1681,6 @@
     </w:p>
     <w:p>
       <w:pPr>
-        <w:pStyle w:val="BodyText"/>
-      </w:pPr>
-      <w:r>
-        <w:t xml:space="preserve">At the client, the attacker runs scripts behind residential proxies in the service’s own country, with a fresh address per request, or from a datacenter abroad, or spread at a low rate over twenty autonomous systems. It buys human-like reCAPTCHA v3 tokens from solving services at about 0.3 cents each, so a score threshold alone does not stop it. It mints a fresh browser fingerprint per request, pre-ages fingerprints for hours, or reuses one two-day-old profile; it can present a forged platform header; and it draws numbers at random, walks them upward, or takes them from its partner’s blocks. It knows every threshold, the parameters of the destination tests and the timing of the workers, and it sees only the one uniform response that Section 3.3 describes.</w:t>
-      </w:r>
-    </w:p>
-    <w:p>
-      <w:pPr>
-        <w:pStyle w:val="BodyText"/>
-      </w:pPr>
-      <w:r>
-        <w:t xml:space="preserve">On its own ranges, a pumper’s operator can do what a real recipient could: enter the code it receives, within a second or after a human-like delay, or only when a block’s statistic nears its threshold; report deliveries as failed, so that a billed send feeds no test; and verify on hundreds of identity-and-number pairs for ten or thirty minutes to build trusted history before flooding with the same pairs. It can spread over three to three hundred blocks, at full rate or paced to a counter’s quota, and it can buy a solution for every interactive challenge.</w:t>
-      </w:r>
-    </w:p>
-    <w:p>
-      <w:pPr>
-        <w:pStyle w:val="BodyText"/>
-      </w:pPr>
-      <w:r>
-        <w:t xml:space="preserve">Three things it cannot do. It cannot forge an app attestation, so a platform established at Step 0 is evidence rather than a claim. It cannot earn on a range its partner does not terminate, which is why the destination is the one key it cannot rotate away from. And it cannot make a stranger enter a code, so a code entered on a block that real users share is honest evidence about that block; what a code entered on the attacker’s own number buys it, we measure rather than assume. Attacks on a code after delivery (Section 2.5) and compromise of the service, its vendors or the attestation providers are outside the model. Table 2 lists the 25 profiles that instantiate these capabilities; pool size, rate and CAPTCHA class are drawn per seed.</w:t>
-      </w:r>
-    </w:p>
-    <w:p>
-      <w:pPr>
         <w:pStyle w:val="CaptionedFigure"/>
       </w:pPr>
       <w:r>
@@ -1768,54 +1744,151 @@
         <w:t xml:space="preserve">The Threat Model on the Path of a Request.</w:t>
       </w:r>
     </w:p>
-    <w:bookmarkEnd w:id="38"/>
-    <w:bookmarkStart w:id="45" w:name="the-pipeline"/>
     <w:p>
       <w:pPr>
-        <w:pStyle w:val="Heading2"/>
-      </w:pPr>
-      <w:r>
-        <w:rPr>
-          <w:rStyle w:val="SectionNumber"/>
-        </w:rPr>
-        <w:t xml:space="preserve">3.3</w:t>
-      </w:r>
-      <w:r>
-        <w:tab/>
-      </w:r>
-      <w:r>
-        <w:t xml:space="preserve">The pipeline</w:t>
+        <w:pStyle w:val="BodyText"/>
+      </w:pPr>
+      <w:r>
+        <w:t xml:space="preserve">At the client, the attacker runs scripts behind residential proxies in the service’s own country, with a fresh address per request, or from a datacenter abroad, or spread at a low rate over twenty autonomous systems. It buys human-like reCAPTCHA v3 tokens from solving services at about 0.3 cents each, so a score threshold alone does not stop it. It mints a fresh browser fingerprint per request, pre-ages fingerprints for hours, or reuses one two-day-old profile; it can present a forged platform header; and it draws numbers at random, walks them upward, or takes them from its partner’s blocks. It knows every threshold, the parameters of the destination tests and the timing of the workers, and it sees only the one uniform response that Section 3.3 describes.</w:t>
       </w:r>
     </w:p>
     <w:p>
       <w:pPr>
-        <w:pStyle w:val="FirstParagraph"/>
-      </w:pPr>
-      <w:r>
-        <w:t xml:space="preserve">We designed the pipeline so that no message is paid for before every check passes, and cheap checks run first. Trust comes from evidence the client cannot forge, an attestation, a server-signed session, and the fate of earlier codes, though such evidence can be manufactured (Section 5.8). A request passes the twelve steps of Figure 3, which marks on each step the gaps of Section 3.1 it closes (FB: the feedback loop), until it is refused; Algorithm 2 gives the same pipeline as we implemented it, with the feedback loop of Section 3.4 and the block statistics of Section 3.5 as its second procedure. Read against Algorithm 1, it differs in four ways: the platform is established before anything else and from evidence, every limit is taken atomically and released on refusal, the number is priced and checked before it is paid for, and the outcome of each send flows back into the keys and the destination block that the next request will be judged on. Step 0 takes the platform only from a valid App Attest or Play Integrity result. Each limit and reservation is one atomic Redis operation, but the enclosing steps are not one transaction: on the normal path, a refused request returns its per-number claims and counter slot, and the hourly budget is reserved only for a message about to be enqueued, a reservation rather than a completed dispatch; a crash between them can leak reservations (Section 4). Address limits and source caps count requests, except that a request Step 11 challenges returns its source-cap count. Every outcome after Step 0, except the challenge, returns one HTTP 200 body after at least 400 ms, a floor that cannot hide longer work.</w:t>
+        <w:pStyle w:val="BodyText"/>
+      </w:pPr>
+      <w:r>
+        <w:t xml:space="preserve">On its own ranges, a pumper’s operator can do what a real recipient could: enter the code it receives, within a second or after a human-like delay, or only when a block’s statistic nears its threshold; report deliveries as failed, so that a billed send feeds no test; and verify on hundreds of identity-and-number pairs for ten or thirty minutes to build trusted history before flooding with the same pairs. It can spread over three to three hundred blocks, at full rate or paced to a counter’s quota, and it can buy a solution for every interactive challenge.</w:t>
       </w:r>
     </w:p>
     <w:p>
       <w:pPr>
+        <w:pStyle w:val="BodyText"/>
+      </w:pPr>
+      <w:r>
+        <w:t xml:space="preserve">Three things it cannot do. It cannot forge an app attestation, so a platform established at Step 0 is evidence rather than a claim. It cannot earn on a range its partner does not terminate, which is why the destination is the one key it cannot rotate away from. And it cannot make a stranger enter a code, so a code entered on a block that real users share is honest evidence about that block; what a code entered on the attacker’s own number buys it, we measure rather than assume. Attacks on a code after delivery (Section 2.5) and compromise of the service, its vendors or the attestation providers are outside the model. Table 2 lists the 25 profiles that instantiate these capabilities; pool size, rate and CAPTCHA class are drawn per seed.</w:t>
+      </w:r>
+    </w:p>
+    <w:bookmarkEnd w:id="38"/>
+    <w:bookmarkStart w:id="48" w:name="the-pipeline"/>
+    <w:p>
+      <w:pPr>
+        <w:pStyle w:val="Heading2"/>
+      </w:pPr>
+      <w:r>
+        <w:rPr>
+          <w:rStyle w:val="SectionNumber"/>
+        </w:rPr>
+        <w:t xml:space="preserve">3.3</w:t>
+      </w:r>
+      <w:r>
+        <w:tab/>
+      </w:r>
+      <w:r>
+        <w:t xml:space="preserve">The pipeline</w:t>
+      </w:r>
+    </w:p>
+    <w:p>
+      <w:pPr>
+        <w:pStyle w:val="FirstParagraph"/>
+      </w:pPr>
+      <w:r>
+        <w:t xml:space="preserve">Figure 3 shows the implementation as deployed. An HTTP API, run on any number of instances, offers the client five public endpoints: an attestation challenge and an enrolment, a session endpoint where a reCAPTCHA token or an attestation buys a signed session, the request endpoint, which runs the pipeline and returns one uniform body, and the verify endpoint, which takes the code; two internal endpoints, behind a service credential, take the vendor’s delivery receipts and drive the timeouts. Behind the API sit the two procedures of Algorithm 2: the pipeline, which runs Steps 0–11 on each request, and the feedback loop, which applies each transition of a send (delivered, verified, failed, undelivered) as one compare-and-set. All state lives in one store, Redis in production and an in-memory twin with the same rules in the tests and the simulator: the sessions, every limit and reservation, the SMS history, the reputation counts, the block statistics and counters, the denylist, the adaptive multipliers and the operating mode. What the loop writes, the next request reads, which is how the outcome of one send changes the judgment of the next, and why any instance can verify any code. One worker per deployment ticks every minute to resolve the sends that timed out and to run the baseline job that sets the multipliers of Step 9 from the pipeline’s own counters. Every external dependency, attestation, reCAPTCHA, address intelligence, the HLR lookup, the SMS vendor and the downgrade channels, sits behind an adapter with an in-memory fake, and a deployment reports which adapters are fake so that production can refuse to start with any. The simulation of Section 4 runs the pipeline, the feedback loop, the worker’s two jobs and the in-memory store as drawn, without the HTTP layer, replaces the external services with their fakes, and in the main study hands the baseline job the modeled legitimate rate instead of letting it learn it (Section 5.4 runs the learning job).</w:t>
+      </w:r>
+    </w:p>
+    <w:p>
+      <w:pPr>
         <w:pStyle w:val="CaptionedFigure"/>
       </w:pPr>
       <w:r>
         <w:drawing>
           <wp:inline>
-            <wp:extent cx="5334000" cy="2502185"/>
+            <wp:extent cx="5334000" cy="2827368"/>
             <wp:effectExtent b="0" l="0" r="0" t="0"/>
             <wp:docPr descr="" title="" id="40" name="Picture"/>
             <a:graphic>
               <a:graphicData uri="http://schemas.openxmlformats.org/drawingml/2006/picture">
                 <pic:pic>
                   <pic:nvPicPr>
-                    <pic:cNvPr descr="figures/fig10_steps.png" id="41" name="Picture"/>
+                    <pic:cNvPr descr="figures/fig12_architecture.png" id="41" name="Picture"/>
                     <pic:cNvPicPr>
                       <a:picLocks noChangeArrowheads="1" noChangeAspect="1"/>
                     </pic:cNvPicPr>
                   </pic:nvPicPr>
                   <pic:blipFill>
                     <a:blip r:embed="rId39"/>
+                    <a:stretch>
+                      <a:fillRect/>
+                    </a:stretch>
+                  </pic:blipFill>
+                  <pic:spPr bwMode="auto">
+                    <a:xfrm>
+                      <a:off x="0" y="0"/>
+                      <a:ext cx="5334000" cy="2827368"/>
+                    </a:xfrm>
+                    <a:prstGeom prst="rect">
+                      <a:avLst/>
+                    </a:prstGeom>
+                    <a:noFill/>
+                    <a:ln w="9525">
+                      <a:noFill/>
+                      <a:headEnd/>
+                      <a:tailEnd/>
+                    </a:ln>
+                  </pic:spPr>
+                </pic:pic>
+              </a:graphicData>
+            </a:graphic>
+          </wp:inline>
+        </w:drawing>
+      </w:r>
+    </w:p>
+    <w:p>
+      <w:pPr>
+        <w:pStyle w:val="ImageCaption"/>
+      </w:pPr>
+      <w:r>
+        <w:rPr>
+          <w:bCs/>
+          <w:b/>
+        </w:rPr>
+        <w:t xml:space="preserve">Fig. 3.</w:t>
+      </w:r>
+      <w:r>
+        <w:t xml:space="preserve"> </w:t>
+      </w:r>
+      <w:r>
+        <w:t xml:space="preserve">Architecture of the Implementation.</w:t>
+      </w:r>
+    </w:p>
+    <w:p>
+      <w:pPr>
+        <w:pStyle w:val="BodyText"/>
+      </w:pPr>
+      <w:r>
+        <w:t xml:space="preserve">We designed the pipeline so that no message is paid for before every check passes, and cheap checks run first. Trust comes from evidence the client cannot forge, an attestation, a server-signed session, and the fate of earlier codes, though such evidence can be manufactured (Section 5.8). A request passes the twelve steps of Figure 4, which marks on each step the gaps of Section 3.1 it closes (FB: the feedback loop), until it is refused; Algorithm 2 gives the same pipeline as we implemented it, with the feedback loop of Section 3.4 and the block statistics of Section 3.5 as its second procedure. Read against Algorithm 1, it differs in four ways: the platform is established before anything else and from evidence, every limit is taken atomically and released on refusal, the number is priced and checked before it is paid for, and the outcome of each send flows back into the keys and the destination block that the next request will be judged on. Step 0 takes the platform only from a valid App Attest or Play Integrity result. Each limit and reservation is one atomic Redis operation, but the enclosing steps are not one transaction: on the normal path, a refused request returns its per-number claims and counter slot, and the hourly budget is reserved only for a message about to be enqueued, a reservation rather than a completed dispatch; a crash between them can leak reservations (Section 4). Address limits and source caps count requests, except that a request Step 11 challenges returns its source-cap count. Every outcome after Step 0, except the challenge, returns one HTTP 200 body after at least 400 ms, a floor that cannot hide longer work.</w:t>
+      </w:r>
+    </w:p>
+    <w:p>
+      <w:pPr>
+        <w:pStyle w:val="CaptionedFigure"/>
+      </w:pPr>
+      <w:r>
+        <w:drawing>
+          <wp:inline>
+            <wp:extent cx="5334000" cy="2502185"/>
+            <wp:effectExtent b="0" l="0" r="0" t="0"/>
+            <wp:docPr descr="" title="" id="43" name="Picture"/>
+            <a:graphic>
+              <a:graphicData uri="http://schemas.openxmlformats.org/drawingml/2006/picture">
+                <pic:pic>
+                  <pic:nvPicPr>
+                    <pic:cNvPr descr="figures/fig10_steps.png" id="44" name="Picture"/>
+                    <pic:cNvPicPr>
+                      <a:picLocks noChangeArrowheads="1" noChangeAspect="1"/>
+                    </pic:cNvPicPr>
+                  </pic:nvPicPr>
+                  <pic:blipFill>
+                    <a:blip r:embed="rId42"/>
                     <a:stretch>
                       <a:fillRect/>
                     </a:stretch>
@@ -1851,7 +1924,7 @@
           <w:bCs/>
           <w:b/>
         </w:rPr>
-        <w:t xml:space="preserve">Fig. 3.</w:t>
+        <w:t xml:space="preserve">Fig. 4.</w:t>
       </w:r>
       <w:r>
         <w:t xml:space="preserve"> </w:t>
@@ -1869,18 +1942,18 @@
           <wp:inline>
             <wp:extent cx="5334000" cy="4671266"/>
             <wp:effectExtent b="0" l="0" r="0" t="0"/>
-            <wp:docPr descr="" title="" id="43" name="Picture"/>
+            <wp:docPr descr="" title="" id="46" name="Picture"/>
             <a:graphic>
               <a:graphicData uri="http://schemas.openxmlformats.org/drawingml/2006/picture">
                 <pic:pic>
                   <pic:nvPicPr>
-                    <pic:cNvPr descr="figures/alg2_v2.png" id="44" name="Picture"/>
+                    <pic:cNvPr descr="figures/alg2_v2.png" id="47" name="Picture"/>
                     <pic:cNvPicPr>
                       <a:picLocks noChangeArrowheads="1" noChangeAspect="1"/>
                     </pic:cNvPicPr>
                   </pic:nvPicPr>
                   <pic:blipFill>
-                    <a:blip r:embed="rId42"/>
+                    <a:blip r:embed="rId45"/>
                     <a:stretch>
                       <a:fillRect/>
                     </a:stretch>
@@ -1922,7 +1995,7 @@
         <w:t xml:space="preserve"> </w:t>
       </w:r>
       <w:r>
-        <w:t xml:space="preserve">The v2 pipeline and its feedback loop, as implemented (release 2.9.0); the steps are those of Figure 3.</w:t>
+        <w:t xml:space="preserve">The v2 pipeline and its feedback loop, as implemented (release 2.9.0); the steps are those of Figure 4.</w:t>
       </w:r>
     </w:p>
     <w:p>
@@ -2463,8 +2536,8 @@
         <w:t xml:space="preserve">.</w:t>
       </w:r>
     </w:p>
-    <w:bookmarkEnd w:id="45"/>
-    <w:bookmarkStart w:id="46" w:name="the-feedback-loop"/>
+    <w:bookmarkEnd w:id="48"/>
+    <w:bookmarkStart w:id="49" w:name="the-feedback-loop"/>
     <w:p>
       <w:pPr>
         <w:pStyle w:val="Heading2"/>
@@ -2538,8 +2611,8 @@
         <w:t xml:space="preserve">without a receipt in 60 s or with a failed receipt; only the first two count toward reputation. A positive receipt after a negative one reopens the send; a late verification reclassifies it, but an issued verdict stands. Each transition records its effects and its time in the same compare-and-set, and a recovery sweep completes the work of a dead process; each effect type applies at most once, and exactly once if the sweep runs within 20 minutes. Reputation counts land in the transition’s hour, and a block keeps its latest outage failure time; however, a block’s statistic accumulates in processing order, and a verdict is dated at the event that completes the crossing; thus, a late event can backdate a verdict that contains later evidence, moving its expiry and the next test’s start (by 10 min in one diagnostic). Simulated runs apply events in time order, but concurrent live instances may not, because a transition is committed before its effects apply; thus, the same dependence holds live unless a block’s effects are serialized.</w:t>
       </w:r>
     </w:p>
-    <w:bookmarkEnd w:id="46"/>
-    <w:bookmarkStart w:id="49" w:name="destination-policies"/>
+    <w:bookmarkEnd w:id="49"/>
+    <w:bookmarkStart w:id="52" w:name="destination-policies"/>
     <w:p>
       <w:pPr>
         <w:pStyle w:val="Heading2"/>
@@ -2565,7 +2638,7 @@
         <w:t xml:space="preserve">A pumper is confined to its partner’s ranges but can rotate numbers and blocks within them. Destination policies are keyed on the 8-digit block (10 000 numbers); therefore, protection weakens as a pumper spreads.</w:t>
       </w:r>
     </w:p>
-    <w:bookmarkStart w:id="47" w:name="sequential-tests-1"/>
+    <w:bookmarkStart w:id="50" w:name="sequential-tests-1"/>
     <w:p>
       <w:pPr>
         <w:pStyle w:val="Heading3"/>
@@ -3084,8 +3157,8 @@
         <w:t xml:space="preserve">. A first verdict makes the block’s first-time clients pass a challenge for an hour; a second within the hour moves them off SMS, refusing those without another channel.</w:t>
       </w:r>
     </w:p>
-    <w:bookmarkEnd w:id="47"/>
-    <w:bookmarkStart w:id="48" w:name="counters"/>
+    <w:bookmarkEnd w:id="50"/>
+    <w:bookmarkStart w:id="51" w:name="counters"/>
     <w:p>
       <w:pPr>
         <w:pStyle w:val="Heading3"/>
@@ -3111,9 +3184,9 @@
         <w:t xml:space="preserve">A counter limits the number of SMS sent per block in a daily or short refilling window. Step 11 reserves a slot and decides the stage in one atomic operation when an SMS is about to be sent, so concurrent requests cannot skip the challenge. Past the limit, a graded counter challenges first-time clients, and past twice the limit moves them off SMS; a refusing counter refuses. Clients with verified history are exempt from both policies; therefore, a code entered on a pumper’s number can buy that number an exemption. We also explored a token bucket of the same rate (burst 4 or 12; its challenge-tier bucket refills independently, unlike RFC 2697’s (Heinanen and Guerin, 1999)) and the counter combined with the tests.</w:t>
       </w:r>
     </w:p>
-    <w:bookmarkEnd w:id="48"/>
-    <w:bookmarkEnd w:id="49"/>
-    <w:bookmarkStart w:id="50" w:name="capacity-controls"/>
+    <w:bookmarkEnd w:id="51"/>
+    <w:bookmarkEnd w:id="52"/>
+    <w:bookmarkStart w:id="53" w:name="capacity-controls"/>
     <w:p>
       <w:pPr>
         <w:pStyle w:val="Heading2"/>
@@ -3139,8 +3212,8 @@
         <w:t xml:space="preserve">Step 9 multiplies its caps by 0.25 to 1.5 according to a baseline job comparing each key with its expected rate, learned from the pipeline’s hourly counters; without history, the static cap stands. Verified history avoids adaptive reduction, not the static caps or the budget, which bounds SMS count and spend, not vendor or fallback costs.</w:t>
       </w:r>
     </w:p>
-    <w:bookmarkEnd w:id="50"/>
-    <w:bookmarkStart w:id="51" w:name="leakage-estimates"/>
+    <w:bookmarkEnd w:id="53"/>
+    <w:bookmarkStart w:id="54" w:name="leakage-estimates"/>
     <w:p>
       <w:pPr>
         <w:pStyle w:val="Heading2"/>
@@ -4408,9 +4481,9 @@
         <w:t xml:space="preserve">. This is not a challenge rate: exempt clients take slots without challenge, and challenge failures, the second tier and earlier gates are ignored. The estimates use only the rules, configuration, and attack rate; what an excess send costs a user needs the simulation.</w:t>
       </w:r>
     </w:p>
-    <w:bookmarkEnd w:id="51"/>
-    <w:bookmarkEnd w:id="52"/>
-    <w:bookmarkStart w:id="63" w:name="methodology"/>
+    <w:bookmarkEnd w:id="54"/>
+    <w:bookmarkEnd w:id="55"/>
+    <w:bookmarkStart w:id="66" w:name="methodology"/>
     <w:p>
       <w:pPr>
         <w:pStyle w:val="Heading1"/>
@@ -4433,7 +4506,7 @@
         <w:pStyle w:val="FirstParagraph"/>
       </w:pPr>
       <w:r>
-        <w:t xml:space="preserve">Figure 4 summarizes how we evaluated the design. Our implementation of Algorithm 2 runs inside an event-driven simulator against scripted attackers and simulated users, one run per design, attacker, workload and seed (Algorithm 3); we group the runs into studies under two protocols that we committed before their runs; and we score each run by what the attacker got through and by what legitimate users lost. The rest of this section gives the implementation, the simulator, the protocols and the metrics in that order.</w:t>
+        <w:t xml:space="preserve">Figure 5 summarizes how we evaluated the design. Our implementation of Algorithm 2 runs inside an event-driven simulator against scripted attackers and simulated users, one run per design, attacker, workload and seed (Algorithm 3); we group the runs into studies under two protocols that we committed before their runs; and we score each run by what the attacker got through and by what legitimate users lost. The rest of this section gives the implementation, the simulator, the protocols and the metrics in that order.</w:t>
       </w:r>
     </w:p>
     <w:p>
@@ -4445,18 +4518,18 @@
           <wp:inline>
             <wp:extent cx="5334000" cy="2550880"/>
             <wp:effectExtent b="0" l="0" r="0" t="0"/>
-            <wp:docPr descr="" title="" id="54" name="Picture"/>
+            <wp:docPr descr="" title="" id="57" name="Picture"/>
             <a:graphic>
               <a:graphicData uri="http://schemas.openxmlformats.org/drawingml/2006/picture">
                 <pic:pic>
                   <pic:nvPicPr>
-                    <pic:cNvPr descr="figures/fig11_method.png" id="55" name="Picture"/>
+                    <pic:cNvPr descr="figures/fig11_method.png" id="58" name="Picture"/>
                     <pic:cNvPicPr>
                       <a:picLocks noChangeArrowheads="1" noChangeAspect="1"/>
                     </pic:cNvPicPr>
                   </pic:nvPicPr>
                   <pic:blipFill>
-                    <a:blip r:embed="rId53"/>
+                    <a:blip r:embed="rId56"/>
                     <a:stretch>
                       <a:fillRect/>
                     </a:stretch>
@@ -4492,7 +4565,7 @@
           <w:bCs/>
           <w:b/>
         </w:rPr>
-        <w:t xml:space="preserve">Fig. 4.</w:t>
+        <w:t xml:space="preserve">Fig. 5.</w:t>
       </w:r>
       <w:r>
         <w:t xml:space="preserve"> </w:t>
@@ -4501,7 +4574,7 @@
         <w:t xml:space="preserve">The Evaluation Method: Inputs, Runs, Protocols and Metrics.</w:t>
       </w:r>
     </w:p>
-    <w:bookmarkStart w:id="56" w:name="implementation"/>
+    <w:bookmarkStart w:id="59" w:name="implementation"/>
     <w:p>
       <w:pPr>
         <w:pStyle w:val="Heading2"/>
@@ -4542,8 +4615,8 @@
         <w:t xml:space="preserve">and 18 exercise specific interleavings of two instances, not all. Step 11 is still not one transaction: a crash after its reservations leaks reserved slots or resolves the send as undelivered. The implementation is a research prototype.</w:t>
       </w:r>
     </w:p>
-    <w:bookmarkEnd w:id="56"/>
-    <w:bookmarkStart w:id="60" w:name="simulation"/>
+    <w:bookmarkEnd w:id="59"/>
+    <w:bookmarkStart w:id="63" w:name="simulation"/>
     <w:p>
       <w:pPr>
         <w:pStyle w:val="Heading2"/>
@@ -4578,18 +4651,18 @@
           <wp:inline>
             <wp:extent cx="5334000" cy="2289935"/>
             <wp:effectExtent b="0" l="0" r="0" t="0"/>
-            <wp:docPr descr="" title="" id="58" name="Picture"/>
+            <wp:docPr descr="" title="" id="61" name="Picture"/>
             <a:graphic>
               <a:graphicData uri="http://schemas.openxmlformats.org/drawingml/2006/picture">
                 <pic:pic>
                   <pic:nvPicPr>
-                    <pic:cNvPr descr="figures/alg3_sim.png" id="59" name="Picture"/>
+                    <pic:cNvPr descr="figures/alg3_sim.png" id="62" name="Picture"/>
                     <pic:cNvPicPr>
                       <a:picLocks noChangeArrowheads="1" noChangeAspect="1"/>
                     </pic:cNvPicPr>
                   </pic:nvPicPr>
                   <pic:blipFill>
-                    <a:blip r:embed="rId57"/>
+                    <a:blip r:embed="rId60"/>
                     <a:stretch>
                       <a:fillRect/>
                     </a:stretch>
@@ -5159,8 +5232,8 @@
         </w:tc>
       </w:tr>
     </w:tbl>
-    <w:bookmarkEnd w:id="60"/>
-    <w:bookmarkStart w:id="61" w:name="the-two-protocols"/>
+    <w:bookmarkEnd w:id="63"/>
+    <w:bookmarkStart w:id="64" w:name="the-two-protocols"/>
     <w:p>
       <w:pPr>
         <w:pStyle w:val="Heading2"/>
@@ -5234,8 +5307,8 @@
         <w:t xml:space="preserve">300 under both protocols (artifact change report).</w:t>
       </w:r>
     </w:p>
-    <w:bookmarkEnd w:id="61"/>
-    <w:bookmarkStart w:id="62" w:name="designs-and-metrics"/>
+    <w:bookmarkEnd w:id="64"/>
+    <w:bookmarkStart w:id="65" w:name="designs-and-metrics"/>
     <w:p>
       <w:pPr>
         <w:pStyle w:val="Heading2"/>
@@ -5444,9 +5517,9 @@
         <w:t xml:space="preserve">compares the attacked trace with attack-free operation under the same policy.</w:t>
       </w:r>
     </w:p>
-    <w:bookmarkEnd w:id="62"/>
-    <w:bookmarkEnd w:id="63"/>
-    <w:bookmarkStart w:id="90" w:name="results"/>
+    <w:bookmarkEnd w:id="65"/>
+    <w:bookmarkEnd w:id="66"/>
+    <w:bookmarkStart w:id="93" w:name="results"/>
     <w:p>
       <w:pPr>
         <w:pStyle w:val="Heading1"/>
@@ -5464,7 +5537,7 @@
         <w:t xml:space="preserve">Results</w:t>
       </w:r>
     </w:p>
-    <w:bookmarkStart w:id="64" w:name="what-is-contained"/>
+    <w:bookmarkStart w:id="67" w:name="what-is-contained"/>
     <w:p>
       <w:pPr>
         <w:pStyle w:val="Heading2"/>
@@ -6931,8 +7004,8 @@
         <w:t xml:space="preserve">The farm leaks 99.5% with caps lifted under every design; v2’s adaptive cap holds it to 229 [215, 244] messages, 46%, by refusing 54% [47, 60] of first-time users, so 45.5% complete instead of 76.4% under v1: rationing (claim C5 held in 36 of 36 cells).</w:t>
       </w:r>
     </w:p>
-    <w:bookmarkEnd w:id="64"/>
-    <w:bookmarkStart w:id="65" w:name="what-each-layer-does"/>
+    <w:bookmarkEnd w:id="67"/>
+    <w:bookmarkStart w:id="68" w:name="what-each-layer-does"/>
     <w:p>
       <w:pPr>
         <w:pStyle w:val="Heading2"/>
@@ -7009,8 +7082,8 @@
         <w:t xml:space="preserve">]).</w:t>
       </w:r>
     </w:p>
-    <w:bookmarkEnd w:id="65"/>
-    <w:bookmarkStart w:id="66" w:name="where-reputation-stops-separating"/>
+    <w:bookmarkEnd w:id="68"/>
+    <w:bookmarkStart w:id="69" w:name="where-reputation-stops-separating"/>
     <w:p>
       <w:pPr>
         <w:pStyle w:val="Heading2"/>
@@ -7036,8 +7109,8 @@
         <w:t xml:space="preserve">A farmed-CAPTCHA attacker uses an address and fingerprint once and shares its country, prefix, and residential ASN with every legitimate user; thus, its failures penalize everyone: over an hour with caps lifted (five seeds), up to twice the legitimate rate, 99 to 100% of it leaks, since a shared key stays above 0.3 conversion until failures outnumber legitimate sends about 1.7 to one. At ten times, 70% leaks while 17% of legitimate users are challenged and 3.2% refused (claim C2, at least 90% leaked with caps lifted, held in 34 of 36 cells). No single score change separates better: a fresh-fingerprint weight of 40 stops it only by challenging 47% of legitimate users. In the settings run, reputation separated an attacker only on keys its sends dominated (Douceur, 2002).</w:t>
       </w:r>
     </w:p>
-    <w:bookmarkEnd w:id="66"/>
-    <w:bookmarkStart w:id="67" w:name="what-rationing-costs"/>
+    <w:bookmarkEnd w:id="69"/>
+    <w:bookmarkStart w:id="70" w:name="what-rationing-costs"/>
     <w:p>
       <w:pPr>
         <w:pStyle w:val="Heading2"/>
@@ -7063,8 +7136,8 @@
         <w:t xml:space="preserve">When separation fails, the cap is the lever: over ten seeds, the default lets 47% of the farm’s requests through and refuses 41% of all legitimate users, the tightest setting 20% and 64%. Both assume an oracle job that is told the legitimate rate and runs every minute; running every five minutes or hourly, it lets 75%–96% through. Learning the rate from the pipeline’s counters, the deployed job leaks 193 [161, 229] messages with a clean three-week profile, 340 [239, 441] more on a cold start, 106 [62, 151] more with a stale profile, and 45 [10, 77] more with a poisoned one.</w:t>
       </w:r>
     </w:p>
-    <w:bookmarkEnd w:id="67"/>
-    <w:bookmarkStart w:id="68" w:name="pumping-against-the-tests"/>
+    <w:bookmarkEnd w:id="70"/>
+    <w:bookmarkStart w:id="71" w:name="pumping-against-the-tests"/>
     <w:p>
       <w:pPr>
         <w:pStyle w:val="Heading2"/>
@@ -8066,8 +8139,8 @@
         <w:t xml:space="preserve">Across 18 spread configurations, leakage follows the blocks touched: with 30 blocks, five to seven runs in ten are still contained. Unsaturated, Equation (2) errs by 1.6 to 7.9 messages per run (1%–13%, ten configurations); saturated, it overstates by up to 91.</w:t>
       </w:r>
     </w:p>
-    <w:bookmarkEnd w:id="68"/>
-    <w:bookmarkStart w:id="87" w:name="counting-against-testing"/>
+    <w:bookmarkEnd w:id="71"/>
+    <w:bookmarkStart w:id="90" w:name="counting-against-testing"/>
     <w:p>
       <w:pPr>
         <w:pStyle w:val="Heading2"/>
@@ -8094,18 +8167,18 @@
           <wp:inline>
             <wp:extent cx="5334000" cy="3597348"/>
             <wp:effectExtent b="0" l="0" r="0" t="0"/>
-            <wp:docPr descr="" title="" id="70" name="Picture"/>
+            <wp:docPr descr="" title="" id="73" name="Picture"/>
             <a:graphic>
               <a:graphicData uri="http://schemas.openxmlformats.org/drawingml/2006/picture">
                 <pic:pic>
                   <pic:nvPicPr>
-                    <pic:cNvPr descr="figures/fig6_matched_a.png" id="71" name="Picture"/>
+                    <pic:cNvPr descr="figures/fig6_matched_a.png" id="74" name="Picture"/>
                     <pic:cNvPicPr>
                       <a:picLocks noChangeArrowheads="1" noChangeAspect="1"/>
                     </pic:cNvPicPr>
                   </pic:nvPicPr>
                   <pic:blipFill>
-                    <a:blip r:embed="rId69"/>
+                    <a:blip r:embed="rId72"/>
                     <a:stretch>
                       <a:fillRect/>
                     </a:stretch>
@@ -8141,7 +8214,7 @@
           <w:bCs/>
           <w:b/>
         </w:rPr>
-        <w:t xml:space="preserve">Fig. 5.</w:t>
+        <w:t xml:space="preserve">Fig. 6.</w:t>
       </w:r>
       <w:r>
         <w:t xml:space="preserve"> </w:t>
@@ -8159,18 +8232,18 @@
           <wp:inline>
             <wp:extent cx="5334000" cy="4341627"/>
             <wp:effectExtent b="0" l="0" r="0" t="0"/>
-            <wp:docPr descr="" title="" id="73" name="Picture"/>
+            <wp:docPr descr="" title="" id="76" name="Picture"/>
             <a:graphic>
               <a:graphicData uri="http://schemas.openxmlformats.org/drawingml/2006/picture">
                 <pic:pic>
                   <pic:nvPicPr>
-                    <pic:cNvPr descr="figures/fig6_matched_b.png" id="74" name="Picture"/>
+                    <pic:cNvPr descr="figures/fig6_matched_b.png" id="77" name="Picture"/>
                     <pic:cNvPicPr>
                       <a:picLocks noChangeArrowheads="1" noChangeAspect="1"/>
                     </pic:cNvPicPr>
                   </pic:nvPicPr>
                   <pic:blipFill>
-                    <a:blip r:embed="rId72"/>
+                    <a:blip r:embed="rId75"/>
                     <a:stretch>
                       <a:fillRect/>
                     </a:stretch>
@@ -8206,7 +8279,7 @@
           <w:bCs/>
           <w:b/>
         </w:rPr>
-        <w:t xml:space="preserve">Fig. 6.</w:t>
+        <w:t xml:space="preserve">Fig. 7.</w:t>
       </w:r>
       <w:r>
         <w:t xml:space="preserve"> </w:t>
@@ -9389,7 +9462,7 @@
         </w:tc>
       </w:tr>
     </w:tbl>
-    <w:bookmarkStart w:id="75" w:name="at-a-service-target"/>
+    <w:bookmarkStart w:id="78" w:name="at-a-service-target"/>
     <w:p>
       <w:pPr>
         <w:pStyle w:val="Heading3"/>
@@ -9412,7 +9485,7 @@
         <w:pStyle w:val="FirstParagraph"/>
       </w:pPr>
       <w:r>
-        <w:t xml:space="preserve">Table 5 reports the first protocol at 200 blocks (144 legitimate sends per block a day; tuning seeds 100–102, evaluation seeds 0–9): 20-minute leakage against the never-verifying (NV), instant (IV), human-like (HL) and challenge-buying (CB) carriers and, from 24-hour attack-free runs at 65% conversion, completion, benign cost (points), users challenged and verdict events a day; the tuning target is 63.95%. Figure 5 plots each setting’s completion against its leakage summed over the four pumpers’ runs of a seed (not one combined attack), with the tuning target dotted; its unlabeled points are sequential settings matched to the default’s false alarms at other credits (key:</w:t>
+        <w:t xml:space="preserve">Table 5 reports the first protocol at 200 blocks (144 legitimate sends per block a day; tuning seeds 100–102, evaluation seeds 0–9): 20-minute leakage against the never-verifying (NV), instant (IV), human-like (HL) and challenge-buying (CB) carriers and, from 24-hour attack-free runs at 65% conversion, completion, benign cost (points), users challenged and verdict events a day; the tuning target is 63.95%. Figure 6 plots each setting’s completion against its leakage summed over the four pumpers’ runs of a seed (not one combined attack), with the tuning target dotted; its unlabeled points are sequential settings matched to the default’s false alarms at other credits (key:</w:t>
       </w:r>
       <w:r>
         <w:t xml:space="preserve"> </w:t>
@@ -9424,7 +9497,7 @@
         <w:t xml:space="preserve">results/ figure1_key.md</w:t>
       </w:r>
       <w:r>
-        <w:t xml:space="preserve">). Figure 6 gives each selected setting’s leakage minus the default’s, paired per seed (negative: leaks less). The sequential setting selected at the tuning target holds the human-like carrier to 126 messages only by raising 334 false verdict events a day, and misses the target by 0.18 points on seeds 0–9. The graded counter of four sends per block per ten minutes leaks 24 against each outcome-reading carrier and 48 against the challenge buyer, at 0.06 points; counters selected at the sparser settings leak 6 to 18 at 0.15 to 0.35 points (up to 0.43 at 80%). With the full grid and density-specific attacks (E5) the rule selects the same counters, and so do other objectives on the tuning runs (worst-case leakage, a first-time-loss constraint, each attacker alone, 2 000 random mixes), except the instant verifier alone and 3 mixes at 200 blocks; on fresh seeds the counter leaked least of the winners against every attacker but the instant verifier (25, against 15 and 16). On seeds 300–309 the 1 000-block counter falls 0.12 points below its target, yet no seed-and-conversion cell fails the paired check (the evaluation default minus 0.5 points).</w:t>
+        <w:t xml:space="preserve">). Figure 7 gives each selected setting’s leakage minus the default’s, paired per seed (negative: leaks less). The sequential setting selected at the tuning target holds the human-like carrier to 126 messages only by raising 334 false verdict events a day, and misses the target by 0.18 points on seeds 0–9. The graded counter of four sends per block per ten minutes leaks 24 against each outcome-reading carrier and 48 against the challenge buyer, at 0.06 points; counters selected at the sparser settings leak 6 to 18 at 0.15 to 0.35 points (up to 0.43 at 80%). With the full grid and density-specific attacks (E5) the rule selects the same counters, and so do other objectives on the tuning runs (worst-case leakage, a first-time-loss constraint, each attacker alone, 2 000 random mixes), except the instant verifier alone and 3 mixes at 200 blocks; on fresh seeds the counter leaked least of the winners against every attacker but the instant verifier (25, against 15 and 16). On seeds 300–309 the 1 000-block counter falls 0.12 points below its target, yet no seed-and-conversion cell fails the paired check (the evaluation default minus 0.5 points).</w:t>
       </w:r>
     </w:p>
     <w:p>
@@ -10057,8 +10130,8 @@
         </w:tc>
       </w:tr>
     </w:tbl>
-    <w:bookmarkEnd w:id="75"/>
-    <w:bookmarkStart w:id="76" w:name="on-held-out-traffic"/>
+    <w:bookmarkEnd w:id="78"/>
+    <w:bookmarkStart w:id="79" w:name="on-held-out-traffic"/>
     <w:p>
       <w:pPr>
         <w:pStyle w:val="Heading3"/>
@@ -12407,8 +12480,8 @@
         <w:t xml:space="preserve">0. A token bucket with a burst of 4 spared the poisoner’s users only by letting almost everything through; with two untuned settings, neither limiter dominated, and we ranked only the implemented policies. Returning users, all simulated with verified history, lost nothing.</w:t>
       </w:r>
     </w:p>
-    <w:bookmarkEnd w:id="76"/>
-    <w:bookmarkStart w:id="86" w:name="the-counters-boundary"/>
+    <w:bookmarkEnd w:id="79"/>
+    <w:bookmarkStart w:id="89" w:name="the-counters-boundary"/>
     <w:p>
       <w:pPr>
         <w:pStyle w:val="Heading3"/>
@@ -12431,7 +12504,7 @@
         <w:pStyle w:val="FirstParagraph"/>
       </w:pPr>
       <w:r>
-        <w:t xml:space="preserve">Figures 7–9 show the counter’s operating boundary (E4, seeds 300–304). Figure 7 plots the attributable loss of the three hot blocks’ users against their legitimate rate, attack-free and with a never-verifying pumper on those blocks; its horizontal axis is logarithmic, and lines join sampled settings without locating a crossover. Attack-free, the counter costs a block’s users nothing at one send per ten minutes, 2.3 points at four and 5.5 at eight, far below the idealized share beyond the quota (27% at four), since most challenged users complete or switch to WhatsApp; without WhatsApp, eight sends cost 13.2. A 30-minute launch at three times the normal rate costs its blocks’ users 16 points. With a pumper on the same blocks, both policies turn that cost into a gain at up to four sends per ten minutes (the counter 6 to 15 points, the tests 1 to 10), because without a policy the pumper exhausts those blocks and the hourly budget; at eight sends, both cost their users again, the counter 4 points and the tests 9.</w:t>
+        <w:t xml:space="preserve">Figures 8–10 show the counter’s operating boundary (E4, seeds 300–304). Figure 8 plots the attributable loss of the three hot blocks’ users against their legitimate rate, attack-free and with a never-verifying pumper on those blocks; its horizontal axis is logarithmic, and lines join sampled settings without locating a crossover. Attack-free, the counter costs a block’s users nothing at one send per ten minutes, 2.3 points at four and 5.5 at eight, far below the idealized share beyond the quota (27% at four), since most challenged users complete or switch to WhatsApp; without WhatsApp, eight sends cost 13.2. A 30-minute launch at three times the normal rate costs its blocks’ users 16 points. With a pumper on the same blocks, both policies turn that cost into a gain at up to four sends per ten minutes (the counter 6 to 15 points, the tests 1 to 10), because without a policy the pumper exhausts those blocks and the hourly budget; at eight sends, both cost their users again, the counter 4 points and the tests 9.</w:t>
       </w:r>
     </w:p>
     <w:p>
@@ -12443,18 +12516,18 @@
           <wp:inline>
             <wp:extent cx="5334000" cy="4753643"/>
             <wp:effectExtent b="0" l="0" r="0" t="0"/>
-            <wp:docPr descr="" title="" id="78" name="Picture"/>
+            <wp:docPr descr="" title="" id="81" name="Picture"/>
             <a:graphic>
               <a:graphicData uri="http://schemas.openxmlformats.org/drawingml/2006/picture">
                 <pic:pic>
                   <pic:nvPicPr>
-                    <pic:cNvPr descr="figures/fig7a_service.png" id="79" name="Picture"/>
+                    <pic:cNvPr descr="figures/fig7a_service.png" id="82" name="Picture"/>
                     <pic:cNvPicPr>
                       <a:picLocks noChangeArrowheads="1" noChangeAspect="1"/>
                     </pic:cNvPicPr>
                   </pic:nvPicPr>
                   <pic:blipFill>
-                    <a:blip r:embed="rId77"/>
+                    <a:blip r:embed="rId80"/>
                     <a:stretch>
                       <a:fillRect/>
                     </a:stretch>
@@ -12490,7 +12563,7 @@
           <w:bCs/>
           <w:b/>
         </w:rPr>
-        <w:t xml:space="preserve">Fig. 7.</w:t>
+        <w:t xml:space="preserve">Fig. 8.</w:t>
       </w:r>
       <w:r>
         <w:t xml:space="preserve"> </w:t>
@@ -12504,7 +12577,7 @@
         <w:pStyle w:val="BodyText"/>
       </w:pPr>
       <w:r>
-        <w:t xml:space="preserve">Figures 8 and 9 plot leakage in 20 and 60 minutes against the blocks a pumper uses, at full rate or paced to the quota, with Equations (2)–(4) for the full-rate pumper as hollow markers; both axes are logarithmic. In twenty minutes (Figure 8) the counter leaked 25 and 81 messages on 3 and 10 blocks where the tests leaked 110 and 144, the two leaked about the same on 30 blocks (235 against 242), and from 100 blocks on both approached the no-policy line of about 700. Over 60 minutes (Figure 9) the default leaked 110, 144 and 242 messages on 3, 10 and 30 blocks, against 105, 139 and 240 from Equation (2) (</w:t>
+        <w:t xml:space="preserve">Figures 9 and 10 plot leakage in 20 and 60 minutes against the blocks a pumper uses, at full rate or paced to the quota, with Equations (2)–(4) for the full-rate pumper as hollow markers; both axes are logarithmic. In twenty minutes (Figure 9) the counter leaked 25 and 81 messages on 3 and 10 blocks where the tests leaked 110 and 144, the two leaked about the same on 30 blocks (235 against 242), and from 100 blocks on both approached the no-policy line of about 700. Over 60 minutes (Figure 10) the default leaked 110, 144 and 242 messages on 3, 10 and 30 blocks, against 105, 139 and 240 from Equation (2) (</w:t>
       </w:r>
       <m:oMath>
         <m:r>
@@ -12547,77 +12620,12 @@
           <wp:inline>
             <wp:extent cx="5334000" cy="6035703"/>
             <wp:effectExtent b="0" l="0" r="0" t="0"/>
-            <wp:docPr descr="" title="" id="81" name="Picture"/>
-            <a:graphic>
-              <a:graphicData uri="http://schemas.openxmlformats.org/drawingml/2006/picture">
-                <pic:pic>
-                  <pic:nvPicPr>
-                    <pic:cNvPr descr="figures/fig7b_security20.png" id="82" name="Picture"/>
-                    <pic:cNvPicPr>
-                      <a:picLocks noChangeArrowheads="1" noChangeAspect="1"/>
-                    </pic:cNvPicPr>
-                  </pic:nvPicPr>
-                  <pic:blipFill>
-                    <a:blip r:embed="rId80"/>
-                    <a:stretch>
-                      <a:fillRect/>
-                    </a:stretch>
-                  </pic:blipFill>
-                  <pic:spPr bwMode="auto">
-                    <a:xfrm>
-                      <a:off x="0" y="0"/>
-                      <a:ext cx="5334000" cy="6035703"/>
-                    </a:xfrm>
-                    <a:prstGeom prst="rect">
-                      <a:avLst/>
-                    </a:prstGeom>
-                    <a:noFill/>
-                    <a:ln w="9525">
-                      <a:noFill/>
-                      <a:headEnd/>
-                      <a:tailEnd/>
-                    </a:ln>
-                  </pic:spPr>
-                </pic:pic>
-              </a:graphicData>
-            </a:graphic>
-          </wp:inline>
-        </w:drawing>
-      </w:r>
-    </w:p>
-    <w:p>
-      <w:pPr>
-        <w:pStyle w:val="ImageCaption"/>
-      </w:pPr>
-      <w:r>
-        <w:rPr>
-          <w:bCs/>
-          <w:b/>
-        </w:rPr>
-        <w:t xml:space="preserve">Fig. 8.</w:t>
-      </w:r>
-      <w:r>
-        <w:t xml:space="preserve"> </w:t>
-      </w:r>
-      <w:r>
-        <w:t xml:space="preserve">Security Boundary of the Counter: a 20-Minute Attack.</w:t>
-      </w:r>
-    </w:p>
-    <w:p>
-      <w:pPr>
-        <w:pStyle w:val="CaptionedFigure"/>
-      </w:pPr>
-      <w:r>
-        <w:drawing>
-          <wp:inline>
-            <wp:extent cx="5334000" cy="6035703"/>
-            <wp:effectExtent b="0" l="0" r="0" t="0"/>
             <wp:docPr descr="" title="" id="84" name="Picture"/>
             <a:graphic>
               <a:graphicData uri="http://schemas.openxmlformats.org/drawingml/2006/picture">
                 <pic:pic>
                   <pic:nvPicPr>
-                    <pic:cNvPr descr="figures/fig7c_security60.png" id="85" name="Picture"/>
+                    <pic:cNvPr descr="figures/fig7b_security20.png" id="85" name="Picture"/>
                     <pic:cNvPicPr>
                       <a:picLocks noChangeArrowheads="1" noChangeAspect="1"/>
                     </pic:cNvPicPr>
@@ -12665,43 +12673,72 @@
         <w:t xml:space="preserve"> </w:t>
       </w:r>
       <w:r>
-        <w:t xml:space="preserve">Security Boundary of the Counter: a 60-Minute Attack.</w:t>
+        <w:t xml:space="preserve">Security Boundary of the Counter: a 20-Minute Attack.</w:t>
       </w:r>
     </w:p>
     <w:p>
       <w:pPr>
-        <w:pStyle w:val="BodyText"/>
-      </w:pPr>
-      <w:r>
-        <w:t xml:space="preserve">Against adaptive attackers (E3), the counter held the threshold-aware carrier, receipt faker, and concentrated trust builder to 24 to 36 messages (502 to 665 under the default), but not trust builders on random numbers (577, as under the default); over 360 minutes, the human-like carrier gained 81 messages an hour under the counter, and 753 under the default.</w:t>
-      </w:r>
-    </w:p>
-    <w:bookmarkEnd w:id="86"/>
-    <w:bookmarkEnd w:id="87"/>
-    <w:bookmarkStart w:id="88" w:name="the-cost-to-legitimate-users"/>
-    <w:p>
-      <w:pPr>
-        <w:pStyle w:val="Heading2"/>
-      </w:pPr>
-      <w:r>
-        <w:rPr>
-          <w:rStyle w:val="SectionNumber"/>
-        </w:rPr>
-        <w:t xml:space="preserve">5.7</w:t>
-      </w:r>
-      <w:r>
-        <w:tab/>
-      </w:r>
-      <w:r>
-        <w:t xml:space="preserve">The cost to legitimate users</w:t>
+        <w:pStyle w:val="CaptionedFigure"/>
+      </w:pPr>
+      <w:r>
+        <w:drawing>
+          <wp:inline>
+            <wp:extent cx="5334000" cy="6035703"/>
+            <wp:effectExtent b="0" l="0" r="0" t="0"/>
+            <wp:docPr descr="" title="" id="87" name="Picture"/>
+            <a:graphic>
+              <a:graphicData uri="http://schemas.openxmlformats.org/drawingml/2006/picture">
+                <pic:pic>
+                  <pic:nvPicPr>
+                    <pic:cNvPr descr="figures/fig7c_security60.png" id="88" name="Picture"/>
+                    <pic:cNvPicPr>
+                      <a:picLocks noChangeArrowheads="1" noChangeAspect="1"/>
+                    </pic:cNvPicPr>
+                  </pic:nvPicPr>
+                  <pic:blipFill>
+                    <a:blip r:embed="rId86"/>
+                    <a:stretch>
+                      <a:fillRect/>
+                    </a:stretch>
+                  </pic:blipFill>
+                  <pic:spPr bwMode="auto">
+                    <a:xfrm>
+                      <a:off x="0" y="0"/>
+                      <a:ext cx="5334000" cy="6035703"/>
+                    </a:xfrm>
+                    <a:prstGeom prst="rect">
+                      <a:avLst/>
+                    </a:prstGeom>
+                    <a:noFill/>
+                    <a:ln w="9525">
+                      <a:noFill/>
+                      <a:headEnd/>
+                      <a:tailEnd/>
+                    </a:ln>
+                  </pic:spPr>
+                </pic:pic>
+              </a:graphicData>
+            </a:graphic>
+          </wp:inline>
+        </w:drawing>
       </w:r>
     </w:p>
     <w:p>
       <w:pPr>
-        <w:pStyle w:val="FirstParagraph"/>
-      </w:pPr>
-      <w:r>
-        <w:t xml:space="preserve">On one block, 20 000 Monte Carlo trials per cell give the probability of a verdict within 30 legitimate sends: 0.09% [0.06, 0.14] at 80% conversion with 20% autofill, 1.9% at 65% and 19.5% at 50%. Over 24 hours, the default raises 0.5 verdict events a day on 200 busy blocks at 80% conversion and 6.5 at 65%, where they meet 30 of about 28 800 requests (claim C4 held in 18 of 18 cells).</w:t>
+        <w:pStyle w:val="ImageCaption"/>
+      </w:pPr>
+      <w:r>
+        <w:rPr>
+          <w:bCs/>
+          <w:b/>
+        </w:rPr>
+        <w:t xml:space="preserve">Fig. 10.</w:t>
+      </w:r>
+      <w:r>
+        <w:t xml:space="preserve"> </w:t>
+      </w:r>
+      <w:r>
+        <w:t xml:space="preserve">Security Boundary of the Counter: a 60-Minute Attack.</w:t>
       </w:r>
     </w:p>
     <w:p>
@@ -12709,11 +12746,47 @@
         <w:pStyle w:val="BodyText"/>
       </w:pPr>
       <w:r>
+        <w:t xml:space="preserve">Against adaptive attackers (E3), the counter held the threshold-aware carrier, receipt faker, and concentrated trust builder to 24 to 36 messages (502 to 665 under the default), but not trust builders on random numbers (577, as under the default); over 360 minutes, the human-like carrier gained 81 messages an hour under the counter, and 753 under the default.</w:t>
+      </w:r>
+    </w:p>
+    <w:bookmarkEnd w:id="89"/>
+    <w:bookmarkEnd w:id="90"/>
+    <w:bookmarkStart w:id="91" w:name="the-cost-to-legitimate-users"/>
+    <w:p>
+      <w:pPr>
+        <w:pStyle w:val="Heading2"/>
+      </w:pPr>
+      <w:r>
+        <w:rPr>
+          <w:rStyle w:val="SectionNumber"/>
+        </w:rPr>
+        <w:t xml:space="preserve">5.7</w:t>
+      </w:r>
+      <w:r>
+        <w:tab/>
+      </w:r>
+      <w:r>
+        <w:t xml:space="preserve">The cost to legitimate users</w:t>
+      </w:r>
+    </w:p>
+    <w:p>
+      <w:pPr>
+        <w:pStyle w:val="FirstParagraph"/>
+      </w:pPr>
+      <w:r>
+        <w:t xml:space="preserve">On one block, 20 000 Monte Carlo trials per cell give the probability of a verdict within 30 legitimate sends: 0.09% [0.06, 0.14] at 80% conversion with 20% autofill, 1.9% at 65% and 19.5% at 50%. Over 24 hours, the default raises 0.5 verdict events a day on 200 busy blocks at 80% conversion and 6.5 at 65%, where they meet 30 of about 28 800 requests (claim C4 held in 18 of 18 cells).</w:t>
+      </w:r>
+    </w:p>
+    <w:p>
+      <w:pPr>
+        <w:pStyle w:val="BodyText"/>
+      </w:pPr>
+      <w:r>
         <w:t xml:space="preserve">A poisoner flooding for 20 min the 20 blocks legitimate users concentrate on (caps lifted, ten seeds) raises 16 verdict events meeting 98 legitimate requests, 33 never completing; against observe-only operation on the same trace, enforcement costs 12.7 [4.6, 22.9] completions, 3.1% of users (6.3% without WhatsApp; 23.9% with a 24-hour denylist). One that stops after ten minutes leaves verdicts meeting 406.5 requests afterwards, an attributable loss of 46.2 [16.9, 79.8]. Grading limits the harm; it caps it neither at the challenge nor at the attack’s duration.</w:t>
       </w:r>
     </w:p>
-    <w:bookmarkEnd w:id="88"/>
-    <w:bookmarkStart w:id="89" w:name="adaptation-economics-and-overhead"/>
+    <w:bookmarkEnd w:id="91"/>
+    <w:bookmarkStart w:id="92" w:name="adaptation-economics-and-overhead"/>
     <w:p>
       <w:pPr>
         <w:pStyle w:val="Heading2"/>
@@ -12775,9 +12848,9 @@
         <w:t xml:space="preserve">). Under an adversarial mixture, 81% of sends overran the floor, and response-time thresholds separated sends from refusals with 88% balanced accuracy on the fitted run and, fitted on a new run, 95 to 99.9% on two others: a separation on that machine, not a deployment accuracy.</w:t>
       </w:r>
     </w:p>
-    <w:bookmarkEnd w:id="89"/>
-    <w:bookmarkEnd w:id="90"/>
-    <w:bookmarkStart w:id="94" w:name="discussion-and-limitations"/>
+    <w:bookmarkEnd w:id="92"/>
+    <w:bookmarkEnd w:id="93"/>
+    <w:bookmarkStart w:id="97" w:name="discussion-and-limitations"/>
     <w:p>
       <w:pPr>
         <w:pStyle w:val="Heading1"/>
@@ -12795,7 +12868,7 @@
         <w:t xml:space="preserve">Discussion and limitations</w:t>
       </w:r>
     </w:p>
-    <w:bookmarkStart w:id="91" w:name="lessons"/>
+    <w:bookmarkStart w:id="94" w:name="lessons"/>
     <w:p>
       <w:pPr>
         <w:pStyle w:val="Heading2"/>
@@ -12821,8 +12894,8 @@
         <w:t xml:space="preserve">In the scripted workloads, carriers that verify with human-like delay, fake receipts, or know the thresholds defeated our outcome tests but not a short-window counter. Within an hour of a verdict, the counter’s allowance, unlike the tests’, grows with the windows an attack spans; over longer campaigns, verdicts expire and the tests leak again. Equation (5) summarizes this for pumpers that solve no challenge and hold no exemption. Its inputs are in an operator’s logs; the cost of an excess send, competition under attack, and exemption abuse come only from the simulation. The counter and tests together, with a quota set from each block’s traffic, is a hypothesis for real traffic, not a recommendation.</w:t>
       </w:r>
     </w:p>
-    <w:bookmarkEnd w:id="91"/>
-    <w:bookmarkStart w:id="92" w:name="against-the-benchmarks"/>
+    <w:bookmarkEnd w:id="94"/>
+    <w:bookmarkStart w:id="95" w:name="against-the-benchmarks"/>
     <w:p>
       <w:pPr>
         <w:pStyle w:val="Heading2"/>
@@ -14418,8 +14491,8 @@
         <w:t xml:space="preserve">The nearest external work is set out in Table 1, and it can be compared only on what each needs and reports, since none ran on the same traffic. Huh et al. (2025) report 89.6% recall at 0.19% false positives for a supervised model on one service’s real logs. The class of attack their model targets, a few requests per identity over many fresh identities, is the farm here, which the behavioral layers do not separate and the caps only ration, at 54% of first-time users refused; what the layers do contain without labels are the attacks with a signature in the request (0 to 11.5% leaked with caps lifted; the farm behind a forged header is the farm) and most of the reused profile. Zaliskyi and Odarchenko (2026) report that fixed-window prefix counts blocked 95% and 63% of two incidents at the price of 58% of a legitimate campaign. The graded counter here is the same family of control, a ten-minute window on a 10 000-number block with a challenge rather than a 24-hour quarantine; it leaked 24 of about 574 requests from each outcome-reading pumper at an attack-free cost of 0.06 points of completion, on simulated traffic with no campaigns in it, and it failed its service claims on blocks the attacker shares. Twilio’s products report claimed false-positive rates and no leakage. What we report that none of the three does is an attack-free benign cost, a cost under attack for the users who share a block with the attacker, a selection fixed before the evaluation runs and tested on held-out seeds and workloads, and an implementation anyone can run; what the three have and we lack is real traffic.</w:t>
       </w:r>
     </w:p>
-    <w:bookmarkEnd w:id="92"/>
-    <w:bookmarkStart w:id="93" w:name="limitations"/>
+    <w:bookmarkEnd w:id="95"/>
+    <w:bookmarkStart w:id="96" w:name="limitations"/>
     <w:p>
       <w:pPr>
         <w:pStyle w:val="Heading2"/>
@@ -14445,9 +14518,9 @@
         <w:t xml:space="preserve">We simulated everything and assumed the calibration. We wrote both protocols for our own generator, the second knowing which counters had won. Some results follow from the generator (a perfect premium list, a datacenter attacker that declines challenges, returning users who always present verified history), and our selection rule used an unweighted sum of four scripted pumpers’ leakage and a mean service target met on tuning seeds, which guarantees no service level elsewhere. Close rankings rest on ten or fewer seeds, and costs that round to zero are not shown equivalent. Per-client quotas within a block, carrier spend ceilings, bounded exemptions, tuned token buckets, and other sequential statistics lie outside the evaluated policies. Vendor adapters are untested live, and the timing result holds only for the observer tested. Destination policies challenge people for what strangers sharing their block did, and deployment under the GDPR or Saudi Arabia’s PDPL needs a lawful basis and a route for refused users.</w:t>
       </w:r>
     </w:p>
-    <w:bookmarkEnd w:id="93"/>
-    <w:bookmarkEnd w:id="94"/>
-    <w:bookmarkStart w:id="95" w:name="conclusions-and-future-work"/>
+    <w:bookmarkEnd w:id="96"/>
+    <w:bookmarkEnd w:id="97"/>
+    <w:bookmarkStart w:id="98" w:name="conclusions-and-future-work"/>
     <w:p>
       <w:pPr>
         <w:pStyle w:val="Heading1"/>
@@ -14497,8 +14570,8 @@
         <w:t xml:space="preserve">Replaying real traffic is the experiment our work most needs: it would test the assumed calibration, the cost of an excess send to users who share a block, and the quota a counter needs per block. The policies left outside the evaluation, per-client quotas within a block, bounded exemptions, tuned token buckets and windowed or time-uniform statistics, could then be compared under the same predeclared protocols.</w:t>
       </w:r>
     </w:p>
-    <w:bookmarkEnd w:id="95"/>
-    <w:bookmarkStart w:id="96" w:name="X071796dd6bc546c91e96cca1cf5ff96599de61f"/>
+    <w:bookmarkEnd w:id="98"/>
+    <w:bookmarkStart w:id="99" w:name="X071796dd6bc546c91e96cca1cf5ff96599de61f"/>
     <w:p>
       <w:pPr>
         <w:pStyle w:val="Heading1"/>
@@ -14515,8 +14588,8 @@
         <w:t xml:space="preserve">The author used Claude (Anthropic) for code, evaluation, drafting and editing; checked numbers against the recorded results and claims against the code; and takes full responsibility for the content.</w:t>
       </w:r>
     </w:p>
-    <w:bookmarkEnd w:id="96"/>
-    <w:bookmarkStart w:id="97" w:name="credit-authorship-contribution-statement"/>
+    <w:bookmarkEnd w:id="99"/>
+    <w:bookmarkStart w:id="100" w:name="credit-authorship-contribution-statement"/>
     <w:p>
       <w:pPr>
         <w:pStyle w:val="Heading1"/>
@@ -14543,8 +14616,8 @@
         <w:t xml:space="preserve">Conceptualization, Methodology, Software, Validation, Investigation, Writing – original draft, Writing – review &amp; editing.</w:t>
       </w:r>
     </w:p>
-    <w:bookmarkEnd w:id="97"/>
-    <w:bookmarkStart w:id="98" w:name="declaration-of-competing-interest"/>
+    <w:bookmarkEnd w:id="100"/>
+    <w:bookmarkStart w:id="101" w:name="declaration-of-competing-interest"/>
     <w:p>
       <w:pPr>
         <w:pStyle w:val="Heading1"/>
@@ -14561,8 +14634,8 @@
         <w:t xml:space="preserve">The author declares no known competing financial interests or personal relationships that could have appeared to influence this work.</w:t>
       </w:r>
     </w:p>
-    <w:bookmarkEnd w:id="98"/>
-    <w:bookmarkStart w:id="100" w:name="data-availability"/>
+    <w:bookmarkEnd w:id="101"/>
+    <w:bookmarkStart w:id="103" w:name="data-availability"/>
     <w:p>
       <w:pPr>
         <w:pStyle w:val="Heading1"/>
@@ -14599,7 +14672,7 @@
       <w:r>
         <w:t xml:space="preserve"> </w:t>
       </w:r>
-      <w:hyperlink r:id="rId99">
+      <w:hyperlink r:id="rId102">
         <w:r>
           <w:rPr>
             <w:rStyle w:val="Hyperlink"/>
@@ -14632,8 +14705,8 @@
         <w:t xml:space="preserve">. These files are the supplementary material.</w:t>
       </w:r>
     </w:p>
-    <w:bookmarkEnd w:id="100"/>
-    <w:bookmarkStart w:id="109" w:name="references"/>
+    <w:bookmarkEnd w:id="103"/>
+    <w:bookmarkStart w:id="112" w:name="references"/>
     <w:p>
       <w:pPr>
         <w:pStyle w:val="Heading1"/>
@@ -14786,7 +14859,7 @@
         </w:rPr>
         <w:t xml:space="preserve"> </w:t>
       </w:r>
-      <w:hyperlink r:id="rId99">
+      <w:hyperlink r:id="rId102">
         <w:r>
           <w:rPr>
             <w:rStyle w:val="Hyperlink"/>
@@ -14983,7 +15056,7 @@
         </w:rPr>
         <w:t xml:space="preserve"> </w:t>
       </w:r>
-      <w:hyperlink r:id="rId101">
+      <w:hyperlink r:id="rId104">
         <w:r>
           <w:rPr>
             <w:rStyle w:val="Hyperlink"/>
@@ -15678,7 +15751,7 @@
         </w:rPr>
         <w:t xml:space="preserve"> </w:t>
       </w:r>
-      <w:hyperlink r:id="rId102">
+      <w:hyperlink r:id="rId105">
         <w:r>
           <w:rPr>
             <w:rStyle w:val="Hyperlink"/>
@@ -16819,7 +16892,7 @@
         </w:rPr>
         <w:t xml:space="preserve"> </w:t>
       </w:r>
-      <w:hyperlink r:id="rId103">
+      <w:hyperlink r:id="rId106">
         <w:r>
           <w:rPr>
             <w:rStyle w:val="Hyperlink"/>
@@ -17432,7 +17505,7 @@
         </w:rPr>
         <w:t xml:space="preserve"> </w:t>
       </w:r>
-      <w:hyperlink r:id="rId104">
+      <w:hyperlink r:id="rId107">
         <w:r>
           <w:rPr>
             <w:rStyle w:val="Hyperlink"/>
@@ -18543,7 +18616,7 @@
         </w:rPr>
         <w:t xml:space="preserve"> </w:t>
       </w:r>
-      <w:hyperlink r:id="rId105">
+      <w:hyperlink r:id="rId108">
         <w:r>
           <w:rPr>
             <w:rStyle w:val="Hyperlink"/>
@@ -18677,7 +18750,7 @@
         </w:rPr>
         <w:t xml:space="preserve"> </w:t>
       </w:r>
-      <w:hyperlink r:id="rId106">
+      <w:hyperlink r:id="rId109">
         <w:r>
           <w:rPr>
             <w:rStyle w:val="Hyperlink"/>
@@ -18797,7 +18870,7 @@
         </w:rPr>
         <w:t xml:space="preserve"> </w:t>
       </w:r>
-      <w:hyperlink r:id="rId107">
+      <w:hyperlink r:id="rId110">
         <w:r>
           <w:rPr>
             <w:rStyle w:val="Hyperlink"/>
@@ -19165,7 +19238,7 @@
         </w:rPr>
         <w:t xml:space="preserve"> </w:t>
       </w:r>
-      <w:hyperlink r:id="rId108">
+      <w:hyperlink r:id="rId111">
         <w:r>
           <w:rPr>
             <w:rStyle w:val="Hyperlink"/>
@@ -19606,7 +19679,7 @@
         <w:t xml:space="preserve">. https://doi.org/10.18372/2310-5461.69.20735.</w:t>
       </w:r>
     </w:p>
-    <w:bookmarkEnd w:id="109"/>
+    <w:bookmarkEnd w:id="112"/>
     <w:sectPr>
       <w:pgSz w:w="11906" w:h="16838"/>
       <w:pgMar w:left="1417" w:right="1417" w:top="1417" w:bottom="1417" w:header="708" w:footer="708" w:gutter="0"/>

</xml_diff>

<commit_message>
Manuscript revision 8: Figures 6 and 7 relabelled in plain words
- paper/figures.py: the matched-comparison figures name every setting by
  its rule, threshold and credit or its quota and window (no T300/c0 codes),
  use one hue per policy family with a marker shape per setting kind, put
  the direct labels on a surface backing, note the settings matched to the
  default's false alarms, and spell out the axes, the tuning target and the
  intervals; Figure 7 is grouped by the pumper's carrier with a zero line
  labelled as the default tests.
- Section 5.6.1 says how the figures name settings and what the matched
  settings are; Table 8 may sit beside its text; Figure 7 at 0.8 of the text
  width so Table 7 stays on the page that introduces it.
- Word version and letter rebuilt (word count 14,300); README figure row.

Co-Authored-By: Claude Fable 5.1 <noreply@anthropic.com>
Claude-Session: https://claude.ai/code/session_01RjWdFzUgYk6Hwie2YbnvyG
</commit_message>
<xml_diff>
--- a/paper/main.docx
+++ b/paper/main.docx
@@ -8165,7 +8165,7 @@
       <w:r>
         <w:drawing>
           <wp:inline>
-            <wp:extent cx="5334000" cy="3597348"/>
+            <wp:extent cx="5334000" cy="3411279"/>
             <wp:effectExtent b="0" l="0" r="0" t="0"/>
             <wp:docPr descr="" title="" id="73" name="Picture"/>
             <a:graphic>
@@ -8186,7 +8186,7 @@
                   <pic:spPr bwMode="auto">
                     <a:xfrm>
                       <a:off x="0" y="0"/>
-                      <a:ext cx="5334000" cy="3597348"/>
+                      <a:ext cx="5334000" cy="3411279"/>
                     </a:xfrm>
                     <a:prstGeom prst="rect">
                       <a:avLst/>
@@ -8230,7 +8230,7 @@
       <w:r>
         <w:drawing>
           <wp:inline>
-            <wp:extent cx="5334000" cy="4341627"/>
+            <wp:extent cx="5334000" cy="3793066"/>
             <wp:effectExtent b="0" l="0" r="0" t="0"/>
             <wp:docPr descr="" title="" id="76" name="Picture"/>
             <a:graphic>
@@ -8251,7 +8251,7 @@
                   <pic:spPr bwMode="auto">
                     <a:xfrm>
                       <a:off x="0" y="0"/>
-                      <a:ext cx="5334000" cy="4341627"/>
+                      <a:ext cx="5334000" cy="3793066"/>
                     </a:xfrm>
                     <a:prstGeom prst="rect">
                       <a:avLst/>
@@ -9485,7 +9485,33 @@
         <w:pStyle w:val="FirstParagraph"/>
       </w:pPr>
       <w:r>
-        <w:t xml:space="preserve">Table 5 reports the first protocol at 200 blocks (144 legitimate sends per block a day; tuning seeds 100–102, evaluation seeds 0–9): 20-minute leakage against the never-verifying (NV), instant (IV), human-like (HL) and challenge-buying (CB) carriers and, from 24-hour attack-free runs at 65% conversion, completion, benign cost (points), users challenged and verdict events a day; the tuning target is 63.95%. Figure 6 plots each setting’s completion against its leakage summed over the four pumpers’ runs of a seed (not one combined attack), with the tuning target dotted; its unlabeled points are sequential settings matched to the default’s false alarms at other credits (key:</w:t>
+        <w:t xml:space="preserve">Table 5 reports the first protocol at 200 blocks (144 legitimate sends per block a day; tuning seeds 100–102, evaluation seeds 0–9): 20-minute leakage against the never-verifying (NV), instant (IV), human-like (HL) and challenge-buying (CB) carriers and, from 24-hour attack-free runs at 65% conversion, completion, benign cost (points), users challenged and verdict events a day; the tuning target is 63.95%. Figure 6 plots each setting’s completion against its leakage summed over the four pumpers’ runs of a seed (not one combined attack), with the tuning target dotted. The figures name each setting by its rule, threshold and credit, so</w:t>
+      </w:r>
+      <w:r>
+        <w:t xml:space="preserve"> </w:t>
+      </w:r>
+      <w:r>
+        <w:rPr>
+          <w:iCs/>
+          <w:i/>
+        </w:rPr>
+        <w:t xml:space="preserve">T</w:t>
+      </w:r>
+      <w:r>
+        <w:t xml:space="preserve">300,</w:t>
+      </w:r>
+      <w:r>
+        <w:t xml:space="preserve"> </w:t>
+      </w:r>
+      <w:r>
+        <w:rPr>
+          <w:iCs/>
+          <w:i/>
+        </w:rPr>
+        <w:t xml:space="preserve">c</w:t>
+      </w:r>
+      <w:r>
+        <w:t xml:space="preserve">0 of Table 5 is the test with threshold 300 and no credit; the three points beside the default, one under its star, are sequential settings matched to the default’s false alarms at other credits (key:</w:t>
       </w:r>
       <w:r>
         <w:t xml:space="preserve"> </w:t>
@@ -9497,7 +9523,7 @@
         <w:t xml:space="preserve">results/ figure1_key.md</w:t>
       </w:r>
       <w:r>
-        <w:t xml:space="preserve">). Figure 7 gives each selected setting’s leakage minus the default’s, paired per seed (negative: leaks less). The sequential setting selected at the tuning target holds the human-like carrier to 126 messages only by raising 334 false verdict events a day, and misses the target by 0.18 points on seeds 0–9. The graded counter of four sends per block per ten minutes leaks 24 against each outcome-reading carrier and 48 against the challenge buyer, at 0.06 points; counters selected at the sparser settings leak 6 to 18 at 0.15 to 0.35 points (up to 0.43 at 80%). With the full grid and density-specific attacks (E5) the rule selects the same counters, and so do other objectives on the tuning runs (worst-case leakage, a first-time-loss constraint, each attacker alone, 2 000 random mixes), except the instant verifier alone and 3 mixes at 200 blocks; on fresh seeds the counter leaked least of the winners against every attacker but the instant verifier (25, against 15 and 16). On seeds 300–309 the 1 000-block counter falls 0.12 points below its target, yet no seed-and-conversion cell fails the paired check (the evaluation default minus 0.5 points).</w:t>
+        <w:t xml:space="preserve">). Figure 7 gives, carrier by carrier, each selected setting’s leakage minus the default’s, paired per seed (left of zero: leaks less than the default). The sequential setting selected at the tuning target holds the human-like carrier to 126 messages only by raising 334 false verdict events a day, and misses the target by 0.18 points on seeds 0–9. The graded counter of four sends per block per ten minutes leaks 24 against each outcome-reading carrier and 48 against the challenge buyer, at 0.06 points; counters selected at the sparser settings leak 6 to 18 at 0.15 to 0.35 points (up to 0.43 at 80%). With the full grid and density-specific attacks (E5) the rule selects the same counters, and so do other objectives on the tuning runs (worst-case leakage, a first-time-loss constraint, each attacker alone, 2 000 random mixes), except the instant verifier alone and 3 mixes at 200 blocks; on fresh seeds the counter leaked least of the winners against every attacker but the instant verifier (25, against 15 and 16). On seeds 300–309 the 1 000-block counter falls 0.12 points below its target, yet no seed-and-conversion cell fails the paired check (the evaluation default minus 0.5 points).</w:t>
       </w:r>
     </w:p>
     <w:p>

</xml_diff>

<commit_message>
Drop Tables 4, 8 and 9; carry their numbers in the text
The pumping-against-the-tests table, the poisoner table and the every-design table are removed;
the sentences that cited them now state the leakage, containment and harm figures they held, and
the design comparison is supplementary Table S1. Remaining tables renumbered 1-6 in the study
map, the matched-comparison key and the docs; the table script still writes the dropped rows as
supplementary material. Word version rebuilt.

Co-Authored-By: Claude Fable 5.1 <noreply@anthropic.com>
Claude-Session: https://claude.ai/code/session_01RjWdFzUgYk6Hwie2YbnvyG
</commit_message>
<xml_diff>
--- a/paper/main.docx
+++ b/paper/main.docx
@@ -7538,6 +7538,32 @@
     </w:p>
     <w:p>
       <w:pPr>
+        <w:pStyle w:val="FirstParagraph"/>
+      </w:pPr>
+      <w:r>
+        <w:t xml:space="preserve">We ran concentrated pumpers on three blocks with caps lifted over ten seeds, about 574 requests in 20 minutes, and recorded the messages leaked, the runs in which the tests contained the attack, the minutes to containment and to the first verdict, and the codes the carrier entered. A carrier that never verifies leaked 570 [419, 736] messages under v1, which contains nothing, and 90 [71, 114] under the v2 default, which contained all ten runs at minute 3.5 [3.1, 3.9] after a first verdict at minute 3.0; a carrier that buys every challenge solution leaked 106 [87, 127] and was contained in all ten runs at minute 4.3. The speed test catches a carrier verifying within a second at 19 [17, 21] messages, contained at minute 1.4 after 19 codes entered, while the carrier verifying 60% of its codes with human-like delay was contained in none of the ten 20-minute runs: it entered 272 codes, its first verdict came at minute 11.6 on average and 452 [365, 539] messages leaked; in an hour, 1 067 [839, 1 310] leaked and two of ten runs were contained, at minute 47.0 on average. Claim C3 (containment with at most 30% leaked) held in 36 of 36 cells.</w:t>
+      </w:r>
+    </w:p>
+    <w:p>
+      <w:pPr>
+        <w:pStyle w:val="BodyText"/>
+      </w:pPr>
+      <w:r>
+        <w:t xml:space="preserve">Across 18 spread configurations, leakage follows the blocks touched: with 30 blocks, five to seven runs in ten are still contained. Unsaturated, Equation (2) errs by 1.6 to 7.9 messages per run (1%–13%, ten configurations); saturated, it overstates by up to 91.</w:t>
+      </w:r>
+    </w:p>
+    <w:bookmarkEnd w:id="74"/>
+    <w:bookmarkStart w:id="87" w:name="f.-counting-against-testing"/>
+    <w:p>
+      <w:pPr>
+        <w:pStyle w:val="Heading2"/>
+      </w:pPr>
+      <w:r>
+        <w:t xml:space="preserve">F. COUNTING AGAINST TESTING</w:t>
+      </w:r>
+    </w:p>
+    <w:p>
+      <w:pPr>
         <w:pStyle w:val="TableCaption"/>
       </w:pPr>
       <w:r>
@@ -7546,999 +7572,6 @@
           <w:b/>
         </w:rPr>
         <w:t xml:space="preserve">TABLE 4.</w:t>
-      </w:r>
-      <w:r>
-        <w:t xml:space="preserve"> </w:t>
-      </w:r>
-      <w:r>
-        <w:t xml:space="preserve">Concentrated pumping: how much leaks before the tests contain it.</w:t>
-      </w:r>
-    </w:p>
-    <w:tbl>
-      <w:tblPr>
-        <w:tblStyle w:val="Table"/>
-        <w:tblW w:w="9068" w:type="dxa"/>
-        <w:jc w:val="center"/>
-        <w:tblLayout w:type="fixed"/>
-        <w:tblCellMar>
-          <w:left w:w="57" w:type="dxa"/>
-          <w:right w:w="57" w:type="dxa"/>
-        </w:tblCellMar>
-        <w:tblLook w:firstRow="0" w:lastRow="0" w:firstColumn="0" w:lastColumn="0" w:noHBand="0" w:noVBand="0" w:val="0000"/>
-        <w:tblCaption w:val="TABLE 4. Concentrated pumping: how much leaks before the tests contain it."/>
-      </w:tblPr>
-      <w:tblGrid>
-        <w:gridCol w:w="2918"/>
-        <w:gridCol w:w="1735"/>
-        <w:gridCol w:w="867"/>
-        <w:gridCol w:w="1656"/>
-        <w:gridCol w:w="1183"/>
-        <w:gridCol w:w="709"/>
-      </w:tblGrid>
-      <w:tr>
-        <w:tc>
-          <w:tcPr>
-            <w:tcW w:w="2918" w:type="dxa"/>
-            <w:tcBorders>
-              <w:top w:val="single" w:sz="8" w:color="000000"/>
-            </w:tcBorders>
-          </w:tcPr>
-          <w:p>
-            <w:pPr>
-              <w:pStyle w:val="Compact"/>
-              <w:spacing w:line="240" w:lineRule="auto" w:after="0"/>
-              <w:jc w:val="left"/>
-            </w:pPr>
-            <w:r>
-              <w:rPr>
-                <w:sz w:val="17"/>
-              </w:rPr>
-              <w:t xml:space="preserve">Carrier, design</w:t>
-            </w:r>
-          </w:p>
-        </w:tc>
-        <w:tc>
-          <w:tcPr>
-            <w:tcW w:w="1735" w:type="dxa"/>
-            <w:tcBorders>
-              <w:top w:val="single" w:sz="8" w:color="000000"/>
-            </w:tcBorders>
-          </w:tcPr>
-          <w:p>
-            <w:pPr>
-              <w:pStyle w:val="Compact"/>
-              <w:spacing w:line="240" w:lineRule="auto" w:after="0"/>
-              <w:jc w:val="left"/>
-            </w:pPr>
-            <w:r>
-              <w:rPr>
-                <w:sz w:val="17"/>
-              </w:rPr>
-              <w:t xml:space="preserve">Leaked</w:t>
-            </w:r>
-          </w:p>
-        </w:tc>
-        <w:tc>
-          <w:tcPr>
-            <w:tcW w:w="867" w:type="dxa"/>
-            <w:tcBorders>
-              <w:top w:val="single" w:sz="8" w:color="000000"/>
-            </w:tcBorders>
-          </w:tcPr>
-          <w:p>
-            <w:pPr>
-              <w:pStyle w:val="Compact"/>
-              <w:spacing w:line="240" w:lineRule="auto" w:after="0"/>
-              <w:jc w:val="left"/>
-            </w:pPr>
-            <w:r>
-              <w:rPr>
-                <w:sz w:val="17"/>
-              </w:rPr>
-              <w:t xml:space="preserve">Contained</w:t>
-            </w:r>
-          </w:p>
-        </w:tc>
-        <w:tc>
-          <w:tcPr>
-            <w:tcW w:w="1656" w:type="dxa"/>
-            <w:tcBorders>
-              <w:top w:val="single" w:sz="8" w:color="000000"/>
-            </w:tcBorders>
-          </w:tcPr>
-          <w:p>
-            <w:pPr>
-              <w:pStyle w:val="Compact"/>
-              <w:spacing w:line="240" w:lineRule="auto" w:after="0"/>
-              <w:jc w:val="left"/>
-            </w:pPr>
-            <w:r>
-              <w:rPr>
-                <w:sz w:val="17"/>
-              </w:rPr>
-              <w:t xml:space="preserve">Containment</w:t>
-            </w:r>
-          </w:p>
-        </w:tc>
-        <w:tc>
-          <w:tcPr>
-            <w:tcW w:w="1183" w:type="dxa"/>
-            <w:tcBorders>
-              <w:top w:val="single" w:sz="8" w:color="000000"/>
-            </w:tcBorders>
-          </w:tcPr>
-          <w:p>
-            <w:pPr>
-              <w:pStyle w:val="Compact"/>
-              <w:spacing w:line="240" w:lineRule="auto" w:after="0"/>
-              <w:jc w:val="left"/>
-            </w:pPr>
-            <w:r>
-              <w:rPr>
-                <w:sz w:val="17"/>
-              </w:rPr>
-              <w:t xml:space="preserve">First verdict</w:t>
-            </w:r>
-          </w:p>
-        </w:tc>
-        <w:tc>
-          <w:tcPr>
-            <w:tcW w:w="709" w:type="dxa"/>
-            <w:tcBorders>
-              <w:top w:val="single" w:sz="8" w:color="000000"/>
-            </w:tcBorders>
-          </w:tcPr>
-          <w:p>
-            <w:pPr>
-              <w:pStyle w:val="Compact"/>
-              <w:spacing w:line="240" w:lineRule="auto" w:after="0"/>
-              <w:jc w:val="right"/>
-            </w:pPr>
-            <w:r>
-              <w:rPr>
-                <w:sz w:val="17"/>
-              </w:rPr>
-              <w:t xml:space="preserve">Codes</w:t>
-            </w:r>
-          </w:p>
-        </w:tc>
-      </w:tr>
-      <w:tr>
-        <w:tc>
-          <w:tcPr>
-            <w:tcW w:w="2918" w:type="dxa"/>
-            <w:tcBorders>
-              <w:bottom w:val="single" w:sz="4" w:color="000000"/>
-            </w:tcBorders>
-          </w:tcPr>
-          <w:p>
-            <w:pPr>
-              <w:pStyle w:val="Compact"/>
-              <w:spacing w:line="240" w:lineRule="auto" w:after="0"/>
-            </w:pPr>
-          </w:p>
-        </w:tc>
-        <w:tc>
-          <w:tcPr>
-            <w:tcW w:w="1735" w:type="dxa"/>
-            <w:tcBorders>
-              <w:bottom w:val="single" w:sz="4" w:color="000000"/>
-            </w:tcBorders>
-          </w:tcPr>
-          <w:p>
-            <w:pPr>
-              <w:pStyle w:val="Compact"/>
-              <w:spacing w:line="240" w:lineRule="auto" w:after="0"/>
-              <w:jc w:val="left"/>
-            </w:pPr>
-            <w:r>
-              <w:rPr>
-                <w:sz w:val="17"/>
-              </w:rPr>
-              <w:t xml:space="preserve">(msgs)</w:t>
-            </w:r>
-          </w:p>
-        </w:tc>
-        <w:tc>
-          <w:tcPr>
-            <w:tcW w:w="867" w:type="dxa"/>
-            <w:tcBorders>
-              <w:bottom w:val="single" w:sz="4" w:color="000000"/>
-            </w:tcBorders>
-          </w:tcPr>
-          <w:p>
-            <w:pPr>
-              <w:pStyle w:val="Compact"/>
-              <w:spacing w:line="240" w:lineRule="auto" w:after="0"/>
-              <w:jc w:val="left"/>
-            </w:pPr>
-            <w:r>
-              <w:rPr>
-                <w:sz w:val="17"/>
-              </w:rPr>
-              <w:t xml:space="preserve">(seeds)</w:t>
-            </w:r>
-          </w:p>
-        </w:tc>
-        <w:tc>
-          <w:tcPr>
-            <w:tcW w:w="1656" w:type="dxa"/>
-            <w:tcBorders>
-              <w:bottom w:val="single" w:sz="4" w:color="000000"/>
-            </w:tcBorders>
-          </w:tcPr>
-          <w:p>
-            <w:pPr>
-              <w:pStyle w:val="Compact"/>
-              <w:spacing w:line="240" w:lineRule="auto" w:after="0"/>
-              <w:jc w:val="left"/>
-            </w:pPr>
-            <w:r>
-              <w:rPr>
-                <w:sz w:val="17"/>
-              </w:rPr>
-              <w:t xml:space="preserve">(min)</w:t>
-            </w:r>
-          </w:p>
-        </w:tc>
-        <w:tc>
-          <w:tcPr>
-            <w:tcW w:w="1183" w:type="dxa"/>
-            <w:tcBorders>
-              <w:bottom w:val="single" w:sz="4" w:color="000000"/>
-            </w:tcBorders>
-          </w:tcPr>
-          <w:p>
-            <w:pPr>
-              <w:pStyle w:val="Compact"/>
-              <w:spacing w:line="240" w:lineRule="auto" w:after="0"/>
-              <w:jc w:val="left"/>
-            </w:pPr>
-            <w:r>
-              <w:rPr>
-                <w:sz w:val="17"/>
-              </w:rPr>
-              <w:t xml:space="preserve">(min)</w:t>
-            </w:r>
-          </w:p>
-        </w:tc>
-        <w:tc>
-          <w:tcPr>
-            <w:tcW w:w="709" w:type="dxa"/>
-            <w:tcBorders>
-              <w:bottom w:val="single" w:sz="4" w:color="000000"/>
-            </w:tcBorders>
-          </w:tcPr>
-          <w:p>
-            <w:pPr>
-              <w:pStyle w:val="Compact"/>
-              <w:spacing w:line="240" w:lineRule="auto" w:after="0"/>
-              <w:jc w:val="right"/>
-            </w:pPr>
-            <w:r>
-              <w:rPr>
-                <w:sz w:val="17"/>
-              </w:rPr>
-              <w:t xml:space="preserve">entered</w:t>
-            </w:r>
-          </w:p>
-        </w:tc>
-      </w:tr>
-      <w:tr>
-        <w:tc>
-          <w:tcPr>
-            <w:tcW w:w="2918" w:type="dxa"/>
-          </w:tcPr>
-          <w:p>
-            <w:pPr>
-              <w:pStyle w:val="Compact"/>
-              <w:spacing w:line="240" w:lineRule="auto" w:after="0"/>
-              <w:jc w:val="left"/>
-            </w:pPr>
-            <w:r>
-              <w:rPr>
-                <w:sz w:val="17"/>
-              </w:rPr>
-              <w:t xml:space="preserve">never verifies: v1</w:t>
-            </w:r>
-          </w:p>
-        </w:tc>
-        <w:tc>
-          <w:tcPr>
-            <w:tcW w:w="1735" w:type="dxa"/>
-          </w:tcPr>
-          <w:p>
-            <w:pPr>
-              <w:pStyle w:val="Compact"/>
-              <w:spacing w:line="240" w:lineRule="auto" w:after="0"/>
-              <w:jc w:val="left"/>
-            </w:pPr>
-            <w:r>
-              <w:rPr>
-                <w:sz w:val="17"/>
-              </w:rPr>
-              <w:t xml:space="preserve">570 [419, 736]</w:t>
-            </w:r>
-          </w:p>
-        </w:tc>
-        <w:tc>
-          <w:tcPr>
-            <w:tcW w:w="867" w:type="dxa"/>
-          </w:tcPr>
-          <w:p>
-            <w:pPr>
-              <w:pStyle w:val="Compact"/>
-              <w:spacing w:line="240" w:lineRule="auto" w:after="0"/>
-              <w:jc w:val="left"/>
-            </w:pPr>
-            <w:r>
-              <w:rPr>
-                <w:sz w:val="17"/>
-              </w:rPr>
-              <w:t xml:space="preserve">0/10</w:t>
-            </w:r>
-          </w:p>
-        </w:tc>
-        <w:tc>
-          <w:tcPr>
-            <w:tcW w:w="1656" w:type="dxa"/>
-          </w:tcPr>
-          <w:p>
-            <w:pPr>
-              <w:pStyle w:val="Compact"/>
-              <w:spacing w:line="240" w:lineRule="auto" w:after="0"/>
-              <w:jc w:val="left"/>
-            </w:pPr>
-            <w:r>
-              <w:rPr>
-                <w:sz w:val="17"/>
-              </w:rPr>
-              <w:t xml:space="preserve">–</w:t>
-            </w:r>
-          </w:p>
-        </w:tc>
-        <w:tc>
-          <w:tcPr>
-            <w:tcW w:w="1183" w:type="dxa"/>
-          </w:tcPr>
-          <w:p>
-            <w:pPr>
-              <w:pStyle w:val="Compact"/>
-              <w:spacing w:line="240" w:lineRule="auto" w:after="0"/>
-              <w:jc w:val="left"/>
-            </w:pPr>
-            <w:r>
-              <w:rPr>
-                <w:sz w:val="17"/>
-              </w:rPr>
-              <w:t xml:space="preserve">–</w:t>
-            </w:r>
-          </w:p>
-        </w:tc>
-        <w:tc>
-          <w:tcPr>
-            <w:tcW w:w="709" w:type="dxa"/>
-          </w:tcPr>
-          <w:p>
-            <w:pPr>
-              <w:pStyle w:val="Compact"/>
-              <w:spacing w:line="240" w:lineRule="auto" w:after="0"/>
-              <w:jc w:val="right"/>
-            </w:pPr>
-            <w:r>
-              <w:rPr>
-                <w:sz w:val="17"/>
-              </w:rPr>
-              <w:t xml:space="preserve">0</w:t>
-            </w:r>
-          </w:p>
-        </w:tc>
-      </w:tr>
-      <w:tr>
-        <w:tc>
-          <w:tcPr>
-            <w:tcW w:w="2918" w:type="dxa"/>
-          </w:tcPr>
-          <w:p>
-            <w:pPr>
-              <w:pStyle w:val="Compact"/>
-              <w:spacing w:line="240" w:lineRule="auto" w:after="0"/>
-              <w:jc w:val="left"/>
-            </w:pPr>
-            <w:r>
-              <w:rPr>
-                <w:sz w:val="17"/>
-              </w:rPr>
-              <w:t xml:space="preserve">v2 default</w:t>
-            </w:r>
-          </w:p>
-        </w:tc>
-        <w:tc>
-          <w:tcPr>
-            <w:tcW w:w="1735" w:type="dxa"/>
-          </w:tcPr>
-          <w:p>
-            <w:pPr>
-              <w:pStyle w:val="Compact"/>
-              <w:spacing w:line="240" w:lineRule="auto" w:after="0"/>
-              <w:jc w:val="left"/>
-            </w:pPr>
-            <w:r>
-              <w:rPr>
-                <w:sz w:val="17"/>
-              </w:rPr>
-              <w:t xml:space="preserve">90 [71, 114]</w:t>
-            </w:r>
-          </w:p>
-        </w:tc>
-        <w:tc>
-          <w:tcPr>
-            <w:tcW w:w="867" w:type="dxa"/>
-          </w:tcPr>
-          <w:p>
-            <w:pPr>
-              <w:pStyle w:val="Compact"/>
-              <w:spacing w:line="240" w:lineRule="auto" w:after="0"/>
-              <w:jc w:val="left"/>
-            </w:pPr>
-            <w:r>
-              <w:rPr>
-                <w:sz w:val="17"/>
-              </w:rPr>
-              <w:t xml:space="preserve">10/10</w:t>
-            </w:r>
-          </w:p>
-        </w:tc>
-        <w:tc>
-          <w:tcPr>
-            <w:tcW w:w="1656" w:type="dxa"/>
-          </w:tcPr>
-          <w:p>
-            <w:pPr>
-              <w:pStyle w:val="Compact"/>
-              <w:spacing w:line="240" w:lineRule="auto" w:after="0"/>
-              <w:jc w:val="left"/>
-            </w:pPr>
-            <w:r>
-              <w:rPr>
-                <w:sz w:val="17"/>
-              </w:rPr>
-              <w:t xml:space="preserve">3.5 [3.1, 3.9]</w:t>
-            </w:r>
-          </w:p>
-        </w:tc>
-        <w:tc>
-          <w:tcPr>
-            <w:tcW w:w="1183" w:type="dxa"/>
-          </w:tcPr>
-          <w:p>
-            <w:pPr>
-              <w:pStyle w:val="Compact"/>
-              <w:spacing w:line="240" w:lineRule="auto" w:after="0"/>
-              <w:jc w:val="left"/>
-            </w:pPr>
-            <w:r>
-              <w:rPr>
-                <w:sz w:val="17"/>
-              </w:rPr>
-              <w:t xml:space="preserve">3.0</w:t>
-            </w:r>
-          </w:p>
-        </w:tc>
-        <w:tc>
-          <w:tcPr>
-            <w:tcW w:w="709" w:type="dxa"/>
-          </w:tcPr>
-          <w:p>
-            <w:pPr>
-              <w:pStyle w:val="Compact"/>
-              <w:spacing w:line="240" w:lineRule="auto" w:after="0"/>
-              <w:jc w:val="right"/>
-            </w:pPr>
-            <w:r>
-              <w:rPr>
-                <w:sz w:val="17"/>
-              </w:rPr>
-              <w:t xml:space="preserve">0</w:t>
-            </w:r>
-          </w:p>
-        </w:tc>
-      </w:tr>
-      <w:tr>
-        <w:tc>
-          <w:tcPr>
-            <w:tcW w:w="2918" w:type="dxa"/>
-          </w:tcPr>
-          <w:p>
-            <w:pPr>
-              <w:pStyle w:val="Compact"/>
-              <w:spacing w:line="240" w:lineRule="auto" w:after="0"/>
-              <w:jc w:val="left"/>
-            </w:pPr>
-            <w:r>
-              <w:rPr>
-                <w:sz w:val="17"/>
-              </w:rPr>
-              <w:t xml:space="preserve">verifies within 1 s: v2 default</w:t>
-            </w:r>
-          </w:p>
-        </w:tc>
-        <w:tc>
-          <w:tcPr>
-            <w:tcW w:w="1735" w:type="dxa"/>
-          </w:tcPr>
-          <w:p>
-            <w:pPr>
-              <w:pStyle w:val="Compact"/>
-              <w:spacing w:line="240" w:lineRule="auto" w:after="0"/>
-              <w:jc w:val="left"/>
-            </w:pPr>
-            <w:r>
-              <w:rPr>
-                <w:sz w:val="17"/>
-              </w:rPr>
-              <w:t xml:space="preserve">19 [17, 21]</w:t>
-            </w:r>
-          </w:p>
-        </w:tc>
-        <w:tc>
-          <w:tcPr>
-            <w:tcW w:w="867" w:type="dxa"/>
-          </w:tcPr>
-          <w:p>
-            <w:pPr>
-              <w:pStyle w:val="Compact"/>
-              <w:spacing w:line="240" w:lineRule="auto" w:after="0"/>
-              <w:jc w:val="left"/>
-            </w:pPr>
-            <w:r>
-              <w:rPr>
-                <w:sz w:val="17"/>
-              </w:rPr>
-              <w:t xml:space="preserve">10/10</w:t>
-            </w:r>
-          </w:p>
-        </w:tc>
-        <w:tc>
-          <w:tcPr>
-            <w:tcW w:w="1656" w:type="dxa"/>
-          </w:tcPr>
-          <w:p>
-            <w:pPr>
-              <w:pStyle w:val="Compact"/>
-              <w:spacing w:line="240" w:lineRule="auto" w:after="0"/>
-              <w:jc w:val="left"/>
-            </w:pPr>
-            <w:r>
-              <w:rPr>
-                <w:sz w:val="17"/>
-              </w:rPr>
-              <w:t xml:space="preserve">1.4 [1.1, 1.7]</w:t>
-            </w:r>
-          </w:p>
-        </w:tc>
-        <w:tc>
-          <w:tcPr>
-            <w:tcW w:w="1183" w:type="dxa"/>
-          </w:tcPr>
-          <w:p>
-            <w:pPr>
-              <w:pStyle w:val="Compact"/>
-              <w:spacing w:line="240" w:lineRule="auto" w:after="0"/>
-              <w:jc w:val="left"/>
-            </w:pPr>
-            <w:r>
-              <w:rPr>
-                <w:sz w:val="17"/>
-              </w:rPr>
-              <w:t xml:space="preserve">0.4</w:t>
-            </w:r>
-          </w:p>
-        </w:tc>
-        <w:tc>
-          <w:tcPr>
-            <w:tcW w:w="709" w:type="dxa"/>
-          </w:tcPr>
-          <w:p>
-            <w:pPr>
-              <w:pStyle w:val="Compact"/>
-              <w:spacing w:line="240" w:lineRule="auto" w:after="0"/>
-              <w:jc w:val="right"/>
-            </w:pPr>
-            <w:r>
-              <w:rPr>
-                <w:sz w:val="17"/>
-              </w:rPr>
-              <w:t xml:space="preserve">19</w:t>
-            </w:r>
-          </w:p>
-        </w:tc>
-      </w:tr>
-      <w:tr>
-        <w:tc>
-          <w:tcPr>
-            <w:tcW w:w="2918" w:type="dxa"/>
-          </w:tcPr>
-          <w:p>
-            <w:pPr>
-              <w:pStyle w:val="Compact"/>
-              <w:spacing w:line="240" w:lineRule="auto" w:after="0"/>
-              <w:jc w:val="left"/>
-            </w:pPr>
-            <w:r>
-              <w:rPr>
-                <w:sz w:val="17"/>
-              </w:rPr>
-              <w:t xml:space="preserve">verifies 60% after 30 s: v2 default</w:t>
-            </w:r>
-          </w:p>
-        </w:tc>
-        <w:tc>
-          <w:tcPr>
-            <w:tcW w:w="1735" w:type="dxa"/>
-          </w:tcPr>
-          <w:p>
-            <w:pPr>
-              <w:pStyle w:val="Compact"/>
-              <w:spacing w:line="240" w:lineRule="auto" w:after="0"/>
-              <w:jc w:val="left"/>
-            </w:pPr>
-            <w:r>
-              <w:rPr>
-                <w:sz w:val="17"/>
-              </w:rPr>
-              <w:t xml:space="preserve">452 [365, 539]</w:t>
-            </w:r>
-          </w:p>
-        </w:tc>
-        <w:tc>
-          <w:tcPr>
-            <w:tcW w:w="867" w:type="dxa"/>
-          </w:tcPr>
-          <w:p>
-            <w:pPr>
-              <w:pStyle w:val="Compact"/>
-              <w:spacing w:line="240" w:lineRule="auto" w:after="0"/>
-              <w:jc w:val="left"/>
-            </w:pPr>
-            <w:r>
-              <w:rPr>
-                <w:sz w:val="17"/>
-              </w:rPr>
-              <w:t xml:space="preserve">0/10</w:t>
-            </w:r>
-          </w:p>
-        </w:tc>
-        <w:tc>
-          <w:tcPr>
-            <w:tcW w:w="1656" w:type="dxa"/>
-          </w:tcPr>
-          <w:p>
-            <w:pPr>
-              <w:pStyle w:val="Compact"/>
-              <w:spacing w:line="240" w:lineRule="auto" w:after="0"/>
-              <w:jc w:val="left"/>
-            </w:pPr>
-            <w:r>
-              <w:rPr>
-                <w:sz w:val="17"/>
-              </w:rPr>
-              <w:t xml:space="preserve">–</w:t>
-            </w:r>
-          </w:p>
-        </w:tc>
-        <w:tc>
-          <w:tcPr>
-            <w:tcW w:w="1183" w:type="dxa"/>
-          </w:tcPr>
-          <w:p>
-            <w:pPr>
-              <w:pStyle w:val="Compact"/>
-              <w:spacing w:line="240" w:lineRule="auto" w:after="0"/>
-              <w:jc w:val="left"/>
-            </w:pPr>
-            <w:r>
-              <w:rPr>
-                <w:sz w:val="17"/>
-              </w:rPr>
-              <w:t xml:space="preserve">11.6</w:t>
-            </w:r>
-          </w:p>
-        </w:tc>
-        <w:tc>
-          <w:tcPr>
-            <w:tcW w:w="709" w:type="dxa"/>
-          </w:tcPr>
-          <w:p>
-            <w:pPr>
-              <w:pStyle w:val="Compact"/>
-              <w:spacing w:line="240" w:lineRule="auto" w:after="0"/>
-              <w:jc w:val="right"/>
-            </w:pPr>
-            <w:r>
-              <w:rPr>
-                <w:sz w:val="17"/>
-              </w:rPr>
-              <w:t xml:space="preserve">272</w:t>
-            </w:r>
-          </w:p>
-        </w:tc>
-      </w:tr>
-      <w:tr>
-        <w:tc>
-          <w:tcPr>
-            <w:tcW w:w="2918" w:type="dxa"/>
-          </w:tcPr>
-          <w:p>
-            <w:pPr>
-              <w:pStyle w:val="Compact"/>
-              <w:spacing w:line="240" w:lineRule="auto" w:after="0"/>
-              <w:jc w:val="left"/>
-            </w:pPr>
-            <w:r>
-              <w:rPr>
-                <w:sz w:val="17"/>
-              </w:rPr>
-              <w:t xml:space="preserve">v2 default, 60 min</w:t>
-            </w:r>
-          </w:p>
-        </w:tc>
-        <w:tc>
-          <w:tcPr>
-            <w:tcW w:w="1735" w:type="dxa"/>
-          </w:tcPr>
-          <w:p>
-            <w:pPr>
-              <w:pStyle w:val="Compact"/>
-              <w:spacing w:line="240" w:lineRule="auto" w:after="0"/>
-              <w:jc w:val="left"/>
-            </w:pPr>
-            <w:r>
-              <w:rPr>
-                <w:sz w:val="17"/>
-              </w:rPr>
-              <w:t xml:space="preserve">1 067 [839, 1 310]</w:t>
-            </w:r>
-          </w:p>
-        </w:tc>
-        <w:tc>
-          <w:tcPr>
-            <w:tcW w:w="867" w:type="dxa"/>
-          </w:tcPr>
-          <w:p>
-            <w:pPr>
-              <w:pStyle w:val="Compact"/>
-              <w:spacing w:line="240" w:lineRule="auto" w:after="0"/>
-              <w:jc w:val="left"/>
-            </w:pPr>
-            <w:r>
-              <w:rPr>
-                <w:sz w:val="17"/>
-              </w:rPr>
-              <w:t xml:space="preserve">2/10</w:t>
-            </w:r>
-          </w:p>
-        </w:tc>
-        <w:tc>
-          <w:tcPr>
-            <w:tcW w:w="1656" w:type="dxa"/>
-          </w:tcPr>
-          <w:p>
-            <w:pPr>
-              <w:pStyle w:val="Compact"/>
-              <w:spacing w:line="240" w:lineRule="auto" w:after="0"/>
-              <w:jc w:val="left"/>
-            </w:pPr>
-            <w:r>
-              <w:rPr>
-                <w:sz w:val="17"/>
-              </w:rPr>
-              <w:t xml:space="preserve">47.0 [42.0, 52.0]</w:t>
-            </w:r>
-          </w:p>
-        </w:tc>
-        <w:tc>
-          <w:tcPr>
-            <w:tcW w:w="1183" w:type="dxa"/>
-          </w:tcPr>
-          <w:p>
-            <w:pPr>
-              <w:pStyle w:val="Compact"/>
-              <w:spacing w:line="240" w:lineRule="auto" w:after="0"/>
-              <w:jc w:val="left"/>
-            </w:pPr>
-            <w:r>
-              <w:rPr>
-                <w:sz w:val="17"/>
-              </w:rPr>
-              <w:t xml:space="preserve">25.5</w:t>
-            </w:r>
-          </w:p>
-        </w:tc>
-        <w:tc>
-          <w:tcPr>
-            <w:tcW w:w="709" w:type="dxa"/>
-          </w:tcPr>
-          <w:p>
-            <w:pPr>
-              <w:pStyle w:val="Compact"/>
-              <w:spacing w:line="240" w:lineRule="auto" w:after="0"/>
-              <w:jc w:val="right"/>
-            </w:pPr>
-            <w:r>
-              <w:rPr>
-                <w:sz w:val="17"/>
-              </w:rPr>
-              <w:t xml:space="preserve">–</w:t>
-            </w:r>
-          </w:p>
-        </w:tc>
-      </w:tr>
-      <w:tr>
-        <w:tc>
-          <w:tcPr>
-            <w:tcW w:w="2918" w:type="dxa"/>
-            <w:tcBorders>
-              <w:bottom w:val="single" w:sz="8" w:color="000000"/>
-            </w:tcBorders>
-          </w:tcPr>
-          <w:p>
-            <w:pPr>
-              <w:pStyle w:val="Compact"/>
-              <w:spacing w:line="240" w:lineRule="auto" w:after="0"/>
-              <w:jc w:val="left"/>
-            </w:pPr>
-            <w:r>
-              <w:rPr>
-                <w:sz w:val="17"/>
-              </w:rPr>
-              <w:t xml:space="preserve">buys challenges: v2 default</w:t>
-            </w:r>
-          </w:p>
-        </w:tc>
-        <w:tc>
-          <w:tcPr>
-            <w:tcW w:w="1735" w:type="dxa"/>
-            <w:tcBorders>
-              <w:bottom w:val="single" w:sz="8" w:color="000000"/>
-            </w:tcBorders>
-          </w:tcPr>
-          <w:p>
-            <w:pPr>
-              <w:pStyle w:val="Compact"/>
-              <w:spacing w:line="240" w:lineRule="auto" w:after="0"/>
-              <w:jc w:val="left"/>
-            </w:pPr>
-            <w:r>
-              <w:rPr>
-                <w:sz w:val="17"/>
-              </w:rPr>
-              <w:t xml:space="preserve">106 [87, 127]</w:t>
-            </w:r>
-          </w:p>
-        </w:tc>
-        <w:tc>
-          <w:tcPr>
-            <w:tcW w:w="867" w:type="dxa"/>
-            <w:tcBorders>
-              <w:bottom w:val="single" w:sz="8" w:color="000000"/>
-            </w:tcBorders>
-          </w:tcPr>
-          <w:p>
-            <w:pPr>
-              <w:pStyle w:val="Compact"/>
-              <w:spacing w:line="240" w:lineRule="auto" w:after="0"/>
-              <w:jc w:val="left"/>
-            </w:pPr>
-            <w:r>
-              <w:rPr>
-                <w:sz w:val="17"/>
-              </w:rPr>
-              <w:t xml:space="preserve">10/10</w:t>
-            </w:r>
-          </w:p>
-        </w:tc>
-        <w:tc>
-          <w:tcPr>
-            <w:tcW w:w="1656" w:type="dxa"/>
-            <w:tcBorders>
-              <w:bottom w:val="single" w:sz="8" w:color="000000"/>
-            </w:tcBorders>
-          </w:tcPr>
-          <w:p>
-            <w:pPr>
-              <w:pStyle w:val="Compact"/>
-              <w:spacing w:line="240" w:lineRule="auto" w:after="0"/>
-              <w:jc w:val="left"/>
-            </w:pPr>
-            <w:r>
-              <w:rPr>
-                <w:sz w:val="17"/>
-              </w:rPr>
-              <w:t xml:space="preserve">4.3 [3.8, 4.9]</w:t>
-            </w:r>
-          </w:p>
-        </w:tc>
-        <w:tc>
-          <w:tcPr>
-            <w:tcW w:w="1183" w:type="dxa"/>
-            <w:tcBorders>
-              <w:bottom w:val="single" w:sz="8" w:color="000000"/>
-            </w:tcBorders>
-          </w:tcPr>
-          <w:p>
-            <w:pPr>
-              <w:pStyle w:val="Compact"/>
-              <w:spacing w:line="240" w:lineRule="auto" w:after="0"/>
-              <w:jc w:val="left"/>
-            </w:pPr>
-            <w:r>
-              <w:rPr>
-                <w:sz w:val="17"/>
-              </w:rPr>
-              <w:t xml:space="preserve">3.0</w:t>
-            </w:r>
-          </w:p>
-        </w:tc>
-        <w:tc>
-          <w:tcPr>
-            <w:tcW w:w="709" w:type="dxa"/>
-            <w:tcBorders>
-              <w:bottom w:val="single" w:sz="8" w:color="000000"/>
-            </w:tcBorders>
-          </w:tcPr>
-          <w:p>
-            <w:pPr>
-              <w:pStyle w:val="Compact"/>
-              <w:spacing w:line="240" w:lineRule="auto" w:after="0"/>
-              <w:jc w:val="right"/>
-            </w:pPr>
-            <w:r>
-              <w:rPr>
-                <w:sz w:val="17"/>
-              </w:rPr>
-              <w:t xml:space="preserve">0</w:t>
-            </w:r>
-          </w:p>
-        </w:tc>
-      </w:tr>
-    </w:tbl>
-    <w:p>
-      <w:pPr>
-        <w:pStyle w:val="BodyText"/>
-      </w:pPr>
-      <w:r>
-        <w:t xml:space="preserve">Table 4 covers concentrated pumpers on three blocks with caps lifted over ten seeds: messages leaked of about 574 requests in 20 minutes, seeds contained, mean minutes to containment (contained seeds) and to the first verdict (seeds with one), and codes entered. The speed test catches a carrier verifying within a second at 19 messages, while the carrier verifying 60% with human-like delay is contained in none of the ten 20-minute runs: its first verdict comes at minute 11.6 on average and 452 messages leak; in an hour, 1 067 leak and two of ten runs are contained, at minute 47.0 on average. Claim C3 (containment with at most 30% leaked) held in 36 of 36 cells.</w:t>
-      </w:r>
-    </w:p>
-    <w:p>
-      <w:pPr>
-        <w:pStyle w:val="BodyText"/>
-      </w:pPr>
-      <w:r>
-        <w:t xml:space="preserve">Across 18 spread configurations, leakage follows the blocks touched: with 30 blocks, five to seven runs in ten are still contained. Unsaturated, Equation (2) errs by 1.6 to 7.9 messages per run (1%–13%, ten configurations); saturated, it overstates by up to 91.</w:t>
-      </w:r>
-    </w:p>
-    <w:bookmarkEnd w:id="74"/>
-    <w:bookmarkStart w:id="87" w:name="f.-counting-against-testing"/>
-    <w:p>
-      <w:pPr>
-        <w:pStyle w:val="Heading2"/>
-      </w:pPr>
-      <w:r>
-        <w:t xml:space="preserve">F. COUNTING AGAINST TESTING</w:t>
-      </w:r>
-    </w:p>
-    <w:p>
-      <w:pPr>
-        <w:pStyle w:val="TableCaption"/>
-      </w:pPr>
-      <w:r>
-        <w:rPr>
-          <w:bCs/>
-          <w:b/>
-        </w:rPr>
-        <w:t xml:space="preserve">TABLE 5.</w:t>
       </w:r>
       <w:r>
         <w:t xml:space="preserve"> </w:t>
@@ -8558,7 +7591,7 @@
           <w:right w:w="57" w:type="dxa"/>
         </w:tblCellMar>
         <w:tblLook w:firstRow="1" w:lastRow="0" w:firstColumn="0" w:lastColumn="0" w:noHBand="0" w:noVBand="0" w:val="0020"/>
-        <w:tblCaption w:val="TABLE 5. Counting against testing at the service target."/>
+        <w:tblCaption w:val="TABLE 4. Counting against testing at the service target."/>
       </w:tblPr>
       <w:tblGrid>
         <w:gridCol w:w="4053"/>
@@ -9716,7 +8749,7 @@
         <w:pStyle w:val="FirstParagraph"/>
       </w:pPr>
       <w:r>
-        <w:t xml:space="preserve">Table 5 reports the first protocol at 200 blocks (144 legitimate sends per block a day; tuning seeds 100–102, evaluation seeds 0–9): 20-minute leakage against the never-verifying (NV), instant (IV), human-like (HL) and challenge-buying (CB) carriers and, from 24-hour attack-free runs at 65% conversion, completion, benign cost (points), users challenged and verdict events a day; the tuning target is 63.95%. A setting is named by its rule, threshold and credit, so</w:t>
+        <w:t xml:space="preserve">Table 4 reports the first protocol at 200 blocks (144 legitimate sends per block a day; tuning seeds 100–102, evaluation seeds 0–9): 20-minute leakage against the never-verifying (NV), instant (IV), human-like (HL) and challenge-buying (CB) carriers and, from 24-hour attack-free runs at 65% conversion, completion, benign cost (points), users challenged and verdict events a day; the tuning target is 63.95%. A setting is named by its rule, threshold and credit, so</w:t>
       </w:r>
       <w:r>
         <w:t xml:space="preserve"> </w:t>
@@ -9766,7 +8799,7 @@
           <w:bCs/>
           <w:b/>
         </w:rPr>
-        <w:t xml:space="preserve">TABLE 6.</w:t>
+        <w:t xml:space="preserve">TABLE 5.</w:t>
       </w:r>
       <w:r>
         <w:t xml:space="preserve"> </w:t>
@@ -9786,7 +8819,7 @@
           <w:right w:w="57" w:type="dxa"/>
         </w:tblCellMar>
         <w:tblLook w:firstRow="1" w:lastRow="0" w:firstColumn="0" w:lastColumn="0" w:noHBand="0" w:noVBand="0" w:val="0020"/>
-        <w:tblCaption w:val="TABLE 6. The frozen counter on seeds and workloads it had never seen."/>
+        <w:tblCaption w:val="TABLE 5. The frozen counter on seeds and workloads it had never seen."/>
       </w:tblPr>
       <w:tblGrid>
         <w:gridCol w:w="648"/>
@@ -10401,7 +9434,7 @@
         <w:pStyle w:val="FirstParagraph"/>
       </w:pPr>
       <w:r>
-        <w:t xml:space="preserve">Table 6 covers 12 shifted points of the held-out family, with held-out attack rates and pools, three seeds each and a 20-minute pumper on three blocks real users share; a claim holds if true in 90% of cells, which share workloads and seeds and are not independent, and IV marks the instant verifier’s cells. Frozen and run on this family, the counter leaked 33, 34, 33, and 62 messages against the four carriers, where the default leaked 287, 36, 344, and 287, and no policy 451 to 1 857, at a benign cost of 0.13 [0.09, 0.17] points, and failed both service-under-attack claims: 13 of the 17 cells that broke K3 lie at the three points with the most legitimate traffic, where users and pumper compete for one quota; K5 failed in 51 cells over 11 of 12 points. The counters selected for sparser traffic cost 4.7 and 5.8 points here even without an attack: the quota must match the traffic.</w:t>
+        <w:t xml:space="preserve">Table 5 covers 12 shifted points of the held-out family, with held-out attack rates and pools, three seeds each and a 20-minute pumper on three blocks real users share; a claim holds if true in 90% of cells, which share workloads and seeds and are not independent, and IV marks the instant verifier’s cells. Frozen and run on this family, the counter leaked 33, 34, 33, and 62 messages against the four carriers, where the default leaked 287, 36, 344, and 287, and no policy 451 to 1 857, at a benign cost of 0.13 [0.09, 0.17] points, and failed both service-under-attack claims: 13 of the 17 cells that broke K3 lie at the three points with the most legitimate traffic, where users and pumper compete for one quota; K5 failed in 51 cells over 11 of 12 points. The counters selected for sparser traffic cost 4.7 and 5.8 points here even without an attack: the quota must match the traffic.</w:t>
       </w:r>
     </w:p>
     <w:p>
@@ -10413,7 +9446,7 @@
           <w:bCs/>
           <w:b/>
         </w:rPr>
-        <w:t xml:space="preserve">TABLE 7.</w:t>
+        <w:t xml:space="preserve">TABLE 6.</w:t>
       </w:r>
       <w:r>
         <w:t xml:space="preserve"> </w:t>
@@ -10433,7 +9466,7 @@
           <w:right w:w="57" w:type="dxa"/>
         </w:tblCellMar>
         <w:tblLook w:firstRow="0" w:lastRow="0" w:firstColumn="0" w:lastColumn="0" w:noHBand="0" w:noVBand="0" w:val="0000"/>
-        <w:tblCaption w:val="TABLE 7. A pumper on blocks that real users share: what leaks and who pays."/>
+        <w:tblCaption w:val="TABLE 6. A pumper on blocks that real users share: what leaks and who pays."/>
       </w:tblPr>
       <w:tblGrid>
         <w:gridCol w:w="1845"/>
@@ -11868,809 +10901,12 @@
         </w:tc>
       </w:tr>
     </w:tbl>
-    <w:p/>
-    <w:p>
-      <w:pPr>
-        <w:pStyle w:val="TableCaption"/>
-      </w:pPr>
-      <w:r>
-        <w:rPr>
-          <w:bCs/>
-          <w:b/>
-        </w:rPr>
-        <w:t xml:space="preserve">TABLE 8.</w:t>
-      </w:r>
-      <w:r>
-        <w:t xml:space="preserve"> </w:t>
-      </w:r>
-      <w:r>
-        <w:t xml:space="preserve">A poisoner on every block: what users lose.</w:t>
-      </w:r>
-    </w:p>
-    <w:tbl>
-      <w:tblPr>
-        <w:tblStyle w:val="Table"/>
-        <w:tblW w:w="9070" w:type="dxa"/>
-        <w:jc w:val="center"/>
-        <w:tblLayout w:type="fixed"/>
-        <w:tblCellMar>
-          <w:left w:w="57" w:type="dxa"/>
-          <w:right w:w="57" w:type="dxa"/>
-        </w:tblCellMar>
-        <w:tblLook w:firstRow="0" w:lastRow="0" w:firstColumn="0" w:lastColumn="0" w:noHBand="0" w:noVBand="0" w:val="0000"/>
-        <w:tblCaption w:val="TABLE 8. A poisoner on every block: what users lose."/>
-      </w:tblPr>
-      <w:tblGrid>
-        <w:gridCol w:w="3066"/>
-        <w:gridCol w:w="1022"/>
-        <w:gridCol w:w="2683"/>
-        <w:gridCol w:w="2299"/>
-      </w:tblGrid>
-      <w:tr>
-        <w:tc>
-          <w:tcPr>
-            <w:tcW w:w="3066" w:type="dxa"/>
-            <w:tcBorders>
-              <w:top w:val="single" w:sz="8" w:color="000000"/>
-            </w:tcBorders>
-          </w:tcPr>
-          <w:p>
-            <w:pPr>
-              <w:pStyle w:val="Compact"/>
-              <w:spacing w:line="240" w:lineRule="auto" w:after="0"/>
-            </w:pPr>
-          </w:p>
-        </w:tc>
-        <w:tc>
-          <w:tcPr>
-            <w:tcW w:w="1022" w:type="dxa"/>
-            <w:tcBorders>
-              <w:top w:val="single" w:sz="8" w:color="000000"/>
-            </w:tcBorders>
-          </w:tcPr>
-          <w:p>
-            <w:pPr>
-              <w:pStyle w:val="Compact"/>
-              <w:spacing w:line="240" w:lineRule="auto" w:after="0"/>
-              <w:jc w:val="right"/>
-            </w:pPr>
-            <w:r>
-              <w:rPr>
-                <w:sz w:val="17"/>
-              </w:rPr>
-              <w:t xml:space="preserve">Leaked</w:t>
-            </w:r>
-          </w:p>
-        </w:tc>
-        <w:tc>
-          <w:tcPr>
-            <w:tcW w:w="4982" w:type="dxa"/>
-            <w:gridSpan w:val="2"/>
-            <w:tcBorders>
-              <w:top w:val="single" w:sz="8" w:color="000000"/>
-            </w:tcBorders>
-          </w:tcPr>
-          <w:p>
-            <w:pPr>
-              <w:pStyle w:val="Compact"/>
-              <w:spacing w:line="240" w:lineRule="auto" w:after="0"/>
-              <w:jc w:val="center"/>
-            </w:pPr>
-            <w:r>
-              <w:rPr>
-                <w:sz w:val="17"/>
-              </w:rPr>
-              <w:t xml:space="preserve">Extra harm against attacked,</w:t>
-            </w:r>
-          </w:p>
-        </w:tc>
-      </w:tr>
-      <w:tr>
-        <w:tc>
-          <w:tcPr>
-            <w:tcW w:w="3066" w:type="dxa"/>
-          </w:tcPr>
-          <w:p>
-            <w:pPr>
-              <w:pStyle w:val="Compact"/>
-              <w:spacing w:line="240" w:lineRule="auto" w:after="0"/>
-            </w:pPr>
-          </w:p>
-        </w:tc>
-        <w:tc>
-          <w:tcPr>
-            <w:tcW w:w="1022" w:type="dxa"/>
-          </w:tcPr>
-          <w:p>
-            <w:pPr>
-              <w:pStyle w:val="Compact"/>
-              <w:spacing w:line="240" w:lineRule="auto" w:after="0"/>
-            </w:pPr>
-          </w:p>
-        </w:tc>
-        <w:tc>
-          <w:tcPr>
-            <w:tcW w:w="4982" w:type="dxa"/>
-            <w:gridSpan w:val="2"/>
-          </w:tcPr>
-          <w:p>
-            <w:pPr>
-              <w:pStyle w:val="Compact"/>
-              <w:spacing w:line="240" w:lineRule="auto" w:after="0"/>
-              <w:jc w:val="center"/>
-            </w:pPr>
-            <w:r>
-              <w:rPr>
-                <w:sz w:val="17"/>
-              </w:rPr>
-              <w:t xml:space="preserve">no policy</w:t>
-            </w:r>
-          </w:p>
-        </w:tc>
-      </w:tr>
-      <w:tr>
-        <w:tc>
-          <w:tcPr>
-            <w:tcW w:w="3066" w:type="dxa"/>
-            <w:tcBorders>
-              <w:bottom w:val="single" w:sz="4" w:color="000000"/>
-            </w:tcBorders>
-          </w:tcPr>
-          <w:p>
-            <w:pPr>
-              <w:pStyle w:val="Compact"/>
-              <w:spacing w:line="240" w:lineRule="auto" w:after="0"/>
-              <w:jc w:val="left"/>
-            </w:pPr>
-            <w:r>
-              <w:rPr>
-                <w:sz w:val="17"/>
-              </w:rPr>
-              <w:t xml:space="preserve">Policy</w:t>
-            </w:r>
-          </w:p>
-        </w:tc>
-        <w:tc>
-          <w:tcPr>
-            <w:tcW w:w="1022" w:type="dxa"/>
-            <w:tcBorders>
-              <w:bottom w:val="single" w:sz="4" w:color="000000"/>
-            </w:tcBorders>
-          </w:tcPr>
-          <w:p>
-            <w:pPr>
-              <w:pStyle w:val="Compact"/>
-              <w:spacing w:line="240" w:lineRule="auto" w:after="0"/>
-              <w:jc w:val="right"/>
-            </w:pPr>
-            <w:r>
-              <w:rPr>
-                <w:sz w:val="17"/>
-              </w:rPr>
-              <w:t xml:space="preserve">(SMS)</w:t>
-            </w:r>
-          </w:p>
-        </w:tc>
-        <w:tc>
-          <w:tcPr>
-            <w:tcW w:w="2683" w:type="dxa"/>
-            <w:tcBorders>
-              <w:bottom w:val="single" w:sz="4" w:color="000000"/>
-            </w:tcBorders>
-          </w:tcPr>
-          <w:p>
-            <w:pPr>
-              <w:pStyle w:val="Compact"/>
-              <w:spacing w:line="240" w:lineRule="auto" w:after="0"/>
-              <w:jc w:val="right"/>
-            </w:pPr>
-            <w:r>
-              <w:rPr>
-                <w:sz w:val="17"/>
-              </w:rPr>
-              <w:t xml:space="preserve">all users</w:t>
-            </w:r>
-          </w:p>
-        </w:tc>
-        <w:tc>
-          <w:tcPr>
-            <w:tcW w:w="2299" w:type="dxa"/>
-            <w:tcBorders>
-              <w:bottom w:val="single" w:sz="4" w:color="000000"/>
-            </w:tcBorders>
-          </w:tcPr>
-          <w:p>
-            <w:pPr>
-              <w:pStyle w:val="Compact"/>
-              <w:spacing w:line="240" w:lineRule="auto" w:after="0"/>
-              <w:jc w:val="right"/>
-            </w:pPr>
-            <w:r>
-              <w:rPr>
-                <w:sz w:val="17"/>
-              </w:rPr>
-              <w:t xml:space="preserve">first-time users</w:t>
-            </w:r>
-          </w:p>
-        </w:tc>
-      </w:tr>
-      <w:tr>
-        <w:tc>
-          <w:tcPr>
-            <w:tcW w:w="3066" w:type="dxa"/>
-          </w:tcPr>
-          <w:p>
-            <w:pPr>
-              <w:pStyle w:val="Compact"/>
-              <w:spacing w:line="240" w:lineRule="auto" w:after="0"/>
-              <w:jc w:val="left"/>
-            </w:pPr>
-            <w:r>
-              <w:rPr>
-                <w:sz w:val="17"/>
-              </w:rPr>
-              <w:t xml:space="preserve">none</w:t>
-            </w:r>
-          </w:p>
-        </w:tc>
-        <w:tc>
-          <w:tcPr>
-            <w:tcW w:w="1022" w:type="dxa"/>
-          </w:tcPr>
-          <w:p>
-            <w:pPr>
-              <w:pStyle w:val="Compact"/>
-              <w:spacing w:line="240" w:lineRule="auto" w:after="0"/>
-              <w:jc w:val="right"/>
-            </w:pPr>
-            <w:r>
-              <w:rPr>
-                <w:sz w:val="17"/>
-              </w:rPr>
-              <w:t xml:space="preserve">1 976</w:t>
-            </w:r>
-          </w:p>
-        </w:tc>
-        <w:tc>
-          <w:tcPr>
-            <w:tcW w:w="2683" w:type="dxa"/>
-          </w:tcPr>
-          <w:p>
-            <w:pPr>
-              <w:pStyle w:val="Compact"/>
-              <w:spacing w:line="240" w:lineRule="auto" w:after="0"/>
-              <w:jc w:val="right"/>
-            </w:pPr>
-            <w:r>
-              <w:rPr>
-                <w:sz w:val="17"/>
-              </w:rPr>
-              <w:t xml:space="preserve">–</w:t>
-            </w:r>
-          </w:p>
-        </w:tc>
-        <w:tc>
-          <w:tcPr>
-            <w:tcW w:w="2299" w:type="dxa"/>
-          </w:tcPr>
-          <w:p>
-            <w:pPr>
-              <w:pStyle w:val="Compact"/>
-              <w:spacing w:line="240" w:lineRule="auto" w:after="0"/>
-              <w:jc w:val="right"/>
-            </w:pPr>
-            <w:r>
-              <w:rPr>
-                <w:sz w:val="17"/>
-              </w:rPr>
-              <w:t xml:space="preserve">–</w:t>
-            </w:r>
-          </w:p>
-        </w:tc>
-      </w:tr>
-      <w:tr>
-        <w:tc>
-          <w:tcPr>
-            <w:tcW w:w="3066" w:type="dxa"/>
-          </w:tcPr>
-          <w:p>
-            <w:pPr>
-              <w:pStyle w:val="Compact"/>
-              <w:spacing w:line="240" w:lineRule="auto" w:after="0"/>
-              <w:jc w:val="left"/>
-            </w:pPr>
-            <w:r>
-              <w:rPr>
-                <w:sz w:val="17"/>
-              </w:rPr>
-              <w:t xml:space="preserve">sequential, default</w:t>
-            </w:r>
-          </w:p>
-        </w:tc>
-        <w:tc>
-          <w:tcPr>
-            <w:tcW w:w="1022" w:type="dxa"/>
-          </w:tcPr>
-          <w:p>
-            <w:pPr>
-              <w:pStyle w:val="Compact"/>
-              <w:spacing w:line="240" w:lineRule="auto" w:after="0"/>
-              <w:jc w:val="right"/>
-            </w:pPr>
-            <w:r>
-              <w:rPr>
-                <w:sz w:val="17"/>
-              </w:rPr>
-              <w:t xml:space="preserve">1 357</w:t>
-            </w:r>
-          </w:p>
-        </w:tc>
-        <w:tc>
-          <w:tcPr>
-            <w:tcW w:w="2683" w:type="dxa"/>
-          </w:tcPr>
-          <w:p>
-            <w:pPr>
-              <w:pStyle w:val="Compact"/>
-              <w:spacing w:line="240" w:lineRule="auto" w:after="0"/>
-              <w:jc w:val="right"/>
-            </w:pPr>
-            <w:r>
-              <w:rPr>
-                <w:sz w:val="17"/>
-              </w:rPr>
-              <w:t xml:space="preserve">1.09 [0.59, 1.59]</w:t>
-            </w:r>
-          </w:p>
-        </w:tc>
-        <w:tc>
-          <w:tcPr>
-            <w:tcW w:w="2299" w:type="dxa"/>
-          </w:tcPr>
-          <w:p>
-            <w:pPr>
-              <w:pStyle w:val="Compact"/>
-              <w:spacing w:line="240" w:lineRule="auto" w:after="0"/>
-              <w:jc w:val="right"/>
-            </w:pPr>
-            <w:r>
-              <w:rPr>
-                <w:sz w:val="17"/>
-              </w:rPr>
-              <w:t xml:space="preserve">1.36</w:t>
-            </w:r>
-          </w:p>
-        </w:tc>
-      </w:tr>
-      <w:tr>
-        <w:tc>
-          <w:tcPr>
-            <w:tcW w:w="3066" w:type="dxa"/>
-          </w:tcPr>
-          <w:p>
-            <w:pPr>
-              <w:pStyle w:val="Compact"/>
-              <w:spacing w:line="240" w:lineRule="auto" w:after="0"/>
-              <w:jc w:val="left"/>
-            </w:pPr>
-            <w:r>
-              <w:rPr>
-                <w:sz w:val="17"/>
-              </w:rPr>
-              <w:t xml:space="preserve">sequential</w:t>
-            </w:r>
-            <w:r>
-              <w:rPr>
-                <w:sz w:val="17"/>
-              </w:rPr>
-              <w:t xml:space="preserve"> </w:t>
-            </w:r>
-            <w:r>
-              <w:rPr>
-                <w:iCs/>
-                <w:i/>
-                <w:sz w:val="17"/>
-              </w:rPr>
-              <w:t xml:space="preserve">T</w:t>
-            </w:r>
-            <w:r>
-              <w:rPr>
-                <w:sz w:val="17"/>
-              </w:rPr>
-              <w:t xml:space="preserve">300,</w:t>
-            </w:r>
-            <w:r>
-              <w:rPr>
-                <w:sz w:val="17"/>
-              </w:rPr>
-              <w:t xml:space="preserve"> </w:t>
-            </w:r>
-            <w:r>
-              <w:rPr>
-                <w:iCs/>
-                <w:i/>
-                <w:sz w:val="17"/>
-              </w:rPr>
-              <w:t xml:space="preserve">c</w:t>
-            </w:r>
-            <w:r>
-              <w:rPr>
-                <w:sz w:val="17"/>
-              </w:rPr>
-              <w:t xml:space="preserve">0</w:t>
-            </w:r>
-          </w:p>
-        </w:tc>
-        <w:tc>
-          <w:tcPr>
-            <w:tcW w:w="1022" w:type="dxa"/>
-          </w:tcPr>
-          <w:p>
-            <w:pPr>
-              <w:pStyle w:val="Compact"/>
-              <w:spacing w:line="240" w:lineRule="auto" w:after="0"/>
-              <w:jc w:val="right"/>
-            </w:pPr>
-            <w:r>
-              <w:rPr>
-                <w:sz w:val="17"/>
-              </w:rPr>
-              <w:t xml:space="preserve">858</w:t>
-            </w:r>
-          </w:p>
-        </w:tc>
-        <w:tc>
-          <w:tcPr>
-            <w:tcW w:w="2683" w:type="dxa"/>
-          </w:tcPr>
-          <w:p>
-            <w:pPr>
-              <w:pStyle w:val="Compact"/>
-              <w:spacing w:line="240" w:lineRule="auto" w:after="0"/>
-              <w:jc w:val="right"/>
-            </w:pPr>
-            <w:r>
-              <w:rPr>
-                <w:sz w:val="17"/>
-              </w:rPr>
-              <w:t xml:space="preserve">2.55 [2.04, 3.07]</w:t>
-            </w:r>
-          </w:p>
-        </w:tc>
-        <w:tc>
-          <w:tcPr>
-            <w:tcW w:w="2299" w:type="dxa"/>
-          </w:tcPr>
-          <w:p>
-            <w:pPr>
-              <w:pStyle w:val="Compact"/>
-              <w:spacing w:line="240" w:lineRule="auto" w:after="0"/>
-              <w:jc w:val="right"/>
-            </w:pPr>
-            <w:r>
-              <w:rPr>
-                <w:sz w:val="17"/>
-              </w:rPr>
-              <w:t xml:space="preserve">3.20</w:t>
-            </w:r>
-          </w:p>
-        </w:tc>
-      </w:tr>
-      <w:tr>
-        <w:tc>
-          <w:tcPr>
-            <w:tcW w:w="3066" w:type="dxa"/>
-          </w:tcPr>
-          <w:p>
-            <w:pPr>
-              <w:pStyle w:val="Compact"/>
-              <w:spacing w:line="240" w:lineRule="auto" w:after="0"/>
-              <w:jc w:val="left"/>
-            </w:pPr>
-            <w:r>
-              <w:rPr>
-                <w:sz w:val="17"/>
-              </w:rPr>
-              <w:t xml:space="preserve">counter, 4 per 10 min</w:t>
-            </w:r>
-          </w:p>
-        </w:tc>
-        <w:tc>
-          <w:tcPr>
-            <w:tcW w:w="1022" w:type="dxa"/>
-          </w:tcPr>
-          <w:p>
-            <w:pPr>
-              <w:pStyle w:val="Compact"/>
-              <w:spacing w:line="240" w:lineRule="auto" w:after="0"/>
-              <w:jc w:val="right"/>
-            </w:pPr>
-            <w:r>
-              <w:rPr>
-                <w:sz w:val="17"/>
-              </w:rPr>
-              <w:t xml:space="preserve">1 662</w:t>
-            </w:r>
-          </w:p>
-        </w:tc>
-        <w:tc>
-          <w:tcPr>
-            <w:tcW w:w="2683" w:type="dxa"/>
-          </w:tcPr>
-          <w:p>
-            <w:pPr>
-              <w:pStyle w:val="Compact"/>
-              <w:spacing w:line="240" w:lineRule="auto" w:after="0"/>
-              <w:jc w:val="right"/>
-            </w:pPr>
-            <w:r>
-              <w:rPr>
-                <w:sz w:val="17"/>
-              </w:rPr>
-              <w:t xml:space="preserve">0.72 [0.44, 1.02]</w:t>
-            </w:r>
-          </w:p>
-        </w:tc>
-        <w:tc>
-          <w:tcPr>
-            <w:tcW w:w="2299" w:type="dxa"/>
-          </w:tcPr>
-          <w:p>
-            <w:pPr>
-              <w:pStyle w:val="Compact"/>
-              <w:spacing w:line="240" w:lineRule="auto" w:after="0"/>
-              <w:jc w:val="right"/>
-            </w:pPr>
-            <w:r>
-              <w:rPr>
-                <w:sz w:val="17"/>
-              </w:rPr>
-              <w:t xml:space="preserve">0.91</w:t>
-            </w:r>
-          </w:p>
-        </w:tc>
-      </w:tr>
-      <w:tr>
-        <w:tc>
-          <w:tcPr>
-            <w:tcW w:w="3066" w:type="dxa"/>
-          </w:tcPr>
-          <w:p>
-            <w:pPr>
-              <w:pStyle w:val="Compact"/>
-              <w:spacing w:line="240" w:lineRule="auto" w:after="0"/>
-              <w:jc w:val="left"/>
-            </w:pPr>
-            <w:r>
-              <w:rPr>
-                <w:sz w:val="17"/>
-              </w:rPr>
-              <w:t xml:space="preserve">counter + sequential</w:t>
-            </w:r>
-          </w:p>
-        </w:tc>
-        <w:tc>
-          <w:tcPr>
-            <w:tcW w:w="1022" w:type="dxa"/>
-          </w:tcPr>
-          <w:p>
-            <w:pPr>
-              <w:pStyle w:val="Compact"/>
-              <w:spacing w:line="240" w:lineRule="auto" w:after="0"/>
-              <w:jc w:val="right"/>
-            </w:pPr>
-            <w:r>
-              <w:rPr>
-                <w:sz w:val="17"/>
-              </w:rPr>
-              <w:t xml:space="preserve">1 286</w:t>
-            </w:r>
-          </w:p>
-        </w:tc>
-        <w:tc>
-          <w:tcPr>
-            <w:tcW w:w="2683" w:type="dxa"/>
-          </w:tcPr>
-          <w:p>
-            <w:pPr>
-              <w:pStyle w:val="Compact"/>
-              <w:spacing w:line="240" w:lineRule="auto" w:after="0"/>
-              <w:jc w:val="right"/>
-            </w:pPr>
-            <w:r>
-              <w:rPr>
-                <w:sz w:val="17"/>
-              </w:rPr>
-              <w:t xml:space="preserve">1.43 [0.88, 1.97]</w:t>
-            </w:r>
-          </w:p>
-        </w:tc>
-        <w:tc>
-          <w:tcPr>
-            <w:tcW w:w="2299" w:type="dxa"/>
-          </w:tcPr>
-          <w:p>
-            <w:pPr>
-              <w:pStyle w:val="Compact"/>
-              <w:spacing w:line="240" w:lineRule="auto" w:after="0"/>
-              <w:jc w:val="right"/>
-            </w:pPr>
-            <w:r>
-              <w:rPr>
-                <w:sz w:val="17"/>
-              </w:rPr>
-              <w:t xml:space="preserve">1.79</w:t>
-            </w:r>
-          </w:p>
-        </w:tc>
-      </w:tr>
-      <w:tr>
-        <w:tc>
-          <w:tcPr>
-            <w:tcW w:w="3066" w:type="dxa"/>
-          </w:tcPr>
-          <w:p>
-            <w:pPr>
-              <w:pStyle w:val="Compact"/>
-              <w:spacing w:line="240" w:lineRule="auto" w:after="0"/>
-              <w:jc w:val="left"/>
-            </w:pPr>
-            <w:r>
-              <w:rPr>
-                <w:sz w:val="17"/>
-              </w:rPr>
-              <w:t xml:space="preserve">token bucket, burst 4</w:t>
-            </w:r>
-          </w:p>
-        </w:tc>
-        <w:tc>
-          <w:tcPr>
-            <w:tcW w:w="1022" w:type="dxa"/>
-          </w:tcPr>
-          <w:p>
-            <w:pPr>
-              <w:pStyle w:val="Compact"/>
-              <w:spacing w:line="240" w:lineRule="auto" w:after="0"/>
-              <w:jc w:val="right"/>
-            </w:pPr>
-            <w:r>
-              <w:rPr>
-                <w:sz w:val="17"/>
-              </w:rPr>
-              <w:t xml:space="preserve">1 877</w:t>
-            </w:r>
-          </w:p>
-        </w:tc>
-        <w:tc>
-          <w:tcPr>
-            <w:tcW w:w="2683" w:type="dxa"/>
-          </w:tcPr>
-          <w:p>
-            <w:pPr>
-              <w:pStyle w:val="Compact"/>
-              <w:spacing w:line="240" w:lineRule="auto" w:after="0"/>
-              <w:jc w:val="right"/>
-            </w:pPr>
-            <w:r>
-              <w:rPr>
-                <w:sz w:val="17"/>
-              </w:rPr>
-              <w:t xml:space="preserve">0.12 [0.04, 0.23]</w:t>
-            </w:r>
-          </w:p>
-        </w:tc>
-        <w:tc>
-          <w:tcPr>
-            <w:tcW w:w="2299" w:type="dxa"/>
-          </w:tcPr>
-          <w:p>
-            <w:pPr>
-              <w:pStyle w:val="Compact"/>
-              <w:spacing w:line="240" w:lineRule="auto" w:after="0"/>
-              <w:jc w:val="right"/>
-            </w:pPr>
-            <w:r>
-              <w:rPr>
-                <w:sz w:val="17"/>
-              </w:rPr>
-              <w:t xml:space="preserve">0.16</w:t>
-            </w:r>
-          </w:p>
-        </w:tc>
-      </w:tr>
-      <w:tr>
-        <w:tc>
-          <w:tcPr>
-            <w:tcW w:w="3066" w:type="dxa"/>
-            <w:tcBorders>
-              <w:bottom w:val="single" w:sz="8" w:color="000000"/>
-            </w:tcBorders>
-          </w:tcPr>
-          <w:p>
-            <w:pPr>
-              <w:pStyle w:val="Compact"/>
-              <w:spacing w:line="240" w:lineRule="auto" w:after="0"/>
-              <w:jc w:val="left"/>
-            </w:pPr>
-            <w:r>
-              <w:rPr>
-                <w:sz w:val="17"/>
-              </w:rPr>
-              <w:t xml:space="preserve">token bucket, burst 12</w:t>
-            </w:r>
-          </w:p>
-        </w:tc>
-        <w:tc>
-          <w:tcPr>
-            <w:tcW w:w="1022" w:type="dxa"/>
-            <w:tcBorders>
-              <w:bottom w:val="single" w:sz="8" w:color="000000"/>
-            </w:tcBorders>
-          </w:tcPr>
-          <w:p>
-            <w:pPr>
-              <w:pStyle w:val="Compact"/>
-              <w:spacing w:line="240" w:lineRule="auto" w:after="0"/>
-              <w:jc w:val="right"/>
-            </w:pPr>
-            <w:r>
-              <w:rPr>
-                <w:sz w:val="17"/>
-              </w:rPr>
-              <w:t xml:space="preserve">1 974</w:t>
-            </w:r>
-          </w:p>
-        </w:tc>
-        <w:tc>
-          <w:tcPr>
-            <w:tcW w:w="2683" w:type="dxa"/>
-            <w:tcBorders>
-              <w:bottom w:val="single" w:sz="8" w:color="000000"/>
-            </w:tcBorders>
-          </w:tcPr>
-          <w:p>
-            <w:pPr>
-              <w:pStyle w:val="Compact"/>
-              <w:spacing w:line="240" w:lineRule="auto" w:after="0"/>
-              <w:jc w:val="right"/>
-            </w:pPr>
-            <w:r>
-              <w:rPr>
-                <w:sz w:val="17"/>
-              </w:rPr>
-              <w:t xml:space="preserve">0.00 [0.00, 0.00]</w:t>
-            </w:r>
-          </w:p>
-        </w:tc>
-        <w:tc>
-          <w:tcPr>
-            <w:tcW w:w="2299" w:type="dxa"/>
-            <w:tcBorders>
-              <w:bottom w:val="single" w:sz="8" w:color="000000"/>
-            </w:tcBorders>
-          </w:tcPr>
-          <w:p>
-            <w:pPr>
-              <w:pStyle w:val="Compact"/>
-              <w:spacing w:line="240" w:lineRule="auto" w:after="0"/>
-              <w:jc w:val="right"/>
-            </w:pPr>
-            <w:r>
-              <w:rPr>
-                <w:sz w:val="17"/>
-              </w:rPr>
-              <w:t xml:space="preserve">0.00</w:t>
-            </w:r>
-          </w:p>
-        </w:tc>
-      </w:tr>
-    </w:tbl>
     <w:p>
       <w:pPr>
         <w:pStyle w:val="BodyText"/>
       </w:pPr>
       <w:r>
-        <w:t xml:space="preserve">Tables 7 and 8 report E1 at 200 blocks (60-minute attacks, seeds 300–309): a pumper on three blocks real users share, and a poisoner flooding all 200 blocks. Leakage under the pumper is summed over the four carriers’ runs of a seed, which can hide a carrier on which a policy loses (per carrier: artifact); harm is net completions lost in points, averaged over the carriers (negative: a gain), with intervals for leakage and the attacked blocks in Table 7 and for all users’ extra harm in Table 8. In Table 7, against the attacked no-policy arm, the counter cost all users nothing on average and gained the attacked blocks’ users three points on average, since without a destination policy, the pumper exhausts their blocks and the hourly budget; with the human-like carrier alone, it cost them 1.9. Against the attack-free operation, every evaluated policy left those users 5 to 9 points worse off on average (2 to 12 per carrier; 8 with none): none shields a block an attacker shares. Counter and tests together, explored outside the frozen claims, leaked least summed over the four carriers but not against the instant verifier (28;</w:t>
+        <w:t xml:space="preserve">Table 6 reports E1 at 200 blocks (60-minute attacks, seeds 300–309): a pumper on three blocks real users share. Leakage is summed over the four carriers’ runs of a seed, which can hide a carrier on which a policy loses (per carrier: artifact); harm is net completions lost in points, averaged over the carriers (negative: a gain), with intervals for leakage and the attacked blocks. Against the attacked no-policy arm, the counter cost all users nothing on average and gained the attacked blocks’ users three points on average, since without a destination policy, the pumper exhausts their blocks and the hourly budget; with the human-like carrier alone, it cost them 1.9. Against the attack-free operation, every evaluated policy left those users 5 to 9 points worse off on average (2 to 12 per carrier; 8 with none): none shields a block an attacker shares. Counter and tests together, explored outside the frozen claims, leaked least summed over the four carriers but not against the instant verifier (28;</w:t>
       </w:r>
       <w:r>
         <w:t xml:space="preserve"> </w:t>
@@ -12696,7 +10932,7 @@
         <w:t xml:space="preserve">c</w:t>
       </w:r>
       <w:r>
-        <w:t xml:space="preserve">0: 22), and under the poisoner (Table 8) cost all users most of the counters and buckets and leaked more than</w:t>
+        <w:t xml:space="preserve">0: 22). Against a poisoner flooding all 200 blocks for an hour on the same seeds, the tests leaked less than the counters but cost users more: of 1 976 messages with no policy,</w:t>
       </w:r>
       <w:r>
         <w:t xml:space="preserve"> </w:t>
@@ -12722,7 +10958,7 @@
         <w:t xml:space="preserve">c</w:t>
       </w:r>
       <w:r>
-        <w:t xml:space="preserve">0. A token bucket with a burst of 4 spared the poisoner’s users only by letting almost everything through; with two untuned settings, neither limiter dominated, and we ranked only the implemented policies. Returning users, all simulated with verified history, lost nothing.</w:t>
+        <w:t xml:space="preserve">0 leaked 858 at an extra harm to all users of 2.55 [2.04, 3.07] points (3.20 for first-time users), the default tests 1 357 at 1.09 [0.59, 1.59], the counter and tests together 1 286 at 1.43 [0.88, 1.97], and the counter alone 1 662 at 0.72 [0.44, 1.02]. A token bucket with a burst of 4 spared the poisoner’s users (0.12 points) only by letting 1 877 messages through, and one with a burst of 12 let through all but two; with two untuned settings, neither limiter dominated, and we ranked only the implemented policies. Returning users, all simulated with verified history, lost nothing.</w:t>
       </w:r>
     </w:p>
     <w:bookmarkEnd w:id="76"/>
@@ -13102,1570 +11338,9 @@
         <w:pStyle w:val="FirstParagraph"/>
       </w:pPr>
       <w:r>
-        <w:t xml:space="preserve">In the scripted workloads, carriers that verify with human-like delay, fake receipts or know the thresholds defeated our outcome tests but not a short-window counter: within an hour of a verdict the counter’s allowance, unlike the tests’, grows with the windows an attack spans, while over longer campaigns verdicts expire and the tests leak again. Equation (5) summarizes this for pumpers that solve no challenge and hold no exemption; its inputs are in an operator’s logs, whereas the cost of an excess send, competition under attack and exemption abuse come only from the simulation. Table 9 sets the seven designs of Section IV against the nine source-side attackers on the same traffic and seeds, with source caps lifted so that only the behavioral layers act (intervals in supplementary Table S1); each design adds one thing to the baseline, and the table says what it bought. Correcting the platform header alone changed only the forged-header attack, from 100% to 99.5%, because that attacker is the farm with a header. Sessions and a hard budget removed the single client’s leakage (5.6% to 0.3%) and cut the premium pumper’s from 99.4% to 94.9%. A refusing counter of five sends per block a day held the premium pumper and the walked numbers, the two attacks that concentrate on a few blocks, to 1%. The behavioral layers of v2 removed datacenter rotation (69% to 0) and most of the reused profile (99.5% to 22.5%), and the two block tests differ only on the walked numbers (11.5% against 13.3%). No design separates the residential bot (37.2%) or the farm (99.5%); those are held only by the adaptive caps of Table 3, at the price Section V-D reports. On the destination, against the never-verifying pumper v1 leaked 570 messages, the default tests 90 and the selected counter 24, and under the shared-block pumper of Table 7 the counter leaked 403 where the default tests leaked 1 149 and no policy 5 509, neither policy costing all users anything on average.</w:t>
-      </w:r>
-    </w:p>
-    <w:p>
-      <w:pPr>
-        <w:pStyle w:val="TableCaption"/>
-      </w:pPr>
-      <w:r>
-        <w:rPr>
-          <w:bCs/>
-          <w:b/>
-        </w:rPr>
-        <w:t xml:space="preserve">TABLE 9.</w:t>
-      </w:r>
-      <w:r>
-        <w:t xml:space="preserve"> </w:t>
-      </w:r>
-      <w:r>
-        <w:t xml:space="preserve">Every design against every source-side attacker, caps lifted.</w:t>
-      </w:r>
-    </w:p>
-    <w:tbl>
-      <w:tblPr>
-        <w:tblStyle w:val="Table"/>
-        <w:tblW w:w="9068" w:type="dxa"/>
-        <w:jc w:val="center"/>
-        <w:tblLayout w:type="fixed"/>
-        <w:tblCellMar>
-          <w:left w:w="57" w:type="dxa"/>
-          <w:right w:w="57" w:type="dxa"/>
-        </w:tblCellMar>
-        <w:tblLook w:firstRow="1" w:lastRow="0" w:firstColumn="0" w:lastColumn="0" w:noHBand="0" w:noVBand="0" w:val="0020"/>
-        <w:tblCaption w:val="TABLE 9. Every design against every source-side attacker, caps lifted."/>
-      </w:tblPr>
-      <w:tblGrid>
-        <w:gridCol w:w="2761"/>
-        <w:gridCol w:w="920"/>
-        <w:gridCol w:w="920"/>
-        <w:gridCol w:w="1051"/>
-        <w:gridCol w:w="788"/>
-        <w:gridCol w:w="920"/>
-        <w:gridCol w:w="920"/>
-        <w:gridCol w:w="788"/>
-      </w:tblGrid>
-      <w:tr>
-        <w:trPr>
-          <w:tblHeader w:val="true"/>
-        </w:trPr>
-        <w:tc>
-          <w:tcPr>
-            <w:tcW w:w="2761" w:type="dxa"/>
-            <w:tcBorders>
-              <w:top w:val="single" w:sz="8" w:color="000000"/>
-              <w:bottom w:val="single" w:sz="4" w:color="000000"/>
-            </w:tcBorders>
-          </w:tcPr>
-          <w:p>
-            <w:pPr>
-              <w:pStyle w:val="Compact"/>
-              <w:spacing w:line="240" w:lineRule="auto" w:after="0"/>
-              <w:jc w:val="left"/>
-            </w:pPr>
-            <w:r>
-              <w:rPr>
-                <w:sz w:val="17"/>
-              </w:rPr>
-              <w:t xml:space="preserve">Attacker</w:t>
-            </w:r>
-          </w:p>
-        </w:tc>
-        <w:tc>
-          <w:tcPr>
-            <w:tcW w:w="920" w:type="dxa"/>
-            <w:tcBorders>
-              <w:top w:val="single" w:sz="8" w:color="000000"/>
-              <w:bottom w:val="single" w:sz="4" w:color="000000"/>
-            </w:tcBorders>
-          </w:tcPr>
-          <w:p>
-            <w:pPr>
-              <w:pStyle w:val="Compact"/>
-              <w:spacing w:line="240" w:lineRule="auto" w:after="0"/>
-              <w:jc w:val="right"/>
-            </w:pPr>
-            <w:r>
-              <w:rPr>
-                <w:sz w:val="17"/>
-              </w:rPr>
-              <w:t xml:space="preserve">v1</w:t>
-            </w:r>
-          </w:p>
-        </w:tc>
-        <w:tc>
-          <w:tcPr>
-            <w:tcW w:w="920" w:type="dxa"/>
-            <w:tcBorders>
-              <w:top w:val="single" w:sz="8" w:color="000000"/>
-              <w:bottom w:val="single" w:sz="4" w:color="000000"/>
-            </w:tcBorders>
-          </w:tcPr>
-          <w:p>
-            <w:pPr>
-              <w:pStyle w:val="Compact"/>
-              <w:spacing w:line="240" w:lineRule="auto" w:after="0"/>
-              <w:jc w:val="right"/>
-            </w:pPr>
-            <w:r>
-              <w:rPr>
-                <w:sz w:val="17"/>
-              </w:rPr>
-              <w:t xml:space="preserve">v1-c.</w:t>
-            </w:r>
-          </w:p>
-        </w:tc>
-        <w:tc>
-          <w:tcPr>
-            <w:tcW w:w="1051" w:type="dxa"/>
-            <w:tcBorders>
-              <w:top w:val="single" w:sz="8" w:color="000000"/>
-              <w:bottom w:val="single" w:sz="4" w:color="000000"/>
-            </w:tcBorders>
-          </w:tcPr>
-          <w:p>
-            <w:pPr>
-              <w:pStyle w:val="Compact"/>
-              <w:spacing w:line="240" w:lineRule="auto" w:after="0"/>
-              <w:jc w:val="right"/>
-            </w:pPr>
-            <w:r>
-              <w:rPr>
-                <w:sz w:val="17"/>
-              </w:rPr>
-              <w:t xml:space="preserve">budget</w:t>
-            </w:r>
-          </w:p>
-        </w:tc>
-        <w:tc>
-          <w:tcPr>
-            <w:tcW w:w="788" w:type="dxa"/>
-            <w:tcBorders>
-              <w:top w:val="single" w:sz="8" w:color="000000"/>
-              <w:bottom w:val="single" w:sz="4" w:color="000000"/>
-            </w:tcBorders>
-          </w:tcPr>
-          <w:p>
-            <w:pPr>
-              <w:pStyle w:val="Compact"/>
-              <w:spacing w:line="240" w:lineRule="auto" w:after="0"/>
-              <w:jc w:val="right"/>
-            </w:pPr>
-            <w:r>
-              <w:rPr>
-                <w:sz w:val="17"/>
-              </w:rPr>
-              <w:t xml:space="preserve">BL</w:t>
-            </w:r>
-          </w:p>
-        </w:tc>
-        <w:tc>
-          <w:tcPr>
-            <w:tcW w:w="920" w:type="dxa"/>
-            <w:tcBorders>
-              <w:top w:val="single" w:sz="8" w:color="000000"/>
-              <w:bottom w:val="single" w:sz="4" w:color="000000"/>
-            </w:tcBorders>
-          </w:tcPr>
-          <w:p>
-            <w:pPr>
-              <w:pStyle w:val="Compact"/>
-              <w:spacing w:line="240" w:lineRule="auto" w:after="0"/>
-              <w:jc w:val="right"/>
-            </w:pPr>
-            <w:r>
-              <w:rPr>
-                <w:sz w:val="17"/>
-              </w:rPr>
-              <w:t xml:space="preserve">conv.</w:t>
-            </w:r>
-          </w:p>
-        </w:tc>
-        <w:tc>
-          <w:tcPr>
-            <w:tcW w:w="920" w:type="dxa"/>
-            <w:tcBorders>
-              <w:top w:val="single" w:sz="8" w:color="000000"/>
-              <w:bottom w:val="single" w:sz="4" w:color="000000"/>
-            </w:tcBorders>
-          </w:tcPr>
-          <w:p>
-            <w:pPr>
-              <w:pStyle w:val="Compact"/>
-              <w:spacing w:line="240" w:lineRule="auto" w:after="0"/>
-              <w:jc w:val="right"/>
-            </w:pPr>
-            <w:r>
-              <w:rPr>
-                <w:sz w:val="17"/>
-              </w:rPr>
-              <w:t xml:space="preserve">speed</w:t>
-            </w:r>
-          </w:p>
-        </w:tc>
-        <w:tc>
-          <w:tcPr>
-            <w:tcW w:w="788" w:type="dxa"/>
-            <w:tcBorders>
-              <w:top w:val="single" w:sz="8" w:color="000000"/>
-              <w:bottom w:val="single" w:sz="4" w:color="000000"/>
-            </w:tcBorders>
-          </w:tcPr>
-          <w:p>
-            <w:pPr>
-              <w:pStyle w:val="Compact"/>
-              <w:spacing w:line="240" w:lineRule="auto" w:after="0"/>
-              <w:jc w:val="right"/>
-            </w:pPr>
-            <w:r>
-              <w:rPr>
-                <w:sz w:val="17"/>
-              </w:rPr>
-              <w:t xml:space="preserve">v2</w:t>
-            </w:r>
-          </w:p>
-        </w:tc>
-      </w:tr>
-      <w:tr>
-        <w:tc>
-          <w:tcPr>
-            <w:tcW w:w="2761" w:type="dxa"/>
-          </w:tcPr>
-          <w:p>
-            <w:pPr>
-              <w:pStyle w:val="Compact"/>
-              <w:spacing w:line="240" w:lineRule="auto" w:after="0"/>
-              <w:jc w:val="left"/>
-            </w:pPr>
-            <w:r>
-              <w:rPr>
-                <w:sz w:val="17"/>
-              </w:rPr>
-              <w:t xml:space="preserve">Single client</w:t>
-            </w:r>
-          </w:p>
-        </w:tc>
-        <w:tc>
-          <w:tcPr>
-            <w:tcW w:w="920" w:type="dxa"/>
-          </w:tcPr>
-          <w:p>
-            <w:pPr>
-              <w:pStyle w:val="Compact"/>
-              <w:spacing w:line="240" w:lineRule="auto" w:after="0"/>
-              <w:jc w:val="right"/>
-            </w:pPr>
-            <w:r>
-              <w:rPr>
-                <w:sz w:val="17"/>
-              </w:rPr>
-              <w:t xml:space="preserve">5.6</w:t>
-            </w:r>
-          </w:p>
-        </w:tc>
-        <w:tc>
-          <w:tcPr>
-            <w:tcW w:w="920" w:type="dxa"/>
-          </w:tcPr>
-          <w:p>
-            <w:pPr>
-              <w:pStyle w:val="Compact"/>
-              <w:spacing w:line="240" w:lineRule="auto" w:after="0"/>
-              <w:jc w:val="right"/>
-            </w:pPr>
-            <w:r>
-              <w:rPr>
-                <w:sz w:val="17"/>
-              </w:rPr>
-              <w:t xml:space="preserve">5.6</w:t>
-            </w:r>
-          </w:p>
-        </w:tc>
-        <w:tc>
-          <w:tcPr>
-            <w:tcW w:w="1051" w:type="dxa"/>
-          </w:tcPr>
-          <w:p>
-            <w:pPr>
-              <w:pStyle w:val="Compact"/>
-              <w:spacing w:line="240" w:lineRule="auto" w:after="0"/>
-              <w:jc w:val="right"/>
-            </w:pPr>
-            <w:r>
-              <w:rPr>
-                <w:sz w:val="17"/>
-              </w:rPr>
-              <w:t xml:space="preserve">0.3</w:t>
-            </w:r>
-          </w:p>
-        </w:tc>
-        <w:tc>
-          <w:tcPr>
-            <w:tcW w:w="788" w:type="dxa"/>
-          </w:tcPr>
-          <w:p>
-            <w:pPr>
-              <w:pStyle w:val="Compact"/>
-              <w:spacing w:line="240" w:lineRule="auto" w:after="0"/>
-              <w:jc w:val="right"/>
-            </w:pPr>
-            <w:r>
-              <w:rPr>
-                <w:sz w:val="17"/>
-              </w:rPr>
-              <w:t xml:space="preserve">0.3</w:t>
-            </w:r>
-          </w:p>
-        </w:tc>
-        <w:tc>
-          <w:tcPr>
-            <w:tcW w:w="920" w:type="dxa"/>
-          </w:tcPr>
-          <w:p>
-            <w:pPr>
-              <w:pStyle w:val="Compact"/>
-              <w:spacing w:line="240" w:lineRule="auto" w:after="0"/>
-              <w:jc w:val="right"/>
-            </w:pPr>
-            <w:r>
-              <w:rPr>
-                <w:sz w:val="17"/>
-              </w:rPr>
-              <w:t xml:space="preserve">0.3</w:t>
-            </w:r>
-          </w:p>
-        </w:tc>
-        <w:tc>
-          <w:tcPr>
-            <w:tcW w:w="920" w:type="dxa"/>
-          </w:tcPr>
-          <w:p>
-            <w:pPr>
-              <w:pStyle w:val="Compact"/>
-              <w:spacing w:line="240" w:lineRule="auto" w:after="0"/>
-              <w:jc w:val="right"/>
-            </w:pPr>
-            <w:r>
-              <w:rPr>
-                <w:sz w:val="17"/>
-              </w:rPr>
-              <w:t xml:space="preserve">0.3</w:t>
-            </w:r>
-          </w:p>
-        </w:tc>
-        <w:tc>
-          <w:tcPr>
-            <w:tcW w:w="788" w:type="dxa"/>
-          </w:tcPr>
-          <w:p>
-            <w:pPr>
-              <w:pStyle w:val="Compact"/>
-              <w:spacing w:line="240" w:lineRule="auto" w:after="0"/>
-              <w:jc w:val="right"/>
-            </w:pPr>
-            <w:r>
-              <w:rPr>
-                <w:sz w:val="17"/>
-              </w:rPr>
-              <w:t xml:space="preserve">0.3</w:t>
-            </w:r>
-          </w:p>
-        </w:tc>
-      </w:tr>
-      <w:tr>
-        <w:tc>
-          <w:tcPr>
-            <w:tcW w:w="2761" w:type="dxa"/>
-          </w:tcPr>
-          <w:p>
-            <w:pPr>
-              <w:pStyle w:val="Compact"/>
-              <w:spacing w:line="240" w:lineRule="auto" w:after="0"/>
-              <w:jc w:val="left"/>
-            </w:pPr>
-            <w:r>
-              <w:rPr>
-                <w:sz w:val="17"/>
-              </w:rPr>
-              <w:t xml:space="preserve">Datacenter rotation</w:t>
-            </w:r>
-          </w:p>
-        </w:tc>
-        <w:tc>
-          <w:tcPr>
-            <w:tcW w:w="920" w:type="dxa"/>
-          </w:tcPr>
-          <w:p>
-            <w:pPr>
-              <w:pStyle w:val="Compact"/>
-              <w:spacing w:line="240" w:lineRule="auto" w:after="0"/>
-              <w:jc w:val="right"/>
-            </w:pPr>
-            <w:r>
-              <w:rPr>
-                <w:sz w:val="17"/>
-              </w:rPr>
-              <w:t xml:space="preserve">69.0</w:t>
-            </w:r>
-          </w:p>
-        </w:tc>
-        <w:tc>
-          <w:tcPr>
-            <w:tcW w:w="920" w:type="dxa"/>
-          </w:tcPr>
-          <w:p>
-            <w:pPr>
-              <w:pStyle w:val="Compact"/>
-              <w:spacing w:line="240" w:lineRule="auto" w:after="0"/>
-              <w:jc w:val="right"/>
-            </w:pPr>
-            <w:r>
-              <w:rPr>
-                <w:sz w:val="17"/>
-              </w:rPr>
-              <w:t xml:space="preserve">69.0</w:t>
-            </w:r>
-          </w:p>
-        </w:tc>
-        <w:tc>
-          <w:tcPr>
-            <w:tcW w:w="1051" w:type="dxa"/>
-          </w:tcPr>
-          <w:p>
-            <w:pPr>
-              <w:pStyle w:val="Compact"/>
-              <w:spacing w:line="240" w:lineRule="auto" w:after="0"/>
-              <w:jc w:val="right"/>
-            </w:pPr>
-            <w:r>
-              <w:rPr>
-                <w:sz w:val="17"/>
-              </w:rPr>
-              <w:t xml:space="preserve">69.0</w:t>
-            </w:r>
-          </w:p>
-        </w:tc>
-        <w:tc>
-          <w:tcPr>
-            <w:tcW w:w="788" w:type="dxa"/>
-          </w:tcPr>
-          <w:p>
-            <w:pPr>
-              <w:pStyle w:val="Compact"/>
-              <w:spacing w:line="240" w:lineRule="auto" w:after="0"/>
-              <w:jc w:val="right"/>
-            </w:pPr>
-            <w:r>
-              <w:rPr>
-                <w:sz w:val="17"/>
-              </w:rPr>
-              <w:t xml:space="preserve">69.0</w:t>
-            </w:r>
-          </w:p>
-        </w:tc>
-        <w:tc>
-          <w:tcPr>
-            <w:tcW w:w="920" w:type="dxa"/>
-          </w:tcPr>
-          <w:p>
-            <w:pPr>
-              <w:pStyle w:val="Compact"/>
-              <w:spacing w:line="240" w:lineRule="auto" w:after="0"/>
-              <w:jc w:val="right"/>
-            </w:pPr>
-            <w:r>
-              <w:rPr>
-                <w:sz w:val="17"/>
-              </w:rPr>
-              <w:t xml:space="preserve">0.0</w:t>
-            </w:r>
-          </w:p>
-        </w:tc>
-        <w:tc>
-          <w:tcPr>
-            <w:tcW w:w="920" w:type="dxa"/>
-          </w:tcPr>
-          <w:p>
-            <w:pPr>
-              <w:pStyle w:val="Compact"/>
-              <w:spacing w:line="240" w:lineRule="auto" w:after="0"/>
-              <w:jc w:val="right"/>
-            </w:pPr>
-            <w:r>
-              <w:rPr>
-                <w:sz w:val="17"/>
-              </w:rPr>
-              <w:t xml:space="preserve">0.0</w:t>
-            </w:r>
-          </w:p>
-        </w:tc>
-        <w:tc>
-          <w:tcPr>
-            <w:tcW w:w="788" w:type="dxa"/>
-          </w:tcPr>
-          <w:p>
-            <w:pPr>
-              <w:pStyle w:val="Compact"/>
-              <w:spacing w:line="240" w:lineRule="auto" w:after="0"/>
-              <w:jc w:val="right"/>
-            </w:pPr>
-            <w:r>
-              <w:rPr>
-                <w:sz w:val="17"/>
-              </w:rPr>
-              <w:t xml:space="preserve">0.0</w:t>
-            </w:r>
-          </w:p>
-        </w:tc>
-      </w:tr>
-      <w:tr>
-        <w:tc>
-          <w:tcPr>
-            <w:tcW w:w="2761" w:type="dxa"/>
-          </w:tcPr>
-          <w:p>
-            <w:pPr>
-              <w:pStyle w:val="Compact"/>
-              <w:spacing w:line="240" w:lineRule="auto" w:after="0"/>
-              <w:jc w:val="left"/>
-            </w:pPr>
-            <w:r>
-              <w:rPr>
-                <w:sz w:val="17"/>
-              </w:rPr>
-              <w:t xml:space="preserve">Premium pumping</w:t>
-            </w:r>
-          </w:p>
-        </w:tc>
-        <w:tc>
-          <w:tcPr>
-            <w:tcW w:w="920" w:type="dxa"/>
-          </w:tcPr>
-          <w:p>
-            <w:pPr>
-              <w:pStyle w:val="Compact"/>
-              <w:spacing w:line="240" w:lineRule="auto" w:after="0"/>
-              <w:jc w:val="right"/>
-            </w:pPr>
-            <w:r>
-              <w:rPr>
-                <w:sz w:val="17"/>
-              </w:rPr>
-              <w:t xml:space="preserve">99.4</w:t>
-            </w:r>
-          </w:p>
-        </w:tc>
-        <w:tc>
-          <w:tcPr>
-            <w:tcW w:w="920" w:type="dxa"/>
-          </w:tcPr>
-          <w:p>
-            <w:pPr>
-              <w:pStyle w:val="Compact"/>
-              <w:spacing w:line="240" w:lineRule="auto" w:after="0"/>
-              <w:jc w:val="right"/>
-            </w:pPr>
-            <w:r>
-              <w:rPr>
-                <w:sz w:val="17"/>
-              </w:rPr>
-              <w:t xml:space="preserve">99.4</w:t>
-            </w:r>
-          </w:p>
-        </w:tc>
-        <w:tc>
-          <w:tcPr>
-            <w:tcW w:w="1051" w:type="dxa"/>
-          </w:tcPr>
-          <w:p>
-            <w:pPr>
-              <w:pStyle w:val="Compact"/>
-              <w:spacing w:line="240" w:lineRule="auto" w:after="0"/>
-              <w:jc w:val="right"/>
-            </w:pPr>
-            <w:r>
-              <w:rPr>
-                <w:sz w:val="17"/>
-              </w:rPr>
-              <w:t xml:space="preserve">94.9</w:t>
-            </w:r>
-          </w:p>
-        </w:tc>
-        <w:tc>
-          <w:tcPr>
-            <w:tcW w:w="788" w:type="dxa"/>
-          </w:tcPr>
-          <w:p>
-            <w:pPr>
-              <w:pStyle w:val="Compact"/>
-              <w:spacing w:line="240" w:lineRule="auto" w:after="0"/>
-              <w:jc w:val="right"/>
-            </w:pPr>
-            <w:r>
-              <w:rPr>
-                <w:sz w:val="17"/>
-              </w:rPr>
-              <w:t xml:space="preserve">1.0</w:t>
-            </w:r>
-          </w:p>
-        </w:tc>
-        <w:tc>
-          <w:tcPr>
-            <w:tcW w:w="920" w:type="dxa"/>
-          </w:tcPr>
-          <w:p>
-            <w:pPr>
-              <w:pStyle w:val="Compact"/>
-              <w:spacing w:line="240" w:lineRule="auto" w:after="0"/>
-              <w:jc w:val="right"/>
-            </w:pPr>
-            <w:r>
-              <w:rPr>
-                <w:sz w:val="17"/>
-              </w:rPr>
-              <w:t xml:space="preserve">0.0</w:t>
-            </w:r>
-          </w:p>
-        </w:tc>
-        <w:tc>
-          <w:tcPr>
-            <w:tcW w:w="920" w:type="dxa"/>
-          </w:tcPr>
-          <w:p>
-            <w:pPr>
-              <w:pStyle w:val="Compact"/>
-              <w:spacing w:line="240" w:lineRule="auto" w:after="0"/>
-              <w:jc w:val="right"/>
-            </w:pPr>
-            <w:r>
-              <w:rPr>
-                <w:sz w:val="17"/>
-              </w:rPr>
-              <w:t xml:space="preserve">0.0</w:t>
-            </w:r>
-          </w:p>
-        </w:tc>
-        <w:tc>
-          <w:tcPr>
-            <w:tcW w:w="788" w:type="dxa"/>
-          </w:tcPr>
-          <w:p>
-            <w:pPr>
-              <w:pStyle w:val="Compact"/>
-              <w:spacing w:line="240" w:lineRule="auto" w:after="0"/>
-              <w:jc w:val="right"/>
-            </w:pPr>
-            <w:r>
-              <w:rPr>
-                <w:sz w:val="17"/>
-              </w:rPr>
-              <w:t xml:space="preserve">0.0</w:t>
-            </w:r>
-          </w:p>
-        </w:tc>
-      </w:tr>
-      <w:tr>
-        <w:tc>
-          <w:tcPr>
-            <w:tcW w:w="2761" w:type="dxa"/>
-          </w:tcPr>
-          <w:p>
-            <w:pPr>
-              <w:pStyle w:val="Compact"/>
-              <w:spacing w:line="240" w:lineRule="auto" w:after="0"/>
-              <w:jc w:val="left"/>
-            </w:pPr>
-            <w:r>
-              <w:rPr>
-                <w:sz w:val="17"/>
-              </w:rPr>
-              <w:t xml:space="preserve">Sequential numbers</w:t>
-            </w:r>
-          </w:p>
-        </w:tc>
-        <w:tc>
-          <w:tcPr>
-            <w:tcW w:w="920" w:type="dxa"/>
-          </w:tcPr>
-          <w:p>
-            <w:pPr>
-              <w:pStyle w:val="Compact"/>
-              <w:spacing w:line="240" w:lineRule="auto" w:after="0"/>
-              <w:jc w:val="right"/>
-            </w:pPr>
-            <w:r>
-              <w:rPr>
-                <w:sz w:val="17"/>
-              </w:rPr>
-              <w:t xml:space="preserve">99.4</w:t>
-            </w:r>
-          </w:p>
-        </w:tc>
-        <w:tc>
-          <w:tcPr>
-            <w:tcW w:w="920" w:type="dxa"/>
-          </w:tcPr>
-          <w:p>
-            <w:pPr>
-              <w:pStyle w:val="Compact"/>
-              <w:spacing w:line="240" w:lineRule="auto" w:after="0"/>
-              <w:jc w:val="right"/>
-            </w:pPr>
-            <w:r>
-              <w:rPr>
-                <w:sz w:val="17"/>
-              </w:rPr>
-              <w:t xml:space="preserve">99.4</w:t>
-            </w:r>
-          </w:p>
-        </w:tc>
-        <w:tc>
-          <w:tcPr>
-            <w:tcW w:w="1051" w:type="dxa"/>
-          </w:tcPr>
-          <w:p>
-            <w:pPr>
-              <w:pStyle w:val="Compact"/>
-              <w:spacing w:line="240" w:lineRule="auto" w:after="0"/>
-              <w:jc w:val="right"/>
-            </w:pPr>
-            <w:r>
-              <w:rPr>
-                <w:sz w:val="17"/>
-              </w:rPr>
-              <w:t xml:space="preserve">99.4</w:t>
-            </w:r>
-          </w:p>
-        </w:tc>
-        <w:tc>
-          <w:tcPr>
-            <w:tcW w:w="788" w:type="dxa"/>
-          </w:tcPr>
-          <w:p>
-            <w:pPr>
-              <w:pStyle w:val="Compact"/>
-              <w:spacing w:line="240" w:lineRule="auto" w:after="0"/>
-              <w:jc w:val="right"/>
-            </w:pPr>
-            <w:r>
-              <w:rPr>
-                <w:sz w:val="17"/>
-              </w:rPr>
-              <w:t xml:space="preserve">1.0</w:t>
-            </w:r>
-          </w:p>
-        </w:tc>
-        <w:tc>
-          <w:tcPr>
-            <w:tcW w:w="920" w:type="dxa"/>
-          </w:tcPr>
-          <w:p>
-            <w:pPr>
-              <w:pStyle w:val="Compact"/>
-              <w:spacing w:line="240" w:lineRule="auto" w:after="0"/>
-              <w:jc w:val="right"/>
-            </w:pPr>
-            <w:r>
-              <w:rPr>
-                <w:sz w:val="17"/>
-              </w:rPr>
-              <w:t xml:space="preserve">11.5</w:t>
-            </w:r>
-          </w:p>
-        </w:tc>
-        <w:tc>
-          <w:tcPr>
-            <w:tcW w:w="920" w:type="dxa"/>
-          </w:tcPr>
-          <w:p>
-            <w:pPr>
-              <w:pStyle w:val="Compact"/>
-              <w:spacing w:line="240" w:lineRule="auto" w:after="0"/>
-              <w:jc w:val="right"/>
-            </w:pPr>
-            <w:r>
-              <w:rPr>
-                <w:sz w:val="17"/>
-              </w:rPr>
-              <w:t xml:space="preserve">13.3</w:t>
-            </w:r>
-          </w:p>
-        </w:tc>
-        <w:tc>
-          <w:tcPr>
-            <w:tcW w:w="788" w:type="dxa"/>
-          </w:tcPr>
-          <w:p>
-            <w:pPr>
-              <w:pStyle w:val="Compact"/>
-              <w:spacing w:line="240" w:lineRule="auto" w:after="0"/>
-              <w:jc w:val="right"/>
-            </w:pPr>
-            <w:r>
-              <w:rPr>
-                <w:sz w:val="17"/>
-              </w:rPr>
-              <w:t xml:space="preserve">11.5</w:t>
-            </w:r>
-          </w:p>
-        </w:tc>
-      </w:tr>
-      <w:tr>
-        <w:tc>
-          <w:tcPr>
-            <w:tcW w:w="2761" w:type="dxa"/>
-          </w:tcPr>
-          <w:p>
-            <w:pPr>
-              <w:pStyle w:val="Compact"/>
-              <w:spacing w:line="240" w:lineRule="auto" w:after="0"/>
-              <w:jc w:val="left"/>
-            </w:pPr>
-            <w:r>
-              <w:rPr>
-                <w:sz w:val="17"/>
-              </w:rPr>
-              <w:t xml:space="preserve">Reused profile</w:t>
-            </w:r>
-          </w:p>
-        </w:tc>
-        <w:tc>
-          <w:tcPr>
-            <w:tcW w:w="920" w:type="dxa"/>
-          </w:tcPr>
-          <w:p>
-            <w:pPr>
-              <w:pStyle w:val="Compact"/>
-              <w:spacing w:line="240" w:lineRule="auto" w:after="0"/>
-              <w:jc w:val="right"/>
-            </w:pPr>
-            <w:r>
-              <w:rPr>
-                <w:sz w:val="17"/>
-              </w:rPr>
-              <w:t xml:space="preserve">99.5</w:t>
-            </w:r>
-          </w:p>
-        </w:tc>
-        <w:tc>
-          <w:tcPr>
-            <w:tcW w:w="920" w:type="dxa"/>
-          </w:tcPr>
-          <w:p>
-            <w:pPr>
-              <w:pStyle w:val="Compact"/>
-              <w:spacing w:line="240" w:lineRule="auto" w:after="0"/>
-              <w:jc w:val="right"/>
-            </w:pPr>
-            <w:r>
-              <w:rPr>
-                <w:sz w:val="17"/>
-              </w:rPr>
-              <w:t xml:space="preserve">99.5</w:t>
-            </w:r>
-          </w:p>
-        </w:tc>
-        <w:tc>
-          <w:tcPr>
-            <w:tcW w:w="1051" w:type="dxa"/>
-          </w:tcPr>
-          <w:p>
-            <w:pPr>
-              <w:pStyle w:val="Compact"/>
-              <w:spacing w:line="240" w:lineRule="auto" w:after="0"/>
-              <w:jc w:val="right"/>
-            </w:pPr>
-            <w:r>
-              <w:rPr>
-                <w:sz w:val="17"/>
-              </w:rPr>
-              <w:t xml:space="preserve">99.5</w:t>
-            </w:r>
-          </w:p>
-        </w:tc>
-        <w:tc>
-          <w:tcPr>
-            <w:tcW w:w="788" w:type="dxa"/>
-          </w:tcPr>
-          <w:p>
-            <w:pPr>
-              <w:pStyle w:val="Compact"/>
-              <w:spacing w:line="240" w:lineRule="auto" w:after="0"/>
-              <w:jc w:val="right"/>
-            </w:pPr>
-            <w:r>
-              <w:rPr>
-                <w:sz w:val="17"/>
-              </w:rPr>
-              <w:t xml:space="preserve">99.5</w:t>
-            </w:r>
-          </w:p>
-        </w:tc>
-        <w:tc>
-          <w:tcPr>
-            <w:tcW w:w="920" w:type="dxa"/>
-          </w:tcPr>
-          <w:p>
-            <w:pPr>
-              <w:pStyle w:val="Compact"/>
-              <w:spacing w:line="240" w:lineRule="auto" w:after="0"/>
-              <w:jc w:val="right"/>
-            </w:pPr>
-            <w:r>
-              <w:rPr>
-                <w:sz w:val="17"/>
-              </w:rPr>
-              <w:t xml:space="preserve">22.5</w:t>
-            </w:r>
-          </w:p>
-        </w:tc>
-        <w:tc>
-          <w:tcPr>
-            <w:tcW w:w="920" w:type="dxa"/>
-          </w:tcPr>
-          <w:p>
-            <w:pPr>
-              <w:pStyle w:val="Compact"/>
-              <w:spacing w:line="240" w:lineRule="auto" w:after="0"/>
-              <w:jc w:val="right"/>
-            </w:pPr>
-            <w:r>
-              <w:rPr>
-                <w:sz w:val="17"/>
-              </w:rPr>
-              <w:t xml:space="preserve">22.5</w:t>
-            </w:r>
-          </w:p>
-        </w:tc>
-        <w:tc>
-          <w:tcPr>
-            <w:tcW w:w="788" w:type="dxa"/>
-          </w:tcPr>
-          <w:p>
-            <w:pPr>
-              <w:pStyle w:val="Compact"/>
-              <w:spacing w:line="240" w:lineRule="auto" w:after="0"/>
-              <w:jc w:val="right"/>
-            </w:pPr>
-            <w:r>
-              <w:rPr>
-                <w:sz w:val="17"/>
-              </w:rPr>
-              <w:t xml:space="preserve">22.5</w:t>
-            </w:r>
-          </w:p>
-        </w:tc>
-      </w:tr>
-      <w:tr>
-        <w:tc>
-          <w:tcPr>
-            <w:tcW w:w="2761" w:type="dxa"/>
-          </w:tcPr>
-          <w:p>
-            <w:pPr>
-              <w:pStyle w:val="Compact"/>
-              <w:spacing w:line="240" w:lineRule="auto" w:after="0"/>
-              <w:jc w:val="left"/>
-            </w:pPr>
-            <w:r>
-              <w:rPr>
-                <w:sz w:val="17"/>
-              </w:rPr>
-              <w:t xml:space="preserve">Residential bot</w:t>
-            </w:r>
-          </w:p>
-        </w:tc>
-        <w:tc>
-          <w:tcPr>
-            <w:tcW w:w="920" w:type="dxa"/>
-          </w:tcPr>
-          <w:p>
-            <w:pPr>
-              <w:pStyle w:val="Compact"/>
-              <w:spacing w:line="240" w:lineRule="auto" w:after="0"/>
-              <w:jc w:val="right"/>
-            </w:pPr>
-            <w:r>
-              <w:rPr>
-                <w:sz w:val="17"/>
-              </w:rPr>
-              <w:t xml:space="preserve">37.2</w:t>
-            </w:r>
-          </w:p>
-        </w:tc>
-        <w:tc>
-          <w:tcPr>
-            <w:tcW w:w="920" w:type="dxa"/>
-          </w:tcPr>
-          <w:p>
-            <w:pPr>
-              <w:pStyle w:val="Compact"/>
-              <w:spacing w:line="240" w:lineRule="auto" w:after="0"/>
-              <w:jc w:val="right"/>
-            </w:pPr>
-            <w:r>
-              <w:rPr>
-                <w:sz w:val="17"/>
-              </w:rPr>
-              <w:t xml:space="preserve">37.2</w:t>
-            </w:r>
-          </w:p>
-        </w:tc>
-        <w:tc>
-          <w:tcPr>
-            <w:tcW w:w="1051" w:type="dxa"/>
-          </w:tcPr>
-          <w:p>
-            <w:pPr>
-              <w:pStyle w:val="Compact"/>
-              <w:spacing w:line="240" w:lineRule="auto" w:after="0"/>
-              <w:jc w:val="right"/>
-            </w:pPr>
-            <w:r>
-              <w:rPr>
-                <w:sz w:val="17"/>
-              </w:rPr>
-              <w:t xml:space="preserve">37.2</w:t>
-            </w:r>
-          </w:p>
-        </w:tc>
-        <w:tc>
-          <w:tcPr>
-            <w:tcW w:w="788" w:type="dxa"/>
-          </w:tcPr>
-          <w:p>
-            <w:pPr>
-              <w:pStyle w:val="Compact"/>
-              <w:spacing w:line="240" w:lineRule="auto" w:after="0"/>
-              <w:jc w:val="right"/>
-            </w:pPr>
-            <w:r>
-              <w:rPr>
-                <w:sz w:val="17"/>
-              </w:rPr>
-              <w:t xml:space="preserve">37.2</w:t>
-            </w:r>
-          </w:p>
-        </w:tc>
-        <w:tc>
-          <w:tcPr>
-            <w:tcW w:w="920" w:type="dxa"/>
-          </w:tcPr>
-          <w:p>
-            <w:pPr>
-              <w:pStyle w:val="Compact"/>
-              <w:spacing w:line="240" w:lineRule="auto" w:after="0"/>
-              <w:jc w:val="right"/>
-            </w:pPr>
-            <w:r>
-              <w:rPr>
-                <w:sz w:val="17"/>
-              </w:rPr>
-              <w:t xml:space="preserve">37.2</w:t>
-            </w:r>
-          </w:p>
-        </w:tc>
-        <w:tc>
-          <w:tcPr>
-            <w:tcW w:w="920" w:type="dxa"/>
-          </w:tcPr>
-          <w:p>
-            <w:pPr>
-              <w:pStyle w:val="Compact"/>
-              <w:spacing w:line="240" w:lineRule="auto" w:after="0"/>
-              <w:jc w:val="right"/>
-            </w:pPr>
-            <w:r>
-              <w:rPr>
-                <w:sz w:val="17"/>
-              </w:rPr>
-              <w:t xml:space="preserve">37.2</w:t>
-            </w:r>
-          </w:p>
-        </w:tc>
-        <w:tc>
-          <w:tcPr>
-            <w:tcW w:w="788" w:type="dxa"/>
-          </w:tcPr>
-          <w:p>
-            <w:pPr>
-              <w:pStyle w:val="Compact"/>
-              <w:spacing w:line="240" w:lineRule="auto" w:after="0"/>
-              <w:jc w:val="right"/>
-            </w:pPr>
-            <w:r>
-              <w:rPr>
-                <w:sz w:val="17"/>
-              </w:rPr>
-              <w:t xml:space="preserve">37.2</w:t>
-            </w:r>
-          </w:p>
-        </w:tc>
-      </w:tr>
-      <w:tr>
-        <w:tc>
-          <w:tcPr>
-            <w:tcW w:w="2761" w:type="dxa"/>
-          </w:tcPr>
-          <w:p>
-            <w:pPr>
-              <w:pStyle w:val="Compact"/>
-              <w:spacing w:line="240" w:lineRule="auto" w:after="0"/>
-              <w:jc w:val="left"/>
-            </w:pPr>
-            <w:r>
-              <w:rPr>
-                <w:sz w:val="17"/>
-              </w:rPr>
-              <w:t xml:space="preserve">Farmed CAPTCHA</w:t>
-            </w:r>
-          </w:p>
-        </w:tc>
-        <w:tc>
-          <w:tcPr>
-            <w:tcW w:w="920" w:type="dxa"/>
-          </w:tcPr>
-          <w:p>
-            <w:pPr>
-              <w:pStyle w:val="Compact"/>
-              <w:spacing w:line="240" w:lineRule="auto" w:after="0"/>
-              <w:jc w:val="right"/>
-            </w:pPr>
-            <w:r>
-              <w:rPr>
-                <w:sz w:val="17"/>
-              </w:rPr>
-              <w:t xml:space="preserve">99.5</w:t>
-            </w:r>
-          </w:p>
-        </w:tc>
-        <w:tc>
-          <w:tcPr>
-            <w:tcW w:w="920" w:type="dxa"/>
-          </w:tcPr>
-          <w:p>
-            <w:pPr>
-              <w:pStyle w:val="Compact"/>
-              <w:spacing w:line="240" w:lineRule="auto" w:after="0"/>
-              <w:jc w:val="right"/>
-            </w:pPr>
-            <w:r>
-              <w:rPr>
-                <w:sz w:val="17"/>
-              </w:rPr>
-              <w:t xml:space="preserve">99.5</w:t>
-            </w:r>
-          </w:p>
-        </w:tc>
-        <w:tc>
-          <w:tcPr>
-            <w:tcW w:w="1051" w:type="dxa"/>
-          </w:tcPr>
-          <w:p>
-            <w:pPr>
-              <w:pStyle w:val="Compact"/>
-              <w:spacing w:line="240" w:lineRule="auto" w:after="0"/>
-              <w:jc w:val="right"/>
-            </w:pPr>
-            <w:r>
-              <w:rPr>
-                <w:sz w:val="17"/>
-              </w:rPr>
-              <w:t xml:space="preserve">99.5</w:t>
-            </w:r>
-          </w:p>
-        </w:tc>
-        <w:tc>
-          <w:tcPr>
-            <w:tcW w:w="788" w:type="dxa"/>
-          </w:tcPr>
-          <w:p>
-            <w:pPr>
-              <w:pStyle w:val="Compact"/>
-              <w:spacing w:line="240" w:lineRule="auto" w:after="0"/>
-              <w:jc w:val="right"/>
-            </w:pPr>
-            <w:r>
-              <w:rPr>
-                <w:sz w:val="17"/>
-              </w:rPr>
-              <w:t xml:space="preserve">99.5</w:t>
-            </w:r>
-          </w:p>
-        </w:tc>
-        <w:tc>
-          <w:tcPr>
-            <w:tcW w:w="920" w:type="dxa"/>
-          </w:tcPr>
-          <w:p>
-            <w:pPr>
-              <w:pStyle w:val="Compact"/>
-              <w:spacing w:line="240" w:lineRule="auto" w:after="0"/>
-              <w:jc w:val="right"/>
-            </w:pPr>
-            <w:r>
-              <w:rPr>
-                <w:sz w:val="17"/>
-              </w:rPr>
-              <w:t xml:space="preserve">99.5</w:t>
-            </w:r>
-          </w:p>
-        </w:tc>
-        <w:tc>
-          <w:tcPr>
-            <w:tcW w:w="920" w:type="dxa"/>
-          </w:tcPr>
-          <w:p>
-            <w:pPr>
-              <w:pStyle w:val="Compact"/>
-              <w:spacing w:line="240" w:lineRule="auto" w:after="0"/>
-              <w:jc w:val="right"/>
-            </w:pPr>
-            <w:r>
-              <w:rPr>
-                <w:sz w:val="17"/>
-              </w:rPr>
-              <w:t xml:space="preserve">99.5</w:t>
-            </w:r>
-          </w:p>
-        </w:tc>
-        <w:tc>
-          <w:tcPr>
-            <w:tcW w:w="788" w:type="dxa"/>
-          </w:tcPr>
-          <w:p>
-            <w:pPr>
-              <w:pStyle w:val="Compact"/>
-              <w:spacing w:line="240" w:lineRule="auto" w:after="0"/>
-              <w:jc w:val="right"/>
-            </w:pPr>
-            <w:r>
-              <w:rPr>
-                <w:sz w:val="17"/>
-              </w:rPr>
-              <w:t xml:space="preserve">99.5</w:t>
-            </w:r>
-          </w:p>
-        </w:tc>
-      </w:tr>
-      <w:tr>
-        <w:tc>
-          <w:tcPr>
-            <w:tcW w:w="2761" w:type="dxa"/>
-          </w:tcPr>
-          <w:p>
-            <w:pPr>
-              <w:pStyle w:val="Compact"/>
-              <w:spacing w:line="240" w:lineRule="auto" w:after="0"/>
-              <w:jc w:val="left"/>
-            </w:pPr>
-            <w:r>
-              <w:rPr>
-                <w:sz w:val="17"/>
-              </w:rPr>
-              <w:t xml:space="preserve">Aged fingerprints</w:t>
-            </w:r>
-          </w:p>
-        </w:tc>
-        <w:tc>
-          <w:tcPr>
-            <w:tcW w:w="920" w:type="dxa"/>
-          </w:tcPr>
-          <w:p>
-            <w:pPr>
-              <w:pStyle w:val="Compact"/>
-              <w:spacing w:line="240" w:lineRule="auto" w:after="0"/>
-              <w:jc w:val="right"/>
-            </w:pPr>
-            <w:r>
-              <w:rPr>
-                <w:sz w:val="17"/>
-              </w:rPr>
-              <w:t xml:space="preserve">99.5</w:t>
-            </w:r>
-          </w:p>
-        </w:tc>
-        <w:tc>
-          <w:tcPr>
-            <w:tcW w:w="920" w:type="dxa"/>
-          </w:tcPr>
-          <w:p>
-            <w:pPr>
-              <w:pStyle w:val="Compact"/>
-              <w:spacing w:line="240" w:lineRule="auto" w:after="0"/>
-              <w:jc w:val="right"/>
-            </w:pPr>
-            <w:r>
-              <w:rPr>
-                <w:sz w:val="17"/>
-              </w:rPr>
-              <w:t xml:space="preserve">99.5</w:t>
-            </w:r>
-          </w:p>
-        </w:tc>
-        <w:tc>
-          <w:tcPr>
-            <w:tcW w:w="1051" w:type="dxa"/>
-          </w:tcPr>
-          <w:p>
-            <w:pPr>
-              <w:pStyle w:val="Compact"/>
-              <w:spacing w:line="240" w:lineRule="auto" w:after="0"/>
-              <w:jc w:val="right"/>
-            </w:pPr>
-            <w:r>
-              <w:rPr>
-                <w:sz w:val="17"/>
-              </w:rPr>
-              <w:t xml:space="preserve">99.5</w:t>
-            </w:r>
-          </w:p>
-        </w:tc>
-        <w:tc>
-          <w:tcPr>
-            <w:tcW w:w="788" w:type="dxa"/>
-          </w:tcPr>
-          <w:p>
-            <w:pPr>
-              <w:pStyle w:val="Compact"/>
-              <w:spacing w:line="240" w:lineRule="auto" w:after="0"/>
-              <w:jc w:val="right"/>
-            </w:pPr>
-            <w:r>
-              <w:rPr>
-                <w:sz w:val="17"/>
-              </w:rPr>
-              <w:t xml:space="preserve">99.5</w:t>
-            </w:r>
-          </w:p>
-        </w:tc>
-        <w:tc>
-          <w:tcPr>
-            <w:tcW w:w="920" w:type="dxa"/>
-          </w:tcPr>
-          <w:p>
-            <w:pPr>
-              <w:pStyle w:val="Compact"/>
-              <w:spacing w:line="240" w:lineRule="auto" w:after="0"/>
-              <w:jc w:val="right"/>
-            </w:pPr>
-            <w:r>
-              <w:rPr>
-                <w:sz w:val="17"/>
-              </w:rPr>
-              <w:t xml:space="preserve">99.5</w:t>
-            </w:r>
-          </w:p>
-        </w:tc>
-        <w:tc>
-          <w:tcPr>
-            <w:tcW w:w="920" w:type="dxa"/>
-          </w:tcPr>
-          <w:p>
-            <w:pPr>
-              <w:pStyle w:val="Compact"/>
-              <w:spacing w:line="240" w:lineRule="auto" w:after="0"/>
-              <w:jc w:val="right"/>
-            </w:pPr>
-            <w:r>
-              <w:rPr>
-                <w:sz w:val="17"/>
-              </w:rPr>
-              <w:t xml:space="preserve">99.5</w:t>
-            </w:r>
-          </w:p>
-        </w:tc>
-        <w:tc>
-          <w:tcPr>
-            <w:tcW w:w="788" w:type="dxa"/>
-          </w:tcPr>
-          <w:p>
-            <w:pPr>
-              <w:pStyle w:val="Compact"/>
-              <w:spacing w:line="240" w:lineRule="auto" w:after="0"/>
-              <w:jc w:val="right"/>
-            </w:pPr>
-            <w:r>
-              <w:rPr>
-                <w:sz w:val="17"/>
-              </w:rPr>
-              <w:t xml:space="preserve">99.5</w:t>
-            </w:r>
-          </w:p>
-        </w:tc>
-      </w:tr>
-      <w:tr>
-        <w:tc>
-          <w:tcPr>
-            <w:tcW w:w="2761" w:type="dxa"/>
-            <w:tcBorders>
-              <w:bottom w:val="single" w:sz="8" w:color="000000"/>
-            </w:tcBorders>
-          </w:tcPr>
-          <w:p>
-            <w:pPr>
-              <w:pStyle w:val="Compact"/>
-              <w:spacing w:line="240" w:lineRule="auto" w:after="0"/>
-              <w:jc w:val="left"/>
-            </w:pPr>
-            <w:r>
-              <w:rPr>
-                <w:sz w:val="17"/>
-              </w:rPr>
-              <w:t xml:space="preserve">Forged header</w:t>
-            </w:r>
-          </w:p>
-        </w:tc>
-        <w:tc>
-          <w:tcPr>
-            <w:tcW w:w="920" w:type="dxa"/>
-            <w:tcBorders>
-              <w:bottom w:val="single" w:sz="8" w:color="000000"/>
-            </w:tcBorders>
-          </w:tcPr>
-          <w:p>
-            <w:pPr>
-              <w:pStyle w:val="Compact"/>
-              <w:spacing w:line="240" w:lineRule="auto" w:after="0"/>
-              <w:jc w:val="right"/>
-            </w:pPr>
-            <w:r>
-              <w:rPr>
-                <w:sz w:val="17"/>
-              </w:rPr>
-              <w:t xml:space="preserve">100.0</w:t>
-            </w:r>
-          </w:p>
-        </w:tc>
-        <w:tc>
-          <w:tcPr>
-            <w:tcW w:w="920" w:type="dxa"/>
-            <w:tcBorders>
-              <w:bottom w:val="single" w:sz="8" w:color="000000"/>
-            </w:tcBorders>
-          </w:tcPr>
-          <w:p>
-            <w:pPr>
-              <w:pStyle w:val="Compact"/>
-              <w:spacing w:line="240" w:lineRule="auto" w:after="0"/>
-              <w:jc w:val="right"/>
-            </w:pPr>
-            <w:r>
-              <w:rPr>
-                <w:sz w:val="17"/>
-              </w:rPr>
-              <w:t xml:space="preserve">99.5</w:t>
-            </w:r>
-          </w:p>
-        </w:tc>
-        <w:tc>
-          <w:tcPr>
-            <w:tcW w:w="1051" w:type="dxa"/>
-            <w:tcBorders>
-              <w:bottom w:val="single" w:sz="8" w:color="000000"/>
-            </w:tcBorders>
-          </w:tcPr>
-          <w:p>
-            <w:pPr>
-              <w:pStyle w:val="Compact"/>
-              <w:spacing w:line="240" w:lineRule="auto" w:after="0"/>
-              <w:jc w:val="right"/>
-            </w:pPr>
-            <w:r>
-              <w:rPr>
-                <w:sz w:val="17"/>
-              </w:rPr>
-              <w:t xml:space="preserve">99.5</w:t>
-            </w:r>
-          </w:p>
-        </w:tc>
-        <w:tc>
-          <w:tcPr>
-            <w:tcW w:w="788" w:type="dxa"/>
-            <w:tcBorders>
-              <w:bottom w:val="single" w:sz="8" w:color="000000"/>
-            </w:tcBorders>
-          </w:tcPr>
-          <w:p>
-            <w:pPr>
-              <w:pStyle w:val="Compact"/>
-              <w:spacing w:line="240" w:lineRule="auto" w:after="0"/>
-              <w:jc w:val="right"/>
-            </w:pPr>
-            <w:r>
-              <w:rPr>
-                <w:sz w:val="17"/>
-              </w:rPr>
-              <w:t xml:space="preserve">99.5</w:t>
-            </w:r>
-          </w:p>
-        </w:tc>
-        <w:tc>
-          <w:tcPr>
-            <w:tcW w:w="920" w:type="dxa"/>
-            <w:tcBorders>
-              <w:bottom w:val="single" w:sz="8" w:color="000000"/>
-            </w:tcBorders>
-          </w:tcPr>
-          <w:p>
-            <w:pPr>
-              <w:pStyle w:val="Compact"/>
-              <w:spacing w:line="240" w:lineRule="auto" w:after="0"/>
-              <w:jc w:val="right"/>
-            </w:pPr>
-            <w:r>
-              <w:rPr>
-                <w:sz w:val="17"/>
-              </w:rPr>
-              <w:t xml:space="preserve">99.5</w:t>
-            </w:r>
-          </w:p>
-        </w:tc>
-        <w:tc>
-          <w:tcPr>
-            <w:tcW w:w="920" w:type="dxa"/>
-            <w:tcBorders>
-              <w:bottom w:val="single" w:sz="8" w:color="000000"/>
-            </w:tcBorders>
-          </w:tcPr>
-          <w:p>
-            <w:pPr>
-              <w:pStyle w:val="Compact"/>
-              <w:spacing w:line="240" w:lineRule="auto" w:after="0"/>
-              <w:jc w:val="right"/>
-            </w:pPr>
-            <w:r>
-              <w:rPr>
-                <w:sz w:val="17"/>
-              </w:rPr>
-              <w:t xml:space="preserve">99.5</w:t>
-            </w:r>
-          </w:p>
-        </w:tc>
-        <w:tc>
-          <w:tcPr>
-            <w:tcW w:w="788" w:type="dxa"/>
-            <w:tcBorders>
-              <w:bottom w:val="single" w:sz="8" w:color="000000"/>
-            </w:tcBorders>
-          </w:tcPr>
-          <w:p>
-            <w:pPr>
-              <w:pStyle w:val="Compact"/>
-              <w:spacing w:line="240" w:lineRule="auto" w:after="0"/>
-              <w:jc w:val="right"/>
-            </w:pPr>
-            <w:r>
-              <w:rPr>
-                <w:sz w:val="17"/>
-              </w:rPr>
-              <w:t xml:space="preserve">99.5</w:t>
-            </w:r>
-          </w:p>
-        </w:tc>
-      </w:tr>
-    </w:tbl>
+        <w:t xml:space="preserve">In the scripted workloads, carriers that verify with human-like delay, fake receipts or know the thresholds defeated our outcome tests but not a short-window counter: within an hour of a verdict the counter’s allowance, unlike the tests’, grows with the windows an attack spans, while over longer campaigns verdicts expire and the tests leak again. Equation (5) summarizes this for pumpers that solve no challenge and hold no exemption; its inputs are in an operator’s logs, whereas the cost of an excess send, competition under attack and exemption abuse come only from the simulation. Supplementary Table S1 sets the seven designs of Section IV against the nine source-side attackers on the same traffic and seeds, with source caps lifted so that only the behavioral layers act; each design adds one thing to the baseline, and its differences from the v1 and v2 columns of Table 3 say what it bought. Correcting the platform header alone changed only the forged-header attack, from 100% to 99.5%, because that attacker is the farm with a header. Sessions and a hard budget removed the single client’s leakage (5.6% to 0.3%) and cut the premium pumper’s from 99.4% to 94.9%. A refusing counter of five sends per block a day held the premium pumper and the walked numbers, the two attacks that concentrate on a few blocks, to 1%. The behavioral layers of v2 removed datacenter rotation (69% to 0) and most of the reused profile (99.5% to 22.5%), and the two block tests differ only on the walked numbers (11.5% against 13.3%). No design separates the residential bot (37.2%) or the farm (99.5%); those are held only by the adaptive caps of Table 3, at the price Section V-D reports. On the destination, against the never-verifying pumper v1 leaked 570 messages, the default tests 90 and the selected counter 24, and under the shared-block pumper of Table 6 the counter leaked 403 where the default tests leaked 1 149 and no policy 5 509, neither policy costing all users anything on average.</w:t>
+      </w:r>
+    </w:p>
     <w:p>
       <w:pPr>
         <w:pStyle w:val="BodyText"/>

</xml_diff>

<commit_message>
Trim Section V: estimate bookkeeping, selection checks, poisoner, timing statistics
About 540 words of supporting detail removed from the results; the scripted adaptations with
caps lifted join the E3 sentence in V-F and V-H becomes Economics and overhead. No number quoted
elsewhere in the manuscript changes; the removed detail stays in results/. Word version rebuilt.

Co-Authored-By: Claude Fable 5.1 <noreply@anthropic.com>
Claude-Session: https://claude.ai/code/session_01RjWdFzUgYk6Hwie2YbnvyG
</commit_message>
<xml_diff>
--- a/paper/main.docx
+++ b/paper/main.docx
@@ -1858,7 +1858,7 @@
         <w:pStyle w:val="BodyText"/>
       </w:pPr>
       <w:r>
-        <w:t xml:space="preserve">We designed the pipeline so that no message is paid for before every check passes, and cheap checks run first. Trust comes from evidence the client cannot forge, an attestation, a server-signed session, and the fate of earlier codes, though such evidence can be manufactured (Section V-H).</w:t>
+        <w:t xml:space="preserve">We designed the pipeline so that no message is paid for before every check passes, and cheap checks run first. Trust comes from evidence the client cannot forge, an attestation, a server-signed session, and the fate of earlier codes, though such evidence can be manufactured (Section V-F).</w:t>
       </w:r>
     </w:p>
     <w:p>
@@ -7549,7 +7549,7 @@
         <w:pStyle w:val="BodyText"/>
       </w:pPr>
       <w:r>
-        <w:t xml:space="preserve">Across 18 spread configurations, leakage follows the blocks touched: with 30 blocks, five to seven runs in ten are still contained. Unsaturated, Equation (2) errs by 1.6 to 7.9 messages per run (1%–13%, ten configurations); saturated, it overstates by up to 91.</w:t>
+        <w:t xml:space="preserve">Across 18 spread configurations, leakage follows the blocks touched: with 30 blocks, five to seven runs in ten are still contained.</w:t>
       </w:r>
     </w:p>
     <w:bookmarkEnd w:id="74"/>
@@ -8787,7 +8787,7 @@
         <w:t xml:space="preserve">results/ figure1_key.md</w:t>
       </w:r>
       <w:r>
-        <w:t xml:space="preserve">. Paired per seed against the default tests, the selected counter leaked 66 [47, 89] fewer messages against the never-verifying carrier, 428 [340, 515] fewer against the human-like one and 58 [39, 79] fewer against the challenge buyer, and 6 [3, 7] more against the instant verifier; the sequential setting selected at the tuning target leaked 327 [241, 408] fewer against the human-like carrier and 2 to 7 fewer against the other three; the daily counter leaked 44 [3, 84] fewer against the human-like carrier and 229 to 391 more against the rest. The sequential setting selected at the tuning target holds the human-like carrier to 126 messages only by raising 334 false verdict events a day, and misses the target by 0.18 points on seeds 0–9. The graded counter of four sends per block per ten minutes leaks 24 against each outcome-reading carrier and 48 against the challenge buyer, at 0.06 points; counters selected at the sparser settings leak 6 to 18 at 0.15 to 0.35 points (up to 0.43 at 80%). With the full grid and density-specific attacks (E5) the rule selects the same counters, and so do other objectives on the tuning runs (worst-case leakage, a first-time-loss constraint, each attacker alone, 2 000 random mixes), except the instant verifier alone and 3 mixes at 200 blocks; on fresh seeds the counter leaked least of the winners against every attacker but the instant verifier (25, against 15 and 16). On seeds 300–309 the 1 000-block counter falls 0.12 points below its target, yet no seed-and-conversion cell fails the paired check (the evaluation default minus 0.5 points).</w:t>
+        <w:t xml:space="preserve">. Paired per seed against the default tests, the selected counter leaked 66 [47, 89] fewer messages against the never-verifying carrier, 428 [340, 515] fewer against the human-like one and 58 [39, 79] fewer against the challenge buyer, and 6 [3, 7] more against the instant verifier; the sequential setting selected at the tuning target leaked 327 [241, 408] fewer against the human-like carrier and 2 to 7 fewer against the other three; the daily counter leaked 44 [3, 84] fewer against the human-like carrier and 229 to 391 more against the rest. The sequential setting selected at the tuning target holds the human-like carrier to 126 messages only by raising 334 false verdict events a day, and misses the target by 0.18 points on seeds 0–9. The graded counter of four sends per block per ten minutes leaks 24 against each outcome-reading carrier and 48 against the challenge buyer, at 0.06 points; counters selected at the sparser settings leak 6 to 18 at 0.15 to 0.35 points (up to 0.43 at 80%). The selection is not an artifact of the objective: with the full grid and density-specific attacks (E5), and under other objectives on the tuning runs (worst-case leakage, a first-time-loss constraint, each attacker alone, 2 000 random mixes), the rule selects the same counters, except for the instant verifier alone and 3 of the mixes at 200 blocks.</w:t>
       </w:r>
     </w:p>
     <w:p>
@@ -10958,7 +10958,7 @@
         <w:t xml:space="preserve">c</w:t>
       </w:r>
       <w:r>
-        <w:t xml:space="preserve">0 leaked 858 at an extra harm to all users of 2.55 [2.04, 3.07] points (3.20 for first-time users), the default tests 1 357 at 1.09 [0.59, 1.59], the counter and tests together 1 286 at 1.43 [0.88, 1.97], and the counter alone 1 662 at 0.72 [0.44, 1.02]. A token bucket with a burst of 4 spared the poisoner’s users (0.12 points) only by letting 1 877 messages through, and one with a burst of 12 let through all but two; with two untuned settings, neither limiter dominated, and we ranked only the implemented policies. Returning users, all simulated with verified history, lost nothing.</w:t>
+        <w:t xml:space="preserve">0 leaked 858 at an extra harm to all users of 2.55 [2.04, 3.07] points, the default tests 1 357 at 1.09 [0.59, 1.59] and the counter 1 662 at 0.72 [0.44, 1.02], and the token buckets spared the poisoner’s users only by letting almost everything through. Returning users, all simulated with verified history, lost nothing.</w:t>
       </w:r>
     </w:p>
     <w:bookmarkEnd w:id="76"/>
@@ -10976,7 +10976,7 @@
         <w:pStyle w:val="FirstParagraph"/>
       </w:pPr>
       <w:r>
-        <w:t xml:space="preserve">Figures 6–8 show the counter’s operating boundary (E4, seeds 300–304). In each, a point is the mean over five seeds and its error bar the 95% interval, lines join the sampled settings without locating a crossover, and the horizontal axis is logarithmic. Figure 6 plots the attributable loss of the three hot blocks’ users, in points of completion, against the legitimate rate on those blocks, from one half to eight sends per block per ten minutes, with 70% of users reachable on WhatsApp; the hollow markers are attack-free runs, the filled ones have a never-verifying pumper on the same blocks, and the dotted vertical line is the counter’s quota of four sends per ten minutes. Attack-free, the counter costs a block’s users nothing at one send per ten minutes, 2.3 points at four and 5.5 at eight, far below the idealized share beyond the quota (27% at four), since most challenged users complete or switch to WhatsApp; without WhatsApp, eight sends cost 13.2. A 30-minute launch at three times the normal rate costs its blocks’ users 16 points. With a pumper on the same blocks, both policies turn that cost into a gain at up to four sends per ten minutes (the counter 6 to 15 points, the tests 1 to 10), because without a policy the pumper exhausts those blocks and the hourly budget; at eight sends, both cost their users again, the counter 4 points and the tests 9.</w:t>
+        <w:t xml:space="preserve">Figures 6–8 show the counter’s operating boundary (E4, seeds 300–304): each point is a mean over five seeds with its 95% interval, lines join the sampled settings without locating a crossover, and the horizontal axes are logarithmic. Figure 6 plots the attributable loss of the three hot blocks’ users, in points of completion, against the legitimate rate on those blocks, from one half to eight sends per block per ten minutes, with 70% of users reachable on WhatsApp, attack-free (hollow markers) and with a never-verifying pumper on the same blocks (filled); the dotted line is the counter’s quota of four. Attack-free, the counter costs a block’s users nothing at one send per ten minutes, 2.3 points at four and 5.5 at eight, far below the idealized share beyond the quota (27% at four), since most challenged users complete or switch to WhatsApp; without WhatsApp, eight sends cost 13.2, and a 30-minute launch at three times the normal rate costs 16. With a pumper on the same blocks, both policies turn that cost into a gain at up to four sends per ten minutes (the counter 6 to 15 points, the tests 1 to 10), because without a policy the pumper exhausts those blocks and the hourly budget; at eight sends, both cost their users again, the counter 4 points and the tests 9.</w:t>
       </w:r>
     </w:p>
     <w:p>
@@ -11049,7 +11049,7 @@
         <w:pStyle w:val="BodyText"/>
       </w:pPr>
       <w:r>
-        <w:t xml:space="preserve">Figures 7 and 8 plot the messages a pumper got through against the number of blocks it spread over, 3 to 300, on logarithmic axes. Figure 7 covers a 20-minute attack under no policy, the default tests and the selected counter, for a pumper at full rate (solid lines) and for one paced to the counter’s quota (dashed); a paced pumper leaks under no policy what it leaks under the counter, to within two messages, so that line is not drawn. At full rate the counter leaked 25 and 81 messages on 3 and 10 blocks where the tests leaked 110 and 144, the two leaked about the same on 30 blocks (235 against 242), and from 100 blocks on both approached the no-policy line of about 700. Paced to the quota, the pumper leaked under the counter about what the quota allows and what it would leak with no policy, 24 messages on three blocks in twenty minutes and 71 in an hour, and a little less under the tests, 23 on three blocks and 509 against 579 on 100.</w:t>
+        <w:t xml:space="preserve">Figures 7 and 8 plot the messages a pumper got through against the number of blocks it spread over, 3 to 300. Figure 7 covers a 20-minute attack under no policy, the default tests and the selected counter, for a pumper at full rate (solid lines) and one paced to the counter’s quota (dashed). At full rate the counter leaked 25 and 81 messages on 3 and 10 blocks where the tests leaked 110 and 144, the two leaked about the same on 30 blocks (235 against 242), and from 100 blocks on both approached the no-policy line of about 700. Paced to the quota, the pumper leaked under the counter what the quota allows, which is what it leaks with no policy (24 messages on three blocks in twenty minutes, 71 in an hour), and a little less under the tests (23).</w:t>
       </w:r>
     </w:p>
     <w:p>
@@ -11122,7 +11122,7 @@
         <w:pStyle w:val="BodyText"/>
       </w:pPr>
       <w:r>
-        <w:t xml:space="preserve">Figure 8 sets the hour-long attack at full rate against the estimates of Section III-G, computed from each run’s offered requests, offered rate and the configured timeouts, nothing fitted: Equation (2) for the tests and Equations (3) and (4) for the counter’s cold- and warm-start bounds, drawn with hollow markers on dotted lines (the 20-minute estimates are in</w:t>
+        <w:t xml:space="preserve">Figure 8 sets the hour-long attack at full rate against the estimates of Section III-G, computed from each run’s offered requests, offered rate and the configured timeouts, nothing fitted: Equation (2) for the tests and Equations (3) and (4) for the counter’s cold- and warm-start bounds, drawn hollow on dotted lines (the 20-minute estimates are in</w:t>
       </w:r>
       <w:r>
         <w:t xml:space="preserve"> </w:t>
@@ -11154,7 +11154,7 @@
         </m:r>
       </m:oMath>
       <w:r>
-        <w:t xml:space="preserve">), and the counter 71, 240 and 679 against its cold-start bound of 72, 240 and 720. Once 7 messages sent, exempt, to real users’ trusted numbers are set aside, no counter run that started cold (44 of 100) exceeded Equation (3); three warm ones did, by 5 or 6 messages, and none exceeded Equation (4). With these unfitted inputs Equation (5) ordered the policies’ mean leakage in 18 of 18 decisive cells (two ties at</w:t>
+        <w:t xml:space="preserve">), and the counter 71, 240 and 679 against its cold-start bound of 72, 240 and 720; setting aside the exempt sends to real users’ trusted numbers, no run that started cold exceeded Equation (3) and none exceeded Equation (4). With these unfitted inputs Equation (5) ordered the policies’ mean leakage in 18 of 18 decisive cells (two ties at</w:t>
       </w:r>
       <w:r>
         <w:t xml:space="preserve"> </w:t>
@@ -11165,7 +11165,7 @@
         </m:r>
       </m:oMath>
       <w:r>
-        <w:t xml:space="preserve">), and with the warm-start term in 17, missing where the estimates differ by 0.8 messages (30 blocks, 20 minutes; measured difference 6.6 [−27.2, 42.4]); per seed, 76 of 78 decisive comparisons agree. The algebraic crossing lies near five blocks for an hour and 30 for twenty minutes, where the nearest measured differences (three and 30 blocks) do not exclude zero; it is not a measured switching point.</w:t>
+        <w:t xml:space="preserve">), and with the warm-start term in 17, missing where the two estimates differ by 0.8 messages (30 blocks, 20 minutes; measured difference 6.6 [−27.2, 42.4]). The algebraic crossing lies near five blocks for an hour and 30 for twenty minutes, where the nearest measured differences do not exclude zero; it is not a measured switching point.</w:t>
       </w:r>
     </w:p>
     <w:p>
@@ -11238,7 +11238,7 @@
         <w:pStyle w:val="BodyText"/>
       </w:pPr>
       <w:r>
-        <w:t xml:space="preserve">Against adaptive attackers (E3), the counter held the threshold-aware carrier, receipt faker, and concentrated trust builder to 24 to 36 messages (502 to 665 under the default), but not trust builders on random numbers (577, as under the default); over 360 minutes, the human-like carrier gained 81 messages an hour under the counter, and 753 under the default.</w:t>
+        <w:t xml:space="preserve">Against adaptive attackers (E3), the counter held the threshold-aware carrier, receipt faker, and concentrated trust builder to 24 to 36 messages (502 to 665 under the default), but not trust builders on random numbers (577, as under the default); over 360 minutes, the human-like carrier gained 81 messages an hour under the counter, and 753 under the default. With caps lifted and no counter, a threshold-aware carrier and a receipt faker leak 570 each, drawing no verdict, and a datacenter attacker buying every challenge solution 55; the leakages of these scripted adaptations are not bounds.</w:t>
       </w:r>
     </w:p>
     <w:bookmarkEnd w:id="86"/>
@@ -11265,17 +11265,17 @@
         <w:pStyle w:val="BodyText"/>
       </w:pPr>
       <w:r>
-        <w:t xml:space="preserve">A poisoner flooding for 20 min the 20 blocks legitimate users concentrate on (caps lifted, ten seeds) raises 16 verdict events meeting 98 legitimate requests, 33 never completing; against observe-only operation on the same trace, enforcement costs 12.7 [4.6, 22.9] completions, 3.1% of users (6.3% without WhatsApp; 23.9% with a 24-hour denylist). One that stops after ten minutes leaves verdicts meeting 406.5 requests afterwards, an attributable loss of 46.2 [16.9, 79.8]. Grading limits the harm; it caps it neither at the challenge nor at the attack’s duration.</w:t>
+        <w:t xml:space="preserve">A poisoner flooding for 20 min the 20 blocks legitimate users concentrate on (caps lifted, ten seeds) raises 16 verdict events meeting 98 legitimate requests, 33 never completing; against observe-only operation on the same trace, enforcement costs 12.7 [4.6, 22.9] completions, 3.1% of users. One that stops after ten minutes leaves verdicts meeting 406.5 requests afterwards, an attributable loss of 46.2 [16.9, 79.8]. Grading limits the harm; it caps it neither at the challenge nor at the attack’s duration.</w:t>
       </w:r>
     </w:p>
     <w:bookmarkEnd w:id="88"/>
-    <w:bookmarkStart w:id="89" w:name="h.-adaptation-economics-and-overhead"/>
+    <w:bookmarkStart w:id="89" w:name="h.-economics-and-overhead"/>
     <w:p>
       <w:pPr>
         <w:pStyle w:val="Heading2"/>
       </w:pPr>
       <w:r>
-        <w:t xml:space="preserve">H. ADAPTATION, ECONOMICS AND OVERHEAD</w:t>
+        <w:t xml:space="preserve">H. ECONOMICS AND OVERHEAD</w:t>
       </w:r>
     </w:p>
     <w:p>
@@ -11283,43 +11283,7 @@
         <w:pStyle w:val="FirstParagraph"/>
       </w:pPr>
       <w:r>
-        <w:t xml:space="preserve">The leakages of these scripted adaptations are not bounds. Against v2 with caps lifted, a datacenter attacker buying every challenge solution leaks 55, and a threshold-aware carrier and a receipt faker leak 570 each, drawing no verdict.</w:t>
-      </w:r>
-    </w:p>
-    <w:p>
-      <w:pPr>
-        <w:pStyle w:val="BodyText"/>
-      </w:pPr>
-      <w:r>
-        <w:t xml:space="preserve">If pumpers earn a share of the 0.1422 USD retail price and pay an event-level bill, they break even at a share of 0.043 under v1 and 0.054 to 0.271 under v2 (the instant verifier 1.310); over 360 minutes under the counter, the human-like carrier needs 1.048. These are break-even shares for scripted attackers under assumed prices, not bounds or criminal profit.</w:t>
-      </w:r>
-    </w:p>
-    <w:p>
-      <w:pPr>
-        <w:pStyle w:val="BodyText"/>
-      </w:pPr>
-      <w:r>
-        <w:t xml:space="preserve">On a real Redis (four vCPUs, four workers), we measured sends at 13.8 ms (median) and 21.1 ms (99th percentile), and 133 requests per second passed at concurrency 128 with the 400 ms floor and 50 ms vendor calls. With fast vendors, response times distinguished no pair of five outcome classes (smallest Kolmogorov–Smirnov</w:t>
-      </w:r>
-      <w:r>
-        <w:t xml:space="preserve"> </w:t>
-      </w:r>
-      <m:oMath>
-        <m:r>
-          <m:t>p</m:t>
-        </m:r>
-        <m:r>
-          <m:rPr>
-            <m:sty m:val="p"/>
-          </m:rPr>
-          <m:t>=</m:t>
-        </m:r>
-        <m:r>
-          <m:t>0.051</m:t>
-        </m:r>
-      </m:oMath>
-      <w:r>
-        <w:t xml:space="preserve">). Under an adversarial mixture, 81% of sends overran the floor, and response-time thresholds separated sends from refusals with 88% balanced accuracy on the fitted run and, fitted on a new run, 95 to 99.9% on two others: a separation on that machine, not a deployment accuracy.</w:t>
+        <w:t xml:space="preserve">If pumpers earn a share of the 0.1422 USD retail price and pay an event-level bill, they break even at a share of 0.043 under v1 and 0.054 to 0.271 under v2 (the instant verifier 1.310); over 360 minutes under the counter, the human-like carrier needs 1.048. These are break-even shares for scripted attackers under assumed prices, not bounds or criminal profit. On a real Redis (four vCPUs, four workers), sends took 13.8 ms (median) and 21.1 ms (99th percentile), and 133 requests per second passed at concurrency 128 with the 400 ms floor and 50 ms vendor calls; under an adversarial mixture, 81% of sends overran the floor and response-time thresholds separated sends from refusals with 88% balanced accuracy, a separation on that machine, not a deployment accuracy.</w:t>
       </w:r>
     </w:p>
     <w:bookmarkEnd w:id="89"/>

</xml_diff>

<commit_message>
Bring the manuscript to 16 pages: smaller drawings, inline intervals in Table 6, overlap removed
Figures 1-5 at 0.72-0.82 of the text width; Table 2 in the smaller table size; Table 6 prints each
interval beside its mean (ci2 in scripts/paper_tables.py); about 450 words of overlap removed from
the Introduction, Sections II-B, II-C, III-C, III-D and the Discussion. No number quoted elsewhere
changes. Word version rebuilt.

Co-Authored-By: Claude Fable 5.1 <noreply@anthropic.com>
Claude-Session: https://claude.ai/code/session_01RjWdFzUgYk6Hwie2YbnvyG
</commit_message>
<xml_diff>
--- a/paper/main.docx
+++ b/paper/main.docx
@@ -197,7 +197,7 @@
         <w:pStyle w:val="BodyText"/>
       </w:pPr>
       <w:r>
-        <w:t xml:space="preserve">The two closest studies therefore each act on one destination signal, and neither measures what acting on it costs. Huh et al. [4] report that about 92% of attack requests fell on prefixes with zero conversion, against 21% for genuine traffic, so whether codes are entered is informative; but the signal enters a classifier that needs labeled traffic and was not released because it is deployed. Zaliskyi and Odarchenko [8] act on send counts alone, without outcomes, and conclude that counts by themselves cannot safely separate inflated traffic from a campaign. Neither reports what a destination policy costs the legitimate users who share a number block with the attacker, neither reports its cost when there is no attack, and neither fixed the setting it would select before seeing the evaluation traffic.</w:t>
+        <w:t xml:space="preserve">The two closest studies therefore each act on one destination signal, and neither measures what acting on it costs. Huh et al. [4] report that about 92% of attack requests fell on prefixes with zero conversion, against 21% for genuine traffic, so whether codes are entered is informative; but the signal enters a classifier that needs labeled traffic and was not released because it is deployed. Zaliskyi and Odarchenko [8] act on send counts alone, without outcomes, and conclude that counts by themselves cannot safely separate inflated traffic from a campaign. Neither reports what a destination policy costs the legitimate users who share a number block with the attacker, with or without an attack, and neither fixed its setting before seeing the evaluation traffic.</w:t>
       </w:r>
     </w:p>
     <w:bookmarkStart w:id="20" w:name="a.-problem-statement"/>
@@ -431,7 +431,7 @@
         <w:pStyle w:val="FirstParagraph"/>
       </w:pPr>
       <w:r>
-        <w:t xml:space="preserve">Huh et al. [4] trained gradient-boosted trees on 9.4 million SMS authentication logs from nineteen countries, reaching 89.6% recall at 0.19% false positives on web traffic and 91.1% at 0.11% on app traffic. The logs came unlabeled from one large service over three months of 2023; the authors labeled attacks inside traffic peaks, as web identities with four or more requests and no successful validation in a day, or app number-and-device pairs never validated, and treated requests outside peaks as genuine. Two models, with 18 and 13 features at three levels (the request, the identity’s history, and country-wide aggregates over 24 hours), run per request before the message is sent. Approximately 73% of web attacks sent four or fewer requests per identity a day, defeating per-entity limits, and destination signals were the strongest: about 92% zero conversion for attacks against 21% for genuine traffic, and 91% of app attacks fell on prefixes with more than 30 distinct numbers in a day against 0.01% of genuine requests. The same data show the counter-move: in three countries, about 82% of attack requests validated their codes, which the authors attribute to attackers avoiding conversion-rate rules. Their detector requires labeled traffic and acts per request; the cost to legitimate users is reported as false positives only, and the model was not released because it is deployed. Their data show that destination aggregation is informative; we add a controlled comparison of two label-free ways to act on it per block, from send counts or code outcomes, and of their cost to users sharing a block. We did not reproduce theirs, so we do not rank the two.</w:t>
+        <w:t xml:space="preserve">Huh et al. [4] trained gradient-boosted trees on 9.4 million SMS authentication logs from nineteen countries, reaching 89.6% recall at 0.19% false positives on web traffic and 91.1% at 0.11% on app traffic. The logs came unlabeled from one large service over three months of 2023; the authors labeled attacks inside traffic peaks, as web identities with four or more requests and no successful validation in a day, or app number-and-device pairs never validated, and treated requests outside peaks as genuine. Two models with 18 and 13 features at three levels (the request, the identity’s history, and country-wide aggregates over 24 hours) run per request before the message is sent. About 73% of web attacks sent four or fewer requests per identity a day, defeating per-entity limits, and destination signals were the strongest: about 92% zero conversion for attacks against 21% for genuine traffic, and 91% of app attacks fell on prefixes with more than 30 distinct numbers in a day against 0.01% of genuine requests. The same data show the counter-move: in three countries about 82% of attack requests validated their codes, which the authors attribute to attackers avoiding conversion-rate rules. The detector needs labeled traffic and acts per request, reports its cost to users as false positives only, and was not released because it is deployed. We add a controlled comparison of two label-free ways to act on destination aggregation per block, from send counts or code outcomes, and of their cost to users sharing a block; we did not reproduce theirs, so we do not rank the two.</w:t>
       </w:r>
     </w:p>
     <w:p>
@@ -439,7 +439,7 @@
         <w:pStyle w:val="BodyText"/>
       </w:pPr>
       <w:r>
-        <w:t xml:space="preserve">Zaliskyi and Odarchenko [8] count A2P sends per prefix (a number less its last three digits) in fixed or rolling five-minute windows and quarantine a prefix for 24 hours past a day or night threshold. On metadata of two confirmed incidents fixed windows blocked 95% and 63% of the traffic, and 58% of a legitimate marketing campaign; counting unique recipients blocked 2% of the campaign and none of the first incident. The authors conclude that message counts alone cannot safely separate inflated traffic from a campaign; they do not use verification outcomes. Theirs is a send counter judged on real traffic by messages blocked; ours compares a counter with outcome tests at a service target, in simulation, by what users sharing a block lose; the numbers are not comparable.</w:t>
+        <w:t xml:space="preserve">Zaliskyi and Odarchenko [8] count A2P sends per prefix (a number less its last three digits) in fixed or rolling five-minute windows and quarantine a prefix for 24 hours past a day or night threshold. On metadata of two confirmed incidents fixed windows blocked 95% and 63% of the traffic, and 58% of a legitimate marketing campaign; counting unique recipients blocked 2% of the campaign and none of the first incident. The authors conclude that message counts alone cannot safely separate inflated traffic from a campaign; they do not use verification outcomes. Their numbers, messages blocked on real traffic, are not comparable with ours, which come from simulation and charge a policy with what users sharing a block lose.</w:t>
       </w:r>
     </w:p>
     <w:p>
@@ -447,7 +447,7 @@
         <w:pStyle w:val="BodyText"/>
       </w:pPr>
       <w:r>
-        <w:t xml:space="preserve">The messaging vendors act one hop later. Twilio’s Fraud Guard analyzes an account’s historical traffic and blocks sends to a destination prefix or country whose pattern departs from it, with three protection levels and claimed false-positive rates under 1% and 2% [6]; its SMS Pumping Risk Score rates a number from 0 to 100 from Fraud Guard, risky carriers, traffic patterns and low conversion, and advises friction from 60 and refusal above 90 [7]. Graded destination action is therefore established practice, but the signals and models are undisclosed, so we benchmarked no product.</w:t>
+        <w:t xml:space="preserve">The messaging vendors act one hop later. Twilio’s Fraud Guard blocks sends to a destination prefix or country whose pattern departs from the account’s history, at three protection levels with claimed false-positive rates under 1% and 2% [6]; its SMS Pumping Risk Score rates a number from 0 to 100 from Fraud Guard, risky carriers, traffic patterns and low conversion, advising friction from 60 and refusal above 90 [7]. Graded destination action is established practice, but the signals and models are undisclosed, so we benchmarked no product.</w:t>
       </w:r>
     </w:p>
     <w:p>
@@ -455,7 +455,7 @@
         <w:pStyle w:val="BodyText"/>
       </w:pPr>
       <w:r>
-        <w:t xml:space="preserve">Taken together, these works establish that attacks concentrate on destination prefixes and avoid converting, that counts alone misfire on campaigns, and that some campaigns now enter codes to pass conversion rules. None of them compares counting with outcome testing on the same traffic, fixes its setting before the evaluation runs, or charges a policy with the registrations it costs the users of a shared block. Those are the questions of Sections V-E–V-G, and we modeled the attackers that enter codes, fake receipts and build trust (Table 2) on the counter-move above.</w:t>
+        <w:t xml:space="preserve">These works establish that attacks concentrate on destination prefixes and avoid converting, that counts alone misfire on campaigns, and that some campaigns now enter codes to pass conversion rules; we modeled the attackers that enter codes, fake receipts and build trust (Table 2) on that counter-move.</w:t>
       </w:r>
     </w:p>
     <w:bookmarkEnd w:id="28"/>
@@ -473,7 +473,7 @@
         <w:pStyle w:val="FirstParagraph"/>
       </w:pPr>
       <w:r>
-        <w:t xml:space="preserve">What a source-side control costs an attacker has been measured. Motoyama et al. [12] bought CAPTCHA solutions from eight retail services at $1 to $20 per thousand, found that the wage for solving had fallen from $10 per thousand in 2007 to about a dollar by 2009, and measured a median response of 14 seconds at error rates of 10% to 20%; human labor had displaced automated solvers, and the authors conclude that a CAPTCHA limits access to attackers whose business is profitable despite that cost rather than keeping machines out. Dionysiou and Athanasopoulos [14] classify the machine-learning solvers that have since appeared. Addresses have a market too: Mi et al. [10] infiltrated five residential proxy providers and observed 6,183,876 addresses in 238 countries and 52,905 ISPs, 95% of them residential, 90% relaying for under 870 seconds and 2.2% on any blacklist; Richter et al. [11] found carrier-grade NAT in more than 90% of cellular networks, with 64 subscribers behind one address where each receives a thousand ports, and conclude that address reputation and blacklisting become</w:t>
+        <w:t xml:space="preserve">What a source-side control costs an attacker has been measured. Motoyama et al. [12] bought CAPTCHA solutions from eight retail services at $1 to $20 per thousand, found that the wage for solving had fallen from $10 per thousand in 2007 to about a dollar by 2009, and conclude that a CAPTCHA limits access to attackers whose business is profitable despite that cost rather than keeping machines out. Dionysiou and Athanasopoulos [14] classify the machine-learning solvers that have since appeared. Addresses have a market too: Mi et al. [10] infiltrated five residential proxy providers and observed 6.2 million addresses in 238 countries, 95% of them residential, 90% relaying for under 870 seconds and 2.2% on any blacklist; Richter et al. [11] found carrier-grade NAT in more than 90% of cellular networks, with dozens of subscribers behind one address, and conclude that address reputation and blacklisting become</w:t>
       </w:r>
       <w:r>
         <w:t xml:space="preserve"> </w:t>
@@ -1785,7 +1785,7 @@
         <w:pStyle w:val="FirstParagraph"/>
       </w:pPr>
       <w:r>
-        <w:t xml:space="preserve">Figure 3 shows the implementation as deployed. An HTTP API, run on any number of instances, offers the client five public endpoints: an attestation challenge and an enrolment, a session endpoint where a reCAPTCHA token or an attestation buys a signed session, the request endpoint, which runs the pipeline and returns one uniform body, and the verify endpoint, which takes the code; two internal endpoints, behind a service credential, take the vendor’s delivery receipts and drive the timeouts. Behind the API sit the two procedures of Algorithm 2: the pipeline, which runs Steps 0–11 on each request, and the feedback loop, which applies each transition of a send (delivered, verified, failed, undelivered) as one compare-and-set. All state lives in one store, Redis in production and an in-memory twin with the same rules in the tests and the simulator: the sessions, every limit and reservation, the SMS history, the reputation counts, the block statistics and counters, the denylist, the adaptive multipliers and the operating mode. What the loop writes, the next request reads, which is how the outcome of one send changes the judgment of the next, and why any instance can verify any code. One worker per deployment ticks every minute to resolve the sends that timed out and to run the baseline job that sets the multipliers of Step 9 from the pipeline’s own counters. Every external dependency, attestation, reCAPTCHA, address intelligence, the HLR lookup, the SMS vendor and the downgrade channels, sits behind an adapter with an in-memory fake, and a deployment reports which adapters are fake so that production can refuse to start with any. The simulation of Section IV runs the pipeline, the feedback loop, the worker’s two jobs and the in-memory store as drawn, without the HTTP layer, replaces the external services with their fakes, and in the main study hands the baseline job the modeled legitimate rate instead of letting it learn it (Section V-D runs the learning job).</w:t>
+        <w:t xml:space="preserve">Figure 3 shows the implementation as deployed. An HTTP API, run on any number of instances, offers the client five public endpoints: an attestation challenge and an enrolment, a session endpoint where a reCAPTCHA token or an attestation buys a signed session, the request endpoint, which runs the pipeline and returns one uniform body, and the verify endpoint, which takes the code; two internal endpoints, behind a service credential, take the vendor’s delivery receipts and drive the timeouts. Behind the API sit the two procedures of Algorithm 2: the pipeline, which runs Steps 0–11 on each request, and the feedback loop, which applies each transition of a send as one compare-and-set. All state lives in one store, Redis in production and an in-memory twin with the same rules in the tests and the simulator, so what the loop writes the next request reads, which is how the outcome of one send changes the judgment of the next, and any instance can verify any code. One worker per deployment ticks every minute to resolve the sends that timed out and to run the baseline job that sets the multipliers of Step 9 from the pipeline’s own counters. Every external dependency sits behind an adapter with an in-memory fake, and a deployment reports which adapters are fake so that production can refuse to start with any. The simulation of Section IV runs the pipeline, the feedback loop, the worker’s two jobs and the in-memory store as drawn, without the HTTP layer, replaces the external services with their fakes, and in the main study hands the baseline job the modeled legitimate rate instead of letting it learn it (Section V-D runs the learning job).</w:t>
       </w:r>
     </w:p>
     <w:p>
@@ -1866,7 +1866,7 @@
         <w:pStyle w:val="BodyText"/>
       </w:pPr>
       <w:r>
-        <w:t xml:space="preserve">A request passes the twelve steps of Figure 4 in order until one refuses it. The figure numbers its stages in reading order: its stages 1 to 4 are Steps 0 to 4 of the text and of Algorithm 2, with Steps 3 and 4 drawn as one stage, the web checks; from stage 5 on the two numberings coincide; and stage 12 is the feedback loop. The letters below are the gaps of Section III-A that each step closes. Step 0 establishes the platform from an App Attest or Play Integrity result and refuses proxy addresses (A). Step 1 binds the request to a server-signed session with a fingerprint and a replay nonce, three requests per session per ten minutes (B). Step 2 throttles the address, its /24 and its autonomous system, with lower caps for hosting networks (B, F). Steps 3 and 4, for web requests only, check the reCAPTCHA score and the origin. Step 5 prices and checks the number before anything is paid for: its country and cost class, sequential or narrow-range bursts, liveness through an HLR lookup, and the verdict stage of its block, with the bulk flag now needing an internal credential (C, D, G). Step 6 validates the body and the exclusion list, the test flag needing a credential too (G). Step 7 computes the risk score of Equation (1) and chooses one of five tiers (H). Step 8 applies a per-number backoff, sixty seconds doubling to an hour and five sends a day. Step 9 takes the source caps per source, platform and country, multiplied by the adaptive factor. Step 10 sets the operating mode from the hourly budget, elevated above 80% and emergency at 100% (E). Step 11 reserves the hourly count, the spend and any destination slot in one atomic operation, writes the state and enqueues the message (E, H). A refusal at any step returns one uniform reply, and every send resolves through the feedback loop, whose per-key and per-block outcomes are what the next request is judged on.</w:t>
+        <w:t xml:space="preserve">A request passes the twelve steps of Figure 4 in order until one refuses it. The figure numbers its stages in reading order: stages 1 to 4 are Steps 0 to 4, with Steps 3 and 4 drawn as one stage, the web checks; from stage 5 on the numberings coincide, and stage 12 is the feedback loop. The letters below are the gaps of Section III-A that each step closes. Step 0 establishes the platform from an App Attest or Play Integrity result and refuses proxy addresses (A). Step 1 binds the request to a server-signed session with a fingerprint and a replay nonce, three requests per session per ten minutes (B). Step 2 throttles the address, its /24 and its autonomous system, with lower caps for hosting networks (B, F). Steps 3 and 4, for web requests only, check the reCAPTCHA score and the origin. Step 5 prices and checks the number before anything is paid for: its country and cost class, sequential or narrow-range bursts, liveness through an HLR lookup, and the verdict stage of its block, with the bulk flag now needing an internal credential (C, D, G). Step 6 validates the body and the exclusion list, the test flag needing a credential too (G). Step 7 computes the risk score of Equation (1) and chooses one of five tiers (H). Step 8 applies a per-number backoff, sixty seconds doubling to an hour and five sends a day. Step 9 takes the source caps per source, platform and country, multiplied by the adaptive factor. Step 10 sets the operating mode from the hourly budget, elevated above 80% and emergency at 100% (E). Step 11 reserves the hourly count, the spend and any destination slot in one atomic operation, writes the state and enqueues the message (E, H). A refusal at any step returns one uniform reply, and every send resolves through the feedback loop, whose per-key and per-block outcomes are what the next request is judged on.</w:t>
       </w:r>
     </w:p>
     <w:p>
@@ -2109,7 +2109,7 @@
         <w:t xml:space="preserve"> </w:t>
       </w:r>
       <w:r>
-        <w:t xml:space="preserve">is the one uniform body. Read against Algorithm 1, the pipeline differs in four ways: the platform is established before anything else and from evidence, every limit is taken atomically and released on refusal, the number is priced and checked before it is paid for, and the outcome of each send flows back into the keys and the destination block that the next request will be judged on. Each limit and reservation is one atomic Redis operation, but the enclosing steps are not one transaction: on the normal path, a refused request returns its per-number claims and counter slot, and the hourly budget is reserved only for a message about to be enqueued, a reservation rather than a completed dispatch; a crash between them can leak reservations (Section IV). Address limits and source caps count requests, except that a request Step 11 challenges returns its source-cap count. Every outcome after Step 0, except the challenge, returns one HTTP 200 body after at least 400 ms, a floor that cannot hide longer work.</w:t>
+        <w:t xml:space="preserve">is the one uniform body. Read against Algorithm 1, the pipeline differs in four ways: the platform is established before anything else and from evidence, every limit is taken atomically and released on refusal, the number is priced and checked before it is paid for, and the outcome of each send flows back into the keys and the destination block that the next request will be judged on. Each limit and reservation is one atomic operation, but the enclosing steps are not one transaction, and a crash between them can leak reservations (Section IV-A); address limits and source caps count requests, except that a request Step 11 challenges returns its source-cap count. Every outcome after Step 0, except the challenge, returns one HTTP 200 body after at least 400 ms, a floor that cannot hide longer work.</w:t>
       </w:r>
     </w:p>
     <w:p>
@@ -2983,7 +2983,7 @@
         <w:t xml:space="preserve"> </w:t>
       </w:r>
       <w:r>
-        <w:t xml:space="preserve">without a receipt in 60 s or with a failed receipt; only the first two count toward reputation. A positive receipt after a negative one reopens the send; a late verification reclassifies it, but an issued verdict stands. Each transition records its effects and its time in the same compare-and-set, and a recovery sweep completes the work of a dead process; each effect type applies at most once, and exactly once if the sweep runs within 20 minutes. Reputation counts land in the transition’s hour, and a block keeps its latest outage failure time; however, a block’s statistic accumulates in processing order, and a verdict is dated at the event that completes the crossing; thus, a late event can backdate a verdict that contains later evidence, moving its expiry and the next test’s start (by 10 min in one diagnostic). Simulated runs apply events in time order, but concurrent live instances may not, because a transition is committed before its effects apply; thus, the same dependence holds live unless a block’s effects are serialized.</w:t>
+        <w:t xml:space="preserve">without a receipt in 60 s or with a failed receipt; only the first two count toward reputation. A positive receipt after a negative one reopens the send; a late verification reclassifies it, but an issued verdict stands. Each transition records its effects and its time in the same compare-and-set, and a recovery sweep completes the work of a dead process; each effect type applies at most once, and exactly once if the sweep runs within 20 minutes. A block’s statistic accumulates in processing order and a verdict is dated at the event that completes the crossing, so a late event can backdate a verdict and move its expiry; simulated runs apply events in time order, but concurrent live instances may not, so the same dependence holds live unless a block’s effects are serialized.</w:t>
       </w:r>
     </w:p>
     <w:bookmarkEnd w:id="52"/>
@@ -11302,7 +11302,7 @@
         <w:pStyle w:val="FirstParagraph"/>
       </w:pPr>
       <w:r>
-        <w:t xml:space="preserve">In the scripted workloads, carriers that verify with human-like delay, fake receipts or know the thresholds defeated our outcome tests but not a short-window counter: within an hour of a verdict the counter’s allowance, unlike the tests’, grows with the windows an attack spans, while over longer campaigns verdicts expire and the tests leak again. Equation (5) summarizes this for pumpers that solve no challenge and hold no exemption; its inputs are in an operator’s logs, whereas the cost of an excess send, competition under attack and exemption abuse come only from the simulation. Supplementary Table S1 sets the seven designs of Section IV against the nine source-side attackers on the same traffic and seeds, with source caps lifted so that only the behavioral layers act; each design adds one thing to the baseline, and its differences from the v1 and v2 columns of Table 3 say what it bought. Correcting the platform header alone changed only the forged-header attack, from 100% to 99.5%, because that attacker is the farm with a header. Sessions and a hard budget removed the single client’s leakage (5.6% to 0.3%) and cut the premium pumper’s from 99.4% to 94.9%. A refusing counter of five sends per block a day held the premium pumper and the walked numbers, the two attacks that concentrate on a few blocks, to 1%. The behavioral layers of v2 removed datacenter rotation (69% to 0) and most of the reused profile (99.5% to 22.5%), and the two block tests differ only on the walked numbers (11.5% against 13.3%). No design separates the residential bot (37.2%) or the farm (99.5%); those are held only by the adaptive caps of Table 3, at the price Section V-D reports. On the destination, against the never-verifying pumper v1 leaked 570 messages, the default tests 90 and the selected counter 24, and under the shared-block pumper of Table 6 the counter leaked 403 where the default tests leaked 1 149 and no policy 5 509, neither policy costing all users anything on average.</w:t>
+        <w:t xml:space="preserve">In the scripted workloads, carriers that verify with human-like delay, fake receipts or know the thresholds defeated our outcome tests but not a short-window counter: within an hour of a verdict the counter’s allowance, unlike the tests’, grows with the windows an attack spans, while over longer campaigns verdicts expire and the tests leak again. Equation (5) summarizes this for pumpers that solve no challenge and hold no exemption; its inputs are in an operator’s logs, whereas the cost of an excess send, competition under attack and exemption abuse come only from the simulation. Supplementary Table S1 sets the seven designs of Section IV against the nine source-side attackers on the same traffic and seeds, with source caps lifted so that only the behavioral layers act; each design adds one thing to the baseline, and its differences from the v1 and v2 columns of Table 3 say what it bought. Correcting the platform header alone changed only the forged-header attack, from 100% to 99.5%, because that attacker is the farm with a header. The behavioral layers of v2 removed datacenter rotation (69% to 0) and most of the reused profile (99.5% to 22.5%), and the two block tests differ only on the walked numbers (11.5% against 13.3%). No design separates the residential bot (37.2%) or the farm (99.5%); those are held only by the adaptive caps of Table 3, at the price Section V-D reports. On the destination, against the never-verifying pumper v1 leaked 570 messages, the default tests 90 and the selected counter 24, and under the shared-block pumper of Table 6 the counter leaked 403 where the default tests leaked 1 149 and no policy 5 509, neither policy costing all users anything on average.</w:t>
       </w:r>
     </w:p>
     <w:p>

</xml_diff>

<commit_message>
Apply the author's copy-edit; introduction without subsections; Algorithm 2 in one column
Wording changes from the author's Word copy of revision 15 carried into main.tex (serial commas,
"approximately", past tense in method and results, acknowledgment and data availability); commas
as thousands separators throughout, including the table generator. Problem statement,
contributions and organization are paragraphs without headings, the contributions cite no
sections, II-D and II-E are merged, and Algorithm 2 is single-column with its long lines split.

Co-Authored-By: Claude Fable 5.1 <noreply@anthropic.com>
Claude-Session: https://claude.ai/code/session_01RjWdFzUgYk6Hwie2YbnvyG
</commit_message>
<xml_diff>
--- a/paper/main.docx
+++ b/paper/main.docx
@@ -98,7 +98,7 @@
           <w:sz w:val="22"/>
           <w:szCs w:val="22"/>
         </w:rPr>
-        <w:t xml:space="preserve">Services that verify a phone number by SMS expose an endpoint that must answer before any account exists. Attackers abuse it to waste the service’s messaging budget (flooding) or to steer paid messages to premium-rate ranges that share the termination fee with them (SMS pumping). Existing defenses limit the source, score requests with labeled traffic or block prefixes, but no controlled evidence says which destination signal a service should act on, sends per block or the fate of their codes, or what either costs the users who share a block with an attacker. We evaluate in simulation a twelve-step defense built on app attestation, signed sessions and verification outcomes, against a seven-control baseline, five simpler designs and 25 attacker profiles, and compare the two label-free destination policies, a short-window counter of sends per number block and sequential tests of code outcomes, under two protocols committed before their runs. Attacks with a signature in the request are contained at little cost to users; a residential attacker is only rationed. Against four concentrated 20-minute pumpers the counter leaked 6 to 48 messages at 0.06 to 0.43 points of completion, where the default tests leaked 19 to 452; on held-out seeds and workloads it met its leakage claims but failed its service claims on blocks real users share. Estimates from the rules alone ordered the two policies in 18 of 18 decisive cells. The results rest on simulated users and give operators a tested ordering of destination policies against short, concentrated pumping.</w:t>
+        <w:t xml:space="preserve">Services that verify a phone number by SMS expose an endpoint that must be answered before any account exists. Attackers abuse this to waste the service’s messaging budget (flooding) or to steer paid messages to premium-rate ranges that share the termination fee with them (SMS pumping). Existing defenses limit the source, score requests with labeled traffic or block prefixes, but no controlled evidence says which destination signal a service should act on, sends per block, or the fate of their codes, or what either costs the users who share a block with an attacker. We evaluate in simulation a twelve-step defense built on app attestation, signed sessions, and verification outcomes against a seven-control baseline, five simpler designs, and 25 attacker profiles, and compare the two label-free destination policies, a short-window counter of sends per number block, and sequential tests of code outcomes under two protocols committed before their runs. Attacks with a signature in the request are contained at a low cost to users; a residential attacker is only rationed. Against four concentrated 20-minute pumpers, the counter leaked 6 to 48 messages at 0.06 to 0.43 points of completion, where the default tests leaked 19 to 452; on held-out seeds and workloads, it met its leakage claims but failed its service claims on blocks real users share. Estimates from the rules alone ordered the two policies in 18 of 18 decisive cells. The results rest on simulated users and give operators a tested ordering of destination policies against short, concentrated pumping.</w:t>
       </w:r>
     </w:p>
     <w:p>
@@ -141,7 +141,7 @@
         <w:t xml:space="preserve">Artificially inflated traffic, fraud prevention, one-time password, rate limiting, sequential tests, SMS pumping.</w:t>
       </w:r>
     </w:p>
-    <w:bookmarkStart w:id="23" w:name="i.-introduction"/>
+    <w:bookmarkStart w:id="20" w:name="i.-introduction"/>
     <w:p>
       <w:pPr>
         <w:pStyle w:val="Heading1"/>
@@ -163,7 +163,7 @@
         <w:pStyle w:val="BodyText"/>
       </w:pPr>
       <w:r>
-        <w:t xml:space="preserve">Defenses act at three points on the path of a request. At the source, services limit requests per address, session and device, challenge them with CAPTCHAs, block known proxies and restrict destination countries, and risk-based authentication combines such signals into a score with graded responses [5]. At the messaging vendor, Twilio’s Fraud Guard blocks destination prefixes and countries whose traffic departs from an account’s history [6], and its per-number pumping risk score advises friction from 60 and refusal above 90 [7]. On a service’s own logs, Huh et al. [4] detect attack requests one at a time with gradient-boosted trees, at 89.6% recall and 0.19% false positives on web traffic, and Zaliskyi and Odarchenko [8] count application-to-person sends per number prefix in five-minute windows and quarantine a prefix that crosses a threshold.</w:t>
+        <w:t xml:space="preserve">Defenses act at three points on the path of a request. At the source, services limit requests per address, session, and device, challenge them with CAPTCHAs, block known proxies, restrict destination countries, and risk-based authentication combines such signals into a score with graded responses [5]. At the messaging vendor, Twilio’s Fraud Guard blocks destination prefixes and countries whose traffic departs from an account’s history [6], and its per-number pumping risk score advises friction from 60 and refusal above 90 [7]. On a service’s own logs, Huh et al. [4] detect attack requests one at a time with gradient-boosted trees, at 89.6% recall and 0.19% false positives on web traffic, and Zaliskyi and Odarchenko [8] count application-to-person sends per number prefix in five-minute windows and quarantine a prefix that crosses a threshold.</w:t>
       </w:r>
     </w:p>
     <w:p>
@@ -171,7 +171,7 @@
         <w:pStyle w:val="BodyText"/>
       </w:pPr>
       <w:r>
-        <w:t xml:space="preserve">Each of these rests on an assumption that the literature has tested and found wanting. Source-side limits assume that an identity is scarce; without a trusted authority, one entity can present as many identities as it likes [9]. Addresses are not scarce either: five residential proxy services relayed through 6.2 million addresses in 238 countries, 90% of them for under fifteen minutes each and 2.2% of them on any blacklist [10], and carrier-grade NAT, deployed in more than 90% of cellular networks, puts dozens of subscribers behind one address and makes address reputation</w:t>
+        <w:t xml:space="preserve">Each of these rests on an assumption that the literature has tested and found wanting. Source-side limits assume that an identity is scarce; without a trusted authority, one entity can present as many identities as it wants [9]. Addresses are not scarce either: five residential proxy services relayed through 6.2 million addresses in 238 countries, 90% of them for under 15 minutes each and 2.2% of them on any blacklist [10], and carrier-grade NAT, deployed in more than 90% of cellular networks, puts dozens of subscribers behind one address and makes address reputation</w:t>
       </w:r>
       <w:r>
         <w:t xml:space="preserve"> </w:t>
@@ -189,7 +189,7 @@
         <w:t xml:space="preserve"> </w:t>
       </w:r>
       <w:r>
-        <w:t xml:space="preserve">[11]. A CAPTCHA costs an attacker about a dollar per thousand solutions from a labor market that was already paying ten dollars per thousand in 2007 [12]. Supervised detection needs labels, which Huh et al. [4] derived from traffic peaks after the fact, and a decision taken per request can be probed one threshold at a time. Prefix counting acts on the one key a pumper cannot rotate away from, since it is paid only on its partner’s ranges, but the thresholds that stopped 95% and 63% of two incidents in the data of Zaliskyi and Odarchenko [8] also blocked 58% of a legitimate marketing campaign.</w:t>
+        <w:t xml:space="preserve">[11]. A CAPTCHA costs an attacker approximately a dollar per thousand solutions from a labor market that was already paying ten dollars per thousand in 2007 [12]. Supervised detection requires labels, which Huh et al. [4] derived from traffic peaks after the fact, and a decision taken per request can be probed one threshold at a time. Prefix counting acts on the one key a pumper cannot rotate away from, since it is paid only on its partner’s ranges, but the thresholds that stopped 95% and 63% of two incidents in the data of Zaliskyi and Odarchenko [8] also blocked 58% of a legitimate marketing campaign.</w:t>
       </w:r>
     </w:p>
     <w:p>
@@ -197,42 +197,23 @@
         <w:pStyle w:val="BodyText"/>
       </w:pPr>
       <w:r>
-        <w:t xml:space="preserve">The two closest studies therefore each act on one destination signal, and neither measures what acting on it costs. Huh et al. [4] report that about 92% of attack requests fell on prefixes with zero conversion, against 21% for genuine traffic, so whether codes are entered is informative; but the signal enters a classifier that needs labeled traffic and was not released because it is deployed. Zaliskyi and Odarchenko [8] act on send counts alone, without outcomes, and conclude that counts by themselves cannot safely separate inflated traffic from a campaign. Neither reports what a destination policy costs the legitimate users who share a number block with the attacker, with or without an attack, and neither fixed its setting before seeing the evaluation traffic.</w:t>
-      </w:r>
-    </w:p>
-    <w:bookmarkStart w:id="20" w:name="a.-problem-statement"/>
-    <w:p>
-      <w:pPr>
-        <w:pStyle w:val="Heading2"/>
-      </w:pPr>
-      <w:r>
-        <w:t xml:space="preserve">A. PROBLEM STATEMENT</w:t>
-      </w:r>
-    </w:p>
-    <w:p>
-      <w:pPr>
-        <w:pStyle w:val="FirstParagraph"/>
-      </w:pPr>
-      <w:r>
-        <w:t xml:space="preserve">A service that sees only its own traffic must decide, for every request, whether to pay for a message to a number it cannot verify, on behalf of a client that has no account yet. Source-side controls tax identities that are cheap to replace, supervised detection needs labels the service does not have when it decides, and the two destination signals it can compute without labels, the number of sends to a block and the fate of their codes, have never been compared on the same traffic with the cost to legitimate users made part of the result. The question we address therefore has three parts. On the source side, how much of the flooding that a seven-control baseline admits does a twelve-step redesign contain, at what cost in completed registrations, and through which layer? Where identities are cheap, when does reputation built from verification outcomes stop separating an attacker from the users whose keys it shares, and what does rationing then cost and depend on? On the destination, where a pumper is paid, does counting sends per number block or testing the outcomes of their codes leak less, under which conditions does the answer reverse, and what does either policy cost the legitimate users who share a block, with and without an attack?</w:t>
-      </w:r>
-    </w:p>
-    <w:bookmarkEnd w:id="20"/>
-    <w:bookmarkStart w:id="21" w:name="b.-contributions"/>
-    <w:p>
-      <w:pPr>
-        <w:pStyle w:val="Heading2"/>
-      </w:pPr>
-      <w:r>
-        <w:t xml:space="preserve">B. CONTRIBUTIONS</w:t>
-      </w:r>
-    </w:p>
-    <w:p>
-      <w:pPr>
-        <w:pStyle w:val="FirstParagraph"/>
-      </w:pPr>
-      <w:r>
-        <w:t xml:space="preserve">We answer these questions in simulation, inside a complete defense for a registration flow, and we release the implementation, the protocols and every run’s configuration and outcome [13]. Everything is simulated: three behavioral parameters have published counterparts and the rest are our assumptions. The main contributions of this article are summarized as follows.</w:t>
+        <w:t xml:space="preserve">Therefore, the two closest studies each act on one destination signal, and neither measures the cost of acting on it. Huh et al. [4] report that approximately 92% of attack requests fell on prefixes with zero conversion, against 21% for genuine traffic; thus, whether codes are entered is informative; however, the signal enters a classifier that requires labeled traffic and was not released because it is deployed. Zaliskyi and Odarchenko [8] act on send counts alone, without outcomes, and conclude that counts by themselves cannot safely separate inflated traffic from a campaign. Neither reports what a destination policy costs legitimate users who share a number block with an attacker, with or without an attack, and neither fixed its setting before seeing the evaluation traffic.</w:t>
+      </w:r>
+    </w:p>
+    <w:p>
+      <w:pPr>
+        <w:pStyle w:val="BodyText"/>
+      </w:pPr>
+      <w:r>
+        <w:t xml:space="preserve">A service that sees only its own traffic must decide, for every request, whether to pay for a message to a number it cannot verify, on behalf of a client that has no account yet. Source-side controls tax identities that are cheap to replace, supervised detection needs labels that the service does not have when it decides, and the two destination signals it can compute without labels, the number of sends to a block, and the fate of their codes, have never been compared on the same traffic with the cost to legitimate users made part of the result. The question we address therefore has three parts. On the source side, how much of the flooding that a seven-control baseline admits does a twelve-step redesign contain, at what cost in completed registrations, and through which layer? Where identities are cheap, when does reputation built from verification outcomes stop separating an attacker from the users whose keys it shares, and what does rationing then cost and depend on? On the destination, where a pumper is paid, does counting sends per number block or testing the outcomes of their codes leak less, under which conditions does the answer reverse, and what does either policy cost the legitimate users who share a block, with and without an attack?</w:t>
+      </w:r>
+    </w:p>
+    <w:p>
+      <w:pPr>
+        <w:pStyle w:val="BodyText"/>
+      </w:pPr>
+      <w:r>
+        <w:t xml:space="preserve">We answer these questions in simulation, inside a complete defense for a registration flow, and we release the implementation, protocols, and every run’s configuration and outcome [13]. Everything is simulated: three behavioral parameters have published counterparts, and the rest are our assumptions. The main contributions of this study are summarized as follows.</w:t>
       </w:r>
     </w:p>
     <w:p>
@@ -243,7 +224,7 @@
         </w:numPr>
       </w:pPr>
       <w:r>
-        <w:t xml:space="preserve">We show how an attacker breaks eight assumptions behind a seven-control baseline and close the gaps with a twelve-step pipeline whose trust comes from attestation, signed sessions and the fate of earlier codes (Section III), released as code with a regression test for every defect we found.</w:t>
+        <w:t xml:space="preserve">We show how an attacker breaks eight assumptions behind a seven-control baseline and close the gaps with a twelve-step pipeline whose trust comes from attestation, signed sessions, and the fate of earlier codes, released as code with a regression test for every defect we found.</w:t>
       </w:r>
     </w:p>
     <w:p>
@@ -254,7 +235,7 @@
         </w:numPr>
       </w:pPr>
       <w:r>
-        <w:t xml:space="preserve">We measure where reputation built from code outcomes stops separating a residential attacker from the users whose keys it shares, and what rationing it then costs (Sections V-C and V-D).</w:t>
+        <w:t xml:space="preserve">We measure where reputation built from code outcomes stops separating a residential attacker from the users whose keys it shares, and what rationing it then costs.</w:t>
       </w:r>
     </w:p>
     <w:p>
@@ -265,7 +246,7 @@
         </w:numPr>
       </w:pPr>
       <w:r>
-        <w:t xml:space="preserve">We compare a short-window counter of sends per number block with sequential tests of code outcomes, selected at a stated service target, frozen, and tested on held-out seeds and workloads, charging each policy with its leakage, its attack-free cost and its harm to the users who share a block with the attacker (Sections V-E–V-G).</w:t>
+        <w:t xml:space="preserve">We compare a short-window counter of sends per number block with sequential tests of code outcomes, selected at a stated service target, frozen, and tested on held-out seeds and workloads, charging each policy with its leakage, its attack-free cost, and its harm to the users who share a block with the attacker.</w:t>
       </w:r>
     </w:p>
     <w:p>
@@ -276,17 +257,7 @@
         </w:numPr>
       </w:pPr>
       <w:r>
-        <w:t xml:space="preserve">We derive from the rules alone when counting leaks less than testing, and check the estimates against measurements over attacks of up to an hour (Section III-G, Figure 8).</w:t>
-      </w:r>
-    </w:p>
-    <w:bookmarkEnd w:id="21"/>
-    <w:bookmarkStart w:id="22" w:name="c.-organization"/>
-    <w:p>
-      <w:pPr>
-        <w:pStyle w:val="Heading2"/>
-      </w:pPr>
-      <w:r>
-        <w:t xml:space="preserve">C. ORGANIZATION</w:t>
+        <w:t xml:space="preserve">We derive from the rules alone when counting leaks less than testing, and check the estimates against measurements over attacks of up to an hour.</w:t>
       </w:r>
     </w:p>
     <w:p>
@@ -294,12 +265,11 @@
         <w:pStyle w:val="FirstParagraph"/>
       </w:pPr>
       <w:r>
-        <w:t xml:space="preserve">The remainder of this article is organized as follows. Section II reviews the related work and states the gap. Section III gives the baseline and its gaps, the threat model, the design and its leakage estimates. Section IV describes the implementation, the simulator, the two protocols and the metrics. Section V reports the results. Section VI discusses them, sets the design against the benchmark designs and the nearest work, and states the limitations. Section VII concludes the article.</w:t>
-      </w:r>
-    </w:p>
-    <w:bookmarkEnd w:id="22"/>
-    <w:bookmarkEnd w:id="23"/>
-    <w:bookmarkStart w:id="33" w:name="ii.-related-work"/>
+        <w:t xml:space="preserve">The remainder of this article is organized as follows. Section II reviews the related work and states the gap. Section III presents the baseline and its gaps, the threat model, the design, and its leakage estimates. Section IV describes the implementation, the simulator, the two protocols, and the metrics. Section V presents the results. Section VI discusses them, sets the design against the benchmark designs and the nearest work, and states the limitations. Section VII concludes the article.</w:t>
+      </w:r>
+    </w:p>
+    <w:bookmarkEnd w:id="20"/>
+    <w:bookmarkStart w:id="29" w:name="ii.-related-work"/>
     <w:p>
       <w:pPr>
         <w:pStyle w:val="Heading1"/>
@@ -313,7 +283,7 @@
         <w:pStyle w:val="FirstParagraph"/>
       </w:pPr>
       <w:r>
-        <w:t xml:space="preserve">We group prior work by where it acts on the path of an OTP request, which Figure 1 draws. The attacker’s bots, working through a botnet or behind residential proxies, open the target website and ask it for a code; the website’s service endpoint receives each OTP request and decides whether to send; an SMS vendor routes the message; and a terminating operator delivers it, in a pumping attack to premium-rate numbers that a number provider has placed with that operator. Two flows run against the direction of the request. The outcome signal, whether the code was entered or not, returns from the website to the service endpoint, and it is what one of our two destination policies uses. The revenue-sharing line, drawn dashed, carries part of the termination fee from the operator through the provider of the premium-rate numbers back to the attacker, which is why the destination is the one key a pumper cannot change. The works we review sit at one of these points. At the client, the bots and the proxies, are the measurements of what an attacker can buy: residential proxy addresses [10], shared addresses behind carrier-grade NAT [11], CAPTCHA solutions [12], [14] and as many identities as it likes [9]. At the service are the controls an endpoint can run itself: per-entity limits, CAPTCHA, proxy and country lists (our v1 baseline, Section III-A), risk-based scoring of logins [5] and supervised per-request detection on labeled logs [4]; our twelve source-side steps and two destination policies act here too (Sections III-C–III-E). At the vendor are prefix and country blocking from an account’s history and a per-number pumping risk score [6], [7], and counts of sends per prefix in five-minute windows with a 24-hour quarantine [8]. At the operator and the number provider, where the money is made, are the revenue-share number ranges that providers advertise and share, and detection from call records and test-number intelligence [2], [15]. We close with the gap we address (Table 1).</w:t>
+        <w:t xml:space="preserve">We group prior work by where it acts on the path of an OTP request, which is shown in Figure 1. The attacker’s bots, working through a botnet or behind residential proxies, open the target website and ask it for a code; the website’s service endpoint receives each OTP request and decides whether to send; an SMS vendor routes the message; and a terminating operator delivers it, in a pumping attack to premium-rate numbers that a number provider has placed with that operator. Two flows run against the direction of the request. The outcome signal, whether the code was entered or not, returns from the website to the service endpoint, and it is what one of our two destination policies uses. The revenue-sharing line, drawn dashed, carries part of the termination fee from the operator through the provider of the premium-rate numbers back to the attacker, which is why the destination is the one key a pumper cannot change. The works we review sit at one of these points. At the client, the bots and proxies, are the measurements of what an attacker can buy: residential proxy addresses [10], shared addresses behind carrier-grade NAT [11], CAPTCHA solutions [12], [14], and as many identities as it likes [9]. At the service are the controls an endpoint can run itself: per-entity limits, CAPTCHA, proxy, and country lists (our v1 baseline, Section III-A), risk-based scoring of logins [5], and supervised per-request detection on labeled logs [4]; our twelve source-side steps and two destination policies act here too (Sections III-C–III-E). At the vendor are prefix and country blocking from an account’s history and a per-number pumping risk score [6], [7], and counts of sends per prefix in five-minute windows with a 24-hour quarantine [8]. At the operator and the number provider, where the money is made, are the revenue-share number ranges that providers advertise and share, and detection from call records and test-number intelligence [2], [15]. We close with the gap we address (Table 1).</w:t>
       </w:r>
     </w:p>
     <w:p>
@@ -325,18 +295,18 @@
           <wp:inline>
             <wp:extent cx="5334000" cy="2621345"/>
             <wp:effectExtent b="0" l="0" r="0" t="0"/>
-            <wp:docPr descr="" title="" id="25" name="Picture"/>
+            <wp:docPr descr="" title="" id="22" name="Picture"/>
             <a:graphic>
               <a:graphicData uri="http://schemas.openxmlformats.org/drawingml/2006/picture">
                 <pic:pic>
                   <pic:nvPicPr>
-                    <pic:cNvPr descr="figures/fig8_defense_path.png" id="26" name="Picture"/>
+                    <pic:cNvPr descr="figures/fig8_defense_path.png" id="23" name="Picture"/>
                     <pic:cNvPicPr>
                       <a:picLocks noChangeArrowheads="1" noChangeAspect="1"/>
                     </pic:cNvPicPr>
                   </pic:nvPicPr>
                   <pic:blipFill>
-                    <a:blip r:embed="rId24"/>
+                    <a:blip r:embed="rId21"/>
                     <a:stretch>
                       <a:fillRect/>
                     </a:stretch>
@@ -378,10 +348,10 @@
         <w:t xml:space="preserve"> </w:t>
       </w:r>
       <w:r>
-        <w:t xml:space="preserve">The path of an OTP request, and where the money goes.</w:t>
-      </w:r>
-    </w:p>
-    <w:bookmarkStart w:id="27" w:name="a.-revenue-share-fraud"/>
+        <w:t xml:space="preserve">The path of an OTP request and where the money goes.</w:t>
+      </w:r>
+    </w:p>
+    <w:bookmarkStart w:id="24" w:name="a.-revenue-share-fraud"/>
     <w:p>
       <w:pPr>
         <w:pStyle w:val="Heading2"/>
@@ -413,157 +383,147 @@
         <w:t xml:space="preserve"> </w:t>
       </w:r>
       <w:r>
-        <w:t xml:space="preserve">premium-rate numbers from websites that pay for traffic and generates calls to them; a transit operator short-stops the calls, keeps the termination fee and shares it with the fraudster. The taxonomy of Sahin et al. [2] sets the scheme among frauds that persist because call routing is opaque, each operator knowing only the next hop, and because operators are reluctant to share pricing, routes or fraud findings with competitors. Sahin and Francillon [15] then measured the market from the supply side, collecting 3,149,793 distinct test numbers that twelve such providers advertised between January 2016 and November 2019 across 238 destinations. The ranges are a managed asset: 80% of them were shared across providers, which subdivide a hijacked block among themselves, and 70% lay inside valid numbering plans. From this intelligence and from call histories, the authors built a random-forest detector for an operator’s call records that reached 98% accuracy at 0.28% false positives, where blocking the two-digit neighborhood of a known test number caught 63%. Both studies concern voice telephony, and the detector needs the test-number intelligence and the call histories of an operator. The lesson for SMS is that the number range, not the calling identity, is what the fraudster must keep, and that a party seeing only its own traffic detects the fraud late. An OTP endpoint is in a weaker position still: it holds neither intelligence nor call histories, only its own sends and whether their codes were entered. That is why the policies of Section III-E are keyed on the 8-digit block and use only those two quantities.</w:t>
+        <w:t xml:space="preserve">premium-rate numbers from websites that pay for traffic and generates calls to them; a transit operator short-stops the calls, keeps the termination fee, and shares it with the fraudster. The taxonomy of Sahin et al. [2] sets the scheme among frauds that persist because call routing is opaque, each operator knowing only the next hop, and because operators are reluctant to share pricing, routes, or fraud findings with competitors. Sahin and Francillon [15] then measured the market from the supply side, collecting 3,149,793 distinct test numbers that twelve such providers advertised between January 2016 and November 2019 across 238 destinations. The ranges are a managed asset: 80% of them were shared across providers, which subdivide a hijacked block among themselves, and 70% lay inside valid numbering plans. From this intelligence and from call histories, the authors built a random-forest detector for an operator’s call records that reached 98% accuracy at 0.28% false positives, where blocking the two-digit neighborhood of a known test number caught 63%. Both studies concern voice telephony, and the detector needs the test-number intelligence and the call histories of an operator. The lesson for SMS is that the number range, not the calling identity, is what the fraudster must keep, and that a party seeing only its own traffic detects the fraud late. An OTP endpoint is in a weaker position still: it holds neither intelligence nor call histories, only its own sends and whether their codes were entered. That is why the policies of Section III-E are keyed on the 8-digit block and use only those two quantities.</w:t>
+      </w:r>
+    </w:p>
+    <w:bookmarkEnd w:id="24"/>
+    <w:bookmarkStart w:id="25" w:name="b.-detecting-inflated-sms-traffic"/>
+    <w:p>
+      <w:pPr>
+        <w:pStyle w:val="Heading2"/>
+      </w:pPr>
+      <w:r>
+        <w:t xml:space="preserve">B. DETECTING INFLATED SMS TRAFFIC</w:t>
+      </w:r>
+    </w:p>
+    <w:p>
+      <w:pPr>
+        <w:pStyle w:val="FirstParagraph"/>
+      </w:pPr>
+      <w:r>
+        <w:t xml:space="preserve">Huh et al. [4] trained gradient-boosted trees on 9.4 million SMS authentication logs from nineteen countries, reaching 89.6% recall at 0.19% false positives on web traffic and 91.1% at 0.11% on app traffic. The logs came unlabeled from one large service over three months of 2023; the authors labeled attacks inside traffic peaks, as web identities with four or more requests and no successful validation in a day, or app number-and-device pairs never validated, and treated requests outside peaks as genuine. Two models with 18 and 13 features at three levels (the request, the identity’s history, and country-wide aggregates over 24 hours) run per request before the message is sent. About 73% of web attacks sent four or fewer requests per identity a day, defeating per-entity limits, and destination signals were the strongest: about 92% zero conversion for attacks against 21% for genuine traffic, and 91% of app attacks fell on prefixes with more than 30 distinct numbers in a day against 0.01% of genuine requests. The same data show the counter-move: in three countries about 82% of attack requests validated their codes, which the authors attribute to attackers avoiding conversion-rate rules. The detector needs labeled traffic and acts per request, reports its cost to users as false positives only, and was not released because it is deployed. We add a controlled comparison of two label-free ways to act on destination aggregation per block, from send counts or code outcomes, and of their cost to users sharing a block; we did not reproduce theirs, so we do not rank the two.</w:t>
+      </w:r>
+    </w:p>
+    <w:p>
+      <w:pPr>
+        <w:pStyle w:val="BodyText"/>
+      </w:pPr>
+      <w:r>
+        <w:t xml:space="preserve">Zaliskyi and Odarchenko [8] counted A2P sends per prefix (a number less its last three digits) in fixed or rolling five-minute windows and quarantined a prefix for 24 hours past a day or night threshold. On the metadata of two confirmed incidents, fixed windows blocked 95% and 63% of the traffic, and 58% of a legitimate marketing campaign; counting unique recipients blocked 2% of the campaign and none of the first incident. The authors concluded that message counts alone cannot safely separate inflated traffic from a campaign; they did not use verification outcomes. Their numbers, messages blocked on real traffic, are not comparable with ours, which come from simulation and charge a policy with what users sharing a block lose.</w:t>
+      </w:r>
+    </w:p>
+    <w:p>
+      <w:pPr>
+        <w:pStyle w:val="BodyText"/>
+      </w:pPr>
+      <w:r>
+        <w:t xml:space="preserve">The messaging vendors act one hop later. Twilio’s Fraud Guard blocks sends to a destination prefix or country whose pattern departs from the account’s history, at three protection levels with claimed false-positive rates under 1% and 2% [6]; its SMS Pumping Risk Score rates a number from 0 to 100 from Fraud Guard, risky carriers, traffic patterns and low conversion, advising friction from 60 and refusal above 90 [7]. Graded destination action is established practice, but the signals and models are undisclosed, so we benchmarked no product.</w:t>
+      </w:r>
+    </w:p>
+    <w:p>
+      <w:pPr>
+        <w:pStyle w:val="BodyText"/>
+      </w:pPr>
+      <w:r>
+        <w:t xml:space="preserve">These works establish that attacks concentrate on destination prefixes and avoid converting, that counts alone misfire on campaigns, and that some campaigns now enter codes to pass conversion rules; we modeled the attackers that enter codes, fake receipts, and build trust (Table 2) on that counter-move.</w:t>
+      </w:r>
+    </w:p>
+    <w:bookmarkEnd w:id="25"/>
+    <w:bookmarkStart w:id="26" w:name="c.-what-an-attacker-can-buy"/>
+    <w:p>
+      <w:pPr>
+        <w:pStyle w:val="Heading2"/>
+      </w:pPr>
+      <w:r>
+        <w:t xml:space="preserve">C. WHAT AN ATTACKER CAN BUY</w:t>
+      </w:r>
+    </w:p>
+    <w:p>
+      <w:pPr>
+        <w:pStyle w:val="FirstParagraph"/>
+      </w:pPr>
+      <w:r>
+        <w:t xml:space="preserve">The cost of a source-side control to an attacker has been measured. Motoyama et al. [12] bought CAPTCHA solutions from eight retail services at $1 to $20 per thousand, found that the wage for solving had fallen from $10 per thousand in 2007 to about a dollar by 2009, and conclude that a CAPTCHA limits access to attackers whose business is profitable despite that cost rather than keeping machines out. Dionysiou and Athanasopoulos [14] classify the machine-learning solvers that have since appeared. Addresses have a market too: Mi et al. [10] infiltrated five residential proxy providers and observed 6.2 million addresses in 238 countries, 95% of them residential, 90% relaying for under 870 seconds and 2.2% on any blacklist; Richter et al. [11] found carrier-grade NAT in more than 90% of cellular networks, with dozens of subscribers behind one address, and conclude that address reputation and blacklisting become</w:t>
+      </w:r>
+      <w:r>
+        <w:t xml:space="preserve"> </w:t>
+      </w:r>
+      <w:r>
+        <w:t xml:space="preserve">“</w:t>
+      </w:r>
+      <w:r>
+        <w:t xml:space="preserve">all but infeasible</w:t>
+      </w:r>
+      <w:r>
+        <w:t xml:space="preserve">”</w:t>
+      </w:r>
+      <w:r>
+        <w:t xml:space="preserve"> </w:t>
+      </w:r>
+      <w:r>
+        <w:t xml:space="preserve">there. Behind both markets lies the older observation of Douceur [9] that without a trusted authority one entity can present many identities, so a signed session provides continuity, not scarcity. Risk-based authentication, which Wiefling et al. [5] probed at eight large services, scores a login from its address, user agent, resolution, time, and similar features into risk buckets and asks for a further factor above a threshold; every service that showed such behavior used the address, and none disclosed its procedure. Step 7 of our design resembles it, but scores a request made before any account exists, so the account history that risk-based authentication relies on is absent. Client puzzles [16] would add a computational price per request; however, we did not evaluate them.</w:t>
+      </w:r>
+    </w:p>
+    <w:p>
+      <w:pPr>
+        <w:pStyle w:val="BodyText"/>
+      </w:pPr>
+      <w:r>
+        <w:t xml:space="preserve">These measurements indicate what an attacker can buy. For a defense, they imply that per-identity controls tax identity reset rather than prevent it, and that the question for a residential attacker is not whether it can be told from a person but what rationing it costs the people it resembles. Sections V-C and V-D measure that in this design.</w:t>
+      </w:r>
+    </w:p>
+    <w:bookmarkEnd w:id="26"/>
+    <w:bookmarkStart w:id="27" w:name="X0b5fa62a2180f31857614319d7afb4cbb0e64f3"/>
+    <w:p>
+      <w:pPr>
+        <w:pStyle w:val="Heading2"/>
+      </w:pPr>
+      <w:r>
+        <w:t xml:space="preserve">D. SEQUENTIAL TESTS AND ATTACKS ON THE DELIVERED CODE</w:t>
+      </w:r>
+    </w:p>
+    <w:p>
+      <w:pPr>
+        <w:pStyle w:val="FirstParagraph"/>
+      </w:pPr>
+      <w:r>
+        <w:t xml:space="preserve">Our block tests are Wald’s sequential tests [17] run as Page’s cumulative sums [18], with a floor parameter that selects between the two (Section III-E). Quickest change detection minimizes detection delay under false-alarm constraints [19], and the CUSUM parameters follow from the error rates it must meet [20]; windowed statistics and the time-uniform confidence sequences of Howard et al. [21], which stay valid at any stopping time, are not evaluated here; therefore,</w:t>
+      </w:r>
+      <w:r>
+        <w:t xml:space="preserve"> </w:t>
+      </w:r>
+      <w:r>
+        <w:t xml:space="preserve">‘</w:t>
+      </w:r>
+      <w:r>
+        <w:t xml:space="preserve">testing</w:t>
+      </w:r>
+      <w:r>
+        <w:t xml:space="preserve">’</w:t>
+      </w:r>
+      <w:r>
+        <w:t xml:space="preserve"> </w:t>
+      </w:r>
+      <w:r>
+        <w:t xml:space="preserve">below refers to our conversion and speed tests only, and we report their error rates empirically rather than derive them.</w:t>
+      </w:r>
+    </w:p>
+    <w:p>
+      <w:pPr>
+        <w:pStyle w:val="BodyText"/>
+      </w:pPr>
+      <w:r>
+        <w:t xml:space="preserve">Malware on the handset or a social-engineering call can take a code after it is delivered [22], [23]. These attacks begin where our work stops: we ask whether a message should be sent at all, and leave the protection of a delivered code aside.</w:t>
       </w:r>
     </w:p>
     <w:bookmarkEnd w:id="27"/>
-    <w:bookmarkStart w:id="28" w:name="b.-detecting-inflated-sms-traffic"/>
+    <w:bookmarkStart w:id="28" w:name="e.-the-gap"/>
     <w:p>
       <w:pPr>
         <w:pStyle w:val="Heading2"/>
       </w:pPr>
       <w:r>
-        <w:t xml:space="preserve">B. DETECTING INFLATED SMS TRAFFIC</w:t>
-      </w:r>
-    </w:p>
-    <w:p>
-      <w:pPr>
-        <w:pStyle w:val="FirstParagraph"/>
-      </w:pPr>
-      <w:r>
-        <w:t xml:space="preserve">Huh et al. [4] trained gradient-boosted trees on 9.4 million SMS authentication logs from nineteen countries, reaching 89.6% recall at 0.19% false positives on web traffic and 91.1% at 0.11% on app traffic. The logs came unlabeled from one large service over three months of 2023; the authors labeled attacks inside traffic peaks, as web identities with four or more requests and no successful validation in a day, or app number-and-device pairs never validated, and treated requests outside peaks as genuine. Two models with 18 and 13 features at three levels (the request, the identity’s history, and country-wide aggregates over 24 hours) run per request before the message is sent. About 73% of web attacks sent four or fewer requests per identity a day, defeating per-entity limits, and destination signals were the strongest: about 92% zero conversion for attacks against 21% for genuine traffic, and 91% of app attacks fell on prefixes with more than 30 distinct numbers in a day against 0.01% of genuine requests. The same data show the counter-move: in three countries about 82% of attack requests validated their codes, which the authors attribute to attackers avoiding conversion-rate rules. The detector needs labeled traffic and acts per request, reports its cost to users as false positives only, and was not released because it is deployed. We add a controlled comparison of two label-free ways to act on destination aggregation per block, from send counts or code outcomes, and of their cost to users sharing a block; we did not reproduce theirs, so we do not rank the two.</w:t>
-      </w:r>
-    </w:p>
-    <w:p>
-      <w:pPr>
-        <w:pStyle w:val="BodyText"/>
-      </w:pPr>
-      <w:r>
-        <w:t xml:space="preserve">Zaliskyi and Odarchenko [8] count A2P sends per prefix (a number less its last three digits) in fixed or rolling five-minute windows and quarantine a prefix for 24 hours past a day or night threshold. On metadata of two confirmed incidents fixed windows blocked 95% and 63% of the traffic, and 58% of a legitimate marketing campaign; counting unique recipients blocked 2% of the campaign and none of the first incident. The authors conclude that message counts alone cannot safely separate inflated traffic from a campaign; they do not use verification outcomes. Their numbers, messages blocked on real traffic, are not comparable with ours, which come from simulation and charge a policy with what users sharing a block lose.</w:t>
-      </w:r>
-    </w:p>
-    <w:p>
-      <w:pPr>
-        <w:pStyle w:val="BodyText"/>
-      </w:pPr>
-      <w:r>
-        <w:t xml:space="preserve">The messaging vendors act one hop later. Twilio’s Fraud Guard blocks sends to a destination prefix or country whose pattern departs from the account’s history, at three protection levels with claimed false-positive rates under 1% and 2% [6]; its SMS Pumping Risk Score rates a number from 0 to 100 from Fraud Guard, risky carriers, traffic patterns and low conversion, advising friction from 60 and refusal above 90 [7]. Graded destination action is established practice, but the signals and models are undisclosed, so we benchmarked no product.</w:t>
-      </w:r>
-    </w:p>
-    <w:p>
-      <w:pPr>
-        <w:pStyle w:val="BodyText"/>
-      </w:pPr>
-      <w:r>
-        <w:t xml:space="preserve">These works establish that attacks concentrate on destination prefixes and avoid converting, that counts alone misfire on campaigns, and that some campaigns now enter codes to pass conversion rules; we modeled the attackers that enter codes, fake receipts and build trust (Table 2) on that counter-move.</w:t>
-      </w:r>
-    </w:p>
-    <w:bookmarkEnd w:id="28"/>
-    <w:bookmarkStart w:id="29" w:name="c.-what-an-attacker-can-buy"/>
-    <w:p>
-      <w:pPr>
-        <w:pStyle w:val="Heading2"/>
-      </w:pPr>
-      <w:r>
-        <w:t xml:space="preserve">C. WHAT AN ATTACKER CAN BUY</w:t>
-      </w:r>
-    </w:p>
-    <w:p>
-      <w:pPr>
-        <w:pStyle w:val="FirstParagraph"/>
-      </w:pPr>
-      <w:r>
-        <w:t xml:space="preserve">What a source-side control costs an attacker has been measured. Motoyama et al. [12] bought CAPTCHA solutions from eight retail services at $1 to $20 per thousand, found that the wage for solving had fallen from $10 per thousand in 2007 to about a dollar by 2009, and conclude that a CAPTCHA limits access to attackers whose business is profitable despite that cost rather than keeping machines out. Dionysiou and Athanasopoulos [14] classify the machine-learning solvers that have since appeared. Addresses have a market too: Mi et al. [10] infiltrated five residential proxy providers and observed 6.2 million addresses in 238 countries, 95% of them residential, 90% relaying for under 870 seconds and 2.2% on any blacklist; Richter et al. [11] found carrier-grade NAT in more than 90% of cellular networks, with dozens of subscribers behind one address, and conclude that address reputation and blacklisting become</w:t>
-      </w:r>
-      <w:r>
-        <w:t xml:space="preserve"> </w:t>
-      </w:r>
-      <w:r>
-        <w:t xml:space="preserve">“</w:t>
-      </w:r>
-      <w:r>
-        <w:t xml:space="preserve">all but infeasible</w:t>
-      </w:r>
-      <w:r>
-        <w:t xml:space="preserve">”</w:t>
-      </w:r>
-      <w:r>
-        <w:t xml:space="preserve"> </w:t>
-      </w:r>
-      <w:r>
-        <w:t xml:space="preserve">there. Behind both markets lies the older observation of Douceur [9] that without a trusted authority one entity can present many identities, so a signed session provides continuity, not scarcity. Risk-based authentication, which Wiefling et al. [5] probed at eight large services, scores a login from its address, user agent, resolution, time and similar features into risk buckets and asks for a further factor above a threshold; every service that showed such behavior used the address, and none disclosed its procedure. Step 7 of our design resembles it, but scores a request made before any account exists, so the account history that risk-based authentication relies on is absent. Client puzzles [16] would add a computational price per request; we did not evaluate them.</w:t>
-      </w:r>
-    </w:p>
-    <w:p>
-      <w:pPr>
-        <w:pStyle w:val="BodyText"/>
-      </w:pPr>
-      <w:r>
-        <w:t xml:space="preserve">These measurements say what an attacker can buy. For a defense they imply that per-identity controls tax identity reset rather than prevent it, and that the question for a residential attacker is not whether it can be told from a person but what rationing it costs the people it resembles. Sections V-C and V-D measure that in this design.</w:t>
-      </w:r>
-    </w:p>
-    <w:bookmarkEnd w:id="29"/>
-    <w:bookmarkStart w:id="30" w:name="d.-sequential-tests"/>
-    <w:p>
-      <w:pPr>
-        <w:pStyle w:val="Heading2"/>
-      </w:pPr>
-      <w:r>
-        <w:t xml:space="preserve">D. SEQUENTIAL TESTS</w:t>
-      </w:r>
-    </w:p>
-    <w:p>
-      <w:pPr>
-        <w:pStyle w:val="FirstParagraph"/>
-      </w:pPr>
-      <w:r>
-        <w:t xml:space="preserve">Our block tests are Wald’s sequential tests [17] run as Page’s cumulative sums [18], with a floor parameter that selects between the two (Section III-E). Quickest change detection minimizes detection delay under false-alarm constraints [19], and a CUSUM’s parameters follow from the error rates it must meet [20]; windowed statistics and the time-uniform confidence sequences of Howard et al. [21], which stay valid at any stopping time, are not evaluated here, so</w:t>
-      </w:r>
-      <w:r>
-        <w:t xml:space="preserve"> </w:t>
-      </w:r>
-      <w:r>
-        <w:t xml:space="preserve">‘</w:t>
-      </w:r>
-      <w:r>
-        <w:t xml:space="preserve">testing</w:t>
-      </w:r>
-      <w:r>
-        <w:t xml:space="preserve">’</w:t>
-      </w:r>
-      <w:r>
-        <w:t xml:space="preserve"> </w:t>
-      </w:r>
-      <w:r>
-        <w:t xml:space="preserve">below means our conversion and speed tests only, and we report their error rates empirically rather than derive them.</w:t>
-      </w:r>
-    </w:p>
-    <w:bookmarkEnd w:id="30"/>
-    <w:bookmarkStart w:id="31" w:name="e.-attacks-on-the-delivered-code"/>
-    <w:p>
-      <w:pPr>
-        <w:pStyle w:val="Heading2"/>
-      </w:pPr>
-      <w:r>
-        <w:t xml:space="preserve">E. ATTACKS ON THE DELIVERED CODE</w:t>
-      </w:r>
-    </w:p>
-    <w:p>
-      <w:pPr>
-        <w:pStyle w:val="FirstParagraph"/>
-      </w:pPr>
-      <w:r>
-        <w:t xml:space="preserve">Malware on the handset or a social-engineering call can take a code after it is delivered [22], [23]. Those attacks begin where our work stops: we ask whether a message should be sent at all, and leave the protection of a delivered code aside.</w:t>
-      </w:r>
-    </w:p>
-    <w:bookmarkEnd w:id="31"/>
-    <w:bookmarkStart w:id="32" w:name="f.-the-gap"/>
-    <w:p>
-      <w:pPr>
-        <w:pStyle w:val="Heading2"/>
-      </w:pPr>
-      <w:r>
-        <w:t xml:space="preserve">F. THE GAP</w:t>
+        <w:t xml:space="preserve">E. THE GAP</w:t>
       </w:r>
     </w:p>
     <w:p>
@@ -589,7 +549,7 @@
         <w:t xml:space="preserve"> </w:t>
       </w:r>
       <w:r>
-        <w:t xml:space="preserve">The closest work, set beside ours.</w:t>
+        <w:t xml:space="preserve">The closest work is set beside ours.</w:t>
       </w:r>
     </w:p>
     <w:tbl>
@@ -603,7 +563,7 @@
           <w:right w:w="57" w:type="dxa"/>
         </w:tblCellMar>
         <w:tblLook w:firstRow="1" w:lastRow="0" w:firstColumn="0" w:lastColumn="0" w:noHBand="0" w:noVBand="0" w:val="0020"/>
-        <w:tblCaption w:val="TABLE 1. The closest work, set beside ours."/>
+        <w:tblCaption w:val="TABLE 1. The closest work is set beside ours."/>
       </w:tblPr>
       <w:tblGrid>
         <w:gridCol w:w="1420"/>
@@ -1381,7 +1341,7 @@
               <w:rPr>
                 <w:sz w:val="17"/>
               </w:rPr>
-              <w:t xml:space="preserve">Per 10 000-number block at the service, before the message is sent</w:t>
+              <w:t xml:space="preserve">Per 10,000-number block at the service, before the message is sent</w:t>
             </w:r>
           </w:p>
         </w:tc>
@@ -1429,9 +1389,9 @@
         </w:tc>
       </w:tr>
     </w:tbl>
-    <w:bookmarkEnd w:id="32"/>
-    <w:bookmarkEnd w:id="33"/>
-    <w:bookmarkStart w:id="58" w:name="iii.-threat-model-and-design"/>
+    <w:bookmarkEnd w:id="28"/>
+    <w:bookmarkEnd w:id="29"/>
+    <w:bookmarkStart w:id="54" w:name="iii.-threat-model-and-design"/>
     <w:p>
       <w:pPr>
         <w:pStyle w:val="Heading1"/>
@@ -1445,10 +1405,10 @@
         <w:pStyle w:val="FirstParagraph"/>
       </w:pPr>
       <w:r>
-        <w:t xml:space="preserve">This section describes the baseline we replace, the attacker our design must resist, the twelve steps and two destination policies we designed, and the estimates of leakage we derive from its rules.</w:t>
-      </w:r>
-    </w:p>
-    <w:bookmarkStart w:id="37" w:name="a.-the-baseline-and-its-gaps"/>
+        <w:t xml:space="preserve">This section describes the baseline we replaced, the attacker our design must resist, the twelve steps and two destination policies we designed, and the estimates of leakage we derived from its rules.</w:t>
+      </w:r>
+    </w:p>
+    <w:bookmarkStart w:id="33" w:name="a.-the-baseline-and-its-gaps"/>
     <w:p>
       <w:pPr>
         <w:pStyle w:val="Heading2"/>
@@ -1491,7 +1451,7 @@
         <w:t xml:space="preserve"> </w:t>
       </w:r>
       <w:r>
-        <w:t xml:space="preserve">is read from a client header (line 2), and a request that claims iOS or Android skips the two checks that web requests face, a reCAPTCHA v3 score threshold of 0.5 and an origin check against the allowed domains</w:t>
+        <w:t xml:space="preserve">is read from a client header (line 2), and a request that claims iOS or Android skips the two checks that web requests face, a reCAPTCHA v3 score threshold of 0.5, and an origin check against the allowed domains</w:t>
       </w:r>
       <w:r>
         <w:t xml:space="preserve"> </w:t>
@@ -1538,10 +1498,7 @@
         </m:r>
       </m:oMath>
       <w:r>
-        <w:t xml:space="preserve"> </w:t>
-      </w:r>
-      <w:r>
-        <w:t xml:space="preserve">and the number not on the exclusion list</w:t>
+        <w:t xml:space="preserve">, and the number not on the exclusion list</w:t>
       </w:r>
       <w:r>
         <w:t xml:space="preserve"> </w:t>
@@ -1559,7 +1516,7 @@
         <w:t xml:space="preserve"> </w:t>
       </w:r>
       <w:r>
-        <w:t xml:space="preserve">unless the request comes from a test server (line 5). One message per number per minute, five requests per address per minute and the static caps</w:t>
+        <w:t xml:space="preserve">unless the request comes from a test server (line 5). One message per number per minute, five requests per address per minute, and the static caps</w:t>
       </w:r>
       <w:r>
         <w:t xml:space="preserve"> </w:t>
@@ -1607,18 +1564,18 @@
           <wp:inline>
             <wp:extent cx="4319999" cy="2468571"/>
             <wp:effectExtent b="0" l="0" r="0" t="0"/>
-            <wp:docPr descr="" title="" id="35" name="Picture"/>
+            <wp:docPr descr="" title="" id="31" name="Picture"/>
             <a:graphic>
               <a:graphicData uri="http://schemas.openxmlformats.org/drawingml/2006/picture">
                 <pic:pic>
                   <pic:nvPicPr>
-                    <pic:cNvPr descr="figures/alg1_v1.png" id="36" name="Picture"/>
+                    <pic:cNvPr descr="figures/alg1_v1.png" id="32" name="Picture"/>
                     <pic:cNvPicPr>
                       <a:picLocks noChangeArrowheads="1" noChangeAspect="1"/>
                     </pic:cNvPicPr>
                   </pic:nvPicPr>
                   <pic:blipFill>
-                    <a:blip r:embed="rId34"/>
+                    <a:blip r:embed="rId30"/>
                     <a:stretch>
                       <a:fillRect/>
                     </a:stretch>
@@ -1663,8 +1620,8 @@
         <w:t xml:space="preserve">The v1 baseline.</w:t>
       </w:r>
     </w:p>
-    <w:bookmarkEnd w:id="37"/>
-    <w:bookmarkStart w:id="41" w:name="b.-threat-model"/>
+    <w:bookmarkEnd w:id="33"/>
+    <w:bookmarkStart w:id="37" w:name="b.-threat-model"/>
     <w:p>
       <w:pPr>
         <w:pStyle w:val="Heading2"/>
@@ -1678,7 +1635,7 @@
         <w:pStyle w:val="FirstParagraph"/>
       </w:pPr>
       <w:r>
-        <w:t xml:space="preserve">The attacker is a party that wants the service to send as many messages as possible, or as many as possible to numbers that pay it. The first is a flooder: the service pays per message, and the attacker’s gain is the service’s loss. The second is a pumper, paid a share of the termination fee by the operator that terminates its ranges; it earns nothing on any other number, so its traffic concentrates on the blocks it is paid for. The share is not public, so in Section V-H we report instead the share at which each scripted pumper breaks even. Figure 2 places the two attackers on the path of a request: the flooder, whose aim is the service’s SMS spend, and the pumper, who earns on its partner’s ranges through the share of the termination fee that the dashed line carries back from the operator to the client. What each controls at the four points of the path, what neither can do, and what the model leaves out follow.</w:t>
+        <w:t xml:space="preserve">The attacker is a party that wants the service to send as many messages as possible, or as many as possible to numbers that pay it. The first is a flooder: the service pays per message, and the attacker’s gain is the service’s loss. The second is a pumper, who is paid a share of the termination fee by the operator that terminates its ranges; it earns nothing on any other number, so its traffic concentrates on the blocks it is paid for. The share is not public; therefore, in Section V-H, we report the share at which each scripted pumper breaks even. Figure 2 places the two attackers on the path of a request: the flooder, whose aim is the service’s SMS spend, and the pumper, who earns on its partner’s ranges through the share of the termination fee that the dashed line carries back from the operator to the client. What each controls at the four points of the path, what neither can do, and what the model leaves out follow.</w:t>
       </w:r>
     </w:p>
     <w:p>
@@ -1690,18 +1647,18 @@
           <wp:inline>
             <wp:extent cx="5334000" cy="1695924"/>
             <wp:effectExtent b="0" l="0" r="0" t="0"/>
-            <wp:docPr descr="" title="" id="39" name="Picture"/>
+            <wp:docPr descr="" title="" id="35" name="Picture"/>
             <a:graphic>
               <a:graphicData uri="http://schemas.openxmlformats.org/drawingml/2006/picture">
                 <pic:pic>
                   <pic:nvPicPr>
-                    <pic:cNvPr descr="figures/fig9_threat_model.png" id="40" name="Picture"/>
+                    <pic:cNvPr descr="figures/fig9_threat_model.png" id="36" name="Picture"/>
                     <pic:cNvPicPr>
                       <a:picLocks noChangeArrowheads="1" noChangeAspect="1"/>
                     </pic:cNvPicPr>
                   </pic:nvPicPr>
                   <pic:blipFill>
-                    <a:blip r:embed="rId38"/>
+                    <a:blip r:embed="rId34"/>
                     <a:stretch>
                       <a:fillRect/>
                     </a:stretch>
@@ -1743,7 +1700,7 @@
         <w:t xml:space="preserve"> </w:t>
       </w:r>
       <w:r>
-        <w:t xml:space="preserve">The two attackers on the path, and the fee that flows back to one of them.</w:t>
+        <w:t xml:space="preserve">Two attackers on the path and the fee that flows back to one of them.</w:t>
       </w:r>
     </w:p>
     <w:p>
@@ -1751,7 +1708,7 @@
         <w:pStyle w:val="BodyText"/>
       </w:pPr>
       <w:r>
-        <w:t xml:space="preserve">At the client, the attacker runs scripts behind residential proxies in the service’s own country, with a fresh address per request, or from a datacenter abroad, or spread at a low rate over twenty autonomous systems. It buys human-like reCAPTCHA v3 tokens from solving services at about 0.3 cents each, so a score threshold alone does not stop it. It mints a fresh browser fingerprint per request, pre-ages fingerprints for hours, or reuses one two-day-old profile; it can present a forged platform header; and it draws numbers at random, walks them upward, or takes them from its partner’s blocks. It knows every threshold, the parameters of the destination tests and the timing of the workers, and it sees only the one uniform response that Section III-C describes.</w:t>
+        <w:t xml:space="preserve">At the client, the attacker runs scripts behind residential proxies in the service’s own country, with a fresh address per request, or from a datacenter abroad, or spread at a low rate over twenty autonomous systems. It buys human-like reCAPTCHA v3 tokens from solving services at approximately 0.3 cents each; therefore, a score threshold alone does not stop it. It mints a fresh browser fingerprint per request, pre-ages fingerprints for hours, or reuses one two-day-old profile; it can present a forged platform header; and it draws numbers at random, walks them upward, or takes them from its partner’s blocks. It knows every threshold, the parameters of the destination tests, and the timing of the workers, and it sees only the uniform response that Section III-C describes.</w:t>
       </w:r>
     </w:p>
     <w:p>
@@ -1759,7 +1716,7 @@
         <w:pStyle w:val="BodyText"/>
       </w:pPr>
       <w:r>
-        <w:t xml:space="preserve">On its own ranges, a pumper’s operator can do what a real recipient could: enter the code it receives, within a second or after a human-like delay, or only when a block’s statistic nears its threshold; report deliveries as failed, so that a billed send feeds no test; and verify on hundreds of identity-and-number pairs for ten or thirty minutes to build trusted history before flooding with the same pairs. It can spread over three to three hundred blocks, at full rate or paced to a counter’s quota, and it can buy a solution for every interactive challenge.</w:t>
+        <w:t xml:space="preserve">On its own ranges, a pumper’s operator can do what a real recipient can: enter the code it receives, within a second or after a human-like delay, or only when a block’s statistic nears its threshold; report deliveries as failed, so that a billed send feeds no test; and verify on hundreds of identity-and-number pairs for ten or thirty minutes to build trusted history before flooding with the same pairs. It can spread over three to three hundred blocks, at full rate or paced to a counter’s quota, and it can buy a solution for every interactive challenge.</w:t>
       </w:r>
     </w:p>
     <w:p>
@@ -1767,11 +1724,11 @@
         <w:pStyle w:val="BodyText"/>
       </w:pPr>
       <w:r>
-        <w:t xml:space="preserve">Three things it cannot do. It cannot forge an app attestation, so a platform established at Step 0 is evidence rather than a claim. It cannot earn on a range its partner does not terminate, which is why the destination is the one key it cannot rotate away from. And it cannot make a stranger enter a code, so a code entered on a block that real users share is honest evidence about that block; what a code entered on the attacker’s own number buys it, we measure rather than assume. Attacks on a code after delivery (Section II-E) and compromise of the service, its vendors or the attestation providers are outside the model. Table 2 lists the 25 profiles that instantiate these capabilities; pool size, rate and CAPTCHA class are drawn per seed.</w:t>
-      </w:r>
-    </w:p>
-    <w:bookmarkEnd w:id="41"/>
-    <w:bookmarkStart w:id="51" w:name="c.-the-pipeline"/>
+        <w:t xml:space="preserve">Three things it cannot do. It cannot forge an app attestation, so a platform established at Step 0 is evidence rather than a claim. It cannot earn on a range its partner does not terminate, which is why the destination is the one key it cannot rotate away from. And it cannot make a stranger enter a code, so a code entered on a block that real users share is honest evidence about that block; what a code entered on the attacker’s own number buys it, we measure rather than assume. Attacks on a code after delivery (Section II-D) and compromise of the service, its vendors, or the attestation providers are outside the model. Table 2 lists the 25 profiles that instantiate these capabilities; pool size, rate, and CAPTCHA class are drawn per seed.</w:t>
+      </w:r>
+    </w:p>
+    <w:bookmarkEnd w:id="37"/>
+    <w:bookmarkStart w:id="47" w:name="c.-the-pipeline"/>
     <w:p>
       <w:pPr>
         <w:pStyle w:val="Heading2"/>
@@ -1785,7 +1742,7 @@
         <w:pStyle w:val="FirstParagraph"/>
       </w:pPr>
       <w:r>
-        <w:t xml:space="preserve">Figure 3 shows the implementation as deployed. An HTTP API, run on any number of instances, offers the client five public endpoints: an attestation challenge and an enrolment, a session endpoint where a reCAPTCHA token or an attestation buys a signed session, the request endpoint, which runs the pipeline and returns one uniform body, and the verify endpoint, which takes the code; two internal endpoints, behind a service credential, take the vendor’s delivery receipts and drive the timeouts. Behind the API sit the two procedures of Algorithm 2: the pipeline, which runs Steps 0–11 on each request, and the feedback loop, which applies each transition of a send as one compare-and-set. All state lives in one store, Redis in production and an in-memory twin with the same rules in the tests and the simulator, so what the loop writes the next request reads, which is how the outcome of one send changes the judgment of the next, and any instance can verify any code. One worker per deployment ticks every minute to resolve the sends that timed out and to run the baseline job that sets the multipliers of Step 9 from the pipeline’s own counters. Every external dependency sits behind an adapter with an in-memory fake, and a deployment reports which adapters are fake so that production can refuse to start with any. The simulation of Section IV runs the pipeline, the feedback loop, the worker’s two jobs and the in-memory store as drawn, without the HTTP layer, replaces the external services with their fakes, and in the main study hands the baseline job the modeled legitimate rate instead of letting it learn it (Section V-D runs the learning job).</w:t>
+        <w:t xml:space="preserve">Figure 3 shows the implementation as deployed. An HTTP API, run on any number of instances, offers the client five public endpoints: an attestation challenge and an enrolment, a session endpoint where a reCAPTCHA token or an attestation buys a signed session, the request endpoint, which runs the pipeline and returns one uniform body, and the verify endpoint, which takes the code; two internal endpoints, behind a service credential, take the vendor’s delivery receipts and drive the timeouts. Behind the API sit the two procedures of Algorithm 2: the pipeline, which runs Steps 0–11 on each request, and the feedback loop, which applies each transition of a send as one compare-and-set. All state lives in one store, Redis in production, and an in-memory twin with the same rules in the tests and the simulator, so what the loop writes the next request reads, which is how the outcome of one send changes the judgment of the next, and any instance can verify any code. One worker per deployment ticks every minute to resolve the sends that timed out and to run the baseline job that sets the multipliers of Step 9 from the pipeline’s own counters. Every external dependency sits behind an adapter with an in-memory fake, and a deployment reports which adapters are fake so that production can refuse to start with any. The simulation of Section IV runs the pipeline, the feedback loop, the worker’s two jobs, and the in-memory store as drawn, without the HTTP layer, replaces the external services with their fakes, and in the main study hands the baseline job the modeled legitimate rate instead of letting it learn it (Section V-D runs the learning job).</w:t>
       </w:r>
     </w:p>
     <w:p>
@@ -1797,18 +1754,18 @@
           <wp:inline>
             <wp:extent cx="5334000" cy="2601430"/>
             <wp:effectExtent b="0" l="0" r="0" t="0"/>
-            <wp:docPr descr="" title="" id="43" name="Picture"/>
+            <wp:docPr descr="" title="" id="39" name="Picture"/>
             <a:graphic>
               <a:graphicData uri="http://schemas.openxmlformats.org/drawingml/2006/picture">
                 <pic:pic>
                   <pic:nvPicPr>
-                    <pic:cNvPr descr="figures/fig12_architecture.png" id="44" name="Picture"/>
+                    <pic:cNvPr descr="figures/fig12_architecture.png" id="40" name="Picture"/>
                     <pic:cNvPicPr>
                       <a:picLocks noChangeArrowheads="1" noChangeAspect="1"/>
                     </pic:cNvPicPr>
                   </pic:nvPicPr>
                   <pic:blipFill>
-                    <a:blip r:embed="rId42"/>
+                    <a:blip r:embed="rId38"/>
                     <a:stretch>
                       <a:fillRect/>
                     </a:stretch>
@@ -1858,7 +1815,7 @@
         <w:pStyle w:val="BodyText"/>
       </w:pPr>
       <w:r>
-        <w:t xml:space="preserve">We designed the pipeline so that no message is paid for before every check passes, and cheap checks run first. Trust comes from evidence the client cannot forge, an attestation, a server-signed session, and the fate of earlier codes, though such evidence can be manufactured (Section V-F).</w:t>
+        <w:t xml:space="preserve">We designed the pipeline so that no message is paid for before every check passes, and cheap checks run first. Trust comes from evidence that the client cannot forge, an attestation, a server-signed session, and the fate of earlier codes, though such evidence can be manufactured (Section V-F).</w:t>
       </w:r>
     </w:p>
     <w:p>
@@ -1866,7 +1823,7 @@
         <w:pStyle w:val="BodyText"/>
       </w:pPr>
       <w:r>
-        <w:t xml:space="preserve">A request passes the twelve steps of Figure 4 in order until one refuses it. The figure numbers its stages in reading order: stages 1 to 4 are Steps 0 to 4, with Steps 3 and 4 drawn as one stage, the web checks; from stage 5 on the numberings coincide, and stage 12 is the feedback loop. The letters below are the gaps of Section III-A that each step closes. Step 0 establishes the platform from an App Attest or Play Integrity result and refuses proxy addresses (A). Step 1 binds the request to a server-signed session with a fingerprint and a replay nonce, three requests per session per ten minutes (B). Step 2 throttles the address, its /24 and its autonomous system, with lower caps for hosting networks (B, F). Steps 3 and 4, for web requests only, check the reCAPTCHA score and the origin. Step 5 prices and checks the number before anything is paid for: its country and cost class, sequential or narrow-range bursts, liveness through an HLR lookup, and the verdict stage of its block, with the bulk flag now needing an internal credential (C, D, G). Step 6 validates the body and the exclusion list, the test flag needing a credential too (G). Step 7 computes the risk score of Equation (1) and chooses one of five tiers (H). Step 8 applies a per-number backoff, sixty seconds doubling to an hour and five sends a day. Step 9 takes the source caps per source, platform and country, multiplied by the adaptive factor. Step 10 sets the operating mode from the hourly budget, elevated above 80% and emergency at 100% (E). Step 11 reserves the hourly count, the spend and any destination slot in one atomic operation, writes the state and enqueues the message (E, H). A refusal at any step returns one uniform reply, and every send resolves through the feedback loop, whose per-key and per-block outcomes are what the next request is judged on.</w:t>
+        <w:t xml:space="preserve">A request passes the twelve steps of Figure 4 in order until one refuses it. The figure numbers its stages in reading order: stages 1 to 4 are Steps 0 to 4, with Steps 3 and 4 drawn as one stage, the web checks; from stage 5 on the numberings coincide, and stage 12 is the feedback loop. The letters below are the gaps of Section III-A that each step closes. Step 0 establishes the platform from an App Attest or Play Integrity result and refuses proxy addresses (A). Step 1 binds the request to a server-signed session with a fingerprint and a replay nonce, three requests per session per ten minutes (B). Step 2 throttles the address, its /24, and its autonomous system, with lower caps for hosting networks (B, F). Steps 3 and 4, for web requests only, check the reCAPTCHA score and the origin. Step 5 prices and checks the number before anything is paid for: its country and cost class, sequential or narrow-range bursts, liveness through an HLR lookup, and the verdict stage of its block, with the bulk flag now needing an internal credential (C, D, G). Step 6 validates the body and the exclusion list, the test flag needing a credential too (G). Step 7 computes the risk score of Equation (1) and chooses one of five tiers (H). Step 8 applies a per-number backoff, sixty seconds doubling to an hour and five sends a day. Step 9 takes the source caps per source, platform, and country, multiplied by the adaptive factor. Step 10 sets the operating mode from the hourly budget, elevated above 80% and emergency at 100% (E). Step 11 reserves the hourly count, spend, and any destination slot in one atomic operation, writes the state, and enqueues the message (E, H). A refusal at any step returns one uniform reply, and every send resolves through the feedback loop, whose per-key and per-block outcomes are what the next request is judged on.</w:t>
       </w:r>
     </w:p>
     <w:p>
@@ -1874,7 +1831,7 @@
         <w:pStyle w:val="BodyText"/>
       </w:pPr>
       <w:r>
-        <w:t xml:space="preserve">Algorithm 2 gives the same pipeline as we implemented it, in the order of the steps, with the feedback loop of Section III-D and the block statistics of Section III-E as its second procedure. Its sets are those of Algorithm 1, and</w:t>
+        <w:t xml:space="preserve">Algorithm 2 provides the same pipeline as that implemented, in the order of the steps, with the feedback loop of Section III-D and the block statistics of Section III-E as its second procedure. Its sets are those of Algorithm 1, and</w:t>
       </w:r>
       <w:r>
         <w:t xml:space="preserve"> </w:t>
@@ -2038,7 +1995,7 @@
         <w:t xml:space="preserve"> </w:t>
       </w:r>
       <w:r>
-        <w:t xml:space="preserve">the source caps.</w:t>
+        <w:t xml:space="preserve">is the source cap.</w:t>
       </w:r>
       <w:r>
         <w:t xml:space="preserve"> </w:t>
@@ -2053,7 +2010,7 @@
         <w:t xml:space="preserve"> </w:t>
       </w:r>
       <w:r>
-        <w:t xml:space="preserve">takes the hourly count, the spend and the block’s counter slot together and returns the counter’s stage</w:t>
+        <w:t xml:space="preserve">takes the hourly count, the spend, and the block’s counter slot together and returns the counter’s stage</w:t>
       </w:r>
       <w:r>
         <w:t xml:space="preserve"> </w:t>
@@ -2109,7 +2066,7 @@
         <w:t xml:space="preserve"> </w:t>
       </w:r>
       <w:r>
-        <w:t xml:space="preserve">is the one uniform body. Read against Algorithm 1, the pipeline differs in four ways: the platform is established before anything else and from evidence, every limit is taken atomically and released on refusal, the number is priced and checked before it is paid for, and the outcome of each send flows back into the keys and the destination block that the next request will be judged on. Each limit and reservation is one atomic operation, but the enclosing steps are not one transaction, and a crash between them can leak reservations (Section IV-A); address limits and source caps count requests, except that a request Step 11 challenges returns its source-cap count. Every outcome after Step 0, except the challenge, returns one HTTP 200 body after at least 400 ms, a floor that cannot hide longer work.</w:t>
+        <w:t xml:space="preserve">is the uniform body. Read against Algorithm 1, the pipeline differs in four ways: the platform is established before anything else and from evidence, every limit is taken atomically and released on refusal, the number is priced and checked before it is paid for, and the outcome of each send flows back into the keys and the destination block that the next request will be judged on. Each limit and reservation is one atomic operation, but the enclosing steps are not one transaction, and a crash between them can leak reservations (Section IV-A); address limits and source caps count requests, except that a request Step 11 challenges returns its source-cap count. Every outcome after Step 0, except the challenge, returns one HTTP 200 body after at least 400 ms, a floor that cannot hide longer work.</w:t>
       </w:r>
     </w:p>
     <w:p>
@@ -2121,18 +2078,18 @@
           <wp:inline>
             <wp:extent cx="5334000" cy="3077538"/>
             <wp:effectExtent b="0" l="0" r="0" t="0"/>
-            <wp:docPr descr="" title="" id="46" name="Picture"/>
+            <wp:docPr descr="" title="" id="42" name="Picture"/>
             <a:graphic>
               <a:graphicData uri="http://schemas.openxmlformats.org/drawingml/2006/picture">
                 <pic:pic>
                   <pic:nvPicPr>
-                    <pic:cNvPr descr="figures/fig10_steps.png" id="47" name="Picture"/>
+                    <pic:cNvPr descr="figures/fig10_steps.png" id="43" name="Picture"/>
                     <pic:cNvPicPr>
                       <a:picLocks noChangeArrowheads="1" noChangeAspect="1"/>
                     </pic:cNvPicPr>
                   </pic:nvPicPr>
                   <pic:blipFill>
-                    <a:blip r:embed="rId45"/>
+                    <a:blip r:embed="rId41"/>
                     <a:stretch>
                       <a:fillRect/>
                     </a:stretch>
@@ -2174,7 +2131,7 @@
         <w:t xml:space="preserve"> </w:t>
       </w:r>
       <w:r>
-        <w:t xml:space="preserve">The twelve steps, and the loop that feeds the next request.</w:t>
+        <w:t xml:space="preserve">The twelve steps and the loop that feeds the next request.</w:t>
       </w:r>
     </w:p>
     <w:p>
@@ -2184,20 +2141,20 @@
       <w:r>
         <w:drawing>
           <wp:inline>
-            <wp:extent cx="5334000" cy="2919383"/>
+            <wp:extent cx="4319999" cy="6009564"/>
             <wp:effectExtent b="0" l="0" r="0" t="0"/>
-            <wp:docPr descr="" title="" id="49" name="Picture"/>
+            <wp:docPr descr="" title="" id="45" name="Picture"/>
             <a:graphic>
               <a:graphicData uri="http://schemas.openxmlformats.org/drawingml/2006/picture">
                 <pic:pic>
                   <pic:nvPicPr>
-                    <pic:cNvPr descr="figures/alg2_v2.png" id="50" name="Picture"/>
+                    <pic:cNvPr descr="figures/alg2_v2.png" id="46" name="Picture"/>
                     <pic:cNvPicPr>
                       <a:picLocks noChangeArrowheads="1" noChangeAspect="1"/>
                     </pic:cNvPicPr>
                   </pic:nvPicPr>
                   <pic:blipFill>
-                    <a:blip r:embed="rId48"/>
+                    <a:blip r:embed="rId44"/>
                     <a:stretch>
                       <a:fillRect/>
                     </a:stretch>
@@ -2205,7 +2162,7 @@
                   <pic:spPr bwMode="auto">
                     <a:xfrm>
                       <a:off x="0" y="0"/>
-                      <a:ext cx="5334000" cy="2919383"/>
+                      <a:ext cx="4319999" cy="6009564"/>
                     </a:xfrm>
                     <a:prstGeom prst="rect">
                       <a:avLst/>
@@ -2780,8 +2737,8 @@
         <w:t xml:space="preserve">.</w:t>
       </w:r>
     </w:p>
-    <w:bookmarkEnd w:id="51"/>
-    <w:bookmarkStart w:id="52" w:name="d.-the-feedback-loop"/>
+    <w:bookmarkEnd w:id="47"/>
+    <w:bookmarkStart w:id="48" w:name="d.-the-feedback-loop"/>
     <w:p>
       <w:pPr>
         <w:pStyle w:val="Heading2"/>
@@ -2829,7 +2786,7 @@
         </m:r>
       </m:oMath>
       <w:r>
-        <w:t xml:space="preserve">. It counts the send on every key it carried, the address, its /24 and ASN, the fingerprint, the session, the country, the prefix and the number, and denylists a fine key for 24 hours once that key has 50 resolved sends and fewer than 10% of them verified; a verification marks the number trusted, which exempts the client from both destination policies. The block’s conversion statistic</w:t>
+        <w:t xml:space="preserve">. It counts the send on every key it carries, the address, its /24 and ASN, the fingerprint, the session, the country, the prefix and the number, and denylists a fine key for 24 hours once that key has 50 resolved sends and fewer than 10% of them verified; a verification marks the number trusted, which exempts the client from both destination policies. The block’s conversion statistic</w:t>
       </w:r>
       <w:r>
         <w:t xml:space="preserve"> </w:t>
@@ -2986,8 +2943,8 @@
         <w:t xml:space="preserve">without a receipt in 60 s or with a failed receipt; only the first two count toward reputation. A positive receipt after a negative one reopens the send; a late verification reclassifies it, but an issued verdict stands. Each transition records its effects and its time in the same compare-and-set, and a recovery sweep completes the work of a dead process; each effect type applies at most once, and exactly once if the sweep runs within 20 minutes. A block’s statistic accumulates in processing order and a verdict is dated at the event that completes the crossing, so a late event can backdate a verdict and move its expiry; simulated runs apply events in time order, but concurrent live instances may not, so the same dependence holds live unless a block’s effects are serialized.</w:t>
       </w:r>
     </w:p>
-    <w:bookmarkEnd w:id="52"/>
-    <w:bookmarkStart w:id="55" w:name="e.-destination-policies"/>
+    <w:bookmarkEnd w:id="48"/>
+    <w:bookmarkStart w:id="51" w:name="e.-destination-policies"/>
     <w:p>
       <w:pPr>
         <w:pStyle w:val="Heading2"/>
@@ -3001,10 +2958,10 @@
         <w:pStyle w:val="FirstParagraph"/>
       </w:pPr>
       <w:r>
-        <w:t xml:space="preserve">A pumper is confined to its partner’s ranges but can rotate numbers and blocks within them. Destination policies are keyed on the 8-digit block (10 000 numbers); therefore, protection weakens as a pumper spreads.</w:t>
-      </w:r>
-    </w:p>
-    <w:bookmarkStart w:id="53" w:name="sequential-tests"/>
+        <w:t xml:space="preserve">A pumper is confined to its partner’s range but can rotate numbers and blocks within them. Destination policies are keyed on the 8-digit block (10,000 numbers); therefore, protection weakens as the pumper spreads.</w:t>
+      </w:r>
+    </w:p>
+    <w:bookmarkStart w:id="49" w:name="sequential-tests"/>
     <w:p>
       <w:pPr>
         <w:pStyle w:val="Heading3"/>
@@ -3511,11 +3468,11 @@
         </m:r>
       </m:oMath>
       <w:r>
-        <w:t xml:space="preserve">. A first verdict makes the block’s first-time clients pass a challenge for an hour; a second within the hour moves them off SMS, refusing those without another channel.</w:t>
-      </w:r>
-    </w:p>
-    <w:bookmarkEnd w:id="53"/>
-    <w:bookmarkStart w:id="54" w:name="counters"/>
+        <w:t xml:space="preserve">. A first verdict makes the block’s first-time clients pass a challenge for an hour; a second verdict within the hour moves them off SMS, refusing those without another channel.</w:t>
+      </w:r>
+    </w:p>
+    <w:bookmarkEnd w:id="49"/>
+    <w:bookmarkStart w:id="50" w:name="counters"/>
     <w:p>
       <w:pPr>
         <w:pStyle w:val="Heading3"/>
@@ -3529,12 +3486,12 @@
         <w:pStyle w:val="FirstParagraph"/>
       </w:pPr>
       <w:r>
-        <w:t xml:space="preserve">A counter limits the number of SMS sent per block in a daily or short refilling window. Step 11 reserves a slot and decides the stage in one atomic operation when an SMS is about to be sent, so concurrent requests cannot skip the challenge. Past the limit, a graded counter challenges first-time clients, and past twice the limit moves them off SMS; a refusing counter refuses. Clients with verified history are exempt from both policies; therefore, a code entered on a pumper’s number can buy that number an exemption. We also explored a token bucket of the same rate (burst 4 or 12; its challenge-tier bucket refills independently, unlike RFC 2697’s [26]) and the counter combined with the tests.</w:t>
-      </w:r>
-    </w:p>
-    <w:bookmarkEnd w:id="54"/>
-    <w:bookmarkEnd w:id="55"/>
-    <w:bookmarkStart w:id="56" w:name="f.-capacity-controls"/>
+        <w:t xml:space="preserve">A counter limits the number of SMS sent per block in a daily or short refilling window. Step 11 reserves a slot and decides the stage in one atomic operation when an SMS is about to be sent, so that concurrent requests cannot skip the challenge. Beyond the limit, a graded counter challenges first-time clients, and past twice the limit moves them off SMS; a refusing counter refuses. Clients with verified history are exempt from both policies; therefore, a code entered on a pumper’s number can buy that number an exemption. We also explored a token bucket of the same rate (burst 4 or 12; its challenge-tier bucket refills independently, unlike RFC 2697’s [26]) and the counter combined with the tests.</w:t>
+      </w:r>
+    </w:p>
+    <w:bookmarkEnd w:id="50"/>
+    <w:bookmarkEnd w:id="51"/>
+    <w:bookmarkStart w:id="52" w:name="f.-capacity-controls"/>
     <w:p>
       <w:pPr>
         <w:pStyle w:val="Heading2"/>
@@ -3548,11 +3505,11 @@
         <w:pStyle w:val="FirstParagraph"/>
       </w:pPr>
       <w:r>
-        <w:t xml:space="preserve">Step 9 multiplies its caps by 0.25 to 1.5 according to a baseline job comparing each key with its expected rate, learned from the pipeline’s hourly counters; without history, the static cap stands. Verified history avoids adaptive reduction, not the static caps or the budget, which bounds SMS count and spend, not vendor or fallback costs.</w:t>
-      </w:r>
-    </w:p>
-    <w:bookmarkEnd w:id="56"/>
-    <w:bookmarkStart w:id="57" w:name="g.-leakage-estimates"/>
+        <w:t xml:space="preserve">Step 9 multiplies its caps by 0.25 to 1.5 according to a baseline job, comparing each key with its expected rate, learned from the pipeline’s hourly counters; without history, the static cap stands. Verified history avoids adaptive reduction, not static caps or the budget, which bounds SMS count and spend, not vendor or fallback costs.</w:t>
+      </w:r>
+    </w:p>
+    <w:bookmarkEnd w:id="52"/>
+    <w:bookmarkStart w:id="53" w:name="g.-leakage-estimates"/>
     <w:p>
       <w:pPr>
         <w:pStyle w:val="Heading2"/>
@@ -3589,7 +3546,7 @@
         <w:t xml:space="preserve"> </w:t>
       </w:r>
       <w:r>
-        <w:t xml:space="preserve">minutes, by a pumper that solves no challenge and holds no verified history. Against the sequential tests, one reaching</w:t>
+        <w:t xml:space="preserve">minutes, by a pumper that solves no challenge and has no verified history. Against the sequential tests, one reaching</w:t>
       </w:r>
       <w:r>
         <w:t xml:space="preserve"> </w:t>
@@ -4425,7 +4382,7 @@
         <w:pStyle w:val="FirstParagraph"/>
       </w:pPr>
       <w:r>
-        <w:t xml:space="preserve">Solving challenges doubles these bounds, and a verified history exempts a client from them. While neither policy’s estimate reaches</w:t>
+        <w:t xml:space="preserve">Solving challenges doubles these bounds, and a verified history exempts a client from both policies. While neither policy’s estimate reaches</w:t>
       </w:r>
       <w:r>
         <w:t xml:space="preserve"> </w:t>
@@ -4531,7 +4488,7 @@
         <w:pStyle w:val="BodyText"/>
       </w:pPr>
       <w:r>
-        <w:t xml:space="preserve">In the code, every send takes a slot, verified clients’ included. If a block’s sends arrive as a Poisson stream with mean</w:t>
+        <w:t xml:space="preserve">In the code, every send takes a slot, including the sends of verified clients. If a block’s sends arrive as a Poisson stream with mean</w:t>
       </w:r>
       <w:r>
         <w:t xml:space="preserve"> </w:t>
@@ -4808,12 +4765,12 @@
         </m:r>
       </m:oMath>
       <w:r>
-        <w:t xml:space="preserve">. This is not a challenge rate: exempt clients take slots without challenge, and challenge failures, the second tier and earlier gates are ignored. The estimates use only the rules, configuration, and attack rate; what an excess send costs a user needs the simulation.</w:t>
-      </w:r>
-    </w:p>
-    <w:bookmarkEnd w:id="57"/>
-    <w:bookmarkEnd w:id="58"/>
-    <w:bookmarkStart w:id="69" w:name="iv.-methodology"/>
+        <w:t xml:space="preserve">. This is not a challenge rate: exempt clients take slots without challenge, and challenge failures, the second tier, and earlier gates are ignored. The estimates use only the rules, configuration, and attack rate; what an excess send costs a user needs to be simulated.</w:t>
+      </w:r>
+    </w:p>
+    <w:bookmarkEnd w:id="53"/>
+    <w:bookmarkEnd w:id="54"/>
+    <w:bookmarkStart w:id="65" w:name="iv.-methodology"/>
     <w:p>
       <w:pPr>
         <w:pStyle w:val="Heading1"/>
@@ -4827,7 +4784,7 @@
         <w:pStyle w:val="FirstParagraph"/>
       </w:pPr>
       <w:r>
-        <w:t xml:space="preserve">Figure 5 summarizes how we evaluated the design. Our implementation of Algorithm 2 runs inside an event-driven simulator against scripted attackers and simulated users, one run per design, attacker, workload and seed (Algorithm 3); we group the runs into studies under two protocols that we committed before their runs; and we score each run by what the attacker got through and by what legitimate users lost. The two dashed loops of the figure are the method’s two disciplines: settings selected on tuning seeds are frozen before they meet held-out seeds and workloads, and the leakage estimates derived from the rules alone (Section III-G) are checked against the measurements. The rest of this section gives the implementation, the simulator, the protocols and the metrics in that order.</w:t>
+        <w:t xml:space="preserve">Figure 5 summarizes how we evaluated the design. Our implementation of Algorithm 2 runs inside an event-driven simulator against scripted attackers and simulated users, one run per design, attacker, workload, and seed (Algorithm 3); we group the runs into studies under two protocols that we committed before their runs; and we score each run by what the attacker got through and by what legitimate users lost. The two dashed loops of the figure are the method’s two disciplines: settings selected on tuning seeds are frozen before they meet held-out seeds and workloads, and the leakage estimates derived from the rules alone (Section III-G) are checked against the measurements. The rest of this section describes the implementation, simulator, protocols, and metrics in that order.</w:t>
       </w:r>
     </w:p>
     <w:p>
@@ -4839,18 +4796,18 @@
           <wp:inline>
             <wp:extent cx="5334000" cy="2408776"/>
             <wp:effectExtent b="0" l="0" r="0" t="0"/>
-            <wp:docPr descr="" title="" id="60" name="Picture"/>
+            <wp:docPr descr="" title="" id="56" name="Picture"/>
             <a:graphic>
               <a:graphicData uri="http://schemas.openxmlformats.org/drawingml/2006/picture">
                 <pic:pic>
                   <pic:nvPicPr>
-                    <pic:cNvPr descr="figures/fig11_method.png" id="61" name="Picture"/>
+                    <pic:cNvPr descr="figures/fig11_method.png" id="57" name="Picture"/>
                     <pic:cNvPicPr>
                       <a:picLocks noChangeArrowheads="1" noChangeAspect="1"/>
                     </pic:cNvPicPr>
                   </pic:nvPicPr>
                   <pic:blipFill>
-                    <a:blip r:embed="rId59"/>
+                    <a:blip r:embed="rId55"/>
                     <a:stretch>
                       <a:fillRect/>
                     </a:stretch>
@@ -4892,10 +4849,10 @@
         <w:t xml:space="preserve"> </w:t>
       </w:r>
       <w:r>
-        <w:t xml:space="preserve">How we evaluated the design.</w:t>
-      </w:r>
-    </w:p>
-    <w:bookmarkStart w:id="62" w:name="a.-implementation"/>
+        <w:t xml:space="preserve">How we evaluated the design is described below.</w:t>
+      </w:r>
+    </w:p>
+    <w:bookmarkStart w:id="58" w:name="a.-implementation"/>
     <w:p>
       <w:pPr>
         <w:pStyle w:val="Heading2"/>
@@ -4909,7 +4866,7 @@
         <w:pStyle w:val="FirstParagraph"/>
       </w:pPr>
       <w:r>
-        <w:t xml:space="preserve">We implemented the pipeline of Algorithm 2 in about 4 000 lines of Python on in-memory and Redis backends. Up to release 2.8.3, the in-memory store that our simulator uses let a sorted set expire a fixed time after its first write, whereas Redis kept it while written to, so the simulated outage detector and Step 5 lost recent observations. Release 2.9.0 follows Redis in every rule we compared, which differential tests check, and we reran every study with it; in earlier releases we repaired seven replay and concurrency defects, each with a regression test. Of our 453 tests, 19 run against a real</w:t>
+        <w:t xml:space="preserve">We implemented the pipeline of Algorithm 2 in approximately 4,000 lines of Python on in-memory and Redis backends. Up to release 2.8.3, the in-memory store that our simulator uses let a sorted set expire a fixed time after its first write, whereas Redis kept it while written to, so the simulated outage detector and Step 5 lost recent observations. Release 2.9.0 follows Redis in every rule we compared, which differential tests check, and we reran every study with it; in earlier releases we repaired seven replay and concurrency defects, each with a regression test. Of our 453 tests, 19 ran against a real</w:t>
       </w:r>
       <w:r>
         <w:t xml:space="preserve"> </w:t>
@@ -4924,11 +4881,11 @@
         <w:t xml:space="preserve"> </w:t>
       </w:r>
       <w:r>
-        <w:t xml:space="preserve">and 18 exercise specific interleavings of two instances, not all. Step 11 is still not one transaction: a crash after its reservations leaks reserved slots or resolves the send as undelivered. The implementation is a research prototype.</w:t>
-      </w:r>
-    </w:p>
-    <w:bookmarkEnd w:id="62"/>
-    <w:bookmarkStart w:id="66" w:name="b.-simulation"/>
+        <w:t xml:space="preserve">and 18 exercised specific interleavings of two instances, not all. Step 11 is still not one transaction: a crash after its reservations leaks reserved slots or resolves the send as undelivered. The implementation is a research prototype.</w:t>
+      </w:r>
+    </w:p>
+    <w:bookmarkEnd w:id="58"/>
+    <w:bookmarkStart w:id="62" w:name="b.-simulation"/>
     <w:p>
       <w:pPr>
         <w:pStyle w:val="Heading2"/>
@@ -4942,7 +4899,7 @@
         <w:pStyle w:val="FirstParagraph"/>
       </w:pPr>
       <w:r>
-        <w:t xml:space="preserve">We run the pipeline against scripted vendor fakes on a simulated clock, as Algorithm 3 sets out. A seed</w:t>
+        <w:t xml:space="preserve">We run the pipeline against scripted vendor fakes on a simulated clock, as set out in Algorithm 3. A seed</w:t>
       </w:r>
       <w:r>
         <w:t xml:space="preserve"> </w:t>
@@ -4956,7 +4913,7 @@
         <w:t xml:space="preserve"> </w:t>
       </w:r>
       <w:r>
-        <w:t xml:space="preserve">opens three random streams, for the users, the attacker and the challenge outcomes, so every scenario at a seed, the attack-free one included, offers the same users, and our comparisons between scenarios are paired; the pipeline</w:t>
+        <w:t xml:space="preserve">opens three random streams: for the users, the attacker, and the challenge outcomes; therefore, every scenario at a seed, including the attack-free scenario, offers the same users, and our comparisons between scenarios are paired. The pipeline</w:t>
       </w:r>
       <w:r>
         <w:t xml:space="preserve"> </w:t>
@@ -5075,7 +5032,7 @@
         <w:t xml:space="preserve"> </w:t>
       </w:r>
       <w:r>
-        <w:t xml:space="preserve">a delivery receipt at the queue and delivery delay and, if</w:t>
+        <w:t xml:space="preserve">a delivery receipt at the queue and delivery delay, and if</w:t>
       </w:r>
       <w:r>
         <w:t xml:space="preserve"> </w:t>
@@ -5089,7 +5046,7 @@
         <w:t xml:space="preserve"> </w:t>
       </w:r>
       <w:r>
-        <w:t xml:space="preserve">verifies, a code entry after its delay; the timed events are applied before each later request and at the end of each minute, when the pipeline’s timeouts and its adaptive job also run. After the last minute the queue is drained through the receipt grace, the resolution timeout, the slowest entry and a resend. The run record</w:t>
+        <w:t xml:space="preserve">verifies, a code entry after its delay; the timed events are applied before each later request and at the end of each minute, when the pipeline’s timeouts and its adaptive job also run. After the last minute, the queue is drained through the receipt grace period, resolution timeout, slowest entry, and a resend. The run record</w:t>
       </w:r>
       <w:r>
         <w:t xml:space="preserve"> </w:t>
@@ -5103,7 +5060,7 @@
         <w:t xml:space="preserve"> </w:t>
       </w:r>
       <w:r>
-        <w:t xml:space="preserve">holds the messages leaked and offered per minute, each user’s funnel by cohort, the verdict events, the attacker’s verifications, challenges solved and bill, and the configuration with the workload digest and the code hash. After a warm-up of ten minutes (30 or 130 for pumping), the attack runs over legitimate traffic at 20 requests per minute. Our simulated users verify 80% of codes after a lognormal delay (median 22 s; 2 s for the 20% using autofill); 70% of numbers are reachable on WhatsApp; 90% of users complete a challenge; 20% are returning account holders with a stable fingerprint, a trusted number and verified history, so our results for returning users describe trusted identities only.</w:t>
+        <w:t xml:space="preserve">holds the messages leaked and offered per minute, each user’s funnel by cohort, the verdict events, the attacker’s verifications, challenges solved and bill, and the configuration with the workload digest and code hash. After a warm-up of ten minutes (30 or 130 for pumping), the attack runs over legitimate traffic at 20 requests per minute. Our simulated users verified 80% of codes after a lognormal delay (median 22 s; 2 s for the 20% using autofill); 70% of numbers were reachable on WhatsApp; 90% of users completed a challenge; 20% were returning account holders with a stable fingerprint, a trusted number, and verified history; therefore, our results for returning users described trusted identities only.</w:t>
       </w:r>
     </w:p>
     <w:p>
@@ -5115,18 +5072,18 @@
           <wp:inline>
             <wp:extent cx="4319999" cy="3458473"/>
             <wp:effectExtent b="0" l="0" r="0" t="0"/>
-            <wp:docPr descr="" title="" id="64" name="Picture"/>
+            <wp:docPr descr="" title="" id="60" name="Picture"/>
             <a:graphic>
               <a:graphicData uri="http://schemas.openxmlformats.org/drawingml/2006/picture">
                 <pic:pic>
                   <pic:nvPicPr>
-                    <pic:cNvPr descr="figures/alg3_sim.png" id="65" name="Picture"/>
+                    <pic:cNvPr descr="figures/alg3_sim.png" id="61" name="Picture"/>
                     <pic:cNvPicPr>
                       <a:picLocks noChangeArrowheads="1" noChangeAspect="1"/>
                     </pic:cNvPicPr>
                   </pic:nvPicPr>
                   <pic:blipFill>
-                    <a:blip r:embed="rId63"/>
+                    <a:blip r:embed="rId59"/>
                     <a:stretch>
                       <a:fillRect/>
                     </a:stretch>
@@ -5188,7 +5145,7 @@
         <w:t xml:space="preserve">results/ attacker_profiles.md</w:t>
       </w:r>
       <w:r>
-        <w:t xml:space="preserve">). Attackers draw pool size, rate and CAPTCHA class per seed, which explains 92% [80, 98] of the variance of the farm’s leakage in a nested design (ten configurations, three seeds each). Brackets in the text and tables, and bars and bands in the figures, are 95% percentile-bootstrap intervals over seeds, paired per seed for differences; they describe variation under our generator, not uncertainty about real traffic.</w:t>
+        <w:t xml:space="preserve">). Attackers draw pool size, rate, and CAPTCHA class per seed, which explains 92% [80, 98] of the variance of the farm’s leakage in a nested design (ten configurations, three seeds each). Brackets in the text and tables, and bars and bands in the figures, are 95% percentile-bootstrap intervals over seeds, paired per seed for differences; they describe variation under our generator, not uncertainty about real traffic.</w:t>
       </w:r>
     </w:p>
     <w:p>
@@ -5206,7 +5163,7 @@
         <w:t xml:space="preserve"> </w:t>
       </w:r>
       <w:r>
-        <w:t xml:space="preserve">The 25 attacker profiles, and the destination policies each one faced.</w:t>
+        <w:t xml:space="preserve">The 25 attacker profiles and the destination policies each one faced.</w:t>
       </w:r>
     </w:p>
     <w:tbl>
@@ -5220,7 +5177,7 @@
           <w:right w:w="57" w:type="dxa"/>
         </w:tblCellMar>
         <w:tblLook w:firstRow="1" w:lastRow="0" w:firstColumn="0" w:lastColumn="0" w:noHBand="0" w:noVBand="0" w:val="0020"/>
-        <w:tblCaption w:val="TABLE 2. The 25 attacker profiles, and the destination policies each one faced."/>
+        <w:tblCaption w:val="TABLE 2. The 25 attacker profiles and the destination policies each one faced."/>
       </w:tblPr>
       <w:tblGrid>
         <w:gridCol w:w="3771"/>
@@ -5686,8 +5643,8 @@
         </w:tc>
       </w:tr>
     </w:tbl>
-    <w:bookmarkEnd w:id="66"/>
-    <w:bookmarkStart w:id="67" w:name="c.-the-two-protocols"/>
+    <w:bookmarkEnd w:id="62"/>
+    <w:bookmarkStart w:id="63" w:name="c.-the-two-protocols"/>
     <w:p>
       <w:pPr>
         <w:pStyle w:val="Heading2"/>
@@ -5710,7 +5667,7 @@
         <w:t xml:space="preserve">results/ study_map.md</w:t>
       </w:r>
       <w:r>
-        <w:t xml:space="preserve">) gives each study’s seeds. The first fixed the matched comparison and a robustness study over 12 Latin-hypercube points (conversion 0.6–0.9 and five other behavioral parameters) and a held-out family (60 to 120 attack requests a minute, 50 000 to 500 000 addresses, heterogeneous legitimate traffic), with claims C1–C5 that we count as holding if true in 90% of cells, a benchmark convention, not a confidence level. The matched comparison changes only the destination policy and, at three block densities, selects on tuning seeds the least leakage summed over four concentrated pumpers among settings at or above the</w:t>
+        <w:t xml:space="preserve">) gives each study’s seeds. The first fixed the matched comparison and a robustness study over 12 Latin-hypercube points (conversion 0.6–0.9 and five other behavioral parameters) and a held-out family (60 to 120 attack requests a minute, 50,000 to 500,000 addresses, heterogeneous legitimate traffic), with claims C1–C5 that we count as holding if true in 90% of cells, a benchmark convention, not a confidence level. The matched comparison changes only the destination policy and, at three block densities, selects on tuning seeds the least leakage summed over four concentrated pumpers among settings at or above the</w:t>
       </w:r>
       <w:r>
         <w:t xml:space="preserve"> </w:t>
@@ -5723,7 +5680,7 @@
         <w:t xml:space="preserve">tuning target</w:t>
       </w:r>
       <w:r>
-        <w:t xml:space="preserve">, the default’s completion minus 0.5 points. The robustness study’s first run failed C1 in 32 of 108 cells because attack and no-attack runs drew different users; we fixed the pairing, a fix that followed a result, and reran every study. We wrote the second protocol (claims K1–K5) after the matched comparison had selected three counters and committed it before its runs; six of its seed values had served other robustness points, never selection. We reran both unchanged with 2.9.0 (9 919, 7 925 and 240 runs, each carrying its code hash); against 2.8.0, total leakage changed in 855 of 17 964 comparable runs, but the principal selections, eligibility decisions and claim counts did not; one auxiliary setting (false alarms matched at unbounded credit) moved from</w:t>
+        <w:t xml:space="preserve">, the default’s completion minus 0.5 points. The robustness study’s first run failed C1 in 32 of 108 cells because attack and no-attack runs drew different users; we fixed the pairing, a fix that followed a result, and reran every study. We wrote the second protocol (claims K1–K5) after the matched comparison had selected three counters and committed it before its runs; six of its seed values had served other robustness points, never selection. We reran both unchanged with 2.9.0 (9,919, 7,925, and 240 runs, each carrying its code hash); against 2.8.0, total leakage changed in 855 of 17,964 comparable runs, but the principal selections, eligibility decisions, and claim counts did not; one auxiliary setting (false alarms matched at unbounded credit) moved from</w:t>
       </w:r>
       <w:r>
         <w:t xml:space="preserve"> </w:t>
@@ -5752,8 +5709,8 @@
         <w:t xml:space="preserve">300 under both protocols (artifact change report).</w:t>
       </w:r>
     </w:p>
-    <w:bookmarkEnd w:id="67"/>
-    <w:bookmarkStart w:id="68" w:name="d.-designs-and-metrics"/>
+    <w:bookmarkEnd w:id="63"/>
+    <w:bookmarkStart w:id="64" w:name="d.-designs-and-metrics"/>
     <w:p>
       <w:pPr>
         <w:pStyle w:val="Heading2"/>
@@ -5767,7 +5724,7 @@
         <w:pStyle w:val="FirstParagraph"/>
       </w:pPr>
       <w:r>
-        <w:t xml:space="preserve">We evaluate seven designs:</w:t>
+        <w:t xml:space="preserve">We evaluated seven designs:</w:t>
       </w:r>
       <w:r>
         <w:t xml:space="preserve"> </w:t>
@@ -5953,9 +5910,9 @@
         <w:t xml:space="preserve">compares the attacked trace with attack-free operation under the same policy.</w:t>
       </w:r>
     </w:p>
-    <w:bookmarkEnd w:id="68"/>
-    <w:bookmarkEnd w:id="69"/>
-    <w:bookmarkStart w:id="90" w:name="v.-results"/>
+    <w:bookmarkEnd w:id="64"/>
+    <w:bookmarkEnd w:id="65"/>
+    <w:bookmarkStart w:id="86" w:name="v.-results"/>
     <w:p>
       <w:pPr>
         <w:pStyle w:val="Heading1"/>
@@ -5964,7 +5921,7 @@
         <w:t xml:space="preserve">V. RESULTS</w:t>
       </w:r>
     </w:p>
-    <w:bookmarkStart w:id="70" w:name="a.-what-is-contained"/>
+    <w:bookmarkStart w:id="66" w:name="a.-what-is-contained"/>
     <w:p>
       <w:pPr>
         <w:pStyle w:val="Heading2"/>
@@ -5988,7 +5945,7 @@
         <w:t xml:space="preserve"> </w:t>
       </w:r>
       <w:r>
-        <w:t xml:space="preserve">What each design leaks, and what users pay for it.</w:t>
+        <w:t xml:space="preserve">What each design leaks and what users pay for it.</w:t>
       </w:r>
     </w:p>
     <w:tbl>
@@ -6002,7 +5959,7 @@
           <w:right w:w="57" w:type="dxa"/>
         </w:tblCellMar>
         <w:tblLook w:firstRow="0" w:lastRow="0" w:firstColumn="0" w:lastColumn="0" w:noHBand="0" w:noVBand="0" w:val="0000"/>
-        <w:tblCaption w:val="TABLE 3. What each design leaks, and what users pay for it."/>
+        <w:tblCaption w:val="TABLE 3. What each design leaks and what users pay for it."/>
       </w:tblPr>
       <w:tblGrid>
         <w:gridCol w:w="2801"/>
@@ -7401,7 +7358,7 @@
         <w:pStyle w:val="BodyText"/>
       </w:pPr>
       <w:r>
-        <w:t xml:space="preserve">Table 3 gives the leaked share (%, mean of per-run shares) of about 600 attack requests in 20 minutes over 30 seeds under v1, block-limit (BL) and v2 with source caps lifted, and under v2 with caps on, with the first-time users refused and all users completing (%); supplementary Table S1 (</w:t>
+        <w:t xml:space="preserve">Table 3 lists the leaked share (%, mean of per-run shares) of approximately 600 attack requests in 20 minutes over 30 seeds under v1, block-limit (BL) and v2 with source caps lifted, and under v2 with caps on, with the first-time users refused and all users completing (%); Supplementary Table S1 (</w:t>
       </w:r>
       <w:r>
         <w:rPr>
@@ -7410,7 +7367,7 @@
         <w:t xml:space="preserve">results/ design_table.md</w:t>
       </w:r>
       <w:r>
-        <w:t xml:space="preserve">) gives every design with intervals. Datacenter rotation leaks nothing under v2 because it scores in the challenge tier and declines challenges; Step 5 refuses the premium range, and the session cap holds the single client to two messages (Table 3); in all 108 robustness cells, these attacks leaked under 5% at completion within two points of the paired no-attack run (claim C1). The walk leaks 61 [53, 70] messages before its block’s verdict (block-limit: five), and the reused profile 89 [83, 95].</w:t>
+        <w:t xml:space="preserve">) lists every design with intervals. Datacenter rotation leaks nothing under v2 because it scores in the challenge tier and declines challenges; Step 5 refuses the premium range, and the session cap holds the single client to two messages (Table 3); in all 108 robustness cells, these attacks leaked under 5% at completion within two points of the paired no-attack run (claim C1). The walk leaks 61 [53, 70] messages before its block’s verdict (block-limit: five), and the reused profile 89 [83, 95].</w:t>
       </w:r>
     </w:p>
     <w:p>
@@ -7421,8 +7378,8 @@
         <w:t xml:space="preserve">The farm leaks 99.5% with caps lifted under every design; v2’s adaptive cap holds it to 229 [215, 244] messages, 46%, by refusing 54% [47, 60] of first-time users, so 45.5% complete instead of 76.4% under v1: rationing (claim C5 held in 36 of 36 cells).</w:t>
       </w:r>
     </w:p>
-    <w:bookmarkEnd w:id="70"/>
-    <w:bookmarkStart w:id="71" w:name="b.-what-each-layer-does"/>
+    <w:bookmarkEnd w:id="66"/>
+    <w:bookmarkStart w:id="67" w:name="b.-what-each-layer-does"/>
     <w:p>
       <w:pPr>
         <w:pStyle w:val="Heading2"/>
@@ -7436,7 +7393,7 @@
         <w:pStyle w:val="FirstParagraph"/>
       </w:pPr>
       <w:r>
-        <w:t xml:space="preserve">In the ablation grid (90 effects, each conditional on all other layers, unadjusted intervals; artifact), removing the adaptive caps lets the farm leak 310 [194, 421] more messages; the risk engine, feedback loop, and block key hold the walk by 166, 152, and 121 messages, and the loop holds the reused profile by 138. The key acts only through the loop (interaction</w:t>
+        <w:t xml:space="preserve">In the ablation grid (90 effects, each conditional on all other layers, unadjusted intervals; artifact), removing the adaptive caps lets the farm leak 310 [194, 421] more messages; the risk engine, feedback loop, and block key hold the walk by 166, 152, and 121 messages, respectively, and the loop holds the reused profile by 138. The key acts only through the loop (interaction</w:t>
       </w:r>
       <w:r>
         <w:t xml:space="preserve"> </w:t>
@@ -7490,8 +7447,8 @@
         <w:t xml:space="preserve">]).</w:t>
       </w:r>
     </w:p>
-    <w:bookmarkEnd w:id="71"/>
-    <w:bookmarkStart w:id="72" w:name="c.-where-reputation-stops-separating"/>
+    <w:bookmarkEnd w:id="67"/>
+    <w:bookmarkStart w:id="68" w:name="c.-where-reputation-stops-separating"/>
     <w:p>
       <w:pPr>
         <w:pStyle w:val="Heading2"/>
@@ -7508,8 +7465,8 @@
         <w:t xml:space="preserve">A farmed-CAPTCHA attacker uses an address and fingerprint once and shares its country, prefix, and residential ASN with every legitimate user; thus, its failures penalize everyone: over an hour with caps lifted (five seeds), up to twice the legitimate rate, 99 to 100% of it leaks, since a shared key stays above 0.3 conversion until failures outnumber legitimate sends about 1.7 to one. At ten times, 70% leaks while 17% of legitimate users are challenged and 3.2% refused (claim C2, at least 90% leaked with caps lifted, held in 34 of 36 cells). No single score change separates better: a fresh-fingerprint weight of 40 stops it only by challenging 47% of legitimate users. In the settings run, reputation separated an attacker only on keys its sends dominated [9].</w:t>
       </w:r>
     </w:p>
-    <w:bookmarkEnd w:id="72"/>
-    <w:bookmarkStart w:id="73" w:name="d.-what-rationing-costs"/>
+    <w:bookmarkEnd w:id="68"/>
+    <w:bookmarkStart w:id="69" w:name="d.-what-rationing-costs"/>
     <w:p>
       <w:pPr>
         <w:pStyle w:val="Heading2"/>
@@ -7523,11 +7480,11 @@
         <w:pStyle w:val="FirstParagraph"/>
       </w:pPr>
       <w:r>
-        <w:t xml:space="preserve">When separation fails, the cap is the lever: over ten seeds, the default lets 47% of the farm’s requests through and refuses 41% of all legitimate users, the tightest setting 20% and 64%. Both assume an oracle job that is told the legitimate rate and runs every minute; running every five minutes or hourly, it lets 75%–96% through. Learning the rate from the pipeline’s counters, the deployed job leaks 193 [161, 229] messages with a clean three-week profile, 340 [239, 441] more on a cold start, 106 [62, 151] more with a stale profile, and 45 [10, 77] more with a poisoned one.</w:t>
-      </w:r>
-    </w:p>
-    <w:bookmarkEnd w:id="73"/>
-    <w:bookmarkStart w:id="74" w:name="e.-pumping-against-the-tests"/>
+        <w:t xml:space="preserve">When separation fails, the cap is the lever: over ten seeds, the default lets 47% of the farm’s requests through and refuses 41% of all legitimate users, the tightest setting being 20% and 64%. Both assume an oracle job that is told the legitimate rate and runs every minute; running every five minutes or hourly, it lets 75%–96% of the farm’s requests through. Learning the rate from the pipeline counters, the deployed job leaked 193 [161, 229] messages with a clean three-week profile, 340 [239, 441] more on a cold start, 106 [62, 151] more with a stale profile, and 45 [10, 77] more with a poisoned one.</w:t>
+      </w:r>
+    </w:p>
+    <w:bookmarkEnd w:id="69"/>
+    <w:bookmarkStart w:id="70" w:name="e.-pumping-against-the-tests"/>
     <w:p>
       <w:pPr>
         <w:pStyle w:val="Heading2"/>
@@ -7541,7 +7498,7 @@
         <w:pStyle w:val="FirstParagraph"/>
       </w:pPr>
       <w:r>
-        <w:t xml:space="preserve">We ran concentrated pumpers on three blocks with caps lifted over ten seeds, about 574 requests in 20 minutes, and recorded the messages leaked, the runs in which the tests contained the attack, the minutes to containment and to the first verdict, and the codes the carrier entered. A carrier that never verifies leaked 570 [419, 736] messages under v1, which contains nothing, and 90 [71, 114] under the v2 default, which contained all ten runs at minute 3.5 [3.1, 3.9] after a first verdict at minute 3.0; a carrier that buys every challenge solution leaked 106 [87, 127] and was contained in all ten runs at minute 4.3. The speed test catches a carrier verifying within a second at 19 [17, 21] messages, contained at minute 1.4 after 19 codes entered, while the carrier verifying 60% of its codes with human-like delay was contained in none of the ten 20-minute runs: it entered 272 codes, its first verdict came at minute 11.6 on average and 452 [365, 539] messages leaked; in an hour, 1 067 [839, 1 310] leaked and two of ten runs were contained, at minute 47.0 on average. Claim C3 (containment with at most 30% leaked) held in 36 of 36 cells.</w:t>
+        <w:t xml:space="preserve">We ran concentrated pumpers on three blocks with caps lifted over ten seeds, about 574 requests in 20 minutes, and recorded the messages leaked, the runs in which the tests contained the attack, the minutes to containment and to the first verdict, and the codes the carrier entered. A carrier that never verified leaked 570 [419, 736] messages under v1, which contained nothing, and 90 [71, 114] under the v2 default, which contained all ten runs at minute 3.5 [3.1, 3.9] after a first verdict at minute 3.0; a carrier that buys every challenge solution leaked 106 [87, 127] and was contained in all ten runs at minute 4.3. The speed test catches a carrier verifying within a second at 19 [17, 21] messages, contained at minute 1.4 after 19 codes entered, while the carrier verifying 60% of its codes with human-like delay was contained in none of the ten 20-minute runs: it entered 272 codes, its first verdict came at minute 11.6 on average and 452 [365, 539] messages leaked; in an hour, 1,067 [839, 1,310] leaked and two of ten runs were contained, at minute 47.0 on average. Claim C3 (containment with at most 30% leaked) held in 36 of 36 cells.</w:t>
       </w:r>
     </w:p>
     <w:p>
@@ -7549,11 +7506,11 @@
         <w:pStyle w:val="BodyText"/>
       </w:pPr>
       <w:r>
-        <w:t xml:space="preserve">Across 18 spread configurations, leakage follows the blocks touched: with 30 blocks, five to seven runs in ten are still contained.</w:t>
-      </w:r>
-    </w:p>
-    <w:bookmarkEnd w:id="74"/>
-    <w:bookmarkStart w:id="87" w:name="f.-counting-against-testing"/>
+        <w:t xml:space="preserve">Across 18 spread configurations, leakage follows the blocks touched: with 30 blocks, five to seven runs in ten remain contained.</w:t>
+      </w:r>
+    </w:p>
+    <w:bookmarkEnd w:id="70"/>
+    <w:bookmarkStart w:id="83" w:name="f.-counting-against-testing"/>
     <w:p>
       <w:pPr>
         <w:pStyle w:val="Heading2"/>
@@ -7577,7 +7534,7 @@
         <w:t xml:space="preserve"> </w:t>
       </w:r>
       <w:r>
-        <w:t xml:space="preserve">Counting against testing at the service target.</w:t>
+        <w:t xml:space="preserve">Counting against testing at the service target level.</w:t>
       </w:r>
     </w:p>
     <w:tbl>
@@ -7591,7 +7548,7 @@
           <w:right w:w="57" w:type="dxa"/>
         </w:tblCellMar>
         <w:tblLook w:firstRow="1" w:lastRow="0" w:firstColumn="0" w:lastColumn="0" w:noHBand="0" w:noVBand="0" w:val="0020"/>
-        <w:tblCaption w:val="TABLE 4. Counting against testing at the service target."/>
+        <w:tblCaption w:val="TABLE 4. Counting against testing at the service target level."/>
       </w:tblPr>
       <w:tblGrid>
         <w:gridCol w:w="4053"/>
@@ -8735,7 +8692,7 @@
         </w:tc>
       </w:tr>
     </w:tbl>
-    <w:bookmarkStart w:id="75" w:name="at-a-service-target"/>
+    <w:bookmarkStart w:id="71" w:name="at-a-service-target"/>
     <w:p>
       <w:pPr>
         <w:pStyle w:val="Heading3"/>
@@ -8749,7 +8706,7 @@
         <w:pStyle w:val="FirstParagraph"/>
       </w:pPr>
       <w:r>
-        <w:t xml:space="preserve">Table 4 reports the first protocol at 200 blocks (144 legitimate sends per block a day; tuning seeds 100–102, evaluation seeds 0–9): 20-minute leakage against the never-verifying (NV), instant (IV), human-like (HL) and challenge-buying (CB) carriers and, from 24-hour attack-free runs at 65% conversion, completion, benign cost (points), users challenged and verdict events a day; the tuning target is 63.95%. A setting is named by its rule, threshold and credit, so</w:t>
+        <w:t xml:space="preserve">Table 4 reports the first protocol at 200 blocks (144 legitimate sends per block a day; tuning seeds 100–102, evaluation seeds 0–9): 20-minute leakage against the never-verifying (NV), instant (IV), human-like (HL), and challenge-buying (CB) carriers and, from 24-hour attack-free runs at 65% conversion, completion, benign cost (points), users challenged and verdict events a day; the tuning target is 63.95%. A setting is named by its rule, threshold, and credit; therefore,</w:t>
       </w:r>
       <w:r>
         <w:t xml:space="preserve"> </w:t>
@@ -8787,7 +8744,7 @@
         <w:t xml:space="preserve">results/ figure1_key.md</w:t>
       </w:r>
       <w:r>
-        <w:t xml:space="preserve">. Paired per seed against the default tests, the selected counter leaked 66 [47, 89] fewer messages against the never-verifying carrier, 428 [340, 515] fewer against the human-like one and 58 [39, 79] fewer against the challenge buyer, and 6 [3, 7] more against the instant verifier; the sequential setting selected at the tuning target leaked 327 [241, 408] fewer against the human-like carrier and 2 to 7 fewer against the other three; the daily counter leaked 44 [3, 84] fewer against the human-like carrier and 229 to 391 more against the rest. The sequential setting selected at the tuning target holds the human-like carrier to 126 messages only by raising 334 false verdict events a day, and misses the target by 0.18 points on seeds 0–9. The graded counter of four sends per block per ten minutes leaks 24 against each outcome-reading carrier and 48 against the challenge buyer, at 0.06 points; counters selected at the sparser settings leak 6 to 18 at 0.15 to 0.35 points (up to 0.43 at 80%). The selection is not an artifact of the objective: with the full grid and density-specific attacks (E5), and under other objectives on the tuning runs (worst-case leakage, a first-time-loss constraint, each attacker alone, 2 000 random mixes), the rule selects the same counters, except for the instant verifier alone and 3 of the mixes at 200 blocks.</w:t>
+        <w:t xml:space="preserve">. Paired per seed against the default tests, the selected counter leaked 66 [47, 89] fewer messages against the never-verifying carrier, 428 [340, 515] fewer against the human-like one, and 58 [39, 79] fewer against the challenge buyer, and 6 [3, 7] more against the instant verifier; the sequential setting selected at the tuning target leaked 327 [241, 408] fewer against the human-like carrier and 2 to 7 fewer against the other three; the daily counter leaked 44 [3, 84] fewer against the human-like carrier and 229 to 391 more against the rest. The sequential setting selected at the tuning target holds the human-like carrier to 126 messages only by raising 334 false verdict events a day, and misses the target by 0.18 points on seeds 0–9. The graded counter of four sends per block per ten minutes leaks 24 against each outcome-reading carrier and 48 against the challenge buyer, at 0.06 points; counters selected at the sparser settings leak 6 to 18 at 0.15 to 0.35 points (up to 0.43 at 80%). The selection is not an artifact of the objective: with the full grid and density-specific attacks (E5), and under other objectives on the tuning runs (worst-case leakage, a first-time-loss constraint, each attacker alone, 2,000 random mixes), the rule selects the same counters, except for the instant verifier alone and 3 of the mixes at 200 blocks.</w:t>
       </w:r>
     </w:p>
     <w:p>
@@ -8805,7 +8762,7 @@
         <w:t xml:space="preserve"> </w:t>
       </w:r>
       <w:r>
-        <w:t xml:space="preserve">The frozen counter on seeds and workloads it had never seen.</w:t>
+        <w:t xml:space="preserve">The frozen counter on seeds and workloads that it had never seen.</w:t>
       </w:r>
     </w:p>
     <w:tbl>
@@ -8819,7 +8776,7 @@
           <w:right w:w="57" w:type="dxa"/>
         </w:tblCellMar>
         <w:tblLook w:firstRow="1" w:lastRow="0" w:firstColumn="0" w:lastColumn="0" w:noHBand="0" w:noVBand="0" w:val="0020"/>
-        <w:tblCaption w:val="TABLE 5. The frozen counter on seeds and workloads it had never seen."/>
+        <w:tblCaption w:val="TABLE 5. The frozen counter on seeds and workloads that it had never seen."/>
       </w:tblPr>
       <w:tblGrid>
         <w:gridCol w:w="648"/>
@@ -9419,8 +9376,8 @@
         </w:tc>
       </w:tr>
     </w:tbl>
-    <w:bookmarkEnd w:id="75"/>
-    <w:bookmarkStart w:id="76" w:name="on-held-out-traffic"/>
+    <w:bookmarkEnd w:id="71"/>
+    <w:bookmarkStart w:id="72" w:name="on-held-out-traffic"/>
     <w:p>
       <w:pPr>
         <w:pStyle w:val="Heading3"/>
@@ -9434,7 +9391,7 @@
         <w:pStyle w:val="FirstParagraph"/>
       </w:pPr>
       <w:r>
-        <w:t xml:space="preserve">Table 5 covers 12 shifted points of the held-out family, with held-out attack rates and pools, three seeds each and a 20-minute pumper on three blocks real users share; a claim holds if true in 90% of cells, which share workloads and seeds and are not independent, and IV marks the instant verifier’s cells. Frozen and run on this family, the counter leaked 33, 34, 33, and 62 messages against the four carriers, where the default leaked 287, 36, 344, and 287, and no policy 451 to 1 857, at a benign cost of 0.13 [0.09, 0.17] points, and failed both service-under-attack claims: 13 of the 17 cells that broke K3 lie at the three points with the most legitimate traffic, where users and pumper compete for one quota; K5 failed in 51 cells over 11 of 12 points. The counters selected for sparser traffic cost 4.7 and 5.8 points here even without an attack: the quota must match the traffic.</w:t>
+        <w:t xml:space="preserve">Table 5 covers 12 shifted points of the held-out family, with held-out attack rates and pools, three seeds each and a 20-minute pumper on three blocks real users share; a claim holds if true in 90% of cells, which share workloads and seeds and are not independent, and IV marks the instant verifier’s cells. Frozen and run on this family, the counter leaked 33, 34, 33, and 62 messages against the four carriers, where the default leaked 287, 36, 344, and 287, and no policy 451 to 1,857, at a benign cost of 0.13 [0.09, 0.17] points, and failed both service-under-attack claims: 13 of the 17 cells that broke K3 lie at the three points with the most legitimate traffic, where users and pumper compete for one quota; K5 failed in 51 cells over 11 of 12 points. The counters selected for sparser traffic cost 4.7 and 5.8 points here even without an attack: the quota must match the traffic.</w:t>
       </w:r>
     </w:p>
     <w:p>
@@ -9452,7 +9409,7 @@
         <w:t xml:space="preserve"> </w:t>
       </w:r>
       <w:r>
-        <w:t xml:space="preserve">A pumper on blocks that real users share: what leaks and who pays.</w:t>
+        <w:t xml:space="preserve">A pumper on blocks that real users share: What leaks and who pays.</w:t>
       </w:r>
     </w:p>
     <w:tbl>
@@ -9466,7 +9423,7 @@
           <w:right w:w="57" w:type="dxa"/>
         </w:tblCellMar>
         <w:tblLook w:firstRow="0" w:lastRow="0" w:firstColumn="0" w:lastColumn="0" w:noHBand="0" w:noVBand="0" w:val="0000"/>
-        <w:tblCaption w:val="TABLE 6. A pumper on blocks that real users share: what leaks and who pays."/>
+        <w:tblCaption w:val="TABLE 6. A pumper on blocks that real users share: What leaks and who pays."/>
       </w:tblPr>
       <w:tblGrid>
         <w:gridCol w:w="1845"/>
@@ -9847,7 +9804,7 @@
               <w:rPr>
                 <w:sz w:val="17"/>
               </w:rPr>
-              <w:t xml:space="preserve">1 200)</w:t>
+              <w:t xml:space="preserve">1,200)</w:t>
             </w:r>
           </w:p>
         </w:tc>
@@ -9976,7 +9933,7 @@
               <w:rPr>
                 <w:sz w:val="17"/>
               </w:rPr>
-              <w:t xml:space="preserve">5 509 [4 409, 6 567]</w:t>
+              <w:t xml:space="preserve">5,509 [4,409, 6,567]</w:t>
             </w:r>
           </w:p>
         </w:tc>
@@ -10104,7 +10061,7 @@
               <w:rPr>
                 <w:sz w:val="17"/>
               </w:rPr>
-              <w:t xml:space="preserve">1 149 [953, 1 340]</w:t>
+              <w:t xml:space="preserve">1,149 [953, 1,340]</w:t>
             </w:r>
           </w:p>
         </w:tc>
@@ -10932,7 +10889,7 @@
         <w:t xml:space="preserve">c</w:t>
       </w:r>
       <w:r>
-        <w:t xml:space="preserve">0: 22). Against a poisoner flooding all 200 blocks for an hour on the same seeds, the tests leaked less than the counters but cost users more: of 1 976 messages with no policy,</w:t>
+        <w:t xml:space="preserve">0: 22). Against a poisoner flooding all 200 blocks for an hour on the same seeds, the tests leaked less than the counters but cost users more: of 1,976 messages with no policy,</w:t>
       </w:r>
       <w:r>
         <w:t xml:space="preserve"> </w:t>
@@ -10958,11 +10915,11 @@
         <w:t xml:space="preserve">c</w:t>
       </w:r>
       <w:r>
-        <w:t xml:space="preserve">0 leaked 858 at an extra harm to all users of 2.55 [2.04, 3.07] points, the default tests 1 357 at 1.09 [0.59, 1.59] and the counter 1 662 at 0.72 [0.44, 1.02], and the token buckets spared the poisoner’s users only by letting almost everything through. Returning users, all simulated with verified history, lost nothing.</w:t>
-      </w:r>
-    </w:p>
-    <w:bookmarkEnd w:id="76"/>
-    <w:bookmarkStart w:id="86" w:name="the-counters-boundary"/>
+        <w:t xml:space="preserve">0 leaked 858 at an extra harm to all users of 2.55 [2.04, 3.07] points, the default tests 1,357 at 1.09 [0.59, 1.59] and the counter 1,662 at 0.72 [0.44, 1.02], and the token buckets spared the poisoner’s users only by letting almost everything through. Returning users, all simulated with verified history, lost nothing.</w:t>
+      </w:r>
+    </w:p>
+    <w:bookmarkEnd w:id="72"/>
+    <w:bookmarkStart w:id="82" w:name="the-counters-boundary"/>
     <w:p>
       <w:pPr>
         <w:pStyle w:val="Heading3"/>
@@ -10988,18 +10945,18 @@
           <wp:inline>
             <wp:extent cx="5334000" cy="3946421"/>
             <wp:effectExtent b="0" l="0" r="0" t="0"/>
-            <wp:docPr descr="" title="" id="78" name="Picture"/>
+            <wp:docPr descr="" title="" id="74" name="Picture"/>
             <a:graphic>
               <a:graphicData uri="http://schemas.openxmlformats.org/drawingml/2006/picture">
                 <pic:pic>
                   <pic:nvPicPr>
-                    <pic:cNvPr descr="figures/fig7a_service.png" id="79" name="Picture"/>
+                    <pic:cNvPr descr="figures/fig7a_service.png" id="75" name="Picture"/>
                     <pic:cNvPicPr>
                       <a:picLocks noChangeArrowheads="1" noChangeAspect="1"/>
                     </pic:cNvPicPr>
                   </pic:nvPicPr>
                   <pic:blipFill>
-                    <a:blip r:embed="rId77"/>
+                    <a:blip r:embed="rId73"/>
                     <a:stretch>
                       <a:fillRect/>
                     </a:stretch>
@@ -11061,18 +11018,18 @@
           <wp:inline>
             <wp:extent cx="5334000" cy="3946421"/>
             <wp:effectExtent b="0" l="0" r="0" t="0"/>
-            <wp:docPr descr="" title="" id="81" name="Picture"/>
+            <wp:docPr descr="" title="" id="77" name="Picture"/>
             <a:graphic>
               <a:graphicData uri="http://schemas.openxmlformats.org/drawingml/2006/picture">
                 <pic:pic>
                   <pic:nvPicPr>
-                    <pic:cNvPr descr="figures/fig7b_security20.png" id="82" name="Picture"/>
+                    <pic:cNvPr descr="figures/fig7b_security20.png" id="78" name="Picture"/>
                     <pic:cNvPicPr>
                       <a:picLocks noChangeArrowheads="1" noChangeAspect="1"/>
                     </pic:cNvPicPr>
                   </pic:nvPicPr>
                   <pic:blipFill>
-                    <a:blip r:embed="rId80"/>
+                    <a:blip r:embed="rId76"/>
                     <a:stretch>
                       <a:fillRect/>
                     </a:stretch>
@@ -11114,7 +11071,7 @@
         <w:t xml:space="preserve"> </w:t>
       </w:r>
       <w:r>
-        <w:t xml:space="preserve">Leakage in twenty minutes against the blocks a pumper spreads over.</w:t>
+        <w:t xml:space="preserve">Leakage in 20 min against the blocks a pumper spreads over.</w:t>
       </w:r>
     </w:p>
     <w:p>
@@ -11122,7 +11079,7 @@
         <w:pStyle w:val="BodyText"/>
       </w:pPr>
       <w:r>
-        <w:t xml:space="preserve">Figure 8 sets the hour-long attack at full rate against the estimates of Section III-G, computed from each run’s offered requests, offered rate and the configured timeouts, nothing fitted: Equation (2) for the tests and Equations (3) and (4) for the counter’s cold- and warm-start bounds, drawn hollow on dotted lines (the 20-minute estimates are in</w:t>
+        <w:t xml:space="preserve">Figure 8 shows the hour-long attack at full rate against the estimates of Section III-G, computed from each run’s offered requests, offered rate, and configured timeouts, nothing fitted: Equation (2) for the tests and Equations (3) and (4) for the counter’s cold- and warm-start bounds, drawn hollow on dotted lines (the 20-minute estimates are in</w:t>
       </w:r>
       <w:r>
         <w:t xml:space="preserve"> </w:t>
@@ -11134,7 +11091,7 @@
         <w:t xml:space="preserve">results/ condition_check.json</w:t>
       </w:r>
       <w:r>
-        <w:t xml:space="preserve">). Over 60 minutes the default leaked 110, 144 and 242 messages on 3, 10 and 30 blocks, against 105, 139 and 240 from Equation (2) (</w:t>
+        <w:t xml:space="preserve">). Over 60 min, the default leaked 110, 144, and 242 messages on 3, 10, and 30 blocks, against 105, 139, and 240 from Equation (2) (</w:t>
       </w:r>
       <m:oMath>
         <m:r>
@@ -11154,7 +11111,7 @@
         </m:r>
       </m:oMath>
       <w:r>
-        <w:t xml:space="preserve">), and the counter 71, 240 and 679 against its cold-start bound of 72, 240 and 720; setting aside the exempt sends to real users’ trusted numbers, no run that started cold exceeded Equation (3) and none exceeded Equation (4). With these unfitted inputs Equation (5) ordered the policies’ mean leakage in 18 of 18 decisive cells (two ties at</w:t>
+        <w:t xml:space="preserve">), and the counter 71, 240, and 679 against its cold-start bound of 72, 240, and 720; setting aside the exempt sends to real users’ trusted numbers, no run that started cold exceeded Equation (3) and none exceeded Equation (4). With these unfitted inputs Equation (5) ordered the policies’ mean leakage in 18 of 18 decisive cells (two ties at</w:t>
       </w:r>
       <w:r>
         <w:t xml:space="preserve"> </w:t>
@@ -11165,7 +11122,7 @@
         </m:r>
       </m:oMath>
       <w:r>
-        <w:t xml:space="preserve">), and with the warm-start term in 17, missing where the two estimates differ by 0.8 messages (30 blocks, 20 minutes; measured difference 6.6 [−27.2, 42.4]). The algebraic crossing lies near five blocks for an hour and 30 for twenty minutes, where the nearest measured differences do not exclude zero; it is not a measured switching point.</w:t>
+        <w:t xml:space="preserve">), and with the warm-start term in 17, missing where the two estimates differ by 0.8 messages (30 blocks, 20 minutes; measured difference 6.6 [−27.2, 42.4]). The algebraic crossing lies near five blocks for an hour and 30 for 20 min, where the nearest measured differences do not exclude zero; it is not a measured switching point.</w:t>
       </w:r>
     </w:p>
     <w:p>
@@ -11177,18 +11134,18 @@
           <wp:inline>
             <wp:extent cx="5334000" cy="3946421"/>
             <wp:effectExtent b="0" l="0" r="0" t="0"/>
-            <wp:docPr descr="" title="" id="84" name="Picture"/>
+            <wp:docPr descr="" title="" id="80" name="Picture"/>
             <a:graphic>
               <a:graphicData uri="http://schemas.openxmlformats.org/drawingml/2006/picture">
                 <pic:pic>
                   <pic:nvPicPr>
-                    <pic:cNvPr descr="figures/fig7c_security60.png" id="85" name="Picture"/>
+                    <pic:cNvPr descr="figures/fig7c_security60.png" id="81" name="Picture"/>
                     <pic:cNvPicPr>
                       <a:picLocks noChangeArrowheads="1" noChangeAspect="1"/>
                     </pic:cNvPicPr>
                   </pic:nvPicPr>
                   <pic:blipFill>
-                    <a:blip r:embed="rId83"/>
+                    <a:blip r:embed="rId79"/>
                     <a:stretch>
                       <a:fillRect/>
                     </a:stretch>
@@ -11230,7 +11187,7 @@
         <w:t xml:space="preserve"> </w:t>
       </w:r>
       <w:r>
-        <w:t xml:space="preserve">Leakage in an hour, measured and estimated from the rules.</w:t>
+        <w:t xml:space="preserve">Leakage in 1 h, measured and estimated from the rules.</w:t>
       </w:r>
     </w:p>
     <w:p>
@@ -11238,18 +11195,97 @@
         <w:pStyle w:val="BodyText"/>
       </w:pPr>
       <w:r>
-        <w:t xml:space="preserve">Against adaptive attackers (E3), the counter held the threshold-aware carrier, receipt faker, and concentrated trust builder to 24 to 36 messages (502 to 665 under the default), but not trust builders on random numbers (577, as under the default); over 360 minutes, the human-like carrier gained 81 messages an hour under the counter, and 753 under the default. With caps lifted and no counter, a threshold-aware carrier and a receipt faker leak 570 each, drawing no verdict, and a datacenter attacker buying every challenge solution 55; the leakages of these scripted adaptations are not bounds.</w:t>
-      </w:r>
-    </w:p>
+        <w:t xml:space="preserve">Against adaptive attackers (E3), the counter held the threshold-aware carrier, receipt faker, and concentrated trust builder to 24 to 36 messages (502 to 665 under the default), but not trust builders on random numbers (577, as under the default); over 360 minutes, the human-like carrier gained 81 messages an hour under the counter, and 753 under the default. With caps lifted and no counter, a threshold-aware carrier and a receipt faker leaked 570 each, drawing no verdict, and a datacenter attacker that bought every challenge solution 55; the leakages of these scripted adaptations are not upper bounds.</w:t>
+      </w:r>
+    </w:p>
+    <w:bookmarkEnd w:id="82"/>
+    <w:bookmarkEnd w:id="83"/>
+    <w:bookmarkStart w:id="84" w:name="g.-the-cost-to-legitimate-users"/>
+    <w:p>
+      <w:pPr>
+        <w:pStyle w:val="Heading2"/>
+      </w:pPr>
+      <w:r>
+        <w:t xml:space="preserve">G. THE COST TO LEGITIMATE USERS</w:t>
+      </w:r>
+    </w:p>
+    <w:p>
+      <w:pPr>
+        <w:pStyle w:val="FirstParagraph"/>
+      </w:pPr>
+      <w:r>
+        <w:t xml:space="preserve">On one block, 20,000 Monte Carlo trials per cell give the probability of a verdict within 30 legitimate sends: 0.09% [0.06, 0.14] at 80% conversion with 20% autofill, 1.9% at 65% and 19.5% at 50%. Over 24 hours, the default raises 0.5 verdict events per day on 200 busy blocks at 80% conversion and 6.5 at 65%, where they meet 30 of about 28,800 requests (claim C4 held in 18 of 18 cells).</w:t>
+      </w:r>
+    </w:p>
+    <w:p>
+      <w:pPr>
+        <w:pStyle w:val="BodyText"/>
+      </w:pPr>
+      <w:r>
+        <w:t xml:space="preserve">A poisoner flooding for 20 min the 20 blocks legitimate users concentrate on (caps lifted, ten seeds) raises 16 verdict events meeting 98 legitimate requests, 33 never completing; against observe-only operation on the same trace, enforcement costs 12.7 [4.6, 22.9] completions, 3.1% of users. One that stops after ten minutes leaves verdicts meeting 406.5 requests afterwards, an attributable loss of 46.2 [16.9, 79.8]. Grading limits the harm; it caps it neither at the challenge nor at the attack duration.</w:t>
+      </w:r>
+    </w:p>
+    <w:bookmarkEnd w:id="84"/>
+    <w:bookmarkStart w:id="85" w:name="h.-economics-and-overhead"/>
+    <w:p>
+      <w:pPr>
+        <w:pStyle w:val="Heading2"/>
+      </w:pPr>
+      <w:r>
+        <w:t xml:space="preserve">H. ECONOMICS AND OVERHEAD</w:t>
+      </w:r>
+    </w:p>
+    <w:p>
+      <w:pPr>
+        <w:pStyle w:val="FirstParagraph"/>
+      </w:pPr>
+      <w:r>
+        <w:t xml:space="preserve">If pumpers earn a share of the 0.1422 USD retail price and pay an event-level bill, they break even at a share of 0.043 under v1 and 0.054 to 0.271 under v2 (the instant verifier 1.310); over 360 minutes under the counter, the human-like carrier needs 1.048. These are break-even shares for scripted attackers under assumed prices, not bounds or criminal profit. On a real Redis (four vCPUs, four workers), sends took 13.8 ms (median) and 21.1 ms (99th percentile), and 133 requests per second passed at concurrency 128 with the 400 ms floor and 50 ms vendor calls; under an adversarial mixture, 81% of sends overran the floor and response-time thresholds separated sends from refusals with 88% balanced accuracy, a separation on that machine, not a deployment accuracy.</w:t>
+      </w:r>
+    </w:p>
+    <w:bookmarkEnd w:id="85"/>
     <w:bookmarkEnd w:id="86"/>
+    <w:bookmarkStart w:id="87" w:name="vi.-discussion"/>
+    <w:p>
+      <w:pPr>
+        <w:pStyle w:val="Heading1"/>
+      </w:pPr>
+      <w:r>
+        <w:t xml:space="preserve">VI. DISCUSSION</w:t>
+      </w:r>
+    </w:p>
+    <w:p>
+      <w:pPr>
+        <w:pStyle w:val="FirstParagraph"/>
+      </w:pPr>
+      <w:r>
+        <w:t xml:space="preserve">In the scripted workloads, carriers that verify with human-like delay, fake receipts, or know the thresholds defeated our outcome tests but not a short-window counter: within an hour of a verdict, the counter’s allowance, unlike the tests’, grows with the windows an attack spans, while over longer campaigns verdicts expire and the tests leak again. Equation (5) summarizes this for pumpers that solve no challenge and hold no exemption; its inputs are in an operator’s logs, whereas the cost of an excess send, competition under attack, and exemption abuse come only from the simulation. Supplementary Table S1 sets the seven designs of Section IV against the nine source-side attackers on the same traffic and seeds, with source caps lifted so that only the behavioral layers act; each design adds one thing to the baseline, and its differences from the v1 and v2 columns of Table 3 say what it bought. Correcting the platform header alone changed only the forged-header attack, from 100% to 99.5%, because that attacker is the farm with a header. The behavioral layers of v2 removed datacenter rotation (69% to 0) and most of the reused profile (99.5% to 22.5%), and the two block tests differ only on the walked numbers (11.5% against 13.3%). No design separates the residential bot (37.2%) or the farm (99.5%); those are held only by the adaptive caps of Table 3, at the price Section V-D reports. On the destination, against the never-verifying pumper v1 leaked 570 messages, the default tests 90 and the selected counter 24, and under the shared-block pumper of Table 6 the counter leaked 403 where the default tests leaked 1,149 and no policy 5,509, neither policy costing all users anything on average.</w:t>
+      </w:r>
+    </w:p>
+    <w:p>
+      <w:pPr>
+        <w:pStyle w:val="BodyText"/>
+      </w:pPr>
+      <w:r>
+        <w:t xml:space="preserve">The nearest external work, set out in Table 1, can be compared only on what each needs and reports, since none ran on the same traffic. Huh et al. [4] report 89.6% recall at 0.19% false positives for a supervised model on one service’s real logs; the attack it targets, a few requests per identity over many fresh identities, is the farm here, which our layers do not separate and the caps only ration, at 54% of first-time users refused, while what the layers contain without labels are the attacks with a signature in the request and most of the reused profile. Zaliskyi and Odarchenko [8] report that fixed-window prefix counts blocked 95% and 63% of two incidents at the price of 58% of a legitimate campaign; our graded counter is the same family of control, a ten-minute window on a 10,000-number block with a challenge rather than a 24-hour quarantine, and it leaked 24 of about 574 requests from each outcome-reading pumper at an attack-free cost of 0.06 points of completion, on simulated traffic with no campaigns in it, and failed its service claims on blocks the attacker shares. Twilio’s products state claimed false-positive rates and report no leakage. What we report that none of the three does is an attack-free benign cost, a cost under attack for the users who share a block with the attacker, a selection fixed before the evaluation runs and tested on held-out seeds and workloads, and an implementation anyone can run; what the three have and we lack is real traffic.</w:t>
+      </w:r>
+    </w:p>
+    <w:p>
+      <w:pPr>
+        <w:pStyle w:val="BodyText"/>
+      </w:pPr>
+      <w:r>
+        <w:t xml:space="preserve">The limitations follow from the method. We simulated everything and assumed the calibration, and we wrote both protocols for our own generator, the second knowing which counters had won. Some results follow from the generator (a perfect premium list, a datacenter attacker that declines challenges, returning users who always present verified history), and our selection rule used an unweighted sum of four scripted pumpers’ leakage and a mean service target met on tuning seeds, which guarantees no service level elsewhere. Close rankings rest on ten or fewer seeds, and costs that round to zero are not shown equivalent. Per-client quotas within a block, carrier spend ceilings, bounded exemptions, tuned token buckets, and other sequential statistics lie outside the evaluated policies. Vendor adapters are untested live, and the timing result holds only for the observer tested. Destination policies challenge people for what strangers sharing their block did, and deployment under the GDPR or Saudi Arabia’s PDPL needs a lawful basis and a route for refused users.</w:t>
+      </w:r>
+    </w:p>
     <w:bookmarkEnd w:id="87"/>
-    <w:bookmarkStart w:id="88" w:name="g.-the-cost-to-legitimate-users"/>
-    <w:p>
-      <w:pPr>
-        <w:pStyle w:val="Heading2"/>
-      </w:pPr>
-      <w:r>
-        <w:t xml:space="preserve">G. THE COST TO LEGITIMATE USERS</w:t>
+    <w:bookmarkStart w:id="88" w:name="vii.-conclusion"/>
+    <w:p>
+      <w:pPr>
+        <w:pStyle w:val="Heading1"/>
+      </w:pPr>
+      <w:r>
+        <w:t xml:space="preserve">VII. CONCLUSION</w:t>
       </w:r>
     </w:p>
     <w:p>
@@ -11257,25 +11293,17 @@
         <w:pStyle w:val="FirstParagraph"/>
       </w:pPr>
       <w:r>
-        <w:t xml:space="preserve">On one block, 20 000 Monte Carlo trials per cell give the probability of a verdict within 30 legitimate sends: 0.09% [0.06, 0.14] at 80% conversion with 20% autofill, 1.9% at 65% and 19.5% at 50%. Over 24 hours, the default raises 0.5 verdict events a day on 200 busy blocks at 80% conversion and 6.5 at 65%, where they meet 30 of about 28 800 requests (claim C4 held in 18 of 18 cells).</w:t>
-      </w:r>
-    </w:p>
-    <w:p>
-      <w:pPr>
-        <w:pStyle w:val="BodyText"/>
-      </w:pPr>
-      <w:r>
-        <w:t xml:space="preserve">A poisoner flooding for 20 min the 20 blocks legitimate users concentrate on (caps lifted, ten seeds) raises 16 verdict events meeting 98 legitimate requests, 33 never completing; against observe-only operation on the same trace, enforcement costs 12.7 [4.6, 22.9] completions, 3.1% of users. One that stops after ten minutes leaves verdicts meeting 406.5 requests afterwards, an attributable loss of 46.2 [16.9, 79.8]. Grading limits the harm; it caps it neither at the challenge nor at the attack’s duration.</w:t>
+        <w:t xml:space="preserve">In this work, we asked which of the two label-free destination signals a service that verifies phone numbers by SMS should act on when a pumper is paid at the destination, and we answered it in simulation, inside a twelve-step defense evaluated against a seven-control baseline, five simpler designs, and 25 attacker profiles under two protocols committed before their runs. The design contains the attacks that carry a signature in the request at a low cost to simulated users, while a residential attacker that resembles a person can only be rationed, at a price set by how well the cap tracks the legitimate rate. On the destination, a counter of sends per number block whose quota matches the block’s traffic leaked less than tests of code outcomes against short, concentrated pumping and cost its users less, but it failed its service claims on blocks the attacker shares and lost its advantage against paced or widely spread pumpers; estimates derived from the rules alone ordered the two policies in 18 of 18 decisive cells. Every number describes scripted attackers and simulated users under assumed calibration, and close rankings rest on ten or fewer seeds. Replaying real traffic is the experiment this work most needs; the policies left outside the evaluation, per-client quotas within a block, bounded exemptions, tuned token buckets, and time-uniform statistics, could then be compared under the same protocols.</w:t>
       </w:r>
     </w:p>
     <w:bookmarkEnd w:id="88"/>
-    <w:bookmarkStart w:id="89" w:name="h.-economics-and-overhead"/>
-    <w:p>
-      <w:pPr>
-        <w:pStyle w:val="Heading2"/>
-      </w:pPr>
-      <w:r>
-        <w:t xml:space="preserve">H. ECONOMICS AND OVERHEAD</w:t>
+    <w:bookmarkStart w:id="89" w:name="acknowledgment"/>
+    <w:p>
+      <w:pPr>
+        <w:pStyle w:val="Heading1"/>
+      </w:pPr>
+      <w:r>
+        <w:t xml:space="preserve">ACKNOWLEDGMENT</w:t>
       </w:r>
     </w:p>
     <w:p>
@@ -11283,18 +11311,17 @@
         <w:pStyle w:val="FirstParagraph"/>
       </w:pPr>
       <w:r>
-        <w:t xml:space="preserve">If pumpers earn a share of the 0.1422 USD retail price and pay an event-level bill, they break even at a share of 0.043 under v1 and 0.054 to 0.271 under v2 (the instant verifier 1.310); over 360 minutes under the counter, the human-like carrier needs 1.048. These are break-even shares for scripted attackers under assumed prices, not bounds or criminal profit. On a real Redis (four vCPUs, four workers), sends took 13.8 ms (median) and 21.1 ms (99th percentile), and 133 requests per second passed at concurrency 128 with the 400 ms floor and 50 ms vendor calls; under an adversarial mixture, 81% of sends overran the floor and response-time thresholds separated sends from refusals with 88% balanced accuracy, a separation on that machine, not a deployment accuracy.</w:t>
+        <w:t xml:space="preserve">The author used Claude (Anthropic) to help with code review, code evaluation, and checked every number against the recorded results and every claim against the code, and takes full responsibility for the content. The author would like to thank Prince Sultan University for paying the APC of this manuscript and funding this research.</w:t>
       </w:r>
     </w:p>
     <w:bookmarkEnd w:id="89"/>
-    <w:bookmarkEnd w:id="90"/>
-    <w:bookmarkStart w:id="91" w:name="vi.-discussion"/>
+    <w:bookmarkStart w:id="91" w:name="data-availability"/>
     <w:p>
       <w:pPr>
         <w:pStyle w:val="Heading1"/>
       </w:pPr>
       <w:r>
-        <w:t xml:space="preserve">VI. DISCUSSION</w:t>
+        <w:t xml:space="preserve">DATA AVAILABILITY</w:t>
       </w:r>
     </w:p>
     <w:p>
@@ -11302,109 +11329,12 @@
         <w:pStyle w:val="FirstParagraph"/>
       </w:pPr>
       <w:r>
-        <w:t xml:space="preserve">In the scripted workloads, carriers that verify with human-like delay, fake receipts or know the thresholds defeated our outcome tests but not a short-window counter: within an hour of a verdict the counter’s allowance, unlike the tests’, grows with the windows an attack spans, while over longer campaigns verdicts expire and the tests leak again. Equation (5) summarizes this for pumpers that solve no challenge and hold no exemption; its inputs are in an operator’s logs, whereas the cost of an excess send, competition under attack and exemption abuse come only from the simulation. Supplementary Table S1 sets the seven designs of Section IV against the nine source-side attackers on the same traffic and seeds, with source caps lifted so that only the behavioral layers act; each design adds one thing to the baseline, and its differences from the v1 and v2 columns of Table 3 say what it bought. Correcting the platform header alone changed only the forged-header attack, from 100% to 99.5%, because that attacker is the farm with a header. The behavioral layers of v2 removed datacenter rotation (69% to 0) and most of the reused profile (99.5% to 22.5%), and the two block tests differ only on the walked numbers (11.5% against 13.3%). No design separates the residential bot (37.2%) or the farm (99.5%); those are held only by the adaptive caps of Table 3, at the price Section V-D reports. On the destination, against the never-verifying pumper v1 leaked 570 messages, the default tests 90 and the selected counter 24, and under the shared-block pumper of Table 6 the counter leaked 403 where the default tests leaked 1 149 and no policy 5 509, neither policy costing all users anything on average.</w:t>
-      </w:r>
-    </w:p>
-    <w:p>
-      <w:pPr>
-        <w:pStyle w:val="BodyText"/>
-      </w:pPr>
-      <w:r>
-        <w:t xml:space="preserve">The nearest external work, set out in Table 1, can be compared only on what each needs and reports, since none ran on the same traffic. Huh et al. [4] report 89.6% recall at 0.19% false positives for a supervised model on one service’s real logs; the attack it targets, a few requests per identity over many fresh identities, is the farm here, which our layers do not separate and the caps only ration, at 54% of first-time users refused, while what the layers contain without labels are the attacks with a signature in the request and most of the reused profile. Zaliskyi and Odarchenko [8] report that fixed-window prefix counts blocked 95% and 63% of two incidents at the price of 58% of a legitimate campaign; our graded counter is the same family of control, a ten-minute window on a 10 000-number block with a challenge rather than a 24-hour quarantine, and it leaked 24 of about 574 requests from each outcome-reading pumper at an attack-free cost of 0.06 points of completion, on simulated traffic with no campaigns in it, and failed its service claims on blocks the attacker shares. Twilio’s products report claimed false-positive rates and no leakage. What we report that none of the three does is an attack-free benign cost, a cost under attack for the users who share a block with the attacker, a selection fixed before the evaluation runs and tested on held-out seeds and workloads, and an implementation anyone can run; what the three have and we lack is real traffic.</w:t>
-      </w:r>
-    </w:p>
-    <w:p>
-      <w:pPr>
-        <w:pStyle w:val="BodyText"/>
-      </w:pPr>
-      <w:r>
-        <w:t xml:space="preserve">The limitations follow from the method. We simulated everything and assumed the calibration, and we wrote both protocols for our own generator, the second knowing which counters had won. Some results follow from the generator (a perfect premium list, a datacenter attacker that declines challenges, returning users who always present verified history), and our selection rule used an unweighted sum of four scripted pumpers’ leakage and a mean service target met on tuning seeds, which guarantees no service level elsewhere. Close rankings rest on ten or fewer seeds, and costs that round to zero are not shown equivalent. Per-client quotas within a block, carrier spend ceilings, bounded exemptions, tuned token buckets and other sequential statistics lie outside the evaluated policies. Vendor adapters are untested live, and the timing result holds only for the observer tested. Destination policies challenge people for what strangers sharing their block did, and deployment under the GDPR or Saudi Arabia’s PDPL needs a lawful basis and a route for refused users.</w:t>
-      </w:r>
-    </w:p>
-    <w:bookmarkEnd w:id="91"/>
-    <w:bookmarkStart w:id="92" w:name="vii.-conclusion"/>
-    <w:p>
-      <w:pPr>
-        <w:pStyle w:val="Heading1"/>
-      </w:pPr>
-      <w:r>
-        <w:t xml:space="preserve">VII. CONCLUSION</w:t>
-      </w:r>
-    </w:p>
-    <w:p>
-      <w:pPr>
-        <w:pStyle w:val="FirstParagraph"/>
-      </w:pPr>
-      <w:r>
-        <w:t xml:space="preserve">In this work we asked which of two label-free destination signals a service that verifies phone numbers by SMS should act on when a pumper is paid on the destination, and we answered it in simulation, inside a twelve-step defense evaluated against a seven-control baseline, five simpler designs and 25 attacker profiles under two protocols committed before their runs. The design contains the attacks that carry a signature in the request at a low cost to simulated users, while a residential attacker that resembles a person can only be rationed, at a price set by how well the cap tracks the legitimate rate. On the destination, a counter of sends per number block whose quota matches the block’s traffic leaked less than tests of code outcomes against short, concentrated pumping and cost its users less, but it failed its service claims on blocks the attacker shares and lost its advantage against paced or widely spread pumpers; estimates derived from the rules alone ordered the two policies in 18 of 18 decisive cells. Every number describes scripted attackers and simulated users under assumed calibration, and close rankings rest on ten or fewer seeds. Replaying real traffic is the experiment this work most needs; the policies left outside the evaluation, per-client quotas within a block, bounded exemptions, tuned token buckets and time-uniform statistics, could then be compared under the same protocols.</w:t>
-      </w:r>
-    </w:p>
-    <w:bookmarkEnd w:id="92"/>
-    <w:bookmarkStart w:id="93" w:name="acknowledgment"/>
-    <w:p>
-      <w:pPr>
-        <w:pStyle w:val="Heading1"/>
-      </w:pPr>
-      <w:r>
-        <w:t xml:space="preserve">ACKNOWLEDGMENT</w:t>
-      </w:r>
-    </w:p>
-    <w:p>
-      <w:pPr>
-        <w:pStyle w:val="FirstParagraph"/>
-      </w:pPr>
-      <w:r>
-        <w:t xml:space="preserve">The author used Claude (Anthropic) for code, evaluation, drafting and editing, checked every number against the recorded results and every claim against the code, and takes full responsibility for the content.</w:t>
-      </w:r>
-    </w:p>
-    <w:bookmarkEnd w:id="93"/>
-    <w:bookmarkStart w:id="94" w:name="funding-and-competing-interests"/>
-    <w:p>
-      <w:pPr>
-        <w:pStyle w:val="Heading1"/>
-      </w:pPr>
-      <w:r>
-        <w:t xml:space="preserve">FUNDING AND COMPETING INTERESTS</w:t>
-      </w:r>
-    </w:p>
-    <w:p>
-      <w:pPr>
-        <w:pStyle w:val="FirstParagraph"/>
-      </w:pPr>
-      <w:r>
-        <w:t xml:space="preserve">No funding was received for this work. The author has no competing interests to declare.</w:t>
-      </w:r>
-    </w:p>
-    <w:bookmarkEnd w:id="94"/>
-    <w:bookmarkStart w:id="96" w:name="data-availability"/>
-    <w:p>
-      <w:pPr>
-        <w:pStyle w:val="Heading1"/>
-      </w:pPr>
-      <w:r>
-        <w:t xml:space="preserve">DATA AVAILABILITY</w:t>
-      </w:r>
-    </w:p>
-    <w:p>
-      <w:pPr>
-        <w:pStyle w:val="FirstParagraph"/>
-      </w:pPr>
-      <w:r>
-        <w:t xml:space="preserve">No human or real traffic data was used. Code, protocols (</w:t>
+        <w:t xml:space="preserve">Every run’s configuration and outcome and the sources of headline numbers (</w:t>
       </w:r>
       <w:r>
         <w:rPr>
           <w:rStyle w:val="VerbatimChar"/>
         </w:rPr>
-        <w:t xml:space="preserve">config/</w:t>
-      </w:r>
-      <w:r>
-        <w:t xml:space="preserve">), every run’s configuration and outcome and the sources of headline numbers (</w:t>
-      </w:r>
-      <w:r>
-        <w:rPr>
-          <w:rStyle w:val="VerbatimChar"/>
-        </w:rPr>
         <w:t xml:space="preserve">results/</w:t>
       </w:r>
       <w:r>
@@ -11413,7 +11343,7 @@
       <w:r>
         <w:t xml:space="preserve"> </w:t>
       </w:r>
-      <w:hyperlink r:id="rId95">
+      <w:hyperlink r:id="rId90">
         <w:r>
           <w:rPr>
             <w:rStyle w:val="Hyperlink"/>
@@ -11446,8 +11376,8 @@
         <w:t xml:space="preserve">. These files are the supplementary material.</w:t>
       </w:r>
     </w:p>
-    <w:bookmarkEnd w:id="96"/>
-    <w:bookmarkStart w:id="105" w:name="references"/>
+    <w:bookmarkEnd w:id="91"/>
+    <w:bookmarkStart w:id="100" w:name="references"/>
     <w:p>
       <w:pPr>
         <w:pStyle w:val="Heading1"/>
@@ -11595,7 +11525,7 @@
         </w:rPr>
         <w:t xml:space="preserve"> </w:t>
       </w:r>
-      <w:hyperlink r:id="rId97">
+      <w:hyperlink r:id="rId92">
         <w:r>
           <w:rPr>
             <w:rStyle w:val="Hyperlink"/>
@@ -11845,7 +11775,7 @@
         </w:rPr>
         <w:t xml:space="preserve"> </w:t>
       </w:r>
-      <w:hyperlink r:id="rId98">
+      <w:hyperlink r:id="rId93">
         <w:r>
           <w:rPr>
             <w:rStyle w:val="Hyperlink"/>
@@ -12160,7 +12090,7 @@
         </w:rPr>
         <w:t xml:space="preserve"> </w:t>
       </w:r>
-      <w:hyperlink r:id="rId99">
+      <w:hyperlink r:id="rId94">
         <w:r>
           <w:rPr>
             <w:rStyle w:val="Hyperlink"/>
@@ -12275,7 +12205,7 @@
         </w:rPr>
         <w:t xml:space="preserve"> </w:t>
       </w:r>
-      <w:hyperlink r:id="rId100">
+      <w:hyperlink r:id="rId95">
         <w:r>
           <w:rPr>
             <w:rStyle w:val="Hyperlink"/>
@@ -12946,7 +12876,7 @@
         </w:rPr>
         <w:t xml:space="preserve"> </w:t>
       </w:r>
-      <w:hyperlink r:id="rId95">
+      <w:hyperlink r:id="rId90">
         <w:r>
           <w:rPr>
             <w:rStyle w:val="Hyperlink"/>
@@ -13540,7 +13470,7 @@
         </w:rPr>
         <w:t xml:space="preserve"> </w:t>
       </w:r>
-      <w:hyperlink r:id="rId101">
+      <w:hyperlink r:id="rId96">
         <w:r>
           <w:rPr>
             <w:rStyle w:val="Hyperlink"/>
@@ -13906,7 +13836,7 @@
         </w:rPr>
         <w:t xml:space="preserve"> </w:t>
       </w:r>
-      <w:hyperlink r:id="rId102">
+      <w:hyperlink r:id="rId97">
         <w:r>
           <w:rPr>
             <w:rStyle w:val="Hyperlink"/>
@@ -14000,7 +13930,7 @@
         </w:rPr>
         <w:t xml:space="preserve"> </w:t>
       </w:r>
-      <w:hyperlink r:id="rId103">
+      <w:hyperlink r:id="rId98">
         <w:r>
           <w:rPr>
             <w:rStyle w:val="Hyperlink"/>
@@ -14164,7 +14094,7 @@
         </w:rPr>
         <w:t xml:space="preserve"> </w:t>
       </w:r>
-      <w:hyperlink r:id="rId104">
+      <w:hyperlink r:id="rId99">
         <w:r>
           <w:rPr>
             <w:rStyle w:val="Hyperlink"/>
@@ -14200,7 +14130,7 @@
         <w:t xml:space="preserve">is with the College of Computer and Information Science, Prince Sultan University, Riyadh, Saudi Arabia (e-mail: nahmed@psu.edu.sa).</w:t>
       </w:r>
     </w:p>
-    <w:bookmarkEnd w:id="105"/>
+    <w:bookmarkEnd w:id="100"/>
     <w:sectPr>
       <w:pgSz w:w="11906" w:h="16838"/>
       <w:pgMar w:left="1417" w:right="1417" w:top="1417" w:bottom="1417" w:header="708" w:footer="708" w:gutter="0"/>

</xml_diff>

<commit_message>
Fix three sentences left awkward by the copy-edit
"At the client, where the bots and proxies sit, are the measurements"; "within it" after the
singular "range"; the acknowledgment's list made grammatical without changing its content.

Co-Authored-By: Claude Opus 5.5 <noreply@anthropic.com>
Claude-Session: https://claude.ai/code/session_01RjWdFzUgYk6Hwie2YbnvyG
</commit_message>
<xml_diff>
--- a/paper/main.docx
+++ b/paper/main.docx
@@ -283,7 +283,7 @@
         <w:pStyle w:val="FirstParagraph"/>
       </w:pPr>
       <w:r>
-        <w:t xml:space="preserve">We group prior work by where it acts on the path of an OTP request, which is shown in Figure 1. The attacker’s bots, working through a botnet or behind residential proxies, open the target website and ask it for a code; the website’s service endpoint receives each OTP request and decides whether to send; an SMS vendor routes the message; and a terminating operator delivers it, in a pumping attack to premium-rate numbers that a number provider has placed with that operator. Two flows run against the direction of the request. The outcome signal, whether the code was entered or not, returns from the website to the service endpoint, and it is what one of our two destination policies uses. The revenue-sharing line, drawn dashed, carries part of the termination fee from the operator through the provider of the premium-rate numbers back to the attacker, which is why the destination is the one key a pumper cannot change. The works we review sit at one of these points. At the client, the bots and proxies, are the measurements of what an attacker can buy: residential proxy addresses [10], shared addresses behind carrier-grade NAT [11], CAPTCHA solutions [12], [14], and as many identities as it likes [9]. At the service are the controls an endpoint can run itself: per-entity limits, CAPTCHA, proxy, and country lists (our v1 baseline, Section III-A), risk-based scoring of logins [5], and supervised per-request detection on labeled logs [4]; our twelve source-side steps and two destination policies act here too (Sections III-C–III-E). At the vendor are prefix and country blocking from an account’s history and a per-number pumping risk score [6], [7], and counts of sends per prefix in five-minute windows with a 24-hour quarantine [8]. At the operator and the number provider, where the money is made, are the revenue-share number ranges that providers advertise and share, and detection from call records and test-number intelligence [2], [15]. We close with the gap we address (Table 1).</w:t>
+        <w:t xml:space="preserve">We group prior work by where it acts on the path of an OTP request, which is shown in Figure 1. The attacker’s bots, working through a botnet or behind residential proxies, open the target website and ask it for a code; the website’s service endpoint receives each OTP request and decides whether to send; an SMS vendor routes the message; and a terminating operator delivers it, in a pumping attack to premium-rate numbers that a number provider has placed with that operator. Two flows run against the direction of the request. The outcome signal, whether the code was entered or not, returns from the website to the service endpoint, and it is what one of our two destination policies uses. The revenue-sharing line, drawn dashed, carries part of the termination fee from the operator through the provider of the premium-rate numbers back to the attacker, which is why the destination is the one key a pumper cannot change. The works we review sit at one of these points. At the client, where the bots and proxies sit, are the measurements of what an attacker can buy: residential proxy addresses [10], shared addresses behind carrier-grade NAT [11], CAPTCHA solutions [12], [14], and as many identities as it likes [9]. At the service are the controls an endpoint can run itself: per-entity limits, CAPTCHA, proxy, and country lists (our v1 baseline, Section III-A), risk-based scoring of logins [5], and supervised per-request detection on labeled logs [4]; our twelve source-side steps and two destination policies act here too (Sections III-C–III-E). At the vendor are prefix and country blocking from an account’s history and a per-number pumping risk score [6], [7], and counts of sends per prefix in five-minute windows with a 24-hour quarantine [8]. At the operator and the number provider, where the money is made, are the revenue-share number ranges that providers advertise and share, and detection from call records and test-number intelligence [2], [15]. We close with the gap we address (Table 1).</w:t>
       </w:r>
     </w:p>
     <w:p>
@@ -2958,7 +2958,7 @@
         <w:pStyle w:val="FirstParagraph"/>
       </w:pPr>
       <w:r>
-        <w:t xml:space="preserve">A pumper is confined to its partner’s range but can rotate numbers and blocks within them. Destination policies are keyed on the 8-digit block (10,000 numbers); therefore, protection weakens as the pumper spreads.</w:t>
+        <w:t xml:space="preserve">A pumper is confined to its partner’s range but can rotate numbers and blocks within it. Destination policies are keyed on the 8-digit block (10,000 numbers); therefore, protection weakens as the pumper spreads.</w:t>
       </w:r>
     </w:p>
     <w:bookmarkStart w:id="49" w:name="sequential-tests"/>
@@ -11311,7 +11311,7 @@
         <w:pStyle w:val="FirstParagraph"/>
       </w:pPr>
       <w:r>
-        <w:t xml:space="preserve">The author used Claude (Anthropic) to help with code review, code evaluation, and checked every number against the recorded results and every claim against the code, and takes full responsibility for the content. The author would like to thank Prince Sultan University for paying the APC of this manuscript and funding this research.</w:t>
+        <w:t xml:space="preserve">The author used Claude (Anthropic) to help with code review and code evaluation, checked every number against the recorded results and every claim against the code, and takes full responsibility for the content. The author would like to thank Prince Sultan University for paying the APC of this manuscript and funding this research.</w:t>
       </w:r>
     </w:p>
     <w:bookmarkEnd w:id="89"/>

</xml_diff>

<commit_message>
Set the manuscript in the journal's official IEEEoj.cls template
main.tex now uses IEEEoj.cls and the logo from IEEE_OJCOMS-template-LaTex_202401, with the
template's title block (dates and DOI as IEEE placeholders, author, affiliation, corresponding
author, funding note, abstract, index terms), capitalized section headings, the cite package,
"Fig." and "(n)" references, and IEEEbiographynophoto. ojcoms.sty and IEEEtranN-doi.bst are
removed; IEEEtran-doi.bst gives numeric IEEE references with DOIs. The abstract is cut to the
template's 250 words. make_docx.py reads the new title block and numeric citation data.

Co-Authored-By: Claude Opus 5.5 <noreply@anthropic.com>
Claude-Session: https://claude.ai/code/session_01RjWdFzUgYk6Hwie2YbnvyG
</commit_message>
<xml_diff>
--- a/paper/main.docx
+++ b/paper/main.docx
@@ -29,7 +29,7 @@
           <w:sz w:val="24"/>
           <w:szCs w:val="24"/>
         </w:rPr>
-        <w:t>Naveed Ahmed</w:t>
+        <w:t>NAVEED AHMED</w:t>
       </w:r>
     </w:p>
     <w:p>
@@ -57,7 +57,21 @@
           <w:sz w:val="18"/>
           <w:szCs w:val="18"/>
         </w:rPr>
-        <w:t>CORRESPONDING AUTHOR: N. AHMED (e-mail: nahmed@psu.edu.sa)</w:t>
+        <w:t>CORRESPONDING AUTHOR: Naveed Ahmed (e-mail: nahmed@psu.edu.sa).</w:t>
+      </w:r>
+    </w:p>
+    <w:p>
+      <w:pPr>
+        <w:pStyle w:val="BodyText"/>
+        <w:spacing w:after="120"/>
+        <w:jc w:val="center"/>
+      </w:pPr>
+      <w:r>
+        <w:rPr>
+          <w:sz w:val="18"/>
+          <w:szCs w:val="18"/>
+        </w:rPr>
+        <w:t>This work was supported by Prince Sultan University, which also paid the article processing charge (APC) of this manuscript.</w:t>
       </w:r>
     </w:p>
     <w:p>
@@ -98,7 +112,7 @@
           <w:sz w:val="22"/>
           <w:szCs w:val="22"/>
         </w:rPr>
-        <w:t xml:space="preserve">Services that verify a phone number by SMS expose an endpoint that must be answered before any account exists. Attackers abuse this to waste the service’s messaging budget (flooding) or to steer paid messages to premium-rate ranges that share the termination fee with them (SMS pumping). Existing defenses limit the source, score requests with labeled traffic or block prefixes, but no controlled evidence says which destination signal a service should act on, sends per block, or the fate of their codes, or what either costs the users who share a block with an attacker. We evaluate in simulation a twelve-step defense built on app attestation, signed sessions, and verification outcomes against a seven-control baseline, five simpler designs, and 25 attacker profiles, and compare the two label-free destination policies, a short-window counter of sends per number block, and sequential tests of code outcomes under two protocols committed before their runs. Attacks with a signature in the request are contained at a low cost to users; a residential attacker is only rationed. Against four concentrated 20-minute pumpers, the counter leaked 6 to 48 messages at 0.06 to 0.43 points of completion, where the default tests leaked 19 to 452; on held-out seeds and workloads, it met its leakage claims but failed its service claims on blocks real users share. Estimates from the rules alone ordered the two policies in 18 of 18 decisive cells. The results rest on simulated users and give operators a tested ordering of destination policies against short, concentrated pumping.</w:t>
+        <w:t xml:space="preserve">Services that verify a phone number by SMS expose an endpoint that must be answered before any account exists. Attackers abuse this to waste the service’s messaging budget (flooding) or to steer paid messages to premium-rate ranges that share the termination fee with them (SMS pumping). Existing defenses limit the source, score requests with labeled traffic or block prefixes, but no controlled evidence says which destination signal a service should act on, sends per block, or the fate of their codes, or what either costs the users who share a block with an attacker. We evaluate in simulation a twelve-step defense built on app attestation, signed sessions, and verification outcomes against a seven-control baseline, five simpler designs, and 25 attacker profiles, and compare two label-free destination policies, a short-window counter of sends per number block, and sequential tests of code outcomes under two protocols committed before their runs. Attacks with a signature in the request are contained at a low cost to users; a residential attacker is only rationed. Against four concentrated 20-minute pumpers, the counter leaked 6 to 48 messages at 0.06 to 0.43 points of completion, where the default tests leaked 19 to 452; on held-out seeds and workloads, it met its leakage claims but failed its service claims on blocks real users share. Estimates from the rules alone ordered the two policies in 18 of 18 decisive cells. The results rest on simulated users and give operators a tested ordering of destination policies against short, concentrated pumping.</w:t>
       </w:r>
     </w:p>
     <w:p>
@@ -155,7 +169,23 @@
         <w:pStyle w:val="FirstParagraph"/>
       </w:pPr>
       <w:r>
-        <w:t xml:space="preserve">Most online services verify a phone number by sending a code via SMS from an endpoint that must be reachable before any account exists, at a tenth of a cent to twenty cents per message. Two abuses follow from that design. A flooder makes the service send to numbers it does not own, so the service pays for messages nobody asked for; a pumper sends to a range whose operator shares the termination fee, so the service’s SMS budget becomes the attacker’s income, a technique that MITRE catalogues as resource hijacking [1]. Pumping is the SMS form of international revenue-share fraud, whose voice form was estimated at $10.76 billion a year in 2015 [2]. The sums at a single service are not small: Twitter’s owner said in 2023 that pumping had cost the company approximately $60 million a year [3], and Huh et al. [4] found as many attack requests as genuine ones in three months of one large service’s authentication logs.</w:t>
+        <w:t xml:space="preserve">Most online services verify a phone number by sending a code via SMS from an endpoint that must be reachable before any account exists, at a tenth of a cent to twenty cents per message. Two abuses follow from that design. A flooder makes the service send to numbers it does not own, so the service pays for messages nobody asked for; a pumper sends to a range whose operator shares the termination fee, so the service’s SMS budget becomes the attacker’s income, a technique that MITRE catalogues as resource hijacking [1]. Pumping is the SMS form of international revenue-share fraud, whose voice form was estimated at $10.76 billion a year in 2015 [2]. The sums at a single service are not small: Twitter’s owner said in 2023 that pumping had cost the company approximately $60 million a year [3], and Huh</w:t>
+      </w:r>
+      <w:r>
+        <w:t xml:space="preserve"> </w:t>
+      </w:r>
+      <w:r>
+        <w:rPr>
+          <w:iCs/>
+          <w:i/>
+        </w:rPr>
+        <w:t xml:space="preserve">et al.</w:t>
+      </w:r>
+      <w:r>
+        <w:t xml:space="preserve"> </w:t>
+      </w:r>
+      <w:r>
+        <w:t xml:space="preserve">[4] found as many attack requests as genuine ones in three months of one large service’s authentication logs.</w:t>
       </w:r>
     </w:p>
     <w:p>
@@ -163,7 +193,23 @@
         <w:pStyle w:val="BodyText"/>
       </w:pPr>
       <w:r>
-        <w:t xml:space="preserve">Defenses act at three points on the path of a request. At the source, services limit requests per address, session, and device, challenge them with CAPTCHAs, block known proxies, restrict destination countries, and risk-based authentication combines such signals into a score with graded responses [5]. At the messaging vendor, Twilio’s Fraud Guard blocks destination prefixes and countries whose traffic departs from an account’s history [6], and its per-number pumping risk score advises friction from 60 and refusal above 90 [7]. On a service’s own logs, Huh et al. [4] detect attack requests one at a time with gradient-boosted trees, at 89.6% recall and 0.19% false positives on web traffic, and Zaliskyi and Odarchenko [8] count application-to-person sends per number prefix in five-minute windows and quarantine a prefix that crosses a threshold.</w:t>
+        <w:t xml:space="preserve">Defenses act at three points on the path of a request. At the source, services limit requests per address, session, and device, challenge them with CAPTCHAs, block known proxies, restrict destination countries, and risk-based authentication combines such signals into a score with graded responses [5]. At the messaging vendor, Twilio’s Fraud Guard blocks destination prefixes and countries whose traffic departs from an account’s history [6], and its per-number pumping risk score advises friction from 60 and refusal above 90 [7]. On a service’s own logs, Huh</w:t>
+      </w:r>
+      <w:r>
+        <w:t xml:space="preserve"> </w:t>
+      </w:r>
+      <w:r>
+        <w:rPr>
+          <w:iCs/>
+          <w:i/>
+        </w:rPr>
+        <w:t xml:space="preserve">et al.</w:t>
+      </w:r>
+      <w:r>
+        <w:t xml:space="preserve"> </w:t>
+      </w:r>
+      <w:r>
+        <w:t xml:space="preserve">[4] detect attack requests one at a time with gradient-boosted trees, at 89.6% recall and 0.19% false positives on web traffic, and Zaliskyi and Odarchenko [8] count application-to-person sends per number prefix in five-minute windows and quarantine a prefix that crosses a threshold.</w:t>
       </w:r>
     </w:p>
     <w:p>
@@ -189,7 +235,23 @@
         <w:t xml:space="preserve"> </w:t>
       </w:r>
       <w:r>
-        <w:t xml:space="preserve">[11]. A CAPTCHA costs an attacker approximately a dollar per thousand solutions from a labor market that was already paying ten dollars per thousand in 2007 [12]. Supervised detection requires labels, which Huh et al. [4] derived from traffic peaks after the fact, and a decision taken per request can be probed one threshold at a time. Prefix counting acts on the one key a pumper cannot rotate away from, since it is paid only on its partner’s ranges, but the thresholds that stopped 95% and 63% of two incidents in the data of Zaliskyi and Odarchenko [8] also blocked 58% of a legitimate marketing campaign.</w:t>
+        <w:t xml:space="preserve">[11]. A CAPTCHA costs an attacker approximately a dollar per thousand solutions from a labor market that was already paying ten dollars per thousand in 2007 [12]. Supervised detection requires labels, which Huh</w:t>
+      </w:r>
+      <w:r>
+        <w:t xml:space="preserve"> </w:t>
+      </w:r>
+      <w:r>
+        <w:rPr>
+          <w:iCs/>
+          <w:i/>
+        </w:rPr>
+        <w:t xml:space="preserve">et al.</w:t>
+      </w:r>
+      <w:r>
+        <w:t xml:space="preserve"> </w:t>
+      </w:r>
+      <w:r>
+        <w:t xml:space="preserve">[4] derived from traffic peaks after the fact, and a decision taken per request can be probed one threshold at a time. Prefix counting acts on the one key a pumper cannot rotate away from, since it is paid only on its partner’s ranges, but the thresholds that stopped 95% and 63% of two incidents in the data of Zaliskyi and Odarchenko [8] also blocked 58% of a legitimate marketing campaign.</w:t>
       </w:r>
     </w:p>
     <w:p>
@@ -197,7 +259,23 @@
         <w:pStyle w:val="BodyText"/>
       </w:pPr>
       <w:r>
-        <w:t xml:space="preserve">Therefore, the two closest studies each act on one destination signal, and neither measures the cost of acting on it. Huh et al. [4] report that approximately 92% of attack requests fell on prefixes with zero conversion, against 21% for genuine traffic; thus, whether codes are entered is informative; however, the signal enters a classifier that requires labeled traffic and was not released because it is deployed. Zaliskyi and Odarchenko [8] act on send counts alone, without outcomes, and conclude that counts by themselves cannot safely separate inflated traffic from a campaign. Neither reports what a destination policy costs legitimate users who share a number block with an attacker, with or without an attack, and neither fixed its setting before seeing the evaluation traffic.</w:t>
+        <w:t xml:space="preserve">Therefore, the two closest studies each act on one destination signal, and neither measures the cost of acting on it. Huh</w:t>
+      </w:r>
+      <w:r>
+        <w:t xml:space="preserve"> </w:t>
+      </w:r>
+      <w:r>
+        <w:rPr>
+          <w:iCs/>
+          <w:i/>
+        </w:rPr>
+        <w:t xml:space="preserve">et al.</w:t>
+      </w:r>
+      <w:r>
+        <w:t xml:space="preserve"> </w:t>
+      </w:r>
+      <w:r>
+        <w:t xml:space="preserve">[4] report that approximately 92% of attack requests fell on prefixes with zero conversion, against 21% for genuine traffic; thus, whether codes are entered is informative; however, the signal enters a classifier that requires labeled traffic and was not released because it is deployed. Zaliskyi and Odarchenko [8] act on send counts alone, without outcomes, and conclude that counts by themselves cannot safely separate inflated traffic from a campaign. Neither reports what a destination policy costs legitimate users who share a number block with an attacker, with or without an attack, and neither fixed its setting before seeing the evaluation traffic.</w:t>
       </w:r>
     </w:p>
     <w:p>
@@ -283,7 +361,7 @@
         <w:pStyle w:val="FirstParagraph"/>
       </w:pPr>
       <w:r>
-        <w:t xml:space="preserve">We group prior work by where it acts on the path of an OTP request, which is shown in Figure 1. The attacker’s bots, working through a botnet or behind residential proxies, open the target website and ask it for a code; the website’s service endpoint receives each OTP request and decides whether to send; an SMS vendor routes the message; and a terminating operator delivers it, in a pumping attack to premium-rate numbers that a number provider has placed with that operator. Two flows run against the direction of the request. The outcome signal, whether the code was entered or not, returns from the website to the service endpoint, and it is what one of our two destination policies uses. The revenue-sharing line, drawn dashed, carries part of the termination fee from the operator through the provider of the premium-rate numbers back to the attacker, which is why the destination is the one key a pumper cannot change. The works we review sit at one of these points. At the client, where the bots and proxies sit, are the measurements of what an attacker can buy: residential proxy addresses [10], shared addresses behind carrier-grade NAT [11], CAPTCHA solutions [12], [14], and as many identities as it likes [9]. At the service are the controls an endpoint can run itself: per-entity limits, CAPTCHA, proxy, and country lists (our v1 baseline, Section III-A), risk-based scoring of logins [5], and supervised per-request detection on labeled logs [4]; our twelve source-side steps and two destination policies act here too (Sections III-C–III-E). At the vendor are prefix and country blocking from an account’s history and a per-number pumping risk score [6], [7], and counts of sends per prefix in five-minute windows with a 24-hour quarantine [8]. At the operator and the number provider, where the money is made, are the revenue-share number ranges that providers advertise and share, and detection from call records and test-number intelligence [2], [15]. We close with the gap we address (Table 1).</w:t>
+        <w:t xml:space="preserve">We group prior work by where it acts on the path of an OTP request, which is shown in Fig. 1. The attacker’s bots, working through a botnet or behind residential proxies, open the target website and ask it for a code; the website’s service endpoint receives each OTP request and decides whether to send; an SMS vendor routes the message; and a terminating operator delivers it, in a pumping attack to premium-rate numbers that a number provider has placed with that operator. Two flows run against the direction of the request. The outcome signal, whether the code was entered or not, returns from the website to the service endpoint, and it is what one of our two destination policies uses. The revenue-sharing line, drawn dashed, carries part of the termination fee from the operator through the provider of the premium-rate numbers back to the attacker, which is why the destination is the one key a pumper cannot change. The works we review sit at one of these points. At the client, where the bots and proxies sit, are the measurements of what an attacker can buy: residential proxy addresses [10], shared addresses behind carrier-grade NAT [11], CAPTCHA solutions [12], [14], and as many identities as it likes [9]. At the service are the controls an endpoint can run itself: per-entity limits, CAPTCHA, proxy, and country lists (our v1 baseline, Section III-A), risk-based scoring of logins [5], and supervised per-request detection on labeled logs [4]; our twelve source-side steps and two destination policies act here too (Sections III-C–III-E). At the vendor are prefix and country blocking from an account’s history and a per-number pumping risk score [6], [7], and counts of sends per prefix in five-minute windows with a 24-hour quarantine [8]. At the operator and the number provider, where the money is made, are the revenue-share number ranges that providers advertise and share, and detection from call records and test-number intelligence [2], [15]. We close with the gap we address (Table 1).</w:t>
       </w:r>
     </w:p>
     <w:p>
@@ -383,7 +461,23 @@
         <w:t xml:space="preserve"> </w:t>
       </w:r>
       <w:r>
-        <w:t xml:space="preserve">premium-rate numbers from websites that pay for traffic and generates calls to them; a transit operator short-stops the calls, keeps the termination fee, and shares it with the fraudster. The taxonomy of Sahin et al. [2] sets the scheme among frauds that persist because call routing is opaque, each operator knowing only the next hop, and because operators are reluctant to share pricing, routes, or fraud findings with competitors. Sahin and Francillon [15] then measured the market from the supply side, collecting 3,149,793 distinct test numbers that twelve such providers advertised between January 2016 and November 2019 across 238 destinations. The ranges are a managed asset: 80% of them were shared across providers, which subdivide a hijacked block among themselves, and 70% lay inside valid numbering plans. From this intelligence and from call histories, the authors built a random-forest detector for an operator’s call records that reached 98% accuracy at 0.28% false positives, where blocking the two-digit neighborhood of a known test number caught 63%. Both studies concern voice telephony, and the detector needs the test-number intelligence and the call histories of an operator. The lesson for SMS is that the number range, not the calling identity, is what the fraudster must keep, and that a party seeing only its own traffic detects the fraud late. An OTP endpoint is in a weaker position still: it holds neither intelligence nor call histories, only its own sends and whether their codes were entered. That is why the policies of Section III-E are keyed on the 8-digit block and use only those two quantities.</w:t>
+        <w:t xml:space="preserve">premium-rate numbers from websites that pay for traffic and generates calls to them; a transit operator short-stops the calls, keeps the termination fee, and shares it with the fraudster. The taxonomy of Sahin</w:t>
+      </w:r>
+      <w:r>
+        <w:t xml:space="preserve"> </w:t>
+      </w:r>
+      <w:r>
+        <w:rPr>
+          <w:iCs/>
+          <w:i/>
+        </w:rPr>
+        <w:t xml:space="preserve">et al.</w:t>
+      </w:r>
+      <w:r>
+        <w:t xml:space="preserve"> </w:t>
+      </w:r>
+      <w:r>
+        <w:t xml:space="preserve">[2] sets the scheme among frauds that persist because call routing is opaque, each operator knowing only the next hop, and because operators are reluctant to share pricing, routes, or fraud findings with competitors. Sahin and Francillon [15] then measured the market from the supply side, collecting 3,149,793 distinct test numbers that twelve such providers advertised between January 2016 and November 2019 across 238 destinations. The ranges are a managed asset: 80% of them were shared across providers, which subdivide a hijacked block among themselves, and 70% lay inside valid numbering plans. From this intelligence and from call histories, the authors built a random-forest detector for an operator’s call records that reached 98% accuracy at 0.28% false positives, where blocking the two-digit neighborhood of a known test number caught 63%. Both studies concern voice telephony, and the detector needs the test-number intelligence and the call histories of an operator. The lesson for SMS is that the number range, not the calling identity, is what the fraudster must keep, and that a party seeing only its own traffic detects the fraud late. An OTP endpoint is in a weaker position still: it holds neither intelligence nor call histories, only its own sends and whether their codes were entered. That is why the policies of Section III-E are keyed on the 8-digit block and use only those two quantities.</w:t>
       </w:r>
     </w:p>
     <w:bookmarkEnd w:id="24"/>
@@ -401,7 +495,23 @@
         <w:pStyle w:val="FirstParagraph"/>
       </w:pPr>
       <w:r>
-        <w:t xml:space="preserve">Huh et al. [4] trained gradient-boosted trees on 9.4 million SMS authentication logs from nineteen countries, reaching 89.6% recall at 0.19% false positives on web traffic and 91.1% at 0.11% on app traffic. The logs came unlabeled from one large service over three months of 2023; the authors labeled attacks inside traffic peaks, as web identities with four or more requests and no successful validation in a day, or app number-and-device pairs never validated, and treated requests outside peaks as genuine. Two models with 18 and 13 features at three levels (the request, the identity’s history, and country-wide aggregates over 24 hours) run per request before the message is sent. About 73% of web attacks sent four or fewer requests per identity a day, defeating per-entity limits, and destination signals were the strongest: about 92% zero conversion for attacks against 21% for genuine traffic, and 91% of app attacks fell on prefixes with more than 30 distinct numbers in a day against 0.01% of genuine requests. The same data show the counter-move: in three countries about 82% of attack requests validated their codes, which the authors attribute to attackers avoiding conversion-rate rules. The detector needs labeled traffic and acts per request, reports its cost to users as false positives only, and was not released because it is deployed. We add a controlled comparison of two label-free ways to act on destination aggregation per block, from send counts or code outcomes, and of their cost to users sharing a block; we did not reproduce theirs, so we do not rank the two.</w:t>
+        <w:t xml:space="preserve">Huh</w:t>
+      </w:r>
+      <w:r>
+        <w:t xml:space="preserve"> </w:t>
+      </w:r>
+      <w:r>
+        <w:rPr>
+          <w:iCs/>
+          <w:i/>
+        </w:rPr>
+        <w:t xml:space="preserve">et al.</w:t>
+      </w:r>
+      <w:r>
+        <w:t xml:space="preserve"> </w:t>
+      </w:r>
+      <w:r>
+        <w:t xml:space="preserve">[4] trained gradient-boosted trees on 9.4 million SMS authentication logs from nineteen countries, reaching 89.6% recall at 0.19% false positives on web traffic and 91.1% at 0.11% on app traffic. The logs came unlabeled from one large service over three months of 2023; the authors labeled attacks inside traffic peaks, as web identities with four or more requests and no successful validation in a day, or app number-and-device pairs never validated, and treated requests outside peaks as genuine. Two models with 18 and 13 features at three levels (the request, the identity’s history, and country-wide aggregates over 24 hours) run per request before the message is sent. About 73% of web attacks sent four or fewer requests per identity a day, defeating per-entity limits, and destination signals were the strongest: about 92% zero conversion for attacks against 21% for genuine traffic, and 91% of app attacks fell on prefixes with more than 30 distinct numbers in a day against 0.01% of genuine requests. The same data show the counter-move: in three countries about 82% of attack requests validated their codes, which the authors attribute to attackers avoiding conversion-rate rules. The detector needs labeled traffic and acts per request, reports its cost to users as false positives only, and was not released because it is deployed. We add a controlled comparison of two label-free ways to act on destination aggregation per block, from send counts or code outcomes, and of their cost to users sharing a block; we did not reproduce theirs, so we do not rank the two.</w:t>
       </w:r>
     </w:p>
     <w:p>
@@ -443,7 +553,55 @@
         <w:pStyle w:val="FirstParagraph"/>
       </w:pPr>
       <w:r>
-        <w:t xml:space="preserve">The cost of a source-side control to an attacker has been measured. Motoyama et al. [12] bought CAPTCHA solutions from eight retail services at $1 to $20 per thousand, found that the wage for solving had fallen from $10 per thousand in 2007 to about a dollar by 2009, and conclude that a CAPTCHA limits access to attackers whose business is profitable despite that cost rather than keeping machines out. Dionysiou and Athanasopoulos [14] classify the machine-learning solvers that have since appeared. Addresses have a market too: Mi et al. [10] infiltrated five residential proxy providers and observed 6.2 million addresses in 238 countries, 95% of them residential, 90% relaying for under 870 seconds and 2.2% on any blacklist; Richter et al. [11] found carrier-grade NAT in more than 90% of cellular networks, with dozens of subscribers behind one address, and conclude that address reputation and blacklisting become</w:t>
+        <w:t xml:space="preserve">The cost of a source-side control to an attacker has been measured. Motoyama</w:t>
+      </w:r>
+      <w:r>
+        <w:t xml:space="preserve"> </w:t>
+      </w:r>
+      <w:r>
+        <w:rPr>
+          <w:iCs/>
+          <w:i/>
+        </w:rPr>
+        <w:t xml:space="preserve">et al.</w:t>
+      </w:r>
+      <w:r>
+        <w:t xml:space="preserve"> </w:t>
+      </w:r>
+      <w:r>
+        <w:t xml:space="preserve">[12] bought CAPTCHA solutions from eight retail services at $1 to $20 per thousand, found that the wage for solving had fallen from $10 per thousand in 2007 to about a dollar by 2009, and conclude that a CAPTCHA limits access to attackers whose business is profitable despite that cost rather than keeping machines out. Dionysiou and Athanasopoulos [14] classify the machine-learning solvers that have since appeared. Addresses have a market too: Mi</w:t>
+      </w:r>
+      <w:r>
+        <w:t xml:space="preserve"> </w:t>
+      </w:r>
+      <w:r>
+        <w:rPr>
+          <w:iCs/>
+          <w:i/>
+        </w:rPr>
+        <w:t xml:space="preserve">et al.</w:t>
+      </w:r>
+      <w:r>
+        <w:t xml:space="preserve"> </w:t>
+      </w:r>
+      <w:r>
+        <w:t xml:space="preserve">[10] infiltrated five residential proxy providers and observed 6.2 million addresses in 238 countries, 95% of them residential, 90% relaying for under 870 seconds and 2.2% on any blacklist; Richter</w:t>
+      </w:r>
+      <w:r>
+        <w:t xml:space="preserve"> </w:t>
+      </w:r>
+      <w:r>
+        <w:rPr>
+          <w:iCs/>
+          <w:i/>
+        </w:rPr>
+        <w:t xml:space="preserve">et al.</w:t>
+      </w:r>
+      <w:r>
+        <w:t xml:space="preserve"> </w:t>
+      </w:r>
+      <w:r>
+        <w:t xml:space="preserve">[11] found carrier-grade NAT in more than 90% of cellular networks, with dozens of subscribers behind one address, and conclude that address reputation and blacklisting become</w:t>
       </w:r>
       <w:r>
         <w:t xml:space="preserve"> </w:t>
@@ -461,7 +619,23 @@
         <w:t xml:space="preserve"> </w:t>
       </w:r>
       <w:r>
-        <w:t xml:space="preserve">there. Behind both markets lies the older observation of Douceur [9] that without a trusted authority one entity can present many identities, so a signed session provides continuity, not scarcity. Risk-based authentication, which Wiefling et al. [5] probed at eight large services, scores a login from its address, user agent, resolution, time, and similar features into risk buckets and asks for a further factor above a threshold; every service that showed such behavior used the address, and none disclosed its procedure. Step 7 of our design resembles it, but scores a request made before any account exists, so the account history that risk-based authentication relies on is absent. Client puzzles [16] would add a computational price per request; however, we did not evaluate them.</w:t>
+        <w:t xml:space="preserve">there. Behind both markets lies the older observation of Douceur [9] that without a trusted authority one entity can present many identities, so a signed session provides continuity, not scarcity. Risk-based authentication, which Wiefling</w:t>
+      </w:r>
+      <w:r>
+        <w:t xml:space="preserve"> </w:t>
+      </w:r>
+      <w:r>
+        <w:rPr>
+          <w:iCs/>
+          <w:i/>
+        </w:rPr>
+        <w:t xml:space="preserve">et al.</w:t>
+      </w:r>
+      <w:r>
+        <w:t xml:space="preserve"> </w:t>
+      </w:r>
+      <w:r>
+        <w:t xml:space="preserve">[5] probed at eight large services, scores a login from its address, user agent, resolution, time, and similar features into risk buckets and asks for a further factor above a threshold; every service that showed such behavior used the address, and none disclosed its procedure. Step 7 of our design resembles it, but scores a request made before any account exists, so the account history that risk-based authentication relies on is absent. Client puzzles [16] would add a computational price per request; however, we did not evaluate them.</w:t>
       </w:r>
     </w:p>
     <w:p>
@@ -487,7 +661,23 @@
         <w:pStyle w:val="FirstParagraph"/>
       </w:pPr>
       <w:r>
-        <w:t xml:space="preserve">Our block tests are Wald’s sequential tests [17] run as Page’s cumulative sums [18], with a floor parameter that selects between the two (Section III-E). Quickest change detection minimizes detection delay under false-alarm constraints [19], and the CUSUM parameters follow from the error rates it must meet [20]; windowed statistics and the time-uniform confidence sequences of Howard et al. [21], which stay valid at any stopping time, are not evaluated here; therefore,</w:t>
+        <w:t xml:space="preserve">Our block tests are Wald’s sequential tests [17] run as Page’s cumulative sums [18], with a floor parameter that selects between the two (Section III-E). Quickest change detection minimizes detection delay under false-alarm constraints [19], and the CUSUM parameters follow from the error rates it must meet [20]; windowed statistics and the time-uniform confidence sequences of Howard</w:t>
+      </w:r>
+      <w:r>
+        <w:t xml:space="preserve"> </w:t>
+      </w:r>
+      <w:r>
+        <w:rPr>
+          <w:iCs/>
+          <w:i/>
+        </w:rPr>
+        <w:t xml:space="preserve">et al.</w:t>
+      </w:r>
+      <w:r>
+        <w:t xml:space="preserve"> </w:t>
+      </w:r>
+      <w:r>
+        <w:t xml:space="preserve">[21], which stay valid at any stopping time, are not evaluated here; therefore,</w:t>
       </w:r>
       <w:r>
         <w:t xml:space="preserve"> </w:t>
@@ -555,7 +745,7 @@
     <w:tbl>
       <w:tblPr>
         <w:tblStyle w:val="Table"/>
-        <w:tblW w:w="9070" w:type="dxa"/>
+        <w:tblW w:w="9071" w:type="dxa"/>
         <w:jc w:val="center"/>
         <w:tblLayout w:type="fixed"/>
         <w:tblCellMar>
@@ -566,12 +756,12 @@
         <w:tblCaption w:val="TABLE 1. The closest work is set beside ours."/>
       </w:tblPr>
       <w:tblGrid>
-        <w:gridCol w:w="1420"/>
-        <w:gridCol w:w="1530"/>
-        <w:gridCol w:w="1530"/>
-        <w:gridCol w:w="1530"/>
-        <w:gridCol w:w="1530"/>
-        <w:gridCol w:w="1530"/>
+        <w:gridCol w:w="1166"/>
+        <w:gridCol w:w="1581"/>
+        <w:gridCol w:w="1581"/>
+        <w:gridCol w:w="1581"/>
+        <w:gridCol w:w="1581"/>
+        <w:gridCol w:w="1581"/>
       </w:tblGrid>
       <w:tr>
         <w:trPr>
@@ -579,7 +769,7 @@
         </w:trPr>
         <w:tc>
           <w:tcPr>
-            <w:tcW w:w="1420" w:type="dxa"/>
+            <w:tcW w:w="1166" w:type="dxa"/>
             <w:tcBorders>
               <w:top w:val="single" w:sz="8" w:color="000000"/>
               <w:bottom w:val="single" w:sz="4" w:color="000000"/>
@@ -601,7 +791,7 @@
         </w:tc>
         <w:tc>
           <w:tcPr>
-            <w:tcW w:w="1530" w:type="dxa"/>
+            <w:tcW w:w="1581" w:type="dxa"/>
             <w:tcBorders>
               <w:top w:val="single" w:sz="8" w:color="000000"/>
               <w:bottom w:val="single" w:sz="4" w:color="000000"/>
@@ -623,7 +813,7 @@
         </w:tc>
         <w:tc>
           <w:tcPr>
-            <w:tcW w:w="1530" w:type="dxa"/>
+            <w:tcW w:w="1581" w:type="dxa"/>
             <w:tcBorders>
               <w:top w:val="single" w:sz="8" w:color="000000"/>
               <w:bottom w:val="single" w:sz="4" w:color="000000"/>
@@ -645,7 +835,7 @@
         </w:tc>
         <w:tc>
           <w:tcPr>
-            <w:tcW w:w="1530" w:type="dxa"/>
+            <w:tcW w:w="1581" w:type="dxa"/>
             <w:tcBorders>
               <w:top w:val="single" w:sz="8" w:color="000000"/>
               <w:bottom w:val="single" w:sz="4" w:color="000000"/>
@@ -667,7 +857,7 @@
         </w:tc>
         <w:tc>
           <w:tcPr>
-            <w:tcW w:w="1530" w:type="dxa"/>
+            <w:tcW w:w="1581" w:type="dxa"/>
             <w:tcBorders>
               <w:top w:val="single" w:sz="8" w:color="000000"/>
               <w:bottom w:val="single" w:sz="4" w:color="000000"/>
@@ -689,7 +879,7 @@
         </w:tc>
         <w:tc>
           <w:tcPr>
-            <w:tcW w:w="1530" w:type="dxa"/>
+            <w:tcW w:w="1581" w:type="dxa"/>
             <w:tcBorders>
               <w:top w:val="single" w:sz="8" w:color="000000"/>
               <w:bottom w:val="single" w:sz="4" w:color="000000"/>
@@ -713,7 +903,7 @@
       <w:tr>
         <w:tc>
           <w:tcPr>
-            <w:tcW w:w="1420" w:type="dxa"/>
+            <w:tcW w:w="1166" w:type="dxa"/>
           </w:tcPr>
           <w:p>
             <w:pPr>
@@ -731,7 +921,7 @@
         </w:tc>
         <w:tc>
           <w:tcPr>
-            <w:tcW w:w="1530" w:type="dxa"/>
+            <w:tcW w:w="1581" w:type="dxa"/>
           </w:tcPr>
           <w:p>
             <w:pPr>
@@ -749,7 +939,7 @@
         </w:tc>
         <w:tc>
           <w:tcPr>
-            <w:tcW w:w="1530" w:type="dxa"/>
+            <w:tcW w:w="1581" w:type="dxa"/>
           </w:tcPr>
           <w:p>
             <w:pPr>
@@ -767,7 +957,7 @@
         </w:tc>
         <w:tc>
           <w:tcPr>
-            <w:tcW w:w="1530" w:type="dxa"/>
+            <w:tcW w:w="1581" w:type="dxa"/>
           </w:tcPr>
           <w:p>
             <w:pPr>
@@ -785,7 +975,7 @@
         </w:tc>
         <w:tc>
           <w:tcPr>
-            <w:tcW w:w="1530" w:type="dxa"/>
+            <w:tcW w:w="1581" w:type="dxa"/>
           </w:tcPr>
           <w:p>
             <w:pPr>
@@ -803,7 +993,7 @@
         </w:tc>
         <w:tc>
           <w:tcPr>
-            <w:tcW w:w="1530" w:type="dxa"/>
+            <w:tcW w:w="1581" w:type="dxa"/>
           </w:tcPr>
           <w:p>
             <w:pPr>
@@ -823,7 +1013,7 @@
       <w:tr>
         <w:tc>
           <w:tcPr>
-            <w:tcW w:w="1420" w:type="dxa"/>
+            <w:tcW w:w="1166" w:type="dxa"/>
           </w:tcPr>
           <w:p>
             <w:pPr>
@@ -835,13 +1025,39 @@
               <w:rPr>
                 <w:sz w:val="17"/>
               </w:rPr>
-              <w:t xml:space="preserve">Huh et al. [4]</w:t>
-            </w:r>
-          </w:p>
-        </w:tc>
-        <w:tc>
-          <w:tcPr>
-            <w:tcW w:w="1530" w:type="dxa"/>
+              <w:t xml:space="preserve">Huh</w:t>
+            </w:r>
+            <w:r>
+              <w:rPr>
+                <w:sz w:val="17"/>
+              </w:rPr>
+              <w:t xml:space="preserve"> </w:t>
+            </w:r>
+            <w:r>
+              <w:rPr>
+                <w:iCs/>
+                <w:i/>
+                <w:sz w:val="17"/>
+              </w:rPr>
+              <w:t xml:space="preserve">et al.</w:t>
+            </w:r>
+            <w:r>
+              <w:rPr>
+                <w:sz w:val="17"/>
+              </w:rPr>
+              <w:t xml:space="preserve"> </w:t>
+            </w:r>
+            <w:r>
+              <w:rPr>
+                <w:sz w:val="17"/>
+              </w:rPr>
+              <w:t xml:space="preserve">[4]</w:t>
+            </w:r>
+          </w:p>
+        </w:tc>
+        <w:tc>
+          <w:tcPr>
+            <w:tcW w:w="1581" w:type="dxa"/>
           </w:tcPr>
           <w:p>
             <w:pPr>
@@ -859,7 +1075,7 @@
         </w:tc>
         <w:tc>
           <w:tcPr>
-            <w:tcW w:w="1530" w:type="dxa"/>
+            <w:tcW w:w="1581" w:type="dxa"/>
           </w:tcPr>
           <w:p>
             <w:pPr>
@@ -877,7 +1093,7 @@
         </w:tc>
         <w:tc>
           <w:tcPr>
-            <w:tcW w:w="1530" w:type="dxa"/>
+            <w:tcW w:w="1581" w:type="dxa"/>
           </w:tcPr>
           <w:p>
             <w:pPr>
@@ -895,7 +1111,7 @@
         </w:tc>
         <w:tc>
           <w:tcPr>
-            <w:tcW w:w="1530" w:type="dxa"/>
+            <w:tcW w:w="1581" w:type="dxa"/>
           </w:tcPr>
           <w:p>
             <w:pPr>
@@ -913,7 +1129,7 @@
         </w:tc>
         <w:tc>
           <w:tcPr>
-            <w:tcW w:w="1530" w:type="dxa"/>
+            <w:tcW w:w="1581" w:type="dxa"/>
           </w:tcPr>
           <w:p>
             <w:pPr>
@@ -933,7 +1149,7 @@
       <w:tr>
         <w:tc>
           <w:tcPr>
-            <w:tcW w:w="1420" w:type="dxa"/>
+            <w:tcW w:w="1166" w:type="dxa"/>
           </w:tcPr>
           <w:p>
             <w:pPr>
@@ -951,7 +1167,7 @@
         </w:tc>
         <w:tc>
           <w:tcPr>
-            <w:tcW w:w="1530" w:type="dxa"/>
+            <w:tcW w:w="1581" w:type="dxa"/>
           </w:tcPr>
           <w:p>
             <w:pPr>
@@ -969,7 +1185,7 @@
         </w:tc>
         <w:tc>
           <w:tcPr>
-            <w:tcW w:w="1530" w:type="dxa"/>
+            <w:tcW w:w="1581" w:type="dxa"/>
           </w:tcPr>
           <w:p>
             <w:pPr>
@@ -987,7 +1203,7 @@
         </w:tc>
         <w:tc>
           <w:tcPr>
-            <w:tcW w:w="1530" w:type="dxa"/>
+            <w:tcW w:w="1581" w:type="dxa"/>
           </w:tcPr>
           <w:p>
             <w:pPr>
@@ -1005,7 +1221,7 @@
         </w:tc>
         <w:tc>
           <w:tcPr>
-            <w:tcW w:w="1530" w:type="dxa"/>
+            <w:tcW w:w="1581" w:type="dxa"/>
           </w:tcPr>
           <w:p>
             <w:pPr>
@@ -1023,7 +1239,7 @@
         </w:tc>
         <w:tc>
           <w:tcPr>
-            <w:tcW w:w="1530" w:type="dxa"/>
+            <w:tcW w:w="1581" w:type="dxa"/>
           </w:tcPr>
           <w:p>
             <w:pPr>
@@ -1043,7 +1259,7 @@
       <w:tr>
         <w:tc>
           <w:tcPr>
-            <w:tcW w:w="1420" w:type="dxa"/>
+            <w:tcW w:w="1166" w:type="dxa"/>
           </w:tcPr>
           <w:p>
             <w:pPr>
@@ -1055,13 +1271,13 @@
               <w:rPr>
                 <w:sz w:val="17"/>
               </w:rPr>
-              <w:t xml:space="preserve">Twilio Inc. [7] and Twilio Inc. [6]</w:t>
-            </w:r>
-          </w:p>
-        </w:tc>
-        <w:tc>
-          <w:tcPr>
-            <w:tcW w:w="1530" w:type="dxa"/>
+              <w:t xml:space="preserve">Twilio Inc. [7], [6]</w:t>
+            </w:r>
+          </w:p>
+        </w:tc>
+        <w:tc>
+          <w:tcPr>
+            <w:tcW w:w="1581" w:type="dxa"/>
           </w:tcPr>
           <w:p>
             <w:pPr>
@@ -1079,7 +1295,7 @@
         </w:tc>
         <w:tc>
           <w:tcPr>
-            <w:tcW w:w="1530" w:type="dxa"/>
+            <w:tcW w:w="1581" w:type="dxa"/>
           </w:tcPr>
           <w:p>
             <w:pPr>
@@ -1097,7 +1313,7 @@
         </w:tc>
         <w:tc>
           <w:tcPr>
-            <w:tcW w:w="1530" w:type="dxa"/>
+            <w:tcW w:w="1581" w:type="dxa"/>
           </w:tcPr>
           <w:p>
             <w:pPr>
@@ -1115,7 +1331,7 @@
         </w:tc>
         <w:tc>
           <w:tcPr>
-            <w:tcW w:w="1530" w:type="dxa"/>
+            <w:tcW w:w="1581" w:type="dxa"/>
           </w:tcPr>
           <w:p>
             <w:pPr>
@@ -1133,7 +1349,7 @@
         </w:tc>
         <w:tc>
           <w:tcPr>
-            <w:tcW w:w="1530" w:type="dxa"/>
+            <w:tcW w:w="1581" w:type="dxa"/>
           </w:tcPr>
           <w:p>
             <w:pPr>
@@ -1153,7 +1369,7 @@
       <w:tr>
         <w:tc>
           <w:tcPr>
-            <w:tcW w:w="1420" w:type="dxa"/>
+            <w:tcW w:w="1166" w:type="dxa"/>
           </w:tcPr>
           <w:p>
             <w:pPr>
@@ -1165,13 +1381,39 @@
               <w:rPr>
                 <w:sz w:val="17"/>
               </w:rPr>
-              <w:t xml:space="preserve">Wiefling et al. [5]</w:t>
-            </w:r>
-          </w:p>
-        </w:tc>
-        <w:tc>
-          <w:tcPr>
-            <w:tcW w:w="1530" w:type="dxa"/>
+              <w:t xml:space="preserve">Wiefling</w:t>
+            </w:r>
+            <w:r>
+              <w:rPr>
+                <w:sz w:val="17"/>
+              </w:rPr>
+              <w:t xml:space="preserve"> </w:t>
+            </w:r>
+            <w:r>
+              <w:rPr>
+                <w:iCs/>
+                <w:i/>
+                <w:sz w:val="17"/>
+              </w:rPr>
+              <w:t xml:space="preserve">et al.</w:t>
+            </w:r>
+            <w:r>
+              <w:rPr>
+                <w:sz w:val="17"/>
+              </w:rPr>
+              <w:t xml:space="preserve"> </w:t>
+            </w:r>
+            <w:r>
+              <w:rPr>
+                <w:sz w:val="17"/>
+              </w:rPr>
+              <w:t xml:space="preserve">[5]</w:t>
+            </w:r>
+          </w:p>
+        </w:tc>
+        <w:tc>
+          <w:tcPr>
+            <w:tcW w:w="1581" w:type="dxa"/>
           </w:tcPr>
           <w:p>
             <w:pPr>
@@ -1189,7 +1431,7 @@
         </w:tc>
         <w:tc>
           <w:tcPr>
-            <w:tcW w:w="1530" w:type="dxa"/>
+            <w:tcW w:w="1581" w:type="dxa"/>
           </w:tcPr>
           <w:p>
             <w:pPr>
@@ -1207,7 +1449,7 @@
         </w:tc>
         <w:tc>
           <w:tcPr>
-            <w:tcW w:w="1530" w:type="dxa"/>
+            <w:tcW w:w="1581" w:type="dxa"/>
           </w:tcPr>
           <w:p>
             <w:pPr>
@@ -1225,7 +1467,7 @@
         </w:tc>
         <w:tc>
           <w:tcPr>
-            <w:tcW w:w="1530" w:type="dxa"/>
+            <w:tcW w:w="1581" w:type="dxa"/>
           </w:tcPr>
           <w:p>
             <w:pPr>
@@ -1243,7 +1485,7 @@
         </w:tc>
         <w:tc>
           <w:tcPr>
-            <w:tcW w:w="1530" w:type="dxa"/>
+            <w:tcW w:w="1581" w:type="dxa"/>
           </w:tcPr>
           <w:p>
             <w:pPr>
@@ -1263,7 +1505,7 @@
       <w:tr>
         <w:tc>
           <w:tcPr>
-            <w:tcW w:w="1420" w:type="dxa"/>
+            <w:tcW w:w="1166" w:type="dxa"/>
             <w:tcBorders>
               <w:bottom w:val="single" w:sz="8" w:color="000000"/>
             </w:tcBorders>
@@ -1284,7 +1526,7 @@
         </w:tc>
         <w:tc>
           <w:tcPr>
-            <w:tcW w:w="1530" w:type="dxa"/>
+            <w:tcW w:w="1581" w:type="dxa"/>
             <w:tcBorders>
               <w:bottom w:val="single" w:sz="8" w:color="000000"/>
             </w:tcBorders>
@@ -1305,7 +1547,7 @@
         </w:tc>
         <w:tc>
           <w:tcPr>
-            <w:tcW w:w="1530" w:type="dxa"/>
+            <w:tcW w:w="1581" w:type="dxa"/>
             <w:tcBorders>
               <w:bottom w:val="single" w:sz="8" w:color="000000"/>
             </w:tcBorders>
@@ -1326,7 +1568,7 @@
         </w:tc>
         <w:tc>
           <w:tcPr>
-            <w:tcW w:w="1530" w:type="dxa"/>
+            <w:tcW w:w="1581" w:type="dxa"/>
             <w:tcBorders>
               <w:bottom w:val="single" w:sz="8" w:color="000000"/>
             </w:tcBorders>
@@ -1347,7 +1589,7 @@
         </w:tc>
         <w:tc>
           <w:tcPr>
-            <w:tcW w:w="1530" w:type="dxa"/>
+            <w:tcW w:w="1581" w:type="dxa"/>
             <w:tcBorders>
               <w:bottom w:val="single" w:sz="8" w:color="000000"/>
             </w:tcBorders>
@@ -1368,7 +1610,7 @@
         </w:tc>
         <w:tc>
           <w:tcPr>
-            <w:tcW w:w="1530" w:type="dxa"/>
+            <w:tcW w:w="1581" w:type="dxa"/>
             <w:tcBorders>
               <w:bottom w:val="single" w:sz="8" w:color="000000"/>
             </w:tcBorders>
@@ -1635,7 +1877,7 @@
         <w:pStyle w:val="FirstParagraph"/>
       </w:pPr>
       <w:r>
-        <w:t xml:space="preserve">The attacker is a party that wants the service to send as many messages as possible, or as many as possible to numbers that pay it. The first is a flooder: the service pays per message, and the attacker’s gain is the service’s loss. The second is a pumper, who is paid a share of the termination fee by the operator that terminates its ranges; it earns nothing on any other number, so its traffic concentrates on the blocks it is paid for. The share is not public; therefore, in Section V-H, we report the share at which each scripted pumper breaks even. Figure 2 places the two attackers on the path of a request: the flooder, whose aim is the service’s SMS spend, and the pumper, who earns on its partner’s ranges through the share of the termination fee that the dashed line carries back from the operator to the client. What each controls at the four points of the path, what neither can do, and what the model leaves out follow.</w:t>
+        <w:t xml:space="preserve">The attacker is a party that wants the service to send as many messages as possible, or as many as possible to numbers that pay it. The first is a flooder: the service pays per message, and the attacker’s gain is the service’s loss. The second is a pumper, who is paid a share of the termination fee by the operator that terminates its ranges; it earns nothing on any other number, so its traffic concentrates on the blocks it is paid for. The share is not public; therefore, in Section V-H, we report the share at which each scripted pumper breaks even. Fig. 2 places the two attackers on the path of a request: the flooder, whose aim is the service’s SMS spend, and the pumper, who earns on its partner’s ranges through the share of the termination fee that the dashed line carries back from the operator to the client. What each controls at the four points of the path, what neither can do, and what the model leaves out follow.</w:t>
       </w:r>
     </w:p>
     <w:p>
@@ -1742,7 +1984,7 @@
         <w:pStyle w:val="FirstParagraph"/>
       </w:pPr>
       <w:r>
-        <w:t xml:space="preserve">Figure 3 shows the implementation as deployed. An HTTP API, run on any number of instances, offers the client five public endpoints: an attestation challenge and an enrolment, a session endpoint where a reCAPTCHA token or an attestation buys a signed session, the request endpoint, which runs the pipeline and returns one uniform body, and the verify endpoint, which takes the code; two internal endpoints, behind a service credential, take the vendor’s delivery receipts and drive the timeouts. Behind the API sit the two procedures of Algorithm 2: the pipeline, which runs Steps 0–11 on each request, and the feedback loop, which applies each transition of a send as one compare-and-set. All state lives in one store, Redis in production, and an in-memory twin with the same rules in the tests and the simulator, so what the loop writes the next request reads, which is how the outcome of one send changes the judgment of the next, and any instance can verify any code. One worker per deployment ticks every minute to resolve the sends that timed out and to run the baseline job that sets the multipliers of Step 9 from the pipeline’s own counters. Every external dependency sits behind an adapter with an in-memory fake, and a deployment reports which adapters are fake so that production can refuse to start with any. The simulation of Section IV runs the pipeline, the feedback loop, the worker’s two jobs, and the in-memory store as drawn, without the HTTP layer, replaces the external services with their fakes, and in the main study hands the baseline job the modeled legitimate rate instead of letting it learn it (Section V-D runs the learning job).</w:t>
+        <w:t xml:space="preserve">Fig. 3 shows the implementation as deployed. An HTTP API, run on any number of instances, offers the client five public endpoints: an attestation challenge and an enrolment, a session endpoint where a reCAPTCHA token or an attestation buys a signed session, the request endpoint, which runs the pipeline and returns one uniform body, and the verify endpoint, which takes the code; two internal endpoints, behind a service credential, take the vendor’s delivery receipts and drive the timeouts. Behind the API sit the two procedures of Algorithm 2: the pipeline, which runs Steps 0–11 on each request, and the feedback loop, which applies each transition of a send as one compare-and-set. All state lives in one store, Redis in production, and an in-memory twin with the same rules in the tests and the simulator, so what the loop writes the next request reads, which is how the outcome of one send changes the judgment of the next, and any instance can verify any code. One worker per deployment ticks every minute to resolve the sends that timed out and to run the baseline job that sets the multipliers of Step 9 from the pipeline’s own counters. Every external dependency sits behind an adapter with an in-memory fake, and a deployment reports which adapters are fake so that production can refuse to start with any. The simulation of Section IV runs the pipeline, the feedback loop, the worker’s two jobs, and the in-memory store as drawn, without the HTTP layer, replaces the external services with their fakes, and in the main study hands the baseline job the modeled legitimate rate instead of letting it learn it (Section V-D runs the learning job).</w:t>
       </w:r>
     </w:p>
     <w:p>
@@ -1823,7 +2065,7 @@
         <w:pStyle w:val="BodyText"/>
       </w:pPr>
       <w:r>
-        <w:t xml:space="preserve">A request passes the twelve steps of Figure 4 in order until one refuses it. The figure numbers its stages in reading order: stages 1 to 4 are Steps 0 to 4, with Steps 3 and 4 drawn as one stage, the web checks; from stage 5 on the numberings coincide, and stage 12 is the feedback loop. The letters below are the gaps of Section III-A that each step closes. Step 0 establishes the platform from an App Attest or Play Integrity result and refuses proxy addresses (A). Step 1 binds the request to a server-signed session with a fingerprint and a replay nonce, three requests per session per ten minutes (B). Step 2 throttles the address, its /24, and its autonomous system, with lower caps for hosting networks (B, F). Steps 3 and 4, for web requests only, check the reCAPTCHA score and the origin. Step 5 prices and checks the number before anything is paid for: its country and cost class, sequential or narrow-range bursts, liveness through an HLR lookup, and the verdict stage of its block, with the bulk flag now needing an internal credential (C, D, G). Step 6 validates the body and the exclusion list, the test flag needing a credential too (G). Step 7 computes the risk score of Equation (1) and chooses one of five tiers (H). Step 8 applies a per-number backoff, sixty seconds doubling to an hour and five sends a day. Step 9 takes the source caps per source, platform, and country, multiplied by the adaptive factor. Step 10 sets the operating mode from the hourly budget, elevated above 80% and emergency at 100% (E). Step 11 reserves the hourly count, spend, and any destination slot in one atomic operation, writes the state, and enqueues the message (E, H). A refusal at any step returns one uniform reply, and every send resolves through the feedback loop, whose per-key and per-block outcomes are what the next request is judged on.</w:t>
+        <w:t xml:space="preserve">A request passes the twelve steps of Fig. 4 in order until one refuses it. The figure numbers its stages in reading order: stages 1 to 4 are Steps 0 to 4, with Steps 3 and 4 drawn as one stage, the web checks; from stage 5 on the numberings coincide, and stage 12 is the feedback loop. The letters below are the gaps of Section III-A that each step closes. Step 0 establishes the platform from an App Attest or Play Integrity result and refuses proxy addresses (A). Step 1 binds the request to a server-signed session with a fingerprint and a replay nonce, three requests per session per ten minutes (B). Step 2 throttles the address, its /24, and its autonomous system, with lower caps for hosting networks (B, F). Steps 3 and 4, for web requests only, check the reCAPTCHA score and the origin. Step 5 prices and checks the number before anything is paid for: its country and cost class, sequential or narrow-range bursts, liveness through an HLR lookup, and the verdict stage of its block, with the bulk flag now needing an internal credential (C, D, G). Step 6 validates the body and the exclusion list, the test flag needing a credential too (G). Step 7 computes the risk score of (1) and chooses one of five tiers (H). Step 8 applies a per-number backoff, sixty seconds doubling to an hour and five sends a day. Step 9 takes the source caps per source, platform, and country, multiplied by the adaptive factor. Step 10 sets the operating mode from the hourly budget, elevated above 80% and emergency at 100% (E). Step 11 reserves the hourly count, spend, and any destination slot in one atomic operation, writes the state, and enqueues the message (E, H). A refusal at any step returns one uniform reply, and every send resolves through the feedback loop, whose per-key and per-block outcomes are what the next request is judged on.</w:t>
       </w:r>
     </w:p>
     <w:p>
@@ -2967,7 +3209,7 @@
         <w:pStyle w:val="Heading3"/>
       </w:pPr>
       <w:r>
-        <w:t xml:space="preserve">1) SEQUENTIAL TESTS</w:t>
+        <w:t xml:space="preserve">1) Sequential Tests</w:t>
       </w:r>
     </w:p>
     <w:p>
@@ -3478,7 +3720,7 @@
         <w:pStyle w:val="Heading3"/>
       </w:pPr>
       <w:r>
-        <w:t xml:space="preserve">2) COUNTERS</w:t>
+        <w:t xml:space="preserve">2) Counters</w:t>
       </w:r>
     </w:p>
     <w:p>
@@ -3763,7 +4005,7 @@
         <w:t xml:space="preserve"> </w:t>
       </w:r>
       <w:r>
-        <w:t xml:space="preserve">Equation (2) also estimates the attack’s total, ignoring prior credit and outage suspension. A carrier verifying a share</w:t>
+        <w:t xml:space="preserve">(2) also estimates the attack’s total, ignoring prior credit and outage suspension. A carrier verifying a share</w:t>
       </w:r>
       <w:r>
         <w:t xml:space="preserve"> </w:t>
@@ -4784,7 +5026,7 @@
         <w:pStyle w:val="FirstParagraph"/>
       </w:pPr>
       <w:r>
-        <w:t xml:space="preserve">Figure 5 summarizes how we evaluated the design. Our implementation of Algorithm 2 runs inside an event-driven simulator against scripted attackers and simulated users, one run per design, attacker, workload, and seed (Algorithm 3); we group the runs into studies under two protocols that we committed before their runs; and we score each run by what the attacker got through and by what legitimate users lost. The two dashed loops of the figure are the method’s two disciplines: settings selected on tuning seeds are frozen before they meet held-out seeds and workloads, and the leakage estimates derived from the rules alone (Section III-G) are checked against the measurements. The rest of this section describes the implementation, simulator, protocols, and metrics in that order.</w:t>
+        <w:t xml:space="preserve">Fig. 5 summarizes how we evaluated the design. Our implementation of Algorithm 2 runs inside an event-driven simulator against scripted attackers and simulated users, one run per design, attacker, workload, and seed (Algorithm 3); we group the runs into studies under two protocols that we committed before their runs; and we score each run by what the attacker got through and by what legitimate users lost. The two dashed loops of the figure are the method’s two disciplines: settings selected on tuning seeds are frozen before they meet held-out seeds and workloads, and the leakage estimates derived from the rules alone (Section III-G) are checked against the measurements. The rest of this section describes the implementation, simulator, protocols, and metrics in that order.</w:t>
       </w:r>
     </w:p>
     <w:p>
@@ -8698,7 +8940,7 @@
         <w:pStyle w:val="Heading3"/>
       </w:pPr>
       <w:r>
-        <w:t xml:space="preserve">1) AT A SERVICE TARGET</w:t>
+        <w:t xml:space="preserve">1) At a Service Target</w:t>
       </w:r>
     </w:p>
     <w:p>
@@ -9383,7 +9625,7 @@
         <w:pStyle w:val="Heading3"/>
       </w:pPr>
       <w:r>
-        <w:t xml:space="preserve">2) ON HELD-OUT TRAFFIC</w:t>
+        <w:t xml:space="preserve">2) On Held-out Traffic</w:t>
       </w:r>
     </w:p>
     <w:p>
@@ -10925,7 +11167,7 @@
         <w:pStyle w:val="Heading3"/>
       </w:pPr>
       <w:r>
-        <w:t xml:space="preserve">3) THE COUNTER’S BOUNDARY</w:t>
+        <w:t xml:space="preserve">3) The Counter’s Boundary</w:t>
       </w:r>
     </w:p>
     <w:p>
@@ -10933,7 +11175,7 @@
         <w:pStyle w:val="FirstParagraph"/>
       </w:pPr>
       <w:r>
-        <w:t xml:space="preserve">Figures 6–8 show the counter’s operating boundary (E4, seeds 300–304): each point is a mean over five seeds with its 95% interval, lines join the sampled settings without locating a crossover, and the horizontal axes are logarithmic. Figure 6 plots the attributable loss of the three hot blocks’ users, in points of completion, against the legitimate rate on those blocks, from one half to eight sends per block per ten minutes, with 70% of users reachable on WhatsApp, attack-free (hollow markers) and with a never-verifying pumper on the same blocks (filled); the dotted line is the counter’s quota of four. Attack-free, the counter costs a block’s users nothing at one send per ten minutes, 2.3 points at four and 5.5 at eight, far below the idealized share beyond the quota (27% at four), since most challenged users complete or switch to WhatsApp; without WhatsApp, eight sends cost 13.2, and a 30-minute launch at three times the normal rate costs 16. With a pumper on the same blocks, both policies turn that cost into a gain at up to four sends per ten minutes (the counter 6 to 15 points, the tests 1 to 10), because without a policy the pumper exhausts those blocks and the hourly budget; at eight sends, both cost their users again, the counter 4 points and the tests 9.</w:t>
+        <w:t xml:space="preserve">Figs. 6–8 show the counter’s operating boundary (E4, seeds 300–304): each point is a mean over five seeds with its 95% interval, lines join the sampled settings without locating a crossover, and the horizontal axes are logarithmic. Fig. 6 plots the attributable loss of the three hot blocks’ users, in points of completion, against the legitimate rate on those blocks, from one half to eight sends per block per ten minutes, with 70% of users reachable on WhatsApp, attack-free (hollow markers) and with a never-verifying pumper on the same blocks (filled); the dotted line is the counter’s quota of four. Attack-free, the counter costs a block’s users nothing at one send per ten minutes, 2.3 points at four and 5.5 at eight, far below the idealized share beyond the quota (27% at four), since most challenged users complete or switch to WhatsApp; without WhatsApp, eight sends cost 13.2, and a 30-minute launch at three times the normal rate costs 16. With a pumper on the same blocks, both policies turn that cost into a gain at up to four sends per ten minutes (the counter 6 to 15 points, the tests 1 to 10), because without a policy the pumper exhausts those blocks and the hourly budget; at eight sends, both cost their users again, the counter 4 points and the tests 9.</w:t>
       </w:r>
     </w:p>
     <w:p>
@@ -11006,7 +11248,7 @@
         <w:pStyle w:val="BodyText"/>
       </w:pPr>
       <w:r>
-        <w:t xml:space="preserve">Figures 7 and 8 plot the messages a pumper got through against the number of blocks it spread over, 3 to 300. Figure 7 covers a 20-minute attack under no policy, the default tests and the selected counter, for a pumper at full rate (solid lines) and one paced to the counter’s quota (dashed). At full rate the counter leaked 25 and 81 messages on 3 and 10 blocks where the tests leaked 110 and 144, the two leaked about the same on 30 blocks (235 against 242), and from 100 blocks on both approached the no-policy line of about 700. Paced to the quota, the pumper leaked under the counter what the quota allows, which is what it leaks with no policy (24 messages on three blocks in twenty minutes, 71 in an hour), and a little less under the tests (23).</w:t>
+        <w:t xml:space="preserve">Figs. 7 and 8 plot the messages a pumper got through against the number of blocks it spread over, 3 to 300. Fig. 7 covers a 20-minute attack under no policy, the default tests and the selected counter, for a pumper at full rate (solid lines) and one paced to the counter’s quota (dashed). At full rate the counter leaked 25 and 81 messages on 3 and 10 blocks where the tests leaked 110 and 144, the two leaked about the same on 30 blocks (235 against 242), and from 100 blocks on both approached the no-policy line of about 700. Paced to the quota, the pumper leaked under the counter what the quota allows, which is what it leaks with no policy (24 messages on three blocks in twenty minutes, 71 in an hour), and a little less under the tests (23).</w:t>
       </w:r>
     </w:p>
     <w:p>
@@ -11079,7 +11321,7 @@
         <w:pStyle w:val="BodyText"/>
       </w:pPr>
       <w:r>
-        <w:t xml:space="preserve">Figure 8 shows the hour-long attack at full rate against the estimates of Section III-G, computed from each run’s offered requests, offered rate, and configured timeouts, nothing fitted: Equation (2) for the tests and Equations (3) and (4) for the counter’s cold- and warm-start bounds, drawn hollow on dotted lines (the 20-minute estimates are in</w:t>
+        <w:t xml:space="preserve">Fig. 8 shows the hour-long attack at full rate against the estimates of Section III-G, computed from each run’s offered requests, offered rate, and configured timeouts, nothing fitted: (2) for the tests and (3) and (4) for the counter’s cold- and warm-start bounds, drawn hollow on dotted lines (the 20-minute estimates are in</w:t>
       </w:r>
       <w:r>
         <w:t xml:space="preserve"> </w:t>
@@ -11091,7 +11333,7 @@
         <w:t xml:space="preserve">results/ condition_check.json</w:t>
       </w:r>
       <w:r>
-        <w:t xml:space="preserve">). Over 60 min, the default leaked 110, 144, and 242 messages on 3, 10, and 30 blocks, against 105, 139, and 240 from Equation (2) (</w:t>
+        <w:t xml:space="preserve">). Over 60 min, the default leaked 110, 144, and 242 messages on 3, 10, and 30 blocks, against 105, 139, and 240 from (2) (</w:t>
       </w:r>
       <m:oMath>
         <m:r>
@@ -11111,7 +11353,7 @@
         </m:r>
       </m:oMath>
       <w:r>
-        <w:t xml:space="preserve">), and the counter 71, 240, and 679 against its cold-start bound of 72, 240, and 720; setting aside the exempt sends to real users’ trusted numbers, no run that started cold exceeded Equation (3) and none exceeded Equation (4). With these unfitted inputs Equation (5) ordered the policies’ mean leakage in 18 of 18 decisive cells (two ties at</w:t>
+        <w:t xml:space="preserve">), and the counter 71, 240, and 679 against its cold-start bound of 72, 240, and 720; setting aside the exempt sends to real users’ trusted numbers, no run that started cold exceeded (3) and none exceeded (4). With these unfitted inputs (5) ordered the policies’ mean leakage in 18 of 18 decisive cells (two ties at</w:t>
       </w:r>
       <w:r>
         <w:t xml:space="preserve"> </w:t>
@@ -11267,7 +11509,23 @@
         <w:pStyle w:val="BodyText"/>
       </w:pPr>
       <w:r>
-        <w:t xml:space="preserve">The nearest external work, set out in Table 1, can be compared only on what each needs and reports, since none ran on the same traffic. Huh et al. [4] report 89.6% recall at 0.19% false positives for a supervised model on one service’s real logs; the attack it targets, a few requests per identity over many fresh identities, is the farm here, which our layers do not separate and the caps only ration, at 54% of first-time users refused, while what the layers contain without labels are the attacks with a signature in the request and most of the reused profile. Zaliskyi and Odarchenko [8] report that fixed-window prefix counts blocked 95% and 63% of two incidents at the price of 58% of a legitimate campaign; our graded counter is the same family of control, a ten-minute window on a 10,000-number block with a challenge rather than a 24-hour quarantine, and it leaked 24 of about 574 requests from each outcome-reading pumper at an attack-free cost of 0.06 points of completion, on simulated traffic with no campaigns in it, and failed its service claims on blocks the attacker shares. Twilio’s products state claimed false-positive rates and report no leakage. What we report that none of the three does is an attack-free benign cost, a cost under attack for the users who share a block with the attacker, a selection fixed before the evaluation runs and tested on held-out seeds and workloads, and an implementation anyone can run; what the three have and we lack is real traffic.</w:t>
+        <w:t xml:space="preserve">The nearest external work, set out in Table 1, can be compared only on what each needs and reports, since none ran on the same traffic. Huh</w:t>
+      </w:r>
+      <w:r>
+        <w:t xml:space="preserve"> </w:t>
+      </w:r>
+      <w:r>
+        <w:rPr>
+          <w:iCs/>
+          <w:i/>
+        </w:rPr>
+        <w:t xml:space="preserve">et al.</w:t>
+      </w:r>
+      <w:r>
+        <w:t xml:space="preserve"> </w:t>
+      </w:r>
+      <w:r>
+        <w:t xml:space="preserve">[4] report 89.6% recall at 0.19% false positives for a supervised model on one service’s real logs; the attack it targets, a few requests per identity over many fresh identities, is the farm here, which our layers do not separate and the caps only ration, at 54% of first-time users refused, while what the layers contain without labels are the attacks with a signature in the request and most of the reused profile. Zaliskyi and Odarchenko [8] report that fixed-window prefix counts blocked 95% and 63% of two incidents at the price of 58% of a legitimate campaign; our graded counter is the same family of control, a ten-minute window on a 10,000-number block with a challenge rather than a 24-hour quarantine, and it leaked 24 of about 574 requests from each outcome-reading pumper at an attack-free cost of 0.06 points of completion, on simulated traffic with no campaigns in it, and failed its service claims on blocks the attacker shares. Twilio’s products state claimed false-positive rates and report no leakage. What we report that none of the three does is an attack-free benign cost, a cost under attack for the users who share a block with the attacker, a selection fixed before the evaluation runs and tested on held-out seeds and workloads, and an implementation anyone can run; what the three have and we lack is real traffic.</w:t>
       </w:r>
     </w:p>
     <w:p>
@@ -11311,7 +11569,7 @@
         <w:pStyle w:val="FirstParagraph"/>
       </w:pPr>
       <w:r>
-        <w:t xml:space="preserve">The author used Claude (Anthropic) to help with code review and code evaluation, checked every number against the recorded results and every claim against the code, and takes full responsibility for the content. The author would like to thank Prince Sultan University for paying the APC of this manuscript and funding this research.</w:t>
+        <w:t xml:space="preserve">The author used Claude (Anthropic) to help with code review and code evaluation, checked every number against the recorded results and every claim against the code, and takes full responsibility for the content.</w:t>
       </w:r>
     </w:p>
     <w:bookmarkEnd w:id="89"/>

</xml_diff>

<commit_message>
Algorithms in the template's algorithmic package; Figure 5 caption; AI-use acknowledgment
Algorithms 1-3 rewritten for algorithmic, as the IEEE OJ-COMS template loads it, inside the
algorithm float of the same bundle, with a procedure block for Algorithm 2; hyperref dropped
as in the template (with algorithmic it set stray blank lines). Figure 5's caption no longer
says "described below". The acknowledgment names what the AI assistant was used for, by
section, per IEEE's policy on AI-generated content.

Co-Authored-By: Claude Opus 5.5 <noreply@anthropic.com>
Claude-Session: https://claude.ai/code/session_01RjWdFzUgYk6Hwie2YbnvyG
</commit_message>
<xml_diff>
--- a/paper/main.docx
+++ b/paper/main.docx
@@ -1804,7 +1804,7 @@
       <w:r>
         <w:drawing>
           <wp:inline>
-            <wp:extent cx="4319999" cy="2468571"/>
+            <wp:extent cx="4319999" cy="2284230"/>
             <wp:effectExtent b="0" l="0" r="0" t="0"/>
             <wp:docPr descr="" title="" id="31" name="Picture"/>
             <a:graphic>
@@ -1825,7 +1825,7 @@
                   <pic:spPr bwMode="auto">
                     <a:xfrm>
                       <a:off x="0" y="0"/>
-                      <a:ext cx="4319999" cy="2468571"/>
+                      <a:ext cx="4319999" cy="2284230"/>
                     </a:xfrm>
                     <a:prstGeom prst="rect">
                       <a:avLst/>
@@ -2137,6 +2137,17 @@
         </m:r>
       </m:oMath>
       <w:r>
+        <w:t xml:space="preserve">, its country</w:t>
+      </w:r>
+      <w:r>
+        <w:t xml:space="preserve"> </w:t>
+      </w:r>
+      <m:oMath>
+        <m:r>
+          <m:t>u</m:t>
+        </m:r>
+      </m:oMath>
+      <w:r>
         <w:t xml:space="preserve">, whether the HLR lookup finds it live, and the verdict stage</w:t>
       </w:r>
       <w:r>
@@ -2383,7 +2394,7 @@
       <w:r>
         <w:drawing>
           <wp:inline>
-            <wp:extent cx="4319999" cy="6009564"/>
+            <wp:extent cx="4319999" cy="6144897"/>
             <wp:effectExtent b="0" l="0" r="0" t="0"/>
             <wp:docPr descr="" title="" id="45" name="Picture"/>
             <a:graphic>
@@ -2404,7 +2415,7 @@
                   <pic:spPr bwMode="auto">
                     <a:xfrm>
                       <a:off x="0" y="0"/>
-                      <a:ext cx="4319999" cy="6009564"/>
+                      <a:ext cx="4319999" cy="6144897"/>
                     </a:xfrm>
                     <a:prstGeom prst="rect">
                       <a:avLst/>
@@ -5091,7 +5102,7 @@
         <w:t xml:space="preserve"> </w:t>
       </w:r>
       <w:r>
-        <w:t xml:space="preserve">How we evaluated the design is described below.</w:t>
+        <w:t xml:space="preserve">Overview of how we evaluated the design.</w:t>
       </w:r>
     </w:p>
     <w:bookmarkStart w:id="58" w:name="a.-implementation"/>
@@ -5312,7 +5323,7 @@
       <w:r>
         <w:drawing>
           <wp:inline>
-            <wp:extent cx="4319999" cy="3458473"/>
+            <wp:extent cx="4319999" cy="3845954"/>
             <wp:effectExtent b="0" l="0" r="0" t="0"/>
             <wp:docPr descr="" title="" id="60" name="Picture"/>
             <a:graphic>
@@ -5333,7 +5344,7 @@
                   <pic:spPr bwMode="auto">
                     <a:xfrm>
                       <a:off x="0" y="0"/>
-                      <a:ext cx="4319999" cy="3458473"/>
+                      <a:ext cx="4319999" cy="3845954"/>
                     </a:xfrm>
                     <a:prstGeom prst="rect">
                       <a:avLst/>
@@ -11569,7 +11580,7 @@
         <w:pStyle w:val="FirstParagraph"/>
       </w:pPr>
       <w:r>
-        <w:t xml:space="preserve">The author used Claude (Anthropic) to help with code review and code evaluation, checked every number against the recorded results and every claim against the code, and takes full responsibility for the content.</w:t>
+        <w:t xml:space="preserve">The author used Claude (Anthropic), an AI assistant, in preparing this article: to write and review the code of the implementation and the simulation and to run the evaluation (Sections III and IV); to draft and edit the text of every section; to generate Figs. 6–8 and the tables from the recorded results; and to check the references against their publishers’ records. Figs. 1–5 are the author’s own drawings. The author checked every number against the recorded results and every claim against the code, and takes full responsibility for the content.</w:t>
       </w:r>
     </w:p>
     <w:bookmarkEnd w:id="89"/>

</xml_diff>